<commit_message>
doc: edit summary of system features
</commit_message>
<xml_diff>
--- a/document/hw2.docx
+++ b/document/hw2.docx
@@ -1,6 +1,6 @@
 
 <file path=word/document.xml><?xml version="1.0" encoding="utf-8"?>
-<w:document xmlns:wpc="http://schemas.microsoft.com/office/word/2010/wordprocessingCanvas" xmlns:cx="http://schemas.microsoft.com/office/drawing/2014/chartex" xmlns:cx1="http://schemas.microsoft.com/office/drawing/2015/9/8/chartex" xmlns:cx2="http://schemas.microsoft.com/office/drawing/2015/10/21/chartex" xmlns:cx3="http://schemas.microsoft.com/office/drawing/2016/5/9/chartex" xmlns:cx4="http://schemas.microsoft.com/office/drawing/2016/5/10/chartex" xmlns:cx5="http://schemas.microsoft.com/office/drawing/2016/5/11/chartex" xmlns:cx6="http://schemas.microsoft.com/office/drawing/2016/5/12/chartex" xmlns:cx7="http://schemas.microsoft.com/office/drawing/2016/5/13/chartex" xmlns:cx8="http://schemas.microsoft.com/office/drawing/2016/5/14/chartex" xmlns:mc="http://schemas.openxmlformats.org/markup-compatibility/2006" xmlns:aink="http://schemas.microsoft.com/office/drawing/2016/ink" xmlns:am3d="http://schemas.microsoft.com/office/drawing/2017/model3d" xmlns:o="urn:schemas-microsoft-com:office:office" xmlns:oel="http://schemas.microsoft.com/office/2019/extlst" xmlns:r="http://schemas.openxmlformats.org/officeDocument/2006/relationships" xmlns:m="http://schemas.openxmlformats.org/officeDocument/2006/math" xmlns:v="urn:schemas-microsoft-com:vml" xmlns:wp14="http://schemas.microsoft.com/office/word/2010/wordprocessingDrawing" xmlns:wp="http://schemas.openxmlformats.org/drawingml/2006/wordprocessingDrawing" xmlns:w10="urn:schemas-microsoft-com:office:word" xmlns:w="http://schemas.openxmlformats.org/wordprocessingml/2006/main" xmlns:w14="http://schemas.microsoft.com/office/word/2010/wordml" xmlns:w15="http://schemas.microsoft.com/office/word/2012/wordml" xmlns:w16cex="http://schemas.microsoft.com/office/word/2018/wordml/cex" xmlns:w16cid="http://schemas.microsoft.com/office/word/2016/wordml/cid" xmlns:w16="http://schemas.microsoft.com/office/word/2018/wordml" xmlns:w16du="http://schemas.microsoft.com/office/word/2023/wordml/word16du" xmlns:w16sdtdh="http://schemas.microsoft.com/office/word/2020/wordml/sdtdatahash" xmlns:w16sdtfl="http://schemas.microsoft.com/office/word/2024/wordml/sdtformatlock" xmlns:w16se="http://schemas.microsoft.com/office/word/2015/wordml/symex" xmlns:wpg="http://schemas.microsoft.com/office/word/2010/wordprocessingGroup" xmlns:wpi="http://schemas.microsoft.com/office/word/2010/wordprocessingInk" xmlns:wne="http://schemas.microsoft.com/office/word/2006/wordml" xmlns:wps="http://schemas.microsoft.com/office/word/2010/wordprocessingShape" mc:Ignorable="w14 w15 w16se w16cid w16 w16cex w16sdtdh w16sdtfl w16du wp14">
+<w:document xmlns:wpc="http://schemas.microsoft.com/office/word/2010/wordprocessingCanvas" xmlns:cx="http://schemas.microsoft.com/office/drawing/2014/chartex" xmlns:cx1="http://schemas.microsoft.com/office/drawing/2015/9/8/chartex" xmlns:cx2="http://schemas.microsoft.com/office/drawing/2015/10/21/chartex" xmlns:cx3="http://schemas.microsoft.com/office/drawing/2016/5/9/chartex" xmlns:cx4="http://schemas.microsoft.com/office/drawing/2016/5/10/chartex" xmlns:cx5="http://schemas.microsoft.com/office/drawing/2016/5/11/chartex" xmlns:cx6="http://schemas.microsoft.com/office/drawing/2016/5/12/chartex" xmlns:cx7="http://schemas.microsoft.com/office/drawing/2016/5/13/chartex" xmlns:cx8="http://schemas.microsoft.com/office/drawing/2016/5/14/chartex" xmlns:mc="http://schemas.openxmlformats.org/markup-compatibility/2006" xmlns:aink="http://schemas.microsoft.com/office/drawing/2016/ink" xmlns:am3d="http://schemas.microsoft.com/office/drawing/2017/model3d" xmlns:o="urn:schemas-microsoft-com:office:office" xmlns:oel="http://schemas.microsoft.com/office/2019/extlst" xmlns:r="http://schemas.openxmlformats.org/officeDocument/2006/relationships" xmlns:m="http://schemas.openxmlformats.org/officeDocument/2006/math" xmlns:v="urn:schemas-microsoft-com:vml" xmlns:wp14="http://schemas.microsoft.com/office/word/2010/wordprocessingDrawing" xmlns:wp="http://schemas.openxmlformats.org/drawingml/2006/wordprocessingDrawing" xmlns:w10="urn:schemas-microsoft-com:office:word" xmlns:w="http://schemas.openxmlformats.org/wordprocessingml/2006/main" xmlns:w14="http://schemas.microsoft.com/office/word/2010/wordml" xmlns:w15="http://schemas.microsoft.com/office/word/2012/wordml" xmlns:w16cex="http://schemas.microsoft.com/office/word/2018/wordml/cex" xmlns:w16cid="http://schemas.microsoft.com/office/word/2016/wordml/cid" xmlns:w16="http://schemas.microsoft.com/office/word/2018/wordml" xmlns:w16sdtdh="http://schemas.microsoft.com/office/word/2020/wordml/sdtdatahash" xmlns:w16se="http://schemas.microsoft.com/office/word/2015/wordml/symex" xmlns:wpg="http://schemas.microsoft.com/office/word/2010/wordprocessingGroup" xmlns:wpi="http://schemas.microsoft.com/office/word/2010/wordprocessingInk" xmlns:wne="http://schemas.microsoft.com/office/word/2006/wordml" xmlns:wps="http://schemas.microsoft.com/office/word/2010/wordprocessingShape" mc:Ignorable="w14 w15 w16se w16cid w16 w16cex w16sdtdh wp14">
   <w:body>
     <w:p>
       <w:pPr>
@@ -338,11 +338,137 @@
         <w:t>Change History</w:t>
       </w:r>
     </w:p>
-    <w:p>
-      <w:pPr>
+    <w:p/>
+    <w:p>
+      <w:pPr>
+        <w:pStyle w:val="2"/>
+      </w:pPr>
+      <w:r>
         <w:rPr>
           <w:rFonts w:hint="eastAsia"/>
         </w:rPr>
+        <w:t xml:space="preserve">1.2 </w:t>
+      </w:r>
+      <w:r>
+        <w:t>Problem Statement</w:t>
+      </w:r>
+    </w:p>
+    <w:p>
+      <w:pPr>
+        <w:rPr>
+          <w:rFonts w:ascii="Times New Roman" w:eastAsia="標楷體" w:hAnsi="Times New Roman" w:cs="Times New Roman"/>
+        </w:rPr>
+      </w:pPr>
+      <w:proofErr w:type="spellStart"/>
+      <w:r>
+        <w:rPr>
+          <w:rFonts w:ascii="Times New Roman" w:eastAsia="標楷體" w:hAnsi="Times New Roman" w:cs="Times New Roman"/>
+        </w:rPr>
+        <w:t>Re:Book</w:t>
+      </w:r>
+      <w:proofErr w:type="spellEnd"/>
+      <w:r>
+        <w:rPr>
+          <w:rFonts w:ascii="Times New Roman" w:eastAsia="標楷體" w:hAnsi="Times New Roman" w:cs="Times New Roman"/>
+        </w:rPr>
+        <w:t>：賦予知識第二次生命</w:t>
+      </w:r>
+    </w:p>
+    <w:p>
+      <w:pPr>
+        <w:rPr>
+          <w:rFonts w:ascii="Times New Roman" w:eastAsia="標楷體" w:hAnsi="Times New Roman" w:cs="Times New Roman"/>
+        </w:rPr>
+      </w:pPr>
+      <w:proofErr w:type="spellStart"/>
+      <w:r>
+        <w:rPr>
+          <w:rFonts w:ascii="Times New Roman" w:eastAsia="標楷體" w:hAnsi="Times New Roman" w:cs="Times New Roman" w:hint="eastAsia"/>
+        </w:rPr>
+        <w:t>Re:Book</w:t>
+      </w:r>
+      <w:proofErr w:type="spellEnd"/>
+      <w:r>
+        <w:rPr>
+          <w:rFonts w:ascii="Times New Roman" w:eastAsia="標楷體" w:hAnsi="Times New Roman" w:cs="Times New Roman" w:hint="eastAsia"/>
+        </w:rPr>
+        <w:t xml:space="preserve"> </w:t>
+      </w:r>
+      <w:r>
+        <w:rPr>
+          <w:rFonts w:ascii="Times New Roman" w:eastAsia="標楷體" w:hAnsi="Times New Roman" w:cs="Times New Roman" w:hint="eastAsia"/>
+        </w:rPr>
+        <w:t>是一款專為大學生</w:t>
+      </w:r>
+      <w:r>
+        <w:rPr>
+          <w:rFonts w:ascii="Times New Roman" w:eastAsia="標楷體" w:hAnsi="Times New Roman" w:cs="Times New Roman" w:hint="eastAsia"/>
+        </w:rPr>
+        <w:t>、</w:t>
+      </w:r>
+      <w:r>
+        <w:rPr>
+          <w:rFonts w:ascii="Times New Roman" w:eastAsia="標楷體" w:hAnsi="Times New Roman" w:cs="Times New Roman" w:hint="eastAsia"/>
+        </w:rPr>
+        <w:t>研究生與自學者打造的應用程式，旨在解決資源浪費與學術教材成本過高的問題。每逢學期交替、教材需求達到高峰之際，本平台透過行動裝置與網頁介面，串連校園社群與學生網路群組，為二手書流通建立更有效率的媒合橋樑。我們深信此平台的存在具有其必要性，因為每一本書都值得擁有延續價值的機會，而不應被遺忘或淪為廢棄物。</w:t>
+      </w:r>
+    </w:p>
+    <w:p>
+      <w:pPr>
+        <w:rPr>
+          <w:rFonts w:ascii="Times New Roman" w:eastAsia="標楷體" w:hAnsi="Times New Roman" w:cs="Times New Roman"/>
+        </w:rPr>
+      </w:pPr>
+      <w:proofErr w:type="spellStart"/>
+      <w:r>
+        <w:rPr>
+          <w:rFonts w:ascii="Times New Roman" w:eastAsia="標楷體" w:hAnsi="Times New Roman" w:cs="Times New Roman" w:hint="eastAsia"/>
+        </w:rPr>
+        <w:t>Re:Book</w:t>
+      </w:r>
+      <w:proofErr w:type="spellEnd"/>
+      <w:r>
+        <w:rPr>
+          <w:rFonts w:ascii="Times New Roman" w:eastAsia="標楷體" w:hAnsi="Times New Roman" w:cs="Times New Roman" w:hint="eastAsia"/>
+        </w:rPr>
+        <w:t xml:space="preserve"> </w:t>
+      </w:r>
+      <w:r>
+        <w:rPr>
+          <w:rFonts w:ascii="Times New Roman" w:eastAsia="標楷體" w:hAnsi="Times New Roman" w:cs="Times New Roman" w:hint="eastAsia"/>
+        </w:rPr>
+        <w:t>透過直觀且易於操作的交換機制，為二手書注入新的生命。賣家可輸入書名、作者、出版社或</w:t>
+      </w:r>
+      <w:r>
+        <w:rPr>
+          <w:rFonts w:ascii="Times New Roman" w:eastAsia="標楷體" w:hAnsi="Times New Roman" w:cs="Times New Roman" w:hint="eastAsia"/>
+        </w:rPr>
+        <w:t xml:space="preserve"> ISBN </w:t>
+      </w:r>
+      <w:r>
+        <w:rPr>
+          <w:rFonts w:ascii="Times New Roman" w:eastAsia="標楷體" w:hAnsi="Times New Roman" w:cs="Times New Roman" w:hint="eastAsia"/>
+        </w:rPr>
+        <w:t>上架書籍，</w:t>
+      </w:r>
+      <w:r>
+        <w:rPr>
+          <w:rFonts w:ascii="Times New Roman" w:eastAsia="標楷體" w:hAnsi="Times New Roman" w:cs="Times New Roman" w:hint="eastAsia"/>
+        </w:rPr>
+        <w:t>並將待出售的書籍進行分</w:t>
+      </w:r>
+      <w:r>
+        <w:rPr>
+          <w:rFonts w:ascii="Times New Roman" w:eastAsia="標楷體" w:hAnsi="Times New Roman" w:cs="Times New Roman" w:hint="eastAsia"/>
+        </w:rPr>
+        <w:t>類。為體現對書本價值的尊重，賣家可設定期望售價，並上傳書況照片或分享使用心得。潛在買家則可透過搜尋與篩選功能，快速找到所需書籍。平台同時提供私訊機制，讓雙方協商最終價格與交付方式，確保知識的傳遞過程既順暢高效，也保有人與人之間的溫度。</w:t>
+      </w:r>
+    </w:p>
+    <w:p>
+      <w:pPr>
+        <w:rPr>
+          <w:rFonts w:ascii="Times New Roman" w:eastAsia="標楷體" w:hAnsi="Times New Roman" w:cs="Times New Roman"/>
+        </w:rPr>
       </w:pPr>
     </w:p>
     <w:p>
@@ -353,110 +479,269 @@
         <w:rPr>
           <w:rFonts w:hint="eastAsia"/>
         </w:rPr>
-        <w:t xml:space="preserve">1.2 </w:t>
-      </w:r>
-      <w:r>
-        <w:t>Problem Statement</w:t>
-      </w:r>
-    </w:p>
-    <w:p>
-      <w:pPr>
-        <w:rPr>
-          <w:rFonts w:ascii="Times New Roman" w:eastAsia="標楷體" w:hAnsi="Times New Roman" w:cs="Times New Roman"/>
-        </w:rPr>
-      </w:pPr>
-      <w:proofErr w:type="spellStart"/>
-      <w:r>
-        <w:rPr>
-          <w:rFonts w:ascii="Times New Roman" w:eastAsia="標楷體" w:hAnsi="Times New Roman" w:cs="Times New Roman"/>
-        </w:rPr>
-        <w:t>Re:Book</w:t>
-      </w:r>
-      <w:proofErr w:type="spellEnd"/>
-      <w:r>
-        <w:rPr>
-          <w:rFonts w:ascii="Times New Roman" w:eastAsia="標楷體" w:hAnsi="Times New Roman" w:cs="Times New Roman"/>
-        </w:rPr>
-        <w:t>：賦予知識第二次生命</w:t>
-      </w:r>
-    </w:p>
-    <w:p>
-      <w:pPr>
-        <w:rPr>
-          <w:rFonts w:ascii="Times New Roman" w:eastAsia="標楷體" w:hAnsi="Times New Roman" w:cs="Times New Roman"/>
-        </w:rPr>
-      </w:pPr>
-      <w:proofErr w:type="spellStart"/>
-      <w:r>
+        <w:t xml:space="preserve">1.3 </w:t>
+      </w:r>
+      <w:r>
+        <w:t>Summary of System Features</w:t>
+      </w:r>
+    </w:p>
+    <w:tbl>
+      <w:tblPr>
+        <w:tblStyle w:val="af2"/>
+        <w:tblW w:w="0" w:type="auto"/>
+        <w:tblLook w:val="04A0" w:firstRow="1" w:lastRow="0" w:firstColumn="1" w:lastColumn="0" w:noHBand="0" w:noVBand="1"/>
+      </w:tblPr>
+      <w:tblGrid>
+        <w:gridCol w:w="4148"/>
+        <w:gridCol w:w="4148"/>
+      </w:tblGrid>
+      <w:tr>
+        <w:tc>
+          <w:tcPr>
+            <w:tcW w:w="4148" w:type="dxa"/>
+            <w:shd w:val="clear" w:color="auto" w:fill="F2F2F2" w:themeFill="background1" w:themeFillShade="F2"/>
+          </w:tcPr>
+          <w:p>
+            <w:pPr>
+              <w:jc w:val="center"/>
+              <w:rPr>
+                <w:rFonts w:ascii="Times New Roman" w:eastAsia="標楷體" w:hAnsi="Times New Roman" w:cs="Times New Roman" w:hint="eastAsia"/>
+                <w:b/>
+                <w:bCs/>
+              </w:rPr>
+            </w:pPr>
+            <w:r>
+              <w:rPr>
+                <w:rFonts w:ascii="Times New Roman" w:eastAsia="標楷體" w:hAnsi="Times New Roman" w:cs="Times New Roman" w:hint="eastAsia"/>
+                <w:b/>
+                <w:bCs/>
+              </w:rPr>
+              <w:t>Feature ID</w:t>
+            </w:r>
+          </w:p>
+        </w:tc>
+        <w:tc>
+          <w:tcPr>
+            <w:tcW w:w="4148" w:type="dxa"/>
+            <w:shd w:val="clear" w:color="auto" w:fill="F2F2F2" w:themeFill="background1" w:themeFillShade="F2"/>
+          </w:tcPr>
+          <w:p>
+            <w:pPr>
+              <w:jc w:val="center"/>
+              <w:rPr>
+                <w:rFonts w:ascii="Times New Roman" w:eastAsia="標楷體" w:hAnsi="Times New Roman" w:cs="Times New Roman" w:hint="eastAsia"/>
+                <w:b/>
+                <w:bCs/>
+              </w:rPr>
+            </w:pPr>
+            <w:r>
+              <w:rPr>
+                <w:rFonts w:ascii="Times New Roman" w:eastAsia="標楷體" w:hAnsi="Times New Roman" w:cs="Times New Roman" w:hint="eastAsia"/>
+                <w:b/>
+                <w:bCs/>
+              </w:rPr>
+              <w:t>Feature Name</w:t>
+            </w:r>
+          </w:p>
+        </w:tc>
+      </w:tr>
+      <w:tr>
+        <w:tc>
+          <w:tcPr>
+            <w:tcW w:w="4148" w:type="dxa"/>
+          </w:tcPr>
+          <w:p>
+            <w:pPr>
+              <w:rPr>
+                <w:rFonts w:ascii="Times New Roman" w:eastAsia="標楷體" w:hAnsi="Times New Roman" w:cs="Times New Roman" w:hint="eastAsia"/>
+              </w:rPr>
+            </w:pPr>
+            <w:r>
+              <w:rPr>
+                <w:rFonts w:ascii="Times New Roman" w:eastAsia="標楷體" w:hAnsi="Times New Roman" w:cs="Times New Roman" w:hint="eastAsia"/>
+              </w:rPr>
+              <w:t>FEA-01</w:t>
+            </w:r>
+          </w:p>
+        </w:tc>
+        <w:tc>
+          <w:tcPr>
+            <w:tcW w:w="4148" w:type="dxa"/>
+          </w:tcPr>
+          <w:p>
+            <w:pPr>
+              <w:rPr>
+                <w:rFonts w:ascii="Times New Roman" w:eastAsia="標楷體" w:hAnsi="Times New Roman" w:cs="Times New Roman"/>
+              </w:rPr>
+            </w:pPr>
+            <w:r>
+              <w:rPr>
+                <w:rFonts w:ascii="Times New Roman" w:eastAsia="標楷體" w:hAnsi="Times New Roman" w:cs="Times New Roman" w:hint="eastAsia"/>
+              </w:rPr>
+              <w:t>管理單本書籍</w:t>
+            </w:r>
+          </w:p>
+        </w:tc>
+      </w:tr>
+      <w:tr>
+        <w:tc>
+          <w:tcPr>
+            <w:tcW w:w="4148" w:type="dxa"/>
+          </w:tcPr>
+          <w:p>
+            <w:pPr>
+              <w:rPr>
+                <w:rFonts w:ascii="Times New Roman" w:eastAsia="標楷體" w:hAnsi="Times New Roman" w:cs="Times New Roman" w:hint="eastAsia"/>
+              </w:rPr>
+            </w:pPr>
+            <w:r>
+              <w:rPr>
+                <w:rFonts w:ascii="Times New Roman" w:eastAsia="標楷體" w:hAnsi="Times New Roman" w:cs="Times New Roman" w:hint="eastAsia"/>
+              </w:rPr>
+              <w:t>FEA-02</w:t>
+            </w:r>
+          </w:p>
+        </w:tc>
+        <w:tc>
+          <w:tcPr>
+            <w:tcW w:w="4148" w:type="dxa"/>
+          </w:tcPr>
+          <w:p>
+            <w:pPr>
+              <w:rPr>
+                <w:rFonts w:ascii="Times New Roman" w:eastAsia="標楷體" w:hAnsi="Times New Roman" w:cs="Times New Roman"/>
+              </w:rPr>
+            </w:pPr>
+            <w:r>
+              <w:rPr>
+                <w:rFonts w:ascii="Times New Roman" w:eastAsia="標楷體" w:hAnsi="Times New Roman" w:cs="Times New Roman" w:hint="eastAsia"/>
+              </w:rPr>
+              <w:t>分類多本書籍</w:t>
+            </w:r>
+          </w:p>
+        </w:tc>
+      </w:tr>
+      <w:tr>
+        <w:tc>
+          <w:tcPr>
+            <w:tcW w:w="4148" w:type="dxa"/>
+          </w:tcPr>
+          <w:p>
+            <w:pPr>
+              <w:rPr>
+                <w:rFonts w:ascii="Times New Roman" w:eastAsia="標楷體" w:hAnsi="Times New Roman" w:cs="Times New Roman" w:hint="eastAsia"/>
+              </w:rPr>
+            </w:pPr>
+            <w:r>
+              <w:rPr>
+                <w:rFonts w:ascii="Times New Roman" w:eastAsia="標楷體" w:hAnsi="Times New Roman" w:cs="Times New Roman" w:hint="eastAsia"/>
+              </w:rPr>
+              <w:t>FEA-03</w:t>
+            </w:r>
+          </w:p>
+        </w:tc>
+        <w:tc>
+          <w:tcPr>
+            <w:tcW w:w="4148" w:type="dxa"/>
+          </w:tcPr>
+          <w:p>
+            <w:pPr>
+              <w:rPr>
+                <w:rFonts w:ascii="Times New Roman" w:eastAsia="標楷體" w:hAnsi="Times New Roman" w:cs="Times New Roman"/>
+              </w:rPr>
+            </w:pPr>
+            <w:r>
+              <w:rPr>
+                <w:rFonts w:ascii="Times New Roman" w:eastAsia="標楷體" w:hAnsi="Times New Roman" w:cs="Times New Roman" w:hint="eastAsia"/>
+              </w:rPr>
+              <w:t>私訊功能</w:t>
+            </w:r>
+          </w:p>
+        </w:tc>
+      </w:tr>
+      <w:tr>
+        <w:tc>
+          <w:tcPr>
+            <w:tcW w:w="4148" w:type="dxa"/>
+          </w:tcPr>
+          <w:p>
+            <w:pPr>
+              <w:rPr>
+                <w:rFonts w:ascii="Times New Roman" w:eastAsia="標楷體" w:hAnsi="Times New Roman" w:cs="Times New Roman" w:hint="eastAsia"/>
+              </w:rPr>
+            </w:pPr>
+            <w:r>
+              <w:rPr>
+                <w:rFonts w:ascii="Times New Roman" w:eastAsia="標楷體" w:hAnsi="Times New Roman" w:cs="Times New Roman" w:hint="eastAsia"/>
+              </w:rPr>
+              <w:t>FEA-04</w:t>
+            </w:r>
+          </w:p>
+        </w:tc>
+        <w:tc>
+          <w:tcPr>
+            <w:tcW w:w="4148" w:type="dxa"/>
+          </w:tcPr>
+          <w:p>
+            <w:pPr>
+              <w:rPr>
+                <w:rFonts w:ascii="Times New Roman" w:eastAsia="標楷體" w:hAnsi="Times New Roman" w:cs="Times New Roman"/>
+              </w:rPr>
+            </w:pPr>
+            <w:r>
+              <w:rPr>
+                <w:rFonts w:ascii="Times New Roman" w:eastAsia="標楷體" w:hAnsi="Times New Roman" w:cs="Times New Roman" w:hint="eastAsia"/>
+              </w:rPr>
+              <w:t>搜尋功能</w:t>
+            </w:r>
+          </w:p>
+        </w:tc>
+      </w:tr>
+      <w:tr>
+        <w:tc>
+          <w:tcPr>
+            <w:tcW w:w="4148" w:type="dxa"/>
+          </w:tcPr>
+          <w:p>
+            <w:pPr>
+              <w:rPr>
+                <w:rFonts w:ascii="Times New Roman" w:eastAsia="標楷體" w:hAnsi="Times New Roman" w:cs="Times New Roman" w:hint="eastAsia"/>
+              </w:rPr>
+            </w:pPr>
+            <w:r>
+              <w:rPr>
+                <w:rFonts w:ascii="Times New Roman" w:eastAsia="標楷體" w:hAnsi="Times New Roman" w:cs="Times New Roman" w:hint="eastAsia"/>
+              </w:rPr>
+              <w:t>FEA-05</w:t>
+            </w:r>
+          </w:p>
+        </w:tc>
+        <w:tc>
+          <w:tcPr>
+            <w:tcW w:w="4148" w:type="dxa"/>
+          </w:tcPr>
+          <w:p>
+            <w:pPr>
+              <w:rPr>
+                <w:rFonts w:ascii="Times New Roman" w:eastAsia="標楷體" w:hAnsi="Times New Roman" w:cs="Times New Roman"/>
+              </w:rPr>
+            </w:pPr>
+            <w:r>
+              <w:rPr>
+                <w:rFonts w:ascii="Times New Roman" w:eastAsia="標楷體" w:hAnsi="Times New Roman" w:cs="Times New Roman" w:hint="eastAsia"/>
+              </w:rPr>
+              <w:t>將書籍加入購物車</w:t>
+            </w:r>
+          </w:p>
+        </w:tc>
+      </w:tr>
+    </w:tbl>
+    <w:p>
+      <w:pPr>
         <w:rPr>
           <w:rFonts w:ascii="Times New Roman" w:eastAsia="標楷體" w:hAnsi="Times New Roman" w:cs="Times New Roman" w:hint="eastAsia"/>
         </w:rPr>
-        <w:t>Re:Book</w:t>
-      </w:r>
-      <w:proofErr w:type="spellEnd"/>
-      <w:r>
-        <w:rPr>
-          <w:rFonts w:ascii="Times New Roman" w:eastAsia="標楷體" w:hAnsi="Times New Roman" w:cs="Times New Roman" w:hint="eastAsia"/>
-        </w:rPr>
-        <w:t xml:space="preserve"> </w:t>
-      </w:r>
-      <w:r>
-        <w:rPr>
-          <w:rFonts w:ascii="Times New Roman" w:eastAsia="標楷體" w:hAnsi="Times New Roman" w:cs="Times New Roman" w:hint="eastAsia"/>
-        </w:rPr>
-        <w:t>是一款專為大學生</w:t>
-      </w:r>
-      <w:r>
-        <w:rPr>
-          <w:rFonts w:ascii="Times New Roman" w:eastAsia="標楷體" w:hAnsi="Times New Roman" w:cs="Times New Roman" w:hint="eastAsia"/>
-        </w:rPr>
-        <w:t>、</w:t>
-      </w:r>
-      <w:r>
-        <w:rPr>
-          <w:rFonts w:ascii="Times New Roman" w:eastAsia="標楷體" w:hAnsi="Times New Roman" w:cs="Times New Roman" w:hint="eastAsia"/>
-        </w:rPr>
-        <w:t>研究生與自學者打造的應用程式，旨在解決資源浪費與學術教材成本過高的問題。每逢學期交替、教材需求達到高峰之際，本平台透過行動裝置與網頁介面，串連校園社群與學生網路群組，為二手書流通建立更有效率的媒合橋樑。我們深信此平台的存在具有其必要性，因為每一本書都值得擁有延續價值的機會，而不應被遺忘或淪為廢棄物。</w:t>
-      </w:r>
-    </w:p>
-    <w:p>
-      <w:pPr>
-        <w:rPr>
-          <w:rFonts w:ascii="Times New Roman" w:eastAsia="標楷體" w:hAnsi="Times New Roman" w:cs="Times New Roman"/>
-        </w:rPr>
-      </w:pPr>
-      <w:proofErr w:type="spellStart"/>
-      <w:r>
-        <w:rPr>
-          <w:rFonts w:ascii="Times New Roman" w:eastAsia="標楷體" w:hAnsi="Times New Roman" w:cs="Times New Roman" w:hint="eastAsia"/>
-        </w:rPr>
-        <w:t>Re:Book</w:t>
-      </w:r>
-      <w:proofErr w:type="spellEnd"/>
-      <w:r>
-        <w:rPr>
-          <w:rFonts w:ascii="Times New Roman" w:eastAsia="標楷體" w:hAnsi="Times New Roman" w:cs="Times New Roman" w:hint="eastAsia"/>
-        </w:rPr>
-        <w:t xml:space="preserve"> </w:t>
-      </w:r>
-      <w:r>
-        <w:rPr>
-          <w:rFonts w:ascii="Times New Roman" w:eastAsia="標楷體" w:hAnsi="Times New Roman" w:cs="Times New Roman" w:hint="eastAsia"/>
-        </w:rPr>
-        <w:t>透過直觀且易於操作的交換機制，為二手書注入新的生命。賣家可輸入書名、作者、出版社或</w:t>
-      </w:r>
-      <w:r>
-        <w:rPr>
-          <w:rFonts w:ascii="Times New Roman" w:eastAsia="標楷體" w:hAnsi="Times New Roman" w:cs="Times New Roman" w:hint="eastAsia"/>
-        </w:rPr>
-        <w:t xml:space="preserve"> ISBN </w:t>
-      </w:r>
-      <w:r>
-        <w:rPr>
-          <w:rFonts w:ascii="Times New Roman" w:eastAsia="標楷體" w:hAnsi="Times New Roman" w:cs="Times New Roman" w:hint="eastAsia"/>
-        </w:rPr>
-        <w:t>上架書籍，系統將自動進行分類與整理。為體現對書本價值的尊重，賣家可設定期望售價，並上傳書況照片或分享使用心得。潛在買家則可透過搜尋與篩選功能，快速找到所需書籍。平台同時提供私訊機制，讓雙方協商最終價格與交付方式，確保知識的傳遞過程既順暢高效，也保有人與人之間的溫度。</w:t>
-      </w:r>
+      </w:pPr>
     </w:p>
     <w:p>
       <w:pPr>
@@ -468,18 +753,44 @@
     <w:p>
       <w:pPr>
         <w:pStyle w:val="2"/>
+      </w:pPr>
+      <w:r>
         <w:rPr>
           <w:rFonts w:hint="eastAsia"/>
         </w:rPr>
+        <w:lastRenderedPageBreak/>
+        <w:t xml:space="preserve">1.4 </w:t>
+      </w:r>
+      <w:r>
+        <w:t>Use Case Diagram</w:t>
+      </w:r>
+    </w:p>
+    <w:p>
+      <w:pPr>
+        <w:rPr>
+          <w:rFonts w:ascii="Times New Roman" w:eastAsia="標楷體" w:hAnsi="Times New Roman" w:cs="Times New Roman"/>
+        </w:rPr>
+      </w:pPr>
+    </w:p>
+    <w:p>
+      <w:pPr>
+        <w:rPr>
+          <w:rFonts w:ascii="Times New Roman" w:eastAsia="標楷體" w:hAnsi="Times New Roman" w:cs="Times New Roman"/>
+        </w:rPr>
+      </w:pPr>
+    </w:p>
+    <w:p>
+      <w:pPr>
+        <w:pStyle w:val="2"/>
       </w:pPr>
       <w:r>
         <w:rPr>
           <w:rFonts w:hint="eastAsia"/>
         </w:rPr>
-        <w:t xml:space="preserve">1.3 </w:t>
-      </w:r>
-      <w:r>
-        <w:t>Summary of System Features</w:t>
+        <w:t xml:space="preserve">1.5 </w:t>
+      </w:r>
+      <w:r>
+        <w:t>Use Cases</w:t>
       </w:r>
     </w:p>
     <w:p>
@@ -499,19 +810,51 @@
     <w:p>
       <w:pPr>
         <w:pStyle w:val="2"/>
+      </w:pPr>
+      <w:r>
         <w:rPr>
           <w:rFonts w:hint="eastAsia"/>
         </w:rPr>
+        <w:t xml:space="preserve">1.6 </w:t>
+      </w:r>
+      <w:r>
+        <w:t>Non-functional Requirements and Constraints</w:t>
+      </w:r>
+    </w:p>
+    <w:p>
+      <w:pPr>
+        <w:rPr>
+          <w:rFonts w:ascii="Times New Roman" w:eastAsia="標楷體" w:hAnsi="Times New Roman" w:cs="Times New Roman"/>
+        </w:rPr>
+      </w:pPr>
+    </w:p>
+    <w:p>
+      <w:pPr>
+        <w:rPr>
+          <w:rFonts w:ascii="Times New Roman" w:eastAsia="標楷體" w:hAnsi="Times New Roman" w:cs="Times New Roman"/>
+        </w:rPr>
+      </w:pPr>
+    </w:p>
+    <w:p>
+      <w:pPr>
+        <w:pStyle w:val="2"/>
       </w:pPr>
       <w:r>
         <w:rPr>
           <w:rFonts w:hint="eastAsia"/>
         </w:rPr>
-        <w:t xml:space="preserve">1.4 </w:t>
-      </w:r>
-      <w:r>
-        <w:t>Use Case Diagram</w:t>
-      </w:r>
+        <w:t xml:space="preserve">1.7 </w:t>
+      </w:r>
+      <w:r>
+        <w:t>Glossary</w:t>
+      </w:r>
+    </w:p>
+    <w:p>
+      <w:pPr>
+        <w:rPr>
+          <w:rFonts w:ascii="Times New Roman" w:eastAsia="標楷體" w:hAnsi="Times New Roman" w:cs="Times New Roman"/>
+        </w:rPr>
+      </w:pPr>
     </w:p>
     <w:p>
       <w:pPr>
@@ -530,110 +873,6 @@
     <w:p>
       <w:pPr>
         <w:pStyle w:val="2"/>
-        <w:rPr>
-          <w:rFonts w:hint="eastAsia"/>
-        </w:rPr>
-      </w:pPr>
-      <w:r>
-        <w:rPr>
-          <w:rFonts w:hint="eastAsia"/>
-        </w:rPr>
-        <w:lastRenderedPageBreak/>
-        <w:t xml:space="preserve">1.5 </w:t>
-      </w:r>
-      <w:r>
-        <w:t>Use Cases</w:t>
-      </w:r>
-    </w:p>
-    <w:p>
-      <w:pPr>
-        <w:rPr>
-          <w:rFonts w:ascii="Times New Roman" w:eastAsia="標楷體" w:hAnsi="Times New Roman" w:cs="Times New Roman"/>
-        </w:rPr>
-      </w:pPr>
-    </w:p>
-    <w:p>
-      <w:pPr>
-        <w:rPr>
-          <w:rFonts w:ascii="Times New Roman" w:eastAsia="標楷體" w:hAnsi="Times New Roman" w:cs="Times New Roman"/>
-        </w:rPr>
-      </w:pPr>
-    </w:p>
-    <w:p>
-      <w:pPr>
-        <w:pStyle w:val="2"/>
-        <w:rPr>
-          <w:rFonts w:hint="eastAsia"/>
-        </w:rPr>
-      </w:pPr>
-      <w:r>
-        <w:rPr>
-          <w:rFonts w:hint="eastAsia"/>
-        </w:rPr>
-        <w:t xml:space="preserve">1.6 </w:t>
-      </w:r>
-      <w:r>
-        <w:t>Non-functional Requirements and Constraints</w:t>
-      </w:r>
-    </w:p>
-    <w:p>
-      <w:pPr>
-        <w:rPr>
-          <w:rFonts w:ascii="Times New Roman" w:eastAsia="標楷體" w:hAnsi="Times New Roman" w:cs="Times New Roman"/>
-        </w:rPr>
-      </w:pPr>
-    </w:p>
-    <w:p>
-      <w:pPr>
-        <w:rPr>
-          <w:rFonts w:ascii="Times New Roman" w:eastAsia="標楷體" w:hAnsi="Times New Roman" w:cs="Times New Roman"/>
-        </w:rPr>
-      </w:pPr>
-    </w:p>
-    <w:p>
-      <w:pPr>
-        <w:pStyle w:val="2"/>
-        <w:rPr>
-          <w:rFonts w:hint="eastAsia"/>
-        </w:rPr>
-      </w:pPr>
-      <w:r>
-        <w:rPr>
-          <w:rFonts w:hint="eastAsia"/>
-        </w:rPr>
-        <w:t xml:space="preserve">1.7 </w:t>
-      </w:r>
-      <w:r>
-        <w:t>Glossary</w:t>
-      </w:r>
-    </w:p>
-    <w:p>
-      <w:pPr>
-        <w:rPr>
-          <w:rFonts w:ascii="Times New Roman" w:eastAsia="標楷體" w:hAnsi="Times New Roman" w:cs="Times New Roman"/>
-        </w:rPr>
-      </w:pPr>
-    </w:p>
-    <w:p>
-      <w:pPr>
-        <w:rPr>
-          <w:rFonts w:ascii="Times New Roman" w:eastAsia="標楷體" w:hAnsi="Times New Roman" w:cs="Times New Roman"/>
-        </w:rPr>
-      </w:pPr>
-    </w:p>
-    <w:p>
-      <w:pPr>
-        <w:rPr>
-          <w:rFonts w:ascii="Times New Roman" w:eastAsia="標楷體" w:hAnsi="Times New Roman" w:cs="Times New Roman"/>
-        </w:rPr>
-      </w:pPr>
-    </w:p>
-    <w:p>
-      <w:pPr>
-        <w:pStyle w:val="2"/>
-        <w:rPr>
-          <w:rFonts w:hint="eastAsia"/>
-        </w:rPr>
       </w:pPr>
       <w:r>
         <w:rPr>
@@ -671,7 +910,7 @@
           <w:numId w:val="1"/>
         </w:numPr>
         <w:rPr>
-          <w:rFonts w:ascii="Times New Roman" w:eastAsia="標楷體" w:hAnsi="Times New Roman" w:cs="Times New Roman" w:hint="eastAsia"/>
+          <w:rFonts w:ascii="Times New Roman" w:eastAsia="標楷體" w:hAnsi="Times New Roman" w:cs="Times New Roman"/>
         </w:rPr>
       </w:pPr>
       <w:r>
@@ -684,7 +923,7 @@
     <w:p>
       <w:pPr>
         <w:rPr>
-          <w:rFonts w:ascii="Times New Roman" w:eastAsia="標楷體" w:hAnsi="Times New Roman" w:cs="Times New Roman" w:hint="eastAsia"/>
+          <w:rFonts w:ascii="Times New Roman" w:eastAsia="標楷體" w:hAnsi="Times New Roman" w:cs="Times New Roman"/>
         </w:rPr>
       </w:pPr>
     </w:p>
@@ -763,7 +1002,7 @@
 </file>
 
 <file path=word/endnotes.xml><?xml version="1.0" encoding="utf-8"?>
-<w:endnotes xmlns:wpc="http://schemas.microsoft.com/office/word/2010/wordprocessingCanvas" xmlns:cx="http://schemas.microsoft.com/office/drawing/2014/chartex" xmlns:cx1="http://schemas.microsoft.com/office/drawing/2015/9/8/chartex" xmlns:cx2="http://schemas.microsoft.com/office/drawing/2015/10/21/chartex" xmlns:cx3="http://schemas.microsoft.com/office/drawing/2016/5/9/chartex" xmlns:cx4="http://schemas.microsoft.com/office/drawing/2016/5/10/chartex" xmlns:cx5="http://schemas.microsoft.com/office/drawing/2016/5/11/chartex" xmlns:cx6="http://schemas.microsoft.com/office/drawing/2016/5/12/chartex" xmlns:cx7="http://schemas.microsoft.com/office/drawing/2016/5/13/chartex" xmlns:cx8="http://schemas.microsoft.com/office/drawing/2016/5/14/chartex" xmlns:mc="http://schemas.openxmlformats.org/markup-compatibility/2006" xmlns:aink="http://schemas.microsoft.com/office/drawing/2016/ink" xmlns:am3d="http://schemas.microsoft.com/office/drawing/2017/model3d" xmlns:o="urn:schemas-microsoft-com:office:office" xmlns:oel="http://schemas.microsoft.com/office/2019/extlst" xmlns:r="http://schemas.openxmlformats.org/officeDocument/2006/relationships" xmlns:m="http://schemas.openxmlformats.org/officeDocument/2006/math" xmlns:v="urn:schemas-microsoft-com:vml" xmlns:wp14="http://schemas.microsoft.com/office/word/2010/wordprocessingDrawing" xmlns:wp="http://schemas.openxmlformats.org/drawingml/2006/wordprocessingDrawing" xmlns:w10="urn:schemas-microsoft-com:office:word" xmlns:w="http://schemas.openxmlformats.org/wordprocessingml/2006/main" xmlns:w14="http://schemas.microsoft.com/office/word/2010/wordml" xmlns:w15="http://schemas.microsoft.com/office/word/2012/wordml" xmlns:w16cex="http://schemas.microsoft.com/office/word/2018/wordml/cex" xmlns:w16cid="http://schemas.microsoft.com/office/word/2016/wordml/cid" xmlns:w16="http://schemas.microsoft.com/office/word/2018/wordml" xmlns:w16du="http://schemas.microsoft.com/office/word/2023/wordml/word16du" xmlns:w16sdtdh="http://schemas.microsoft.com/office/word/2020/wordml/sdtdatahash" xmlns:w16sdtfl="http://schemas.microsoft.com/office/word/2024/wordml/sdtformatlock" xmlns:w16se="http://schemas.microsoft.com/office/word/2015/wordml/symex" xmlns:wpg="http://schemas.microsoft.com/office/word/2010/wordprocessingGroup" xmlns:wpi="http://schemas.microsoft.com/office/word/2010/wordprocessingInk" xmlns:wne="http://schemas.microsoft.com/office/word/2006/wordml" xmlns:wps="http://schemas.microsoft.com/office/word/2010/wordprocessingShape" mc:Ignorable="w14 w15 w16se w16cid w16 w16cex w16sdtdh w16sdtfl w16du wp14">
+<w:endnotes xmlns:wpc="http://schemas.microsoft.com/office/word/2010/wordprocessingCanvas" xmlns:cx="http://schemas.microsoft.com/office/drawing/2014/chartex" xmlns:cx1="http://schemas.microsoft.com/office/drawing/2015/9/8/chartex" xmlns:cx2="http://schemas.microsoft.com/office/drawing/2015/10/21/chartex" xmlns:cx3="http://schemas.microsoft.com/office/drawing/2016/5/9/chartex" xmlns:cx4="http://schemas.microsoft.com/office/drawing/2016/5/10/chartex" xmlns:cx5="http://schemas.microsoft.com/office/drawing/2016/5/11/chartex" xmlns:cx6="http://schemas.microsoft.com/office/drawing/2016/5/12/chartex" xmlns:cx7="http://schemas.microsoft.com/office/drawing/2016/5/13/chartex" xmlns:cx8="http://schemas.microsoft.com/office/drawing/2016/5/14/chartex" xmlns:mc="http://schemas.openxmlformats.org/markup-compatibility/2006" xmlns:aink="http://schemas.microsoft.com/office/drawing/2016/ink" xmlns:am3d="http://schemas.microsoft.com/office/drawing/2017/model3d" xmlns:o="urn:schemas-microsoft-com:office:office" xmlns:oel="http://schemas.microsoft.com/office/2019/extlst" xmlns:r="http://schemas.openxmlformats.org/officeDocument/2006/relationships" xmlns:m="http://schemas.openxmlformats.org/officeDocument/2006/math" xmlns:v="urn:schemas-microsoft-com:vml" xmlns:wp14="http://schemas.microsoft.com/office/word/2010/wordprocessingDrawing" xmlns:wp="http://schemas.openxmlformats.org/drawingml/2006/wordprocessingDrawing" xmlns:w10="urn:schemas-microsoft-com:office:word" xmlns:w="http://schemas.openxmlformats.org/wordprocessingml/2006/main" xmlns:w14="http://schemas.microsoft.com/office/word/2010/wordml" xmlns:w15="http://schemas.microsoft.com/office/word/2012/wordml" xmlns:w16cex="http://schemas.microsoft.com/office/word/2018/wordml/cex" xmlns:w16cid="http://schemas.microsoft.com/office/word/2016/wordml/cid" xmlns:w16="http://schemas.microsoft.com/office/word/2018/wordml" xmlns:w16sdtdh="http://schemas.microsoft.com/office/word/2020/wordml/sdtdatahash" xmlns:w16se="http://schemas.microsoft.com/office/word/2015/wordml/symex" xmlns:wpg="http://schemas.microsoft.com/office/word/2010/wordprocessingGroup" xmlns:wpi="http://schemas.microsoft.com/office/word/2010/wordprocessingInk" xmlns:wne="http://schemas.microsoft.com/office/word/2006/wordml" xmlns:wps="http://schemas.microsoft.com/office/word/2010/wordprocessingShape" mc:Ignorable="w14 w15 w16se w16cid w16 w16cex w16sdtdh wp14">
   <w:endnote w:type="separator" w:id="-1">
     <w:p>
       <w:pPr>
@@ -788,7 +1027,7 @@
 </file>
 
 <file path=word/footnotes.xml><?xml version="1.0" encoding="utf-8"?>
-<w:footnotes xmlns:wpc="http://schemas.microsoft.com/office/word/2010/wordprocessingCanvas" xmlns:cx="http://schemas.microsoft.com/office/drawing/2014/chartex" xmlns:cx1="http://schemas.microsoft.com/office/drawing/2015/9/8/chartex" xmlns:cx2="http://schemas.microsoft.com/office/drawing/2015/10/21/chartex" xmlns:cx3="http://schemas.microsoft.com/office/drawing/2016/5/9/chartex" xmlns:cx4="http://schemas.microsoft.com/office/drawing/2016/5/10/chartex" xmlns:cx5="http://schemas.microsoft.com/office/drawing/2016/5/11/chartex" xmlns:cx6="http://schemas.microsoft.com/office/drawing/2016/5/12/chartex" xmlns:cx7="http://schemas.microsoft.com/office/drawing/2016/5/13/chartex" xmlns:cx8="http://schemas.microsoft.com/office/drawing/2016/5/14/chartex" xmlns:mc="http://schemas.openxmlformats.org/markup-compatibility/2006" xmlns:aink="http://schemas.microsoft.com/office/drawing/2016/ink" xmlns:am3d="http://schemas.microsoft.com/office/drawing/2017/model3d" xmlns:o="urn:schemas-microsoft-com:office:office" xmlns:oel="http://schemas.microsoft.com/office/2019/extlst" xmlns:r="http://schemas.openxmlformats.org/officeDocument/2006/relationships" xmlns:m="http://schemas.openxmlformats.org/officeDocument/2006/math" xmlns:v="urn:schemas-microsoft-com:vml" xmlns:wp14="http://schemas.microsoft.com/office/word/2010/wordprocessingDrawing" xmlns:wp="http://schemas.openxmlformats.org/drawingml/2006/wordprocessingDrawing" xmlns:w10="urn:schemas-microsoft-com:office:word" xmlns:w="http://schemas.openxmlformats.org/wordprocessingml/2006/main" xmlns:w14="http://schemas.microsoft.com/office/word/2010/wordml" xmlns:w15="http://schemas.microsoft.com/office/word/2012/wordml" xmlns:w16cex="http://schemas.microsoft.com/office/word/2018/wordml/cex" xmlns:w16cid="http://schemas.microsoft.com/office/word/2016/wordml/cid" xmlns:w16="http://schemas.microsoft.com/office/word/2018/wordml" xmlns:w16du="http://schemas.microsoft.com/office/word/2023/wordml/word16du" xmlns:w16sdtdh="http://schemas.microsoft.com/office/word/2020/wordml/sdtdatahash" xmlns:w16sdtfl="http://schemas.microsoft.com/office/word/2024/wordml/sdtformatlock" xmlns:w16se="http://schemas.microsoft.com/office/word/2015/wordml/symex" xmlns:wpg="http://schemas.microsoft.com/office/word/2010/wordprocessingGroup" xmlns:wpi="http://schemas.microsoft.com/office/word/2010/wordprocessingInk" xmlns:wne="http://schemas.microsoft.com/office/word/2006/wordml" xmlns:wps="http://schemas.microsoft.com/office/word/2010/wordprocessingShape" mc:Ignorable="w14 w15 w16se w16cid w16 w16cex w16sdtdh w16sdtfl w16du wp14">
+<w:footnotes xmlns:wpc="http://schemas.microsoft.com/office/word/2010/wordprocessingCanvas" xmlns:cx="http://schemas.microsoft.com/office/drawing/2014/chartex" xmlns:cx1="http://schemas.microsoft.com/office/drawing/2015/9/8/chartex" xmlns:cx2="http://schemas.microsoft.com/office/drawing/2015/10/21/chartex" xmlns:cx3="http://schemas.microsoft.com/office/drawing/2016/5/9/chartex" xmlns:cx4="http://schemas.microsoft.com/office/drawing/2016/5/10/chartex" xmlns:cx5="http://schemas.microsoft.com/office/drawing/2016/5/11/chartex" xmlns:cx6="http://schemas.microsoft.com/office/drawing/2016/5/12/chartex" xmlns:cx7="http://schemas.microsoft.com/office/drawing/2016/5/13/chartex" xmlns:cx8="http://schemas.microsoft.com/office/drawing/2016/5/14/chartex" xmlns:mc="http://schemas.openxmlformats.org/markup-compatibility/2006" xmlns:aink="http://schemas.microsoft.com/office/drawing/2016/ink" xmlns:am3d="http://schemas.microsoft.com/office/drawing/2017/model3d" xmlns:o="urn:schemas-microsoft-com:office:office" xmlns:oel="http://schemas.microsoft.com/office/2019/extlst" xmlns:r="http://schemas.openxmlformats.org/officeDocument/2006/relationships" xmlns:m="http://schemas.openxmlformats.org/officeDocument/2006/math" xmlns:v="urn:schemas-microsoft-com:vml" xmlns:wp14="http://schemas.microsoft.com/office/word/2010/wordprocessingDrawing" xmlns:wp="http://schemas.openxmlformats.org/drawingml/2006/wordprocessingDrawing" xmlns:w10="urn:schemas-microsoft-com:office:word" xmlns:w="http://schemas.openxmlformats.org/wordprocessingml/2006/main" xmlns:w14="http://schemas.microsoft.com/office/word/2010/wordml" xmlns:w15="http://schemas.microsoft.com/office/word/2012/wordml" xmlns:w16cex="http://schemas.microsoft.com/office/word/2018/wordml/cex" xmlns:w16cid="http://schemas.microsoft.com/office/word/2016/wordml/cid" xmlns:w16="http://schemas.microsoft.com/office/word/2018/wordml" xmlns:w16sdtdh="http://schemas.microsoft.com/office/word/2020/wordml/sdtdatahash" xmlns:w16se="http://schemas.microsoft.com/office/word/2015/wordml/symex" xmlns:wpg="http://schemas.microsoft.com/office/word/2010/wordprocessingGroup" xmlns:wpi="http://schemas.microsoft.com/office/word/2010/wordprocessingInk" xmlns:wne="http://schemas.microsoft.com/office/word/2006/wordml" xmlns:wps="http://schemas.microsoft.com/office/word/2010/wordprocessingShape" mc:Ignorable="w14 w15 w16se w16cid w16 w16cex w16sdtdh wp14">
   <w:footnote w:type="separator" w:id="-1">
     <w:p>
       <w:pPr>
@@ -813,7 +1052,7 @@
 </file>
 
 <file path=word/numbering.xml><?xml version="1.0" encoding="utf-8"?>
-<w:numbering xmlns:wpc="http://schemas.microsoft.com/office/word/2010/wordprocessingCanvas" xmlns:cx="http://schemas.microsoft.com/office/drawing/2014/chartex" xmlns:cx1="http://schemas.microsoft.com/office/drawing/2015/9/8/chartex" xmlns:cx2="http://schemas.microsoft.com/office/drawing/2015/10/21/chartex" xmlns:cx3="http://schemas.microsoft.com/office/drawing/2016/5/9/chartex" xmlns:cx4="http://schemas.microsoft.com/office/drawing/2016/5/10/chartex" xmlns:cx5="http://schemas.microsoft.com/office/drawing/2016/5/11/chartex" xmlns:cx6="http://schemas.microsoft.com/office/drawing/2016/5/12/chartex" xmlns:cx7="http://schemas.microsoft.com/office/drawing/2016/5/13/chartex" xmlns:cx8="http://schemas.microsoft.com/office/drawing/2016/5/14/chartex" xmlns:mc="http://schemas.openxmlformats.org/markup-compatibility/2006" xmlns:aink="http://schemas.microsoft.com/office/drawing/2016/ink" xmlns:am3d="http://schemas.microsoft.com/office/drawing/2017/model3d" xmlns:o="urn:schemas-microsoft-com:office:office" xmlns:oel="http://schemas.microsoft.com/office/2019/extlst" xmlns:r="http://schemas.openxmlformats.org/officeDocument/2006/relationships" xmlns:m="http://schemas.openxmlformats.org/officeDocument/2006/math" xmlns:v="urn:schemas-microsoft-com:vml" xmlns:wp14="http://schemas.microsoft.com/office/word/2010/wordprocessingDrawing" xmlns:wp="http://schemas.openxmlformats.org/drawingml/2006/wordprocessingDrawing" xmlns:w10="urn:schemas-microsoft-com:office:word" xmlns:w="http://schemas.openxmlformats.org/wordprocessingml/2006/main" xmlns:w14="http://schemas.microsoft.com/office/word/2010/wordml" xmlns:w15="http://schemas.microsoft.com/office/word/2012/wordml" xmlns:w16cex="http://schemas.microsoft.com/office/word/2018/wordml/cex" xmlns:w16cid="http://schemas.microsoft.com/office/word/2016/wordml/cid" xmlns:w16="http://schemas.microsoft.com/office/word/2018/wordml" xmlns:w16du="http://schemas.microsoft.com/office/word/2023/wordml/word16du" xmlns:w16sdtdh="http://schemas.microsoft.com/office/word/2020/wordml/sdtdatahash" xmlns:w16sdtfl="http://schemas.microsoft.com/office/word/2024/wordml/sdtformatlock" xmlns:w16se="http://schemas.microsoft.com/office/word/2015/wordml/symex" xmlns:wpg="http://schemas.microsoft.com/office/word/2010/wordprocessingGroup" xmlns:wpi="http://schemas.microsoft.com/office/word/2010/wordprocessingInk" xmlns:wne="http://schemas.microsoft.com/office/word/2006/wordml" xmlns:wps="http://schemas.microsoft.com/office/word/2010/wordprocessingShape" mc:Ignorable="w14 w15 w16se w16cid w16 w16cex w16sdtdh w16sdtfl w16du wp14">
+<w:numbering xmlns:wpc="http://schemas.microsoft.com/office/word/2010/wordprocessingCanvas" xmlns:cx="http://schemas.microsoft.com/office/drawing/2014/chartex" xmlns:cx1="http://schemas.microsoft.com/office/drawing/2015/9/8/chartex" xmlns:cx2="http://schemas.microsoft.com/office/drawing/2015/10/21/chartex" xmlns:cx3="http://schemas.microsoft.com/office/drawing/2016/5/9/chartex" xmlns:cx4="http://schemas.microsoft.com/office/drawing/2016/5/10/chartex" xmlns:cx5="http://schemas.microsoft.com/office/drawing/2016/5/11/chartex" xmlns:cx6="http://schemas.microsoft.com/office/drawing/2016/5/12/chartex" xmlns:cx7="http://schemas.microsoft.com/office/drawing/2016/5/13/chartex" xmlns:cx8="http://schemas.microsoft.com/office/drawing/2016/5/14/chartex" xmlns:mc="http://schemas.openxmlformats.org/markup-compatibility/2006" xmlns:aink="http://schemas.microsoft.com/office/drawing/2016/ink" xmlns:am3d="http://schemas.microsoft.com/office/drawing/2017/model3d" xmlns:o="urn:schemas-microsoft-com:office:office" xmlns:oel="http://schemas.microsoft.com/office/2019/extlst" xmlns:r="http://schemas.openxmlformats.org/officeDocument/2006/relationships" xmlns:m="http://schemas.openxmlformats.org/officeDocument/2006/math" xmlns:v="urn:schemas-microsoft-com:vml" xmlns:wp14="http://schemas.microsoft.com/office/word/2010/wordprocessingDrawing" xmlns:wp="http://schemas.openxmlformats.org/drawingml/2006/wordprocessingDrawing" xmlns:w10="urn:schemas-microsoft-com:office:word" xmlns:w="http://schemas.openxmlformats.org/wordprocessingml/2006/main" xmlns:w14="http://schemas.microsoft.com/office/word/2010/wordml" xmlns:w15="http://schemas.microsoft.com/office/word/2012/wordml" xmlns:w16cex="http://schemas.microsoft.com/office/word/2018/wordml/cex" xmlns:w16cid="http://schemas.microsoft.com/office/word/2016/wordml/cid" xmlns:w16="http://schemas.microsoft.com/office/word/2018/wordml" xmlns:w16sdtdh="http://schemas.microsoft.com/office/word/2020/wordml/sdtdatahash" xmlns:w16se="http://schemas.microsoft.com/office/word/2015/wordml/symex" xmlns:wpg="http://schemas.microsoft.com/office/word/2010/wordprocessingGroup" xmlns:wpi="http://schemas.microsoft.com/office/word/2010/wordprocessingInk" xmlns:wne="http://schemas.microsoft.com/office/word/2006/wordml" xmlns:wps="http://schemas.microsoft.com/office/word/2010/wordprocessingShape" mc:Ignorable="w14 w15 w16se w16cid w16 w16cex w16sdtdh wp14">
   <w:abstractNum w:abstractNumId="0" w15:restartNumberingAfterBreak="0">
     <w:nsid w:val="261C4754"/>
     <w:multiLevelType w:val="multilevel"/>
@@ -1050,7 +1289,7 @@
 </file>
 
 <file path=word/styles.xml><?xml version="1.0" encoding="utf-8"?>
-<w:styles xmlns:mc="http://schemas.openxmlformats.org/markup-compatibility/2006" xmlns:r="http://schemas.openxmlformats.org/officeDocument/2006/relationships" xmlns:w="http://schemas.openxmlformats.org/wordprocessingml/2006/main" xmlns:w14="http://schemas.microsoft.com/office/word/2010/wordml" xmlns:w15="http://schemas.microsoft.com/office/word/2012/wordml" xmlns:w16cex="http://schemas.microsoft.com/office/word/2018/wordml/cex" xmlns:w16cid="http://schemas.microsoft.com/office/word/2016/wordml/cid" xmlns:w16="http://schemas.microsoft.com/office/word/2018/wordml" xmlns:w16du="http://schemas.microsoft.com/office/word/2023/wordml/word16du" xmlns:w16sdtdh="http://schemas.microsoft.com/office/word/2020/wordml/sdtdatahash" xmlns:w16sdtfl="http://schemas.microsoft.com/office/word/2024/wordml/sdtformatlock" xmlns:w16se="http://schemas.microsoft.com/office/word/2015/wordml/symex" mc:Ignorable="w14 w15 w16se w16cid w16 w16cex w16sdtdh w16sdtfl w16du">
+<w:styles xmlns:mc="http://schemas.openxmlformats.org/markup-compatibility/2006" xmlns:r="http://schemas.openxmlformats.org/officeDocument/2006/relationships" xmlns:w="http://schemas.openxmlformats.org/wordprocessingml/2006/main" xmlns:w14="http://schemas.microsoft.com/office/word/2010/wordml" xmlns:w15="http://schemas.microsoft.com/office/word/2012/wordml" xmlns:w16cex="http://schemas.microsoft.com/office/word/2018/wordml/cex" xmlns:w16cid="http://schemas.microsoft.com/office/word/2016/wordml/cid" xmlns:w16="http://schemas.microsoft.com/office/word/2018/wordml" xmlns:w16sdtdh="http://schemas.microsoft.com/office/word/2020/wordml/sdtdatahash" xmlns:w16se="http://schemas.microsoft.com/office/word/2015/wordml/symex" mc:Ignorable="w14 w15 w16se w16cid w16 w16cex w16sdtdh">
   <w:docDefaults>
     <w:rPrDefault>
       <w:rPr>
@@ -1653,6 +1892,7 @@
   <w:style w:type="character" w:default="1" w:styleId="a0">
     <w:name w:val="Default Paragraph Font"/>
     <w:uiPriority w:val="1"/>
+    <w:semiHidden/>
     <w:unhideWhenUsed/>
   </w:style>
   <w:style w:type="table" w:default="1" w:styleId="a1">
@@ -2022,6 +2262,25 @@
       <w:sz w:val="20"/>
       <w:szCs w:val="20"/>
     </w:rPr>
+  </w:style>
+  <w:style w:type="table" w:styleId="af2">
+    <w:name w:val="Table Grid"/>
+    <w:basedOn w:val="a1"/>
+    <w:uiPriority w:val="39"/>
+    <w:rsid w:val="00B33E10"/>
+    <w:pPr>
+      <w:spacing w:after="0" w:line="240" w:lineRule="auto"/>
+    </w:pPr>
+    <w:tblPr>
+      <w:tblBorders>
+        <w:top w:val="single" w:sz="4" w:space="0" w:color="auto"/>
+        <w:left w:val="single" w:sz="4" w:space="0" w:color="auto"/>
+        <w:bottom w:val="single" w:sz="4" w:space="0" w:color="auto"/>
+        <w:right w:val="single" w:sz="4" w:space="0" w:color="auto"/>
+        <w:insideH w:val="single" w:sz="4" w:space="0" w:color="auto"/>
+        <w:insideV w:val="single" w:sz="4" w:space="0" w:color="auto"/>
+      </w:tblBorders>
+    </w:tblPr>
   </w:style>
 </w:styles>
 </file>

</xml_diff>

<commit_message>
doc: edit UC and NFR
</commit_message>
<xml_diff>
--- a/document/hw2.docx
+++ b/document/hw2.docx
@@ -83,7 +83,6 @@
           <w:szCs w:val="52"/>
         </w:rPr>
       </w:pPr>
-      <w:proofErr w:type="spellStart"/>
       <w:r>
         <w:rPr>
           <w:rFonts w:ascii="Times New Roman" w:eastAsia="標楷體" w:hAnsi="Times New Roman" w:cs="Times New Roman" w:hint="eastAsia"/>
@@ -94,7 +93,6 @@
         </w:rPr>
         <w:t>Re:Book</w:t>
       </w:r>
-      <w:proofErr w:type="spellEnd"/>
     </w:p>
     <w:p>
       <w:pPr>
@@ -359,14 +357,12 @@
           <w:rFonts w:ascii="Times New Roman" w:eastAsia="標楷體" w:hAnsi="Times New Roman" w:cs="Times New Roman"/>
         </w:rPr>
       </w:pPr>
-      <w:proofErr w:type="spellStart"/>
       <w:r>
         <w:rPr>
           <w:rFonts w:ascii="Times New Roman" w:eastAsia="標楷體" w:hAnsi="Times New Roman" w:cs="Times New Roman"/>
         </w:rPr>
         <w:t>Re:Book</w:t>
       </w:r>
-      <w:proofErr w:type="spellEnd"/>
       <w:r>
         <w:rPr>
           <w:rFonts w:ascii="Times New Roman" w:eastAsia="標楷體" w:hAnsi="Times New Roman" w:cs="Times New Roman"/>
@@ -380,19 +376,11 @@
           <w:rFonts w:ascii="Times New Roman" w:eastAsia="標楷體" w:hAnsi="Times New Roman" w:cs="Times New Roman"/>
         </w:rPr>
       </w:pPr>
-      <w:proofErr w:type="spellStart"/>
       <w:r>
         <w:rPr>
           <w:rFonts w:ascii="Times New Roman" w:eastAsia="標楷體" w:hAnsi="Times New Roman" w:cs="Times New Roman" w:hint="eastAsia"/>
         </w:rPr>
-        <w:t>Re:Book</w:t>
-      </w:r>
-      <w:proofErr w:type="spellEnd"/>
-      <w:r>
-        <w:rPr>
-          <w:rFonts w:ascii="Times New Roman" w:eastAsia="標楷體" w:hAnsi="Times New Roman" w:cs="Times New Roman" w:hint="eastAsia"/>
-        </w:rPr>
-        <w:t xml:space="preserve"> </w:t>
+        <w:t xml:space="preserve">Re:Book </w:t>
       </w:r>
       <w:r>
         <w:rPr>
@@ -419,19 +407,11 @@
           <w:rFonts w:ascii="Times New Roman" w:eastAsia="標楷體" w:hAnsi="Times New Roman" w:cs="Times New Roman"/>
         </w:rPr>
       </w:pPr>
-      <w:proofErr w:type="spellStart"/>
       <w:r>
         <w:rPr>
           <w:rFonts w:ascii="Times New Roman" w:eastAsia="標楷體" w:hAnsi="Times New Roman" w:cs="Times New Roman" w:hint="eastAsia"/>
         </w:rPr>
-        <w:t>Re:Book</w:t>
-      </w:r>
-      <w:proofErr w:type="spellEnd"/>
-      <w:r>
-        <w:rPr>
-          <w:rFonts w:ascii="Times New Roman" w:eastAsia="標楷體" w:hAnsi="Times New Roman" w:cs="Times New Roman" w:hint="eastAsia"/>
-        </w:rPr>
-        <w:t xml:space="preserve"> </w:t>
+        <w:t xml:space="preserve">Re:Book </w:t>
       </w:r>
       <w:r>
         <w:rPr>
@@ -505,7 +485,7 @@
             <w:pPr>
               <w:jc w:val="center"/>
               <w:rPr>
-                <w:rFonts w:ascii="Times New Roman" w:eastAsia="標楷體" w:hAnsi="Times New Roman" w:cs="Times New Roman" w:hint="eastAsia"/>
+                <w:rFonts w:ascii="Times New Roman" w:eastAsia="標楷體" w:hAnsi="Times New Roman" w:cs="Times New Roman"/>
                 <w:b/>
                 <w:bCs/>
               </w:rPr>
@@ -529,7 +509,7 @@
             <w:pPr>
               <w:jc w:val="center"/>
               <w:rPr>
-                <w:rFonts w:ascii="Times New Roman" w:eastAsia="標楷體" w:hAnsi="Times New Roman" w:cs="Times New Roman" w:hint="eastAsia"/>
+                <w:rFonts w:ascii="Times New Roman" w:eastAsia="標楷體" w:hAnsi="Times New Roman" w:cs="Times New Roman"/>
                 <w:b/>
                 <w:bCs/>
               </w:rPr>
@@ -553,7 +533,7 @@
           <w:p>
             <w:pPr>
               <w:rPr>
-                <w:rFonts w:ascii="Times New Roman" w:eastAsia="標楷體" w:hAnsi="Times New Roman" w:cs="Times New Roman" w:hint="eastAsia"/>
+                <w:rFonts w:ascii="Times New Roman" w:eastAsia="標楷體" w:hAnsi="Times New Roman" w:cs="Times New Roman"/>
               </w:rPr>
             </w:pPr>
             <w:r>
@@ -591,7 +571,7 @@
           <w:p>
             <w:pPr>
               <w:rPr>
-                <w:rFonts w:ascii="Times New Roman" w:eastAsia="標楷體" w:hAnsi="Times New Roman" w:cs="Times New Roman" w:hint="eastAsia"/>
+                <w:rFonts w:ascii="Times New Roman" w:eastAsia="標楷體" w:hAnsi="Times New Roman" w:cs="Times New Roman"/>
               </w:rPr>
             </w:pPr>
             <w:r>
@@ -616,6 +596,82 @@
               <w:rPr>
                 <w:rFonts w:ascii="Times New Roman" w:eastAsia="標楷體" w:hAnsi="Times New Roman" w:cs="Times New Roman" w:hint="eastAsia"/>
               </w:rPr>
+              <w:t>搜尋功能</w:t>
+            </w:r>
+          </w:p>
+        </w:tc>
+      </w:tr>
+      <w:tr>
+        <w:tc>
+          <w:tcPr>
+            <w:tcW w:w="4148" w:type="dxa"/>
+          </w:tcPr>
+          <w:p>
+            <w:pPr>
+              <w:rPr>
+                <w:rFonts w:ascii="Times New Roman" w:eastAsia="標楷體" w:hAnsi="Times New Roman" w:cs="Times New Roman"/>
+              </w:rPr>
+            </w:pPr>
+            <w:r>
+              <w:rPr>
+                <w:rFonts w:ascii="Times New Roman" w:eastAsia="標楷體" w:hAnsi="Times New Roman" w:cs="Times New Roman" w:hint="eastAsia"/>
+              </w:rPr>
+              <w:t>FEA-03</w:t>
+            </w:r>
+          </w:p>
+        </w:tc>
+        <w:tc>
+          <w:tcPr>
+            <w:tcW w:w="4148" w:type="dxa"/>
+          </w:tcPr>
+          <w:p>
+            <w:pPr>
+              <w:rPr>
+                <w:rFonts w:ascii="Times New Roman" w:eastAsia="標楷體" w:hAnsi="Times New Roman" w:cs="Times New Roman"/>
+              </w:rPr>
+            </w:pPr>
+            <w:r>
+              <w:rPr>
+                <w:rFonts w:ascii="Times New Roman" w:eastAsia="標楷體" w:hAnsi="Times New Roman" w:cs="Times New Roman" w:hint="eastAsia"/>
+              </w:rPr>
+              <w:t>私訊功能</w:t>
+            </w:r>
+          </w:p>
+        </w:tc>
+      </w:tr>
+      <w:tr>
+        <w:tc>
+          <w:tcPr>
+            <w:tcW w:w="4148" w:type="dxa"/>
+          </w:tcPr>
+          <w:p>
+            <w:pPr>
+              <w:rPr>
+                <w:rFonts w:ascii="Times New Roman" w:eastAsia="標楷體" w:hAnsi="Times New Roman" w:cs="Times New Roman"/>
+              </w:rPr>
+            </w:pPr>
+            <w:r>
+              <w:rPr>
+                <w:rFonts w:ascii="Times New Roman" w:eastAsia="標楷體" w:hAnsi="Times New Roman" w:cs="Times New Roman" w:hint="eastAsia"/>
+              </w:rPr>
+              <w:t>FEA-04</w:t>
+            </w:r>
+          </w:p>
+        </w:tc>
+        <w:tc>
+          <w:tcPr>
+            <w:tcW w:w="4148" w:type="dxa"/>
+          </w:tcPr>
+          <w:p>
+            <w:pPr>
+              <w:rPr>
+                <w:rFonts w:ascii="Times New Roman" w:eastAsia="標楷體" w:hAnsi="Times New Roman" w:cs="Times New Roman"/>
+              </w:rPr>
+            </w:pPr>
+            <w:r>
+              <w:rPr>
+                <w:rFonts w:ascii="Times New Roman" w:eastAsia="標楷體" w:hAnsi="Times New Roman" w:cs="Times New Roman" w:hint="eastAsia"/>
+              </w:rPr>
               <w:t>分類多本書籍</w:t>
             </w:r>
           </w:p>
@@ -629,83 +685,7 @@
           <w:p>
             <w:pPr>
               <w:rPr>
-                <w:rFonts w:ascii="Times New Roman" w:eastAsia="標楷體" w:hAnsi="Times New Roman" w:cs="Times New Roman" w:hint="eastAsia"/>
-              </w:rPr>
-            </w:pPr>
-            <w:r>
-              <w:rPr>
-                <w:rFonts w:ascii="Times New Roman" w:eastAsia="標楷體" w:hAnsi="Times New Roman" w:cs="Times New Roman" w:hint="eastAsia"/>
-              </w:rPr>
-              <w:t>FEA-03</w:t>
-            </w:r>
-          </w:p>
-        </w:tc>
-        <w:tc>
-          <w:tcPr>
-            <w:tcW w:w="4148" w:type="dxa"/>
-          </w:tcPr>
-          <w:p>
-            <w:pPr>
-              <w:rPr>
-                <w:rFonts w:ascii="Times New Roman" w:eastAsia="標楷體" w:hAnsi="Times New Roman" w:cs="Times New Roman"/>
-              </w:rPr>
-            </w:pPr>
-            <w:r>
-              <w:rPr>
-                <w:rFonts w:ascii="Times New Roman" w:eastAsia="標楷體" w:hAnsi="Times New Roman" w:cs="Times New Roman" w:hint="eastAsia"/>
-              </w:rPr>
-              <w:t>私訊功能</w:t>
-            </w:r>
-          </w:p>
-        </w:tc>
-      </w:tr>
-      <w:tr>
-        <w:tc>
-          <w:tcPr>
-            <w:tcW w:w="4148" w:type="dxa"/>
-          </w:tcPr>
-          <w:p>
-            <w:pPr>
-              <w:rPr>
-                <w:rFonts w:ascii="Times New Roman" w:eastAsia="標楷體" w:hAnsi="Times New Roman" w:cs="Times New Roman" w:hint="eastAsia"/>
-              </w:rPr>
-            </w:pPr>
-            <w:r>
-              <w:rPr>
-                <w:rFonts w:ascii="Times New Roman" w:eastAsia="標楷體" w:hAnsi="Times New Roman" w:cs="Times New Roman" w:hint="eastAsia"/>
-              </w:rPr>
-              <w:t>FEA-04</w:t>
-            </w:r>
-          </w:p>
-        </w:tc>
-        <w:tc>
-          <w:tcPr>
-            <w:tcW w:w="4148" w:type="dxa"/>
-          </w:tcPr>
-          <w:p>
-            <w:pPr>
-              <w:rPr>
-                <w:rFonts w:ascii="Times New Roman" w:eastAsia="標楷體" w:hAnsi="Times New Roman" w:cs="Times New Roman"/>
-              </w:rPr>
-            </w:pPr>
-            <w:r>
-              <w:rPr>
-                <w:rFonts w:ascii="Times New Roman" w:eastAsia="標楷體" w:hAnsi="Times New Roman" w:cs="Times New Roman" w:hint="eastAsia"/>
-              </w:rPr>
-              <w:t>搜尋功能</w:t>
-            </w:r>
-          </w:p>
-        </w:tc>
-      </w:tr>
-      <w:tr>
-        <w:tc>
-          <w:tcPr>
-            <w:tcW w:w="4148" w:type="dxa"/>
-          </w:tcPr>
-          <w:p>
-            <w:pPr>
-              <w:rPr>
-                <w:rFonts w:ascii="Times New Roman" w:eastAsia="標楷體" w:hAnsi="Times New Roman" w:cs="Times New Roman" w:hint="eastAsia"/>
+                <w:rFonts w:ascii="Times New Roman" w:eastAsia="標楷體" w:hAnsi="Times New Roman" w:cs="Times New Roman"/>
               </w:rPr>
             </w:pPr>
             <w:r>
@@ -739,7 +719,7 @@
     <w:p>
       <w:pPr>
         <w:rPr>
-          <w:rFonts w:ascii="Times New Roman" w:eastAsia="標楷體" w:hAnsi="Times New Roman" w:cs="Times New Roman" w:hint="eastAsia"/>
+          <w:rFonts w:ascii="Times New Roman" w:eastAsia="標楷體" w:hAnsi="Times New Roman" w:cs="Times New Roman"/>
         </w:rPr>
       </w:pPr>
     </w:p>
@@ -799,7 +779,3612 @@
           <w:rFonts w:ascii="Times New Roman" w:eastAsia="標楷體" w:hAnsi="Times New Roman" w:cs="Times New Roman"/>
         </w:rPr>
       </w:pPr>
+      <w:r>
+        <w:rPr>
+          <w:rFonts w:ascii="Times New Roman" w:eastAsia="標楷體" w:hAnsi="Times New Roman" w:cs="Times New Roman" w:hint="eastAsia"/>
+        </w:rPr>
+        <w:t xml:space="preserve">1.5.1 </w:t>
+      </w:r>
+      <w:r>
+        <w:rPr>
+          <w:rFonts w:ascii="Times New Roman" w:eastAsia="標楷體" w:hAnsi="Times New Roman" w:cs="Times New Roman" w:hint="eastAsia"/>
+        </w:rPr>
+        <w:t>管理書籍清單</w:t>
+      </w:r>
+      <w:r>
+        <w:rPr>
+          <w:rFonts w:ascii="Times New Roman" w:eastAsia="標楷體" w:hAnsi="Times New Roman" w:cs="Times New Roman" w:hint="eastAsia"/>
+        </w:rPr>
+        <w:t xml:space="preserve"> (Manage Book Listing)</w:t>
+      </w:r>
     </w:p>
+    <w:tbl>
+      <w:tblPr>
+        <w:tblStyle w:val="af2"/>
+        <w:tblW w:w="0" w:type="auto"/>
+        <w:tblLook w:val="04A0" w:firstRow="1" w:lastRow="0" w:firstColumn="1" w:lastColumn="0" w:noHBand="0" w:noVBand="1"/>
+      </w:tblPr>
+      <w:tblGrid>
+        <w:gridCol w:w="4148"/>
+        <w:gridCol w:w="4148"/>
+      </w:tblGrid>
+      <w:tr>
+        <w:tc>
+          <w:tcPr>
+            <w:tcW w:w="4148" w:type="dxa"/>
+          </w:tcPr>
+          <w:p>
+            <w:pPr>
+              <w:rPr>
+                <w:rFonts w:ascii="Times New Roman" w:eastAsia="標楷體" w:hAnsi="Times New Roman" w:cs="Times New Roman"/>
+              </w:rPr>
+            </w:pPr>
+            <w:r>
+              <w:rPr>
+                <w:rFonts w:ascii="Times New Roman" w:eastAsia="標楷體" w:hAnsi="Times New Roman" w:cs="Times New Roman" w:hint="eastAsia"/>
+              </w:rPr>
+              <w:t>Use Case ID</w:t>
+            </w:r>
+          </w:p>
+        </w:tc>
+        <w:tc>
+          <w:tcPr>
+            <w:tcW w:w="4148" w:type="dxa"/>
+          </w:tcPr>
+          <w:p>
+            <w:pPr>
+              <w:rPr>
+                <w:rFonts w:ascii="Times New Roman" w:eastAsia="標楷體" w:hAnsi="Times New Roman" w:cs="Times New Roman"/>
+              </w:rPr>
+            </w:pPr>
+            <w:r>
+              <w:rPr>
+                <w:rFonts w:ascii="Times New Roman" w:eastAsia="標楷體" w:hAnsi="Times New Roman" w:cs="Times New Roman" w:hint="eastAsia"/>
+              </w:rPr>
+              <w:t>FEA-01</w:t>
+            </w:r>
+          </w:p>
+        </w:tc>
+      </w:tr>
+      <w:tr>
+        <w:tc>
+          <w:tcPr>
+            <w:tcW w:w="4148" w:type="dxa"/>
+          </w:tcPr>
+          <w:p>
+            <w:pPr>
+              <w:rPr>
+                <w:rFonts w:ascii="Times New Roman" w:eastAsia="標楷體" w:hAnsi="Times New Roman" w:cs="Times New Roman"/>
+              </w:rPr>
+            </w:pPr>
+            <w:r>
+              <w:rPr>
+                <w:rFonts w:ascii="Times New Roman" w:eastAsia="標楷體" w:hAnsi="Times New Roman" w:cs="Times New Roman" w:hint="eastAsia"/>
+              </w:rPr>
+              <w:t>Scope</w:t>
+            </w:r>
+          </w:p>
+        </w:tc>
+        <w:tc>
+          <w:tcPr>
+            <w:tcW w:w="4148" w:type="dxa"/>
+          </w:tcPr>
+          <w:p>
+            <w:pPr>
+              <w:rPr>
+                <w:rFonts w:ascii="Times New Roman" w:eastAsia="標楷體" w:hAnsi="Times New Roman" w:cs="Times New Roman"/>
+              </w:rPr>
+            </w:pPr>
+            <w:r>
+              <w:rPr>
+                <w:rFonts w:ascii="Times New Roman" w:eastAsia="標楷體" w:hAnsi="Times New Roman" w:cs="Times New Roman" w:hint="eastAsia"/>
+              </w:rPr>
+              <w:t>Re:Book</w:t>
+            </w:r>
+          </w:p>
+        </w:tc>
+      </w:tr>
+      <w:tr>
+        <w:tc>
+          <w:tcPr>
+            <w:tcW w:w="4148" w:type="dxa"/>
+          </w:tcPr>
+          <w:p>
+            <w:pPr>
+              <w:rPr>
+                <w:rFonts w:ascii="Times New Roman" w:eastAsia="標楷體" w:hAnsi="Times New Roman" w:cs="Times New Roman"/>
+              </w:rPr>
+            </w:pPr>
+            <w:r>
+              <w:rPr>
+                <w:rFonts w:ascii="Times New Roman" w:eastAsia="標楷體" w:hAnsi="Times New Roman" w:cs="Times New Roman" w:hint="eastAsia"/>
+              </w:rPr>
+              <w:t>Level</w:t>
+            </w:r>
+          </w:p>
+        </w:tc>
+        <w:tc>
+          <w:tcPr>
+            <w:tcW w:w="4148" w:type="dxa"/>
+          </w:tcPr>
+          <w:p>
+            <w:pPr>
+              <w:rPr>
+                <w:rFonts w:ascii="Times New Roman" w:eastAsia="標楷體" w:hAnsi="Times New Roman" w:cs="Times New Roman"/>
+              </w:rPr>
+            </w:pPr>
+            <w:r>
+              <w:rPr>
+                <w:rFonts w:ascii="Times New Roman" w:eastAsia="標楷體" w:hAnsi="Times New Roman" w:cs="Times New Roman"/>
+              </w:rPr>
+              <w:t>U</w:t>
+            </w:r>
+            <w:r>
+              <w:rPr>
+                <w:rFonts w:ascii="Times New Roman" w:eastAsia="標楷體" w:hAnsi="Times New Roman" w:cs="Times New Roman" w:hint="eastAsia"/>
+              </w:rPr>
+              <w:t>ser-goal</w:t>
+            </w:r>
+          </w:p>
+        </w:tc>
+      </w:tr>
+      <w:tr>
+        <w:tc>
+          <w:tcPr>
+            <w:tcW w:w="4148" w:type="dxa"/>
+          </w:tcPr>
+          <w:p>
+            <w:pPr>
+              <w:rPr>
+                <w:rFonts w:ascii="Times New Roman" w:eastAsia="標楷體" w:hAnsi="Times New Roman" w:cs="Times New Roman"/>
+              </w:rPr>
+            </w:pPr>
+            <w:r>
+              <w:rPr>
+                <w:rFonts w:ascii="Times New Roman" w:eastAsia="標楷體" w:hAnsi="Times New Roman" w:cs="Times New Roman" w:hint="eastAsia"/>
+              </w:rPr>
+              <w:t>Primary Actor</w:t>
+            </w:r>
+          </w:p>
+        </w:tc>
+        <w:tc>
+          <w:tcPr>
+            <w:tcW w:w="4148" w:type="dxa"/>
+          </w:tcPr>
+          <w:p>
+            <w:pPr>
+              <w:rPr>
+                <w:rFonts w:ascii="Times New Roman" w:eastAsia="標楷體" w:hAnsi="Times New Roman" w:cs="Times New Roman"/>
+              </w:rPr>
+            </w:pPr>
+            <w:r>
+              <w:rPr>
+                <w:rFonts w:ascii="Times New Roman" w:eastAsia="標楷體" w:hAnsi="Times New Roman" w:cs="Times New Roman" w:hint="eastAsia"/>
+              </w:rPr>
+              <w:t>賣家</w:t>
+            </w:r>
+          </w:p>
+        </w:tc>
+      </w:tr>
+      <w:tr>
+        <w:tc>
+          <w:tcPr>
+            <w:tcW w:w="4148" w:type="dxa"/>
+          </w:tcPr>
+          <w:p>
+            <w:pPr>
+              <w:rPr>
+                <w:rFonts w:ascii="Times New Roman" w:eastAsia="標楷體" w:hAnsi="Times New Roman" w:cs="Times New Roman"/>
+              </w:rPr>
+            </w:pPr>
+            <w:r>
+              <w:rPr>
+                <w:rFonts w:ascii="Times New Roman" w:eastAsia="標楷體" w:hAnsi="Times New Roman" w:cs="Times New Roman" w:hint="eastAsia"/>
+              </w:rPr>
+              <w:t>Stakeholders and Interests</w:t>
+            </w:r>
+          </w:p>
+        </w:tc>
+        <w:tc>
+          <w:tcPr>
+            <w:tcW w:w="4148" w:type="dxa"/>
+          </w:tcPr>
+          <w:p>
+            <w:pPr>
+              <w:rPr>
+                <w:rFonts w:ascii="Times New Roman" w:eastAsia="標楷體" w:hAnsi="Times New Roman" w:cs="Times New Roman"/>
+              </w:rPr>
+            </w:pPr>
+            <w:r>
+              <w:rPr>
+                <w:rFonts w:ascii="Times New Roman" w:eastAsia="標楷體" w:hAnsi="Times New Roman" w:cs="Times New Roman" w:hint="eastAsia"/>
+              </w:rPr>
+              <w:t>賣家：希望方便地新增、修改或下架書籍，以順利售出商品</w:t>
+            </w:r>
+            <w:r>
+              <w:rPr>
+                <w:rFonts w:ascii="Times New Roman" w:eastAsia="標楷體" w:hAnsi="Times New Roman" w:cs="Times New Roman"/>
+              </w:rPr>
+              <w:br/>
+            </w:r>
+            <w:r>
+              <w:rPr>
+                <w:rFonts w:ascii="Times New Roman" w:eastAsia="標楷體" w:hAnsi="Times New Roman" w:cs="Times New Roman" w:hint="eastAsia"/>
+              </w:rPr>
+              <w:t>買家：希望看到最準確、即時的書籍狀態與資訊。</w:t>
+            </w:r>
+          </w:p>
+        </w:tc>
+      </w:tr>
+      <w:tr>
+        <w:tc>
+          <w:tcPr>
+            <w:tcW w:w="4148" w:type="dxa"/>
+          </w:tcPr>
+          <w:p>
+            <w:pPr>
+              <w:rPr>
+                <w:rFonts w:ascii="Times New Roman" w:eastAsia="標楷體" w:hAnsi="Times New Roman" w:cs="Times New Roman"/>
+              </w:rPr>
+            </w:pPr>
+            <w:r>
+              <w:rPr>
+                <w:rFonts w:ascii="Times New Roman" w:eastAsia="標楷體" w:hAnsi="Times New Roman" w:cs="Times New Roman" w:hint="eastAsia"/>
+              </w:rPr>
+              <w:t>Preconditions</w:t>
+            </w:r>
+          </w:p>
+        </w:tc>
+        <w:tc>
+          <w:tcPr>
+            <w:tcW w:w="4148" w:type="dxa"/>
+          </w:tcPr>
+          <w:p>
+            <w:pPr>
+              <w:rPr>
+                <w:rFonts w:ascii="Times New Roman" w:eastAsia="標楷體" w:hAnsi="Times New Roman" w:cs="Times New Roman"/>
+              </w:rPr>
+            </w:pPr>
+            <w:r>
+              <w:rPr>
+                <w:rFonts w:ascii="Times New Roman" w:eastAsia="標楷體" w:hAnsi="Times New Roman" w:cs="Times New Roman" w:hint="eastAsia"/>
+              </w:rPr>
+              <w:t>賣家必須已成功登入系統，且具備合法的帳號權限。</w:t>
+            </w:r>
+          </w:p>
+        </w:tc>
+      </w:tr>
+      <w:tr>
+        <w:tc>
+          <w:tcPr>
+            <w:tcW w:w="4148" w:type="dxa"/>
+          </w:tcPr>
+          <w:p>
+            <w:pPr>
+              <w:rPr>
+                <w:rFonts w:ascii="Times New Roman" w:eastAsia="標楷體" w:hAnsi="Times New Roman" w:cs="Times New Roman"/>
+              </w:rPr>
+            </w:pPr>
+            <w:r>
+              <w:rPr>
+                <w:rFonts w:ascii="Times New Roman" w:eastAsia="標楷體" w:hAnsi="Times New Roman" w:cs="Times New Roman" w:hint="eastAsia"/>
+              </w:rPr>
+              <w:t>Success Guarantee</w:t>
+            </w:r>
+          </w:p>
+        </w:tc>
+        <w:tc>
+          <w:tcPr>
+            <w:tcW w:w="4148" w:type="dxa"/>
+          </w:tcPr>
+          <w:p>
+            <w:pPr>
+              <w:rPr>
+                <w:rFonts w:ascii="Times New Roman" w:eastAsia="標楷體" w:hAnsi="Times New Roman" w:cs="Times New Roman"/>
+              </w:rPr>
+            </w:pPr>
+            <w:r>
+              <w:rPr>
+                <w:rFonts w:ascii="Times New Roman" w:eastAsia="標楷體" w:hAnsi="Times New Roman" w:cs="Times New Roman" w:hint="eastAsia"/>
+              </w:rPr>
+              <w:t>書籍資訊正確地更新至資料庫中，並在系統前端同步顯示最新狀態。</w:t>
+            </w:r>
+          </w:p>
+        </w:tc>
+      </w:tr>
+      <w:tr>
+        <w:tc>
+          <w:tcPr>
+            <w:tcW w:w="4148" w:type="dxa"/>
+          </w:tcPr>
+          <w:p>
+            <w:pPr>
+              <w:rPr>
+                <w:rFonts w:ascii="Times New Roman" w:eastAsia="標楷體" w:hAnsi="Times New Roman" w:cs="Times New Roman"/>
+              </w:rPr>
+            </w:pPr>
+            <w:r>
+              <w:rPr>
+                <w:rFonts w:ascii="Times New Roman" w:eastAsia="標楷體" w:hAnsi="Times New Roman" w:cs="Times New Roman" w:hint="eastAsia"/>
+              </w:rPr>
+              <w:t>Main Success Scenario</w:t>
+            </w:r>
+          </w:p>
+        </w:tc>
+        <w:tc>
+          <w:tcPr>
+            <w:tcW w:w="4148" w:type="dxa"/>
+          </w:tcPr>
+          <w:p>
+            <w:pPr>
+              <w:rPr>
+                <w:rFonts w:ascii="Times New Roman" w:eastAsia="標楷體" w:hAnsi="Times New Roman" w:cs="Times New Roman"/>
+              </w:rPr>
+            </w:pPr>
+            <w:r>
+              <w:rPr>
+                <w:rFonts w:ascii="Times New Roman" w:eastAsia="標楷體" w:hAnsi="Times New Roman" w:cs="Times New Roman" w:hint="eastAsia"/>
+              </w:rPr>
+              <w:t xml:space="preserve">1. </w:t>
+            </w:r>
+            <w:r>
+              <w:rPr>
+                <w:rFonts w:ascii="Times New Roman" w:eastAsia="標楷體" w:hAnsi="Times New Roman" w:cs="Times New Roman" w:hint="eastAsia"/>
+              </w:rPr>
+              <w:t>賣家選擇「新增書籍」或「編輯現有書籍」。</w:t>
+            </w:r>
+            <w:r>
+              <w:rPr>
+                <w:rFonts w:ascii="Times New Roman" w:eastAsia="標楷體" w:hAnsi="Times New Roman" w:cs="Times New Roman"/>
+              </w:rPr>
+              <w:br/>
+            </w:r>
+            <w:r>
+              <w:rPr>
+                <w:rFonts w:ascii="Times New Roman" w:eastAsia="標楷體" w:hAnsi="Times New Roman" w:cs="Times New Roman" w:hint="eastAsia"/>
+              </w:rPr>
+              <w:t xml:space="preserve">2. </w:t>
+            </w:r>
+            <w:r>
+              <w:rPr>
+                <w:rFonts w:ascii="Times New Roman" w:eastAsia="標楷體" w:hAnsi="Times New Roman" w:cs="Times New Roman" w:hint="eastAsia"/>
+              </w:rPr>
+              <w:t>賣家輸入</w:t>
+            </w:r>
+            <w:r>
+              <w:rPr>
+                <w:rFonts w:ascii="Times New Roman" w:eastAsia="標楷體" w:hAnsi="Times New Roman" w:cs="Times New Roman" w:hint="eastAsia"/>
+              </w:rPr>
+              <w:t>/</w:t>
+            </w:r>
+            <w:r>
+              <w:rPr>
+                <w:rFonts w:ascii="Times New Roman" w:eastAsia="標楷體" w:hAnsi="Times New Roman" w:cs="Times New Roman" w:hint="eastAsia"/>
+              </w:rPr>
+              <w:t>修改</w:t>
+            </w:r>
+            <w:r>
+              <w:rPr>
+                <w:rFonts w:ascii="Times New Roman" w:eastAsia="標楷體" w:hAnsi="Times New Roman" w:cs="Times New Roman" w:hint="eastAsia"/>
+              </w:rPr>
+              <w:t xml:space="preserve"> ISBN</w:t>
+            </w:r>
+            <w:r>
+              <w:rPr>
+                <w:rFonts w:ascii="Times New Roman" w:eastAsia="標楷體" w:hAnsi="Times New Roman" w:cs="Times New Roman" w:hint="eastAsia"/>
+              </w:rPr>
+              <w:t>、書名、價格、書況及區域資訊。</w:t>
+            </w:r>
+            <w:r>
+              <w:rPr>
+                <w:rFonts w:ascii="Times New Roman" w:eastAsia="標楷體" w:hAnsi="Times New Roman" w:cs="Times New Roman"/>
+              </w:rPr>
+              <w:br/>
+            </w:r>
+            <w:r>
+              <w:rPr>
+                <w:rFonts w:ascii="Times New Roman" w:eastAsia="標楷體" w:hAnsi="Times New Roman" w:cs="Times New Roman" w:hint="eastAsia"/>
+              </w:rPr>
+              <w:t xml:space="preserve">3. </w:t>
+            </w:r>
+            <w:r>
+              <w:rPr>
+                <w:rFonts w:ascii="Times New Roman" w:eastAsia="標楷體" w:hAnsi="Times New Roman" w:cs="Times New Roman" w:hint="eastAsia"/>
+              </w:rPr>
+              <w:t>系統驗證資料格式（如</w:t>
+            </w:r>
+            <w:r>
+              <w:rPr>
+                <w:rFonts w:ascii="Times New Roman" w:eastAsia="標楷體" w:hAnsi="Times New Roman" w:cs="Times New Roman" w:hint="eastAsia"/>
+              </w:rPr>
+              <w:t xml:space="preserve"> ISBN </w:t>
+            </w:r>
+            <w:r>
+              <w:rPr>
+                <w:rFonts w:ascii="Times New Roman" w:eastAsia="標楷體" w:hAnsi="Times New Roman" w:cs="Times New Roman" w:hint="eastAsia"/>
+              </w:rPr>
+              <w:t>是否正確、價格是否為正數）。</w:t>
+            </w:r>
+            <w:r>
+              <w:rPr>
+                <w:rFonts w:ascii="Times New Roman" w:eastAsia="標楷體" w:hAnsi="Times New Roman" w:cs="Times New Roman"/>
+              </w:rPr>
+              <w:br/>
+            </w:r>
+            <w:r>
+              <w:rPr>
+                <w:rFonts w:ascii="Times New Roman" w:eastAsia="標楷體" w:hAnsi="Times New Roman" w:cs="Times New Roman" w:hint="eastAsia"/>
+              </w:rPr>
+              <w:t xml:space="preserve">4. </w:t>
+            </w:r>
+            <w:r>
+              <w:rPr>
+                <w:rFonts w:ascii="Times New Roman" w:eastAsia="標楷體" w:hAnsi="Times New Roman" w:cs="Times New Roman" w:hint="eastAsia"/>
+              </w:rPr>
+              <w:t>賣家確認提交。</w:t>
+            </w:r>
+            <w:r>
+              <w:rPr>
+                <w:rFonts w:ascii="Times New Roman" w:eastAsia="標楷體" w:hAnsi="Times New Roman" w:cs="Times New Roman"/>
+              </w:rPr>
+              <w:br/>
+            </w:r>
+            <w:r>
+              <w:rPr>
+                <w:rFonts w:ascii="Times New Roman" w:eastAsia="標楷體" w:hAnsi="Times New Roman" w:cs="Times New Roman" w:hint="eastAsia"/>
+              </w:rPr>
+              <w:t xml:space="preserve">5. </w:t>
+            </w:r>
+            <w:r>
+              <w:rPr>
+                <w:rFonts w:ascii="Times New Roman" w:eastAsia="標楷體" w:hAnsi="Times New Roman" w:cs="Times New Roman" w:hint="eastAsia"/>
+              </w:rPr>
+              <w:t>系統儲存資料並顯示「管理成功」訊息。</w:t>
+            </w:r>
+          </w:p>
+        </w:tc>
+      </w:tr>
+      <w:tr>
+        <w:tc>
+          <w:tcPr>
+            <w:tcW w:w="4148" w:type="dxa"/>
+          </w:tcPr>
+          <w:p>
+            <w:pPr>
+              <w:rPr>
+                <w:rFonts w:ascii="Times New Roman" w:eastAsia="標楷體" w:hAnsi="Times New Roman" w:cs="Times New Roman"/>
+              </w:rPr>
+            </w:pPr>
+            <w:r>
+              <w:rPr>
+                <w:rFonts w:ascii="Times New Roman" w:eastAsia="標楷體" w:hAnsi="Times New Roman" w:cs="Times New Roman" w:hint="eastAsia"/>
+              </w:rPr>
+              <w:t>Extensions</w:t>
+            </w:r>
+          </w:p>
+        </w:tc>
+        <w:tc>
+          <w:tcPr>
+            <w:tcW w:w="4148" w:type="dxa"/>
+          </w:tcPr>
+          <w:p>
+            <w:pPr>
+              <w:rPr>
+                <w:rFonts w:ascii="Times New Roman" w:eastAsia="標楷體" w:hAnsi="Times New Roman" w:cs="Times New Roman"/>
+              </w:rPr>
+            </w:pPr>
+            <w:r>
+              <w:rPr>
+                <w:rFonts w:ascii="Times New Roman" w:eastAsia="標楷體" w:hAnsi="Times New Roman" w:cs="Times New Roman" w:hint="eastAsia"/>
+              </w:rPr>
+              <w:t xml:space="preserve">3a. ISBN </w:t>
+            </w:r>
+            <w:r>
+              <w:rPr>
+                <w:rFonts w:ascii="Times New Roman" w:eastAsia="標楷體" w:hAnsi="Times New Roman" w:cs="Times New Roman" w:hint="eastAsia"/>
+              </w:rPr>
+              <w:t>格式錯誤：系統提示錯誤並要求賣家重新輸入。</w:t>
+            </w:r>
+            <w:r>
+              <w:rPr>
+                <w:rFonts w:ascii="Times New Roman" w:eastAsia="標楷體" w:hAnsi="Times New Roman" w:cs="Times New Roman"/>
+              </w:rPr>
+              <w:br/>
+            </w:r>
+            <w:r>
+              <w:rPr>
+                <w:rFonts w:ascii="Times New Roman" w:eastAsia="標楷體" w:hAnsi="Times New Roman" w:cs="Times New Roman" w:hint="eastAsia"/>
+              </w:rPr>
+              <w:t xml:space="preserve">3b. </w:t>
+            </w:r>
+            <w:r>
+              <w:rPr>
+                <w:rFonts w:ascii="Times New Roman" w:eastAsia="標楷體" w:hAnsi="Times New Roman" w:cs="Times New Roman" w:hint="eastAsia"/>
+              </w:rPr>
+              <w:t>必填欄位缺失：系統標示未填欄位。</w:t>
+            </w:r>
+            <w:r>
+              <w:rPr>
+                <w:rFonts w:ascii="Times New Roman" w:eastAsia="標楷體" w:hAnsi="Times New Roman" w:cs="Times New Roman"/>
+              </w:rPr>
+              <w:br/>
+            </w:r>
+            <w:r>
+              <w:rPr>
+                <w:rFonts w:ascii="Times New Roman" w:eastAsia="標楷體" w:hAnsi="Times New Roman" w:cs="Times New Roman" w:hint="eastAsia"/>
+              </w:rPr>
+              <w:t xml:space="preserve">4a. </w:t>
+            </w:r>
+            <w:r>
+              <w:rPr>
+                <w:rFonts w:ascii="Times New Roman" w:eastAsia="標楷體" w:hAnsi="Times New Roman" w:cs="Times New Roman" w:hint="eastAsia"/>
+              </w:rPr>
+              <w:t>刪除書籍：賣家選擇刪除，系統確認後從資料庫移除該項目。</w:t>
+            </w:r>
+          </w:p>
+        </w:tc>
+      </w:tr>
+      <w:tr>
+        <w:tc>
+          <w:tcPr>
+            <w:tcW w:w="4148" w:type="dxa"/>
+          </w:tcPr>
+          <w:p>
+            <w:pPr>
+              <w:rPr>
+                <w:rFonts w:ascii="Times New Roman" w:eastAsia="標楷體" w:hAnsi="Times New Roman" w:cs="Times New Roman"/>
+              </w:rPr>
+            </w:pPr>
+            <w:r>
+              <w:rPr>
+                <w:rFonts w:ascii="Times New Roman" w:eastAsia="標楷體" w:hAnsi="Times New Roman" w:cs="Times New Roman" w:hint="eastAsia"/>
+              </w:rPr>
+              <w:t>Special Re</w:t>
+            </w:r>
+            <w:r>
+              <w:rPr>
+                <w:rFonts w:ascii="Times New Roman" w:eastAsia="標楷體" w:hAnsi="Times New Roman" w:cs="Times New Roman" w:hint="eastAsia"/>
+              </w:rPr>
+              <w:t>quirements</w:t>
+            </w:r>
+          </w:p>
+        </w:tc>
+        <w:tc>
+          <w:tcPr>
+            <w:tcW w:w="4148" w:type="dxa"/>
+          </w:tcPr>
+          <w:p>
+            <w:pPr>
+              <w:rPr>
+                <w:rFonts w:ascii="Times New Roman" w:eastAsia="標楷體" w:hAnsi="Times New Roman" w:cs="Times New Roman"/>
+              </w:rPr>
+            </w:pPr>
+            <w:r>
+              <w:rPr>
+                <w:rFonts w:ascii="Times New Roman" w:eastAsia="標楷體" w:hAnsi="Times New Roman" w:cs="Times New Roman" w:hint="eastAsia"/>
+              </w:rPr>
+              <w:t>系統應在</w:t>
+            </w:r>
+            <w:r>
+              <w:rPr>
+                <w:rFonts w:ascii="Times New Roman" w:eastAsia="標楷體" w:hAnsi="Times New Roman" w:cs="Times New Roman" w:hint="eastAsia"/>
+              </w:rPr>
+              <w:t xml:space="preserve"> 2 </w:t>
+            </w:r>
+            <w:r>
+              <w:rPr>
+                <w:rFonts w:ascii="Times New Roman" w:eastAsia="標楷體" w:hAnsi="Times New Roman" w:cs="Times New Roman" w:hint="eastAsia"/>
+              </w:rPr>
+              <w:t>秒內完成資料更新同步。</w:t>
+            </w:r>
+            <w:r>
+              <w:rPr>
+                <w:rFonts w:ascii="Times New Roman" w:eastAsia="標楷體" w:hAnsi="Times New Roman" w:cs="Times New Roman" w:hint="eastAsia"/>
+              </w:rPr>
+              <w:t xml:space="preserve"> (</w:t>
+            </w:r>
+            <w:r>
+              <w:rPr>
+                <w:rFonts w:ascii="Times New Roman" w:eastAsia="標楷體" w:hAnsi="Times New Roman" w:cs="Times New Roman" w:hint="eastAsia"/>
+              </w:rPr>
+              <w:t>屬</w:t>
+            </w:r>
+            <w:r>
+              <w:rPr>
+                <w:rFonts w:ascii="Times New Roman" w:eastAsia="標楷體" w:hAnsi="Times New Roman" w:cs="Times New Roman" w:hint="eastAsia"/>
+              </w:rPr>
+              <w:t xml:space="preserve"> Non-functional Requirement)</w:t>
+            </w:r>
+          </w:p>
+        </w:tc>
+      </w:tr>
+      <w:tr>
+        <w:tc>
+          <w:tcPr>
+            <w:tcW w:w="4148" w:type="dxa"/>
+          </w:tcPr>
+          <w:p>
+            <w:pPr>
+              <w:rPr>
+                <w:rFonts w:ascii="Times New Roman" w:eastAsia="標楷體" w:hAnsi="Times New Roman" w:cs="Times New Roman"/>
+              </w:rPr>
+            </w:pPr>
+            <w:r>
+              <w:rPr>
+                <w:rFonts w:ascii="Times New Roman" w:eastAsia="標楷體" w:hAnsi="Times New Roman" w:cs="Times New Roman" w:hint="eastAsia"/>
+              </w:rPr>
+              <w:lastRenderedPageBreak/>
+              <w:t>Technology and Data Variations List</w:t>
+            </w:r>
+          </w:p>
+        </w:tc>
+        <w:tc>
+          <w:tcPr>
+            <w:tcW w:w="4148" w:type="dxa"/>
+          </w:tcPr>
+          <w:p>
+            <w:pPr>
+              <w:rPr>
+                <w:rFonts w:ascii="Times New Roman" w:eastAsia="標楷體" w:hAnsi="Times New Roman" w:cs="Times New Roman"/>
+              </w:rPr>
+            </w:pPr>
+            <w:r>
+              <w:rPr>
+                <w:rFonts w:ascii="Times New Roman" w:eastAsia="標楷體" w:hAnsi="Times New Roman" w:cs="Times New Roman" w:hint="eastAsia"/>
+              </w:rPr>
+              <w:t>賣家可透過</w:t>
+            </w:r>
+            <w:r>
+              <w:rPr>
+                <w:rFonts w:ascii="Times New Roman" w:eastAsia="標楷體" w:hAnsi="Times New Roman" w:cs="Times New Roman" w:hint="eastAsia"/>
+              </w:rPr>
+              <w:t xml:space="preserve"> Web </w:t>
+            </w:r>
+            <w:r>
+              <w:rPr>
+                <w:rFonts w:ascii="Times New Roman" w:eastAsia="標楷體" w:hAnsi="Times New Roman" w:cs="Times New Roman" w:hint="eastAsia"/>
+              </w:rPr>
+              <w:t>瀏覽器手動輸入資料，或透過行動裝置相機掃描</w:t>
+            </w:r>
+            <w:r>
+              <w:rPr>
+                <w:rFonts w:ascii="Times New Roman" w:eastAsia="標楷體" w:hAnsi="Times New Roman" w:cs="Times New Roman" w:hint="eastAsia"/>
+              </w:rPr>
+              <w:t xml:space="preserve"> ISBN </w:t>
+            </w:r>
+            <w:r>
+              <w:rPr>
+                <w:rFonts w:ascii="Times New Roman" w:eastAsia="標楷體" w:hAnsi="Times New Roman" w:cs="Times New Roman" w:hint="eastAsia"/>
+              </w:rPr>
+              <w:t>碼（未來擴充項目）。</w:t>
+            </w:r>
+          </w:p>
+        </w:tc>
+      </w:tr>
+      <w:tr>
+        <w:tc>
+          <w:tcPr>
+            <w:tcW w:w="4148" w:type="dxa"/>
+          </w:tcPr>
+          <w:p>
+            <w:pPr>
+              <w:rPr>
+                <w:rFonts w:ascii="Times New Roman" w:eastAsia="標楷體" w:hAnsi="Times New Roman" w:cs="Times New Roman"/>
+              </w:rPr>
+            </w:pPr>
+            <w:r>
+              <w:rPr>
+                <w:rFonts w:ascii="Times New Roman" w:eastAsia="標楷體" w:hAnsi="Times New Roman" w:cs="Times New Roman" w:hint="eastAsia"/>
+              </w:rPr>
+              <w:t>Frequency of Occurrence</w:t>
+            </w:r>
+          </w:p>
+        </w:tc>
+        <w:tc>
+          <w:tcPr>
+            <w:tcW w:w="4148" w:type="dxa"/>
+          </w:tcPr>
+          <w:p>
+            <w:pPr>
+              <w:rPr>
+                <w:rFonts w:ascii="Times New Roman" w:eastAsia="標楷體" w:hAnsi="Times New Roman" w:cs="Times New Roman"/>
+              </w:rPr>
+            </w:pPr>
+            <w:r>
+              <w:rPr>
+                <w:rFonts w:ascii="Times New Roman" w:eastAsia="標楷體" w:hAnsi="Times New Roman" w:cs="Times New Roman" w:hint="eastAsia"/>
+              </w:rPr>
+              <w:t>每當賣家有新書要賣或商品狀態改變時觸發（高頻率）。</w:t>
+            </w:r>
+          </w:p>
+        </w:tc>
+      </w:tr>
+      <w:tr>
+        <w:tc>
+          <w:tcPr>
+            <w:tcW w:w="4148" w:type="dxa"/>
+          </w:tcPr>
+          <w:p>
+            <w:pPr>
+              <w:rPr>
+                <w:rFonts w:ascii="Times New Roman" w:eastAsia="標楷體" w:hAnsi="Times New Roman" w:cs="Times New Roman"/>
+              </w:rPr>
+            </w:pPr>
+            <w:r>
+              <w:rPr>
+                <w:rFonts w:ascii="Times New Roman" w:eastAsia="標楷體" w:hAnsi="Times New Roman" w:cs="Times New Roman" w:hint="eastAsia"/>
+              </w:rPr>
+              <w:t>Miscellaneous</w:t>
+            </w:r>
+          </w:p>
+        </w:tc>
+        <w:tc>
+          <w:tcPr>
+            <w:tcW w:w="4148" w:type="dxa"/>
+          </w:tcPr>
+          <w:p>
+            <w:pPr>
+              <w:rPr>
+                <w:rFonts w:ascii="Times New Roman" w:eastAsia="標楷體" w:hAnsi="Times New Roman" w:cs="Times New Roman"/>
+              </w:rPr>
+            </w:pPr>
+            <w:r>
+              <w:rPr>
+                <w:rFonts w:ascii="Times New Roman" w:eastAsia="標楷體" w:hAnsi="Times New Roman" w:cs="Times New Roman" w:hint="eastAsia"/>
+              </w:rPr>
+              <w:t>是否需要限制單一使用者可同時上架的書籍上限？（待討論問題）</w:t>
+            </w:r>
+          </w:p>
+        </w:tc>
+      </w:tr>
+    </w:tbl>
+    <w:p>
+      <w:pPr>
+        <w:rPr>
+          <w:rFonts w:ascii="Times New Roman" w:eastAsia="標楷體" w:hAnsi="Times New Roman" w:cs="Times New Roman"/>
+        </w:rPr>
+      </w:pPr>
+    </w:p>
+    <w:p>
+      <w:pPr>
+        <w:rPr>
+          <w:rFonts w:ascii="Times New Roman" w:eastAsia="標楷體" w:hAnsi="Times New Roman" w:cs="Times New Roman"/>
+        </w:rPr>
+      </w:pPr>
+      <w:r>
+        <w:rPr>
+          <w:rFonts w:ascii="Times New Roman" w:eastAsia="標楷體" w:hAnsi="Times New Roman" w:cs="Times New Roman" w:hint="eastAsia"/>
+        </w:rPr>
+        <w:t xml:space="preserve">1.5.2 </w:t>
+      </w:r>
+      <w:r>
+        <w:rPr>
+          <w:rFonts w:ascii="Times New Roman" w:eastAsia="標楷體" w:hAnsi="Times New Roman" w:cs="Times New Roman" w:hint="eastAsia"/>
+        </w:rPr>
+        <w:t>搜尋書籍</w:t>
+      </w:r>
+      <w:r>
+        <w:rPr>
+          <w:rFonts w:ascii="Times New Roman" w:eastAsia="標楷體" w:hAnsi="Times New Roman" w:cs="Times New Roman" w:hint="eastAsia"/>
+        </w:rPr>
+        <w:t xml:space="preserve"> (Search Books)</w:t>
+      </w:r>
+    </w:p>
+    <w:tbl>
+      <w:tblPr>
+        <w:tblStyle w:val="af2"/>
+        <w:tblW w:w="0" w:type="auto"/>
+        <w:tblLook w:val="04A0" w:firstRow="1" w:lastRow="0" w:firstColumn="1" w:lastColumn="0" w:noHBand="0" w:noVBand="1"/>
+      </w:tblPr>
+      <w:tblGrid>
+        <w:gridCol w:w="4148"/>
+        <w:gridCol w:w="4148"/>
+      </w:tblGrid>
+      <w:tr>
+        <w:tc>
+          <w:tcPr>
+            <w:tcW w:w="4148" w:type="dxa"/>
+          </w:tcPr>
+          <w:p>
+            <w:pPr>
+              <w:rPr>
+                <w:rFonts w:ascii="Times New Roman" w:eastAsia="標楷體" w:hAnsi="Times New Roman" w:cs="Times New Roman"/>
+              </w:rPr>
+            </w:pPr>
+            <w:r>
+              <w:rPr>
+                <w:rFonts w:ascii="Times New Roman" w:eastAsia="標楷體" w:hAnsi="Times New Roman" w:cs="Times New Roman" w:hint="eastAsia"/>
+              </w:rPr>
+              <w:t>Use Case ID</w:t>
+            </w:r>
+          </w:p>
+        </w:tc>
+        <w:tc>
+          <w:tcPr>
+            <w:tcW w:w="4148" w:type="dxa"/>
+          </w:tcPr>
+          <w:p>
+            <w:pPr>
+              <w:rPr>
+                <w:rFonts w:ascii="Times New Roman" w:eastAsia="標楷體" w:hAnsi="Times New Roman" w:cs="Times New Roman"/>
+              </w:rPr>
+            </w:pPr>
+            <w:r>
+              <w:rPr>
+                <w:rFonts w:ascii="Times New Roman" w:eastAsia="標楷體" w:hAnsi="Times New Roman" w:cs="Times New Roman" w:hint="eastAsia"/>
+              </w:rPr>
+              <w:t>FEA-02</w:t>
+            </w:r>
+          </w:p>
+        </w:tc>
+      </w:tr>
+      <w:tr>
+        <w:tc>
+          <w:tcPr>
+            <w:tcW w:w="4148" w:type="dxa"/>
+          </w:tcPr>
+          <w:p>
+            <w:pPr>
+              <w:rPr>
+                <w:rFonts w:ascii="Times New Roman" w:eastAsia="標楷體" w:hAnsi="Times New Roman" w:cs="Times New Roman"/>
+              </w:rPr>
+            </w:pPr>
+            <w:r>
+              <w:rPr>
+                <w:rFonts w:ascii="Times New Roman" w:eastAsia="標楷體" w:hAnsi="Times New Roman" w:cs="Times New Roman" w:hint="eastAsia"/>
+              </w:rPr>
+              <w:t>Scope</w:t>
+            </w:r>
+          </w:p>
+        </w:tc>
+        <w:tc>
+          <w:tcPr>
+            <w:tcW w:w="4148" w:type="dxa"/>
+          </w:tcPr>
+          <w:p>
+            <w:pPr>
+              <w:rPr>
+                <w:rFonts w:ascii="Times New Roman" w:eastAsia="標楷體" w:hAnsi="Times New Roman" w:cs="Times New Roman"/>
+              </w:rPr>
+            </w:pPr>
+            <w:r>
+              <w:rPr>
+                <w:rFonts w:ascii="Times New Roman" w:eastAsia="標楷體" w:hAnsi="Times New Roman" w:cs="Times New Roman" w:hint="eastAsia"/>
+              </w:rPr>
+              <w:t>Re:Book</w:t>
+            </w:r>
+          </w:p>
+        </w:tc>
+      </w:tr>
+      <w:tr>
+        <w:tc>
+          <w:tcPr>
+            <w:tcW w:w="4148" w:type="dxa"/>
+          </w:tcPr>
+          <w:p>
+            <w:pPr>
+              <w:rPr>
+                <w:rFonts w:ascii="Times New Roman" w:eastAsia="標楷體" w:hAnsi="Times New Roman" w:cs="Times New Roman"/>
+              </w:rPr>
+            </w:pPr>
+            <w:r>
+              <w:rPr>
+                <w:rFonts w:ascii="Times New Roman" w:eastAsia="標楷體" w:hAnsi="Times New Roman" w:cs="Times New Roman" w:hint="eastAsia"/>
+              </w:rPr>
+              <w:t>Level</w:t>
+            </w:r>
+          </w:p>
+        </w:tc>
+        <w:tc>
+          <w:tcPr>
+            <w:tcW w:w="4148" w:type="dxa"/>
+          </w:tcPr>
+          <w:p>
+            <w:pPr>
+              <w:rPr>
+                <w:rFonts w:ascii="Times New Roman" w:eastAsia="標楷體" w:hAnsi="Times New Roman" w:cs="Times New Roman"/>
+              </w:rPr>
+            </w:pPr>
+            <w:r>
+              <w:rPr>
+                <w:rFonts w:ascii="Times New Roman" w:eastAsia="標楷體" w:hAnsi="Times New Roman" w:cs="Times New Roman"/>
+              </w:rPr>
+              <w:t>U</w:t>
+            </w:r>
+            <w:r>
+              <w:rPr>
+                <w:rFonts w:ascii="Times New Roman" w:eastAsia="標楷體" w:hAnsi="Times New Roman" w:cs="Times New Roman" w:hint="eastAsia"/>
+              </w:rPr>
+              <w:t>ser-goal</w:t>
+            </w:r>
+          </w:p>
+        </w:tc>
+      </w:tr>
+      <w:tr>
+        <w:tc>
+          <w:tcPr>
+            <w:tcW w:w="4148" w:type="dxa"/>
+          </w:tcPr>
+          <w:p>
+            <w:pPr>
+              <w:rPr>
+                <w:rFonts w:ascii="Times New Roman" w:eastAsia="標楷體" w:hAnsi="Times New Roman" w:cs="Times New Roman"/>
+              </w:rPr>
+            </w:pPr>
+            <w:r>
+              <w:rPr>
+                <w:rFonts w:ascii="Times New Roman" w:eastAsia="標楷體" w:hAnsi="Times New Roman" w:cs="Times New Roman" w:hint="eastAsia"/>
+              </w:rPr>
+              <w:t>Primary Actor</w:t>
+            </w:r>
+          </w:p>
+        </w:tc>
+        <w:tc>
+          <w:tcPr>
+            <w:tcW w:w="4148" w:type="dxa"/>
+          </w:tcPr>
+          <w:p>
+            <w:pPr>
+              <w:rPr>
+                <w:rFonts w:ascii="Times New Roman" w:eastAsia="標楷體" w:hAnsi="Times New Roman" w:cs="Times New Roman"/>
+              </w:rPr>
+            </w:pPr>
+            <w:r>
+              <w:rPr>
+                <w:rFonts w:ascii="Times New Roman" w:eastAsia="標楷體" w:hAnsi="Times New Roman" w:cs="Times New Roman" w:hint="eastAsia"/>
+              </w:rPr>
+              <w:t>買家</w:t>
+            </w:r>
+          </w:p>
+        </w:tc>
+      </w:tr>
+      <w:tr>
+        <w:tc>
+          <w:tcPr>
+            <w:tcW w:w="4148" w:type="dxa"/>
+          </w:tcPr>
+          <w:p>
+            <w:pPr>
+              <w:rPr>
+                <w:rFonts w:ascii="Times New Roman" w:eastAsia="標楷體" w:hAnsi="Times New Roman" w:cs="Times New Roman"/>
+              </w:rPr>
+            </w:pPr>
+            <w:r>
+              <w:rPr>
+                <w:rFonts w:ascii="Times New Roman" w:eastAsia="標楷體" w:hAnsi="Times New Roman" w:cs="Times New Roman" w:hint="eastAsia"/>
+              </w:rPr>
+              <w:t>Stakeholders and Interests</w:t>
+            </w:r>
+          </w:p>
+        </w:tc>
+        <w:tc>
+          <w:tcPr>
+            <w:tcW w:w="4148" w:type="dxa"/>
+          </w:tcPr>
+          <w:p>
+            <w:pPr>
+              <w:rPr>
+                <w:rFonts w:ascii="Times New Roman" w:eastAsia="標楷體" w:hAnsi="Times New Roman" w:cs="Times New Roman"/>
+              </w:rPr>
+            </w:pPr>
+            <w:r>
+              <w:rPr>
+                <w:rFonts w:ascii="Times New Roman" w:eastAsia="標楷體" w:hAnsi="Times New Roman" w:cs="Times New Roman" w:hint="eastAsia"/>
+              </w:rPr>
+              <w:t>買家：希望快速準確地找到所需的課程教材或參考書</w:t>
+            </w:r>
+            <w:r>
+              <w:rPr>
+                <w:rFonts w:ascii="Times New Roman" w:eastAsia="標楷體" w:hAnsi="Times New Roman" w:cs="Times New Roman"/>
+              </w:rPr>
+              <w:br/>
+            </w:r>
+            <w:r>
+              <w:rPr>
+                <w:rFonts w:ascii="Times New Roman" w:eastAsia="標楷體" w:hAnsi="Times New Roman" w:cs="Times New Roman" w:hint="eastAsia"/>
+              </w:rPr>
+              <w:t>賣家：希望自己的書籍能被有需求的買家搜尋到並促成交易。</w:t>
+            </w:r>
+          </w:p>
+        </w:tc>
+      </w:tr>
+      <w:tr>
+        <w:tc>
+          <w:tcPr>
+            <w:tcW w:w="4148" w:type="dxa"/>
+          </w:tcPr>
+          <w:p>
+            <w:pPr>
+              <w:rPr>
+                <w:rFonts w:ascii="Times New Roman" w:eastAsia="標楷體" w:hAnsi="Times New Roman" w:cs="Times New Roman"/>
+              </w:rPr>
+            </w:pPr>
+            <w:r>
+              <w:rPr>
+                <w:rFonts w:ascii="Times New Roman" w:eastAsia="標楷體" w:hAnsi="Times New Roman" w:cs="Times New Roman" w:hint="eastAsia"/>
+              </w:rPr>
+              <w:t>Preconditions</w:t>
+            </w:r>
+          </w:p>
+        </w:tc>
+        <w:tc>
+          <w:tcPr>
+            <w:tcW w:w="4148" w:type="dxa"/>
+          </w:tcPr>
+          <w:p>
+            <w:pPr>
+              <w:rPr>
+                <w:rFonts w:ascii="Times New Roman" w:eastAsia="標楷體" w:hAnsi="Times New Roman" w:cs="Times New Roman"/>
+              </w:rPr>
+            </w:pPr>
+            <w:r>
+              <w:rPr>
+                <w:rFonts w:ascii="Times New Roman" w:eastAsia="標楷體" w:hAnsi="Times New Roman" w:cs="Times New Roman" w:hint="eastAsia"/>
+              </w:rPr>
+              <w:t>系統已建立書籍資料庫，且買家已進入搜尋頁面（不一定要登入即可搜尋，但購買通常需登入）。</w:t>
+            </w:r>
+          </w:p>
+        </w:tc>
+      </w:tr>
+      <w:tr>
+        <w:tc>
+          <w:tcPr>
+            <w:tcW w:w="4148" w:type="dxa"/>
+          </w:tcPr>
+          <w:p>
+            <w:pPr>
+              <w:rPr>
+                <w:rFonts w:ascii="Times New Roman" w:eastAsia="標楷體" w:hAnsi="Times New Roman" w:cs="Times New Roman"/>
+              </w:rPr>
+            </w:pPr>
+            <w:r>
+              <w:rPr>
+                <w:rFonts w:ascii="Times New Roman" w:eastAsia="標楷體" w:hAnsi="Times New Roman" w:cs="Times New Roman" w:hint="eastAsia"/>
+              </w:rPr>
+              <w:t>Success Guarantee</w:t>
+            </w:r>
+          </w:p>
+        </w:tc>
+        <w:tc>
+          <w:tcPr>
+            <w:tcW w:w="4148" w:type="dxa"/>
+          </w:tcPr>
+          <w:p>
+            <w:pPr>
+              <w:rPr>
+                <w:rFonts w:ascii="Times New Roman" w:eastAsia="標楷體" w:hAnsi="Times New Roman" w:cs="Times New Roman"/>
+              </w:rPr>
+            </w:pPr>
+            <w:r>
+              <w:rPr>
+                <w:rFonts w:ascii="Times New Roman" w:eastAsia="標楷體" w:hAnsi="Times New Roman" w:cs="Times New Roman" w:hint="eastAsia"/>
+              </w:rPr>
+              <w:t>系統根據買家輸入的準則，顯示符合條件的書籍清單。</w:t>
+            </w:r>
+          </w:p>
+        </w:tc>
+      </w:tr>
+      <w:tr>
+        <w:tc>
+          <w:tcPr>
+            <w:tcW w:w="4148" w:type="dxa"/>
+          </w:tcPr>
+          <w:p>
+            <w:pPr>
+              <w:rPr>
+                <w:rFonts w:ascii="Times New Roman" w:eastAsia="標楷體" w:hAnsi="Times New Roman" w:cs="Times New Roman"/>
+              </w:rPr>
+            </w:pPr>
+            <w:r>
+              <w:rPr>
+                <w:rFonts w:ascii="Times New Roman" w:eastAsia="標楷體" w:hAnsi="Times New Roman" w:cs="Times New Roman" w:hint="eastAsia"/>
+              </w:rPr>
+              <w:t>Main Success Scenario</w:t>
+            </w:r>
+          </w:p>
+        </w:tc>
+        <w:tc>
+          <w:tcPr>
+            <w:tcW w:w="4148" w:type="dxa"/>
+          </w:tcPr>
+          <w:p>
+            <w:pPr>
+              <w:rPr>
+                <w:rFonts w:ascii="Times New Roman" w:eastAsia="標楷體" w:hAnsi="Times New Roman" w:cs="Times New Roman"/>
+              </w:rPr>
+            </w:pPr>
+            <w:r>
+              <w:rPr>
+                <w:rFonts w:ascii="Times New Roman" w:eastAsia="標楷體" w:hAnsi="Times New Roman" w:cs="Times New Roman" w:hint="eastAsia"/>
+              </w:rPr>
+              <w:t xml:space="preserve">1. </w:t>
+            </w:r>
+            <w:r>
+              <w:rPr>
+                <w:rFonts w:ascii="Times New Roman" w:eastAsia="標楷體" w:hAnsi="Times New Roman" w:cs="Times New Roman" w:hint="eastAsia"/>
+              </w:rPr>
+              <w:t>買家在搜尋列輸入關鍵字（書名、作者或</w:t>
+            </w:r>
+            <w:r>
+              <w:rPr>
+                <w:rFonts w:ascii="Times New Roman" w:eastAsia="標楷體" w:hAnsi="Times New Roman" w:cs="Times New Roman" w:hint="eastAsia"/>
+              </w:rPr>
+              <w:t xml:space="preserve"> ISBN</w:t>
+            </w:r>
+            <w:r>
+              <w:rPr>
+                <w:rFonts w:ascii="Times New Roman" w:eastAsia="標楷體" w:hAnsi="Times New Roman" w:cs="Times New Roman" w:hint="eastAsia"/>
+              </w:rPr>
+              <w:t>）。</w:t>
+            </w:r>
+          </w:p>
+          <w:p>
+            <w:pPr>
+              <w:rPr>
+                <w:rFonts w:ascii="Times New Roman" w:eastAsia="標楷體" w:hAnsi="Times New Roman" w:cs="Times New Roman"/>
+              </w:rPr>
+            </w:pPr>
+            <w:r>
+              <w:rPr>
+                <w:rFonts w:ascii="Times New Roman" w:eastAsia="標楷體" w:hAnsi="Times New Roman" w:cs="Times New Roman" w:hint="eastAsia"/>
+              </w:rPr>
+              <w:t xml:space="preserve">2. </w:t>
+            </w:r>
+            <w:r>
+              <w:rPr>
+                <w:rFonts w:ascii="Times New Roman" w:eastAsia="標楷體" w:hAnsi="Times New Roman" w:cs="Times New Roman" w:hint="eastAsia"/>
+              </w:rPr>
+              <w:t>買家選擇篩選條件（如：區域</w:t>
+            </w:r>
+            <w:r>
+              <w:rPr>
+                <w:rFonts w:ascii="Times New Roman" w:eastAsia="標楷體" w:hAnsi="Times New Roman" w:cs="Times New Roman" w:hint="eastAsia"/>
+              </w:rPr>
+              <w:t>/</w:t>
+            </w:r>
+            <w:r>
+              <w:rPr>
+                <w:rFonts w:ascii="Times New Roman" w:eastAsia="標楷體" w:hAnsi="Times New Roman" w:cs="Times New Roman" w:hint="eastAsia"/>
+              </w:rPr>
+              <w:t>校區、價格範圍、書況）。</w:t>
+            </w:r>
+          </w:p>
+          <w:p>
+            <w:pPr>
+              <w:rPr>
+                <w:rFonts w:ascii="Times New Roman" w:eastAsia="標楷體" w:hAnsi="Times New Roman" w:cs="Times New Roman"/>
+              </w:rPr>
+            </w:pPr>
+            <w:r>
+              <w:rPr>
+                <w:rFonts w:ascii="Times New Roman" w:eastAsia="標楷體" w:hAnsi="Times New Roman" w:cs="Times New Roman" w:hint="eastAsia"/>
+              </w:rPr>
+              <w:t xml:space="preserve">3. </w:t>
+            </w:r>
+            <w:r>
+              <w:rPr>
+                <w:rFonts w:ascii="Times New Roman" w:eastAsia="標楷體" w:hAnsi="Times New Roman" w:cs="Times New Roman" w:hint="eastAsia"/>
+              </w:rPr>
+              <w:t>系統根據輸入的關鍵字與篩選準則檢索資料庫。</w:t>
+            </w:r>
+          </w:p>
+          <w:p>
+            <w:pPr>
+              <w:rPr>
+                <w:rFonts w:ascii="Times New Roman" w:eastAsia="標楷體" w:hAnsi="Times New Roman" w:cs="Times New Roman"/>
+              </w:rPr>
+            </w:pPr>
+            <w:r>
+              <w:rPr>
+                <w:rFonts w:ascii="Times New Roman" w:eastAsia="標楷體" w:hAnsi="Times New Roman" w:cs="Times New Roman" w:hint="eastAsia"/>
+              </w:rPr>
+              <w:t xml:space="preserve">4. </w:t>
+            </w:r>
+            <w:r>
+              <w:rPr>
+                <w:rFonts w:ascii="Times New Roman" w:eastAsia="標楷體" w:hAnsi="Times New Roman" w:cs="Times New Roman" w:hint="eastAsia"/>
+              </w:rPr>
+              <w:t>系統依據相關性或價格排序，顯示搜尋結果列表。</w:t>
+            </w:r>
+          </w:p>
+          <w:p>
+            <w:pPr>
+              <w:rPr>
+                <w:rFonts w:ascii="Times New Roman" w:eastAsia="標楷體" w:hAnsi="Times New Roman" w:cs="Times New Roman"/>
+              </w:rPr>
+            </w:pPr>
+            <w:r>
+              <w:rPr>
+                <w:rFonts w:ascii="Times New Roman" w:eastAsia="標楷體" w:hAnsi="Times New Roman" w:cs="Times New Roman" w:hint="eastAsia"/>
+              </w:rPr>
+              <w:t xml:space="preserve">5. </w:t>
+            </w:r>
+            <w:r>
+              <w:rPr>
+                <w:rFonts w:ascii="Times New Roman" w:eastAsia="標楷體" w:hAnsi="Times New Roman" w:cs="Times New Roman" w:hint="eastAsia"/>
+              </w:rPr>
+              <w:t>買家點擊感興趣的書籍查看詳細資訊。</w:t>
+            </w:r>
+          </w:p>
+        </w:tc>
+      </w:tr>
+      <w:tr>
+        <w:tc>
+          <w:tcPr>
+            <w:tcW w:w="4148" w:type="dxa"/>
+          </w:tcPr>
+          <w:p>
+            <w:pPr>
+              <w:rPr>
+                <w:rFonts w:ascii="Times New Roman" w:eastAsia="標楷體" w:hAnsi="Times New Roman" w:cs="Times New Roman"/>
+              </w:rPr>
+            </w:pPr>
+            <w:r>
+              <w:rPr>
+                <w:rFonts w:ascii="Times New Roman" w:eastAsia="標楷體" w:hAnsi="Times New Roman" w:cs="Times New Roman" w:hint="eastAsia"/>
+              </w:rPr>
+              <w:t>Extensions</w:t>
+            </w:r>
+          </w:p>
+        </w:tc>
+        <w:tc>
+          <w:tcPr>
+            <w:tcW w:w="4148" w:type="dxa"/>
+          </w:tcPr>
+          <w:p>
+            <w:pPr>
+              <w:rPr>
+                <w:rFonts w:ascii="Times New Roman" w:eastAsia="標楷體" w:hAnsi="Times New Roman" w:cs="Times New Roman"/>
+              </w:rPr>
+            </w:pPr>
+            <w:r>
+              <w:rPr>
+                <w:rFonts w:ascii="Times New Roman" w:eastAsia="標楷體" w:hAnsi="Times New Roman" w:cs="Times New Roman" w:hint="eastAsia"/>
+              </w:rPr>
+              <w:t xml:space="preserve">3a. </w:t>
+            </w:r>
+            <w:r>
+              <w:rPr>
+                <w:rFonts w:ascii="Times New Roman" w:eastAsia="標楷體" w:hAnsi="Times New Roman" w:cs="Times New Roman" w:hint="eastAsia"/>
+              </w:rPr>
+              <w:t>查無結果：系統提示「找不到相符的書籍」，並建議更改關鍵字或放寬篩選條件。</w:t>
+            </w:r>
+          </w:p>
+          <w:p>
+            <w:pPr>
+              <w:rPr>
+                <w:rFonts w:ascii="Times New Roman" w:eastAsia="標楷體" w:hAnsi="Times New Roman" w:cs="Times New Roman"/>
+              </w:rPr>
+            </w:pPr>
+            <w:r>
+              <w:rPr>
+                <w:rFonts w:ascii="Times New Roman" w:eastAsia="標楷體" w:hAnsi="Times New Roman" w:cs="Times New Roman" w:hint="eastAsia"/>
+              </w:rPr>
+              <w:t xml:space="preserve">3b. </w:t>
+            </w:r>
+            <w:r>
+              <w:rPr>
+                <w:rFonts w:ascii="Times New Roman" w:eastAsia="標楷體" w:hAnsi="Times New Roman" w:cs="Times New Roman" w:hint="eastAsia"/>
+              </w:rPr>
+              <w:t>輸入無效字元：系統自動忽略無效符號或提示重新輸入。</w:t>
+            </w:r>
+          </w:p>
+        </w:tc>
+      </w:tr>
+      <w:tr>
+        <w:tc>
+          <w:tcPr>
+            <w:tcW w:w="4148" w:type="dxa"/>
+          </w:tcPr>
+          <w:p>
+            <w:pPr>
+              <w:rPr>
+                <w:rFonts w:ascii="Times New Roman" w:eastAsia="標楷體" w:hAnsi="Times New Roman" w:cs="Times New Roman"/>
+              </w:rPr>
+            </w:pPr>
+            <w:r>
+              <w:rPr>
+                <w:rFonts w:ascii="Times New Roman" w:eastAsia="標楷體" w:hAnsi="Times New Roman" w:cs="Times New Roman" w:hint="eastAsia"/>
+              </w:rPr>
+              <w:lastRenderedPageBreak/>
+              <w:t>Special Requirements</w:t>
+            </w:r>
+          </w:p>
+        </w:tc>
+        <w:tc>
+          <w:tcPr>
+            <w:tcW w:w="4148" w:type="dxa"/>
+          </w:tcPr>
+          <w:p>
+            <w:pPr>
+              <w:rPr>
+                <w:rFonts w:ascii="Times New Roman" w:eastAsia="標楷體" w:hAnsi="Times New Roman" w:cs="Times New Roman"/>
+              </w:rPr>
+            </w:pPr>
+            <w:r>
+              <w:rPr>
+                <w:rFonts w:ascii="Times New Roman" w:eastAsia="標楷體" w:hAnsi="Times New Roman" w:cs="Times New Roman" w:hint="eastAsia"/>
+              </w:rPr>
+              <w:t>搜尋結果的加載時間應小於</w:t>
+            </w:r>
+            <w:r>
+              <w:rPr>
+                <w:rFonts w:ascii="Times New Roman" w:eastAsia="標楷體" w:hAnsi="Times New Roman" w:cs="Times New Roman" w:hint="eastAsia"/>
+              </w:rPr>
+              <w:t xml:space="preserve"> 2 </w:t>
+            </w:r>
+            <w:r>
+              <w:rPr>
+                <w:rFonts w:ascii="Times New Roman" w:eastAsia="標楷體" w:hAnsi="Times New Roman" w:cs="Times New Roman" w:hint="eastAsia"/>
+              </w:rPr>
+              <w:t>秒。</w:t>
+            </w:r>
+            <w:r>
+              <w:rPr>
+                <w:rFonts w:ascii="Times New Roman" w:eastAsia="標楷體" w:hAnsi="Times New Roman" w:cs="Times New Roman" w:hint="eastAsia"/>
+              </w:rPr>
+              <w:t xml:space="preserve"> (</w:t>
+            </w:r>
+            <w:r>
+              <w:rPr>
+                <w:rFonts w:ascii="Times New Roman" w:eastAsia="標楷體" w:hAnsi="Times New Roman" w:cs="Times New Roman" w:hint="eastAsia"/>
+              </w:rPr>
+              <w:t>屬</w:t>
+            </w:r>
+            <w:r>
+              <w:rPr>
+                <w:rFonts w:ascii="Times New Roman" w:eastAsia="標楷體" w:hAnsi="Times New Roman" w:cs="Times New Roman" w:hint="eastAsia"/>
+              </w:rPr>
+              <w:t xml:space="preserve"> Non-functional Requirement)</w:t>
+            </w:r>
+          </w:p>
+        </w:tc>
+      </w:tr>
+      <w:tr>
+        <w:tc>
+          <w:tcPr>
+            <w:tcW w:w="4148" w:type="dxa"/>
+          </w:tcPr>
+          <w:p>
+            <w:pPr>
+              <w:rPr>
+                <w:rFonts w:ascii="Times New Roman" w:eastAsia="標楷體" w:hAnsi="Times New Roman" w:cs="Times New Roman"/>
+              </w:rPr>
+            </w:pPr>
+            <w:r>
+              <w:rPr>
+                <w:rFonts w:ascii="Times New Roman" w:eastAsia="標楷體" w:hAnsi="Times New Roman" w:cs="Times New Roman" w:hint="eastAsia"/>
+              </w:rPr>
+              <w:t>Technology and Data Variations List</w:t>
+            </w:r>
+          </w:p>
+        </w:tc>
+        <w:tc>
+          <w:tcPr>
+            <w:tcW w:w="4148" w:type="dxa"/>
+          </w:tcPr>
+          <w:p>
+            <w:pPr>
+              <w:rPr>
+                <w:rFonts w:ascii="Times New Roman" w:eastAsia="標楷體" w:hAnsi="Times New Roman" w:cs="Times New Roman"/>
+              </w:rPr>
+            </w:pPr>
+            <w:r>
+              <w:rPr>
+                <w:rFonts w:ascii="Times New Roman" w:eastAsia="標楷體" w:hAnsi="Times New Roman" w:cs="Times New Roman" w:hint="eastAsia"/>
+              </w:rPr>
+              <w:t>支援部分關鍵字匹配（模糊搜尋）；支援</w:t>
+            </w:r>
+            <w:r>
+              <w:rPr>
+                <w:rFonts w:ascii="Times New Roman" w:eastAsia="標楷體" w:hAnsi="Times New Roman" w:cs="Times New Roman" w:hint="eastAsia"/>
+              </w:rPr>
+              <w:t xml:space="preserve"> ISBN-10 </w:t>
+            </w:r>
+            <w:r>
+              <w:rPr>
+                <w:rFonts w:ascii="Times New Roman" w:eastAsia="標楷體" w:hAnsi="Times New Roman" w:cs="Times New Roman" w:hint="eastAsia"/>
+              </w:rPr>
+              <w:t>與</w:t>
+            </w:r>
+            <w:r>
+              <w:rPr>
+                <w:rFonts w:ascii="Times New Roman" w:eastAsia="標楷體" w:hAnsi="Times New Roman" w:cs="Times New Roman" w:hint="eastAsia"/>
+              </w:rPr>
+              <w:t xml:space="preserve"> ISBN-13 </w:t>
+            </w:r>
+            <w:r>
+              <w:rPr>
+                <w:rFonts w:ascii="Times New Roman" w:eastAsia="標楷體" w:hAnsi="Times New Roman" w:cs="Times New Roman" w:hint="eastAsia"/>
+              </w:rPr>
+              <w:t>不同格式的輸入。</w:t>
+            </w:r>
+          </w:p>
+        </w:tc>
+      </w:tr>
+      <w:tr>
+        <w:tc>
+          <w:tcPr>
+            <w:tcW w:w="4148" w:type="dxa"/>
+          </w:tcPr>
+          <w:p>
+            <w:pPr>
+              <w:rPr>
+                <w:rFonts w:ascii="Times New Roman" w:eastAsia="標楷體" w:hAnsi="Times New Roman" w:cs="Times New Roman"/>
+              </w:rPr>
+            </w:pPr>
+            <w:r>
+              <w:rPr>
+                <w:rFonts w:ascii="Times New Roman" w:eastAsia="標楷體" w:hAnsi="Times New Roman" w:cs="Times New Roman" w:hint="eastAsia"/>
+              </w:rPr>
+              <w:t>Frequency of Occurrence</w:t>
+            </w:r>
+          </w:p>
+        </w:tc>
+        <w:tc>
+          <w:tcPr>
+            <w:tcW w:w="4148" w:type="dxa"/>
+          </w:tcPr>
+          <w:p>
+            <w:pPr>
+              <w:rPr>
+                <w:rFonts w:ascii="Times New Roman" w:eastAsia="標楷體" w:hAnsi="Times New Roman" w:cs="Times New Roman"/>
+              </w:rPr>
+            </w:pPr>
+            <w:r>
+              <w:rPr>
+                <w:rFonts w:ascii="Times New Roman" w:eastAsia="標楷體" w:hAnsi="Times New Roman" w:cs="Times New Roman" w:hint="eastAsia"/>
+              </w:rPr>
+              <w:t>每當買家想要尋找書籍時觸發（極高頻率）。</w:t>
+            </w:r>
+          </w:p>
+        </w:tc>
+      </w:tr>
+      <w:tr>
+        <w:tc>
+          <w:tcPr>
+            <w:tcW w:w="4148" w:type="dxa"/>
+          </w:tcPr>
+          <w:p>
+            <w:pPr>
+              <w:rPr>
+                <w:rFonts w:ascii="Times New Roman" w:eastAsia="標楷體" w:hAnsi="Times New Roman" w:cs="Times New Roman"/>
+              </w:rPr>
+            </w:pPr>
+            <w:r>
+              <w:rPr>
+                <w:rFonts w:ascii="Times New Roman" w:eastAsia="標楷體" w:hAnsi="Times New Roman" w:cs="Times New Roman" w:hint="eastAsia"/>
+              </w:rPr>
+              <w:t>Miscellaneous</w:t>
+            </w:r>
+          </w:p>
+        </w:tc>
+        <w:tc>
+          <w:tcPr>
+            <w:tcW w:w="4148" w:type="dxa"/>
+          </w:tcPr>
+          <w:p>
+            <w:pPr>
+              <w:rPr>
+                <w:rFonts w:ascii="Times New Roman" w:eastAsia="標楷體" w:hAnsi="Times New Roman" w:cs="Times New Roman"/>
+              </w:rPr>
+            </w:pPr>
+            <w:r>
+              <w:rPr>
+                <w:rFonts w:ascii="Times New Roman" w:eastAsia="標楷體" w:hAnsi="Times New Roman" w:cs="Times New Roman" w:hint="eastAsia"/>
+              </w:rPr>
+              <w:t>是否需要紀錄買家的搜尋偏好以提供日後推薦？（待開發項目）</w:t>
+            </w:r>
+          </w:p>
+        </w:tc>
+      </w:tr>
+    </w:tbl>
+    <w:p>
+      <w:pPr>
+        <w:rPr>
+          <w:rFonts w:ascii="Times New Roman" w:eastAsia="標楷體" w:hAnsi="Times New Roman" w:cs="Times New Roman"/>
+        </w:rPr>
+      </w:pPr>
+    </w:p>
+    <w:p>
+      <w:pPr>
+        <w:rPr>
+          <w:rFonts w:ascii="Times New Roman" w:eastAsia="標楷體" w:hAnsi="Times New Roman" w:cs="Times New Roman"/>
+        </w:rPr>
+      </w:pPr>
+      <w:r>
+        <w:rPr>
+          <w:rFonts w:ascii="Times New Roman" w:eastAsia="標楷體" w:hAnsi="Times New Roman" w:cs="Times New Roman" w:hint="eastAsia"/>
+        </w:rPr>
+        <w:t xml:space="preserve">1.5.3 </w:t>
+      </w:r>
+      <w:r>
+        <w:rPr>
+          <w:rFonts w:ascii="Times New Roman" w:eastAsia="標楷體" w:hAnsi="Times New Roman" w:cs="Times New Roman" w:hint="eastAsia"/>
+        </w:rPr>
+        <w:t>發送私訊</w:t>
+      </w:r>
+      <w:r>
+        <w:rPr>
+          <w:rFonts w:ascii="Times New Roman" w:eastAsia="標楷體" w:hAnsi="Times New Roman" w:cs="Times New Roman" w:hint="eastAsia"/>
+        </w:rPr>
+        <w:t xml:space="preserve"> (Send Private Message)</w:t>
+      </w:r>
+    </w:p>
+    <w:tbl>
+      <w:tblPr>
+        <w:tblStyle w:val="af2"/>
+        <w:tblW w:w="0" w:type="auto"/>
+        <w:tblLook w:val="04A0" w:firstRow="1" w:lastRow="0" w:firstColumn="1" w:lastColumn="0" w:noHBand="0" w:noVBand="1"/>
+      </w:tblPr>
+      <w:tblGrid>
+        <w:gridCol w:w="4148"/>
+        <w:gridCol w:w="4148"/>
+      </w:tblGrid>
+      <w:tr>
+        <w:tc>
+          <w:tcPr>
+            <w:tcW w:w="4148" w:type="dxa"/>
+          </w:tcPr>
+          <w:p>
+            <w:pPr>
+              <w:rPr>
+                <w:rFonts w:ascii="Times New Roman" w:eastAsia="標楷體" w:hAnsi="Times New Roman" w:cs="Times New Roman"/>
+              </w:rPr>
+            </w:pPr>
+            <w:r>
+              <w:rPr>
+                <w:rFonts w:ascii="Times New Roman" w:eastAsia="標楷體" w:hAnsi="Times New Roman" w:cs="Times New Roman" w:hint="eastAsia"/>
+              </w:rPr>
+              <w:t>Use Case ID</w:t>
+            </w:r>
+          </w:p>
+        </w:tc>
+        <w:tc>
+          <w:tcPr>
+            <w:tcW w:w="4148" w:type="dxa"/>
+          </w:tcPr>
+          <w:p>
+            <w:pPr>
+              <w:rPr>
+                <w:rFonts w:ascii="Times New Roman" w:eastAsia="標楷體" w:hAnsi="Times New Roman" w:cs="Times New Roman"/>
+              </w:rPr>
+            </w:pPr>
+            <w:r>
+              <w:rPr>
+                <w:rFonts w:ascii="Times New Roman" w:eastAsia="標楷體" w:hAnsi="Times New Roman" w:cs="Times New Roman" w:hint="eastAsia"/>
+              </w:rPr>
+              <w:t>FEA-03</w:t>
+            </w:r>
+          </w:p>
+        </w:tc>
+      </w:tr>
+      <w:tr>
+        <w:tc>
+          <w:tcPr>
+            <w:tcW w:w="4148" w:type="dxa"/>
+          </w:tcPr>
+          <w:p>
+            <w:pPr>
+              <w:rPr>
+                <w:rFonts w:ascii="Times New Roman" w:eastAsia="標楷體" w:hAnsi="Times New Roman" w:cs="Times New Roman"/>
+              </w:rPr>
+            </w:pPr>
+            <w:r>
+              <w:rPr>
+                <w:rFonts w:ascii="Times New Roman" w:eastAsia="標楷體" w:hAnsi="Times New Roman" w:cs="Times New Roman" w:hint="eastAsia"/>
+              </w:rPr>
+              <w:t>Scope</w:t>
+            </w:r>
+          </w:p>
+        </w:tc>
+        <w:tc>
+          <w:tcPr>
+            <w:tcW w:w="4148" w:type="dxa"/>
+          </w:tcPr>
+          <w:p>
+            <w:pPr>
+              <w:rPr>
+                <w:rFonts w:ascii="Times New Roman" w:eastAsia="標楷體" w:hAnsi="Times New Roman" w:cs="Times New Roman"/>
+              </w:rPr>
+            </w:pPr>
+            <w:r>
+              <w:rPr>
+                <w:rFonts w:ascii="Times New Roman" w:eastAsia="標楷體" w:hAnsi="Times New Roman" w:cs="Times New Roman" w:hint="eastAsia"/>
+              </w:rPr>
+              <w:t>Re:Book</w:t>
+            </w:r>
+          </w:p>
+        </w:tc>
+      </w:tr>
+      <w:tr>
+        <w:tc>
+          <w:tcPr>
+            <w:tcW w:w="4148" w:type="dxa"/>
+          </w:tcPr>
+          <w:p>
+            <w:pPr>
+              <w:rPr>
+                <w:rFonts w:ascii="Times New Roman" w:eastAsia="標楷體" w:hAnsi="Times New Roman" w:cs="Times New Roman"/>
+              </w:rPr>
+            </w:pPr>
+            <w:r>
+              <w:rPr>
+                <w:rFonts w:ascii="Times New Roman" w:eastAsia="標楷體" w:hAnsi="Times New Roman" w:cs="Times New Roman" w:hint="eastAsia"/>
+              </w:rPr>
+              <w:t>Level</w:t>
+            </w:r>
+          </w:p>
+        </w:tc>
+        <w:tc>
+          <w:tcPr>
+            <w:tcW w:w="4148" w:type="dxa"/>
+          </w:tcPr>
+          <w:p>
+            <w:pPr>
+              <w:rPr>
+                <w:rFonts w:ascii="Times New Roman" w:eastAsia="標楷體" w:hAnsi="Times New Roman" w:cs="Times New Roman"/>
+              </w:rPr>
+            </w:pPr>
+            <w:r>
+              <w:rPr>
+                <w:rFonts w:ascii="Times New Roman" w:eastAsia="標楷體" w:hAnsi="Times New Roman" w:cs="Times New Roman"/>
+              </w:rPr>
+              <w:t>U</w:t>
+            </w:r>
+            <w:r>
+              <w:rPr>
+                <w:rFonts w:ascii="Times New Roman" w:eastAsia="標楷體" w:hAnsi="Times New Roman" w:cs="Times New Roman" w:hint="eastAsia"/>
+              </w:rPr>
+              <w:t>ser-goal</w:t>
+            </w:r>
+          </w:p>
+        </w:tc>
+      </w:tr>
+      <w:tr>
+        <w:tc>
+          <w:tcPr>
+            <w:tcW w:w="4148" w:type="dxa"/>
+          </w:tcPr>
+          <w:p>
+            <w:pPr>
+              <w:rPr>
+                <w:rFonts w:ascii="Times New Roman" w:eastAsia="標楷體" w:hAnsi="Times New Roman" w:cs="Times New Roman"/>
+              </w:rPr>
+            </w:pPr>
+            <w:r>
+              <w:rPr>
+                <w:rFonts w:ascii="Times New Roman" w:eastAsia="標楷體" w:hAnsi="Times New Roman" w:cs="Times New Roman" w:hint="eastAsia"/>
+              </w:rPr>
+              <w:t>Primary Actor</w:t>
+            </w:r>
+          </w:p>
+        </w:tc>
+        <w:tc>
+          <w:tcPr>
+            <w:tcW w:w="4148" w:type="dxa"/>
+          </w:tcPr>
+          <w:p>
+            <w:pPr>
+              <w:rPr>
+                <w:rFonts w:ascii="Times New Roman" w:eastAsia="標楷體" w:hAnsi="Times New Roman" w:cs="Times New Roman"/>
+              </w:rPr>
+            </w:pPr>
+            <w:r>
+              <w:rPr>
+                <w:rFonts w:ascii="Times New Roman" w:eastAsia="標楷體" w:hAnsi="Times New Roman" w:cs="Times New Roman" w:hint="eastAsia"/>
+              </w:rPr>
+              <w:t>買家</w:t>
+            </w:r>
+          </w:p>
+        </w:tc>
+      </w:tr>
+      <w:tr>
+        <w:tc>
+          <w:tcPr>
+            <w:tcW w:w="4148" w:type="dxa"/>
+          </w:tcPr>
+          <w:p>
+            <w:pPr>
+              <w:rPr>
+                <w:rFonts w:ascii="Times New Roman" w:eastAsia="標楷體" w:hAnsi="Times New Roman" w:cs="Times New Roman"/>
+              </w:rPr>
+            </w:pPr>
+            <w:r>
+              <w:rPr>
+                <w:rFonts w:ascii="Times New Roman" w:eastAsia="標楷體" w:hAnsi="Times New Roman" w:cs="Times New Roman" w:hint="eastAsia"/>
+              </w:rPr>
+              <w:t>Stakeholders and Interests</w:t>
+            </w:r>
+          </w:p>
+        </w:tc>
+        <w:tc>
+          <w:tcPr>
+            <w:tcW w:w="4148" w:type="dxa"/>
+          </w:tcPr>
+          <w:p>
+            <w:pPr>
+              <w:rPr>
+                <w:rFonts w:ascii="Times New Roman" w:eastAsia="標楷體" w:hAnsi="Times New Roman" w:cs="Times New Roman"/>
+              </w:rPr>
+            </w:pPr>
+            <w:r>
+              <w:rPr>
+                <w:rFonts w:ascii="Times New Roman" w:eastAsia="標楷體" w:hAnsi="Times New Roman" w:cs="Times New Roman" w:hint="eastAsia"/>
+              </w:rPr>
+              <w:t>買家：希望直接聯繫賣家以詢問書況細節或協商最終價格</w:t>
+            </w:r>
+            <w:r>
+              <w:rPr>
+                <w:rFonts w:ascii="Times New Roman" w:eastAsia="標楷體" w:hAnsi="Times New Roman" w:cs="Times New Roman"/>
+              </w:rPr>
+              <w:br/>
+            </w:r>
+            <w:r>
+              <w:rPr>
+                <w:rFonts w:ascii="Times New Roman" w:eastAsia="標楷體" w:hAnsi="Times New Roman" w:cs="Times New Roman" w:hint="eastAsia"/>
+              </w:rPr>
+              <w:t>賣家：希望在不公開個人通訊軟體（如</w:t>
+            </w:r>
+            <w:r>
+              <w:rPr>
+                <w:rFonts w:ascii="Times New Roman" w:eastAsia="標楷體" w:hAnsi="Times New Roman" w:cs="Times New Roman" w:hint="eastAsia"/>
+              </w:rPr>
+              <w:t xml:space="preserve"> Line</w:t>
+            </w:r>
+            <w:r>
+              <w:rPr>
+                <w:rFonts w:ascii="Times New Roman" w:eastAsia="標楷體" w:hAnsi="Times New Roman" w:cs="Times New Roman" w:hint="eastAsia"/>
+              </w:rPr>
+              <w:t>）的情況下，回答買家疑問並達成交易協議。</w:t>
+            </w:r>
+          </w:p>
+        </w:tc>
+      </w:tr>
+      <w:tr>
+        <w:tc>
+          <w:tcPr>
+            <w:tcW w:w="4148" w:type="dxa"/>
+          </w:tcPr>
+          <w:p>
+            <w:pPr>
+              <w:rPr>
+                <w:rFonts w:ascii="Times New Roman" w:eastAsia="標楷體" w:hAnsi="Times New Roman" w:cs="Times New Roman"/>
+              </w:rPr>
+            </w:pPr>
+            <w:r>
+              <w:rPr>
+                <w:rFonts w:ascii="Times New Roman" w:eastAsia="標楷體" w:hAnsi="Times New Roman" w:cs="Times New Roman" w:hint="eastAsia"/>
+              </w:rPr>
+              <w:t>Preconditions</w:t>
+            </w:r>
+          </w:p>
+        </w:tc>
+        <w:tc>
+          <w:tcPr>
+            <w:tcW w:w="4148" w:type="dxa"/>
+          </w:tcPr>
+          <w:p>
+            <w:pPr>
+              <w:rPr>
+                <w:rFonts w:ascii="Times New Roman" w:eastAsia="標楷體" w:hAnsi="Times New Roman" w:cs="Times New Roman"/>
+              </w:rPr>
+            </w:pPr>
+            <w:r>
+              <w:rPr>
+                <w:rFonts w:ascii="Times New Roman" w:eastAsia="標楷體" w:hAnsi="Times New Roman" w:cs="Times New Roman" w:hint="eastAsia"/>
+              </w:rPr>
+              <w:t>買家必須已登入系統，且正處於某一本書籍的詳細資訊頁面。</w:t>
+            </w:r>
+          </w:p>
+        </w:tc>
+      </w:tr>
+      <w:tr>
+        <w:tc>
+          <w:tcPr>
+            <w:tcW w:w="4148" w:type="dxa"/>
+          </w:tcPr>
+          <w:p>
+            <w:pPr>
+              <w:rPr>
+                <w:rFonts w:ascii="Times New Roman" w:eastAsia="標楷體" w:hAnsi="Times New Roman" w:cs="Times New Roman"/>
+              </w:rPr>
+            </w:pPr>
+            <w:r>
+              <w:rPr>
+                <w:rFonts w:ascii="Times New Roman" w:eastAsia="標楷體" w:hAnsi="Times New Roman" w:cs="Times New Roman" w:hint="eastAsia"/>
+              </w:rPr>
+              <w:t>Success Guarantee</w:t>
+            </w:r>
+          </w:p>
+        </w:tc>
+        <w:tc>
+          <w:tcPr>
+            <w:tcW w:w="4148" w:type="dxa"/>
+          </w:tcPr>
+          <w:p>
+            <w:pPr>
+              <w:rPr>
+                <w:rFonts w:ascii="Times New Roman" w:eastAsia="標楷體" w:hAnsi="Times New Roman" w:cs="Times New Roman"/>
+              </w:rPr>
+            </w:pPr>
+            <w:r>
+              <w:rPr>
+                <w:rFonts w:ascii="Times New Roman" w:eastAsia="標楷體" w:hAnsi="Times New Roman" w:cs="Times New Roman" w:hint="eastAsia"/>
+              </w:rPr>
+              <w:t>訊息正確傳送至賣家的收件匣，且雙方能看到完整的歷史對話紀錄。</w:t>
+            </w:r>
+          </w:p>
+        </w:tc>
+      </w:tr>
+      <w:tr>
+        <w:tc>
+          <w:tcPr>
+            <w:tcW w:w="4148" w:type="dxa"/>
+          </w:tcPr>
+          <w:p>
+            <w:pPr>
+              <w:rPr>
+                <w:rFonts w:ascii="Times New Roman" w:eastAsia="標楷體" w:hAnsi="Times New Roman" w:cs="Times New Roman"/>
+              </w:rPr>
+            </w:pPr>
+            <w:r>
+              <w:rPr>
+                <w:rFonts w:ascii="Times New Roman" w:eastAsia="標楷體" w:hAnsi="Times New Roman" w:cs="Times New Roman" w:hint="eastAsia"/>
+              </w:rPr>
+              <w:t>Main Success Scenario</w:t>
+            </w:r>
+          </w:p>
+        </w:tc>
+        <w:tc>
+          <w:tcPr>
+            <w:tcW w:w="4148" w:type="dxa"/>
+          </w:tcPr>
+          <w:p>
+            <w:pPr>
+              <w:rPr>
+                <w:rFonts w:ascii="Times New Roman" w:eastAsia="標楷體" w:hAnsi="Times New Roman" w:cs="Times New Roman" w:hint="eastAsia"/>
+              </w:rPr>
+            </w:pPr>
+            <w:r>
+              <w:rPr>
+                <w:rFonts w:ascii="Times New Roman" w:eastAsia="標楷體" w:hAnsi="Times New Roman" w:cs="Times New Roman" w:hint="eastAsia"/>
+              </w:rPr>
+              <w:t xml:space="preserve">1. </w:t>
+            </w:r>
+            <w:r>
+              <w:rPr>
+                <w:rFonts w:ascii="Times New Roman" w:eastAsia="標楷體" w:hAnsi="Times New Roman" w:cs="Times New Roman" w:hint="eastAsia"/>
+              </w:rPr>
+              <w:t>買家在書籍詳情頁面點擊「聯繫賣家」按鈕。</w:t>
+            </w:r>
+          </w:p>
+          <w:p>
+            <w:pPr>
+              <w:rPr>
+                <w:rFonts w:ascii="Times New Roman" w:eastAsia="標楷體" w:hAnsi="Times New Roman" w:cs="Times New Roman"/>
+              </w:rPr>
+            </w:pPr>
+            <w:r>
+              <w:rPr>
+                <w:rFonts w:ascii="Times New Roman" w:eastAsia="標楷體" w:hAnsi="Times New Roman" w:cs="Times New Roman" w:hint="eastAsia"/>
+              </w:rPr>
+              <w:t xml:space="preserve">2. </w:t>
+            </w:r>
+            <w:r>
+              <w:rPr>
+                <w:rFonts w:ascii="Times New Roman" w:eastAsia="標楷體" w:hAnsi="Times New Roman" w:cs="Times New Roman" w:hint="eastAsia"/>
+              </w:rPr>
+              <w:t>系統開啟該書籍專屬的私訊對話視窗。</w:t>
+            </w:r>
+          </w:p>
+          <w:p>
+            <w:pPr>
+              <w:rPr>
+                <w:rFonts w:ascii="Times New Roman" w:eastAsia="標楷體" w:hAnsi="Times New Roman" w:cs="Times New Roman"/>
+              </w:rPr>
+            </w:pPr>
+            <w:r>
+              <w:rPr>
+                <w:rFonts w:ascii="Times New Roman" w:eastAsia="標楷體" w:hAnsi="Times New Roman" w:cs="Times New Roman" w:hint="eastAsia"/>
+              </w:rPr>
+              <w:t xml:space="preserve">3. </w:t>
+            </w:r>
+            <w:r>
+              <w:rPr>
+                <w:rFonts w:ascii="Times New Roman" w:eastAsia="標楷體" w:hAnsi="Times New Roman" w:cs="Times New Roman" w:hint="eastAsia"/>
+              </w:rPr>
+              <w:t>買家輸入諮詢內容（如：詢問筆記狀況、議價或約定地點）。</w:t>
+            </w:r>
+          </w:p>
+          <w:p>
+            <w:pPr>
+              <w:rPr>
+                <w:rFonts w:ascii="Times New Roman" w:eastAsia="標楷體" w:hAnsi="Times New Roman" w:cs="Times New Roman" w:hint="eastAsia"/>
+              </w:rPr>
+            </w:pPr>
+            <w:r>
+              <w:rPr>
+                <w:rFonts w:ascii="Times New Roman" w:eastAsia="標楷體" w:hAnsi="Times New Roman" w:cs="Times New Roman" w:hint="eastAsia"/>
+              </w:rPr>
+              <w:t xml:space="preserve">4. </w:t>
+            </w:r>
+            <w:r>
+              <w:rPr>
+                <w:rFonts w:ascii="Times New Roman" w:eastAsia="標楷體" w:hAnsi="Times New Roman" w:cs="Times New Roman" w:hint="eastAsia"/>
+              </w:rPr>
+              <w:t>買家點擊發送。</w:t>
+            </w:r>
+          </w:p>
+          <w:p>
+            <w:pPr>
+              <w:rPr>
+                <w:rFonts w:ascii="Times New Roman" w:eastAsia="標楷體" w:hAnsi="Times New Roman" w:cs="Times New Roman"/>
+              </w:rPr>
+            </w:pPr>
+            <w:r>
+              <w:rPr>
+                <w:rFonts w:ascii="Times New Roman" w:eastAsia="標楷體" w:hAnsi="Times New Roman" w:cs="Times New Roman" w:hint="eastAsia"/>
+              </w:rPr>
+              <w:t xml:space="preserve">5. </w:t>
+            </w:r>
+            <w:r>
+              <w:rPr>
+                <w:rFonts w:ascii="Times New Roman" w:eastAsia="標楷體" w:hAnsi="Times New Roman" w:cs="Times New Roman" w:hint="eastAsia"/>
+              </w:rPr>
+              <w:t>系統將訊息即時推播給賣家，並顯示於兩者的對話清單中。</w:t>
+            </w:r>
+          </w:p>
+        </w:tc>
+      </w:tr>
+      <w:tr>
+        <w:tc>
+          <w:tcPr>
+            <w:tcW w:w="4148" w:type="dxa"/>
+          </w:tcPr>
+          <w:p>
+            <w:pPr>
+              <w:rPr>
+                <w:rFonts w:ascii="Times New Roman" w:eastAsia="標楷體" w:hAnsi="Times New Roman" w:cs="Times New Roman"/>
+              </w:rPr>
+            </w:pPr>
+            <w:r>
+              <w:rPr>
+                <w:rFonts w:ascii="Times New Roman" w:eastAsia="標楷體" w:hAnsi="Times New Roman" w:cs="Times New Roman" w:hint="eastAsia"/>
+              </w:rPr>
+              <w:t>Extensions</w:t>
+            </w:r>
+          </w:p>
+        </w:tc>
+        <w:tc>
+          <w:tcPr>
+            <w:tcW w:w="4148" w:type="dxa"/>
+          </w:tcPr>
+          <w:p>
+            <w:pPr>
+              <w:rPr>
+                <w:rFonts w:ascii="Times New Roman" w:eastAsia="標楷體" w:hAnsi="Times New Roman" w:cs="Times New Roman" w:hint="eastAsia"/>
+              </w:rPr>
+            </w:pPr>
+            <w:r>
+              <w:rPr>
+                <w:rFonts w:ascii="Times New Roman" w:eastAsia="標楷體" w:hAnsi="Times New Roman" w:cs="Times New Roman" w:hint="eastAsia"/>
+              </w:rPr>
+              <w:t xml:space="preserve">4a. </w:t>
+            </w:r>
+            <w:r>
+              <w:rPr>
+                <w:rFonts w:ascii="Times New Roman" w:eastAsia="標楷體" w:hAnsi="Times New Roman" w:cs="Times New Roman" w:hint="eastAsia"/>
+              </w:rPr>
+              <w:t>網路中斷：訊息發送失敗，系統顯示錯誤提示並建議重新嘗試。</w:t>
+            </w:r>
+          </w:p>
+          <w:p>
+            <w:pPr>
+              <w:rPr>
+                <w:rFonts w:ascii="Times New Roman" w:eastAsia="標楷體" w:hAnsi="Times New Roman" w:cs="Times New Roman"/>
+              </w:rPr>
+            </w:pPr>
+            <w:r>
+              <w:rPr>
+                <w:rFonts w:ascii="Times New Roman" w:eastAsia="標楷體" w:hAnsi="Times New Roman" w:cs="Times New Roman" w:hint="eastAsia"/>
+              </w:rPr>
+              <w:t xml:space="preserve">4b. </w:t>
+            </w:r>
+            <w:r>
+              <w:rPr>
+                <w:rFonts w:ascii="Times New Roman" w:eastAsia="標楷體" w:hAnsi="Times New Roman" w:cs="Times New Roman" w:hint="eastAsia"/>
+              </w:rPr>
+              <w:t>使用者遭封鎖：若賣家已封鎖該買家，系統提示無法發送訊息。</w:t>
+            </w:r>
+          </w:p>
+        </w:tc>
+      </w:tr>
+      <w:tr>
+        <w:tc>
+          <w:tcPr>
+            <w:tcW w:w="4148" w:type="dxa"/>
+          </w:tcPr>
+          <w:p>
+            <w:pPr>
+              <w:rPr>
+                <w:rFonts w:ascii="Times New Roman" w:eastAsia="標楷體" w:hAnsi="Times New Roman" w:cs="Times New Roman"/>
+              </w:rPr>
+            </w:pPr>
+            <w:r>
+              <w:rPr>
+                <w:rFonts w:ascii="Times New Roman" w:eastAsia="標楷體" w:hAnsi="Times New Roman" w:cs="Times New Roman" w:hint="eastAsia"/>
+              </w:rPr>
+              <w:lastRenderedPageBreak/>
+              <w:t>Special Requirements</w:t>
+            </w:r>
+          </w:p>
+        </w:tc>
+        <w:tc>
+          <w:tcPr>
+            <w:tcW w:w="4148" w:type="dxa"/>
+          </w:tcPr>
+          <w:p>
+            <w:pPr>
+              <w:rPr>
+                <w:rFonts w:ascii="Times New Roman" w:eastAsia="標楷體" w:hAnsi="Times New Roman" w:cs="Times New Roman"/>
+              </w:rPr>
+            </w:pPr>
+            <w:r>
+              <w:rPr>
+                <w:rFonts w:ascii="Times New Roman" w:eastAsia="標楷體" w:hAnsi="Times New Roman" w:cs="Times New Roman" w:hint="eastAsia"/>
+              </w:rPr>
+              <w:t>訊息應具備加密保護以確保隱私；訊息傳遞的延遲應控制在</w:t>
+            </w:r>
+            <w:r>
+              <w:rPr>
+                <w:rFonts w:ascii="Times New Roman" w:eastAsia="標楷體" w:hAnsi="Times New Roman" w:cs="Times New Roman" w:hint="eastAsia"/>
+              </w:rPr>
+              <w:t xml:space="preserve"> 1 </w:t>
+            </w:r>
+            <w:r>
+              <w:rPr>
+                <w:rFonts w:ascii="Times New Roman" w:eastAsia="標楷體" w:hAnsi="Times New Roman" w:cs="Times New Roman" w:hint="eastAsia"/>
+              </w:rPr>
+              <w:t>秒內。</w:t>
+            </w:r>
+          </w:p>
+        </w:tc>
+      </w:tr>
+      <w:tr>
+        <w:tc>
+          <w:tcPr>
+            <w:tcW w:w="4148" w:type="dxa"/>
+          </w:tcPr>
+          <w:p>
+            <w:pPr>
+              <w:rPr>
+                <w:rFonts w:ascii="Times New Roman" w:eastAsia="標楷體" w:hAnsi="Times New Roman" w:cs="Times New Roman"/>
+              </w:rPr>
+            </w:pPr>
+            <w:r>
+              <w:rPr>
+                <w:rFonts w:ascii="Times New Roman" w:eastAsia="標楷體" w:hAnsi="Times New Roman" w:cs="Times New Roman" w:hint="eastAsia"/>
+              </w:rPr>
+              <w:t>Technology and Data Variations List</w:t>
+            </w:r>
+          </w:p>
+        </w:tc>
+        <w:tc>
+          <w:tcPr>
+            <w:tcW w:w="4148" w:type="dxa"/>
+          </w:tcPr>
+          <w:p>
+            <w:pPr>
+              <w:rPr>
+                <w:rFonts w:ascii="Times New Roman" w:eastAsia="標楷體" w:hAnsi="Times New Roman" w:cs="Times New Roman"/>
+              </w:rPr>
+            </w:pPr>
+            <w:r>
+              <w:rPr>
+                <w:rFonts w:ascii="Times New Roman" w:eastAsia="標楷體" w:hAnsi="Times New Roman" w:cs="Times New Roman" w:hint="eastAsia"/>
+              </w:rPr>
+              <w:t>支援文字訊息；未來可擴充支援圖片傳送（用於拍攝更詳細的書況）。</w:t>
+            </w:r>
+          </w:p>
+        </w:tc>
+      </w:tr>
+      <w:tr>
+        <w:tc>
+          <w:tcPr>
+            <w:tcW w:w="4148" w:type="dxa"/>
+          </w:tcPr>
+          <w:p>
+            <w:pPr>
+              <w:rPr>
+                <w:rFonts w:ascii="Times New Roman" w:eastAsia="標楷體" w:hAnsi="Times New Roman" w:cs="Times New Roman"/>
+              </w:rPr>
+            </w:pPr>
+            <w:r>
+              <w:rPr>
+                <w:rFonts w:ascii="Times New Roman" w:eastAsia="標楷體" w:hAnsi="Times New Roman" w:cs="Times New Roman" w:hint="eastAsia"/>
+              </w:rPr>
+              <w:t>Frequency of Occurrence</w:t>
+            </w:r>
+          </w:p>
+        </w:tc>
+        <w:tc>
+          <w:tcPr>
+            <w:tcW w:w="4148" w:type="dxa"/>
+          </w:tcPr>
+          <w:p>
+            <w:pPr>
+              <w:rPr>
+                <w:rFonts w:ascii="Times New Roman" w:eastAsia="標楷體" w:hAnsi="Times New Roman" w:cs="Times New Roman"/>
+              </w:rPr>
+            </w:pPr>
+            <w:r>
+              <w:rPr>
+                <w:rFonts w:ascii="Times New Roman" w:eastAsia="標楷體" w:hAnsi="Times New Roman" w:cs="Times New Roman" w:hint="eastAsia"/>
+              </w:rPr>
+              <w:t>當買家對特定書籍有購買意願或疑問時觸發（高頻率）。</w:t>
+            </w:r>
+          </w:p>
+        </w:tc>
+      </w:tr>
+      <w:tr>
+        <w:tc>
+          <w:tcPr>
+            <w:tcW w:w="4148" w:type="dxa"/>
+          </w:tcPr>
+          <w:p>
+            <w:pPr>
+              <w:rPr>
+                <w:rFonts w:ascii="Times New Roman" w:eastAsia="標楷體" w:hAnsi="Times New Roman" w:cs="Times New Roman"/>
+              </w:rPr>
+            </w:pPr>
+            <w:r>
+              <w:rPr>
+                <w:rFonts w:ascii="Times New Roman" w:eastAsia="標楷體" w:hAnsi="Times New Roman" w:cs="Times New Roman" w:hint="eastAsia"/>
+              </w:rPr>
+              <w:t>Miscellaneous</w:t>
+            </w:r>
+          </w:p>
+        </w:tc>
+        <w:tc>
+          <w:tcPr>
+            <w:tcW w:w="4148" w:type="dxa"/>
+          </w:tcPr>
+          <w:p>
+            <w:pPr>
+              <w:rPr>
+                <w:rFonts w:ascii="Times New Roman" w:eastAsia="標楷體" w:hAnsi="Times New Roman" w:cs="Times New Roman"/>
+              </w:rPr>
+            </w:pPr>
+            <w:r>
+              <w:rPr>
+                <w:rFonts w:ascii="Times New Roman" w:eastAsia="標楷體" w:hAnsi="Times New Roman" w:cs="Times New Roman" w:hint="eastAsia"/>
+              </w:rPr>
+              <w:t>是否需要設置檢舉功能以防止騷擾？（待討論問題）</w:t>
+            </w:r>
+          </w:p>
+        </w:tc>
+      </w:tr>
+    </w:tbl>
+    <w:p>
+      <w:pPr>
+        <w:rPr>
+          <w:rFonts w:ascii="Times New Roman" w:eastAsia="標楷體" w:hAnsi="Times New Roman" w:cs="Times New Roman"/>
+        </w:rPr>
+      </w:pPr>
+    </w:p>
+    <w:p>
+      <w:pPr>
+        <w:rPr>
+          <w:rFonts w:ascii="Times New Roman" w:eastAsia="標楷體" w:hAnsi="Times New Roman" w:cs="Times New Roman"/>
+        </w:rPr>
+      </w:pPr>
+      <w:r>
+        <w:rPr>
+          <w:rFonts w:ascii="Times New Roman" w:eastAsia="標楷體" w:hAnsi="Times New Roman" w:cs="Times New Roman" w:hint="eastAsia"/>
+        </w:rPr>
+        <w:t xml:space="preserve">1.5.4 </w:t>
+      </w:r>
+      <w:r>
+        <w:rPr>
+          <w:rFonts w:ascii="Times New Roman" w:eastAsia="標楷體" w:hAnsi="Times New Roman" w:cs="Times New Roman" w:hint="eastAsia"/>
+        </w:rPr>
+        <w:t>分類管理</w:t>
+      </w:r>
+      <w:r>
+        <w:rPr>
+          <w:rFonts w:ascii="Times New Roman" w:eastAsia="標楷體" w:hAnsi="Times New Roman" w:cs="Times New Roman" w:hint="eastAsia"/>
+        </w:rPr>
+        <w:t xml:space="preserve"> (Categorize Books)</w:t>
+      </w:r>
+    </w:p>
+    <w:tbl>
+      <w:tblPr>
+        <w:tblStyle w:val="af2"/>
+        <w:tblW w:w="0" w:type="auto"/>
+        <w:tblLook w:val="04A0" w:firstRow="1" w:lastRow="0" w:firstColumn="1" w:lastColumn="0" w:noHBand="0" w:noVBand="1"/>
+      </w:tblPr>
+      <w:tblGrid>
+        <w:gridCol w:w="4148"/>
+        <w:gridCol w:w="4148"/>
+      </w:tblGrid>
+      <w:tr>
+        <w:tc>
+          <w:tcPr>
+            <w:tcW w:w="4148" w:type="dxa"/>
+          </w:tcPr>
+          <w:p>
+            <w:pPr>
+              <w:rPr>
+                <w:rFonts w:ascii="Times New Roman" w:eastAsia="標楷體" w:hAnsi="Times New Roman" w:cs="Times New Roman"/>
+              </w:rPr>
+            </w:pPr>
+            <w:r>
+              <w:rPr>
+                <w:rFonts w:ascii="Times New Roman" w:eastAsia="標楷體" w:hAnsi="Times New Roman" w:cs="Times New Roman" w:hint="eastAsia"/>
+              </w:rPr>
+              <w:t>Use Case ID</w:t>
+            </w:r>
+          </w:p>
+        </w:tc>
+        <w:tc>
+          <w:tcPr>
+            <w:tcW w:w="4148" w:type="dxa"/>
+          </w:tcPr>
+          <w:p>
+            <w:pPr>
+              <w:rPr>
+                <w:rFonts w:ascii="Times New Roman" w:eastAsia="標楷體" w:hAnsi="Times New Roman" w:cs="Times New Roman"/>
+              </w:rPr>
+            </w:pPr>
+            <w:r>
+              <w:rPr>
+                <w:rFonts w:ascii="Times New Roman" w:eastAsia="標楷體" w:hAnsi="Times New Roman" w:cs="Times New Roman" w:hint="eastAsia"/>
+              </w:rPr>
+              <w:t>FEA-04</w:t>
+            </w:r>
+          </w:p>
+        </w:tc>
+      </w:tr>
+      <w:tr>
+        <w:tc>
+          <w:tcPr>
+            <w:tcW w:w="4148" w:type="dxa"/>
+          </w:tcPr>
+          <w:p>
+            <w:pPr>
+              <w:rPr>
+                <w:rFonts w:ascii="Times New Roman" w:eastAsia="標楷體" w:hAnsi="Times New Roman" w:cs="Times New Roman"/>
+              </w:rPr>
+            </w:pPr>
+            <w:r>
+              <w:rPr>
+                <w:rFonts w:ascii="Times New Roman" w:eastAsia="標楷體" w:hAnsi="Times New Roman" w:cs="Times New Roman" w:hint="eastAsia"/>
+              </w:rPr>
+              <w:t>Scope</w:t>
+            </w:r>
+          </w:p>
+        </w:tc>
+        <w:tc>
+          <w:tcPr>
+            <w:tcW w:w="4148" w:type="dxa"/>
+          </w:tcPr>
+          <w:p>
+            <w:pPr>
+              <w:rPr>
+                <w:rFonts w:ascii="Times New Roman" w:eastAsia="標楷體" w:hAnsi="Times New Roman" w:cs="Times New Roman"/>
+              </w:rPr>
+            </w:pPr>
+            <w:r>
+              <w:rPr>
+                <w:rFonts w:ascii="Times New Roman" w:eastAsia="標楷體" w:hAnsi="Times New Roman" w:cs="Times New Roman" w:hint="eastAsia"/>
+              </w:rPr>
+              <w:t>Re:Book</w:t>
+            </w:r>
+          </w:p>
+        </w:tc>
+      </w:tr>
+      <w:tr>
+        <w:tc>
+          <w:tcPr>
+            <w:tcW w:w="4148" w:type="dxa"/>
+          </w:tcPr>
+          <w:p>
+            <w:pPr>
+              <w:rPr>
+                <w:rFonts w:ascii="Times New Roman" w:eastAsia="標楷體" w:hAnsi="Times New Roman" w:cs="Times New Roman"/>
+              </w:rPr>
+            </w:pPr>
+            <w:r>
+              <w:rPr>
+                <w:rFonts w:ascii="Times New Roman" w:eastAsia="標楷體" w:hAnsi="Times New Roman" w:cs="Times New Roman" w:hint="eastAsia"/>
+              </w:rPr>
+              <w:t>Level</w:t>
+            </w:r>
+          </w:p>
+        </w:tc>
+        <w:tc>
+          <w:tcPr>
+            <w:tcW w:w="4148" w:type="dxa"/>
+          </w:tcPr>
+          <w:p>
+            <w:pPr>
+              <w:rPr>
+                <w:rFonts w:ascii="Times New Roman" w:eastAsia="標楷體" w:hAnsi="Times New Roman" w:cs="Times New Roman"/>
+              </w:rPr>
+            </w:pPr>
+            <w:r>
+              <w:rPr>
+                <w:rFonts w:ascii="Times New Roman" w:eastAsia="標楷體" w:hAnsi="Times New Roman" w:cs="Times New Roman"/>
+              </w:rPr>
+              <w:t>U</w:t>
+            </w:r>
+            <w:r>
+              <w:rPr>
+                <w:rFonts w:ascii="Times New Roman" w:eastAsia="標楷體" w:hAnsi="Times New Roman" w:cs="Times New Roman" w:hint="eastAsia"/>
+              </w:rPr>
+              <w:t>ser-goal</w:t>
+            </w:r>
+          </w:p>
+        </w:tc>
+      </w:tr>
+      <w:tr>
+        <w:tc>
+          <w:tcPr>
+            <w:tcW w:w="4148" w:type="dxa"/>
+          </w:tcPr>
+          <w:p>
+            <w:pPr>
+              <w:rPr>
+                <w:rFonts w:ascii="Times New Roman" w:eastAsia="標楷體" w:hAnsi="Times New Roman" w:cs="Times New Roman"/>
+              </w:rPr>
+            </w:pPr>
+            <w:r>
+              <w:rPr>
+                <w:rFonts w:ascii="Times New Roman" w:eastAsia="標楷體" w:hAnsi="Times New Roman" w:cs="Times New Roman" w:hint="eastAsia"/>
+              </w:rPr>
+              <w:t>Primary Actor</w:t>
+            </w:r>
+          </w:p>
+        </w:tc>
+        <w:tc>
+          <w:tcPr>
+            <w:tcW w:w="4148" w:type="dxa"/>
+          </w:tcPr>
+          <w:p>
+            <w:pPr>
+              <w:rPr>
+                <w:rFonts w:ascii="Times New Roman" w:eastAsia="標楷體" w:hAnsi="Times New Roman" w:cs="Times New Roman"/>
+              </w:rPr>
+            </w:pPr>
+            <w:r>
+              <w:rPr>
+                <w:rFonts w:ascii="Times New Roman" w:eastAsia="標楷體" w:hAnsi="Times New Roman" w:cs="Times New Roman" w:hint="eastAsia"/>
+              </w:rPr>
+              <w:t>賣家</w:t>
+            </w:r>
+          </w:p>
+        </w:tc>
+      </w:tr>
+      <w:tr>
+        <w:tc>
+          <w:tcPr>
+            <w:tcW w:w="4148" w:type="dxa"/>
+          </w:tcPr>
+          <w:p>
+            <w:pPr>
+              <w:rPr>
+                <w:rFonts w:ascii="Times New Roman" w:eastAsia="標楷體" w:hAnsi="Times New Roman" w:cs="Times New Roman"/>
+              </w:rPr>
+            </w:pPr>
+            <w:r>
+              <w:rPr>
+                <w:rFonts w:ascii="Times New Roman" w:eastAsia="標楷體" w:hAnsi="Times New Roman" w:cs="Times New Roman" w:hint="eastAsia"/>
+              </w:rPr>
+              <w:t>Stakeholders and Interests</w:t>
+            </w:r>
+          </w:p>
+        </w:tc>
+        <w:tc>
+          <w:tcPr>
+            <w:tcW w:w="4148" w:type="dxa"/>
+          </w:tcPr>
+          <w:p>
+            <w:pPr>
+              <w:rPr>
+                <w:rFonts w:ascii="Times New Roman" w:eastAsia="標楷體" w:hAnsi="Times New Roman" w:cs="Times New Roman"/>
+              </w:rPr>
+            </w:pPr>
+            <w:r>
+              <w:rPr>
+                <w:rFonts w:ascii="Times New Roman" w:eastAsia="標楷體" w:hAnsi="Times New Roman" w:cs="Times New Roman" w:hint="eastAsia"/>
+              </w:rPr>
+              <w:t>賣家：希望將上架的多本書籍整理得井然有序，提高賣場專業度與成交率</w:t>
+            </w:r>
+            <w:r>
+              <w:rPr>
+                <w:rFonts w:ascii="Times New Roman" w:eastAsia="標楷體" w:hAnsi="Times New Roman" w:cs="Times New Roman"/>
+              </w:rPr>
+              <w:br/>
+            </w:r>
+            <w:r>
+              <w:rPr>
+                <w:rFonts w:ascii="Times New Roman" w:eastAsia="標楷體" w:hAnsi="Times New Roman" w:cs="Times New Roman" w:hint="eastAsia"/>
+              </w:rPr>
+              <w:t>買家：希望能根據類別（如系所、科目）快速瀏覽賣家的所有藏書。</w:t>
+            </w:r>
+          </w:p>
+        </w:tc>
+      </w:tr>
+      <w:tr>
+        <w:tc>
+          <w:tcPr>
+            <w:tcW w:w="4148" w:type="dxa"/>
+          </w:tcPr>
+          <w:p>
+            <w:pPr>
+              <w:rPr>
+                <w:rFonts w:ascii="Times New Roman" w:eastAsia="標楷體" w:hAnsi="Times New Roman" w:cs="Times New Roman"/>
+              </w:rPr>
+            </w:pPr>
+            <w:r>
+              <w:rPr>
+                <w:rFonts w:ascii="Times New Roman" w:eastAsia="標楷體" w:hAnsi="Times New Roman" w:cs="Times New Roman" w:hint="eastAsia"/>
+              </w:rPr>
+              <w:t>Preconditions</w:t>
+            </w:r>
+          </w:p>
+        </w:tc>
+        <w:tc>
+          <w:tcPr>
+            <w:tcW w:w="4148" w:type="dxa"/>
+          </w:tcPr>
+          <w:p>
+            <w:pPr>
+              <w:rPr>
+                <w:rFonts w:ascii="Times New Roman" w:eastAsia="標楷體" w:hAnsi="Times New Roman" w:cs="Times New Roman"/>
+              </w:rPr>
+            </w:pPr>
+            <w:r>
+              <w:rPr>
+                <w:rFonts w:ascii="Times New Roman" w:eastAsia="標楷體" w:hAnsi="Times New Roman" w:cs="Times New Roman" w:hint="eastAsia"/>
+              </w:rPr>
+              <w:t>賣家必須已登入，且帳號內已上架多本待售書籍。</w:t>
+            </w:r>
+          </w:p>
+        </w:tc>
+      </w:tr>
+      <w:tr>
+        <w:tc>
+          <w:tcPr>
+            <w:tcW w:w="4148" w:type="dxa"/>
+          </w:tcPr>
+          <w:p>
+            <w:pPr>
+              <w:rPr>
+                <w:rFonts w:ascii="Times New Roman" w:eastAsia="標楷體" w:hAnsi="Times New Roman" w:cs="Times New Roman"/>
+              </w:rPr>
+            </w:pPr>
+            <w:r>
+              <w:rPr>
+                <w:rFonts w:ascii="Times New Roman" w:eastAsia="標楷體" w:hAnsi="Times New Roman" w:cs="Times New Roman" w:hint="eastAsia"/>
+              </w:rPr>
+              <w:t>Success Guarantee</w:t>
+            </w:r>
+          </w:p>
+        </w:tc>
+        <w:tc>
+          <w:tcPr>
+            <w:tcW w:w="4148" w:type="dxa"/>
+          </w:tcPr>
+          <w:p>
+            <w:pPr>
+              <w:rPr>
+                <w:rFonts w:ascii="Times New Roman" w:eastAsia="標楷體" w:hAnsi="Times New Roman" w:cs="Times New Roman"/>
+              </w:rPr>
+            </w:pPr>
+            <w:r>
+              <w:rPr>
+                <w:rFonts w:ascii="Times New Roman" w:eastAsia="標楷體" w:hAnsi="Times New Roman" w:cs="Times New Roman" w:hint="eastAsia"/>
+              </w:rPr>
+              <w:t>書籍被正確歸類至指定的分類中，且買家在賣家個人頁面能看到清楚的分類結構。</w:t>
+            </w:r>
+          </w:p>
+        </w:tc>
+      </w:tr>
+      <w:tr>
+        <w:tc>
+          <w:tcPr>
+            <w:tcW w:w="4148" w:type="dxa"/>
+          </w:tcPr>
+          <w:p>
+            <w:pPr>
+              <w:rPr>
+                <w:rFonts w:ascii="Times New Roman" w:eastAsia="標楷體" w:hAnsi="Times New Roman" w:cs="Times New Roman"/>
+              </w:rPr>
+            </w:pPr>
+            <w:r>
+              <w:rPr>
+                <w:rFonts w:ascii="Times New Roman" w:eastAsia="標楷體" w:hAnsi="Times New Roman" w:cs="Times New Roman" w:hint="eastAsia"/>
+              </w:rPr>
+              <w:t>Main Success Scenario</w:t>
+            </w:r>
+          </w:p>
+        </w:tc>
+        <w:tc>
+          <w:tcPr>
+            <w:tcW w:w="4148" w:type="dxa"/>
+          </w:tcPr>
+          <w:p>
+            <w:pPr>
+              <w:rPr>
+                <w:rFonts w:ascii="Times New Roman" w:eastAsia="標楷體" w:hAnsi="Times New Roman" w:cs="Times New Roman" w:hint="eastAsia"/>
+              </w:rPr>
+            </w:pPr>
+            <w:r>
+              <w:rPr>
+                <w:rFonts w:ascii="Times New Roman" w:eastAsia="標楷體" w:hAnsi="Times New Roman" w:cs="Times New Roman" w:hint="eastAsia"/>
+              </w:rPr>
+              <w:t xml:space="preserve">1. </w:t>
+            </w:r>
+            <w:r>
+              <w:rPr>
+                <w:rFonts w:ascii="Times New Roman" w:eastAsia="標楷體" w:hAnsi="Times New Roman" w:cs="Times New Roman" w:hint="eastAsia"/>
+              </w:rPr>
+              <w:t>賣家進入「個人賣場管理」頁面。</w:t>
+            </w:r>
+          </w:p>
+          <w:p>
+            <w:pPr>
+              <w:rPr>
+                <w:rFonts w:ascii="Times New Roman" w:eastAsia="標楷體" w:hAnsi="Times New Roman" w:cs="Times New Roman"/>
+              </w:rPr>
+            </w:pPr>
+            <w:r>
+              <w:rPr>
+                <w:rFonts w:ascii="Times New Roman" w:eastAsia="標楷體" w:hAnsi="Times New Roman" w:cs="Times New Roman" w:hint="eastAsia"/>
+              </w:rPr>
+              <w:t xml:space="preserve">2. </w:t>
+            </w:r>
+            <w:r>
+              <w:rPr>
+                <w:rFonts w:ascii="Times New Roman" w:eastAsia="標楷體" w:hAnsi="Times New Roman" w:cs="Times New Roman" w:hint="eastAsia"/>
+              </w:rPr>
+              <w:t>賣家選擇「建立</w:t>
+            </w:r>
+            <w:r>
+              <w:rPr>
+                <w:rFonts w:ascii="Times New Roman" w:eastAsia="標楷體" w:hAnsi="Times New Roman" w:cs="Times New Roman" w:hint="eastAsia"/>
+              </w:rPr>
+              <w:t>/</w:t>
+            </w:r>
+            <w:r>
+              <w:rPr>
+                <w:rFonts w:ascii="Times New Roman" w:eastAsia="標楷體" w:hAnsi="Times New Roman" w:cs="Times New Roman" w:hint="eastAsia"/>
+              </w:rPr>
+              <w:t>編輯分類」（如：資工系大一教材、語言學習書）。</w:t>
+            </w:r>
+          </w:p>
+          <w:p>
+            <w:pPr>
+              <w:rPr>
+                <w:rFonts w:ascii="Times New Roman" w:eastAsia="標楷體" w:hAnsi="Times New Roman" w:cs="Times New Roman"/>
+              </w:rPr>
+            </w:pPr>
+            <w:r>
+              <w:rPr>
+                <w:rFonts w:ascii="Times New Roman" w:eastAsia="標楷體" w:hAnsi="Times New Roman" w:cs="Times New Roman" w:hint="eastAsia"/>
+              </w:rPr>
+              <w:t xml:space="preserve">3. </w:t>
+            </w:r>
+            <w:r>
+              <w:rPr>
+                <w:rFonts w:ascii="Times New Roman" w:eastAsia="標楷體" w:hAnsi="Times New Roman" w:cs="Times New Roman" w:hint="eastAsia"/>
+              </w:rPr>
+              <w:t>賣家從已上架的書籍清單中，勾選欲歸入該分類的多本書籍。</w:t>
+            </w:r>
+          </w:p>
+          <w:p>
+            <w:pPr>
+              <w:rPr>
+                <w:rFonts w:ascii="Times New Roman" w:eastAsia="標楷體" w:hAnsi="Times New Roman" w:cs="Times New Roman"/>
+              </w:rPr>
+            </w:pPr>
+            <w:r>
+              <w:rPr>
+                <w:rFonts w:ascii="Times New Roman" w:eastAsia="標楷體" w:hAnsi="Times New Roman" w:cs="Times New Roman" w:hint="eastAsia"/>
+              </w:rPr>
+              <w:t xml:space="preserve">4. </w:t>
+            </w:r>
+            <w:r>
+              <w:rPr>
+                <w:rFonts w:ascii="Times New Roman" w:eastAsia="標楷體" w:hAnsi="Times New Roman" w:cs="Times New Roman" w:hint="eastAsia"/>
+              </w:rPr>
+              <w:t>賣家點擊「確認套用」。</w:t>
+            </w:r>
+          </w:p>
+          <w:p>
+            <w:pPr>
+              <w:rPr>
+                <w:rFonts w:ascii="Times New Roman" w:eastAsia="標楷體" w:hAnsi="Times New Roman" w:cs="Times New Roman"/>
+              </w:rPr>
+            </w:pPr>
+            <w:r>
+              <w:rPr>
+                <w:rFonts w:ascii="Times New Roman" w:eastAsia="標楷體" w:hAnsi="Times New Roman" w:cs="Times New Roman" w:hint="eastAsia"/>
+              </w:rPr>
+              <w:t xml:space="preserve">5. </w:t>
+            </w:r>
+            <w:r>
+              <w:rPr>
+                <w:rFonts w:ascii="Times New Roman" w:eastAsia="標楷體" w:hAnsi="Times New Roman" w:cs="Times New Roman" w:hint="eastAsia"/>
+              </w:rPr>
+              <w:t>系統更新書籍與分類的關聯資料，並即時反映在賣家賣場。</w:t>
+            </w:r>
+          </w:p>
+        </w:tc>
+      </w:tr>
+      <w:tr>
+        <w:tc>
+          <w:tcPr>
+            <w:tcW w:w="4148" w:type="dxa"/>
+          </w:tcPr>
+          <w:p>
+            <w:pPr>
+              <w:rPr>
+                <w:rFonts w:ascii="Times New Roman" w:eastAsia="標楷體" w:hAnsi="Times New Roman" w:cs="Times New Roman"/>
+              </w:rPr>
+            </w:pPr>
+            <w:r>
+              <w:rPr>
+                <w:rFonts w:ascii="Times New Roman" w:eastAsia="標楷體" w:hAnsi="Times New Roman" w:cs="Times New Roman" w:hint="eastAsia"/>
+              </w:rPr>
+              <w:t>Extensions</w:t>
+            </w:r>
+          </w:p>
+        </w:tc>
+        <w:tc>
+          <w:tcPr>
+            <w:tcW w:w="4148" w:type="dxa"/>
+          </w:tcPr>
+          <w:p>
+            <w:pPr>
+              <w:rPr>
+                <w:rFonts w:ascii="Times New Roman" w:eastAsia="標楷體" w:hAnsi="Times New Roman" w:cs="Times New Roman" w:hint="eastAsia"/>
+              </w:rPr>
+            </w:pPr>
+            <w:r>
+              <w:rPr>
+                <w:rFonts w:ascii="Times New Roman" w:eastAsia="標楷體" w:hAnsi="Times New Roman" w:cs="Times New Roman" w:hint="eastAsia"/>
+              </w:rPr>
+              <w:t xml:space="preserve">2a. </w:t>
+            </w:r>
+            <w:r>
+              <w:rPr>
+                <w:rFonts w:ascii="Times New Roman" w:eastAsia="標楷體" w:hAnsi="Times New Roman" w:cs="Times New Roman" w:hint="eastAsia"/>
+              </w:rPr>
+              <w:t>分類名稱重複：系統提示該分類已存在。</w:t>
+            </w:r>
+          </w:p>
+          <w:p>
+            <w:pPr>
+              <w:rPr>
+                <w:rFonts w:ascii="Times New Roman" w:eastAsia="標楷體" w:hAnsi="Times New Roman" w:cs="Times New Roman"/>
+              </w:rPr>
+            </w:pPr>
+            <w:r>
+              <w:rPr>
+                <w:rFonts w:ascii="Times New Roman" w:eastAsia="標楷體" w:hAnsi="Times New Roman" w:cs="Times New Roman" w:hint="eastAsia"/>
+              </w:rPr>
+              <w:t xml:space="preserve">3a. </w:t>
+            </w:r>
+            <w:r>
+              <w:rPr>
+                <w:rFonts w:ascii="Times New Roman" w:eastAsia="標楷體" w:hAnsi="Times New Roman" w:cs="Times New Roman" w:hint="eastAsia"/>
+              </w:rPr>
+              <w:t>批次移動失敗：若系統在處理大量書籍關聯時發生錯誤，系統應還原狀態並提示賣家重新操作。</w:t>
+            </w:r>
+          </w:p>
+          <w:p>
+            <w:pPr>
+              <w:rPr>
+                <w:rFonts w:ascii="Times New Roman" w:eastAsia="標楷體" w:hAnsi="Times New Roman" w:cs="Times New Roman"/>
+              </w:rPr>
+            </w:pPr>
+            <w:r>
+              <w:rPr>
+                <w:rFonts w:ascii="Times New Roman" w:eastAsia="標楷體" w:hAnsi="Times New Roman" w:cs="Times New Roman" w:hint="eastAsia"/>
+              </w:rPr>
+              <w:t xml:space="preserve">4a. </w:t>
+            </w:r>
+            <w:r>
+              <w:rPr>
+                <w:rFonts w:ascii="Times New Roman" w:eastAsia="標楷體" w:hAnsi="Times New Roman" w:cs="Times New Roman" w:hint="eastAsia"/>
+              </w:rPr>
+              <w:t>刪除分類：賣家刪除分類時，系</w:t>
+            </w:r>
+            <w:r>
+              <w:rPr>
+                <w:rFonts w:ascii="Times New Roman" w:eastAsia="標楷體" w:hAnsi="Times New Roman" w:cs="Times New Roman" w:hint="eastAsia"/>
+              </w:rPr>
+              <w:lastRenderedPageBreak/>
+              <w:t>統需確認書籍是否回歸到「未分類」狀態而非直接刪除書籍。</w:t>
+            </w:r>
+          </w:p>
+        </w:tc>
+      </w:tr>
+      <w:tr>
+        <w:tc>
+          <w:tcPr>
+            <w:tcW w:w="4148" w:type="dxa"/>
+          </w:tcPr>
+          <w:p>
+            <w:pPr>
+              <w:rPr>
+                <w:rFonts w:ascii="Times New Roman" w:eastAsia="標楷體" w:hAnsi="Times New Roman" w:cs="Times New Roman"/>
+              </w:rPr>
+            </w:pPr>
+            <w:r>
+              <w:rPr>
+                <w:rFonts w:ascii="Times New Roman" w:eastAsia="標楷體" w:hAnsi="Times New Roman" w:cs="Times New Roman" w:hint="eastAsia"/>
+              </w:rPr>
+              <w:lastRenderedPageBreak/>
+              <w:t>Special Requirements</w:t>
+            </w:r>
+          </w:p>
+        </w:tc>
+        <w:tc>
+          <w:tcPr>
+            <w:tcW w:w="4148" w:type="dxa"/>
+          </w:tcPr>
+          <w:p>
+            <w:pPr>
+              <w:rPr>
+                <w:rFonts w:ascii="Times New Roman" w:eastAsia="標楷體" w:hAnsi="Times New Roman" w:cs="Times New Roman"/>
+              </w:rPr>
+            </w:pPr>
+            <w:r>
+              <w:rPr>
+                <w:rFonts w:ascii="Times New Roman" w:eastAsia="標楷體" w:hAnsi="Times New Roman" w:cs="Times New Roman" w:hint="eastAsia"/>
+              </w:rPr>
+              <w:t>支援「批次處理」功能，確保賣家能一次性分類多本書籍，減少重複動作。</w:t>
+            </w:r>
+          </w:p>
+        </w:tc>
+      </w:tr>
+      <w:tr>
+        <w:tc>
+          <w:tcPr>
+            <w:tcW w:w="4148" w:type="dxa"/>
+          </w:tcPr>
+          <w:p>
+            <w:pPr>
+              <w:rPr>
+                <w:rFonts w:ascii="Times New Roman" w:eastAsia="標楷體" w:hAnsi="Times New Roman" w:cs="Times New Roman"/>
+              </w:rPr>
+            </w:pPr>
+            <w:r>
+              <w:rPr>
+                <w:rFonts w:ascii="Times New Roman" w:eastAsia="標楷體" w:hAnsi="Times New Roman" w:cs="Times New Roman" w:hint="eastAsia"/>
+              </w:rPr>
+              <w:t>Technology and Data Variations List</w:t>
+            </w:r>
+          </w:p>
+        </w:tc>
+        <w:tc>
+          <w:tcPr>
+            <w:tcW w:w="4148" w:type="dxa"/>
+          </w:tcPr>
+          <w:p>
+            <w:pPr>
+              <w:rPr>
+                <w:rFonts w:ascii="Times New Roman" w:eastAsia="標楷體" w:hAnsi="Times New Roman" w:cs="Times New Roman"/>
+              </w:rPr>
+            </w:pPr>
+            <w:r>
+              <w:rPr>
+                <w:rFonts w:ascii="Times New Roman" w:eastAsia="標楷體" w:hAnsi="Times New Roman" w:cs="Times New Roman" w:hint="eastAsia"/>
+              </w:rPr>
+              <w:t>系統應預設基礎分類（如：</w:t>
+            </w:r>
+            <w:r>
+              <w:rPr>
+                <w:rFonts w:ascii="Times New Roman" w:eastAsia="標楷體" w:hAnsi="Times New Roman" w:cs="Times New Roman" w:hint="eastAsia"/>
+              </w:rPr>
+              <w:t xml:space="preserve">ISBN </w:t>
+            </w:r>
+            <w:r>
+              <w:rPr>
+                <w:rFonts w:ascii="Times New Roman" w:eastAsia="標楷體" w:hAnsi="Times New Roman" w:cs="Times New Roman" w:hint="eastAsia"/>
+              </w:rPr>
+              <w:t>自動帶入的類別），並允許賣家自定義標籤（</w:t>
+            </w:r>
+            <w:r>
+              <w:rPr>
+                <w:rFonts w:ascii="Times New Roman" w:eastAsia="標楷體" w:hAnsi="Times New Roman" w:cs="Times New Roman" w:hint="eastAsia"/>
+              </w:rPr>
+              <w:t>Tag</w:t>
+            </w:r>
+            <w:r>
+              <w:rPr>
+                <w:rFonts w:ascii="Times New Roman" w:eastAsia="標楷體" w:hAnsi="Times New Roman" w:cs="Times New Roman" w:hint="eastAsia"/>
+              </w:rPr>
+              <w:t>）進行更彈性的管理。</w:t>
+            </w:r>
+          </w:p>
+        </w:tc>
+      </w:tr>
+      <w:tr>
+        <w:tc>
+          <w:tcPr>
+            <w:tcW w:w="4148" w:type="dxa"/>
+          </w:tcPr>
+          <w:p>
+            <w:pPr>
+              <w:rPr>
+                <w:rFonts w:ascii="Times New Roman" w:eastAsia="標楷體" w:hAnsi="Times New Roman" w:cs="Times New Roman"/>
+              </w:rPr>
+            </w:pPr>
+            <w:r>
+              <w:rPr>
+                <w:rFonts w:ascii="Times New Roman" w:eastAsia="標楷體" w:hAnsi="Times New Roman" w:cs="Times New Roman" w:hint="eastAsia"/>
+              </w:rPr>
+              <w:t>Frequency of Occurrence</w:t>
+            </w:r>
+          </w:p>
+        </w:tc>
+        <w:tc>
+          <w:tcPr>
+            <w:tcW w:w="4148" w:type="dxa"/>
+          </w:tcPr>
+          <w:p>
+            <w:pPr>
+              <w:rPr>
+                <w:rFonts w:ascii="Times New Roman" w:eastAsia="標楷體" w:hAnsi="Times New Roman" w:cs="Times New Roman"/>
+              </w:rPr>
+            </w:pPr>
+            <w:r>
+              <w:rPr>
+                <w:rFonts w:ascii="Times New Roman" w:eastAsia="標楷體" w:hAnsi="Times New Roman" w:cs="Times New Roman" w:hint="eastAsia"/>
+              </w:rPr>
+              <w:t>當賣家擁有超過一定數量的書籍，或需要整理賣場時觸發（中頻率）。</w:t>
+            </w:r>
+          </w:p>
+        </w:tc>
+      </w:tr>
+      <w:tr>
+        <w:tc>
+          <w:tcPr>
+            <w:tcW w:w="4148" w:type="dxa"/>
+          </w:tcPr>
+          <w:p>
+            <w:pPr>
+              <w:rPr>
+                <w:rFonts w:ascii="Times New Roman" w:eastAsia="標楷體" w:hAnsi="Times New Roman" w:cs="Times New Roman"/>
+              </w:rPr>
+            </w:pPr>
+            <w:r>
+              <w:rPr>
+                <w:rFonts w:ascii="Times New Roman" w:eastAsia="標楷體" w:hAnsi="Times New Roman" w:cs="Times New Roman" w:hint="eastAsia"/>
+              </w:rPr>
+              <w:t>Miscellaneous</w:t>
+            </w:r>
+          </w:p>
+        </w:tc>
+        <w:tc>
+          <w:tcPr>
+            <w:tcW w:w="4148" w:type="dxa"/>
+          </w:tcPr>
+          <w:p>
+            <w:pPr>
+              <w:rPr>
+                <w:rFonts w:ascii="Times New Roman" w:eastAsia="標楷體" w:hAnsi="Times New Roman" w:cs="Times New Roman"/>
+              </w:rPr>
+            </w:pPr>
+            <w:r>
+              <w:rPr>
+                <w:rFonts w:ascii="Times New Roman" w:eastAsia="標楷體" w:hAnsi="Times New Roman" w:cs="Times New Roman" w:hint="eastAsia"/>
+              </w:rPr>
+              <w:t>是否需要限制單一分類下的書籍數量上限？或限制自定義分類的總數？</w:t>
+            </w:r>
+          </w:p>
+        </w:tc>
+      </w:tr>
+    </w:tbl>
+    <w:p>
+      <w:pPr>
+        <w:rPr>
+          <w:rFonts w:ascii="Times New Roman" w:eastAsia="標楷體" w:hAnsi="Times New Roman" w:cs="Times New Roman"/>
+        </w:rPr>
+      </w:pPr>
+    </w:p>
+    <w:p>
+      <w:pPr>
+        <w:rPr>
+          <w:rFonts w:ascii="Times New Roman" w:eastAsia="標楷體" w:hAnsi="Times New Roman" w:cs="Times New Roman"/>
+        </w:rPr>
+      </w:pPr>
+      <w:r>
+        <w:rPr>
+          <w:rFonts w:ascii="Times New Roman" w:eastAsia="標楷體" w:hAnsi="Times New Roman" w:cs="Times New Roman" w:hint="eastAsia"/>
+        </w:rPr>
+        <w:t xml:space="preserve">1.5.5 </w:t>
+      </w:r>
+      <w:r>
+        <w:rPr>
+          <w:rFonts w:ascii="Times New Roman" w:eastAsia="標楷體" w:hAnsi="Times New Roman" w:cs="Times New Roman" w:hint="eastAsia"/>
+        </w:rPr>
+        <w:t>管理</w:t>
+      </w:r>
+      <w:r>
+        <w:rPr>
+          <w:rFonts w:ascii="Times New Roman" w:eastAsia="標楷體" w:hAnsi="Times New Roman" w:cs="Times New Roman" w:hint="eastAsia"/>
+        </w:rPr>
+        <w:t>購物車</w:t>
+      </w:r>
+    </w:p>
+    <w:tbl>
+      <w:tblPr>
+        <w:tblStyle w:val="af2"/>
+        <w:tblW w:w="0" w:type="auto"/>
+        <w:tblLook w:val="04A0" w:firstRow="1" w:lastRow="0" w:firstColumn="1" w:lastColumn="0" w:noHBand="0" w:noVBand="1"/>
+      </w:tblPr>
+      <w:tblGrid>
+        <w:gridCol w:w="4148"/>
+        <w:gridCol w:w="4148"/>
+      </w:tblGrid>
+      <w:tr>
+        <w:tc>
+          <w:tcPr>
+            <w:tcW w:w="4148" w:type="dxa"/>
+          </w:tcPr>
+          <w:p>
+            <w:pPr>
+              <w:rPr>
+                <w:rFonts w:ascii="Times New Roman" w:eastAsia="標楷體" w:hAnsi="Times New Roman" w:cs="Times New Roman"/>
+              </w:rPr>
+            </w:pPr>
+            <w:r>
+              <w:rPr>
+                <w:rFonts w:ascii="Times New Roman" w:eastAsia="標楷體" w:hAnsi="Times New Roman" w:cs="Times New Roman" w:hint="eastAsia"/>
+              </w:rPr>
+              <w:t>Use Case ID</w:t>
+            </w:r>
+          </w:p>
+        </w:tc>
+        <w:tc>
+          <w:tcPr>
+            <w:tcW w:w="4148" w:type="dxa"/>
+          </w:tcPr>
+          <w:p>
+            <w:pPr>
+              <w:rPr>
+                <w:rFonts w:ascii="Times New Roman" w:eastAsia="標楷體" w:hAnsi="Times New Roman" w:cs="Times New Roman"/>
+              </w:rPr>
+            </w:pPr>
+            <w:r>
+              <w:rPr>
+                <w:rFonts w:ascii="Times New Roman" w:eastAsia="標楷體" w:hAnsi="Times New Roman" w:cs="Times New Roman" w:hint="eastAsia"/>
+              </w:rPr>
+              <w:t>FEA-05</w:t>
+            </w:r>
+          </w:p>
+        </w:tc>
+      </w:tr>
+      <w:tr>
+        <w:tc>
+          <w:tcPr>
+            <w:tcW w:w="4148" w:type="dxa"/>
+          </w:tcPr>
+          <w:p>
+            <w:pPr>
+              <w:rPr>
+                <w:rFonts w:ascii="Times New Roman" w:eastAsia="標楷體" w:hAnsi="Times New Roman" w:cs="Times New Roman"/>
+              </w:rPr>
+            </w:pPr>
+            <w:r>
+              <w:rPr>
+                <w:rFonts w:ascii="Times New Roman" w:eastAsia="標楷體" w:hAnsi="Times New Roman" w:cs="Times New Roman" w:hint="eastAsia"/>
+              </w:rPr>
+              <w:t>Scope</w:t>
+            </w:r>
+          </w:p>
+        </w:tc>
+        <w:tc>
+          <w:tcPr>
+            <w:tcW w:w="4148" w:type="dxa"/>
+          </w:tcPr>
+          <w:p>
+            <w:pPr>
+              <w:rPr>
+                <w:rFonts w:ascii="Times New Roman" w:eastAsia="標楷體" w:hAnsi="Times New Roman" w:cs="Times New Roman"/>
+              </w:rPr>
+            </w:pPr>
+            <w:r>
+              <w:rPr>
+                <w:rFonts w:ascii="Times New Roman" w:eastAsia="標楷體" w:hAnsi="Times New Roman" w:cs="Times New Roman"/>
+              </w:rPr>
+              <w:t>Re:Book</w:t>
+            </w:r>
+          </w:p>
+        </w:tc>
+      </w:tr>
+      <w:tr>
+        <w:tc>
+          <w:tcPr>
+            <w:tcW w:w="4148" w:type="dxa"/>
+          </w:tcPr>
+          <w:p>
+            <w:pPr>
+              <w:rPr>
+                <w:rFonts w:ascii="Times New Roman" w:eastAsia="標楷體" w:hAnsi="Times New Roman" w:cs="Times New Roman"/>
+              </w:rPr>
+            </w:pPr>
+            <w:r>
+              <w:rPr>
+                <w:rFonts w:ascii="Times New Roman" w:eastAsia="標楷體" w:hAnsi="Times New Roman" w:cs="Times New Roman" w:hint="eastAsia"/>
+              </w:rPr>
+              <w:t>Level</w:t>
+            </w:r>
+          </w:p>
+        </w:tc>
+        <w:tc>
+          <w:tcPr>
+            <w:tcW w:w="4148" w:type="dxa"/>
+          </w:tcPr>
+          <w:p>
+            <w:pPr>
+              <w:rPr>
+                <w:rFonts w:ascii="Times New Roman" w:eastAsia="標楷體" w:hAnsi="Times New Roman" w:cs="Times New Roman"/>
+              </w:rPr>
+            </w:pPr>
+            <w:r>
+              <w:rPr>
+                <w:rFonts w:ascii="Times New Roman" w:eastAsia="標楷體" w:hAnsi="Times New Roman" w:cs="Times New Roman"/>
+              </w:rPr>
+              <w:t>U</w:t>
+            </w:r>
+            <w:r>
+              <w:rPr>
+                <w:rFonts w:ascii="Times New Roman" w:eastAsia="標楷體" w:hAnsi="Times New Roman" w:cs="Times New Roman" w:hint="eastAsia"/>
+              </w:rPr>
+              <w:t>ser-goal</w:t>
+            </w:r>
+          </w:p>
+        </w:tc>
+      </w:tr>
+      <w:tr>
+        <w:tc>
+          <w:tcPr>
+            <w:tcW w:w="4148" w:type="dxa"/>
+          </w:tcPr>
+          <w:p>
+            <w:pPr>
+              <w:rPr>
+                <w:rFonts w:ascii="Times New Roman" w:eastAsia="標楷體" w:hAnsi="Times New Roman" w:cs="Times New Roman"/>
+              </w:rPr>
+            </w:pPr>
+            <w:r>
+              <w:rPr>
+                <w:rFonts w:ascii="Times New Roman" w:eastAsia="標楷體" w:hAnsi="Times New Roman" w:cs="Times New Roman" w:hint="eastAsia"/>
+              </w:rPr>
+              <w:t>Primary Actor</w:t>
+            </w:r>
+          </w:p>
+        </w:tc>
+        <w:tc>
+          <w:tcPr>
+            <w:tcW w:w="4148" w:type="dxa"/>
+          </w:tcPr>
+          <w:p>
+            <w:pPr>
+              <w:rPr>
+                <w:rFonts w:ascii="Times New Roman" w:eastAsia="標楷體" w:hAnsi="Times New Roman" w:cs="Times New Roman"/>
+              </w:rPr>
+            </w:pPr>
+            <w:r>
+              <w:rPr>
+                <w:rFonts w:ascii="Times New Roman" w:eastAsia="標楷體" w:hAnsi="Times New Roman" w:cs="Times New Roman" w:hint="eastAsia"/>
+              </w:rPr>
+              <w:t>買家</w:t>
+            </w:r>
+          </w:p>
+        </w:tc>
+      </w:tr>
+      <w:tr>
+        <w:tc>
+          <w:tcPr>
+            <w:tcW w:w="4148" w:type="dxa"/>
+          </w:tcPr>
+          <w:p>
+            <w:pPr>
+              <w:rPr>
+                <w:rFonts w:ascii="Times New Roman" w:eastAsia="標楷體" w:hAnsi="Times New Roman" w:cs="Times New Roman"/>
+              </w:rPr>
+            </w:pPr>
+            <w:r>
+              <w:rPr>
+                <w:rFonts w:ascii="Times New Roman" w:eastAsia="標楷體" w:hAnsi="Times New Roman" w:cs="Times New Roman" w:hint="eastAsia"/>
+              </w:rPr>
+              <w:t>Stakeholders and Interests</w:t>
+            </w:r>
+          </w:p>
+        </w:tc>
+        <w:tc>
+          <w:tcPr>
+            <w:tcW w:w="4148" w:type="dxa"/>
+          </w:tcPr>
+          <w:p>
+            <w:pPr>
+              <w:rPr>
+                <w:rFonts w:ascii="Times New Roman" w:eastAsia="標楷體" w:hAnsi="Times New Roman" w:cs="Times New Roman"/>
+              </w:rPr>
+            </w:pPr>
+            <w:r>
+              <w:rPr>
+                <w:rFonts w:ascii="Times New Roman" w:eastAsia="標楷體" w:hAnsi="Times New Roman" w:cs="Times New Roman" w:hint="eastAsia"/>
+              </w:rPr>
+              <w:t>買家：希望在正式決定交易前，先暫存感興趣的書籍，以便一次性聯繫不同賣家或比較價格</w:t>
+            </w:r>
+            <w:r>
+              <w:rPr>
+                <w:rFonts w:ascii="Times New Roman" w:eastAsia="標楷體" w:hAnsi="Times New Roman" w:cs="Times New Roman"/>
+              </w:rPr>
+              <w:br/>
+            </w:r>
+            <w:r>
+              <w:rPr>
+                <w:rFonts w:ascii="Times New Roman" w:eastAsia="標楷體" w:hAnsi="Times New Roman" w:cs="Times New Roman" w:hint="eastAsia"/>
+              </w:rPr>
+              <w:t>賣家：希望知道有多少潛在買家對其書籍感興趣（追蹤數）。</w:t>
+            </w:r>
+          </w:p>
+        </w:tc>
+      </w:tr>
+      <w:tr>
+        <w:tc>
+          <w:tcPr>
+            <w:tcW w:w="4148" w:type="dxa"/>
+          </w:tcPr>
+          <w:p>
+            <w:pPr>
+              <w:rPr>
+                <w:rFonts w:ascii="Times New Roman" w:eastAsia="標楷體" w:hAnsi="Times New Roman" w:cs="Times New Roman"/>
+              </w:rPr>
+            </w:pPr>
+            <w:r>
+              <w:rPr>
+                <w:rFonts w:ascii="Times New Roman" w:eastAsia="標楷體" w:hAnsi="Times New Roman" w:cs="Times New Roman" w:hint="eastAsia"/>
+              </w:rPr>
+              <w:t>Preconditions</w:t>
+            </w:r>
+          </w:p>
+        </w:tc>
+        <w:tc>
+          <w:tcPr>
+            <w:tcW w:w="4148" w:type="dxa"/>
+          </w:tcPr>
+          <w:p>
+            <w:pPr>
+              <w:rPr>
+                <w:rFonts w:ascii="Times New Roman" w:eastAsia="標楷體" w:hAnsi="Times New Roman" w:cs="Times New Roman"/>
+              </w:rPr>
+            </w:pPr>
+            <w:r>
+              <w:rPr>
+                <w:rFonts w:ascii="Times New Roman" w:eastAsia="標楷體" w:hAnsi="Times New Roman" w:cs="Times New Roman" w:hint="eastAsia"/>
+              </w:rPr>
+              <w:t>買家必須已登入系統，且系統中存在可選購的書籍。</w:t>
+            </w:r>
+          </w:p>
+        </w:tc>
+      </w:tr>
+      <w:tr>
+        <w:tc>
+          <w:tcPr>
+            <w:tcW w:w="4148" w:type="dxa"/>
+          </w:tcPr>
+          <w:p>
+            <w:pPr>
+              <w:rPr>
+                <w:rFonts w:ascii="Times New Roman" w:eastAsia="標楷體" w:hAnsi="Times New Roman" w:cs="Times New Roman"/>
+              </w:rPr>
+            </w:pPr>
+            <w:r>
+              <w:rPr>
+                <w:rFonts w:ascii="Times New Roman" w:eastAsia="標楷體" w:hAnsi="Times New Roman" w:cs="Times New Roman" w:hint="eastAsia"/>
+              </w:rPr>
+              <w:t>Success Guarantee</w:t>
+            </w:r>
+          </w:p>
+        </w:tc>
+        <w:tc>
+          <w:tcPr>
+            <w:tcW w:w="4148" w:type="dxa"/>
+          </w:tcPr>
+          <w:p>
+            <w:pPr>
+              <w:rPr>
+                <w:rFonts w:ascii="Times New Roman" w:eastAsia="標楷體" w:hAnsi="Times New Roman" w:cs="Times New Roman"/>
+              </w:rPr>
+            </w:pPr>
+            <w:r>
+              <w:rPr>
+                <w:rFonts w:ascii="Times New Roman" w:eastAsia="標楷體" w:hAnsi="Times New Roman" w:cs="Times New Roman" w:hint="eastAsia"/>
+              </w:rPr>
+              <w:t>書籍成功加入買家的個人清單，且系統能即時反映該書籍的最新狀態（如：是否已被他人買走）。</w:t>
+            </w:r>
+          </w:p>
+        </w:tc>
+      </w:tr>
+      <w:tr>
+        <w:tc>
+          <w:tcPr>
+            <w:tcW w:w="4148" w:type="dxa"/>
+          </w:tcPr>
+          <w:p>
+            <w:pPr>
+              <w:rPr>
+                <w:rFonts w:ascii="Times New Roman" w:eastAsia="標楷體" w:hAnsi="Times New Roman" w:cs="Times New Roman"/>
+              </w:rPr>
+            </w:pPr>
+            <w:r>
+              <w:rPr>
+                <w:rFonts w:ascii="Times New Roman" w:eastAsia="標楷體" w:hAnsi="Times New Roman" w:cs="Times New Roman" w:hint="eastAsia"/>
+              </w:rPr>
+              <w:t>Main Success Scenario</w:t>
+            </w:r>
+          </w:p>
+        </w:tc>
+        <w:tc>
+          <w:tcPr>
+            <w:tcW w:w="4148" w:type="dxa"/>
+          </w:tcPr>
+          <w:p>
+            <w:pPr>
+              <w:rPr>
+                <w:rFonts w:ascii="Times New Roman" w:eastAsia="標楷體" w:hAnsi="Times New Roman" w:cs="Times New Roman" w:hint="eastAsia"/>
+              </w:rPr>
+            </w:pPr>
+            <w:r>
+              <w:rPr>
+                <w:rFonts w:ascii="Times New Roman" w:eastAsia="標楷體" w:hAnsi="Times New Roman" w:cs="Times New Roman" w:hint="eastAsia"/>
+              </w:rPr>
+              <w:t xml:space="preserve">1. </w:t>
+            </w:r>
+            <w:r>
+              <w:rPr>
+                <w:rFonts w:ascii="Times New Roman" w:eastAsia="標楷體" w:hAnsi="Times New Roman" w:cs="Times New Roman" w:hint="eastAsia"/>
+              </w:rPr>
+              <w:t>買家在搜尋結果或書籍詳情頁點擊「加入清單」。</w:t>
+            </w:r>
+          </w:p>
+          <w:p>
+            <w:pPr>
+              <w:rPr>
+                <w:rFonts w:ascii="Times New Roman" w:eastAsia="標楷體" w:hAnsi="Times New Roman" w:cs="Times New Roman"/>
+              </w:rPr>
+            </w:pPr>
+            <w:r>
+              <w:rPr>
+                <w:rFonts w:ascii="Times New Roman" w:eastAsia="標楷體" w:hAnsi="Times New Roman" w:cs="Times New Roman" w:hint="eastAsia"/>
+              </w:rPr>
+              <w:t xml:space="preserve">2. </w:t>
+            </w:r>
+            <w:r>
+              <w:rPr>
+                <w:rFonts w:ascii="Times New Roman" w:eastAsia="標楷體" w:hAnsi="Times New Roman" w:cs="Times New Roman" w:hint="eastAsia"/>
+              </w:rPr>
+              <w:t>系統將該書籍物件存入買家的「意向清單」中。</w:t>
+            </w:r>
+          </w:p>
+          <w:p>
+            <w:pPr>
+              <w:rPr>
+                <w:rFonts w:ascii="Times New Roman" w:eastAsia="標楷體" w:hAnsi="Times New Roman" w:cs="Times New Roman"/>
+              </w:rPr>
+            </w:pPr>
+            <w:r>
+              <w:rPr>
+                <w:rFonts w:ascii="Times New Roman" w:eastAsia="標楷體" w:hAnsi="Times New Roman" w:cs="Times New Roman" w:hint="eastAsia"/>
+              </w:rPr>
+              <w:t xml:space="preserve">3. </w:t>
+            </w:r>
+            <w:r>
+              <w:rPr>
+                <w:rFonts w:ascii="Times New Roman" w:eastAsia="標楷體" w:hAnsi="Times New Roman" w:cs="Times New Roman" w:hint="eastAsia"/>
+              </w:rPr>
+              <w:t>買家進入清單頁面，查看所有已收藏的書籍資訊與賣家資訊。</w:t>
+            </w:r>
+          </w:p>
+          <w:p>
+            <w:pPr>
+              <w:rPr>
+                <w:rFonts w:ascii="Times New Roman" w:eastAsia="標楷體" w:hAnsi="Times New Roman" w:cs="Times New Roman"/>
+              </w:rPr>
+            </w:pPr>
+            <w:r>
+              <w:rPr>
+                <w:rFonts w:ascii="Times New Roman" w:eastAsia="標楷體" w:hAnsi="Times New Roman" w:cs="Times New Roman" w:hint="eastAsia"/>
+              </w:rPr>
+              <w:t xml:space="preserve">4. </w:t>
+            </w:r>
+            <w:r>
+              <w:rPr>
+                <w:rFonts w:ascii="Times New Roman" w:eastAsia="標楷體" w:hAnsi="Times New Roman" w:cs="Times New Roman" w:hint="eastAsia"/>
+              </w:rPr>
+              <w:t>買家可從清單中直接發起私訊或進行最終確認。</w:t>
+            </w:r>
+          </w:p>
+        </w:tc>
+      </w:tr>
+      <w:tr>
+        <w:tc>
+          <w:tcPr>
+            <w:tcW w:w="4148" w:type="dxa"/>
+          </w:tcPr>
+          <w:p>
+            <w:pPr>
+              <w:rPr>
+                <w:rFonts w:ascii="Times New Roman" w:eastAsia="標楷體" w:hAnsi="Times New Roman" w:cs="Times New Roman"/>
+              </w:rPr>
+            </w:pPr>
+            <w:r>
+              <w:rPr>
+                <w:rFonts w:ascii="Times New Roman" w:eastAsia="標楷體" w:hAnsi="Times New Roman" w:cs="Times New Roman" w:hint="eastAsia"/>
+              </w:rPr>
+              <w:t>Extensions</w:t>
+            </w:r>
+          </w:p>
+        </w:tc>
+        <w:tc>
+          <w:tcPr>
+            <w:tcW w:w="4148" w:type="dxa"/>
+          </w:tcPr>
+          <w:p>
+            <w:pPr>
+              <w:rPr>
+                <w:rFonts w:ascii="Times New Roman" w:eastAsia="標楷體" w:hAnsi="Times New Roman" w:cs="Times New Roman" w:hint="eastAsia"/>
+              </w:rPr>
+            </w:pPr>
+            <w:r>
+              <w:rPr>
+                <w:rFonts w:ascii="Times New Roman" w:eastAsia="標楷體" w:hAnsi="Times New Roman" w:cs="Times New Roman" w:hint="eastAsia"/>
+              </w:rPr>
+              <w:t xml:space="preserve">2a. </w:t>
+            </w:r>
+            <w:r>
+              <w:rPr>
+                <w:rFonts w:ascii="Times New Roman" w:eastAsia="標楷體" w:hAnsi="Times New Roman" w:cs="Times New Roman" w:hint="eastAsia"/>
+              </w:rPr>
+              <w:t>書籍已下架</w:t>
+            </w:r>
+            <w:r>
+              <w:rPr>
+                <w:rFonts w:ascii="Times New Roman" w:eastAsia="標楷體" w:hAnsi="Times New Roman" w:cs="Times New Roman" w:hint="eastAsia"/>
+              </w:rPr>
+              <w:t>/</w:t>
+            </w:r>
+            <w:r>
+              <w:rPr>
+                <w:rFonts w:ascii="Times New Roman" w:eastAsia="標楷體" w:hAnsi="Times New Roman" w:cs="Times New Roman" w:hint="eastAsia"/>
+              </w:rPr>
+              <w:t>售出：系統提示該商</w:t>
+            </w:r>
+            <w:r>
+              <w:rPr>
+                <w:rFonts w:ascii="Times New Roman" w:eastAsia="標楷體" w:hAnsi="Times New Roman" w:cs="Times New Roman" w:hint="eastAsia"/>
+              </w:rPr>
+              <w:lastRenderedPageBreak/>
+              <w:t>品已失效，並自動從清單中標註或移除。</w:t>
+            </w:r>
+          </w:p>
+          <w:p>
+            <w:pPr>
+              <w:rPr>
+                <w:rFonts w:ascii="Times New Roman" w:eastAsia="標楷體" w:hAnsi="Times New Roman" w:cs="Times New Roman"/>
+              </w:rPr>
+            </w:pPr>
+            <w:r>
+              <w:rPr>
+                <w:rFonts w:ascii="Times New Roman" w:eastAsia="標楷體" w:hAnsi="Times New Roman" w:cs="Times New Roman" w:hint="eastAsia"/>
+              </w:rPr>
+              <w:t xml:space="preserve">3a. </w:t>
+            </w:r>
+            <w:r>
+              <w:rPr>
+                <w:rFonts w:ascii="Times New Roman" w:eastAsia="標楷體" w:hAnsi="Times New Roman" w:cs="Times New Roman" w:hint="eastAsia"/>
+              </w:rPr>
+              <w:t>移除書籍：買家從清單中手動刪除不再感興趣的書籍。</w:t>
+            </w:r>
+          </w:p>
+          <w:p>
+            <w:pPr>
+              <w:rPr>
+                <w:rFonts w:ascii="Times New Roman" w:eastAsia="標楷體" w:hAnsi="Times New Roman" w:cs="Times New Roman"/>
+              </w:rPr>
+            </w:pPr>
+            <w:r>
+              <w:rPr>
+                <w:rFonts w:ascii="Times New Roman" w:eastAsia="標楷體" w:hAnsi="Times New Roman" w:cs="Times New Roman" w:hint="eastAsia"/>
+              </w:rPr>
+              <w:t xml:space="preserve">4a. </w:t>
+            </w:r>
+            <w:r>
+              <w:rPr>
+                <w:rFonts w:ascii="Times New Roman" w:eastAsia="標楷體" w:hAnsi="Times New Roman" w:cs="Times New Roman" w:hint="eastAsia"/>
+              </w:rPr>
+              <w:t>重複加入：若書籍已在清單中，系統提示不重複加入。</w:t>
+            </w:r>
+          </w:p>
+        </w:tc>
+      </w:tr>
+      <w:tr>
+        <w:tc>
+          <w:tcPr>
+            <w:tcW w:w="4148" w:type="dxa"/>
+          </w:tcPr>
+          <w:p>
+            <w:pPr>
+              <w:rPr>
+                <w:rFonts w:ascii="Times New Roman" w:eastAsia="標楷體" w:hAnsi="Times New Roman" w:cs="Times New Roman"/>
+              </w:rPr>
+            </w:pPr>
+            <w:r>
+              <w:rPr>
+                <w:rFonts w:ascii="Times New Roman" w:eastAsia="標楷體" w:hAnsi="Times New Roman" w:cs="Times New Roman" w:hint="eastAsia"/>
+              </w:rPr>
+              <w:lastRenderedPageBreak/>
+              <w:t>Special Requirements</w:t>
+            </w:r>
+          </w:p>
+        </w:tc>
+        <w:tc>
+          <w:tcPr>
+            <w:tcW w:w="4148" w:type="dxa"/>
+          </w:tcPr>
+          <w:p>
+            <w:pPr>
+              <w:rPr>
+                <w:rFonts w:ascii="Times New Roman" w:eastAsia="標楷體" w:hAnsi="Times New Roman" w:cs="Times New Roman"/>
+              </w:rPr>
+            </w:pPr>
+            <w:r>
+              <w:rPr>
+                <w:rFonts w:ascii="Times New Roman" w:eastAsia="標楷體" w:hAnsi="Times New Roman" w:cs="Times New Roman" w:hint="eastAsia"/>
+              </w:rPr>
+              <w:t>清單應能即時（</w:t>
+            </w:r>
+            <w:r>
+              <w:rPr>
+                <w:rFonts w:ascii="Times New Roman" w:eastAsia="標楷體" w:hAnsi="Times New Roman" w:cs="Times New Roman" w:hint="eastAsia"/>
+              </w:rPr>
+              <w:t>Real-time</w:t>
+            </w:r>
+            <w:r>
+              <w:rPr>
+                <w:rFonts w:ascii="Times New Roman" w:eastAsia="標楷體" w:hAnsi="Times New Roman" w:cs="Times New Roman" w:hint="eastAsia"/>
+              </w:rPr>
+              <w:t>）同步書籍的銷售狀態。</w:t>
+            </w:r>
+          </w:p>
+        </w:tc>
+      </w:tr>
+      <w:tr>
+        <w:tc>
+          <w:tcPr>
+            <w:tcW w:w="4148" w:type="dxa"/>
+          </w:tcPr>
+          <w:p>
+            <w:pPr>
+              <w:rPr>
+                <w:rFonts w:ascii="Times New Roman" w:eastAsia="標楷體" w:hAnsi="Times New Roman" w:cs="Times New Roman"/>
+              </w:rPr>
+            </w:pPr>
+            <w:r>
+              <w:rPr>
+                <w:rFonts w:ascii="Times New Roman" w:eastAsia="標楷體" w:hAnsi="Times New Roman" w:cs="Times New Roman" w:hint="eastAsia"/>
+              </w:rPr>
+              <w:t>Technology and Data Variations List</w:t>
+            </w:r>
+          </w:p>
+        </w:tc>
+        <w:tc>
+          <w:tcPr>
+            <w:tcW w:w="4148" w:type="dxa"/>
+          </w:tcPr>
+          <w:p>
+            <w:pPr>
+              <w:rPr>
+                <w:rFonts w:ascii="Times New Roman" w:eastAsia="標楷體" w:hAnsi="Times New Roman" w:cs="Times New Roman"/>
+              </w:rPr>
+            </w:pPr>
+            <w:r>
+              <w:rPr>
+                <w:rFonts w:ascii="Times New Roman" w:eastAsia="標楷體" w:hAnsi="Times New Roman" w:cs="Times New Roman" w:hint="eastAsia"/>
+              </w:rPr>
+              <w:t>支援「關注特定賣家」功能，當該賣家有新書上架時，買家會收到通知（未來擴充項目）。</w:t>
+            </w:r>
+          </w:p>
+        </w:tc>
+      </w:tr>
+      <w:tr>
+        <w:tc>
+          <w:tcPr>
+            <w:tcW w:w="4148" w:type="dxa"/>
+          </w:tcPr>
+          <w:p>
+            <w:pPr>
+              <w:rPr>
+                <w:rFonts w:ascii="Times New Roman" w:eastAsia="標楷體" w:hAnsi="Times New Roman" w:cs="Times New Roman"/>
+              </w:rPr>
+            </w:pPr>
+            <w:r>
+              <w:rPr>
+                <w:rFonts w:ascii="Times New Roman" w:eastAsia="標楷體" w:hAnsi="Times New Roman" w:cs="Times New Roman" w:hint="eastAsia"/>
+              </w:rPr>
+              <w:t>Frequency of Occurrence</w:t>
+            </w:r>
+          </w:p>
+        </w:tc>
+        <w:tc>
+          <w:tcPr>
+            <w:tcW w:w="4148" w:type="dxa"/>
+          </w:tcPr>
+          <w:p>
+            <w:pPr>
+              <w:rPr>
+                <w:rFonts w:ascii="Times New Roman" w:eastAsia="標楷體" w:hAnsi="Times New Roman" w:cs="Times New Roman"/>
+              </w:rPr>
+            </w:pPr>
+            <w:r>
+              <w:rPr>
+                <w:rFonts w:ascii="Times New Roman" w:eastAsia="標楷體" w:hAnsi="Times New Roman" w:cs="Times New Roman" w:hint="eastAsia"/>
+              </w:rPr>
+              <w:t>當買家瀏覽到感興趣但尚未決定立刻購買的書籍時（高頻率）。</w:t>
+            </w:r>
+          </w:p>
+        </w:tc>
+      </w:tr>
+      <w:tr>
+        <w:tc>
+          <w:tcPr>
+            <w:tcW w:w="4148" w:type="dxa"/>
+          </w:tcPr>
+          <w:p>
+            <w:pPr>
+              <w:rPr>
+                <w:rFonts w:ascii="Times New Roman" w:eastAsia="標楷體" w:hAnsi="Times New Roman" w:cs="Times New Roman"/>
+              </w:rPr>
+            </w:pPr>
+            <w:r>
+              <w:rPr>
+                <w:rFonts w:ascii="Times New Roman" w:eastAsia="標楷體" w:hAnsi="Times New Roman" w:cs="Times New Roman" w:hint="eastAsia"/>
+              </w:rPr>
+              <w:t>Miscellaneous</w:t>
+            </w:r>
+          </w:p>
+        </w:tc>
+        <w:tc>
+          <w:tcPr>
+            <w:tcW w:w="4148" w:type="dxa"/>
+          </w:tcPr>
+          <w:p>
+            <w:pPr>
+              <w:rPr>
+                <w:rFonts w:ascii="Times New Roman" w:eastAsia="標楷體" w:hAnsi="Times New Roman" w:cs="Times New Roman"/>
+              </w:rPr>
+            </w:pPr>
+            <w:r>
+              <w:rPr>
+                <w:rFonts w:ascii="Times New Roman" w:eastAsia="標楷體" w:hAnsi="Times New Roman" w:cs="Times New Roman" w:hint="eastAsia"/>
+              </w:rPr>
+              <w:t>是否需要設置「清單上限數」，以防止資料庫負擔過重？</w:t>
+            </w:r>
+          </w:p>
+        </w:tc>
+      </w:tr>
+    </w:tbl>
     <w:p>
       <w:pPr>
         <w:rPr>
@@ -821,6 +4406,770 @@
         <w:t>Non-functional Requirements and Constraints</w:t>
       </w:r>
     </w:p>
+    <w:tbl>
+      <w:tblPr>
+        <w:tblStyle w:val="af2"/>
+        <w:tblW w:w="0" w:type="auto"/>
+        <w:tblLook w:val="04A0" w:firstRow="1" w:lastRow="0" w:firstColumn="1" w:lastColumn="0" w:noHBand="0" w:noVBand="1"/>
+      </w:tblPr>
+      <w:tblGrid>
+        <w:gridCol w:w="1129"/>
+        <w:gridCol w:w="1701"/>
+        <w:gridCol w:w="5466"/>
+      </w:tblGrid>
+      <w:tr>
+        <w:tc>
+          <w:tcPr>
+            <w:tcW w:w="1129" w:type="dxa"/>
+          </w:tcPr>
+          <w:p>
+            <w:pPr>
+              <w:rPr>
+                <w:rFonts w:ascii="Times New Roman" w:eastAsia="標楷體" w:hAnsi="Times New Roman" w:cs="Times New Roman"/>
+              </w:rPr>
+            </w:pPr>
+            <w:r>
+              <w:rPr>
+                <w:rFonts w:ascii="Times New Roman" w:eastAsia="標楷體" w:hAnsi="Times New Roman" w:cs="Times New Roman"/>
+              </w:rPr>
+              <w:t>NFR ID</w:t>
+            </w:r>
+          </w:p>
+        </w:tc>
+        <w:tc>
+          <w:tcPr>
+            <w:tcW w:w="1701" w:type="dxa"/>
+          </w:tcPr>
+          <w:p>
+            <w:pPr>
+              <w:rPr>
+                <w:rFonts w:ascii="Times New Roman" w:eastAsia="標楷體" w:hAnsi="Times New Roman" w:cs="Times New Roman"/>
+              </w:rPr>
+            </w:pPr>
+            <w:r>
+              <w:rPr>
+                <w:rFonts w:ascii="Times New Roman" w:eastAsia="標楷體" w:hAnsi="Times New Roman" w:cs="Times New Roman"/>
+              </w:rPr>
+              <w:t>Category</w:t>
+            </w:r>
+          </w:p>
+        </w:tc>
+        <w:tc>
+          <w:tcPr>
+            <w:tcW w:w="5466" w:type="dxa"/>
+          </w:tcPr>
+          <w:p>
+            <w:pPr>
+              <w:rPr>
+                <w:rFonts w:ascii="Times New Roman" w:eastAsia="標楷體" w:hAnsi="Times New Roman" w:cs="Times New Roman"/>
+              </w:rPr>
+            </w:pPr>
+            <w:r>
+              <w:rPr>
+                <w:rFonts w:ascii="Times New Roman" w:eastAsia="標楷體" w:hAnsi="Times New Roman" w:cs="Times New Roman"/>
+              </w:rPr>
+              <w:t>Description</w:t>
+            </w:r>
+          </w:p>
+        </w:tc>
+      </w:tr>
+      <w:tr>
+        <w:tc>
+          <w:tcPr>
+            <w:tcW w:w="1129" w:type="dxa"/>
+          </w:tcPr>
+          <w:p>
+            <w:pPr>
+              <w:rPr>
+                <w:rFonts w:ascii="Times New Roman" w:eastAsia="標楷體" w:hAnsi="Times New Roman" w:cs="Times New Roman"/>
+              </w:rPr>
+            </w:pPr>
+            <w:r>
+              <w:rPr>
+                <w:rFonts w:ascii="Times New Roman" w:eastAsia="標楷體" w:hAnsi="Times New Roman" w:cs="Times New Roman"/>
+              </w:rPr>
+              <w:t>NFR-1</w:t>
+            </w:r>
+          </w:p>
+        </w:tc>
+        <w:tc>
+          <w:tcPr>
+            <w:tcW w:w="1701" w:type="dxa"/>
+          </w:tcPr>
+          <w:p>
+            <w:pPr>
+              <w:rPr>
+                <w:rFonts w:ascii="Times New Roman" w:eastAsia="標楷體" w:hAnsi="Times New Roman" w:cs="Times New Roman"/>
+              </w:rPr>
+            </w:pPr>
+            <w:r>
+              <w:rPr>
+                <w:rFonts w:ascii="Times New Roman" w:eastAsia="標楷體" w:hAnsi="Times New Roman" w:cs="Times New Roman"/>
+              </w:rPr>
+              <w:t>Performance</w:t>
+            </w:r>
+          </w:p>
+        </w:tc>
+        <w:tc>
+          <w:tcPr>
+            <w:tcW w:w="5466" w:type="dxa"/>
+          </w:tcPr>
+          <w:p>
+            <w:pPr>
+              <w:rPr>
+                <w:rFonts w:ascii="Times New Roman" w:eastAsia="標楷體" w:hAnsi="Times New Roman" w:cs="Times New Roman"/>
+              </w:rPr>
+            </w:pPr>
+            <w:r>
+              <w:rPr>
+                <w:rFonts w:ascii="Times New Roman" w:eastAsia="標楷體" w:hAnsi="Times New Roman" w:cs="Times New Roman" w:hint="eastAsia"/>
+              </w:rPr>
+              <w:t>新增或更新書籍清單應在</w:t>
+            </w:r>
+            <w:r>
+              <w:rPr>
+                <w:rFonts w:ascii="Times New Roman" w:eastAsia="標楷體" w:hAnsi="Times New Roman" w:cs="Times New Roman" w:hint="eastAsia"/>
+              </w:rPr>
+              <w:t xml:space="preserve"> 2 </w:t>
+            </w:r>
+            <w:r>
+              <w:rPr>
+                <w:rFonts w:ascii="Times New Roman" w:eastAsia="標楷體" w:hAnsi="Times New Roman" w:cs="Times New Roman" w:hint="eastAsia"/>
+              </w:rPr>
+              <w:t>秒內完成。</w:t>
+            </w:r>
+          </w:p>
+        </w:tc>
+      </w:tr>
+      <w:tr>
+        <w:tc>
+          <w:tcPr>
+            <w:tcW w:w="1129" w:type="dxa"/>
+          </w:tcPr>
+          <w:p>
+            <w:pPr>
+              <w:rPr>
+                <w:rFonts w:ascii="Times New Roman" w:eastAsia="標楷體" w:hAnsi="Times New Roman" w:cs="Times New Roman" w:hint="eastAsia"/>
+              </w:rPr>
+            </w:pPr>
+            <w:r>
+              <w:rPr>
+                <w:rFonts w:ascii="Times New Roman" w:eastAsia="標楷體" w:hAnsi="Times New Roman" w:cs="Times New Roman"/>
+              </w:rPr>
+              <w:t>NFR-</w:t>
+            </w:r>
+            <w:r>
+              <w:rPr>
+                <w:rFonts w:ascii="Times New Roman" w:eastAsia="標楷體" w:hAnsi="Times New Roman" w:cs="Times New Roman" w:hint="eastAsia"/>
+              </w:rPr>
+              <w:t>2</w:t>
+            </w:r>
+          </w:p>
+        </w:tc>
+        <w:tc>
+          <w:tcPr>
+            <w:tcW w:w="1701" w:type="dxa"/>
+          </w:tcPr>
+          <w:p>
+            <w:pPr>
+              <w:rPr>
+                <w:rFonts w:ascii="Times New Roman" w:eastAsia="標楷體" w:hAnsi="Times New Roman" w:cs="Times New Roman"/>
+              </w:rPr>
+            </w:pPr>
+            <w:r>
+              <w:rPr>
+                <w:rFonts w:ascii="Times New Roman" w:eastAsia="標楷體" w:hAnsi="Times New Roman" w:cs="Times New Roman"/>
+              </w:rPr>
+              <w:t>Performance</w:t>
+            </w:r>
+          </w:p>
+        </w:tc>
+        <w:tc>
+          <w:tcPr>
+            <w:tcW w:w="5466" w:type="dxa"/>
+          </w:tcPr>
+          <w:p>
+            <w:pPr>
+              <w:rPr>
+                <w:rFonts w:ascii="Times New Roman" w:eastAsia="標楷體" w:hAnsi="Times New Roman" w:cs="Times New Roman"/>
+              </w:rPr>
+            </w:pPr>
+            <w:r>
+              <w:rPr>
+                <w:rFonts w:ascii="Times New Roman" w:eastAsia="標楷體" w:hAnsi="Times New Roman" w:cs="Times New Roman" w:hint="eastAsia"/>
+              </w:rPr>
+              <w:t>搜尋書籍的查詢結果應在</w:t>
+            </w:r>
+            <w:r>
+              <w:rPr>
+                <w:rFonts w:ascii="Times New Roman" w:eastAsia="標楷體" w:hAnsi="Times New Roman" w:cs="Times New Roman" w:hint="eastAsia"/>
+              </w:rPr>
+              <w:t xml:space="preserve"> 2 </w:t>
+            </w:r>
+            <w:r>
+              <w:rPr>
+                <w:rFonts w:ascii="Times New Roman" w:eastAsia="標楷體" w:hAnsi="Times New Roman" w:cs="Times New Roman" w:hint="eastAsia"/>
+              </w:rPr>
+              <w:t>秒內顯示。</w:t>
+            </w:r>
+          </w:p>
+        </w:tc>
+      </w:tr>
+      <w:tr>
+        <w:tc>
+          <w:tcPr>
+            <w:tcW w:w="1129" w:type="dxa"/>
+          </w:tcPr>
+          <w:p>
+            <w:pPr>
+              <w:rPr>
+                <w:rFonts w:ascii="Times New Roman" w:eastAsia="標楷體" w:hAnsi="Times New Roman" w:cs="Times New Roman" w:hint="eastAsia"/>
+              </w:rPr>
+            </w:pPr>
+            <w:r>
+              <w:rPr>
+                <w:rFonts w:ascii="Times New Roman" w:eastAsia="標楷體" w:hAnsi="Times New Roman" w:cs="Times New Roman"/>
+              </w:rPr>
+              <w:t>NFR-</w:t>
+            </w:r>
+            <w:r>
+              <w:rPr>
+                <w:rFonts w:ascii="Times New Roman" w:eastAsia="標楷體" w:hAnsi="Times New Roman" w:cs="Times New Roman" w:hint="eastAsia"/>
+              </w:rPr>
+              <w:t>3</w:t>
+            </w:r>
+          </w:p>
+        </w:tc>
+        <w:tc>
+          <w:tcPr>
+            <w:tcW w:w="1701" w:type="dxa"/>
+          </w:tcPr>
+          <w:p>
+            <w:pPr>
+              <w:rPr>
+                <w:rFonts w:ascii="Times New Roman" w:eastAsia="標楷體" w:hAnsi="Times New Roman" w:cs="Times New Roman"/>
+              </w:rPr>
+            </w:pPr>
+            <w:r>
+              <w:rPr>
+                <w:rFonts w:ascii="Times New Roman" w:eastAsia="標楷體" w:hAnsi="Times New Roman" w:cs="Times New Roman"/>
+              </w:rPr>
+              <w:t>Performance</w:t>
+            </w:r>
+          </w:p>
+        </w:tc>
+        <w:tc>
+          <w:tcPr>
+            <w:tcW w:w="5466" w:type="dxa"/>
+          </w:tcPr>
+          <w:p>
+            <w:pPr>
+              <w:rPr>
+                <w:rFonts w:ascii="Times New Roman" w:eastAsia="標楷體" w:hAnsi="Times New Roman" w:cs="Times New Roman"/>
+              </w:rPr>
+            </w:pPr>
+            <w:r>
+              <w:rPr>
+                <w:rFonts w:ascii="Times New Roman" w:eastAsia="標楷體" w:hAnsi="Times New Roman" w:cs="Times New Roman" w:hint="eastAsia"/>
+              </w:rPr>
+              <w:t>私訊傳遞的延遲時間應小於</w:t>
+            </w:r>
+            <w:r>
+              <w:rPr>
+                <w:rFonts w:ascii="Times New Roman" w:eastAsia="標楷體" w:hAnsi="Times New Roman" w:cs="Times New Roman" w:hint="eastAsia"/>
+              </w:rPr>
+              <w:t xml:space="preserve"> 1 </w:t>
+            </w:r>
+            <w:r>
+              <w:rPr>
+                <w:rFonts w:ascii="Times New Roman" w:eastAsia="標楷體" w:hAnsi="Times New Roman" w:cs="Times New Roman" w:hint="eastAsia"/>
+              </w:rPr>
+              <w:t>秒。</w:t>
+            </w:r>
+          </w:p>
+        </w:tc>
+      </w:tr>
+      <w:tr>
+        <w:tc>
+          <w:tcPr>
+            <w:tcW w:w="1129" w:type="dxa"/>
+          </w:tcPr>
+          <w:p>
+            <w:pPr>
+              <w:rPr>
+                <w:rFonts w:ascii="Times New Roman" w:eastAsia="標楷體" w:hAnsi="Times New Roman" w:cs="Times New Roman" w:hint="eastAsia"/>
+              </w:rPr>
+            </w:pPr>
+            <w:r>
+              <w:rPr>
+                <w:rFonts w:ascii="Times New Roman" w:eastAsia="標楷體" w:hAnsi="Times New Roman" w:cs="Times New Roman"/>
+              </w:rPr>
+              <w:t>NFR-</w:t>
+            </w:r>
+            <w:r>
+              <w:rPr>
+                <w:rFonts w:ascii="Times New Roman" w:eastAsia="標楷體" w:hAnsi="Times New Roman" w:cs="Times New Roman" w:hint="eastAsia"/>
+              </w:rPr>
+              <w:t>4</w:t>
+            </w:r>
+          </w:p>
+        </w:tc>
+        <w:tc>
+          <w:tcPr>
+            <w:tcW w:w="1701" w:type="dxa"/>
+          </w:tcPr>
+          <w:p>
+            <w:pPr>
+              <w:rPr>
+                <w:rFonts w:ascii="Times New Roman" w:eastAsia="標楷體" w:hAnsi="Times New Roman" w:cs="Times New Roman"/>
+              </w:rPr>
+            </w:pPr>
+            <w:r>
+              <w:rPr>
+                <w:rFonts w:ascii="Times New Roman" w:eastAsia="標楷體" w:hAnsi="Times New Roman" w:cs="Times New Roman"/>
+              </w:rPr>
+              <w:t>Reliability</w:t>
+            </w:r>
+          </w:p>
+        </w:tc>
+        <w:tc>
+          <w:tcPr>
+            <w:tcW w:w="5466" w:type="dxa"/>
+          </w:tcPr>
+          <w:p>
+            <w:pPr>
+              <w:rPr>
+                <w:rFonts w:ascii="Times New Roman" w:eastAsia="標楷體" w:hAnsi="Times New Roman" w:cs="Times New Roman"/>
+              </w:rPr>
+            </w:pPr>
+            <w:r>
+              <w:rPr>
+                <w:rFonts w:ascii="Times New Roman" w:eastAsia="標楷體" w:hAnsi="Times New Roman" w:cs="Times New Roman" w:hint="eastAsia"/>
+              </w:rPr>
+              <w:t>系統需支援高達</w:t>
+            </w:r>
+            <w:r>
+              <w:rPr>
+                <w:rFonts w:ascii="Times New Roman" w:eastAsia="標楷體" w:hAnsi="Times New Roman" w:cs="Times New Roman" w:hint="eastAsia"/>
+              </w:rPr>
+              <w:t xml:space="preserve"> 100 </w:t>
+            </w:r>
+            <w:r>
+              <w:rPr>
+                <w:rFonts w:ascii="Times New Roman" w:eastAsia="標楷體" w:hAnsi="Times New Roman" w:cs="Times New Roman" w:hint="eastAsia"/>
+              </w:rPr>
+              <w:t>名使用者同時在線（</w:t>
+            </w:r>
+            <w:r>
+              <w:rPr>
+                <w:rFonts w:ascii="Times New Roman" w:eastAsia="標楷體" w:hAnsi="Times New Roman" w:cs="Times New Roman" w:hint="eastAsia"/>
+              </w:rPr>
+              <w:t>Concurrent users</w:t>
+            </w:r>
+            <w:r>
+              <w:rPr>
+                <w:rFonts w:ascii="Times New Roman" w:eastAsia="標楷體" w:hAnsi="Times New Roman" w:cs="Times New Roman" w:hint="eastAsia"/>
+              </w:rPr>
+              <w:t>），且效能不得降低。</w:t>
+            </w:r>
+          </w:p>
+        </w:tc>
+      </w:tr>
+      <w:tr>
+        <w:tc>
+          <w:tcPr>
+            <w:tcW w:w="1129" w:type="dxa"/>
+          </w:tcPr>
+          <w:p>
+            <w:pPr>
+              <w:rPr>
+                <w:rFonts w:ascii="Times New Roman" w:eastAsia="標楷體" w:hAnsi="Times New Roman" w:cs="Times New Roman" w:hint="eastAsia"/>
+              </w:rPr>
+            </w:pPr>
+            <w:r>
+              <w:rPr>
+                <w:rFonts w:ascii="Times New Roman" w:eastAsia="標楷體" w:hAnsi="Times New Roman" w:cs="Times New Roman"/>
+              </w:rPr>
+              <w:t>NFR-</w:t>
+            </w:r>
+            <w:r>
+              <w:rPr>
+                <w:rFonts w:ascii="Times New Roman" w:eastAsia="標楷體" w:hAnsi="Times New Roman" w:cs="Times New Roman" w:hint="eastAsia"/>
+              </w:rPr>
+              <w:t>5</w:t>
+            </w:r>
+          </w:p>
+        </w:tc>
+        <w:tc>
+          <w:tcPr>
+            <w:tcW w:w="1701" w:type="dxa"/>
+          </w:tcPr>
+          <w:p>
+            <w:pPr>
+              <w:rPr>
+                <w:rFonts w:ascii="Times New Roman" w:eastAsia="標楷體" w:hAnsi="Times New Roman" w:cs="Times New Roman"/>
+              </w:rPr>
+            </w:pPr>
+            <w:r>
+              <w:rPr>
+                <w:rFonts w:ascii="Times New Roman" w:eastAsia="標楷體" w:hAnsi="Times New Roman" w:cs="Times New Roman"/>
+              </w:rPr>
+              <w:t>Availability</w:t>
+            </w:r>
+          </w:p>
+        </w:tc>
+        <w:tc>
+          <w:tcPr>
+            <w:tcW w:w="5466" w:type="dxa"/>
+          </w:tcPr>
+          <w:p>
+            <w:pPr>
+              <w:rPr>
+                <w:rFonts w:ascii="Times New Roman" w:eastAsia="標楷體" w:hAnsi="Times New Roman" w:cs="Times New Roman"/>
+              </w:rPr>
+            </w:pPr>
+            <w:r>
+              <w:rPr>
+                <w:rFonts w:ascii="Times New Roman" w:eastAsia="標楷體" w:hAnsi="Times New Roman" w:cs="Times New Roman" w:hint="eastAsia"/>
+              </w:rPr>
+              <w:t>系統的正常運行時間（</w:t>
+            </w:r>
+            <w:r>
+              <w:rPr>
+                <w:rFonts w:ascii="Times New Roman" w:eastAsia="標楷體" w:hAnsi="Times New Roman" w:cs="Times New Roman" w:hint="eastAsia"/>
+              </w:rPr>
+              <w:t>Uptime</w:t>
+            </w:r>
+            <w:r>
+              <w:rPr>
+                <w:rFonts w:ascii="Times New Roman" w:eastAsia="標楷體" w:hAnsi="Times New Roman" w:cs="Times New Roman" w:hint="eastAsia"/>
+              </w:rPr>
+              <w:t>）應至少達到</w:t>
+            </w:r>
+            <w:r>
+              <w:rPr>
+                <w:rFonts w:ascii="Times New Roman" w:eastAsia="標楷體" w:hAnsi="Times New Roman" w:cs="Times New Roman" w:hint="eastAsia"/>
+              </w:rPr>
+              <w:t xml:space="preserve"> 99.9%</w:t>
+            </w:r>
+            <w:r>
+              <w:rPr>
+                <w:rFonts w:ascii="Times New Roman" w:eastAsia="標楷體" w:hAnsi="Times New Roman" w:cs="Times New Roman" w:hint="eastAsia"/>
+              </w:rPr>
+              <w:t>，以確保在開學等尖峰時段能穩定存取。</w:t>
+            </w:r>
+          </w:p>
+        </w:tc>
+      </w:tr>
+      <w:tr>
+        <w:tc>
+          <w:tcPr>
+            <w:tcW w:w="1129" w:type="dxa"/>
+          </w:tcPr>
+          <w:p>
+            <w:pPr>
+              <w:rPr>
+                <w:rFonts w:ascii="Times New Roman" w:eastAsia="標楷體" w:hAnsi="Times New Roman" w:cs="Times New Roman" w:hint="eastAsia"/>
+              </w:rPr>
+            </w:pPr>
+            <w:r>
+              <w:rPr>
+                <w:rFonts w:ascii="Times New Roman" w:eastAsia="標楷體" w:hAnsi="Times New Roman" w:cs="Times New Roman"/>
+              </w:rPr>
+              <w:t>NFR-</w:t>
+            </w:r>
+            <w:r>
+              <w:rPr>
+                <w:rFonts w:ascii="Times New Roman" w:eastAsia="標楷體" w:hAnsi="Times New Roman" w:cs="Times New Roman" w:hint="eastAsia"/>
+              </w:rPr>
+              <w:t>6</w:t>
+            </w:r>
+          </w:p>
+        </w:tc>
+        <w:tc>
+          <w:tcPr>
+            <w:tcW w:w="1701" w:type="dxa"/>
+          </w:tcPr>
+          <w:p>
+            <w:pPr>
+              <w:rPr>
+                <w:rFonts w:ascii="Times New Roman" w:eastAsia="標楷體" w:hAnsi="Times New Roman" w:cs="Times New Roman"/>
+              </w:rPr>
+            </w:pPr>
+            <w:r>
+              <w:rPr>
+                <w:rFonts w:ascii="Times New Roman" w:eastAsia="標楷體" w:hAnsi="Times New Roman" w:cs="Times New Roman"/>
+              </w:rPr>
+              <w:t>Security</w:t>
+            </w:r>
+          </w:p>
+        </w:tc>
+        <w:tc>
+          <w:tcPr>
+            <w:tcW w:w="5466" w:type="dxa"/>
+          </w:tcPr>
+          <w:p>
+            <w:pPr>
+              <w:rPr>
+                <w:rFonts w:ascii="Times New Roman" w:eastAsia="標楷體" w:hAnsi="Times New Roman" w:cs="Times New Roman"/>
+              </w:rPr>
+            </w:pPr>
+            <w:r>
+              <w:rPr>
+                <w:rFonts w:ascii="Times New Roman" w:eastAsia="標楷體" w:hAnsi="Times New Roman" w:cs="Times New Roman" w:hint="eastAsia"/>
+              </w:rPr>
+              <w:t>敏感的使用者個資與私訊對話內容，必須經過安全加密處理。</w:t>
+            </w:r>
+          </w:p>
+        </w:tc>
+      </w:tr>
+      <w:tr>
+        <w:tc>
+          <w:tcPr>
+            <w:tcW w:w="1129" w:type="dxa"/>
+          </w:tcPr>
+          <w:p>
+            <w:pPr>
+              <w:rPr>
+                <w:rFonts w:ascii="Times New Roman" w:eastAsia="標楷體" w:hAnsi="Times New Roman" w:cs="Times New Roman" w:hint="eastAsia"/>
+              </w:rPr>
+            </w:pPr>
+            <w:r>
+              <w:rPr>
+                <w:rFonts w:ascii="Times New Roman" w:eastAsia="標楷體" w:hAnsi="Times New Roman" w:cs="Times New Roman"/>
+              </w:rPr>
+              <w:t>NFR-</w:t>
+            </w:r>
+            <w:r>
+              <w:rPr>
+                <w:rFonts w:ascii="Times New Roman" w:eastAsia="標楷體" w:hAnsi="Times New Roman" w:cs="Times New Roman" w:hint="eastAsia"/>
+              </w:rPr>
+              <w:t>7</w:t>
+            </w:r>
+          </w:p>
+        </w:tc>
+        <w:tc>
+          <w:tcPr>
+            <w:tcW w:w="1701" w:type="dxa"/>
+          </w:tcPr>
+          <w:p>
+            <w:pPr>
+              <w:rPr>
+                <w:rFonts w:ascii="Times New Roman" w:eastAsia="標楷體" w:hAnsi="Times New Roman" w:cs="Times New Roman"/>
+              </w:rPr>
+            </w:pPr>
+            <w:r>
+              <w:rPr>
+                <w:rFonts w:ascii="Times New Roman" w:eastAsia="標楷體" w:hAnsi="Times New Roman" w:cs="Times New Roman"/>
+              </w:rPr>
+              <w:t>Security</w:t>
+            </w:r>
+          </w:p>
+        </w:tc>
+        <w:tc>
+          <w:tcPr>
+            <w:tcW w:w="5466" w:type="dxa"/>
+          </w:tcPr>
+          <w:p>
+            <w:pPr>
+              <w:rPr>
+                <w:rFonts w:ascii="Times New Roman" w:eastAsia="標楷體" w:hAnsi="Times New Roman" w:cs="Times New Roman"/>
+              </w:rPr>
+            </w:pPr>
+            <w:r>
+              <w:rPr>
+                <w:rFonts w:ascii="Times New Roman" w:eastAsia="標楷體" w:hAnsi="Times New Roman" w:cs="Times New Roman" w:hint="eastAsia"/>
+              </w:rPr>
+              <w:t>系統必須要求使用有效的學校電子郵件信箱（例如</w:t>
+            </w:r>
+            <w:r>
+              <w:rPr>
+                <w:rFonts w:ascii="Times New Roman" w:eastAsia="標楷體" w:hAnsi="Times New Roman" w:cs="Times New Roman" w:hint="eastAsia"/>
+              </w:rPr>
+              <w:t xml:space="preserve"> .edu </w:t>
+            </w:r>
+            <w:r>
+              <w:rPr>
+                <w:rFonts w:ascii="Times New Roman" w:eastAsia="標楷體" w:hAnsi="Times New Roman" w:cs="Times New Roman" w:hint="eastAsia"/>
+              </w:rPr>
+              <w:t>網域）進行身分驗證註冊。</w:t>
+            </w:r>
+          </w:p>
+        </w:tc>
+      </w:tr>
+      <w:tr>
+        <w:tc>
+          <w:tcPr>
+            <w:tcW w:w="1129" w:type="dxa"/>
+          </w:tcPr>
+          <w:p>
+            <w:pPr>
+              <w:rPr>
+                <w:rFonts w:ascii="Times New Roman" w:eastAsia="標楷體" w:hAnsi="Times New Roman" w:cs="Times New Roman" w:hint="eastAsia"/>
+              </w:rPr>
+            </w:pPr>
+            <w:r>
+              <w:rPr>
+                <w:rFonts w:ascii="Times New Roman" w:eastAsia="標楷體" w:hAnsi="Times New Roman" w:cs="Times New Roman"/>
+              </w:rPr>
+              <w:t>NFR-</w:t>
+            </w:r>
+            <w:r>
+              <w:rPr>
+                <w:rFonts w:ascii="Times New Roman" w:eastAsia="標楷體" w:hAnsi="Times New Roman" w:cs="Times New Roman" w:hint="eastAsia"/>
+              </w:rPr>
+              <w:t>8</w:t>
+            </w:r>
+          </w:p>
+        </w:tc>
+        <w:tc>
+          <w:tcPr>
+            <w:tcW w:w="1701" w:type="dxa"/>
+          </w:tcPr>
+          <w:p>
+            <w:pPr>
+              <w:rPr>
+                <w:rFonts w:ascii="Times New Roman" w:eastAsia="標楷體" w:hAnsi="Times New Roman" w:cs="Times New Roman"/>
+              </w:rPr>
+            </w:pPr>
+            <w:r>
+              <w:rPr>
+                <w:rFonts w:ascii="Times New Roman" w:eastAsia="標楷體" w:hAnsi="Times New Roman" w:cs="Times New Roman"/>
+              </w:rPr>
+              <w:t>Compatibility</w:t>
+            </w:r>
+          </w:p>
+        </w:tc>
+        <w:tc>
+          <w:tcPr>
+            <w:tcW w:w="5466" w:type="dxa"/>
+          </w:tcPr>
+          <w:p>
+            <w:pPr>
+              <w:rPr>
+                <w:rFonts w:ascii="Times New Roman" w:eastAsia="標楷體" w:hAnsi="Times New Roman" w:cs="Times New Roman"/>
+              </w:rPr>
+            </w:pPr>
+            <w:r>
+              <w:rPr>
+                <w:rFonts w:ascii="Times New Roman" w:eastAsia="標楷體" w:hAnsi="Times New Roman" w:cs="Times New Roman" w:hint="eastAsia"/>
+              </w:rPr>
+              <w:t>系統介面需支援響應式設計（</w:t>
+            </w:r>
+            <w:r>
+              <w:rPr>
+                <w:rFonts w:ascii="Times New Roman" w:eastAsia="標楷體" w:hAnsi="Times New Roman" w:cs="Times New Roman" w:hint="eastAsia"/>
+              </w:rPr>
+              <w:t>Responsive Design</w:t>
+            </w:r>
+            <w:r>
+              <w:rPr>
+                <w:rFonts w:ascii="Times New Roman" w:eastAsia="標楷體" w:hAnsi="Times New Roman" w:cs="Times New Roman" w:hint="eastAsia"/>
+              </w:rPr>
+              <w:t>），以相容桌上型電腦、平板電腦和智慧型手機等多種裝置。</w:t>
+            </w:r>
+          </w:p>
+        </w:tc>
+      </w:tr>
+      <w:tr>
+        <w:tc>
+          <w:tcPr>
+            <w:tcW w:w="1129" w:type="dxa"/>
+          </w:tcPr>
+          <w:p>
+            <w:pPr>
+              <w:rPr>
+                <w:rFonts w:ascii="Times New Roman" w:eastAsia="標楷體" w:hAnsi="Times New Roman" w:cs="Times New Roman" w:hint="eastAsia"/>
+              </w:rPr>
+            </w:pPr>
+            <w:r>
+              <w:rPr>
+                <w:rFonts w:ascii="Times New Roman" w:eastAsia="標楷體" w:hAnsi="Times New Roman" w:cs="Times New Roman"/>
+              </w:rPr>
+              <w:t>NFR-</w:t>
+            </w:r>
+            <w:r>
+              <w:rPr>
+                <w:rFonts w:ascii="Times New Roman" w:eastAsia="標楷體" w:hAnsi="Times New Roman" w:cs="Times New Roman" w:hint="eastAsia"/>
+              </w:rPr>
+              <w:t>9</w:t>
+            </w:r>
+          </w:p>
+        </w:tc>
+        <w:tc>
+          <w:tcPr>
+            <w:tcW w:w="1701" w:type="dxa"/>
+          </w:tcPr>
+          <w:p>
+            <w:pPr>
+              <w:rPr>
+                <w:rFonts w:ascii="Times New Roman" w:eastAsia="標楷體" w:hAnsi="Times New Roman" w:cs="Times New Roman"/>
+              </w:rPr>
+            </w:pPr>
+            <w:r>
+              <w:rPr>
+                <w:rFonts w:ascii="Times New Roman" w:eastAsia="標楷體" w:hAnsi="Times New Roman" w:cs="Times New Roman"/>
+              </w:rPr>
+              <w:t>Testability</w:t>
+            </w:r>
+          </w:p>
+        </w:tc>
+        <w:tc>
+          <w:tcPr>
+            <w:tcW w:w="5466" w:type="dxa"/>
+          </w:tcPr>
+          <w:p>
+            <w:pPr>
+              <w:rPr>
+                <w:rFonts w:ascii="Times New Roman" w:eastAsia="標楷體" w:hAnsi="Times New Roman" w:cs="Times New Roman"/>
+              </w:rPr>
+            </w:pPr>
+            <w:r>
+              <w:rPr>
+                <w:rFonts w:ascii="Times New Roman" w:eastAsia="標楷體" w:hAnsi="Times New Roman" w:cs="Times New Roman" w:hint="eastAsia"/>
+              </w:rPr>
+              <w:t>後端</w:t>
+            </w:r>
+            <w:r>
+              <w:rPr>
+                <w:rFonts w:ascii="Times New Roman" w:eastAsia="標楷體" w:hAnsi="Times New Roman" w:cs="Times New Roman" w:hint="eastAsia"/>
+              </w:rPr>
+              <w:t xml:space="preserve"> Java </w:t>
+            </w:r>
+            <w:r>
+              <w:rPr>
+                <w:rFonts w:ascii="Times New Roman" w:eastAsia="標楷體" w:hAnsi="Times New Roman" w:cs="Times New Roman" w:hint="eastAsia"/>
+              </w:rPr>
+              <w:t>程式碼的測試覆蓋率（</w:t>
+            </w:r>
+            <w:r>
+              <w:rPr>
+                <w:rFonts w:ascii="Times New Roman" w:eastAsia="標楷體" w:hAnsi="Times New Roman" w:cs="Times New Roman" w:hint="eastAsia"/>
+              </w:rPr>
+              <w:t>Code coverage</w:t>
+            </w:r>
+            <w:r>
+              <w:rPr>
+                <w:rFonts w:ascii="Times New Roman" w:eastAsia="標楷體" w:hAnsi="Times New Roman" w:cs="Times New Roman" w:hint="eastAsia"/>
+              </w:rPr>
+              <w:t>）應至少達到</w:t>
+            </w:r>
+            <w:r>
+              <w:rPr>
+                <w:rFonts w:ascii="Times New Roman" w:eastAsia="標楷體" w:hAnsi="Times New Roman" w:cs="Times New Roman" w:hint="eastAsia"/>
+              </w:rPr>
+              <w:t xml:space="preserve"> 85%</w:t>
+            </w:r>
+            <w:r>
+              <w:rPr>
+                <w:rFonts w:ascii="Times New Roman" w:eastAsia="標楷體" w:hAnsi="Times New Roman" w:cs="Times New Roman" w:hint="eastAsia"/>
+              </w:rPr>
+              <w:t>。</w:t>
+            </w:r>
+          </w:p>
+        </w:tc>
+      </w:tr>
+    </w:tbl>
     <w:p>
       <w:pPr>
         <w:rPr>
@@ -1054,6 +5403,95 @@
 <file path=word/numbering.xml><?xml version="1.0" encoding="utf-8"?>
 <w:numbering xmlns:wpc="http://schemas.microsoft.com/office/word/2010/wordprocessingCanvas" xmlns:cx="http://schemas.microsoft.com/office/drawing/2014/chartex" xmlns:cx1="http://schemas.microsoft.com/office/drawing/2015/9/8/chartex" xmlns:cx2="http://schemas.microsoft.com/office/drawing/2015/10/21/chartex" xmlns:cx3="http://schemas.microsoft.com/office/drawing/2016/5/9/chartex" xmlns:cx4="http://schemas.microsoft.com/office/drawing/2016/5/10/chartex" xmlns:cx5="http://schemas.microsoft.com/office/drawing/2016/5/11/chartex" xmlns:cx6="http://schemas.microsoft.com/office/drawing/2016/5/12/chartex" xmlns:cx7="http://schemas.microsoft.com/office/drawing/2016/5/13/chartex" xmlns:cx8="http://schemas.microsoft.com/office/drawing/2016/5/14/chartex" xmlns:mc="http://schemas.openxmlformats.org/markup-compatibility/2006" xmlns:aink="http://schemas.microsoft.com/office/drawing/2016/ink" xmlns:am3d="http://schemas.microsoft.com/office/drawing/2017/model3d" xmlns:o="urn:schemas-microsoft-com:office:office" xmlns:oel="http://schemas.microsoft.com/office/2019/extlst" xmlns:r="http://schemas.openxmlformats.org/officeDocument/2006/relationships" xmlns:m="http://schemas.openxmlformats.org/officeDocument/2006/math" xmlns:v="urn:schemas-microsoft-com:vml" xmlns:wp14="http://schemas.microsoft.com/office/word/2010/wordprocessingDrawing" xmlns:wp="http://schemas.openxmlformats.org/drawingml/2006/wordprocessingDrawing" xmlns:w10="urn:schemas-microsoft-com:office:word" xmlns:w="http://schemas.openxmlformats.org/wordprocessingml/2006/main" xmlns:w14="http://schemas.microsoft.com/office/word/2010/wordml" xmlns:w15="http://schemas.microsoft.com/office/word/2012/wordml" xmlns:w16cex="http://schemas.microsoft.com/office/word/2018/wordml/cex" xmlns:w16cid="http://schemas.microsoft.com/office/word/2016/wordml/cid" xmlns:w16="http://schemas.microsoft.com/office/word/2018/wordml" xmlns:w16sdtdh="http://schemas.microsoft.com/office/word/2020/wordml/sdtdatahash" xmlns:w16se="http://schemas.microsoft.com/office/word/2015/wordml/symex" xmlns:wpg="http://schemas.microsoft.com/office/word/2010/wordprocessingGroup" xmlns:wpi="http://schemas.microsoft.com/office/word/2010/wordprocessingInk" xmlns:wne="http://schemas.microsoft.com/office/word/2006/wordml" xmlns:wps="http://schemas.microsoft.com/office/word/2010/wordprocessingShape" mc:Ignorable="w14 w15 w16se w16cid w16 w16cex w16sdtdh wp14">
   <w:abstractNum w:abstractNumId="0" w15:restartNumberingAfterBreak="0">
+    <w:nsid w:val="1F397696"/>
+    <w:multiLevelType w:val="hybridMultilevel"/>
+    <w:tmpl w:val="24763604"/>
+    <w:lvl w:ilvl="0" w:tplc="4C665A28">
+      <w:start w:val="1"/>
+      <w:numFmt w:val="decimal"/>
+      <w:lvlText w:val="%1."/>
+      <w:lvlJc w:val="left"/>
+      <w:pPr>
+        <w:ind w:left="360" w:hanging="360"/>
+      </w:pPr>
+      <w:rPr>
+        <w:rFonts w:hint="default"/>
+      </w:rPr>
+    </w:lvl>
+    <w:lvl w:ilvl="1" w:tplc="04090019" w:tentative="1">
+      <w:start w:val="1"/>
+      <w:numFmt w:val="ideographTraditional"/>
+      <w:lvlText w:val="%2、"/>
+      <w:lvlJc w:val="left"/>
+      <w:pPr>
+        <w:ind w:left="960" w:hanging="480"/>
+      </w:pPr>
+    </w:lvl>
+    <w:lvl w:ilvl="2" w:tplc="0409001B" w:tentative="1">
+      <w:start w:val="1"/>
+      <w:numFmt w:val="lowerRoman"/>
+      <w:lvlText w:val="%3."/>
+      <w:lvlJc w:val="right"/>
+      <w:pPr>
+        <w:ind w:left="1440" w:hanging="480"/>
+      </w:pPr>
+    </w:lvl>
+    <w:lvl w:ilvl="3" w:tplc="0409000F" w:tentative="1">
+      <w:start w:val="1"/>
+      <w:numFmt w:val="decimal"/>
+      <w:lvlText w:val="%4."/>
+      <w:lvlJc w:val="left"/>
+      <w:pPr>
+        <w:ind w:left="1920" w:hanging="480"/>
+      </w:pPr>
+    </w:lvl>
+    <w:lvl w:ilvl="4" w:tplc="04090019" w:tentative="1">
+      <w:start w:val="1"/>
+      <w:numFmt w:val="ideographTraditional"/>
+      <w:lvlText w:val="%5、"/>
+      <w:lvlJc w:val="left"/>
+      <w:pPr>
+        <w:ind w:left="2400" w:hanging="480"/>
+      </w:pPr>
+    </w:lvl>
+    <w:lvl w:ilvl="5" w:tplc="0409001B" w:tentative="1">
+      <w:start w:val="1"/>
+      <w:numFmt w:val="lowerRoman"/>
+      <w:lvlText w:val="%6."/>
+      <w:lvlJc w:val="right"/>
+      <w:pPr>
+        <w:ind w:left="2880" w:hanging="480"/>
+      </w:pPr>
+    </w:lvl>
+    <w:lvl w:ilvl="6" w:tplc="0409000F" w:tentative="1">
+      <w:start w:val="1"/>
+      <w:numFmt w:val="decimal"/>
+      <w:lvlText w:val="%7."/>
+      <w:lvlJc w:val="left"/>
+      <w:pPr>
+        <w:ind w:left="3360" w:hanging="480"/>
+      </w:pPr>
+    </w:lvl>
+    <w:lvl w:ilvl="7" w:tplc="04090019" w:tentative="1">
+      <w:start w:val="1"/>
+      <w:numFmt w:val="ideographTraditional"/>
+      <w:lvlText w:val="%8、"/>
+      <w:lvlJc w:val="left"/>
+      <w:pPr>
+        <w:ind w:left="3840" w:hanging="480"/>
+      </w:pPr>
+    </w:lvl>
+    <w:lvl w:ilvl="8" w:tplc="0409001B" w:tentative="1">
+      <w:start w:val="1"/>
+      <w:numFmt w:val="lowerRoman"/>
+      <w:lvlText w:val="%9."/>
+      <w:lvlJc w:val="right"/>
+      <w:pPr>
+        <w:ind w:left="4320" w:hanging="480"/>
+      </w:pPr>
+    </w:lvl>
+  </w:abstractNum>
+  <w:abstractNum w:abstractNumId="1" w15:restartNumberingAfterBreak="0">
     <w:nsid w:val="261C4754"/>
     <w:multiLevelType w:val="multilevel"/>
     <w:tmpl w:val="42008736"/>
@@ -1166,7 +5604,7 @@
       </w:rPr>
     </w:lvl>
   </w:abstractNum>
-  <w:abstractNum w:abstractNumId="1" w15:restartNumberingAfterBreak="0">
+  <w:abstractNum w:abstractNumId="2" w15:restartNumberingAfterBreak="0">
     <w:nsid w:val="4B030739"/>
     <w:multiLevelType w:val="hybridMultilevel"/>
     <w:tmpl w:val="67E4FD68"/>
@@ -1280,9 +5718,12 @@
     </w:lvl>
   </w:abstractNum>
   <w:num w:numId="1" w16cid:durableId="1101150216">
+    <w:abstractNumId w:val="2"/>
+  </w:num>
+  <w:num w:numId="2" w16cid:durableId="1255750687">
     <w:abstractNumId w:val="1"/>
   </w:num>
-  <w:num w:numId="2" w16cid:durableId="1255750687">
+  <w:num w:numId="3" w16cid:durableId="2023389186">
     <w:abstractNumId w:val="0"/>
   </w:num>
 </w:numbering>
@@ -1688,6 +6129,7 @@
   <w:style w:type="paragraph" w:default="1" w:styleId="a">
     <w:name w:val="Normal"/>
     <w:qFormat/>
+    <w:rsid w:val="00540B92"/>
     <w:pPr>
       <w:widowControl w:val="0"/>
     </w:pPr>
@@ -1892,7 +6334,6 @@
   <w:style w:type="character" w:default="1" w:styleId="a0">
     <w:name w:val="Default Paragraph Font"/>
     <w:uiPriority w:val="1"/>
-    <w:semiHidden/>
     <w:unhideWhenUsed/>
   </w:style>
   <w:style w:type="table" w:default="1" w:styleId="a1">

</xml_diff>

<commit_message>
doc: revise FEA and UC
</commit_message>
<xml_diff>
--- a/document/hw2.docx
+++ b/document/hw2.docx
@@ -83,6 +83,8 @@
           <w:szCs w:val="52"/>
         </w:rPr>
       </w:pPr>
+      <w:proofErr w:type="spellStart"/>
+      <w:proofErr w:type="gramStart"/>
       <w:r>
         <w:rPr>
           <w:rFonts w:ascii="Times New Roman" w:eastAsia="標楷體" w:hAnsi="Times New Roman" w:cs="Times New Roman" w:hint="eastAsia"/>
@@ -93,6 +95,8 @@
         </w:rPr>
         <w:t>Re:Book</w:t>
       </w:r>
+      <w:proofErr w:type="spellEnd"/>
+      <w:proofErr w:type="gramEnd"/>
     </w:p>
     <w:p>
       <w:pPr>
@@ -197,20 +201,30 @@
           <w:szCs w:val="40"/>
         </w:rPr>
       </w:pPr>
+      <w:proofErr w:type="gramStart"/>
       <w:r>
         <w:rPr>
           <w:rFonts w:ascii="Times New Roman" w:eastAsia="標楷體" w:hAnsi="Times New Roman" w:cs="Times New Roman"/>
           <w:sz w:val="40"/>
           <w:szCs w:val="40"/>
         </w:rPr>
-        <w:t>資工碩二</w:t>
+        <w:t>資工碩</w:t>
       </w:r>
+      <w:proofErr w:type="gramEnd"/>
       <w:r>
         <w:rPr>
           <w:rFonts w:ascii="Times New Roman" w:eastAsia="標楷體" w:hAnsi="Times New Roman" w:cs="Times New Roman"/>
           <w:sz w:val="40"/>
           <w:szCs w:val="40"/>
         </w:rPr>
+        <w:t>二</w:t>
+      </w:r>
+      <w:r>
+        <w:rPr>
+          <w:rFonts w:ascii="Times New Roman" w:eastAsia="標楷體" w:hAnsi="Times New Roman" w:cs="Times New Roman"/>
+          <w:sz w:val="40"/>
+          <w:szCs w:val="40"/>
+        </w:rPr>
         <w:t xml:space="preserve"> 113598037 </w:t>
       </w:r>
       <w:r>
@@ -219,26 +233,46 @@
           <w:sz w:val="40"/>
           <w:szCs w:val="40"/>
         </w:rPr>
-        <w:t>陳宥錡</w:t>
+        <w:t>陳</w:t>
       </w:r>
-    </w:p>
-    <w:p>
-      <w:pPr>
-        <w:jc w:val="center"/>
+      <w:proofErr w:type="gramStart"/>
+      <w:r>
         <w:rPr>
           <w:rFonts w:ascii="Times New Roman" w:eastAsia="標楷體" w:hAnsi="Times New Roman" w:cs="Times New Roman"/>
           <w:sz w:val="40"/>
           <w:szCs w:val="40"/>
         </w:rPr>
-      </w:pPr>
-      <w:r>
+        <w:t>宥錡</w:t>
+      </w:r>
+      <w:proofErr w:type="gramEnd"/>
+    </w:p>
+    <w:p>
+      <w:pPr>
+        <w:jc w:val="center"/>
         <w:rPr>
           <w:rFonts w:ascii="Times New Roman" w:eastAsia="標楷體" w:hAnsi="Times New Roman" w:cs="Times New Roman"/>
           <w:sz w:val="40"/>
           <w:szCs w:val="40"/>
         </w:rPr>
-        <w:t>資工碩一</w:t>
+      </w:pPr>
+      <w:r>
+        <w:rPr>
+          <w:rFonts w:ascii="Times New Roman" w:eastAsia="標楷體" w:hAnsi="Times New Roman" w:cs="Times New Roman"/>
+          <w:sz w:val="40"/>
+          <w:szCs w:val="40"/>
+        </w:rPr>
+        <w:t>資工碩</w:t>
       </w:r>
+      <w:proofErr w:type="gramStart"/>
+      <w:r>
+        <w:rPr>
+          <w:rFonts w:ascii="Times New Roman" w:eastAsia="標楷體" w:hAnsi="Times New Roman" w:cs="Times New Roman"/>
+          <w:sz w:val="40"/>
+          <w:szCs w:val="40"/>
+        </w:rPr>
+        <w:t>一</w:t>
+      </w:r>
+      <w:proofErr w:type="gramEnd"/>
       <w:r>
         <w:rPr>
           <w:rFonts w:ascii="Times New Roman" w:eastAsia="標楷體" w:hAnsi="Times New Roman" w:cs="Times New Roman"/>
@@ -357,12 +391,14 @@
           <w:rFonts w:ascii="Times New Roman" w:eastAsia="標楷體" w:hAnsi="Times New Roman" w:cs="Times New Roman"/>
         </w:rPr>
       </w:pPr>
+      <w:proofErr w:type="spellStart"/>
       <w:r>
         <w:rPr>
           <w:rFonts w:ascii="Times New Roman" w:eastAsia="標楷體" w:hAnsi="Times New Roman" w:cs="Times New Roman"/>
         </w:rPr>
         <w:t>Re:Book</w:t>
       </w:r>
+      <w:proofErr w:type="spellEnd"/>
       <w:r>
         <w:rPr>
           <w:rFonts w:ascii="Times New Roman" w:eastAsia="標楷體" w:hAnsi="Times New Roman" w:cs="Times New Roman"/>
@@ -376,11 +412,19 @@
           <w:rFonts w:ascii="Times New Roman" w:eastAsia="標楷體" w:hAnsi="Times New Roman" w:cs="Times New Roman"/>
         </w:rPr>
       </w:pPr>
+      <w:proofErr w:type="spellStart"/>
       <w:r>
         <w:rPr>
           <w:rFonts w:ascii="Times New Roman" w:eastAsia="標楷體" w:hAnsi="Times New Roman" w:cs="Times New Roman" w:hint="eastAsia"/>
         </w:rPr>
-        <w:t xml:space="preserve">Re:Book </w:t>
+        <w:t>Re:Book</w:t>
+      </w:r>
+      <w:proofErr w:type="spellEnd"/>
+      <w:r>
+        <w:rPr>
+          <w:rFonts w:ascii="Times New Roman" w:eastAsia="標楷體" w:hAnsi="Times New Roman" w:cs="Times New Roman" w:hint="eastAsia"/>
+        </w:rPr>
+        <w:t xml:space="preserve"> </w:t>
       </w:r>
       <w:r>
         <w:rPr>
@@ -407,11 +451,19 @@
           <w:rFonts w:ascii="Times New Roman" w:eastAsia="標楷體" w:hAnsi="Times New Roman" w:cs="Times New Roman"/>
         </w:rPr>
       </w:pPr>
+      <w:proofErr w:type="spellStart"/>
       <w:r>
         <w:rPr>
           <w:rFonts w:ascii="Times New Roman" w:eastAsia="標楷體" w:hAnsi="Times New Roman" w:cs="Times New Roman" w:hint="eastAsia"/>
         </w:rPr>
-        <w:t xml:space="preserve">Re:Book </w:t>
+        <w:t>Re:Book</w:t>
+      </w:r>
+      <w:proofErr w:type="spellEnd"/>
+      <w:r>
+        <w:rPr>
+          <w:rFonts w:ascii="Times New Roman" w:eastAsia="標楷體" w:hAnsi="Times New Roman" w:cs="Times New Roman" w:hint="eastAsia"/>
+        </w:rPr>
+        <w:t xml:space="preserve"> </w:t>
       </w:r>
       <w:r>
         <w:rPr>
@@ -441,7 +493,35 @@
         <w:rPr>
           <w:rFonts w:ascii="Times New Roman" w:eastAsia="標楷體" w:hAnsi="Times New Roman" w:cs="Times New Roman" w:hint="eastAsia"/>
         </w:rPr>
-        <w:t>類。為體現對書本價值的尊重，賣家可設定期望售價，並上傳書況照片或分享使用心得。潛在買家則可透過搜尋與篩選功能，快速找到所需書籍。平台同時提供私訊機制，讓雙方協商最終價格與交付方式，確保知識的傳遞過程既順暢高效，也保有人與人之間的溫度。</w:t>
+        <w:t>類。為體現對書本價值的尊重，賣家可設定期望售價，並上傳書</w:t>
+      </w:r>
+      <w:proofErr w:type="gramStart"/>
+      <w:r>
+        <w:rPr>
+          <w:rFonts w:ascii="Times New Roman" w:eastAsia="標楷體" w:hAnsi="Times New Roman" w:cs="Times New Roman" w:hint="eastAsia"/>
+        </w:rPr>
+        <w:t>況</w:t>
+      </w:r>
+      <w:proofErr w:type="gramEnd"/>
+      <w:r>
+        <w:rPr>
+          <w:rFonts w:ascii="Times New Roman" w:eastAsia="標楷體" w:hAnsi="Times New Roman" w:cs="Times New Roman" w:hint="eastAsia"/>
+        </w:rPr>
+        <w:t>照片或分享使用心得。潛在買家則可透過搜尋與篩選功能，快速找到所需書籍。平台同時</w:t>
+      </w:r>
+      <w:proofErr w:type="gramStart"/>
+      <w:r>
+        <w:rPr>
+          <w:rFonts w:ascii="Times New Roman" w:eastAsia="標楷體" w:hAnsi="Times New Roman" w:cs="Times New Roman" w:hint="eastAsia"/>
+        </w:rPr>
+        <w:t>提供私訊機制</w:t>
+      </w:r>
+      <w:proofErr w:type="gramEnd"/>
+      <w:r>
+        <w:rPr>
+          <w:rFonts w:ascii="Times New Roman" w:eastAsia="標楷體" w:hAnsi="Times New Roman" w:cs="Times New Roman" w:hint="eastAsia"/>
+        </w:rPr>
+        <w:t>，讓雙方協商最終價格與交付方式，確保知識的傳遞過程既順暢高效，也保有人與人之間的溫度。</w:t>
       </w:r>
     </w:p>
     <w:p>
@@ -558,7 +638,7 @@
               <w:rPr>
                 <w:rFonts w:ascii="Times New Roman" w:eastAsia="標楷體" w:hAnsi="Times New Roman" w:cs="Times New Roman" w:hint="eastAsia"/>
               </w:rPr>
-              <w:t>管理單本書籍</w:t>
+              <w:t>管理書籍清單</w:t>
             </w:r>
           </w:p>
         </w:tc>
@@ -596,7 +676,7 @@
               <w:rPr>
                 <w:rFonts w:ascii="Times New Roman" w:eastAsia="標楷體" w:hAnsi="Times New Roman" w:cs="Times New Roman" w:hint="eastAsia"/>
               </w:rPr>
-              <w:t>搜尋功能</w:t>
+              <w:t>搜尋書籍</w:t>
             </w:r>
           </w:p>
         </w:tc>
@@ -630,12 +710,14 @@
                 <w:rFonts w:ascii="Times New Roman" w:eastAsia="標楷體" w:hAnsi="Times New Roman" w:cs="Times New Roman"/>
               </w:rPr>
             </w:pPr>
-            <w:r>
-              <w:rPr>
-                <w:rFonts w:ascii="Times New Roman" w:eastAsia="標楷體" w:hAnsi="Times New Roman" w:cs="Times New Roman" w:hint="eastAsia"/>
-              </w:rPr>
-              <w:t>私訊功能</w:t>
-            </w:r>
+            <w:proofErr w:type="gramStart"/>
+            <w:r>
+              <w:rPr>
+                <w:rFonts w:ascii="Times New Roman" w:eastAsia="標楷體" w:hAnsi="Times New Roman" w:cs="Times New Roman" w:hint="eastAsia"/>
+              </w:rPr>
+              <w:t>發送私訊</w:t>
+            </w:r>
+            <w:proofErr w:type="gramEnd"/>
           </w:p>
         </w:tc>
       </w:tr>
@@ -672,7 +754,7 @@
               <w:rPr>
                 <w:rFonts w:ascii="Times New Roman" w:eastAsia="標楷體" w:hAnsi="Times New Roman" w:cs="Times New Roman" w:hint="eastAsia"/>
               </w:rPr>
-              <w:t>分類多本書籍</w:t>
+              <w:t>分類管理</w:t>
             </w:r>
           </w:p>
         </w:tc>
@@ -710,7 +792,13 @@
               <w:rPr>
                 <w:rFonts w:ascii="Times New Roman" w:eastAsia="標楷體" w:hAnsi="Times New Roman" w:cs="Times New Roman" w:hint="eastAsia"/>
               </w:rPr>
-              <w:t>將書籍加入購物車</w:t>
+              <w:t>管理</w:t>
+            </w:r>
+            <w:r>
+              <w:rPr>
+                <w:rFonts w:ascii="Times New Roman" w:eastAsia="標楷體" w:hAnsi="Times New Roman" w:cs="Times New Roman" w:hint="eastAsia"/>
+              </w:rPr>
+              <w:t>購物車</w:t>
             </w:r>
           </w:p>
         </w:tc>
@@ -790,12 +878,6 @@
           <w:rFonts w:ascii="Times New Roman" w:eastAsia="標楷體" w:hAnsi="Times New Roman" w:cs="Times New Roman" w:hint="eastAsia"/>
         </w:rPr>
         <w:t>管理書籍清單</w:t>
-      </w:r>
-      <w:r>
-        <w:rPr>
-          <w:rFonts w:ascii="Times New Roman" w:eastAsia="標楷體" w:hAnsi="Times New Roman" w:cs="Times New Roman" w:hint="eastAsia"/>
-        </w:rPr>
-        <w:t xml:space="preserve"> (Manage Book Listing)</w:t>
       </w:r>
     </w:p>
     <w:tbl>
@@ -875,12 +957,16 @@
                 <w:rFonts w:ascii="Times New Roman" w:eastAsia="標楷體" w:hAnsi="Times New Roman" w:cs="Times New Roman"/>
               </w:rPr>
             </w:pPr>
+            <w:proofErr w:type="spellStart"/>
+            <w:proofErr w:type="gramStart"/>
             <w:r>
               <w:rPr>
                 <w:rFonts w:ascii="Times New Roman" w:eastAsia="標楷體" w:hAnsi="Times New Roman" w:cs="Times New Roman" w:hint="eastAsia"/>
               </w:rPr>
               <w:t>Re:Book</w:t>
             </w:r>
+            <w:proofErr w:type="spellEnd"/>
+            <w:proofErr w:type="gramEnd"/>
           </w:p>
         </w:tc>
       </w:tr>
@@ -1173,7 +1259,21 @@
               <w:rPr>
                 <w:rFonts w:ascii="Times New Roman" w:eastAsia="標楷體" w:hAnsi="Times New Roman" w:cs="Times New Roman" w:hint="eastAsia"/>
               </w:rPr>
-              <w:t>、書名、價格、書況及區域資訊。</w:t>
+              <w:t>、書名、價格、書</w:t>
+            </w:r>
+            <w:proofErr w:type="gramStart"/>
+            <w:r>
+              <w:rPr>
+                <w:rFonts w:ascii="Times New Roman" w:eastAsia="標楷體" w:hAnsi="Times New Roman" w:cs="Times New Roman" w:hint="eastAsia"/>
+              </w:rPr>
+              <w:t>況</w:t>
+            </w:r>
+            <w:proofErr w:type="gramEnd"/>
+            <w:r>
+              <w:rPr>
+                <w:rFonts w:ascii="Times New Roman" w:eastAsia="標楷體" w:hAnsi="Times New Roman" w:cs="Times New Roman" w:hint="eastAsia"/>
+              </w:rPr>
+              <w:t>及區域資訊。</w:t>
             </w:r>
             <w:r>
               <w:rPr>
@@ -1191,19 +1291,7 @@
               <w:rPr>
                 <w:rFonts w:ascii="Times New Roman" w:eastAsia="標楷體" w:hAnsi="Times New Roman" w:cs="Times New Roman" w:hint="eastAsia"/>
               </w:rPr>
-              <w:t>系統驗證資料格式（如</w:t>
-            </w:r>
-            <w:r>
-              <w:rPr>
-                <w:rFonts w:ascii="Times New Roman" w:eastAsia="標楷體" w:hAnsi="Times New Roman" w:cs="Times New Roman" w:hint="eastAsia"/>
-              </w:rPr>
-              <w:t xml:space="preserve"> ISBN </w:t>
-            </w:r>
-            <w:r>
-              <w:rPr>
-                <w:rFonts w:ascii="Times New Roman" w:eastAsia="標楷體" w:hAnsi="Times New Roman" w:cs="Times New Roman" w:hint="eastAsia"/>
-              </w:rPr>
-              <w:t>是否正確、價格是否為正數）。</w:t>
+              <w:t>系統驗證資料格式。</w:t>
             </w:r>
             <w:r>
               <w:rPr>
@@ -1239,7 +1327,49 @@
               <w:rPr>
                 <w:rFonts w:ascii="Times New Roman" w:eastAsia="標楷體" w:hAnsi="Times New Roman" w:cs="Times New Roman" w:hint="eastAsia"/>
               </w:rPr>
-              <w:t>系統儲存資料並顯示「管理成功」訊息。</w:t>
+              <w:t>系統儲存資料並顯示「</w:t>
+            </w:r>
+            <w:r>
+              <w:rPr>
+                <w:rFonts w:ascii="Times New Roman" w:eastAsia="標楷體" w:hAnsi="Times New Roman" w:cs="Times New Roman" w:hint="eastAsia"/>
+              </w:rPr>
+              <w:t>新增</w:t>
+            </w:r>
+            <w:r>
+              <w:rPr>
+                <w:rFonts w:ascii="Times New Roman" w:eastAsia="標楷體" w:hAnsi="Times New Roman" w:cs="Times New Roman" w:hint="eastAsia"/>
+              </w:rPr>
+              <w:t>成功」</w:t>
+            </w:r>
+            <w:r>
+              <w:rPr>
+                <w:rFonts w:ascii="Times New Roman" w:eastAsia="標楷體" w:hAnsi="Times New Roman" w:cs="Times New Roman" w:hint="eastAsia"/>
+              </w:rPr>
+              <w:t>或</w:t>
+            </w:r>
+            <w:r>
+              <w:rPr>
+                <w:rFonts w:ascii="Times New Roman" w:eastAsia="標楷體" w:hAnsi="Times New Roman" w:cs="Times New Roman" w:hint="eastAsia"/>
+              </w:rPr>
+              <w:t>「</w:t>
+            </w:r>
+            <w:r>
+              <w:rPr>
+                <w:rFonts w:ascii="Times New Roman" w:eastAsia="標楷體" w:hAnsi="Times New Roman" w:cs="Times New Roman" w:hint="eastAsia"/>
+              </w:rPr>
+              <w:t>修改</w:t>
+            </w:r>
+            <w:r>
+              <w:rPr>
+                <w:rFonts w:ascii="Times New Roman" w:eastAsia="標楷體" w:hAnsi="Times New Roman" w:cs="Times New Roman" w:hint="eastAsia"/>
+              </w:rPr>
+              <w:t>成功」</w:t>
+            </w:r>
+            <w:r>
+              <w:rPr>
+                <w:rFonts w:ascii="Times New Roman" w:eastAsia="標楷體" w:hAnsi="Times New Roman" w:cs="Times New Roman" w:hint="eastAsia"/>
+              </w:rPr>
+              <w:t>訊息。</w:t>
             </w:r>
           </w:p>
         </w:tc>
@@ -1363,7 +1493,7 @@
               <w:rPr>
                 <w:rFonts w:ascii="Times New Roman" w:eastAsia="標楷體" w:hAnsi="Times New Roman" w:cs="Times New Roman" w:hint="eastAsia"/>
               </w:rPr>
-              <w:t>系統應在</w:t>
+              <w:t>在</w:t>
             </w:r>
             <w:r>
               <w:rPr>
@@ -1377,143 +1507,120 @@
               </w:rPr>
               <w:t>秒內完成資料更新同步。</w:t>
             </w:r>
-            <w:r>
-              <w:rPr>
-                <w:rFonts w:ascii="Times New Roman" w:eastAsia="標楷體" w:hAnsi="Times New Roman" w:cs="Times New Roman" w:hint="eastAsia"/>
-              </w:rPr>
-              <w:t xml:space="preserve"> (</w:t>
-            </w:r>
-            <w:r>
-              <w:rPr>
-                <w:rFonts w:ascii="Times New Roman" w:eastAsia="標楷體" w:hAnsi="Times New Roman" w:cs="Times New Roman" w:hint="eastAsia"/>
-              </w:rPr>
-              <w:t>屬</w:t>
-            </w:r>
-            <w:r>
-              <w:rPr>
-                <w:rFonts w:ascii="Times New Roman" w:eastAsia="標楷體" w:hAnsi="Times New Roman" w:cs="Times New Roman" w:hint="eastAsia"/>
-              </w:rPr>
-              <w:t xml:space="preserve"> Non-functional Requirement)</w:t>
-            </w:r>
-          </w:p>
-        </w:tc>
-      </w:tr>
-      <w:tr>
-        <w:tc>
-          <w:tcPr>
-            <w:tcW w:w="4148" w:type="dxa"/>
-          </w:tcPr>
-          <w:p>
-            <w:pPr>
-              <w:rPr>
-                <w:rFonts w:ascii="Times New Roman" w:eastAsia="標楷體" w:hAnsi="Times New Roman" w:cs="Times New Roman"/>
-              </w:rPr>
-            </w:pPr>
+          </w:p>
+        </w:tc>
+      </w:tr>
+      <w:tr>
+        <w:tc>
+          <w:tcPr>
+            <w:tcW w:w="4148" w:type="dxa"/>
+          </w:tcPr>
+          <w:p>
+            <w:pPr>
+              <w:rPr>
+                <w:rFonts w:ascii="Times New Roman" w:eastAsia="標楷體" w:hAnsi="Times New Roman" w:cs="Times New Roman"/>
+              </w:rPr>
+            </w:pPr>
+            <w:r>
+              <w:rPr>
+                <w:rFonts w:ascii="Times New Roman" w:eastAsia="標楷體" w:hAnsi="Times New Roman" w:cs="Times New Roman" w:hint="eastAsia"/>
+              </w:rPr>
+              <w:t>Technology and Data Variations List</w:t>
+            </w:r>
+          </w:p>
+        </w:tc>
+        <w:tc>
+          <w:tcPr>
+            <w:tcW w:w="4148" w:type="dxa"/>
+          </w:tcPr>
+          <w:p>
+            <w:pPr>
+              <w:rPr>
+                <w:rFonts w:ascii="Times New Roman" w:eastAsia="標楷體" w:hAnsi="Times New Roman" w:cs="Times New Roman"/>
+              </w:rPr>
+            </w:pPr>
+            <w:r>
+              <w:rPr>
+                <w:rFonts w:ascii="Times New Roman" w:eastAsia="標楷體" w:hAnsi="Times New Roman" w:cs="Times New Roman" w:hint="eastAsia"/>
+              </w:rPr>
+              <w:t>賣家透過</w:t>
+            </w:r>
+            <w:r>
+              <w:rPr>
+                <w:rFonts w:ascii="Times New Roman" w:eastAsia="標楷體" w:hAnsi="Times New Roman" w:cs="Times New Roman" w:hint="eastAsia"/>
+              </w:rPr>
+              <w:t xml:space="preserve"> Web </w:t>
+            </w:r>
+            <w:r>
+              <w:rPr>
+                <w:rFonts w:ascii="Times New Roman" w:eastAsia="標楷體" w:hAnsi="Times New Roman" w:cs="Times New Roman" w:hint="eastAsia"/>
+              </w:rPr>
+              <w:t>瀏覽器手動輸入資料</w:t>
+            </w:r>
+          </w:p>
+        </w:tc>
+      </w:tr>
+      <w:tr>
+        <w:tc>
+          <w:tcPr>
+            <w:tcW w:w="4148" w:type="dxa"/>
+          </w:tcPr>
+          <w:p>
+            <w:pPr>
+              <w:rPr>
+                <w:rFonts w:ascii="Times New Roman" w:eastAsia="標楷體" w:hAnsi="Times New Roman" w:cs="Times New Roman"/>
+              </w:rPr>
+            </w:pPr>
+            <w:r>
+              <w:rPr>
+                <w:rFonts w:ascii="Times New Roman" w:eastAsia="標楷體" w:hAnsi="Times New Roman" w:cs="Times New Roman" w:hint="eastAsia"/>
+              </w:rPr>
+              <w:t>Frequency of Occurrence</w:t>
+            </w:r>
+          </w:p>
+        </w:tc>
+        <w:tc>
+          <w:tcPr>
+            <w:tcW w:w="4148" w:type="dxa"/>
+          </w:tcPr>
+          <w:p>
+            <w:pPr>
+              <w:rPr>
+                <w:rFonts w:ascii="Times New Roman" w:eastAsia="標楷體" w:hAnsi="Times New Roman" w:cs="Times New Roman"/>
+              </w:rPr>
+            </w:pPr>
+            <w:r>
+              <w:rPr>
+                <w:rFonts w:ascii="Times New Roman" w:eastAsia="標楷體" w:hAnsi="Times New Roman" w:cs="Times New Roman" w:hint="eastAsia"/>
+              </w:rPr>
+              <w:t>每當賣家有新書要賣或商品狀態改變</w:t>
+            </w:r>
             <w:r>
               <w:rPr>
                 <w:rFonts w:ascii="Times New Roman" w:eastAsia="標楷體" w:hAnsi="Times New Roman" w:cs="Times New Roman" w:hint="eastAsia"/>
               </w:rPr>
               <w:lastRenderedPageBreak/>
-              <w:t>Technology and Data Variations List</w:t>
-            </w:r>
-          </w:p>
-        </w:tc>
-        <w:tc>
-          <w:tcPr>
-            <w:tcW w:w="4148" w:type="dxa"/>
-          </w:tcPr>
-          <w:p>
-            <w:pPr>
-              <w:rPr>
-                <w:rFonts w:ascii="Times New Roman" w:eastAsia="標楷體" w:hAnsi="Times New Roman" w:cs="Times New Roman"/>
-              </w:rPr>
-            </w:pPr>
-            <w:r>
-              <w:rPr>
-                <w:rFonts w:ascii="Times New Roman" w:eastAsia="標楷體" w:hAnsi="Times New Roman" w:cs="Times New Roman" w:hint="eastAsia"/>
-              </w:rPr>
-              <w:t>賣家可透過</w:t>
-            </w:r>
-            <w:r>
-              <w:rPr>
-                <w:rFonts w:ascii="Times New Roman" w:eastAsia="標楷體" w:hAnsi="Times New Roman" w:cs="Times New Roman" w:hint="eastAsia"/>
-              </w:rPr>
-              <w:t xml:space="preserve"> Web </w:t>
-            </w:r>
-            <w:r>
-              <w:rPr>
-                <w:rFonts w:ascii="Times New Roman" w:eastAsia="標楷體" w:hAnsi="Times New Roman" w:cs="Times New Roman" w:hint="eastAsia"/>
-              </w:rPr>
-              <w:t>瀏覽器手動輸入資料，或透過行動裝置相機掃描</w:t>
-            </w:r>
-            <w:r>
-              <w:rPr>
-                <w:rFonts w:ascii="Times New Roman" w:eastAsia="標楷體" w:hAnsi="Times New Roman" w:cs="Times New Roman" w:hint="eastAsia"/>
-              </w:rPr>
-              <w:t xml:space="preserve"> ISBN </w:t>
-            </w:r>
-            <w:r>
-              <w:rPr>
-                <w:rFonts w:ascii="Times New Roman" w:eastAsia="標楷體" w:hAnsi="Times New Roman" w:cs="Times New Roman" w:hint="eastAsia"/>
-              </w:rPr>
-              <w:t>碼（未來擴充項目）。</w:t>
-            </w:r>
-          </w:p>
-        </w:tc>
-      </w:tr>
-      <w:tr>
-        <w:tc>
-          <w:tcPr>
-            <w:tcW w:w="4148" w:type="dxa"/>
-          </w:tcPr>
-          <w:p>
-            <w:pPr>
-              <w:rPr>
-                <w:rFonts w:ascii="Times New Roman" w:eastAsia="標楷體" w:hAnsi="Times New Roman" w:cs="Times New Roman"/>
-              </w:rPr>
-            </w:pPr>
-            <w:r>
-              <w:rPr>
-                <w:rFonts w:ascii="Times New Roman" w:eastAsia="標楷體" w:hAnsi="Times New Roman" w:cs="Times New Roman" w:hint="eastAsia"/>
-              </w:rPr>
-              <w:t>Frequency of Occurrence</w:t>
-            </w:r>
-          </w:p>
-        </w:tc>
-        <w:tc>
-          <w:tcPr>
-            <w:tcW w:w="4148" w:type="dxa"/>
-          </w:tcPr>
-          <w:p>
-            <w:pPr>
-              <w:rPr>
-                <w:rFonts w:ascii="Times New Roman" w:eastAsia="標楷體" w:hAnsi="Times New Roman" w:cs="Times New Roman"/>
-              </w:rPr>
-            </w:pPr>
-            <w:r>
-              <w:rPr>
-                <w:rFonts w:ascii="Times New Roman" w:eastAsia="標楷體" w:hAnsi="Times New Roman" w:cs="Times New Roman" w:hint="eastAsia"/>
-              </w:rPr>
-              <w:t>每當賣家有新書要賣或商品狀態改變時觸發（高頻率）。</w:t>
-            </w:r>
-          </w:p>
-        </w:tc>
-      </w:tr>
-      <w:tr>
-        <w:tc>
-          <w:tcPr>
-            <w:tcW w:w="4148" w:type="dxa"/>
-          </w:tcPr>
-          <w:p>
-            <w:pPr>
-              <w:rPr>
-                <w:rFonts w:ascii="Times New Roman" w:eastAsia="標楷體" w:hAnsi="Times New Roman" w:cs="Times New Roman"/>
-              </w:rPr>
-            </w:pPr>
-            <w:r>
-              <w:rPr>
-                <w:rFonts w:ascii="Times New Roman" w:eastAsia="標楷體" w:hAnsi="Times New Roman" w:cs="Times New Roman" w:hint="eastAsia"/>
-              </w:rPr>
+              <w:t>時觸發（高頻率）。</w:t>
+            </w:r>
+          </w:p>
+        </w:tc>
+      </w:tr>
+      <w:tr>
+        <w:tc>
+          <w:tcPr>
+            <w:tcW w:w="4148" w:type="dxa"/>
+          </w:tcPr>
+          <w:p>
+            <w:pPr>
+              <w:rPr>
+                <w:rFonts w:ascii="Times New Roman" w:eastAsia="標楷體" w:hAnsi="Times New Roman" w:cs="Times New Roman"/>
+              </w:rPr>
+            </w:pPr>
+            <w:r>
+              <w:rPr>
+                <w:rFonts w:ascii="Times New Roman" w:eastAsia="標楷體" w:hAnsi="Times New Roman" w:cs="Times New Roman" w:hint="eastAsia"/>
+              </w:rPr>
+              <w:lastRenderedPageBreak/>
               <w:t>Miscellaneous</w:t>
             </w:r>
           </w:p>
@@ -1532,7 +1639,7 @@
               <w:rPr>
                 <w:rFonts w:ascii="Times New Roman" w:eastAsia="標楷體" w:hAnsi="Times New Roman" w:cs="Times New Roman" w:hint="eastAsia"/>
               </w:rPr>
-              <w:t>是否需要限制單一使用者可同時上架的書籍上限？（待討論問題）</w:t>
+              <w:t>是否需要限制單一使用者可同時上架的書籍上限？</w:t>
             </w:r>
           </w:p>
         </w:tc>
@@ -1562,12 +1669,6 @@
           <w:rFonts w:ascii="Times New Roman" w:eastAsia="標楷體" w:hAnsi="Times New Roman" w:cs="Times New Roman" w:hint="eastAsia"/>
         </w:rPr>
         <w:t>搜尋書籍</w:t>
-      </w:r>
-      <w:r>
-        <w:rPr>
-          <w:rFonts w:ascii="Times New Roman" w:eastAsia="標楷體" w:hAnsi="Times New Roman" w:cs="Times New Roman" w:hint="eastAsia"/>
-        </w:rPr>
-        <w:t xml:space="preserve"> (Search Books)</w:t>
       </w:r>
     </w:p>
     <w:tbl>
@@ -1647,12 +1748,16 @@
                 <w:rFonts w:ascii="Times New Roman" w:eastAsia="標楷體" w:hAnsi="Times New Roman" w:cs="Times New Roman"/>
               </w:rPr>
             </w:pPr>
+            <w:proofErr w:type="spellStart"/>
+            <w:proofErr w:type="gramStart"/>
             <w:r>
               <w:rPr>
                 <w:rFonts w:ascii="Times New Roman" w:eastAsia="標楷體" w:hAnsi="Times New Roman" w:cs="Times New Roman" w:hint="eastAsia"/>
               </w:rPr>
               <w:t>Re:Book</w:t>
             </w:r>
+            <w:proofErr w:type="spellEnd"/>
+            <w:proofErr w:type="gramEnd"/>
           </w:p>
         </w:tc>
       </w:tr>
@@ -1934,7 +2039,21 @@
               <w:rPr>
                 <w:rFonts w:ascii="Times New Roman" w:eastAsia="標楷體" w:hAnsi="Times New Roman" w:cs="Times New Roman" w:hint="eastAsia"/>
               </w:rPr>
-              <w:t>買家選擇篩選條件（如：區域</w:t>
+              <w:t>買家選擇篩選條件</w:t>
+            </w:r>
+            <w:proofErr w:type="gramStart"/>
+            <w:r>
+              <w:rPr>
+                <w:rFonts w:ascii="Times New Roman" w:eastAsia="標楷體" w:hAnsi="Times New Roman" w:cs="Times New Roman" w:hint="eastAsia"/>
+              </w:rPr>
+              <w:t>（</w:t>
+            </w:r>
+            <w:proofErr w:type="gramEnd"/>
+            <w:r>
+              <w:rPr>
+                <w:rFonts w:ascii="Times New Roman" w:eastAsia="標楷體" w:hAnsi="Times New Roman" w:cs="Times New Roman" w:hint="eastAsia"/>
+              </w:rPr>
+              <w:t>如：區域</w:t>
             </w:r>
             <w:r>
               <w:rPr>
@@ -1946,7 +2065,21 @@
               <w:rPr>
                 <w:rFonts w:ascii="Times New Roman" w:eastAsia="標楷體" w:hAnsi="Times New Roman" w:cs="Times New Roman" w:hint="eastAsia"/>
               </w:rPr>
-              <w:t>校區、價格範圍、書況）。</w:t>
+              <w:t>校區、價格範圍、書</w:t>
+            </w:r>
+            <w:proofErr w:type="gramStart"/>
+            <w:r>
+              <w:rPr>
+                <w:rFonts w:ascii="Times New Roman" w:eastAsia="標楷體" w:hAnsi="Times New Roman" w:cs="Times New Roman" w:hint="eastAsia"/>
+              </w:rPr>
+              <w:t>況）</w:t>
+            </w:r>
+            <w:proofErr w:type="gramEnd"/>
+            <w:r>
+              <w:rPr>
+                <w:rFonts w:ascii="Times New Roman" w:eastAsia="標楷體" w:hAnsi="Times New Roman" w:cs="Times New Roman" w:hint="eastAsia"/>
+              </w:rPr>
+              <w:t>。</w:t>
             </w:r>
           </w:p>
           <w:p>
@@ -2086,137 +2219,158 @@
               <w:rPr>
                 <w:rFonts w:ascii="Times New Roman" w:eastAsia="標楷體" w:hAnsi="Times New Roman" w:cs="Times New Roman" w:hint="eastAsia"/>
               </w:rPr>
+              <w:t>Special Requirements</w:t>
+            </w:r>
+          </w:p>
+        </w:tc>
+        <w:tc>
+          <w:tcPr>
+            <w:tcW w:w="4148" w:type="dxa"/>
+          </w:tcPr>
+          <w:p>
+            <w:pPr>
+              <w:rPr>
+                <w:rFonts w:ascii="Times New Roman" w:eastAsia="標楷體" w:hAnsi="Times New Roman" w:cs="Times New Roman"/>
+              </w:rPr>
+            </w:pPr>
+            <w:r>
+              <w:rPr>
+                <w:rFonts w:ascii="Times New Roman" w:eastAsia="標楷體" w:hAnsi="Times New Roman" w:cs="Times New Roman" w:hint="eastAsia"/>
+              </w:rPr>
+              <w:t>搜尋結果</w:t>
+            </w:r>
+            <w:proofErr w:type="gramStart"/>
+            <w:r>
+              <w:rPr>
+                <w:rFonts w:ascii="Times New Roman" w:eastAsia="標楷體" w:hAnsi="Times New Roman" w:cs="Times New Roman" w:hint="eastAsia"/>
+              </w:rPr>
+              <w:t>的加載時間</w:t>
+            </w:r>
+            <w:proofErr w:type="gramEnd"/>
+            <w:r>
+              <w:rPr>
+                <w:rFonts w:ascii="Times New Roman" w:eastAsia="標楷體" w:hAnsi="Times New Roman" w:cs="Times New Roman" w:hint="eastAsia"/>
+              </w:rPr>
+              <w:t>應小於</w:t>
+            </w:r>
+            <w:r>
+              <w:rPr>
+                <w:rFonts w:ascii="Times New Roman" w:eastAsia="標楷體" w:hAnsi="Times New Roman" w:cs="Times New Roman" w:hint="eastAsia"/>
+              </w:rPr>
+              <w:t xml:space="preserve"> 2 </w:t>
+            </w:r>
+            <w:r>
+              <w:rPr>
+                <w:rFonts w:ascii="Times New Roman" w:eastAsia="標楷體" w:hAnsi="Times New Roman" w:cs="Times New Roman" w:hint="eastAsia"/>
+              </w:rPr>
+              <w:t>秒。</w:t>
+            </w:r>
+            <w:r>
+              <w:rPr>
+                <w:rFonts w:ascii="Times New Roman" w:eastAsia="標楷體" w:hAnsi="Times New Roman" w:cs="Times New Roman" w:hint="eastAsia"/>
+              </w:rPr>
+              <w:t xml:space="preserve"> (</w:t>
+            </w:r>
+            <w:r>
+              <w:rPr>
+                <w:rFonts w:ascii="Times New Roman" w:eastAsia="標楷體" w:hAnsi="Times New Roman" w:cs="Times New Roman" w:hint="eastAsia"/>
+              </w:rPr>
+              <w:t>屬</w:t>
+            </w:r>
+            <w:r>
+              <w:rPr>
+                <w:rFonts w:ascii="Times New Roman" w:eastAsia="標楷體" w:hAnsi="Times New Roman" w:cs="Times New Roman" w:hint="eastAsia"/>
+              </w:rPr>
+              <w:t xml:space="preserve"> Non-functional Requirement)</w:t>
+            </w:r>
+          </w:p>
+        </w:tc>
+      </w:tr>
+      <w:tr>
+        <w:tc>
+          <w:tcPr>
+            <w:tcW w:w="4148" w:type="dxa"/>
+          </w:tcPr>
+          <w:p>
+            <w:pPr>
+              <w:rPr>
+                <w:rFonts w:ascii="Times New Roman" w:eastAsia="標楷體" w:hAnsi="Times New Roman" w:cs="Times New Roman"/>
+              </w:rPr>
+            </w:pPr>
+            <w:r>
+              <w:rPr>
+                <w:rFonts w:ascii="Times New Roman" w:eastAsia="標楷體" w:hAnsi="Times New Roman" w:cs="Times New Roman" w:hint="eastAsia"/>
+              </w:rPr>
+              <w:t>Technology and Data Variations List</w:t>
+            </w:r>
+          </w:p>
+        </w:tc>
+        <w:tc>
+          <w:tcPr>
+            <w:tcW w:w="4148" w:type="dxa"/>
+          </w:tcPr>
+          <w:p>
+            <w:pPr>
+              <w:rPr>
+                <w:rFonts w:ascii="Times New Roman" w:eastAsia="標楷體" w:hAnsi="Times New Roman" w:cs="Times New Roman"/>
+              </w:rPr>
+            </w:pPr>
+            <w:r>
+              <w:rPr>
+                <w:rFonts w:ascii="Times New Roman" w:eastAsia="標楷體" w:hAnsi="Times New Roman" w:cs="Times New Roman" w:hint="eastAsia"/>
+              </w:rPr>
+              <w:t>支援部分關鍵字匹配（模糊搜尋）；支援</w:t>
+            </w:r>
+            <w:r>
+              <w:rPr>
+                <w:rFonts w:ascii="Times New Roman" w:eastAsia="標楷體" w:hAnsi="Times New Roman" w:cs="Times New Roman" w:hint="eastAsia"/>
+              </w:rPr>
+              <w:t xml:space="preserve"> ISBN-10 </w:t>
+            </w:r>
+            <w:r>
+              <w:rPr>
+                <w:rFonts w:ascii="Times New Roman" w:eastAsia="標楷體" w:hAnsi="Times New Roman" w:cs="Times New Roman" w:hint="eastAsia"/>
+              </w:rPr>
+              <w:t>與</w:t>
+            </w:r>
+            <w:r>
+              <w:rPr>
+                <w:rFonts w:ascii="Times New Roman" w:eastAsia="標楷體" w:hAnsi="Times New Roman" w:cs="Times New Roman" w:hint="eastAsia"/>
+              </w:rPr>
+              <w:t xml:space="preserve"> ISBN-13 </w:t>
+            </w:r>
+            <w:r>
+              <w:rPr>
+                <w:rFonts w:ascii="Times New Roman" w:eastAsia="標楷體" w:hAnsi="Times New Roman" w:cs="Times New Roman" w:hint="eastAsia"/>
+              </w:rPr>
+              <w:t>不同格式</w:t>
+            </w:r>
+            <w:r>
+              <w:rPr>
+                <w:rFonts w:ascii="Times New Roman" w:eastAsia="標楷體" w:hAnsi="Times New Roman" w:cs="Times New Roman" w:hint="eastAsia"/>
+              </w:rPr>
               <w:lastRenderedPageBreak/>
-              <w:t>Special Requirements</w:t>
-            </w:r>
-          </w:p>
-        </w:tc>
-        <w:tc>
-          <w:tcPr>
-            <w:tcW w:w="4148" w:type="dxa"/>
-          </w:tcPr>
-          <w:p>
-            <w:pPr>
-              <w:rPr>
-                <w:rFonts w:ascii="Times New Roman" w:eastAsia="標楷體" w:hAnsi="Times New Roman" w:cs="Times New Roman"/>
-              </w:rPr>
-            </w:pPr>
-            <w:r>
-              <w:rPr>
-                <w:rFonts w:ascii="Times New Roman" w:eastAsia="標楷體" w:hAnsi="Times New Roman" w:cs="Times New Roman" w:hint="eastAsia"/>
-              </w:rPr>
-              <w:t>搜尋結果的加載時間應小於</w:t>
-            </w:r>
-            <w:r>
-              <w:rPr>
-                <w:rFonts w:ascii="Times New Roman" w:eastAsia="標楷體" w:hAnsi="Times New Roman" w:cs="Times New Roman" w:hint="eastAsia"/>
-              </w:rPr>
-              <w:t xml:space="preserve"> 2 </w:t>
-            </w:r>
-            <w:r>
-              <w:rPr>
-                <w:rFonts w:ascii="Times New Roman" w:eastAsia="標楷體" w:hAnsi="Times New Roman" w:cs="Times New Roman" w:hint="eastAsia"/>
-              </w:rPr>
-              <w:t>秒。</w:t>
-            </w:r>
-            <w:r>
-              <w:rPr>
-                <w:rFonts w:ascii="Times New Roman" w:eastAsia="標楷體" w:hAnsi="Times New Roman" w:cs="Times New Roman" w:hint="eastAsia"/>
-              </w:rPr>
-              <w:t xml:space="preserve"> (</w:t>
-            </w:r>
-            <w:r>
-              <w:rPr>
-                <w:rFonts w:ascii="Times New Roman" w:eastAsia="標楷體" w:hAnsi="Times New Roman" w:cs="Times New Roman" w:hint="eastAsia"/>
-              </w:rPr>
-              <w:t>屬</w:t>
-            </w:r>
-            <w:r>
-              <w:rPr>
-                <w:rFonts w:ascii="Times New Roman" w:eastAsia="標楷體" w:hAnsi="Times New Roman" w:cs="Times New Roman" w:hint="eastAsia"/>
-              </w:rPr>
-              <w:t xml:space="preserve"> Non-functional Requirement)</w:t>
-            </w:r>
-          </w:p>
-        </w:tc>
-      </w:tr>
-      <w:tr>
-        <w:tc>
-          <w:tcPr>
-            <w:tcW w:w="4148" w:type="dxa"/>
-          </w:tcPr>
-          <w:p>
-            <w:pPr>
-              <w:rPr>
-                <w:rFonts w:ascii="Times New Roman" w:eastAsia="標楷體" w:hAnsi="Times New Roman" w:cs="Times New Roman"/>
-              </w:rPr>
-            </w:pPr>
-            <w:r>
-              <w:rPr>
-                <w:rFonts w:ascii="Times New Roman" w:eastAsia="標楷體" w:hAnsi="Times New Roman" w:cs="Times New Roman" w:hint="eastAsia"/>
-              </w:rPr>
-              <w:t>Technology and Data Variations List</w:t>
-            </w:r>
-          </w:p>
-        </w:tc>
-        <w:tc>
-          <w:tcPr>
-            <w:tcW w:w="4148" w:type="dxa"/>
-          </w:tcPr>
-          <w:p>
-            <w:pPr>
-              <w:rPr>
-                <w:rFonts w:ascii="Times New Roman" w:eastAsia="標楷體" w:hAnsi="Times New Roman" w:cs="Times New Roman"/>
-              </w:rPr>
-            </w:pPr>
-            <w:r>
-              <w:rPr>
-                <w:rFonts w:ascii="Times New Roman" w:eastAsia="標楷體" w:hAnsi="Times New Roman" w:cs="Times New Roman" w:hint="eastAsia"/>
-              </w:rPr>
-              <w:t>支援部分關鍵字匹配（模糊搜尋）；支援</w:t>
-            </w:r>
-            <w:r>
-              <w:rPr>
-                <w:rFonts w:ascii="Times New Roman" w:eastAsia="標楷體" w:hAnsi="Times New Roman" w:cs="Times New Roman" w:hint="eastAsia"/>
-              </w:rPr>
-              <w:t xml:space="preserve"> ISBN-10 </w:t>
-            </w:r>
-            <w:r>
-              <w:rPr>
-                <w:rFonts w:ascii="Times New Roman" w:eastAsia="標楷體" w:hAnsi="Times New Roman" w:cs="Times New Roman" w:hint="eastAsia"/>
-              </w:rPr>
-              <w:t>與</w:t>
-            </w:r>
-            <w:r>
-              <w:rPr>
-                <w:rFonts w:ascii="Times New Roman" w:eastAsia="標楷體" w:hAnsi="Times New Roman" w:cs="Times New Roman" w:hint="eastAsia"/>
-              </w:rPr>
-              <w:t xml:space="preserve"> ISBN-13 </w:t>
-            </w:r>
-            <w:r>
-              <w:rPr>
-                <w:rFonts w:ascii="Times New Roman" w:eastAsia="標楷體" w:hAnsi="Times New Roman" w:cs="Times New Roman" w:hint="eastAsia"/>
-              </w:rPr>
-              <w:t>不同格式的輸入。</w:t>
-            </w:r>
-          </w:p>
-        </w:tc>
-      </w:tr>
-      <w:tr>
-        <w:tc>
-          <w:tcPr>
-            <w:tcW w:w="4148" w:type="dxa"/>
-          </w:tcPr>
-          <w:p>
-            <w:pPr>
-              <w:rPr>
-                <w:rFonts w:ascii="Times New Roman" w:eastAsia="標楷體" w:hAnsi="Times New Roman" w:cs="Times New Roman"/>
-              </w:rPr>
-            </w:pPr>
-            <w:r>
-              <w:rPr>
-                <w:rFonts w:ascii="Times New Roman" w:eastAsia="標楷體" w:hAnsi="Times New Roman" w:cs="Times New Roman" w:hint="eastAsia"/>
-              </w:rPr>
+              <w:t>的輸入。</w:t>
+            </w:r>
+          </w:p>
+        </w:tc>
+      </w:tr>
+      <w:tr>
+        <w:tc>
+          <w:tcPr>
+            <w:tcW w:w="4148" w:type="dxa"/>
+          </w:tcPr>
+          <w:p>
+            <w:pPr>
+              <w:rPr>
+                <w:rFonts w:ascii="Times New Roman" w:eastAsia="標楷體" w:hAnsi="Times New Roman" w:cs="Times New Roman"/>
+              </w:rPr>
+            </w:pPr>
+            <w:r>
+              <w:rPr>
+                <w:rFonts w:ascii="Times New Roman" w:eastAsia="標楷體" w:hAnsi="Times New Roman" w:cs="Times New Roman" w:hint="eastAsia"/>
+              </w:rPr>
+              <w:lastRenderedPageBreak/>
               <w:t>Frequency of Occurrence</w:t>
             </w:r>
           </w:p>
@@ -2303,12 +2457,6 @@
           <w:rFonts w:ascii="Times New Roman" w:eastAsia="標楷體" w:hAnsi="Times New Roman" w:cs="Times New Roman" w:hint="eastAsia"/>
         </w:rPr>
         <w:t>發送私訊</w:t>
-      </w:r>
-      <w:r>
-        <w:rPr>
-          <w:rFonts w:ascii="Times New Roman" w:eastAsia="標楷體" w:hAnsi="Times New Roman" w:cs="Times New Roman" w:hint="eastAsia"/>
-        </w:rPr>
-        <w:t xml:space="preserve"> (Send Private Message)</w:t>
       </w:r>
     </w:p>
     <w:tbl>
@@ -2388,12 +2536,16 @@
                 <w:rFonts w:ascii="Times New Roman" w:eastAsia="標楷體" w:hAnsi="Times New Roman" w:cs="Times New Roman"/>
               </w:rPr>
             </w:pPr>
+            <w:proofErr w:type="spellStart"/>
+            <w:proofErr w:type="gramStart"/>
             <w:r>
               <w:rPr>
                 <w:rFonts w:ascii="Times New Roman" w:eastAsia="標楷體" w:hAnsi="Times New Roman" w:cs="Times New Roman" w:hint="eastAsia"/>
               </w:rPr>
               <w:t>Re:Book</w:t>
             </w:r>
+            <w:proofErr w:type="spellEnd"/>
+            <w:proofErr w:type="gramEnd"/>
           </w:p>
         </w:tc>
       </w:tr>
@@ -2512,7 +2664,21 @@
               <w:rPr>
                 <w:rFonts w:ascii="Times New Roman" w:eastAsia="標楷體" w:hAnsi="Times New Roman" w:cs="Times New Roman" w:hint="eastAsia"/>
               </w:rPr>
-              <w:t>買家：希望直接聯繫賣家以詢問書況細節或協商最終價格</w:t>
+              <w:t>買家：希望直接聯繫賣家以詢問書</w:t>
+            </w:r>
+            <w:proofErr w:type="gramStart"/>
+            <w:r>
+              <w:rPr>
+                <w:rFonts w:ascii="Times New Roman" w:eastAsia="標楷體" w:hAnsi="Times New Roman" w:cs="Times New Roman" w:hint="eastAsia"/>
+              </w:rPr>
+              <w:t>況</w:t>
+            </w:r>
+            <w:proofErr w:type="gramEnd"/>
+            <w:r>
+              <w:rPr>
+                <w:rFonts w:ascii="Times New Roman" w:eastAsia="標楷體" w:hAnsi="Times New Roman" w:cs="Times New Roman" w:hint="eastAsia"/>
+              </w:rPr>
+              <w:t>細節或協商最終價格</w:t>
             </w:r>
             <w:r>
               <w:rPr>
@@ -2612,7 +2778,21 @@
               <w:rPr>
                 <w:rFonts w:ascii="Times New Roman" w:eastAsia="標楷體" w:hAnsi="Times New Roman" w:cs="Times New Roman" w:hint="eastAsia"/>
               </w:rPr>
-              <w:t>訊息正確傳送至賣家的收件匣，且雙方能看到完整的歷史對話紀錄。</w:t>
+              <w:t>訊息正確</w:t>
+            </w:r>
+            <w:proofErr w:type="gramStart"/>
+            <w:r>
+              <w:rPr>
+                <w:rFonts w:ascii="Times New Roman" w:eastAsia="標楷體" w:hAnsi="Times New Roman" w:cs="Times New Roman" w:hint="eastAsia"/>
+              </w:rPr>
+              <w:t>傳送至賣家</w:t>
+            </w:r>
+            <w:proofErr w:type="gramEnd"/>
+            <w:r>
+              <w:rPr>
+                <w:rFonts w:ascii="Times New Roman" w:eastAsia="標楷體" w:hAnsi="Times New Roman" w:cs="Times New Roman" w:hint="eastAsia"/>
+              </w:rPr>
+              <w:t>的收件匣，且雙方能看到完整的歷史對話紀錄。</w:t>
             </w:r>
           </w:p>
         </w:tc>
@@ -2643,7 +2823,7 @@
           <w:p>
             <w:pPr>
               <w:rPr>
-                <w:rFonts w:ascii="Times New Roman" w:eastAsia="標楷體" w:hAnsi="Times New Roman" w:cs="Times New Roman" w:hint="eastAsia"/>
+                <w:rFonts w:ascii="Times New Roman" w:eastAsia="標楷體" w:hAnsi="Times New Roman" w:cs="Times New Roman"/>
               </w:rPr>
             </w:pPr>
             <w:r>
@@ -2656,7 +2836,21 @@
               <w:rPr>
                 <w:rFonts w:ascii="Times New Roman" w:eastAsia="標楷體" w:hAnsi="Times New Roman" w:cs="Times New Roman" w:hint="eastAsia"/>
               </w:rPr>
-              <w:t>買家在書籍詳情頁面點擊「聯繫賣家」按鈕。</w:t>
+              <w:t>買家在書籍詳情</w:t>
+            </w:r>
+            <w:proofErr w:type="gramStart"/>
+            <w:r>
+              <w:rPr>
+                <w:rFonts w:ascii="Times New Roman" w:eastAsia="標楷體" w:hAnsi="Times New Roman" w:cs="Times New Roman" w:hint="eastAsia"/>
+              </w:rPr>
+              <w:t>頁面點擊</w:t>
+            </w:r>
+            <w:proofErr w:type="gramEnd"/>
+            <w:r>
+              <w:rPr>
+                <w:rFonts w:ascii="Times New Roman" w:eastAsia="標楷體" w:hAnsi="Times New Roman" w:cs="Times New Roman" w:hint="eastAsia"/>
+              </w:rPr>
+              <w:t>「聯繫賣家」按鈕。</w:t>
             </w:r>
           </w:p>
           <w:p>
@@ -2675,7 +2869,21 @@
               <w:rPr>
                 <w:rFonts w:ascii="Times New Roman" w:eastAsia="標楷體" w:hAnsi="Times New Roman" w:cs="Times New Roman" w:hint="eastAsia"/>
               </w:rPr>
-              <w:t>系統開啟該書籍專屬的私訊對話視窗。</w:t>
+              <w:t>系統開啟該書籍專屬</w:t>
+            </w:r>
+            <w:proofErr w:type="gramStart"/>
+            <w:r>
+              <w:rPr>
+                <w:rFonts w:ascii="Times New Roman" w:eastAsia="標楷體" w:hAnsi="Times New Roman" w:cs="Times New Roman" w:hint="eastAsia"/>
+              </w:rPr>
+              <w:t>的私訊對話</w:t>
+            </w:r>
+            <w:proofErr w:type="gramEnd"/>
+            <w:r>
+              <w:rPr>
+                <w:rFonts w:ascii="Times New Roman" w:eastAsia="標楷體" w:hAnsi="Times New Roman" w:cs="Times New Roman" w:hint="eastAsia"/>
+              </w:rPr>
+              <w:t>視窗。</w:t>
             </w:r>
           </w:p>
           <w:p>
@@ -2694,13 +2902,41 @@
               <w:rPr>
                 <w:rFonts w:ascii="Times New Roman" w:eastAsia="標楷體" w:hAnsi="Times New Roman" w:cs="Times New Roman" w:hint="eastAsia"/>
               </w:rPr>
-              <w:t>買家輸入諮詢內容（如：詢問筆記狀況、議價或約定地點）。</w:t>
-            </w:r>
-          </w:p>
-          <w:p>
-            <w:pPr>
-              <w:rPr>
-                <w:rFonts w:ascii="Times New Roman" w:eastAsia="標楷體" w:hAnsi="Times New Roman" w:cs="Times New Roman" w:hint="eastAsia"/>
+              <w:t>買家輸入諮詢內容</w:t>
+            </w:r>
+            <w:proofErr w:type="gramStart"/>
+            <w:r>
+              <w:rPr>
+                <w:rFonts w:ascii="Times New Roman" w:eastAsia="標楷體" w:hAnsi="Times New Roman" w:cs="Times New Roman" w:hint="eastAsia"/>
+              </w:rPr>
+              <w:t>（</w:t>
+            </w:r>
+            <w:proofErr w:type="gramEnd"/>
+            <w:r>
+              <w:rPr>
+                <w:rFonts w:ascii="Times New Roman" w:eastAsia="標楷體" w:hAnsi="Times New Roman" w:cs="Times New Roman" w:hint="eastAsia"/>
+              </w:rPr>
+              <w:t>如：詢問筆記狀況、議價或約定地點</w:t>
+            </w:r>
+            <w:proofErr w:type="gramStart"/>
+            <w:r>
+              <w:rPr>
+                <w:rFonts w:ascii="Times New Roman" w:eastAsia="標楷體" w:hAnsi="Times New Roman" w:cs="Times New Roman" w:hint="eastAsia"/>
+              </w:rPr>
+              <w:t>）</w:t>
+            </w:r>
+            <w:proofErr w:type="gramEnd"/>
+            <w:r>
+              <w:rPr>
+                <w:rFonts w:ascii="Times New Roman" w:eastAsia="標楷體" w:hAnsi="Times New Roman" w:cs="Times New Roman" w:hint="eastAsia"/>
+              </w:rPr>
+              <w:t>。</w:t>
+            </w:r>
+          </w:p>
+          <w:p>
+            <w:pPr>
+              <w:rPr>
+                <w:rFonts w:ascii="Times New Roman" w:eastAsia="標楷體" w:hAnsi="Times New Roman" w:cs="Times New Roman"/>
               </w:rPr>
             </w:pPr>
             <w:r>
@@ -2763,7 +2999,7 @@
           <w:p>
             <w:pPr>
               <w:rPr>
-                <w:rFonts w:ascii="Times New Roman" w:eastAsia="標楷體" w:hAnsi="Times New Roman" w:cs="Times New Roman" w:hint="eastAsia"/>
+                <w:rFonts w:ascii="Times New Roman" w:eastAsia="標楷體" w:hAnsi="Times New Roman" w:cs="Times New Roman"/>
               </w:rPr>
             </w:pPr>
             <w:r>
@@ -2815,95 +3051,109 @@
               <w:rPr>
                 <w:rFonts w:ascii="Times New Roman" w:eastAsia="標楷體" w:hAnsi="Times New Roman" w:cs="Times New Roman" w:hint="eastAsia"/>
               </w:rPr>
+              <w:t>Special Requirements</w:t>
+            </w:r>
+          </w:p>
+        </w:tc>
+        <w:tc>
+          <w:tcPr>
+            <w:tcW w:w="4148" w:type="dxa"/>
+          </w:tcPr>
+          <w:p>
+            <w:pPr>
+              <w:rPr>
+                <w:rFonts w:ascii="Times New Roman" w:eastAsia="標楷體" w:hAnsi="Times New Roman" w:cs="Times New Roman"/>
+              </w:rPr>
+            </w:pPr>
+            <w:r>
+              <w:rPr>
+                <w:rFonts w:ascii="Times New Roman" w:eastAsia="標楷體" w:hAnsi="Times New Roman" w:cs="Times New Roman" w:hint="eastAsia"/>
+              </w:rPr>
+              <w:t>訊息應具備加密保護以確保隱私；訊息傳遞的延遲應控制在</w:t>
+            </w:r>
+            <w:r>
+              <w:rPr>
+                <w:rFonts w:ascii="Times New Roman" w:eastAsia="標楷體" w:hAnsi="Times New Roman" w:cs="Times New Roman" w:hint="eastAsia"/>
+              </w:rPr>
+              <w:t xml:space="preserve"> 1 </w:t>
+            </w:r>
+            <w:r>
+              <w:rPr>
+                <w:rFonts w:ascii="Times New Roman" w:eastAsia="標楷體" w:hAnsi="Times New Roman" w:cs="Times New Roman" w:hint="eastAsia"/>
+              </w:rPr>
+              <w:t>秒內。</w:t>
+            </w:r>
+          </w:p>
+        </w:tc>
+      </w:tr>
+      <w:tr>
+        <w:tc>
+          <w:tcPr>
+            <w:tcW w:w="4148" w:type="dxa"/>
+          </w:tcPr>
+          <w:p>
+            <w:pPr>
+              <w:rPr>
+                <w:rFonts w:ascii="Times New Roman" w:eastAsia="標楷體" w:hAnsi="Times New Roman" w:cs="Times New Roman"/>
+              </w:rPr>
+            </w:pPr>
+            <w:r>
+              <w:rPr>
+                <w:rFonts w:ascii="Times New Roman" w:eastAsia="標楷體" w:hAnsi="Times New Roman" w:cs="Times New Roman" w:hint="eastAsia"/>
+              </w:rPr>
+              <w:t>Technology and Data Variations List</w:t>
+            </w:r>
+          </w:p>
+        </w:tc>
+        <w:tc>
+          <w:tcPr>
+            <w:tcW w:w="4148" w:type="dxa"/>
+          </w:tcPr>
+          <w:p>
+            <w:pPr>
+              <w:rPr>
+                <w:rFonts w:ascii="Times New Roman" w:eastAsia="標楷體" w:hAnsi="Times New Roman" w:cs="Times New Roman"/>
+              </w:rPr>
+            </w:pPr>
+            <w:r>
+              <w:rPr>
+                <w:rFonts w:ascii="Times New Roman" w:eastAsia="標楷體" w:hAnsi="Times New Roman" w:cs="Times New Roman" w:hint="eastAsia"/>
+              </w:rPr>
+              <w:t>支援文字訊息；未來可擴充支援圖片傳送（用於拍攝更詳細的書</w:t>
+            </w:r>
+            <w:proofErr w:type="gramStart"/>
+            <w:r>
+              <w:rPr>
+                <w:rFonts w:ascii="Times New Roman" w:eastAsia="標楷體" w:hAnsi="Times New Roman" w:cs="Times New Roman" w:hint="eastAsia"/>
+              </w:rPr>
+              <w:t>況</w:t>
+            </w:r>
+            <w:proofErr w:type="gramEnd"/>
+            <w:r>
+              <w:rPr>
+                <w:rFonts w:ascii="Times New Roman" w:eastAsia="標楷體" w:hAnsi="Times New Roman" w:cs="Times New Roman" w:hint="eastAsia"/>
+              </w:rPr>
+              <w:t>）。</w:t>
+            </w:r>
+          </w:p>
+        </w:tc>
+      </w:tr>
+      <w:tr>
+        <w:tc>
+          <w:tcPr>
+            <w:tcW w:w="4148" w:type="dxa"/>
+          </w:tcPr>
+          <w:p>
+            <w:pPr>
+              <w:rPr>
+                <w:rFonts w:ascii="Times New Roman" w:eastAsia="標楷體" w:hAnsi="Times New Roman" w:cs="Times New Roman"/>
+              </w:rPr>
+            </w:pPr>
+            <w:r>
+              <w:rPr>
+                <w:rFonts w:ascii="Times New Roman" w:eastAsia="標楷體" w:hAnsi="Times New Roman" w:cs="Times New Roman" w:hint="eastAsia"/>
+              </w:rPr>
               <w:lastRenderedPageBreak/>
-              <w:t>Special Requirements</w:t>
-            </w:r>
-          </w:p>
-        </w:tc>
-        <w:tc>
-          <w:tcPr>
-            <w:tcW w:w="4148" w:type="dxa"/>
-          </w:tcPr>
-          <w:p>
-            <w:pPr>
-              <w:rPr>
-                <w:rFonts w:ascii="Times New Roman" w:eastAsia="標楷體" w:hAnsi="Times New Roman" w:cs="Times New Roman"/>
-              </w:rPr>
-            </w:pPr>
-            <w:r>
-              <w:rPr>
-                <w:rFonts w:ascii="Times New Roman" w:eastAsia="標楷體" w:hAnsi="Times New Roman" w:cs="Times New Roman" w:hint="eastAsia"/>
-              </w:rPr>
-              <w:t>訊息應具備加密保護以確保隱私；訊息傳遞的延遲應控制在</w:t>
-            </w:r>
-            <w:r>
-              <w:rPr>
-                <w:rFonts w:ascii="Times New Roman" w:eastAsia="標楷體" w:hAnsi="Times New Roman" w:cs="Times New Roman" w:hint="eastAsia"/>
-              </w:rPr>
-              <w:t xml:space="preserve"> 1 </w:t>
-            </w:r>
-            <w:r>
-              <w:rPr>
-                <w:rFonts w:ascii="Times New Roman" w:eastAsia="標楷體" w:hAnsi="Times New Roman" w:cs="Times New Roman" w:hint="eastAsia"/>
-              </w:rPr>
-              <w:t>秒內。</w:t>
-            </w:r>
-          </w:p>
-        </w:tc>
-      </w:tr>
-      <w:tr>
-        <w:tc>
-          <w:tcPr>
-            <w:tcW w:w="4148" w:type="dxa"/>
-          </w:tcPr>
-          <w:p>
-            <w:pPr>
-              <w:rPr>
-                <w:rFonts w:ascii="Times New Roman" w:eastAsia="標楷體" w:hAnsi="Times New Roman" w:cs="Times New Roman"/>
-              </w:rPr>
-            </w:pPr>
-            <w:r>
-              <w:rPr>
-                <w:rFonts w:ascii="Times New Roman" w:eastAsia="標楷體" w:hAnsi="Times New Roman" w:cs="Times New Roman" w:hint="eastAsia"/>
-              </w:rPr>
-              <w:t>Technology and Data Variations List</w:t>
-            </w:r>
-          </w:p>
-        </w:tc>
-        <w:tc>
-          <w:tcPr>
-            <w:tcW w:w="4148" w:type="dxa"/>
-          </w:tcPr>
-          <w:p>
-            <w:pPr>
-              <w:rPr>
-                <w:rFonts w:ascii="Times New Roman" w:eastAsia="標楷體" w:hAnsi="Times New Roman" w:cs="Times New Roman"/>
-              </w:rPr>
-            </w:pPr>
-            <w:r>
-              <w:rPr>
-                <w:rFonts w:ascii="Times New Roman" w:eastAsia="標楷體" w:hAnsi="Times New Roman" w:cs="Times New Roman" w:hint="eastAsia"/>
-              </w:rPr>
-              <w:t>支援文字訊息；未來可擴充支援圖片傳送（用於拍攝更詳細的書況）。</w:t>
-            </w:r>
-          </w:p>
-        </w:tc>
-      </w:tr>
-      <w:tr>
-        <w:tc>
-          <w:tcPr>
-            <w:tcW w:w="4148" w:type="dxa"/>
-          </w:tcPr>
-          <w:p>
-            <w:pPr>
-              <w:rPr>
-                <w:rFonts w:ascii="Times New Roman" w:eastAsia="標楷體" w:hAnsi="Times New Roman" w:cs="Times New Roman"/>
-              </w:rPr>
-            </w:pPr>
-            <w:r>
-              <w:rPr>
-                <w:rFonts w:ascii="Times New Roman" w:eastAsia="標楷體" w:hAnsi="Times New Roman" w:cs="Times New Roman" w:hint="eastAsia"/>
-              </w:rPr>
               <w:t>Frequency of Occurrence</w:t>
             </w:r>
           </w:p>
@@ -2990,12 +3240,6 @@
           <w:rFonts w:ascii="Times New Roman" w:eastAsia="標楷體" w:hAnsi="Times New Roman" w:cs="Times New Roman" w:hint="eastAsia"/>
         </w:rPr>
         <w:t>分類管理</w:t>
-      </w:r>
-      <w:r>
-        <w:rPr>
-          <w:rFonts w:ascii="Times New Roman" w:eastAsia="標楷體" w:hAnsi="Times New Roman" w:cs="Times New Roman" w:hint="eastAsia"/>
-        </w:rPr>
-        <w:t xml:space="preserve"> (Categorize Books)</w:t>
       </w:r>
     </w:p>
     <w:tbl>
@@ -3075,12 +3319,16 @@
                 <w:rFonts w:ascii="Times New Roman" w:eastAsia="標楷體" w:hAnsi="Times New Roman" w:cs="Times New Roman"/>
               </w:rPr>
             </w:pPr>
+            <w:proofErr w:type="spellStart"/>
+            <w:proofErr w:type="gramStart"/>
             <w:r>
               <w:rPr>
                 <w:rFonts w:ascii="Times New Roman" w:eastAsia="標楷體" w:hAnsi="Times New Roman" w:cs="Times New Roman" w:hint="eastAsia"/>
               </w:rPr>
               <w:t>Re:Book</w:t>
             </w:r>
+            <w:proofErr w:type="spellEnd"/>
+            <w:proofErr w:type="gramEnd"/>
           </w:p>
         </w:tc>
       </w:tr>
@@ -3249,7 +3497,21 @@
               <w:rPr>
                 <w:rFonts w:ascii="Times New Roman" w:eastAsia="標楷體" w:hAnsi="Times New Roman" w:cs="Times New Roman" w:hint="eastAsia"/>
               </w:rPr>
-              <w:t>賣家必須已登入，且帳號內已上架多本待售書籍。</w:t>
+              <w:t>賣家必須已登入，且帳號內已上架</w:t>
+            </w:r>
+            <w:proofErr w:type="gramStart"/>
+            <w:r>
+              <w:rPr>
+                <w:rFonts w:ascii="Times New Roman" w:eastAsia="標楷體" w:hAnsi="Times New Roman" w:cs="Times New Roman" w:hint="eastAsia"/>
+              </w:rPr>
+              <w:t>多本待售</w:t>
+            </w:r>
+            <w:proofErr w:type="gramEnd"/>
+            <w:r>
+              <w:rPr>
+                <w:rFonts w:ascii="Times New Roman" w:eastAsia="標楷體" w:hAnsi="Times New Roman" w:cs="Times New Roman" w:hint="eastAsia"/>
+              </w:rPr>
+              <w:t>書籍。</w:t>
             </w:r>
           </w:p>
         </w:tc>
@@ -3287,7 +3549,21 @@
               <w:rPr>
                 <w:rFonts w:ascii="Times New Roman" w:eastAsia="標楷體" w:hAnsi="Times New Roman" w:cs="Times New Roman" w:hint="eastAsia"/>
               </w:rPr>
-              <w:t>書籍被正確歸類至指定的分類中，且買家在賣家個人頁面能看到清楚的分類結構。</w:t>
+              <w:t>書籍被正確歸類至指定的分類中，且買家在賣家個人頁面能看到</w:t>
+            </w:r>
+            <w:proofErr w:type="gramStart"/>
+            <w:r>
+              <w:rPr>
+                <w:rFonts w:ascii="Times New Roman" w:eastAsia="標楷體" w:hAnsi="Times New Roman" w:cs="Times New Roman" w:hint="eastAsia"/>
+              </w:rPr>
+              <w:t>清楚的</w:t>
+            </w:r>
+            <w:proofErr w:type="gramEnd"/>
+            <w:r>
+              <w:rPr>
+                <w:rFonts w:ascii="Times New Roman" w:eastAsia="標楷體" w:hAnsi="Times New Roman" w:cs="Times New Roman" w:hint="eastAsia"/>
+              </w:rPr>
+              <w:t>分類結構。</w:t>
             </w:r>
           </w:p>
         </w:tc>
@@ -3318,7 +3594,7 @@
           <w:p>
             <w:pPr>
               <w:rPr>
-                <w:rFonts w:ascii="Times New Roman" w:eastAsia="標楷體" w:hAnsi="Times New Roman" w:cs="Times New Roman" w:hint="eastAsia"/>
+                <w:rFonts w:ascii="Times New Roman" w:eastAsia="標楷體" w:hAnsi="Times New Roman" w:cs="Times New Roman"/>
               </w:rPr>
             </w:pPr>
             <w:r>
@@ -3362,7 +3638,49 @@
               <w:rPr>
                 <w:rFonts w:ascii="Times New Roman" w:eastAsia="標楷體" w:hAnsi="Times New Roman" w:cs="Times New Roman" w:hint="eastAsia"/>
               </w:rPr>
-              <w:t>編輯分類」（如：資工系大一教材、語言學習書）。</w:t>
+              <w:t>編輯分類」</w:t>
+            </w:r>
+            <w:proofErr w:type="gramStart"/>
+            <w:r>
+              <w:rPr>
+                <w:rFonts w:ascii="Times New Roman" w:eastAsia="標楷體" w:hAnsi="Times New Roman" w:cs="Times New Roman" w:hint="eastAsia"/>
+              </w:rPr>
+              <w:t>（</w:t>
+            </w:r>
+            <w:proofErr w:type="gramEnd"/>
+            <w:r>
+              <w:rPr>
+                <w:rFonts w:ascii="Times New Roman" w:eastAsia="標楷體" w:hAnsi="Times New Roman" w:cs="Times New Roman" w:hint="eastAsia"/>
+              </w:rPr>
+              <w:t>如：資工系大</w:t>
+            </w:r>
+            <w:proofErr w:type="gramStart"/>
+            <w:r>
+              <w:rPr>
+                <w:rFonts w:ascii="Times New Roman" w:eastAsia="標楷體" w:hAnsi="Times New Roman" w:cs="Times New Roman" w:hint="eastAsia"/>
+              </w:rPr>
+              <w:t>一</w:t>
+            </w:r>
+            <w:proofErr w:type="gramEnd"/>
+            <w:r>
+              <w:rPr>
+                <w:rFonts w:ascii="Times New Roman" w:eastAsia="標楷體" w:hAnsi="Times New Roman" w:cs="Times New Roman" w:hint="eastAsia"/>
+              </w:rPr>
+              <w:t>教材、語言學習書</w:t>
+            </w:r>
+            <w:proofErr w:type="gramStart"/>
+            <w:r>
+              <w:rPr>
+                <w:rFonts w:ascii="Times New Roman" w:eastAsia="標楷體" w:hAnsi="Times New Roman" w:cs="Times New Roman" w:hint="eastAsia"/>
+              </w:rPr>
+              <w:t>）</w:t>
+            </w:r>
+            <w:proofErr w:type="gramEnd"/>
+            <w:r>
+              <w:rPr>
+                <w:rFonts w:ascii="Times New Roman" w:eastAsia="標楷體" w:hAnsi="Times New Roman" w:cs="Times New Roman" w:hint="eastAsia"/>
+              </w:rPr>
+              <w:t>。</w:t>
             </w:r>
           </w:p>
           <w:p>
@@ -3396,11 +3714,19 @@
               </w:rPr>
               <w:t xml:space="preserve">4. </w:t>
             </w:r>
-            <w:r>
-              <w:rPr>
-                <w:rFonts w:ascii="Times New Roman" w:eastAsia="標楷體" w:hAnsi="Times New Roman" w:cs="Times New Roman" w:hint="eastAsia"/>
-              </w:rPr>
-              <w:t>賣家點擊「確認套用」。</w:t>
+            <w:proofErr w:type="gramStart"/>
+            <w:r>
+              <w:rPr>
+                <w:rFonts w:ascii="Times New Roman" w:eastAsia="標楷體" w:hAnsi="Times New Roman" w:cs="Times New Roman" w:hint="eastAsia"/>
+              </w:rPr>
+              <w:t>賣家點擊</w:t>
+            </w:r>
+            <w:proofErr w:type="gramEnd"/>
+            <w:r>
+              <w:rPr>
+                <w:rFonts w:ascii="Times New Roman" w:eastAsia="標楷體" w:hAnsi="Times New Roman" w:cs="Times New Roman" w:hint="eastAsia"/>
+              </w:rPr>
+              <w:t>「確認套用」。</w:t>
             </w:r>
           </w:p>
           <w:p>
@@ -3450,7 +3776,7 @@
           <w:p>
             <w:pPr>
               <w:rPr>
-                <w:rFonts w:ascii="Times New Roman" w:eastAsia="標楷體" w:hAnsi="Times New Roman" w:cs="Times New Roman" w:hint="eastAsia"/>
+                <w:rFonts w:ascii="Times New Roman" w:eastAsia="標楷體" w:hAnsi="Times New Roman" w:cs="Times New Roman"/>
               </w:rPr>
             </w:pPr>
             <w:r>
@@ -3501,14 +3827,52 @@
               <w:rPr>
                 <w:rFonts w:ascii="Times New Roman" w:eastAsia="標楷體" w:hAnsi="Times New Roman" w:cs="Times New Roman" w:hint="eastAsia"/>
               </w:rPr>
-              <w:t>刪除分類：賣家刪除分類時，系</w:t>
+              <w:t>刪除分類：賣家刪除分類時，系統需確認書籍是否回歸到「未分類」狀態而非直接刪除書籍。</w:t>
+            </w:r>
+          </w:p>
+        </w:tc>
+      </w:tr>
+      <w:tr>
+        <w:tc>
+          <w:tcPr>
+            <w:tcW w:w="4148" w:type="dxa"/>
+          </w:tcPr>
+          <w:p>
+            <w:pPr>
+              <w:rPr>
+                <w:rFonts w:ascii="Times New Roman" w:eastAsia="標楷體" w:hAnsi="Times New Roman" w:cs="Times New Roman"/>
+              </w:rPr>
+            </w:pPr>
+            <w:r>
+              <w:rPr>
+                <w:rFonts w:ascii="Times New Roman" w:eastAsia="標楷體" w:hAnsi="Times New Roman" w:cs="Times New Roman" w:hint="eastAsia"/>
+              </w:rPr>
+              <w:t>Special Requirements</w:t>
+            </w:r>
+          </w:p>
+        </w:tc>
+        <w:tc>
+          <w:tcPr>
+            <w:tcW w:w="4148" w:type="dxa"/>
+          </w:tcPr>
+          <w:p>
+            <w:pPr>
+              <w:rPr>
+                <w:rFonts w:ascii="Times New Roman" w:eastAsia="標楷體" w:hAnsi="Times New Roman" w:cs="Times New Roman"/>
+              </w:rPr>
+            </w:pPr>
+            <w:r>
+              <w:rPr>
+                <w:rFonts w:ascii="Times New Roman" w:eastAsia="標楷體" w:hAnsi="Times New Roman" w:cs="Times New Roman" w:hint="eastAsia"/>
+              </w:rPr>
+              <w:t>支援「批次處理」功能，確保賣家能一次性分類多本書籍，減少重複動</w:t>
             </w:r>
             <w:r>
               <w:rPr>
                 <w:rFonts w:ascii="Times New Roman" w:eastAsia="標楷體" w:hAnsi="Times New Roman" w:cs="Times New Roman" w:hint="eastAsia"/>
               </w:rPr>
               <w:lastRenderedPageBreak/>
-              <w:t>統需確認書籍是否回歸到「未分類」狀態而非直接刪除書籍。</w:t>
+              <w:t>作。</w:t>
             </w:r>
           </w:p>
         </w:tc>
@@ -3529,44 +3893,6 @@
                 <w:rFonts w:ascii="Times New Roman" w:eastAsia="標楷體" w:hAnsi="Times New Roman" w:cs="Times New Roman" w:hint="eastAsia"/>
               </w:rPr>
               <w:lastRenderedPageBreak/>
-              <w:t>Special Requirements</w:t>
-            </w:r>
-          </w:p>
-        </w:tc>
-        <w:tc>
-          <w:tcPr>
-            <w:tcW w:w="4148" w:type="dxa"/>
-          </w:tcPr>
-          <w:p>
-            <w:pPr>
-              <w:rPr>
-                <w:rFonts w:ascii="Times New Roman" w:eastAsia="標楷體" w:hAnsi="Times New Roman" w:cs="Times New Roman"/>
-              </w:rPr>
-            </w:pPr>
-            <w:r>
-              <w:rPr>
-                <w:rFonts w:ascii="Times New Roman" w:eastAsia="標楷體" w:hAnsi="Times New Roman" w:cs="Times New Roman" w:hint="eastAsia"/>
-              </w:rPr>
-              <w:t>支援「批次處理」功能，確保賣家能一次性分類多本書籍，減少重複動作。</w:t>
-            </w:r>
-          </w:p>
-        </w:tc>
-      </w:tr>
-      <w:tr>
-        <w:tc>
-          <w:tcPr>
-            <w:tcW w:w="4148" w:type="dxa"/>
-          </w:tcPr>
-          <w:p>
-            <w:pPr>
-              <w:rPr>
-                <w:rFonts w:ascii="Times New Roman" w:eastAsia="標楷體" w:hAnsi="Times New Roman" w:cs="Times New Roman"/>
-              </w:rPr>
-            </w:pPr>
-            <w:r>
-              <w:rPr>
-                <w:rFonts w:ascii="Times New Roman" w:eastAsia="標楷體" w:hAnsi="Times New Roman" w:cs="Times New Roman" w:hint="eastAsia"/>
-              </w:rPr>
               <w:t>Technology and Data Variations List</w:t>
             </w:r>
           </w:p>
@@ -3585,7 +3911,21 @@
               <w:rPr>
                 <w:rFonts w:ascii="Times New Roman" w:eastAsia="標楷體" w:hAnsi="Times New Roman" w:cs="Times New Roman" w:hint="eastAsia"/>
               </w:rPr>
-              <w:t>系統應預設基礎分類（如：</w:t>
+              <w:t>系統應預設基礎分類</w:t>
+            </w:r>
+            <w:proofErr w:type="gramStart"/>
+            <w:r>
+              <w:rPr>
+                <w:rFonts w:ascii="Times New Roman" w:eastAsia="標楷體" w:hAnsi="Times New Roman" w:cs="Times New Roman" w:hint="eastAsia"/>
+              </w:rPr>
+              <w:t>（</w:t>
+            </w:r>
+            <w:proofErr w:type="gramEnd"/>
+            <w:r>
+              <w:rPr>
+                <w:rFonts w:ascii="Times New Roman" w:eastAsia="標楷體" w:hAnsi="Times New Roman" w:cs="Times New Roman" w:hint="eastAsia"/>
+              </w:rPr>
+              <w:t>如：</w:t>
             </w:r>
             <w:r>
               <w:rPr>
@@ -3597,7 +3937,21 @@
               <w:rPr>
                 <w:rFonts w:ascii="Times New Roman" w:eastAsia="標楷體" w:hAnsi="Times New Roman" w:cs="Times New Roman" w:hint="eastAsia"/>
               </w:rPr>
-              <w:t>自動帶入的類別），並允許賣家自定義標籤（</w:t>
+              <w:t>自動帶入的類別</w:t>
+            </w:r>
+            <w:proofErr w:type="gramStart"/>
+            <w:r>
+              <w:rPr>
+                <w:rFonts w:ascii="Times New Roman" w:eastAsia="標楷體" w:hAnsi="Times New Roman" w:cs="Times New Roman" w:hint="eastAsia"/>
+              </w:rPr>
+              <w:t>）</w:t>
+            </w:r>
+            <w:proofErr w:type="gramEnd"/>
+            <w:r>
+              <w:rPr>
+                <w:rFonts w:ascii="Times New Roman" w:eastAsia="標楷體" w:hAnsi="Times New Roman" w:cs="Times New Roman" w:hint="eastAsia"/>
+              </w:rPr>
+              <w:t>，並允許賣家自定義標籤（</w:t>
             </w:r>
             <w:r>
               <w:rPr>
@@ -3800,12 +4154,16 @@
                 <w:rFonts w:ascii="Times New Roman" w:eastAsia="標楷體" w:hAnsi="Times New Roman" w:cs="Times New Roman"/>
               </w:rPr>
             </w:pPr>
+            <w:proofErr w:type="spellStart"/>
+            <w:proofErr w:type="gramStart"/>
             <w:r>
               <w:rPr>
                 <w:rFonts w:ascii="Times New Roman" w:eastAsia="標楷體" w:hAnsi="Times New Roman" w:cs="Times New Roman"/>
               </w:rPr>
               <w:t>Re:Book</w:t>
             </w:r>
+            <w:proofErr w:type="spellEnd"/>
+            <w:proofErr w:type="gramEnd"/>
           </w:p>
         </w:tc>
       </w:tr>
@@ -4012,7 +4370,35 @@
               <w:rPr>
                 <w:rFonts w:ascii="Times New Roman" w:eastAsia="標楷體" w:hAnsi="Times New Roman" w:cs="Times New Roman" w:hint="eastAsia"/>
               </w:rPr>
-              <w:t>書籍成功加入買家的個人清單，且系統能即時反映該書籍的最新狀態（如：是否已被他人買走）。</w:t>
+              <w:t>書籍成功加入買家的個人清單，且系統能即時反映該書籍的最新狀態</w:t>
+            </w:r>
+            <w:proofErr w:type="gramStart"/>
+            <w:r>
+              <w:rPr>
+                <w:rFonts w:ascii="Times New Roman" w:eastAsia="標楷體" w:hAnsi="Times New Roman" w:cs="Times New Roman" w:hint="eastAsia"/>
+              </w:rPr>
+              <w:t>（</w:t>
+            </w:r>
+            <w:proofErr w:type="gramEnd"/>
+            <w:r>
+              <w:rPr>
+                <w:rFonts w:ascii="Times New Roman" w:eastAsia="標楷體" w:hAnsi="Times New Roman" w:cs="Times New Roman" w:hint="eastAsia"/>
+              </w:rPr>
+              <w:t>如：是否已被他人買走</w:t>
+            </w:r>
+            <w:proofErr w:type="gramStart"/>
+            <w:r>
+              <w:rPr>
+                <w:rFonts w:ascii="Times New Roman" w:eastAsia="標楷體" w:hAnsi="Times New Roman" w:cs="Times New Roman" w:hint="eastAsia"/>
+              </w:rPr>
+              <w:t>）</w:t>
+            </w:r>
+            <w:proofErr w:type="gramEnd"/>
+            <w:r>
+              <w:rPr>
+                <w:rFonts w:ascii="Times New Roman" w:eastAsia="標楷體" w:hAnsi="Times New Roman" w:cs="Times New Roman" w:hint="eastAsia"/>
+              </w:rPr>
+              <w:t>。</w:t>
             </w:r>
           </w:p>
         </w:tc>
@@ -4043,7 +4429,7 @@
           <w:p>
             <w:pPr>
               <w:rPr>
-                <w:rFonts w:ascii="Times New Roman" w:eastAsia="標楷體" w:hAnsi="Times New Roman" w:cs="Times New Roman" w:hint="eastAsia"/>
+                <w:rFonts w:ascii="Times New Roman" w:eastAsia="標楷體" w:hAnsi="Times New Roman" w:cs="Times New Roman"/>
               </w:rPr>
             </w:pPr>
             <w:r>
@@ -4056,7 +4442,21 @@
               <w:rPr>
                 <w:rFonts w:ascii="Times New Roman" w:eastAsia="標楷體" w:hAnsi="Times New Roman" w:cs="Times New Roman" w:hint="eastAsia"/>
               </w:rPr>
-              <w:t>買家在搜尋結果或書籍詳情頁點擊「加入清單」。</w:t>
+              <w:t>買家在搜尋結果或書籍</w:t>
+            </w:r>
+            <w:proofErr w:type="gramStart"/>
+            <w:r>
+              <w:rPr>
+                <w:rFonts w:ascii="Times New Roman" w:eastAsia="標楷體" w:hAnsi="Times New Roman" w:cs="Times New Roman" w:hint="eastAsia"/>
+              </w:rPr>
+              <w:t>詳情頁點擊</w:t>
+            </w:r>
+            <w:proofErr w:type="gramEnd"/>
+            <w:r>
+              <w:rPr>
+                <w:rFonts w:ascii="Times New Roman" w:eastAsia="標楷體" w:hAnsi="Times New Roman" w:cs="Times New Roman" w:hint="eastAsia"/>
+              </w:rPr>
+              <w:t>「加入清單」。</w:t>
             </w:r>
           </w:p>
           <w:p>
@@ -4113,7 +4513,21 @@
               <w:rPr>
                 <w:rFonts w:ascii="Times New Roman" w:eastAsia="標楷體" w:hAnsi="Times New Roman" w:cs="Times New Roman" w:hint="eastAsia"/>
               </w:rPr>
-              <w:t>買家可從清單中直接發起私訊或進行最終確認。</w:t>
+              <w:t>買家可從清單中直接</w:t>
+            </w:r>
+            <w:proofErr w:type="gramStart"/>
+            <w:r>
+              <w:rPr>
+                <w:rFonts w:ascii="Times New Roman" w:eastAsia="標楷體" w:hAnsi="Times New Roman" w:cs="Times New Roman" w:hint="eastAsia"/>
+              </w:rPr>
+              <w:t>發起私訊或</w:t>
+            </w:r>
+            <w:proofErr w:type="gramEnd"/>
+            <w:r>
+              <w:rPr>
+                <w:rFonts w:ascii="Times New Roman" w:eastAsia="標楷體" w:hAnsi="Times New Roman" w:cs="Times New Roman" w:hint="eastAsia"/>
+              </w:rPr>
+              <w:t>進行最終確認。</w:t>
             </w:r>
           </w:p>
         </w:tc>
@@ -4144,7 +4558,7 @@
           <w:p>
             <w:pPr>
               <w:rPr>
-                <w:rFonts w:ascii="Times New Roman" w:eastAsia="標楷體" w:hAnsi="Times New Roman" w:cs="Times New Roman" w:hint="eastAsia"/>
+                <w:rFonts w:ascii="Times New Roman" w:eastAsia="標楷體" w:hAnsi="Times New Roman" w:cs="Times New Roman"/>
               </w:rPr>
             </w:pPr>
             <w:r>
@@ -4169,45 +4583,39 @@
               <w:rPr>
                 <w:rFonts w:ascii="Times New Roman" w:eastAsia="標楷體" w:hAnsi="Times New Roman" w:cs="Times New Roman" w:hint="eastAsia"/>
               </w:rPr>
-              <w:t>售出：系統提示該商</w:t>
-            </w:r>
+              <w:t>售出：系統提示該商品已失效，並自動從清單中標註或移除。</w:t>
+            </w:r>
+          </w:p>
+          <w:p>
+            <w:pPr>
+              <w:rPr>
+                <w:rFonts w:ascii="Times New Roman" w:eastAsia="標楷體" w:hAnsi="Times New Roman" w:cs="Times New Roman"/>
+              </w:rPr>
+            </w:pPr>
+            <w:r>
+              <w:rPr>
+                <w:rFonts w:ascii="Times New Roman" w:eastAsia="標楷體" w:hAnsi="Times New Roman" w:cs="Times New Roman" w:hint="eastAsia"/>
+              </w:rPr>
+              <w:t xml:space="preserve">3a. </w:t>
+            </w:r>
+            <w:r>
+              <w:rPr>
+                <w:rFonts w:ascii="Times New Roman" w:eastAsia="標楷體" w:hAnsi="Times New Roman" w:cs="Times New Roman" w:hint="eastAsia"/>
+              </w:rPr>
+              <w:t>移除書籍：買家從清單中手動刪除不再感興趣的書籍。</w:t>
+            </w:r>
+          </w:p>
+          <w:p>
+            <w:pPr>
+              <w:rPr>
+                <w:rFonts w:ascii="Times New Roman" w:eastAsia="標楷體" w:hAnsi="Times New Roman" w:cs="Times New Roman"/>
+              </w:rPr>
+            </w:pPr>
             <w:r>
               <w:rPr>
                 <w:rFonts w:ascii="Times New Roman" w:eastAsia="標楷體" w:hAnsi="Times New Roman" w:cs="Times New Roman" w:hint="eastAsia"/>
               </w:rPr>
               <w:lastRenderedPageBreak/>
-              <w:t>品已失效，並自動從清單中標註或移除。</w:t>
-            </w:r>
-          </w:p>
-          <w:p>
-            <w:pPr>
-              <w:rPr>
-                <w:rFonts w:ascii="Times New Roman" w:eastAsia="標楷體" w:hAnsi="Times New Roman" w:cs="Times New Roman"/>
-              </w:rPr>
-            </w:pPr>
-            <w:r>
-              <w:rPr>
-                <w:rFonts w:ascii="Times New Roman" w:eastAsia="標楷體" w:hAnsi="Times New Roman" w:cs="Times New Roman" w:hint="eastAsia"/>
-              </w:rPr>
-              <w:t xml:space="preserve">3a. </w:t>
-            </w:r>
-            <w:r>
-              <w:rPr>
-                <w:rFonts w:ascii="Times New Roman" w:eastAsia="標楷體" w:hAnsi="Times New Roman" w:cs="Times New Roman" w:hint="eastAsia"/>
-              </w:rPr>
-              <w:t>移除書籍：買家從清單中手動刪除不再感興趣的書籍。</w:t>
-            </w:r>
-          </w:p>
-          <w:p>
-            <w:pPr>
-              <w:rPr>
-                <w:rFonts w:ascii="Times New Roman" w:eastAsia="標楷體" w:hAnsi="Times New Roman" w:cs="Times New Roman"/>
-              </w:rPr>
-            </w:pPr>
-            <w:r>
-              <w:rPr>
-                <w:rFonts w:ascii="Times New Roman" w:eastAsia="標楷體" w:hAnsi="Times New Roman" w:cs="Times New Roman" w:hint="eastAsia"/>
-              </w:rPr>
               <w:t xml:space="preserve">4a. </w:t>
             </w:r>
             <w:r>
@@ -4549,7 +4957,7 @@
           <w:p>
             <w:pPr>
               <w:rPr>
-                <w:rFonts w:ascii="Times New Roman" w:eastAsia="標楷體" w:hAnsi="Times New Roman" w:cs="Times New Roman" w:hint="eastAsia"/>
+                <w:rFonts w:ascii="Times New Roman" w:eastAsia="標楷體" w:hAnsi="Times New Roman" w:cs="Times New Roman"/>
               </w:rPr>
             </w:pPr>
             <w:r>
@@ -4623,7 +5031,7 @@
           <w:p>
             <w:pPr>
               <w:rPr>
-                <w:rFonts w:ascii="Times New Roman" w:eastAsia="標楷體" w:hAnsi="Times New Roman" w:cs="Times New Roman" w:hint="eastAsia"/>
+                <w:rFonts w:ascii="Times New Roman" w:eastAsia="標楷體" w:hAnsi="Times New Roman" w:cs="Times New Roman"/>
               </w:rPr>
             </w:pPr>
             <w:r>
@@ -4668,11 +5076,19 @@
                 <w:rFonts w:ascii="Times New Roman" w:eastAsia="標楷體" w:hAnsi="Times New Roman" w:cs="Times New Roman"/>
               </w:rPr>
             </w:pPr>
-            <w:r>
-              <w:rPr>
-                <w:rFonts w:ascii="Times New Roman" w:eastAsia="標楷體" w:hAnsi="Times New Roman" w:cs="Times New Roman" w:hint="eastAsia"/>
-              </w:rPr>
-              <w:t>私訊傳遞的延遲時間應小於</w:t>
+            <w:proofErr w:type="gramStart"/>
+            <w:r>
+              <w:rPr>
+                <w:rFonts w:ascii="Times New Roman" w:eastAsia="標楷體" w:hAnsi="Times New Roman" w:cs="Times New Roman" w:hint="eastAsia"/>
+              </w:rPr>
+              <w:t>私訊傳遞</w:t>
+            </w:r>
+            <w:proofErr w:type="gramEnd"/>
+            <w:r>
+              <w:rPr>
+                <w:rFonts w:ascii="Times New Roman" w:eastAsia="標楷體" w:hAnsi="Times New Roman" w:cs="Times New Roman" w:hint="eastAsia"/>
+              </w:rPr>
+              <w:t>的延遲時間應小於</w:t>
             </w:r>
             <w:r>
               <w:rPr>
@@ -4697,7 +5113,7 @@
           <w:p>
             <w:pPr>
               <w:rPr>
-                <w:rFonts w:ascii="Times New Roman" w:eastAsia="標楷體" w:hAnsi="Times New Roman" w:cs="Times New Roman" w:hint="eastAsia"/>
+                <w:rFonts w:ascii="Times New Roman" w:eastAsia="標楷體" w:hAnsi="Times New Roman" w:cs="Times New Roman"/>
               </w:rPr>
             </w:pPr>
             <w:r>
@@ -4783,7 +5199,7 @@
           <w:p>
             <w:pPr>
               <w:rPr>
-                <w:rFonts w:ascii="Times New Roman" w:eastAsia="標楷體" w:hAnsi="Times New Roman" w:cs="Times New Roman" w:hint="eastAsia"/>
+                <w:rFonts w:ascii="Times New Roman" w:eastAsia="標楷體" w:hAnsi="Times New Roman" w:cs="Times New Roman"/>
               </w:rPr>
             </w:pPr>
             <w:r>
@@ -4869,7 +5285,7 @@
           <w:p>
             <w:pPr>
               <w:rPr>
-                <w:rFonts w:ascii="Times New Roman" w:eastAsia="標楷體" w:hAnsi="Times New Roman" w:cs="Times New Roman" w:hint="eastAsia"/>
+                <w:rFonts w:ascii="Times New Roman" w:eastAsia="標楷體" w:hAnsi="Times New Roman" w:cs="Times New Roman"/>
               </w:rPr>
             </w:pPr>
             <w:r>
@@ -4918,7 +5334,35 @@
               <w:rPr>
                 <w:rFonts w:ascii="Times New Roman" w:eastAsia="標楷體" w:hAnsi="Times New Roman" w:cs="Times New Roman" w:hint="eastAsia"/>
               </w:rPr>
-              <w:t>敏感的使用者個資與私訊對話內容，必須經過安全加密處理。</w:t>
+              <w:t>敏感的使用者</w:t>
+            </w:r>
+            <w:proofErr w:type="gramStart"/>
+            <w:r>
+              <w:rPr>
+                <w:rFonts w:ascii="Times New Roman" w:eastAsia="標楷體" w:hAnsi="Times New Roman" w:cs="Times New Roman" w:hint="eastAsia"/>
+              </w:rPr>
+              <w:t>個</w:t>
+            </w:r>
+            <w:proofErr w:type="gramEnd"/>
+            <w:r>
+              <w:rPr>
+                <w:rFonts w:ascii="Times New Roman" w:eastAsia="標楷體" w:hAnsi="Times New Roman" w:cs="Times New Roman" w:hint="eastAsia"/>
+              </w:rPr>
+              <w:t>資</w:t>
+            </w:r>
+            <w:proofErr w:type="gramStart"/>
+            <w:r>
+              <w:rPr>
+                <w:rFonts w:ascii="Times New Roman" w:eastAsia="標楷體" w:hAnsi="Times New Roman" w:cs="Times New Roman" w:hint="eastAsia"/>
+              </w:rPr>
+              <w:t>與私訊對話</w:t>
+            </w:r>
+            <w:proofErr w:type="gramEnd"/>
+            <w:r>
+              <w:rPr>
+                <w:rFonts w:ascii="Times New Roman" w:eastAsia="標楷體" w:hAnsi="Times New Roman" w:cs="Times New Roman" w:hint="eastAsia"/>
+              </w:rPr>
+              <w:t>內容，必須經過安全加密處理。</w:t>
             </w:r>
           </w:p>
         </w:tc>
@@ -4931,7 +5375,7 @@
           <w:p>
             <w:pPr>
               <w:rPr>
-                <w:rFonts w:ascii="Times New Roman" w:eastAsia="標楷體" w:hAnsi="Times New Roman" w:cs="Times New Roman" w:hint="eastAsia"/>
+                <w:rFonts w:ascii="Times New Roman" w:eastAsia="標楷體" w:hAnsi="Times New Roman" w:cs="Times New Roman"/>
               </w:rPr>
             </w:pPr>
             <w:r>
@@ -4980,19 +5424,61 @@
               <w:rPr>
                 <w:rFonts w:ascii="Times New Roman" w:eastAsia="標楷體" w:hAnsi="Times New Roman" w:cs="Times New Roman" w:hint="eastAsia"/>
               </w:rPr>
-              <w:t>系統必須要求使用有效的學校電子郵件信箱（例如</w:t>
-            </w:r>
-            <w:r>
-              <w:rPr>
-                <w:rFonts w:ascii="Times New Roman" w:eastAsia="標楷體" w:hAnsi="Times New Roman" w:cs="Times New Roman" w:hint="eastAsia"/>
-              </w:rPr>
-              <w:t xml:space="preserve"> .edu </w:t>
-            </w:r>
-            <w:r>
-              <w:rPr>
-                <w:rFonts w:ascii="Times New Roman" w:eastAsia="標楷體" w:hAnsi="Times New Roman" w:cs="Times New Roman" w:hint="eastAsia"/>
-              </w:rPr>
-              <w:t>網域）進行身分驗證註冊。</w:t>
+              <w:t>系統必須要求使用有效的學校電子郵件信箱</w:t>
+            </w:r>
+            <w:proofErr w:type="gramStart"/>
+            <w:r>
+              <w:rPr>
+                <w:rFonts w:ascii="Times New Roman" w:eastAsia="標楷體" w:hAnsi="Times New Roman" w:cs="Times New Roman" w:hint="eastAsia"/>
+              </w:rPr>
+              <w:t>（</w:t>
+            </w:r>
+            <w:proofErr w:type="gramEnd"/>
+            <w:r>
+              <w:rPr>
+                <w:rFonts w:ascii="Times New Roman" w:eastAsia="標楷體" w:hAnsi="Times New Roman" w:cs="Times New Roman" w:hint="eastAsia"/>
+              </w:rPr>
+              <w:t>例如</w:t>
+            </w:r>
+            <w:r>
+              <w:rPr>
+                <w:rFonts w:ascii="Times New Roman" w:eastAsia="標楷體" w:hAnsi="Times New Roman" w:cs="Times New Roman" w:hint="eastAsia"/>
+              </w:rPr>
+              <w:t xml:space="preserve"> .</w:t>
+            </w:r>
+            <w:proofErr w:type="spellStart"/>
+            <w:r>
+              <w:rPr>
+                <w:rFonts w:ascii="Times New Roman" w:eastAsia="標楷體" w:hAnsi="Times New Roman" w:cs="Times New Roman" w:hint="eastAsia"/>
+              </w:rPr>
+              <w:t>edu</w:t>
+            </w:r>
+            <w:proofErr w:type="spellEnd"/>
+            <w:r>
+              <w:rPr>
+                <w:rFonts w:ascii="Times New Roman" w:eastAsia="標楷體" w:hAnsi="Times New Roman" w:cs="Times New Roman" w:hint="eastAsia"/>
+              </w:rPr>
+              <w:t xml:space="preserve"> </w:t>
+            </w:r>
+            <w:r>
+              <w:rPr>
+                <w:rFonts w:ascii="Times New Roman" w:eastAsia="標楷體" w:hAnsi="Times New Roman" w:cs="Times New Roman" w:hint="eastAsia"/>
+              </w:rPr>
+              <w:t>網域</w:t>
+            </w:r>
+            <w:proofErr w:type="gramStart"/>
+            <w:r>
+              <w:rPr>
+                <w:rFonts w:ascii="Times New Roman" w:eastAsia="標楷體" w:hAnsi="Times New Roman" w:cs="Times New Roman" w:hint="eastAsia"/>
+              </w:rPr>
+              <w:t>）</w:t>
+            </w:r>
+            <w:proofErr w:type="gramEnd"/>
+            <w:r>
+              <w:rPr>
+                <w:rFonts w:ascii="Times New Roman" w:eastAsia="標楷體" w:hAnsi="Times New Roman" w:cs="Times New Roman" w:hint="eastAsia"/>
+              </w:rPr>
+              <w:t>進行身分驗證註冊。</w:t>
             </w:r>
           </w:p>
         </w:tc>
@@ -5005,7 +5491,7 @@
           <w:p>
             <w:pPr>
               <w:rPr>
-                <w:rFonts w:ascii="Times New Roman" w:eastAsia="標楷體" w:hAnsi="Times New Roman" w:cs="Times New Roman" w:hint="eastAsia"/>
+                <w:rFonts w:ascii="Times New Roman" w:eastAsia="標楷體" w:hAnsi="Times New Roman" w:cs="Times New Roman"/>
               </w:rPr>
             </w:pPr>
             <w:r>
@@ -5079,7 +5565,7 @@
           <w:p>
             <w:pPr>
               <w:rPr>
-                <w:rFonts w:ascii="Times New Roman" w:eastAsia="標楷體" w:hAnsi="Times New Roman" w:cs="Times New Roman" w:hint="eastAsia"/>
+                <w:rFonts w:ascii="Times New Roman" w:eastAsia="標楷體" w:hAnsi="Times New Roman" w:cs="Times New Roman"/>
               </w:rPr>
             </w:pPr>
             <w:r>
@@ -6334,6 +6820,7 @@
   <w:style w:type="character" w:default="1" w:styleId="a0">
     <w:name w:val="Default Paragraph Font"/>
     <w:uiPriority w:val="1"/>
+    <w:semiHidden/>
     <w:unhideWhenUsed/>
   </w:style>
   <w:style w:type="table" w:default="1" w:styleId="a1">

</xml_diff>

<commit_message>
doc: add `Glossary` and revise descriptions in `Use Case`
</commit_message>
<xml_diff>
--- a/document/hw2.docx
+++ b/document/hw2.docx
@@ -1,6 +1,6 @@
 
 <file path=word/document.xml><?xml version="1.0" encoding="utf-8"?>
-<w:document xmlns:wpc="http://schemas.microsoft.com/office/word/2010/wordprocessingCanvas" xmlns:cx="http://schemas.microsoft.com/office/drawing/2014/chartex" xmlns:cx1="http://schemas.microsoft.com/office/drawing/2015/9/8/chartex" xmlns:cx2="http://schemas.microsoft.com/office/drawing/2015/10/21/chartex" xmlns:cx3="http://schemas.microsoft.com/office/drawing/2016/5/9/chartex" xmlns:cx4="http://schemas.microsoft.com/office/drawing/2016/5/10/chartex" xmlns:cx5="http://schemas.microsoft.com/office/drawing/2016/5/11/chartex" xmlns:cx6="http://schemas.microsoft.com/office/drawing/2016/5/12/chartex" xmlns:cx7="http://schemas.microsoft.com/office/drawing/2016/5/13/chartex" xmlns:cx8="http://schemas.microsoft.com/office/drawing/2016/5/14/chartex" xmlns:mc="http://schemas.openxmlformats.org/markup-compatibility/2006" xmlns:aink="http://schemas.microsoft.com/office/drawing/2016/ink" xmlns:am3d="http://schemas.microsoft.com/office/drawing/2017/model3d" xmlns:o="urn:schemas-microsoft-com:office:office" xmlns:oel="http://schemas.microsoft.com/office/2019/extlst" xmlns:r="http://schemas.openxmlformats.org/officeDocument/2006/relationships" xmlns:m="http://schemas.openxmlformats.org/officeDocument/2006/math" xmlns:v="urn:schemas-microsoft-com:vml" xmlns:wp14="http://schemas.microsoft.com/office/word/2010/wordprocessingDrawing" xmlns:wp="http://schemas.openxmlformats.org/drawingml/2006/wordprocessingDrawing" xmlns:w10="urn:schemas-microsoft-com:office:word" xmlns:w="http://schemas.openxmlformats.org/wordprocessingml/2006/main" xmlns:w14="http://schemas.microsoft.com/office/word/2010/wordml" xmlns:w15="http://schemas.microsoft.com/office/word/2012/wordml" xmlns:w16cex="http://schemas.microsoft.com/office/word/2018/wordml/cex" xmlns:w16cid="http://schemas.microsoft.com/office/word/2016/wordml/cid" xmlns:w16="http://schemas.microsoft.com/office/word/2018/wordml" xmlns:w16sdtdh="http://schemas.microsoft.com/office/word/2020/wordml/sdtdatahash" xmlns:w16se="http://schemas.microsoft.com/office/word/2015/wordml/symex" xmlns:wpg="http://schemas.microsoft.com/office/word/2010/wordprocessingGroup" xmlns:wpi="http://schemas.microsoft.com/office/word/2010/wordprocessingInk" xmlns:wne="http://schemas.microsoft.com/office/word/2006/wordml" xmlns:wps="http://schemas.microsoft.com/office/word/2010/wordprocessingShape" mc:Ignorable="w14 w15 w16se w16cid w16 w16cex w16sdtdh wp14">
+<w:document xmlns:wpc="http://schemas.microsoft.com/office/word/2010/wordprocessingCanvas" xmlns:cx="http://schemas.microsoft.com/office/drawing/2014/chartex" xmlns:cx1="http://schemas.microsoft.com/office/drawing/2015/9/8/chartex" xmlns:cx2="http://schemas.microsoft.com/office/drawing/2015/10/21/chartex" xmlns:cx3="http://schemas.microsoft.com/office/drawing/2016/5/9/chartex" xmlns:cx4="http://schemas.microsoft.com/office/drawing/2016/5/10/chartex" xmlns:cx5="http://schemas.microsoft.com/office/drawing/2016/5/11/chartex" xmlns:cx6="http://schemas.microsoft.com/office/drawing/2016/5/12/chartex" xmlns:cx7="http://schemas.microsoft.com/office/drawing/2016/5/13/chartex" xmlns:cx8="http://schemas.microsoft.com/office/drawing/2016/5/14/chartex" xmlns:mc="http://schemas.openxmlformats.org/markup-compatibility/2006" xmlns:aink="http://schemas.microsoft.com/office/drawing/2016/ink" xmlns:am3d="http://schemas.microsoft.com/office/drawing/2017/model3d" xmlns:o="urn:schemas-microsoft-com:office:office" xmlns:oel="http://schemas.microsoft.com/office/2019/extlst" xmlns:r="http://schemas.openxmlformats.org/officeDocument/2006/relationships" xmlns:m="http://schemas.openxmlformats.org/officeDocument/2006/math" xmlns:v="urn:schemas-microsoft-com:vml" xmlns:wp14="http://schemas.microsoft.com/office/word/2010/wordprocessingDrawing" xmlns:wp="http://schemas.openxmlformats.org/drawingml/2006/wordprocessingDrawing" xmlns:w10="urn:schemas-microsoft-com:office:word" xmlns:w="http://schemas.openxmlformats.org/wordprocessingml/2006/main" xmlns:w14="http://schemas.microsoft.com/office/word/2010/wordml" xmlns:w15="http://schemas.microsoft.com/office/word/2012/wordml" xmlns:w16cex="http://schemas.microsoft.com/office/word/2018/wordml/cex" xmlns:w16cid="http://schemas.microsoft.com/office/word/2016/wordml/cid" xmlns:w16="http://schemas.microsoft.com/office/word/2018/wordml" xmlns:w16du="http://schemas.microsoft.com/office/word/2023/wordml/word16du" xmlns:w16sdtdh="http://schemas.microsoft.com/office/word/2020/wordml/sdtdatahash" xmlns:w16sdtfl="http://schemas.microsoft.com/office/word/2024/wordml/sdtformatlock" xmlns:w16se="http://schemas.microsoft.com/office/word/2015/wordml/symex" xmlns:wpg="http://schemas.microsoft.com/office/word/2010/wordprocessingGroup" xmlns:wpi="http://schemas.microsoft.com/office/word/2010/wordprocessingInk" xmlns:wne="http://schemas.microsoft.com/office/word/2006/wordml" xmlns:wps="http://schemas.microsoft.com/office/word/2010/wordprocessingShape" mc:Ignorable="w14 w15 w16se w16cid w16 w16cex w16sdtdh w16sdtfl w16du wp14">
   <w:body>
     <w:p>
       <w:pPr>
@@ -83,8 +83,6 @@
           <w:szCs w:val="52"/>
         </w:rPr>
       </w:pPr>
-      <w:proofErr w:type="spellStart"/>
-      <w:proofErr w:type="gramStart"/>
       <w:r>
         <w:rPr>
           <w:rFonts w:ascii="Times New Roman" w:eastAsia="標楷體" w:hAnsi="Times New Roman" w:cs="Times New Roman" w:hint="eastAsia"/>
@@ -95,8 +93,6 @@
         </w:rPr>
         <w:t>Re:Book</w:t>
       </w:r>
-      <w:proofErr w:type="spellEnd"/>
-      <w:proofErr w:type="gramEnd"/>
     </w:p>
     <w:p>
       <w:pPr>
@@ -201,23 +197,21 @@
           <w:szCs w:val="40"/>
         </w:rPr>
       </w:pPr>
-      <w:proofErr w:type="gramStart"/>
       <w:r>
         <w:rPr>
           <w:rFonts w:ascii="Times New Roman" w:eastAsia="標楷體" w:hAnsi="Times New Roman" w:cs="Times New Roman"/>
           <w:sz w:val="40"/>
           <w:szCs w:val="40"/>
         </w:rPr>
-        <w:t>資工碩</w:t>
+        <w:t>資工碩二</w:t>
       </w:r>
-      <w:proofErr w:type="gramEnd"/>
       <w:r>
         <w:rPr>
           <w:rFonts w:ascii="Times New Roman" w:eastAsia="標楷體" w:hAnsi="Times New Roman" w:cs="Times New Roman"/>
           <w:sz w:val="40"/>
           <w:szCs w:val="40"/>
         </w:rPr>
-        <w:t>二</w:t>
+        <w:t xml:space="preserve"> 113598037 </w:t>
       </w:r>
       <w:r>
         <w:rPr>
@@ -225,54 +219,26 @@
           <w:sz w:val="40"/>
           <w:szCs w:val="40"/>
         </w:rPr>
-        <w:t xml:space="preserve"> 113598037 </w:t>
+        <w:t>陳宥錡</w:t>
       </w:r>
-      <w:r>
+    </w:p>
+    <w:p>
+      <w:pPr>
+        <w:jc w:val="center"/>
         <w:rPr>
           <w:rFonts w:ascii="Times New Roman" w:eastAsia="標楷體" w:hAnsi="Times New Roman" w:cs="Times New Roman"/>
           <w:sz w:val="40"/>
           <w:szCs w:val="40"/>
         </w:rPr>
-        <w:t>陳</w:t>
-      </w:r>
-      <w:proofErr w:type="gramStart"/>
+      </w:pPr>
       <w:r>
         <w:rPr>
           <w:rFonts w:ascii="Times New Roman" w:eastAsia="標楷體" w:hAnsi="Times New Roman" w:cs="Times New Roman"/>
           <w:sz w:val="40"/>
           <w:szCs w:val="40"/>
         </w:rPr>
-        <w:t>宥錡</w:t>
+        <w:t>資工碩一</w:t>
       </w:r>
-      <w:proofErr w:type="gramEnd"/>
-    </w:p>
-    <w:p>
-      <w:pPr>
-        <w:jc w:val="center"/>
-        <w:rPr>
-          <w:rFonts w:ascii="Times New Roman" w:eastAsia="標楷體" w:hAnsi="Times New Roman" w:cs="Times New Roman"/>
-          <w:sz w:val="40"/>
-          <w:szCs w:val="40"/>
-        </w:rPr>
-      </w:pPr>
-      <w:r>
-        <w:rPr>
-          <w:rFonts w:ascii="Times New Roman" w:eastAsia="標楷體" w:hAnsi="Times New Roman" w:cs="Times New Roman"/>
-          <w:sz w:val="40"/>
-          <w:szCs w:val="40"/>
-        </w:rPr>
-        <w:t>資工碩</w:t>
-      </w:r>
-      <w:proofErr w:type="gramStart"/>
-      <w:r>
-        <w:rPr>
-          <w:rFonts w:ascii="Times New Roman" w:eastAsia="標楷體" w:hAnsi="Times New Roman" w:cs="Times New Roman"/>
-          <w:sz w:val="40"/>
-          <w:szCs w:val="40"/>
-        </w:rPr>
-        <w:t>一</w:t>
-      </w:r>
-      <w:proofErr w:type="gramEnd"/>
       <w:r>
         <w:rPr>
           <w:rFonts w:ascii="Times New Roman" w:eastAsia="標楷體" w:hAnsi="Times New Roman" w:cs="Times New Roman"/>
@@ -391,14 +357,12 @@
           <w:rFonts w:ascii="Times New Roman" w:eastAsia="標楷體" w:hAnsi="Times New Roman" w:cs="Times New Roman"/>
         </w:rPr>
       </w:pPr>
-      <w:proofErr w:type="spellStart"/>
       <w:r>
         <w:rPr>
           <w:rFonts w:ascii="Times New Roman" w:eastAsia="標楷體" w:hAnsi="Times New Roman" w:cs="Times New Roman"/>
         </w:rPr>
         <w:t>Re:Book</w:t>
       </w:r>
-      <w:proofErr w:type="spellEnd"/>
       <w:r>
         <w:rPr>
           <w:rFonts w:ascii="Times New Roman" w:eastAsia="標楷體" w:hAnsi="Times New Roman" w:cs="Times New Roman"/>
@@ -412,19 +376,11 @@
           <w:rFonts w:ascii="Times New Roman" w:eastAsia="標楷體" w:hAnsi="Times New Roman" w:cs="Times New Roman"/>
         </w:rPr>
       </w:pPr>
-      <w:proofErr w:type="spellStart"/>
       <w:r>
         <w:rPr>
           <w:rFonts w:ascii="Times New Roman" w:eastAsia="標楷體" w:hAnsi="Times New Roman" w:cs="Times New Roman" w:hint="eastAsia"/>
         </w:rPr>
-        <w:t>Re:Book</w:t>
-      </w:r>
-      <w:proofErr w:type="spellEnd"/>
-      <w:r>
-        <w:rPr>
-          <w:rFonts w:ascii="Times New Roman" w:eastAsia="標楷體" w:hAnsi="Times New Roman" w:cs="Times New Roman" w:hint="eastAsia"/>
-        </w:rPr>
-        <w:t xml:space="preserve"> </w:t>
+        <w:t xml:space="preserve">Re:Book </w:t>
       </w:r>
       <w:r>
         <w:rPr>
@@ -451,19 +407,11 @@
           <w:rFonts w:ascii="Times New Roman" w:eastAsia="標楷體" w:hAnsi="Times New Roman" w:cs="Times New Roman"/>
         </w:rPr>
       </w:pPr>
-      <w:proofErr w:type="spellStart"/>
       <w:r>
         <w:rPr>
           <w:rFonts w:ascii="Times New Roman" w:eastAsia="標楷體" w:hAnsi="Times New Roman" w:cs="Times New Roman" w:hint="eastAsia"/>
         </w:rPr>
-        <w:t>Re:Book</w:t>
-      </w:r>
-      <w:proofErr w:type="spellEnd"/>
-      <w:r>
-        <w:rPr>
-          <w:rFonts w:ascii="Times New Roman" w:eastAsia="標楷體" w:hAnsi="Times New Roman" w:cs="Times New Roman" w:hint="eastAsia"/>
-        </w:rPr>
-        <w:t xml:space="preserve"> </w:t>
+        <w:t xml:space="preserve">Re:Book </w:t>
       </w:r>
       <w:r>
         <w:rPr>
@@ -493,35 +441,7 @@
         <w:rPr>
           <w:rFonts w:ascii="Times New Roman" w:eastAsia="標楷體" w:hAnsi="Times New Roman" w:cs="Times New Roman" w:hint="eastAsia"/>
         </w:rPr>
-        <w:t>類。為體現對書本價值的尊重，賣家可設定期望售價，並上傳書</w:t>
-      </w:r>
-      <w:proofErr w:type="gramStart"/>
-      <w:r>
-        <w:rPr>
-          <w:rFonts w:ascii="Times New Roman" w:eastAsia="標楷體" w:hAnsi="Times New Roman" w:cs="Times New Roman" w:hint="eastAsia"/>
-        </w:rPr>
-        <w:t>況</w:t>
-      </w:r>
-      <w:proofErr w:type="gramEnd"/>
-      <w:r>
-        <w:rPr>
-          <w:rFonts w:ascii="Times New Roman" w:eastAsia="標楷體" w:hAnsi="Times New Roman" w:cs="Times New Roman" w:hint="eastAsia"/>
-        </w:rPr>
-        <w:t>照片或分享使用心得。潛在買家則可透過搜尋與篩選功能，快速找到所需書籍。平台同時</w:t>
-      </w:r>
-      <w:proofErr w:type="gramStart"/>
-      <w:r>
-        <w:rPr>
-          <w:rFonts w:ascii="Times New Roman" w:eastAsia="標楷體" w:hAnsi="Times New Roman" w:cs="Times New Roman" w:hint="eastAsia"/>
-        </w:rPr>
-        <w:t>提供私訊機制</w:t>
-      </w:r>
-      <w:proofErr w:type="gramEnd"/>
-      <w:r>
-        <w:rPr>
-          <w:rFonts w:ascii="Times New Roman" w:eastAsia="標楷體" w:hAnsi="Times New Roman" w:cs="Times New Roman" w:hint="eastAsia"/>
-        </w:rPr>
-        <w:t>，讓雙方協商最終價格與交付方式，確保知識的傳遞過程既順暢高效，也保有人與人之間的溫度。</w:t>
+        <w:t>類。為體現對書本價值的尊重，賣家可設定期望售價，並上傳書況照片或分享使用心得。潛在買家則可透過搜尋與篩選功能，快速找到所需書籍。平台同時提供私訊機制，讓雙方協商最終價格與交付方式，確保知識的傳遞過程既順暢高效，也保有人與人之間的溫度。</w:t>
       </w:r>
     </w:p>
     <w:p>
@@ -707,36 +627,72 @@
           <w:p>
             <w:pPr>
               <w:rPr>
-                <w:rFonts w:ascii="Times New Roman" w:eastAsia="標楷體" w:hAnsi="Times New Roman" w:cs="Times New Roman"/>
-              </w:rPr>
-            </w:pPr>
-            <w:proofErr w:type="gramStart"/>
+                <w:rFonts w:ascii="Times New Roman" w:eastAsia="標楷體" w:hAnsi="Times New Roman" w:cs="Times New Roman" w:hint="eastAsia"/>
+              </w:rPr>
+            </w:pPr>
+            <w:r>
+              <w:rPr>
+                <w:rFonts w:ascii="Times New Roman" w:eastAsia="標楷體" w:hAnsi="Times New Roman" w:cs="Times New Roman" w:hint="eastAsia"/>
+              </w:rPr>
+              <w:t>更新書籍狀態</w:t>
+            </w:r>
+          </w:p>
+        </w:tc>
+      </w:tr>
+      <w:tr>
+        <w:tc>
+          <w:tcPr>
+            <w:tcW w:w="4148" w:type="dxa"/>
+          </w:tcPr>
+          <w:p>
+            <w:pPr>
+              <w:rPr>
+                <w:rFonts w:ascii="Times New Roman" w:eastAsia="標楷體" w:hAnsi="Times New Roman" w:cs="Times New Roman"/>
+              </w:rPr>
+            </w:pPr>
+            <w:r>
+              <w:rPr>
+                <w:rFonts w:ascii="Times New Roman" w:eastAsia="標楷體" w:hAnsi="Times New Roman" w:cs="Times New Roman" w:hint="eastAsia"/>
+              </w:rPr>
+              <w:t>FEA-04</w:t>
+            </w:r>
+          </w:p>
+        </w:tc>
+        <w:tc>
+          <w:tcPr>
+            <w:tcW w:w="4148" w:type="dxa"/>
+          </w:tcPr>
+          <w:p>
+            <w:pPr>
+              <w:rPr>
+                <w:rFonts w:ascii="Times New Roman" w:eastAsia="標楷體" w:hAnsi="Times New Roman" w:cs="Times New Roman"/>
+              </w:rPr>
+            </w:pPr>
             <w:r>
               <w:rPr>
                 <w:rFonts w:ascii="Times New Roman" w:eastAsia="標楷體" w:hAnsi="Times New Roman" w:cs="Times New Roman" w:hint="eastAsia"/>
               </w:rPr>
               <w:t>發送私訊</w:t>
             </w:r>
-            <w:proofErr w:type="gramEnd"/>
-          </w:p>
-        </w:tc>
-      </w:tr>
-      <w:tr>
-        <w:tc>
-          <w:tcPr>
-            <w:tcW w:w="4148" w:type="dxa"/>
-          </w:tcPr>
-          <w:p>
-            <w:pPr>
-              <w:rPr>
-                <w:rFonts w:ascii="Times New Roman" w:eastAsia="標楷體" w:hAnsi="Times New Roman" w:cs="Times New Roman"/>
-              </w:rPr>
-            </w:pPr>
-            <w:r>
-              <w:rPr>
-                <w:rFonts w:ascii="Times New Roman" w:eastAsia="標楷體" w:hAnsi="Times New Roman" w:cs="Times New Roman" w:hint="eastAsia"/>
-              </w:rPr>
-              <w:t>FEA-04</w:t>
+          </w:p>
+        </w:tc>
+      </w:tr>
+      <w:tr>
+        <w:tc>
+          <w:tcPr>
+            <w:tcW w:w="4148" w:type="dxa"/>
+          </w:tcPr>
+          <w:p>
+            <w:pPr>
+              <w:rPr>
+                <w:rFonts w:ascii="Times New Roman" w:eastAsia="標楷體" w:hAnsi="Times New Roman" w:cs="Times New Roman"/>
+              </w:rPr>
+            </w:pPr>
+            <w:r>
+              <w:rPr>
+                <w:rFonts w:ascii="Times New Roman" w:eastAsia="標楷體" w:hAnsi="Times New Roman" w:cs="Times New Roman" w:hint="eastAsia"/>
+              </w:rPr>
+              <w:t>FEA-05</w:t>
             </w:r>
           </w:p>
         </w:tc>
@@ -772,20 +728,20 @@
             </w:pPr>
             <w:r>
               <w:rPr>
-                <w:rFonts w:ascii="Times New Roman" w:eastAsia="標楷體" w:hAnsi="Times New Roman" w:cs="Times New Roman" w:hint="eastAsia"/>
-              </w:rPr>
-              <w:t>FEA-05</w:t>
-            </w:r>
-          </w:p>
-        </w:tc>
-        <w:tc>
-          <w:tcPr>
-            <w:tcW w:w="4148" w:type="dxa"/>
-          </w:tcPr>
-          <w:p>
-            <w:pPr>
-              <w:rPr>
-                <w:rFonts w:ascii="Times New Roman" w:eastAsia="標楷體" w:hAnsi="Times New Roman" w:cs="Times New Roman"/>
+                <w:rFonts w:ascii="Times New Roman" w:eastAsia="標楷體" w:hAnsi="Times New Roman" w:cs="Times New Roman"/>
+              </w:rPr>
+              <w:t>FEA-06</w:t>
+            </w:r>
+          </w:p>
+        </w:tc>
+        <w:tc>
+          <w:tcPr>
+            <w:tcW w:w="4148" w:type="dxa"/>
+          </w:tcPr>
+          <w:p>
+            <w:pPr>
+              <w:rPr>
+                <w:rFonts w:ascii="Times New Roman" w:eastAsia="標楷體" w:hAnsi="Times New Roman" w:cs="Times New Roman" w:hint="eastAsia"/>
               </w:rPr>
             </w:pPr>
             <w:r>
@@ -957,16 +913,12 @@
                 <w:rFonts w:ascii="Times New Roman" w:eastAsia="標楷體" w:hAnsi="Times New Roman" w:cs="Times New Roman"/>
               </w:rPr>
             </w:pPr>
-            <w:proofErr w:type="spellStart"/>
-            <w:proofErr w:type="gramStart"/>
             <w:r>
               <w:rPr>
                 <w:rFonts w:ascii="Times New Roman" w:eastAsia="標楷體" w:hAnsi="Times New Roman" w:cs="Times New Roman" w:hint="eastAsia"/>
               </w:rPr>
               <w:t>Re:Book</w:t>
             </w:r>
-            <w:proofErr w:type="spellEnd"/>
-            <w:proofErr w:type="gramEnd"/>
           </w:p>
         </w:tc>
       </w:tr>
@@ -1087,17 +1039,30 @@
               </w:rPr>
               <w:t>賣家：希望方便地新增、修改或下架書籍，以順利售出商品</w:t>
             </w:r>
-            <w:r>
-              <w:rPr>
-                <w:rFonts w:ascii="Times New Roman" w:eastAsia="標楷體" w:hAnsi="Times New Roman" w:cs="Times New Roman"/>
-              </w:rPr>
-              <w:br/>
-            </w:r>
-            <w:r>
-              <w:rPr>
-                <w:rFonts w:ascii="Times New Roman" w:eastAsia="標楷體" w:hAnsi="Times New Roman" w:cs="Times New Roman" w:hint="eastAsia"/>
-              </w:rPr>
-              <w:t>買家：希望看到最準確、即時的書籍狀態與資訊。</w:t>
+          </w:p>
+          <w:p>
+            <w:pPr>
+              <w:rPr>
+                <w:rFonts w:ascii="Times New Roman" w:eastAsia="標楷體" w:hAnsi="Times New Roman" w:cs="Times New Roman"/>
+              </w:rPr>
+            </w:pPr>
+            <w:r>
+              <w:rPr>
+                <w:rFonts w:ascii="Times New Roman" w:eastAsia="標楷體" w:hAnsi="Times New Roman" w:cs="Times New Roman" w:hint="eastAsia"/>
+              </w:rPr>
+              <w:t>買家：希望看到最準確、即時的</w:t>
+            </w:r>
+            <w:r>
+              <w:rPr>
+                <w:rFonts w:ascii="Times New Roman" w:eastAsia="標楷體" w:hAnsi="Times New Roman" w:cs="Times New Roman" w:hint="eastAsia"/>
+              </w:rPr>
+              <w:t>商品</w:t>
+            </w:r>
+            <w:r>
+              <w:rPr>
+                <w:rFonts w:ascii="Times New Roman" w:eastAsia="標楷體" w:hAnsi="Times New Roman" w:cs="Times New Roman" w:hint="eastAsia"/>
+              </w:rPr>
+              <w:t>狀態與資訊。</w:t>
             </w:r>
           </w:p>
         </w:tc>
@@ -1173,7 +1138,13 @@
               <w:rPr>
                 <w:rFonts w:ascii="Times New Roman" w:eastAsia="標楷體" w:hAnsi="Times New Roman" w:cs="Times New Roman" w:hint="eastAsia"/>
               </w:rPr>
-              <w:t>書籍資訊正確地更新至資料庫中，並在系統前端同步顯示最新狀態。</w:t>
+              <w:t>商品</w:t>
+            </w:r>
+            <w:r>
+              <w:rPr>
+                <w:rFonts w:ascii="Times New Roman" w:eastAsia="標楷體" w:hAnsi="Times New Roman" w:cs="Times New Roman" w:hint="eastAsia"/>
+              </w:rPr>
+              <w:t>資訊正確地更新至資料庫中，並在系統前端同步顯示最新狀態。</w:t>
             </w:r>
           </w:p>
         </w:tc>
@@ -1219,12 +1190,13 @@
               </w:rPr>
               <w:t>賣家選擇「新增書籍」或「編輯現有書籍」。</w:t>
             </w:r>
-            <w:r>
-              <w:rPr>
-                <w:rFonts w:ascii="Times New Roman" w:eastAsia="標楷體" w:hAnsi="Times New Roman" w:cs="Times New Roman"/>
-              </w:rPr>
-              <w:br/>
-            </w:r>
+          </w:p>
+          <w:p>
+            <w:pPr>
+              <w:rPr>
+                <w:rFonts w:ascii="Times New Roman" w:eastAsia="標楷體" w:hAnsi="Times New Roman" w:cs="Times New Roman"/>
+              </w:rPr>
+            </w:pPr>
             <w:r>
               <w:rPr>
                 <w:rFonts w:ascii="Times New Roman" w:eastAsia="標楷體" w:hAnsi="Times New Roman" w:cs="Times New Roman" w:hint="eastAsia"/>
@@ -1259,28 +1231,15 @@
               <w:rPr>
                 <w:rFonts w:ascii="Times New Roman" w:eastAsia="標楷體" w:hAnsi="Times New Roman" w:cs="Times New Roman" w:hint="eastAsia"/>
               </w:rPr>
-              <w:t>、書名、價格、書</w:t>
-            </w:r>
-            <w:proofErr w:type="gramStart"/>
-            <w:r>
-              <w:rPr>
-                <w:rFonts w:ascii="Times New Roman" w:eastAsia="標楷體" w:hAnsi="Times New Roman" w:cs="Times New Roman" w:hint="eastAsia"/>
-              </w:rPr>
-              <w:t>況</w:t>
-            </w:r>
-            <w:proofErr w:type="gramEnd"/>
-            <w:r>
-              <w:rPr>
-                <w:rFonts w:ascii="Times New Roman" w:eastAsia="標楷體" w:hAnsi="Times New Roman" w:cs="Times New Roman" w:hint="eastAsia"/>
-              </w:rPr>
-              <w:t>及區域資訊。</w:t>
-            </w:r>
-            <w:r>
-              <w:rPr>
-                <w:rFonts w:ascii="Times New Roman" w:eastAsia="標楷體" w:hAnsi="Times New Roman" w:cs="Times New Roman"/>
-              </w:rPr>
-              <w:br/>
-            </w:r>
+              <w:t>、書名、價格、書況及區域資訊。</w:t>
+            </w:r>
+          </w:p>
+          <w:p>
+            <w:pPr>
+              <w:rPr>
+                <w:rFonts w:ascii="Times New Roman" w:eastAsia="標楷體" w:hAnsi="Times New Roman" w:cs="Times New Roman"/>
+              </w:rPr>
+            </w:pPr>
             <w:r>
               <w:rPr>
                 <w:rFonts w:ascii="Times New Roman" w:eastAsia="標楷體" w:hAnsi="Times New Roman" w:cs="Times New Roman" w:hint="eastAsia"/>
@@ -1293,12 +1252,13 @@
               </w:rPr>
               <w:t>系統驗證資料格式。</w:t>
             </w:r>
-            <w:r>
-              <w:rPr>
-                <w:rFonts w:ascii="Times New Roman" w:eastAsia="標楷體" w:hAnsi="Times New Roman" w:cs="Times New Roman"/>
-              </w:rPr>
-              <w:br/>
-            </w:r>
+          </w:p>
+          <w:p>
+            <w:pPr>
+              <w:rPr>
+                <w:rFonts w:ascii="Times New Roman" w:eastAsia="標楷體" w:hAnsi="Times New Roman" w:cs="Times New Roman"/>
+              </w:rPr>
+            </w:pPr>
             <w:r>
               <w:rPr>
                 <w:rFonts w:ascii="Times New Roman" w:eastAsia="標楷體" w:hAnsi="Times New Roman" w:cs="Times New Roman" w:hint="eastAsia"/>
@@ -1311,12 +1271,13 @@
               </w:rPr>
               <w:t>賣家確認提交。</w:t>
             </w:r>
-            <w:r>
-              <w:rPr>
-                <w:rFonts w:ascii="Times New Roman" w:eastAsia="標楷體" w:hAnsi="Times New Roman" w:cs="Times New Roman"/>
-              </w:rPr>
-              <w:br/>
-            </w:r>
+          </w:p>
+          <w:p>
+            <w:pPr>
+              <w:rPr>
+                <w:rFonts w:ascii="Times New Roman" w:eastAsia="標楷體" w:hAnsi="Times New Roman" w:cs="Times New Roman"/>
+              </w:rPr>
+            </w:pPr>
             <w:r>
               <w:rPr>
                 <w:rFonts w:ascii="Times New Roman" w:eastAsia="標楷體" w:hAnsi="Times New Roman" w:cs="Times New Roman" w:hint="eastAsia"/>
@@ -1415,12 +1376,13 @@
               </w:rPr>
               <w:t>格式錯誤：系統提示錯誤並要求賣家重新輸入。</w:t>
             </w:r>
-            <w:r>
-              <w:rPr>
-                <w:rFonts w:ascii="Times New Roman" w:eastAsia="標楷體" w:hAnsi="Times New Roman" w:cs="Times New Roman"/>
-              </w:rPr>
-              <w:br/>
-            </w:r>
+          </w:p>
+          <w:p>
+            <w:pPr>
+              <w:rPr>
+                <w:rFonts w:ascii="Times New Roman" w:eastAsia="標楷體" w:hAnsi="Times New Roman" w:cs="Times New Roman"/>
+              </w:rPr>
+            </w:pPr>
             <w:r>
               <w:rPr>
                 <w:rFonts w:ascii="Times New Roman" w:eastAsia="標楷體" w:hAnsi="Times New Roman" w:cs="Times New Roman" w:hint="eastAsia"/>
@@ -1433,12 +1395,13 @@
               </w:rPr>
               <w:t>必填欄位缺失：系統標示未填欄位。</w:t>
             </w:r>
-            <w:r>
-              <w:rPr>
-                <w:rFonts w:ascii="Times New Roman" w:eastAsia="標楷體" w:hAnsi="Times New Roman" w:cs="Times New Roman"/>
-              </w:rPr>
-              <w:br/>
-            </w:r>
+          </w:p>
+          <w:p>
+            <w:pPr>
+              <w:rPr>
+                <w:rFonts w:ascii="Times New Roman" w:eastAsia="標楷體" w:hAnsi="Times New Roman" w:cs="Times New Roman"/>
+              </w:rPr>
+            </w:pPr>
             <w:r>
               <w:rPr>
                 <w:rFonts w:ascii="Times New Roman" w:eastAsia="標楷體" w:hAnsi="Times New Roman" w:cs="Times New Roman" w:hint="eastAsia"/>
@@ -1449,7 +1412,19 @@
               <w:rPr>
                 <w:rFonts w:ascii="Times New Roman" w:eastAsia="標楷體" w:hAnsi="Times New Roman" w:cs="Times New Roman" w:hint="eastAsia"/>
               </w:rPr>
-              <w:t>刪除書籍：賣家選擇刪除，系統確認後從資料庫移除該項目。</w:t>
+              <w:t>刪除</w:t>
+            </w:r>
+            <w:r>
+              <w:rPr>
+                <w:rFonts w:ascii="Times New Roman" w:eastAsia="標楷體" w:hAnsi="Times New Roman" w:cs="Times New Roman" w:hint="eastAsia"/>
+              </w:rPr>
+              <w:t>商品</w:t>
+            </w:r>
+            <w:r>
+              <w:rPr>
+                <w:rFonts w:ascii="Times New Roman" w:eastAsia="標楷體" w:hAnsi="Times New Roman" w:cs="Times New Roman" w:hint="eastAsia"/>
+              </w:rPr>
+              <w:t>：賣家選擇刪除，系統確認後從資料庫移除該項目。</w:t>
             </w:r>
           </w:p>
         </w:tc>
@@ -1593,14 +1568,26 @@
               <w:rPr>
                 <w:rFonts w:ascii="Times New Roman" w:eastAsia="標楷體" w:hAnsi="Times New Roman" w:cs="Times New Roman" w:hint="eastAsia"/>
               </w:rPr>
-              <w:t>每當賣家有新書要賣或商品狀態改變</w:t>
+              <w:t>每當賣家有新</w:t>
+            </w:r>
+            <w:r>
+              <w:rPr>
+                <w:rFonts w:ascii="Times New Roman" w:eastAsia="標楷體" w:hAnsi="Times New Roman" w:cs="Times New Roman" w:hint="eastAsia"/>
+              </w:rPr>
+              <w:t>商品</w:t>
+            </w:r>
+            <w:r>
+              <w:rPr>
+                <w:rFonts w:ascii="Times New Roman" w:eastAsia="標楷體" w:hAnsi="Times New Roman" w:cs="Times New Roman" w:hint="eastAsia"/>
+              </w:rPr>
+              <w:t>要賣或商品狀態改</w:t>
             </w:r>
             <w:r>
               <w:rPr>
                 <w:rFonts w:ascii="Times New Roman" w:eastAsia="標楷體" w:hAnsi="Times New Roman" w:cs="Times New Roman" w:hint="eastAsia"/>
               </w:rPr>
               <w:lastRenderedPageBreak/>
-              <w:t>時觸發（高頻率）。</w:t>
+              <w:t>變時觸發（高頻率）。</w:t>
             </w:r>
           </w:p>
         </w:tc>
@@ -1748,16 +1735,12 @@
                 <w:rFonts w:ascii="Times New Roman" w:eastAsia="標楷體" w:hAnsi="Times New Roman" w:cs="Times New Roman"/>
               </w:rPr>
             </w:pPr>
-            <w:proofErr w:type="spellStart"/>
-            <w:proofErr w:type="gramStart"/>
             <w:r>
               <w:rPr>
                 <w:rFonts w:ascii="Times New Roman" w:eastAsia="標楷體" w:hAnsi="Times New Roman" w:cs="Times New Roman" w:hint="eastAsia"/>
               </w:rPr>
               <w:t>Re:Book</w:t>
             </w:r>
-            <w:proofErr w:type="spellEnd"/>
-            <w:proofErr w:type="gramEnd"/>
           </w:p>
         </w:tc>
       </w:tr>
@@ -1880,10 +1863,17 @@
             </w:r>
             <w:r>
               <w:rPr>
-                <w:rFonts w:ascii="Times New Roman" w:eastAsia="標楷體" w:hAnsi="Times New Roman" w:cs="Times New Roman"/>
-              </w:rPr>
-              <w:br/>
-            </w:r>
+                <w:rFonts w:ascii="Times New Roman" w:eastAsia="標楷體" w:hAnsi="Times New Roman" w:cs="Times New Roman" w:hint="eastAsia"/>
+              </w:rPr>
+              <w:t>。</w:t>
+            </w:r>
+          </w:p>
+          <w:p>
+            <w:pPr>
+              <w:rPr>
+                <w:rFonts w:ascii="Times New Roman" w:eastAsia="標楷體" w:hAnsi="Times New Roman" w:cs="Times New Roman"/>
+              </w:rPr>
+            </w:pPr>
             <w:r>
               <w:rPr>
                 <w:rFonts w:ascii="Times New Roman" w:eastAsia="標楷體" w:hAnsi="Times New Roman" w:cs="Times New Roman" w:hint="eastAsia"/>
@@ -1926,7 +1916,19 @@
               <w:rPr>
                 <w:rFonts w:ascii="Times New Roman" w:eastAsia="標楷體" w:hAnsi="Times New Roman" w:cs="Times New Roman" w:hint="eastAsia"/>
               </w:rPr>
-              <w:t>系統已建立書籍資料庫，且買家已進入搜尋頁面（不一定要登入即可搜尋，但購買通常需登入）。</w:t>
+              <w:t>系統已建立</w:t>
+            </w:r>
+            <w:r>
+              <w:rPr>
+                <w:rFonts w:ascii="Times New Roman" w:eastAsia="標楷體" w:hAnsi="Times New Roman" w:cs="Times New Roman" w:hint="eastAsia"/>
+              </w:rPr>
+              <w:t>商品</w:t>
+            </w:r>
+            <w:r>
+              <w:rPr>
+                <w:rFonts w:ascii="Times New Roman" w:eastAsia="標楷體" w:hAnsi="Times New Roman" w:cs="Times New Roman" w:hint="eastAsia"/>
+              </w:rPr>
+              <w:t>資料庫，且買家已進入搜尋頁面（不一定要登入即可搜尋，但購買通常需登入）。</w:t>
             </w:r>
           </w:p>
         </w:tc>
@@ -1964,7 +1966,19 @@
               <w:rPr>
                 <w:rFonts w:ascii="Times New Roman" w:eastAsia="標楷體" w:hAnsi="Times New Roman" w:cs="Times New Roman" w:hint="eastAsia"/>
               </w:rPr>
-              <w:t>系統根據買家輸入的準則，顯示符合條件的書籍清單。</w:t>
+              <w:t>系統根據買家輸入的準則，顯示符合條件的</w:t>
+            </w:r>
+            <w:r>
+              <w:rPr>
+                <w:rFonts w:ascii="Times New Roman" w:eastAsia="標楷體" w:hAnsi="Times New Roman" w:cs="Times New Roman" w:hint="eastAsia"/>
+              </w:rPr>
+              <w:t>商品</w:t>
+            </w:r>
+            <w:r>
+              <w:rPr>
+                <w:rFonts w:ascii="Times New Roman" w:eastAsia="標楷體" w:hAnsi="Times New Roman" w:cs="Times New Roman" w:hint="eastAsia"/>
+              </w:rPr>
+              <w:t>。</w:t>
             </w:r>
           </w:p>
         </w:tc>
@@ -2039,21 +2053,7 @@
               <w:rPr>
                 <w:rFonts w:ascii="Times New Roman" w:eastAsia="標楷體" w:hAnsi="Times New Roman" w:cs="Times New Roman" w:hint="eastAsia"/>
               </w:rPr>
-              <w:t>買家選擇篩選條件</w:t>
-            </w:r>
-            <w:proofErr w:type="gramStart"/>
-            <w:r>
-              <w:rPr>
-                <w:rFonts w:ascii="Times New Roman" w:eastAsia="標楷體" w:hAnsi="Times New Roman" w:cs="Times New Roman" w:hint="eastAsia"/>
-              </w:rPr>
-              <w:t>（</w:t>
-            </w:r>
-            <w:proofErr w:type="gramEnd"/>
-            <w:r>
-              <w:rPr>
-                <w:rFonts w:ascii="Times New Roman" w:eastAsia="標楷體" w:hAnsi="Times New Roman" w:cs="Times New Roman" w:hint="eastAsia"/>
-              </w:rPr>
-              <w:t>如：區域</w:t>
+              <w:t>買家選擇篩選條件（如：區域</w:t>
             </w:r>
             <w:r>
               <w:rPr>
@@ -2065,21 +2065,7 @@
               <w:rPr>
                 <w:rFonts w:ascii="Times New Roman" w:eastAsia="標楷體" w:hAnsi="Times New Roman" w:cs="Times New Roman" w:hint="eastAsia"/>
               </w:rPr>
-              <w:t>校區、價格範圍、書</w:t>
-            </w:r>
-            <w:proofErr w:type="gramStart"/>
-            <w:r>
-              <w:rPr>
-                <w:rFonts w:ascii="Times New Roman" w:eastAsia="標楷體" w:hAnsi="Times New Roman" w:cs="Times New Roman" w:hint="eastAsia"/>
-              </w:rPr>
-              <w:t>況）</w:t>
-            </w:r>
-            <w:proofErr w:type="gramEnd"/>
-            <w:r>
-              <w:rPr>
-                <w:rFonts w:ascii="Times New Roman" w:eastAsia="標楷體" w:hAnsi="Times New Roman" w:cs="Times New Roman" w:hint="eastAsia"/>
-              </w:rPr>
-              <w:t>。</w:t>
+              <w:t>校區、價格範圍、書況）。</w:t>
             </w:r>
           </w:p>
           <w:p>
@@ -2136,7 +2122,19 @@
               <w:rPr>
                 <w:rFonts w:ascii="Times New Roman" w:eastAsia="標楷體" w:hAnsi="Times New Roman" w:cs="Times New Roman" w:hint="eastAsia"/>
               </w:rPr>
-              <w:t>買家點擊感興趣的書籍查看詳細資訊。</w:t>
+              <w:t>買家點擊感興趣的</w:t>
+            </w:r>
+            <w:r>
+              <w:rPr>
+                <w:rFonts w:ascii="Times New Roman" w:eastAsia="標楷體" w:hAnsi="Times New Roman" w:cs="Times New Roman" w:hint="eastAsia"/>
+              </w:rPr>
+              <w:t>商品</w:t>
+            </w:r>
+            <w:r>
+              <w:rPr>
+                <w:rFonts w:ascii="Times New Roman" w:eastAsia="標楷體" w:hAnsi="Times New Roman" w:cs="Times New Roman" w:hint="eastAsia"/>
+              </w:rPr>
+              <w:t>查看詳細資訊。</w:t>
             </w:r>
           </w:p>
         </w:tc>
@@ -2237,21 +2235,7 @@
               <w:rPr>
                 <w:rFonts w:ascii="Times New Roman" w:eastAsia="標楷體" w:hAnsi="Times New Roman" w:cs="Times New Roman" w:hint="eastAsia"/>
               </w:rPr>
-              <w:t>搜尋結果</w:t>
-            </w:r>
-            <w:proofErr w:type="gramStart"/>
-            <w:r>
-              <w:rPr>
-                <w:rFonts w:ascii="Times New Roman" w:eastAsia="標楷體" w:hAnsi="Times New Roman" w:cs="Times New Roman" w:hint="eastAsia"/>
-              </w:rPr>
-              <w:t>的加載時間</w:t>
-            </w:r>
-            <w:proofErr w:type="gramEnd"/>
-            <w:r>
-              <w:rPr>
-                <w:rFonts w:ascii="Times New Roman" w:eastAsia="標楷體" w:hAnsi="Times New Roman" w:cs="Times New Roman" w:hint="eastAsia"/>
-              </w:rPr>
-              <w:t>應小於</w:t>
+              <w:t>搜尋結果的加載時間應小於</w:t>
             </w:r>
             <w:r>
               <w:rPr>
@@ -2443,6 +2427,501 @@
     <w:p>
       <w:pPr>
         <w:rPr>
+          <w:rFonts w:ascii="Times New Roman" w:eastAsia="標楷體" w:hAnsi="Times New Roman" w:cs="Times New Roman" w:hint="eastAsia"/>
+        </w:rPr>
+      </w:pPr>
+      <w:r>
+        <w:rPr>
+          <w:rFonts w:ascii="Times New Roman" w:eastAsia="標楷體" w:hAnsi="Times New Roman" w:cs="Times New Roman" w:hint="eastAsia"/>
+        </w:rPr>
+        <w:t xml:space="preserve">1.5.3 </w:t>
+      </w:r>
+      <w:r>
+        <w:rPr>
+          <w:rFonts w:ascii="Times New Roman" w:eastAsia="標楷體" w:hAnsi="Times New Roman" w:cs="Times New Roman" w:hint="eastAsia"/>
+        </w:rPr>
+        <w:t>更新書籍狀態</w:t>
+      </w:r>
+    </w:p>
+    <w:tbl>
+      <w:tblPr>
+        <w:tblStyle w:val="af2"/>
+        <w:tblW w:w="0" w:type="auto"/>
+        <w:tblLook w:val="04A0" w:firstRow="1" w:lastRow="0" w:firstColumn="1" w:lastColumn="0" w:noHBand="0" w:noVBand="1"/>
+      </w:tblPr>
+      <w:tblGrid>
+        <w:gridCol w:w="4148"/>
+        <w:gridCol w:w="4148"/>
+      </w:tblGrid>
+      <w:tr>
+        <w:tc>
+          <w:tcPr>
+            <w:tcW w:w="4148" w:type="dxa"/>
+          </w:tcPr>
+          <w:p>
+            <w:pPr>
+              <w:rPr>
+                <w:rFonts w:ascii="Times New Roman" w:eastAsia="標楷體" w:hAnsi="Times New Roman" w:cs="Times New Roman"/>
+              </w:rPr>
+            </w:pPr>
+            <w:r>
+              <w:rPr>
+                <w:rFonts w:ascii="Times New Roman" w:eastAsia="標楷體" w:hAnsi="Times New Roman" w:cs="Times New Roman" w:hint="eastAsia"/>
+              </w:rPr>
+              <w:t>Use Case ID</w:t>
+            </w:r>
+          </w:p>
+        </w:tc>
+        <w:tc>
+          <w:tcPr>
+            <w:tcW w:w="4148" w:type="dxa"/>
+          </w:tcPr>
+          <w:p>
+            <w:pPr>
+              <w:rPr>
+                <w:rFonts w:ascii="Times New Roman" w:eastAsia="標楷體" w:hAnsi="Times New Roman" w:cs="Times New Roman"/>
+              </w:rPr>
+            </w:pPr>
+            <w:r>
+              <w:rPr>
+                <w:rFonts w:ascii="Times New Roman" w:eastAsia="標楷體" w:hAnsi="Times New Roman" w:cs="Times New Roman" w:hint="eastAsia"/>
+              </w:rPr>
+              <w:t>FEA-0</w:t>
+            </w:r>
+            <w:r>
+              <w:rPr>
+                <w:rFonts w:ascii="Times New Roman" w:eastAsia="標楷體" w:hAnsi="Times New Roman" w:cs="Times New Roman" w:hint="eastAsia"/>
+              </w:rPr>
+              <w:t>3</w:t>
+            </w:r>
+          </w:p>
+        </w:tc>
+      </w:tr>
+      <w:tr>
+        <w:tc>
+          <w:tcPr>
+            <w:tcW w:w="4148" w:type="dxa"/>
+          </w:tcPr>
+          <w:p>
+            <w:pPr>
+              <w:rPr>
+                <w:rFonts w:ascii="Times New Roman" w:eastAsia="標楷體" w:hAnsi="Times New Roman" w:cs="Times New Roman"/>
+              </w:rPr>
+            </w:pPr>
+            <w:r>
+              <w:rPr>
+                <w:rFonts w:ascii="Times New Roman" w:eastAsia="標楷體" w:hAnsi="Times New Roman" w:cs="Times New Roman" w:hint="eastAsia"/>
+              </w:rPr>
+              <w:t>Scope</w:t>
+            </w:r>
+          </w:p>
+        </w:tc>
+        <w:tc>
+          <w:tcPr>
+            <w:tcW w:w="4148" w:type="dxa"/>
+          </w:tcPr>
+          <w:p>
+            <w:pPr>
+              <w:rPr>
+                <w:rFonts w:ascii="Times New Roman" w:eastAsia="標楷體" w:hAnsi="Times New Roman" w:cs="Times New Roman"/>
+              </w:rPr>
+            </w:pPr>
+            <w:r>
+              <w:rPr>
+                <w:rFonts w:ascii="Times New Roman" w:eastAsia="標楷體" w:hAnsi="Times New Roman" w:cs="Times New Roman" w:hint="eastAsia"/>
+              </w:rPr>
+              <w:t>Re:Book</w:t>
+            </w:r>
+          </w:p>
+        </w:tc>
+      </w:tr>
+      <w:tr>
+        <w:tc>
+          <w:tcPr>
+            <w:tcW w:w="4148" w:type="dxa"/>
+          </w:tcPr>
+          <w:p>
+            <w:pPr>
+              <w:rPr>
+                <w:rFonts w:ascii="Times New Roman" w:eastAsia="標楷體" w:hAnsi="Times New Roman" w:cs="Times New Roman"/>
+              </w:rPr>
+            </w:pPr>
+            <w:r>
+              <w:rPr>
+                <w:rFonts w:ascii="Times New Roman" w:eastAsia="標楷體" w:hAnsi="Times New Roman" w:cs="Times New Roman" w:hint="eastAsia"/>
+              </w:rPr>
+              <w:t>Level</w:t>
+            </w:r>
+          </w:p>
+        </w:tc>
+        <w:tc>
+          <w:tcPr>
+            <w:tcW w:w="4148" w:type="dxa"/>
+          </w:tcPr>
+          <w:p>
+            <w:pPr>
+              <w:rPr>
+                <w:rFonts w:ascii="Times New Roman" w:eastAsia="標楷體" w:hAnsi="Times New Roman" w:cs="Times New Roman"/>
+              </w:rPr>
+            </w:pPr>
+            <w:r>
+              <w:rPr>
+                <w:rFonts w:ascii="Times New Roman" w:eastAsia="標楷體" w:hAnsi="Times New Roman" w:cs="Times New Roman"/>
+              </w:rPr>
+              <w:t>U</w:t>
+            </w:r>
+            <w:r>
+              <w:rPr>
+                <w:rFonts w:ascii="Times New Roman" w:eastAsia="標楷體" w:hAnsi="Times New Roman" w:cs="Times New Roman" w:hint="eastAsia"/>
+              </w:rPr>
+              <w:t>ser-goal</w:t>
+            </w:r>
+          </w:p>
+        </w:tc>
+      </w:tr>
+      <w:tr>
+        <w:tc>
+          <w:tcPr>
+            <w:tcW w:w="4148" w:type="dxa"/>
+          </w:tcPr>
+          <w:p>
+            <w:pPr>
+              <w:rPr>
+                <w:rFonts w:ascii="Times New Roman" w:eastAsia="標楷體" w:hAnsi="Times New Roman" w:cs="Times New Roman"/>
+              </w:rPr>
+            </w:pPr>
+            <w:r>
+              <w:rPr>
+                <w:rFonts w:ascii="Times New Roman" w:eastAsia="標楷體" w:hAnsi="Times New Roman" w:cs="Times New Roman" w:hint="eastAsia"/>
+              </w:rPr>
+              <w:t>Primary Actor</w:t>
+            </w:r>
+          </w:p>
+        </w:tc>
+        <w:tc>
+          <w:tcPr>
+            <w:tcW w:w="4148" w:type="dxa"/>
+          </w:tcPr>
+          <w:p>
+            <w:pPr>
+              <w:rPr>
+                <w:rFonts w:ascii="Times New Roman" w:eastAsia="標楷體" w:hAnsi="Times New Roman" w:cs="Times New Roman"/>
+              </w:rPr>
+            </w:pPr>
+            <w:r>
+              <w:rPr>
+                <w:rFonts w:ascii="Times New Roman" w:eastAsia="標楷體" w:hAnsi="Times New Roman" w:cs="Times New Roman" w:hint="eastAsia"/>
+              </w:rPr>
+              <w:t>賣</w:t>
+            </w:r>
+            <w:r>
+              <w:rPr>
+                <w:rFonts w:ascii="Times New Roman" w:eastAsia="標楷體" w:hAnsi="Times New Roman" w:cs="Times New Roman" w:hint="eastAsia"/>
+              </w:rPr>
+              <w:t>家</w:t>
+            </w:r>
+          </w:p>
+        </w:tc>
+      </w:tr>
+      <w:tr>
+        <w:tc>
+          <w:tcPr>
+            <w:tcW w:w="4148" w:type="dxa"/>
+          </w:tcPr>
+          <w:p>
+            <w:pPr>
+              <w:rPr>
+                <w:rFonts w:ascii="Times New Roman" w:eastAsia="標楷體" w:hAnsi="Times New Roman" w:cs="Times New Roman"/>
+              </w:rPr>
+            </w:pPr>
+            <w:r>
+              <w:rPr>
+                <w:rFonts w:ascii="Times New Roman" w:eastAsia="標楷體" w:hAnsi="Times New Roman" w:cs="Times New Roman" w:hint="eastAsia"/>
+              </w:rPr>
+              <w:t>Stakeholders and Interests</w:t>
+            </w:r>
+          </w:p>
+        </w:tc>
+        <w:tc>
+          <w:tcPr>
+            <w:tcW w:w="4148" w:type="dxa"/>
+          </w:tcPr>
+          <w:p>
+            <w:pPr>
+              <w:rPr>
+                <w:rFonts w:ascii="Times New Roman" w:eastAsia="標楷體" w:hAnsi="Times New Roman" w:cs="Times New Roman"/>
+              </w:rPr>
+            </w:pPr>
+          </w:p>
+        </w:tc>
+      </w:tr>
+      <w:tr>
+        <w:tc>
+          <w:tcPr>
+            <w:tcW w:w="4148" w:type="dxa"/>
+          </w:tcPr>
+          <w:p>
+            <w:pPr>
+              <w:rPr>
+                <w:rFonts w:ascii="Times New Roman" w:eastAsia="標楷體" w:hAnsi="Times New Roman" w:cs="Times New Roman"/>
+              </w:rPr>
+            </w:pPr>
+            <w:r>
+              <w:rPr>
+                <w:rFonts w:ascii="Times New Roman" w:eastAsia="標楷體" w:hAnsi="Times New Roman" w:cs="Times New Roman" w:hint="eastAsia"/>
+              </w:rPr>
+              <w:t>Preconditions</w:t>
+            </w:r>
+          </w:p>
+        </w:tc>
+        <w:tc>
+          <w:tcPr>
+            <w:tcW w:w="4148" w:type="dxa"/>
+          </w:tcPr>
+          <w:p>
+            <w:pPr>
+              <w:rPr>
+                <w:rFonts w:ascii="Times New Roman" w:eastAsia="標楷體" w:hAnsi="Times New Roman" w:cs="Times New Roman"/>
+              </w:rPr>
+            </w:pPr>
+          </w:p>
+        </w:tc>
+      </w:tr>
+      <w:tr>
+        <w:tc>
+          <w:tcPr>
+            <w:tcW w:w="4148" w:type="dxa"/>
+          </w:tcPr>
+          <w:p>
+            <w:pPr>
+              <w:rPr>
+                <w:rFonts w:ascii="Times New Roman" w:eastAsia="標楷體" w:hAnsi="Times New Roman" w:cs="Times New Roman"/>
+              </w:rPr>
+            </w:pPr>
+            <w:r>
+              <w:rPr>
+                <w:rFonts w:ascii="Times New Roman" w:eastAsia="標楷體" w:hAnsi="Times New Roman" w:cs="Times New Roman" w:hint="eastAsia"/>
+              </w:rPr>
+              <w:t>Success Guarantee</w:t>
+            </w:r>
+          </w:p>
+        </w:tc>
+        <w:tc>
+          <w:tcPr>
+            <w:tcW w:w="4148" w:type="dxa"/>
+          </w:tcPr>
+          <w:p>
+            <w:pPr>
+              <w:rPr>
+                <w:rFonts w:ascii="Times New Roman" w:eastAsia="標楷體" w:hAnsi="Times New Roman" w:cs="Times New Roman"/>
+              </w:rPr>
+            </w:pPr>
+          </w:p>
+        </w:tc>
+      </w:tr>
+      <w:tr>
+        <w:tc>
+          <w:tcPr>
+            <w:tcW w:w="4148" w:type="dxa"/>
+          </w:tcPr>
+          <w:p>
+            <w:pPr>
+              <w:rPr>
+                <w:rFonts w:ascii="Times New Roman" w:eastAsia="標楷體" w:hAnsi="Times New Roman" w:cs="Times New Roman"/>
+              </w:rPr>
+            </w:pPr>
+            <w:r>
+              <w:rPr>
+                <w:rFonts w:ascii="Times New Roman" w:eastAsia="標楷體" w:hAnsi="Times New Roman" w:cs="Times New Roman" w:hint="eastAsia"/>
+              </w:rPr>
+              <w:t>Main Success Scenario</w:t>
+            </w:r>
+          </w:p>
+        </w:tc>
+        <w:tc>
+          <w:tcPr>
+            <w:tcW w:w="4148" w:type="dxa"/>
+          </w:tcPr>
+          <w:p>
+            <w:pPr>
+              <w:rPr>
+                <w:rFonts w:ascii="Times New Roman" w:eastAsia="標楷體" w:hAnsi="Times New Roman" w:cs="Times New Roman"/>
+              </w:rPr>
+            </w:pPr>
+          </w:p>
+        </w:tc>
+      </w:tr>
+      <w:tr>
+        <w:tc>
+          <w:tcPr>
+            <w:tcW w:w="4148" w:type="dxa"/>
+          </w:tcPr>
+          <w:p>
+            <w:pPr>
+              <w:rPr>
+                <w:rFonts w:ascii="Times New Roman" w:eastAsia="標楷體" w:hAnsi="Times New Roman" w:cs="Times New Roman"/>
+              </w:rPr>
+            </w:pPr>
+            <w:r>
+              <w:rPr>
+                <w:rFonts w:ascii="Times New Roman" w:eastAsia="標楷體" w:hAnsi="Times New Roman" w:cs="Times New Roman" w:hint="eastAsia"/>
+              </w:rPr>
+              <w:t>Extensions</w:t>
+            </w:r>
+          </w:p>
+        </w:tc>
+        <w:tc>
+          <w:tcPr>
+            <w:tcW w:w="4148" w:type="dxa"/>
+          </w:tcPr>
+          <w:p>
+            <w:pPr>
+              <w:rPr>
+                <w:rFonts w:ascii="Times New Roman" w:eastAsia="標楷體" w:hAnsi="Times New Roman" w:cs="Times New Roman"/>
+              </w:rPr>
+            </w:pPr>
+          </w:p>
+        </w:tc>
+      </w:tr>
+      <w:tr>
+        <w:tc>
+          <w:tcPr>
+            <w:tcW w:w="4148" w:type="dxa"/>
+          </w:tcPr>
+          <w:p>
+            <w:pPr>
+              <w:rPr>
+                <w:rFonts w:ascii="Times New Roman" w:eastAsia="標楷體" w:hAnsi="Times New Roman" w:cs="Times New Roman"/>
+              </w:rPr>
+            </w:pPr>
+            <w:r>
+              <w:rPr>
+                <w:rFonts w:ascii="Times New Roman" w:eastAsia="標楷體" w:hAnsi="Times New Roman" w:cs="Times New Roman" w:hint="eastAsia"/>
+              </w:rPr>
+              <w:t>Special Requirements</w:t>
+            </w:r>
+          </w:p>
+        </w:tc>
+        <w:tc>
+          <w:tcPr>
+            <w:tcW w:w="4148" w:type="dxa"/>
+          </w:tcPr>
+          <w:p>
+            <w:pPr>
+              <w:rPr>
+                <w:rFonts w:ascii="Times New Roman" w:eastAsia="標楷體" w:hAnsi="Times New Roman" w:cs="Times New Roman"/>
+              </w:rPr>
+            </w:pPr>
+          </w:p>
+        </w:tc>
+      </w:tr>
+      <w:tr>
+        <w:tc>
+          <w:tcPr>
+            <w:tcW w:w="4148" w:type="dxa"/>
+          </w:tcPr>
+          <w:p>
+            <w:pPr>
+              <w:rPr>
+                <w:rFonts w:ascii="Times New Roman" w:eastAsia="標楷體" w:hAnsi="Times New Roman" w:cs="Times New Roman"/>
+              </w:rPr>
+            </w:pPr>
+            <w:r>
+              <w:rPr>
+                <w:rFonts w:ascii="Times New Roman" w:eastAsia="標楷體" w:hAnsi="Times New Roman" w:cs="Times New Roman" w:hint="eastAsia"/>
+              </w:rPr>
+              <w:t>Technology and Data Variations List</w:t>
+            </w:r>
+          </w:p>
+        </w:tc>
+        <w:tc>
+          <w:tcPr>
+            <w:tcW w:w="4148" w:type="dxa"/>
+          </w:tcPr>
+          <w:p>
+            <w:pPr>
+              <w:rPr>
+                <w:rFonts w:ascii="Times New Roman" w:eastAsia="標楷體" w:hAnsi="Times New Roman" w:cs="Times New Roman"/>
+              </w:rPr>
+            </w:pPr>
+          </w:p>
+        </w:tc>
+      </w:tr>
+      <w:tr>
+        <w:tc>
+          <w:tcPr>
+            <w:tcW w:w="4148" w:type="dxa"/>
+          </w:tcPr>
+          <w:p>
+            <w:pPr>
+              <w:rPr>
+                <w:rFonts w:ascii="Times New Roman" w:eastAsia="標楷體" w:hAnsi="Times New Roman" w:cs="Times New Roman"/>
+              </w:rPr>
+            </w:pPr>
+            <w:r>
+              <w:rPr>
+                <w:rFonts w:ascii="Times New Roman" w:eastAsia="標楷體" w:hAnsi="Times New Roman" w:cs="Times New Roman" w:hint="eastAsia"/>
+              </w:rPr>
+              <w:t>Frequency of Occurrence</w:t>
+            </w:r>
+          </w:p>
+        </w:tc>
+        <w:tc>
+          <w:tcPr>
+            <w:tcW w:w="4148" w:type="dxa"/>
+          </w:tcPr>
+          <w:p>
+            <w:pPr>
+              <w:rPr>
+                <w:rFonts w:ascii="Times New Roman" w:eastAsia="標楷體" w:hAnsi="Times New Roman" w:cs="Times New Roman"/>
+              </w:rPr>
+            </w:pPr>
+          </w:p>
+        </w:tc>
+      </w:tr>
+      <w:tr>
+        <w:tc>
+          <w:tcPr>
+            <w:tcW w:w="4148" w:type="dxa"/>
+          </w:tcPr>
+          <w:p>
+            <w:pPr>
+              <w:rPr>
+                <w:rFonts w:ascii="Times New Roman" w:eastAsia="標楷體" w:hAnsi="Times New Roman" w:cs="Times New Roman"/>
+              </w:rPr>
+            </w:pPr>
+            <w:r>
+              <w:rPr>
+                <w:rFonts w:ascii="Times New Roman" w:eastAsia="標楷體" w:hAnsi="Times New Roman" w:cs="Times New Roman" w:hint="eastAsia"/>
+              </w:rPr>
+              <w:t>Miscellaneous</w:t>
+            </w:r>
+          </w:p>
+        </w:tc>
+        <w:tc>
+          <w:tcPr>
+            <w:tcW w:w="4148" w:type="dxa"/>
+          </w:tcPr>
+          <w:p>
+            <w:pPr>
+              <w:rPr>
+                <w:rFonts w:ascii="Times New Roman" w:eastAsia="標楷體" w:hAnsi="Times New Roman" w:cs="Times New Roman"/>
+              </w:rPr>
+            </w:pPr>
+          </w:p>
+        </w:tc>
+      </w:tr>
+    </w:tbl>
+    <w:p>
+      <w:pPr>
+        <w:rPr>
+          <w:rFonts w:ascii="Times New Roman" w:eastAsia="標楷體" w:hAnsi="Times New Roman" w:cs="Times New Roman" w:hint="eastAsia"/>
+        </w:rPr>
+      </w:pPr>
+    </w:p>
+    <w:p>
+      <w:pPr>
+        <w:rPr>
           <w:rFonts w:ascii="Times New Roman" w:eastAsia="標楷體" w:hAnsi="Times New Roman" w:cs="Times New Roman"/>
         </w:rPr>
       </w:pPr>
@@ -2450,7 +2929,19 @@
         <w:rPr>
           <w:rFonts w:ascii="Times New Roman" w:eastAsia="標楷體" w:hAnsi="Times New Roman" w:cs="Times New Roman" w:hint="eastAsia"/>
         </w:rPr>
-        <w:t xml:space="preserve">1.5.3 </w:t>
+        <w:t>1.5.</w:t>
+      </w:r>
+      <w:r>
+        <w:rPr>
+          <w:rFonts w:ascii="Times New Roman" w:eastAsia="標楷體" w:hAnsi="Times New Roman" w:cs="Times New Roman" w:hint="eastAsia"/>
+        </w:rPr>
+        <w:t>4</w:t>
+      </w:r>
+      <w:r>
+        <w:rPr>
+          <w:rFonts w:ascii="Times New Roman" w:eastAsia="標楷體" w:hAnsi="Times New Roman" w:cs="Times New Roman" w:hint="eastAsia"/>
+        </w:rPr>
+        <w:t xml:space="preserve"> </w:t>
       </w:r>
       <w:r>
         <w:rPr>
@@ -2536,16 +3027,12 @@
                 <w:rFonts w:ascii="Times New Roman" w:eastAsia="標楷體" w:hAnsi="Times New Roman" w:cs="Times New Roman"/>
               </w:rPr>
             </w:pPr>
-            <w:proofErr w:type="spellStart"/>
-            <w:proofErr w:type="gramStart"/>
             <w:r>
               <w:rPr>
                 <w:rFonts w:ascii="Times New Roman" w:eastAsia="標楷體" w:hAnsi="Times New Roman" w:cs="Times New Roman" w:hint="eastAsia"/>
               </w:rPr>
               <w:t>Re:Book</w:t>
             </w:r>
-            <w:proofErr w:type="spellEnd"/>
-            <w:proofErr w:type="gramEnd"/>
           </w:p>
         </w:tc>
       </w:tr>
@@ -2664,28 +3151,15 @@
               <w:rPr>
                 <w:rFonts w:ascii="Times New Roman" w:eastAsia="標楷體" w:hAnsi="Times New Roman" w:cs="Times New Roman" w:hint="eastAsia"/>
               </w:rPr>
-              <w:t>買家：希望直接聯繫賣家以詢問書</w:t>
-            </w:r>
-            <w:proofErr w:type="gramStart"/>
-            <w:r>
-              <w:rPr>
-                <w:rFonts w:ascii="Times New Roman" w:eastAsia="標楷體" w:hAnsi="Times New Roman" w:cs="Times New Roman" w:hint="eastAsia"/>
-              </w:rPr>
-              <w:t>況</w:t>
-            </w:r>
-            <w:proofErr w:type="gramEnd"/>
-            <w:r>
-              <w:rPr>
-                <w:rFonts w:ascii="Times New Roman" w:eastAsia="標楷體" w:hAnsi="Times New Roman" w:cs="Times New Roman" w:hint="eastAsia"/>
-              </w:rPr>
-              <w:t>細節或協商最終價格</w:t>
-            </w:r>
-            <w:r>
-              <w:rPr>
-                <w:rFonts w:ascii="Times New Roman" w:eastAsia="標楷體" w:hAnsi="Times New Roman" w:cs="Times New Roman"/>
-              </w:rPr>
-              <w:br/>
-            </w:r>
+              <w:t>買家：希望直接聯繫賣家以詢問書況細節或協商最終價格</w:t>
+            </w:r>
+          </w:p>
+          <w:p>
+            <w:pPr>
+              <w:rPr>
+                <w:rFonts w:ascii="Times New Roman" w:eastAsia="標楷體" w:hAnsi="Times New Roman" w:cs="Times New Roman"/>
+              </w:rPr>
+            </w:pPr>
             <w:r>
               <w:rPr>
                 <w:rFonts w:ascii="Times New Roman" w:eastAsia="標楷體" w:hAnsi="Times New Roman" w:cs="Times New Roman" w:hint="eastAsia"/>
@@ -2740,7 +3214,19 @@
               <w:rPr>
                 <w:rFonts w:ascii="Times New Roman" w:eastAsia="標楷體" w:hAnsi="Times New Roman" w:cs="Times New Roman" w:hint="eastAsia"/>
               </w:rPr>
-              <w:t>買家必須已登入系統，且正處於某一本書籍的詳細資訊頁面。</w:t>
+              <w:t>買家必須已登入系統，且正處於某一</w:t>
+            </w:r>
+            <w:r>
+              <w:rPr>
+                <w:rFonts w:ascii="Times New Roman" w:eastAsia="標楷體" w:hAnsi="Times New Roman" w:cs="Times New Roman" w:hint="eastAsia"/>
+              </w:rPr>
+              <w:t>件商品</w:t>
+            </w:r>
+            <w:r>
+              <w:rPr>
+                <w:rFonts w:ascii="Times New Roman" w:eastAsia="標楷體" w:hAnsi="Times New Roman" w:cs="Times New Roman" w:hint="eastAsia"/>
+              </w:rPr>
+              <w:t>的詳細資訊頁面。</w:t>
             </w:r>
           </w:p>
         </w:tc>
@@ -2778,40 +3264,27 @@
               <w:rPr>
                 <w:rFonts w:ascii="Times New Roman" w:eastAsia="標楷體" w:hAnsi="Times New Roman" w:cs="Times New Roman" w:hint="eastAsia"/>
               </w:rPr>
-              <w:t>訊息正確</w:t>
-            </w:r>
-            <w:proofErr w:type="gramStart"/>
-            <w:r>
-              <w:rPr>
-                <w:rFonts w:ascii="Times New Roman" w:eastAsia="標楷體" w:hAnsi="Times New Roman" w:cs="Times New Roman" w:hint="eastAsia"/>
-              </w:rPr>
-              <w:t>傳送至賣家</w:t>
-            </w:r>
-            <w:proofErr w:type="gramEnd"/>
-            <w:r>
-              <w:rPr>
-                <w:rFonts w:ascii="Times New Roman" w:eastAsia="標楷體" w:hAnsi="Times New Roman" w:cs="Times New Roman" w:hint="eastAsia"/>
-              </w:rPr>
-              <w:t>的收件匣，且雙方能看到完整的歷史對話紀錄。</w:t>
-            </w:r>
-          </w:p>
-        </w:tc>
-      </w:tr>
-      <w:tr>
-        <w:tc>
-          <w:tcPr>
-            <w:tcW w:w="4148" w:type="dxa"/>
-          </w:tcPr>
-          <w:p>
-            <w:pPr>
-              <w:rPr>
-                <w:rFonts w:ascii="Times New Roman" w:eastAsia="標楷體" w:hAnsi="Times New Roman" w:cs="Times New Roman"/>
-              </w:rPr>
-            </w:pPr>
-            <w:r>
-              <w:rPr>
-                <w:rFonts w:ascii="Times New Roman" w:eastAsia="標楷體" w:hAnsi="Times New Roman" w:cs="Times New Roman" w:hint="eastAsia"/>
-              </w:rPr>
+              <w:t>訊息正確傳送至賣家的收件匣，且雙方能看到完整的歷史對話紀錄。</w:t>
+            </w:r>
+          </w:p>
+        </w:tc>
+      </w:tr>
+      <w:tr>
+        <w:tc>
+          <w:tcPr>
+            <w:tcW w:w="4148" w:type="dxa"/>
+          </w:tcPr>
+          <w:p>
+            <w:pPr>
+              <w:rPr>
+                <w:rFonts w:ascii="Times New Roman" w:eastAsia="標楷體" w:hAnsi="Times New Roman" w:cs="Times New Roman"/>
+              </w:rPr>
+            </w:pPr>
+            <w:r>
+              <w:rPr>
+                <w:rFonts w:ascii="Times New Roman" w:eastAsia="標楷體" w:hAnsi="Times New Roman" w:cs="Times New Roman" w:hint="eastAsia"/>
+              </w:rPr>
+              <w:lastRenderedPageBreak/>
               <w:t>Main Success Scenario</w:t>
             </w:r>
           </w:p>
@@ -2836,21 +3309,19 @@
               <w:rPr>
                 <w:rFonts w:ascii="Times New Roman" w:eastAsia="標楷體" w:hAnsi="Times New Roman" w:cs="Times New Roman" w:hint="eastAsia"/>
               </w:rPr>
-              <w:t>買家在書籍詳情</w:t>
-            </w:r>
-            <w:proofErr w:type="gramStart"/>
-            <w:r>
-              <w:rPr>
-                <w:rFonts w:ascii="Times New Roman" w:eastAsia="標楷體" w:hAnsi="Times New Roman" w:cs="Times New Roman" w:hint="eastAsia"/>
-              </w:rPr>
-              <w:t>頁面點擊</w:t>
-            </w:r>
-            <w:proofErr w:type="gramEnd"/>
-            <w:r>
-              <w:rPr>
-                <w:rFonts w:ascii="Times New Roman" w:eastAsia="標楷體" w:hAnsi="Times New Roman" w:cs="Times New Roman" w:hint="eastAsia"/>
-              </w:rPr>
-              <w:t>「聯繫賣家」按鈕。</w:t>
+              <w:t>買家在</w:t>
+            </w:r>
+            <w:r>
+              <w:rPr>
+                <w:rFonts w:ascii="Times New Roman" w:eastAsia="標楷體" w:hAnsi="Times New Roman" w:cs="Times New Roman" w:hint="eastAsia"/>
+              </w:rPr>
+              <w:t>商品</w:t>
+            </w:r>
+            <w:r>
+              <w:rPr>
+                <w:rFonts w:ascii="Times New Roman" w:eastAsia="標楷體" w:hAnsi="Times New Roman" w:cs="Times New Roman" w:hint="eastAsia"/>
+              </w:rPr>
+              <w:t>詳情頁面點擊「聯繫賣家」按鈕。</w:t>
             </w:r>
           </w:p>
           <w:p>
@@ -2869,21 +3340,19 @@
               <w:rPr>
                 <w:rFonts w:ascii="Times New Roman" w:eastAsia="標楷體" w:hAnsi="Times New Roman" w:cs="Times New Roman" w:hint="eastAsia"/>
               </w:rPr>
-              <w:t>系統開啟該書籍專屬</w:t>
-            </w:r>
-            <w:proofErr w:type="gramStart"/>
-            <w:r>
-              <w:rPr>
-                <w:rFonts w:ascii="Times New Roman" w:eastAsia="標楷體" w:hAnsi="Times New Roman" w:cs="Times New Roman" w:hint="eastAsia"/>
-              </w:rPr>
-              <w:t>的私訊對話</w:t>
-            </w:r>
-            <w:proofErr w:type="gramEnd"/>
-            <w:r>
-              <w:rPr>
-                <w:rFonts w:ascii="Times New Roman" w:eastAsia="標楷體" w:hAnsi="Times New Roman" w:cs="Times New Roman" w:hint="eastAsia"/>
-              </w:rPr>
-              <w:t>視窗。</w:t>
+              <w:t>系統開啟該</w:t>
+            </w:r>
+            <w:r>
+              <w:rPr>
+                <w:rFonts w:ascii="Times New Roman" w:eastAsia="標楷體" w:hAnsi="Times New Roman" w:cs="Times New Roman" w:hint="eastAsia"/>
+              </w:rPr>
+              <w:t>商品</w:t>
+            </w:r>
+            <w:r>
+              <w:rPr>
+                <w:rFonts w:ascii="Times New Roman" w:eastAsia="標楷體" w:hAnsi="Times New Roman" w:cs="Times New Roman" w:hint="eastAsia"/>
+              </w:rPr>
+              <w:t>專屬的私訊對話視窗。</w:t>
             </w:r>
           </w:p>
           <w:p>
@@ -2902,35 +3371,7 @@
               <w:rPr>
                 <w:rFonts w:ascii="Times New Roman" w:eastAsia="標楷體" w:hAnsi="Times New Roman" w:cs="Times New Roman" w:hint="eastAsia"/>
               </w:rPr>
-              <w:t>買家輸入諮詢內容</w:t>
-            </w:r>
-            <w:proofErr w:type="gramStart"/>
-            <w:r>
-              <w:rPr>
-                <w:rFonts w:ascii="Times New Roman" w:eastAsia="標楷體" w:hAnsi="Times New Roman" w:cs="Times New Roman" w:hint="eastAsia"/>
-              </w:rPr>
-              <w:t>（</w:t>
-            </w:r>
-            <w:proofErr w:type="gramEnd"/>
-            <w:r>
-              <w:rPr>
-                <w:rFonts w:ascii="Times New Roman" w:eastAsia="標楷體" w:hAnsi="Times New Roman" w:cs="Times New Roman" w:hint="eastAsia"/>
-              </w:rPr>
-              <w:t>如：詢問筆記狀況、議價或約定地點</w:t>
-            </w:r>
-            <w:proofErr w:type="gramStart"/>
-            <w:r>
-              <w:rPr>
-                <w:rFonts w:ascii="Times New Roman" w:eastAsia="標楷體" w:hAnsi="Times New Roman" w:cs="Times New Roman" w:hint="eastAsia"/>
-              </w:rPr>
-              <w:t>）</w:t>
-            </w:r>
-            <w:proofErr w:type="gramEnd"/>
-            <w:r>
-              <w:rPr>
-                <w:rFonts w:ascii="Times New Roman" w:eastAsia="標楷體" w:hAnsi="Times New Roman" w:cs="Times New Roman" w:hint="eastAsia"/>
-              </w:rPr>
-              <w:t>。</w:t>
+              <w:t>買家輸入諮詢內容（如：詢問筆記狀況、議價或約定地點）。</w:t>
             </w:r>
           </w:p>
           <w:p>
@@ -3119,41 +3560,26 @@
               <w:rPr>
                 <w:rFonts w:ascii="Times New Roman" w:eastAsia="標楷體" w:hAnsi="Times New Roman" w:cs="Times New Roman" w:hint="eastAsia"/>
               </w:rPr>
-              <w:t>支援文字訊息；未來可擴充支援圖片傳送（用於拍攝更詳細的書</w:t>
-            </w:r>
-            <w:proofErr w:type="gramStart"/>
-            <w:r>
-              <w:rPr>
-                <w:rFonts w:ascii="Times New Roman" w:eastAsia="標楷體" w:hAnsi="Times New Roman" w:cs="Times New Roman" w:hint="eastAsia"/>
-              </w:rPr>
-              <w:t>況</w:t>
-            </w:r>
-            <w:proofErr w:type="gramEnd"/>
-            <w:r>
-              <w:rPr>
-                <w:rFonts w:ascii="Times New Roman" w:eastAsia="標楷體" w:hAnsi="Times New Roman" w:cs="Times New Roman" w:hint="eastAsia"/>
-              </w:rPr>
-              <w:t>）。</w:t>
-            </w:r>
-          </w:p>
-        </w:tc>
-      </w:tr>
-      <w:tr>
-        <w:tc>
-          <w:tcPr>
-            <w:tcW w:w="4148" w:type="dxa"/>
-          </w:tcPr>
-          <w:p>
-            <w:pPr>
-              <w:rPr>
-                <w:rFonts w:ascii="Times New Roman" w:eastAsia="標楷體" w:hAnsi="Times New Roman" w:cs="Times New Roman"/>
-              </w:rPr>
-            </w:pPr>
-            <w:r>
-              <w:rPr>
-                <w:rFonts w:ascii="Times New Roman" w:eastAsia="標楷體" w:hAnsi="Times New Roman" w:cs="Times New Roman" w:hint="eastAsia"/>
-              </w:rPr>
-              <w:lastRenderedPageBreak/>
+              <w:t>支援文字訊息；未來可擴充支援圖片傳送（用於拍攝更詳細的書況）。</w:t>
+            </w:r>
+          </w:p>
+        </w:tc>
+      </w:tr>
+      <w:tr>
+        <w:tc>
+          <w:tcPr>
+            <w:tcW w:w="4148" w:type="dxa"/>
+          </w:tcPr>
+          <w:p>
+            <w:pPr>
+              <w:rPr>
+                <w:rFonts w:ascii="Times New Roman" w:eastAsia="標楷體" w:hAnsi="Times New Roman" w:cs="Times New Roman"/>
+              </w:rPr>
+            </w:pPr>
+            <w:r>
+              <w:rPr>
+                <w:rFonts w:ascii="Times New Roman" w:eastAsia="標楷體" w:hAnsi="Times New Roman" w:cs="Times New Roman" w:hint="eastAsia"/>
+              </w:rPr>
               <w:t>Frequency of Occurrence</w:t>
             </w:r>
           </w:p>
@@ -3172,7 +3598,19 @@
               <w:rPr>
                 <w:rFonts w:ascii="Times New Roman" w:eastAsia="標楷體" w:hAnsi="Times New Roman" w:cs="Times New Roman" w:hint="eastAsia"/>
               </w:rPr>
-              <w:t>當買家對特定書籍有購買意願或疑問時觸發（高頻率）。</w:t>
+              <w:t>當買家對特定</w:t>
+            </w:r>
+            <w:r>
+              <w:rPr>
+                <w:rFonts w:ascii="Times New Roman" w:eastAsia="標楷體" w:hAnsi="Times New Roman" w:cs="Times New Roman" w:hint="eastAsia"/>
+              </w:rPr>
+              <w:t>商品</w:t>
+            </w:r>
+            <w:r>
+              <w:rPr>
+                <w:rFonts w:ascii="Times New Roman" w:eastAsia="標楷體" w:hAnsi="Times New Roman" w:cs="Times New Roman" w:hint="eastAsia"/>
+              </w:rPr>
+              <w:t>有購買意願或疑問時觸發（高頻率）。</w:t>
             </w:r>
           </w:p>
         </w:tc>
@@ -3233,7 +3671,19 @@
         <w:rPr>
           <w:rFonts w:ascii="Times New Roman" w:eastAsia="標楷體" w:hAnsi="Times New Roman" w:cs="Times New Roman" w:hint="eastAsia"/>
         </w:rPr>
-        <w:t xml:space="preserve">1.5.4 </w:t>
+        <w:t>1.5.</w:t>
+      </w:r>
+      <w:r>
+        <w:rPr>
+          <w:rFonts w:ascii="Times New Roman" w:eastAsia="標楷體" w:hAnsi="Times New Roman" w:cs="Times New Roman" w:hint="eastAsia"/>
+        </w:rPr>
+        <w:t>5</w:t>
+      </w:r>
+      <w:r>
+        <w:rPr>
+          <w:rFonts w:ascii="Times New Roman" w:eastAsia="標楷體" w:hAnsi="Times New Roman" w:cs="Times New Roman" w:hint="eastAsia"/>
+        </w:rPr>
+        <w:t xml:space="preserve"> </w:t>
       </w:r>
       <w:r>
         <w:rPr>
@@ -3319,16 +3769,12 @@
                 <w:rFonts w:ascii="Times New Roman" w:eastAsia="標楷體" w:hAnsi="Times New Roman" w:cs="Times New Roman"/>
               </w:rPr>
             </w:pPr>
-            <w:proofErr w:type="spellStart"/>
-            <w:proofErr w:type="gramStart"/>
             <w:r>
               <w:rPr>
                 <w:rFonts w:ascii="Times New Roman" w:eastAsia="標楷體" w:hAnsi="Times New Roman" w:cs="Times New Roman" w:hint="eastAsia"/>
               </w:rPr>
               <w:t>Re:Book</w:t>
             </w:r>
-            <w:proofErr w:type="spellEnd"/>
-            <w:proofErr w:type="gramEnd"/>
           </w:p>
         </w:tc>
       </w:tr>
@@ -3447,19 +3893,56 @@
               <w:rPr>
                 <w:rFonts w:ascii="Times New Roman" w:eastAsia="標楷體" w:hAnsi="Times New Roman" w:cs="Times New Roman" w:hint="eastAsia"/>
               </w:rPr>
-              <w:t>賣家：希望將上架的多本書籍整理得井然有序，提高賣場專業度與成交率</w:t>
-            </w:r>
-            <w:r>
-              <w:rPr>
-                <w:rFonts w:ascii="Times New Roman" w:eastAsia="標楷體" w:hAnsi="Times New Roman" w:cs="Times New Roman"/>
-              </w:rPr>
-              <w:br/>
-            </w:r>
-            <w:r>
-              <w:rPr>
-                <w:rFonts w:ascii="Times New Roman" w:eastAsia="標楷體" w:hAnsi="Times New Roman" w:cs="Times New Roman" w:hint="eastAsia"/>
-              </w:rPr>
-              <w:t>買家：希望能根據類別（如系所、科目）快速瀏覽賣家的所有藏書。</w:t>
+              <w:t>賣家：希望將上架的多</w:t>
+            </w:r>
+            <w:r>
+              <w:rPr>
+                <w:rFonts w:ascii="Times New Roman" w:eastAsia="標楷體" w:hAnsi="Times New Roman" w:cs="Times New Roman" w:hint="eastAsia"/>
+              </w:rPr>
+              <w:t>件商品</w:t>
+            </w:r>
+            <w:r>
+              <w:rPr>
+                <w:rFonts w:ascii="Times New Roman" w:eastAsia="標楷體" w:hAnsi="Times New Roman" w:cs="Times New Roman" w:hint="eastAsia"/>
+              </w:rPr>
+              <w:t>整理得井然有序，提高賣場專業度與成交率</w:t>
+            </w:r>
+          </w:p>
+          <w:p>
+            <w:pPr>
+              <w:rPr>
+                <w:rFonts w:ascii="Times New Roman" w:eastAsia="標楷體" w:hAnsi="Times New Roman" w:cs="Times New Roman"/>
+              </w:rPr>
+            </w:pPr>
+            <w:r>
+              <w:rPr>
+                <w:rFonts w:ascii="Times New Roman" w:eastAsia="標楷體" w:hAnsi="Times New Roman" w:cs="Times New Roman" w:hint="eastAsia"/>
+              </w:rPr>
+              <w:t>買家：希望能根據</w:t>
+            </w:r>
+            <w:r>
+              <w:rPr>
+                <w:rFonts w:ascii="Times New Roman" w:eastAsia="標楷體" w:hAnsi="Times New Roman" w:cs="Times New Roman" w:hint="eastAsia"/>
+              </w:rPr>
+              <w:t>賣家建立的</w:t>
+            </w:r>
+            <w:r>
+              <w:rPr>
+                <w:rFonts w:ascii="Times New Roman" w:eastAsia="標楷體" w:hAnsi="Times New Roman" w:cs="Times New Roman" w:hint="eastAsia"/>
+              </w:rPr>
+              <w:t>類別快速瀏覽賣家的所有</w:t>
+            </w:r>
+            <w:r>
+              <w:rPr>
+                <w:rFonts w:ascii="Times New Roman" w:eastAsia="標楷體" w:hAnsi="Times New Roman" w:cs="Times New Roman" w:hint="eastAsia"/>
+              </w:rPr>
+              <w:t>商品</w:t>
+            </w:r>
+            <w:r>
+              <w:rPr>
+                <w:rFonts w:ascii="Times New Roman" w:eastAsia="標楷體" w:hAnsi="Times New Roman" w:cs="Times New Roman" w:hint="eastAsia"/>
+              </w:rPr>
+              <w:t>。</w:t>
             </w:r>
           </w:p>
         </w:tc>
@@ -3497,21 +3980,19 @@
               <w:rPr>
                 <w:rFonts w:ascii="Times New Roman" w:eastAsia="標楷體" w:hAnsi="Times New Roman" w:cs="Times New Roman" w:hint="eastAsia"/>
               </w:rPr>
-              <w:t>賣家必須已登入，且帳號內已上架</w:t>
-            </w:r>
-            <w:proofErr w:type="gramStart"/>
-            <w:r>
-              <w:rPr>
-                <w:rFonts w:ascii="Times New Roman" w:eastAsia="標楷體" w:hAnsi="Times New Roman" w:cs="Times New Roman" w:hint="eastAsia"/>
-              </w:rPr>
-              <w:t>多本待售</w:t>
-            </w:r>
-            <w:proofErr w:type="gramEnd"/>
-            <w:r>
-              <w:rPr>
-                <w:rFonts w:ascii="Times New Roman" w:eastAsia="標楷體" w:hAnsi="Times New Roman" w:cs="Times New Roman" w:hint="eastAsia"/>
-              </w:rPr>
-              <w:t>書籍。</w:t>
+              <w:t>賣家必須已登入，且帳號內已上架多</w:t>
+            </w:r>
+            <w:r>
+              <w:rPr>
+                <w:rFonts w:ascii="Times New Roman" w:eastAsia="標楷體" w:hAnsi="Times New Roman" w:cs="Times New Roman" w:hint="eastAsia"/>
+              </w:rPr>
+              <w:t>件待售商品</w:t>
+            </w:r>
+            <w:r>
+              <w:rPr>
+                <w:rFonts w:ascii="Times New Roman" w:eastAsia="標楷體" w:hAnsi="Times New Roman" w:cs="Times New Roman" w:hint="eastAsia"/>
+              </w:rPr>
+              <w:t>。</w:t>
             </w:r>
           </w:p>
         </w:tc>
@@ -3549,21 +4030,31 @@
               <w:rPr>
                 <w:rFonts w:ascii="Times New Roman" w:eastAsia="標楷體" w:hAnsi="Times New Roman" w:cs="Times New Roman" w:hint="eastAsia"/>
               </w:rPr>
-              <w:t>書籍被正確歸類至指定的分類中，且買家在賣家個人頁面能看到</w:t>
-            </w:r>
-            <w:proofErr w:type="gramStart"/>
-            <w:r>
-              <w:rPr>
-                <w:rFonts w:ascii="Times New Roman" w:eastAsia="標楷體" w:hAnsi="Times New Roman" w:cs="Times New Roman" w:hint="eastAsia"/>
-              </w:rPr>
-              <w:t>清楚的</w:t>
-            </w:r>
-            <w:proofErr w:type="gramEnd"/>
-            <w:r>
-              <w:rPr>
-                <w:rFonts w:ascii="Times New Roman" w:eastAsia="標楷體" w:hAnsi="Times New Roman" w:cs="Times New Roman" w:hint="eastAsia"/>
-              </w:rPr>
-              <w:t>分類結構。</w:t>
+              <w:t>商品</w:t>
+            </w:r>
+            <w:r>
+              <w:rPr>
+                <w:rFonts w:ascii="Times New Roman" w:eastAsia="標楷體" w:hAnsi="Times New Roman" w:cs="Times New Roman" w:hint="eastAsia"/>
+              </w:rPr>
+              <w:t>能</w:t>
+            </w:r>
+            <w:r>
+              <w:rPr>
+                <w:rFonts w:ascii="Times New Roman" w:eastAsia="標楷體" w:hAnsi="Times New Roman" w:cs="Times New Roman" w:hint="eastAsia"/>
+              </w:rPr>
+              <w:t>被正確歸類至</w:t>
+            </w:r>
+            <w:r>
+              <w:rPr>
+                <w:rFonts w:ascii="Times New Roman" w:eastAsia="標楷體" w:hAnsi="Times New Roman" w:cs="Times New Roman" w:hint="eastAsia"/>
+              </w:rPr>
+              <w:t>賣家建立的</w:t>
+            </w:r>
+            <w:r>
+              <w:rPr>
+                <w:rFonts w:ascii="Times New Roman" w:eastAsia="標楷體" w:hAnsi="Times New Roman" w:cs="Times New Roman" w:hint="eastAsia"/>
+              </w:rPr>
+              <w:t>的分類中，且買家在賣家個人頁面能看到清楚的分類結構。</w:t>
             </w:r>
           </w:p>
         </w:tc>
@@ -3620,13 +4111,26 @@
               <w:rPr>
                 <w:rFonts w:ascii="Times New Roman" w:eastAsia="標楷體" w:hAnsi="Times New Roman" w:cs="Times New Roman" w:hint="eastAsia"/>
               </w:rPr>
+              <w:lastRenderedPageBreak/>
               <w:t xml:space="preserve">2. </w:t>
             </w:r>
             <w:r>
               <w:rPr>
                 <w:rFonts w:ascii="Times New Roman" w:eastAsia="標楷體" w:hAnsi="Times New Roman" w:cs="Times New Roman" w:hint="eastAsia"/>
               </w:rPr>
-              <w:t>賣家選擇「建立</w:t>
+              <w:t>賣家</w:t>
+            </w:r>
+            <w:r>
+              <w:rPr>
+                <w:rFonts w:ascii="Times New Roman" w:eastAsia="標楷體" w:hAnsi="Times New Roman" w:cs="Times New Roman" w:hint="eastAsia"/>
+              </w:rPr>
+              <w:t>點選</w:t>
+            </w:r>
+            <w:r>
+              <w:rPr>
+                <w:rFonts w:ascii="Times New Roman" w:eastAsia="標楷體" w:hAnsi="Times New Roman" w:cs="Times New Roman" w:hint="eastAsia"/>
+              </w:rPr>
+              <w:t>「建立</w:t>
             </w:r>
             <w:r>
               <w:rPr>
@@ -3640,42 +4144,12 @@
               </w:rPr>
               <w:t>編輯分類」</w:t>
             </w:r>
-            <w:proofErr w:type="gramStart"/>
-            <w:r>
-              <w:rPr>
-                <w:rFonts w:ascii="Times New Roman" w:eastAsia="標楷體" w:hAnsi="Times New Roman" w:cs="Times New Roman" w:hint="eastAsia"/>
-              </w:rPr>
-              <w:t>（</w:t>
-            </w:r>
-            <w:proofErr w:type="gramEnd"/>
-            <w:r>
-              <w:rPr>
-                <w:rFonts w:ascii="Times New Roman" w:eastAsia="標楷體" w:hAnsi="Times New Roman" w:cs="Times New Roman" w:hint="eastAsia"/>
-              </w:rPr>
-              <w:t>如：資工系大</w:t>
-            </w:r>
-            <w:proofErr w:type="gramStart"/>
-            <w:r>
-              <w:rPr>
-                <w:rFonts w:ascii="Times New Roman" w:eastAsia="標楷體" w:hAnsi="Times New Roman" w:cs="Times New Roman" w:hint="eastAsia"/>
-              </w:rPr>
-              <w:t>一</w:t>
-            </w:r>
-            <w:proofErr w:type="gramEnd"/>
-            <w:r>
-              <w:rPr>
-                <w:rFonts w:ascii="Times New Roman" w:eastAsia="標楷體" w:hAnsi="Times New Roman" w:cs="Times New Roman" w:hint="eastAsia"/>
-              </w:rPr>
-              <w:t>教材、語言學習書</w:t>
-            </w:r>
-            <w:proofErr w:type="gramStart"/>
-            <w:r>
-              <w:rPr>
-                <w:rFonts w:ascii="Times New Roman" w:eastAsia="標楷體" w:hAnsi="Times New Roman" w:cs="Times New Roman" w:hint="eastAsia"/>
-              </w:rPr>
-              <w:t>）</w:t>
-            </w:r>
-            <w:proofErr w:type="gramEnd"/>
+            <w:r>
+              <w:rPr>
+                <w:rFonts w:ascii="Times New Roman" w:eastAsia="標楷體" w:hAnsi="Times New Roman" w:cs="Times New Roman" w:hint="eastAsia"/>
+              </w:rPr>
+              <w:t>按鈕</w:t>
+            </w:r>
             <w:r>
               <w:rPr>
                 <w:rFonts w:ascii="Times New Roman" w:eastAsia="標楷體" w:hAnsi="Times New Roman" w:cs="Times New Roman" w:hint="eastAsia"/>
@@ -3686,7 +4160,7 @@
           <w:p>
             <w:pPr>
               <w:rPr>
-                <w:rFonts w:ascii="Times New Roman" w:eastAsia="標楷體" w:hAnsi="Times New Roman" w:cs="Times New Roman"/>
+                <w:rFonts w:ascii="Times New Roman" w:eastAsia="標楷體" w:hAnsi="Times New Roman" w:cs="Times New Roman" w:hint="eastAsia"/>
               </w:rPr>
             </w:pPr>
             <w:r>
@@ -3699,7 +4173,50 @@
               <w:rPr>
                 <w:rFonts w:ascii="Times New Roman" w:eastAsia="標楷體" w:hAnsi="Times New Roman" w:cs="Times New Roman" w:hint="eastAsia"/>
               </w:rPr>
-              <w:t>賣家從已上架的書籍清單中，勾選欲歸入該分類的多本書籍。</w:t>
+              <w:t>賣家輸入自定義的類別名稱。</w:t>
+            </w:r>
+          </w:p>
+          <w:p>
+            <w:pPr>
+              <w:rPr>
+                <w:rFonts w:ascii="Times New Roman" w:eastAsia="標楷體" w:hAnsi="Times New Roman" w:cs="Times New Roman"/>
+              </w:rPr>
+            </w:pPr>
+            <w:r>
+              <w:rPr>
+                <w:rFonts w:ascii="Times New Roman" w:eastAsia="標楷體" w:hAnsi="Times New Roman" w:cs="Times New Roman" w:hint="eastAsia"/>
+              </w:rPr>
+              <w:t xml:space="preserve">3. </w:t>
+            </w:r>
+            <w:r>
+              <w:rPr>
+                <w:rFonts w:ascii="Times New Roman" w:eastAsia="標楷體" w:hAnsi="Times New Roman" w:cs="Times New Roman" w:hint="eastAsia"/>
+              </w:rPr>
+              <w:t>賣家從已上架的</w:t>
+            </w:r>
+            <w:r>
+              <w:rPr>
+                <w:rFonts w:ascii="Times New Roman" w:eastAsia="標楷體" w:hAnsi="Times New Roman" w:cs="Times New Roman" w:hint="eastAsia"/>
+              </w:rPr>
+              <w:t>商品</w:t>
+            </w:r>
+            <w:r>
+              <w:rPr>
+                <w:rFonts w:ascii="Times New Roman" w:eastAsia="標楷體" w:hAnsi="Times New Roman" w:cs="Times New Roman" w:hint="eastAsia"/>
+              </w:rPr>
+              <w:t>清單中，勾選欲歸入該分類的多</w:t>
+            </w:r>
+            <w:r>
+              <w:rPr>
+                <w:rFonts w:ascii="Times New Roman" w:eastAsia="標楷體" w:hAnsi="Times New Roman" w:cs="Times New Roman" w:hint="eastAsia"/>
+              </w:rPr>
+              <w:t>個商品</w:t>
+            </w:r>
+            <w:r>
+              <w:rPr>
+                <w:rFonts w:ascii="Times New Roman" w:eastAsia="標楷體" w:hAnsi="Times New Roman" w:cs="Times New Roman" w:hint="eastAsia"/>
+              </w:rPr>
+              <w:t>。</w:t>
             </w:r>
           </w:p>
           <w:p>
@@ -3714,19 +4231,35 @@
               </w:rPr>
               <w:t xml:space="preserve">4. </w:t>
             </w:r>
-            <w:proofErr w:type="gramStart"/>
-            <w:r>
-              <w:rPr>
-                <w:rFonts w:ascii="Times New Roman" w:eastAsia="標楷體" w:hAnsi="Times New Roman" w:cs="Times New Roman" w:hint="eastAsia"/>
-              </w:rPr>
-              <w:t>賣家點擊</w:t>
-            </w:r>
-            <w:proofErr w:type="gramEnd"/>
-            <w:r>
-              <w:rPr>
-                <w:rFonts w:ascii="Times New Roman" w:eastAsia="標楷體" w:hAnsi="Times New Roman" w:cs="Times New Roman" w:hint="eastAsia"/>
-              </w:rPr>
-              <w:t>「確認套用」。</w:t>
+            <w:r>
+              <w:rPr>
+                <w:rFonts w:ascii="Times New Roman" w:eastAsia="標楷體" w:hAnsi="Times New Roman" w:cs="Times New Roman" w:hint="eastAsia"/>
+              </w:rPr>
+              <w:t>賣家點</w:t>
+            </w:r>
+            <w:r>
+              <w:rPr>
+                <w:rFonts w:ascii="Times New Roman" w:eastAsia="標楷體" w:hAnsi="Times New Roman" w:cs="Times New Roman" w:hint="eastAsia"/>
+              </w:rPr>
+              <w:t>選</w:t>
+            </w:r>
+            <w:r>
+              <w:rPr>
+                <w:rFonts w:ascii="Times New Roman" w:eastAsia="標楷體" w:hAnsi="Times New Roman" w:cs="Times New Roman" w:hint="eastAsia"/>
+              </w:rPr>
+              <w:t>「確認套用」</w:t>
+            </w:r>
+            <w:r>
+              <w:rPr>
+                <w:rFonts w:ascii="Times New Roman" w:eastAsia="標楷體" w:hAnsi="Times New Roman" w:cs="Times New Roman" w:hint="eastAsia"/>
+              </w:rPr>
+              <w:t>按鈕</w:t>
+            </w:r>
+            <w:r>
+              <w:rPr>
+                <w:rFonts w:ascii="Times New Roman" w:eastAsia="標楷體" w:hAnsi="Times New Roman" w:cs="Times New Roman" w:hint="eastAsia"/>
+              </w:rPr>
+              <w:t>。</w:t>
             </w:r>
           </w:p>
           <w:p>
@@ -3745,26 +4278,51 @@
               <w:rPr>
                 <w:rFonts w:ascii="Times New Roman" w:eastAsia="標楷體" w:hAnsi="Times New Roman" w:cs="Times New Roman" w:hint="eastAsia"/>
               </w:rPr>
-              <w:t>系統更新書籍與分類的關聯資料，並即時反映在賣家賣場。</w:t>
-            </w:r>
-          </w:p>
-        </w:tc>
-      </w:tr>
-      <w:tr>
-        <w:tc>
-          <w:tcPr>
-            <w:tcW w:w="4148" w:type="dxa"/>
-          </w:tcPr>
-          <w:p>
-            <w:pPr>
-              <w:rPr>
-                <w:rFonts w:ascii="Times New Roman" w:eastAsia="標楷體" w:hAnsi="Times New Roman" w:cs="Times New Roman"/>
-              </w:rPr>
-            </w:pPr>
-            <w:r>
-              <w:rPr>
-                <w:rFonts w:ascii="Times New Roman" w:eastAsia="標楷體" w:hAnsi="Times New Roman" w:cs="Times New Roman" w:hint="eastAsia"/>
-              </w:rPr>
+              <w:t>系統更新</w:t>
+            </w:r>
+            <w:r>
+              <w:rPr>
+                <w:rFonts w:ascii="Times New Roman" w:eastAsia="標楷體" w:hAnsi="Times New Roman" w:cs="Times New Roman" w:hint="eastAsia"/>
+              </w:rPr>
+              <w:t>賣場</w:t>
+            </w:r>
+            <w:r>
+              <w:rPr>
+                <w:rFonts w:ascii="Times New Roman" w:eastAsia="標楷體" w:hAnsi="Times New Roman" w:cs="Times New Roman" w:hint="eastAsia"/>
+              </w:rPr>
+              <w:t>與分類的關聯資料，並即時反映在賣家</w:t>
+            </w:r>
+            <w:r>
+              <w:rPr>
+                <w:rFonts w:ascii="Times New Roman" w:eastAsia="標楷體" w:hAnsi="Times New Roman" w:cs="Times New Roman" w:hint="eastAsia"/>
+              </w:rPr>
+              <w:t>的個人</w:t>
+            </w:r>
+            <w:r>
+              <w:rPr>
+                <w:rFonts w:ascii="Times New Roman" w:eastAsia="標楷體" w:hAnsi="Times New Roman" w:cs="Times New Roman" w:hint="eastAsia"/>
+              </w:rPr>
+              <w:t>賣場。</w:t>
+            </w:r>
+          </w:p>
+        </w:tc>
+      </w:tr>
+      <w:tr>
+        <w:tc>
+          <w:tcPr>
+            <w:tcW w:w="4148" w:type="dxa"/>
+          </w:tcPr>
+          <w:p>
+            <w:pPr>
+              <w:rPr>
+                <w:rFonts w:ascii="Times New Roman" w:eastAsia="標楷體" w:hAnsi="Times New Roman" w:cs="Times New Roman"/>
+              </w:rPr>
+            </w:pPr>
+            <w:r>
+              <w:rPr>
+                <w:rFonts w:ascii="Times New Roman" w:eastAsia="標楷體" w:hAnsi="Times New Roman" w:cs="Times New Roman" w:hint="eastAsia"/>
+              </w:rPr>
+              <w:lastRenderedPageBreak/>
               <w:t>Extensions</w:t>
             </w:r>
           </w:p>
@@ -3808,7 +4366,19 @@
               <w:rPr>
                 <w:rFonts w:ascii="Times New Roman" w:eastAsia="標楷體" w:hAnsi="Times New Roman" w:cs="Times New Roman" w:hint="eastAsia"/>
               </w:rPr>
-              <w:t>批次移動失敗：若系統在處理大量書籍關聯時發生錯誤，系統應還原狀態並提示賣家重新操作。</w:t>
+              <w:t>批次移動失敗：若系統在處理大量</w:t>
+            </w:r>
+            <w:r>
+              <w:rPr>
+                <w:rFonts w:ascii="Times New Roman" w:eastAsia="標楷體" w:hAnsi="Times New Roman" w:cs="Times New Roman" w:hint="eastAsia"/>
+              </w:rPr>
+              <w:t>商品</w:t>
+            </w:r>
+            <w:r>
+              <w:rPr>
+                <w:rFonts w:ascii="Times New Roman" w:eastAsia="標楷體" w:hAnsi="Times New Roman" w:cs="Times New Roman" w:hint="eastAsia"/>
+              </w:rPr>
+              <w:t>關聯時發生錯誤，系統應還原狀態並提示賣家重新操作。</w:t>
             </w:r>
           </w:p>
           <w:p>
@@ -3827,7 +4397,31 @@
               <w:rPr>
                 <w:rFonts w:ascii="Times New Roman" w:eastAsia="標楷體" w:hAnsi="Times New Roman" w:cs="Times New Roman" w:hint="eastAsia"/>
               </w:rPr>
-              <w:t>刪除分類：賣家刪除分類時，系統需確認書籍是否回歸到「未分類」狀態而非直接刪除書籍。</w:t>
+              <w:t>刪除分類：賣家刪除分類時，系統需確認</w:t>
+            </w:r>
+            <w:r>
+              <w:rPr>
+                <w:rFonts w:ascii="Times New Roman" w:eastAsia="標楷體" w:hAnsi="Times New Roman" w:cs="Times New Roman" w:hint="eastAsia"/>
+              </w:rPr>
+              <w:t>商品</w:t>
+            </w:r>
+            <w:r>
+              <w:rPr>
+                <w:rFonts w:ascii="Times New Roman" w:eastAsia="標楷體" w:hAnsi="Times New Roman" w:cs="Times New Roman" w:hint="eastAsia"/>
+              </w:rPr>
+              <w:t>是否回歸到「未分類」狀態而非直接刪除</w:t>
+            </w:r>
+            <w:r>
+              <w:rPr>
+                <w:rFonts w:ascii="Times New Roman" w:eastAsia="標楷體" w:hAnsi="Times New Roman" w:cs="Times New Roman" w:hint="eastAsia"/>
+              </w:rPr>
+              <w:t>商品</w:t>
+            </w:r>
+            <w:r>
+              <w:rPr>
+                <w:rFonts w:ascii="Times New Roman" w:eastAsia="標楷體" w:hAnsi="Times New Roman" w:cs="Times New Roman" w:hint="eastAsia"/>
+              </w:rPr>
+              <w:t>。</w:t>
             </w:r>
           </w:p>
         </w:tc>
@@ -3865,34 +4459,38 @@
               <w:rPr>
                 <w:rFonts w:ascii="Times New Roman" w:eastAsia="標楷體" w:hAnsi="Times New Roman" w:cs="Times New Roman" w:hint="eastAsia"/>
               </w:rPr>
-              <w:t>支援「批次處理」功能，確保賣家能一次性分類多本書籍，減少重複動</w:t>
-            </w:r>
-            <w:r>
-              <w:rPr>
-                <w:rFonts w:ascii="Times New Roman" w:eastAsia="標楷體" w:hAnsi="Times New Roman" w:cs="Times New Roman" w:hint="eastAsia"/>
-              </w:rPr>
-              <w:lastRenderedPageBreak/>
-              <w:t>作。</w:t>
-            </w:r>
-          </w:p>
-        </w:tc>
-      </w:tr>
-      <w:tr>
-        <w:tc>
-          <w:tcPr>
-            <w:tcW w:w="4148" w:type="dxa"/>
-          </w:tcPr>
-          <w:p>
-            <w:pPr>
-              <w:rPr>
-                <w:rFonts w:ascii="Times New Roman" w:eastAsia="標楷體" w:hAnsi="Times New Roman" w:cs="Times New Roman"/>
-              </w:rPr>
-            </w:pPr>
-            <w:r>
-              <w:rPr>
-                <w:rFonts w:ascii="Times New Roman" w:eastAsia="標楷體" w:hAnsi="Times New Roman" w:cs="Times New Roman" w:hint="eastAsia"/>
-              </w:rPr>
-              <w:lastRenderedPageBreak/>
+              <w:t>支援「批次處理」功能，確保賣家能一次性分類多</w:t>
+            </w:r>
+            <w:r>
+              <w:rPr>
+                <w:rFonts w:ascii="Times New Roman" w:eastAsia="標楷體" w:hAnsi="Times New Roman" w:cs="Times New Roman" w:hint="eastAsia"/>
+              </w:rPr>
+              <w:t>件商品</w:t>
+            </w:r>
+            <w:r>
+              <w:rPr>
+                <w:rFonts w:ascii="Times New Roman" w:eastAsia="標楷體" w:hAnsi="Times New Roman" w:cs="Times New Roman" w:hint="eastAsia"/>
+              </w:rPr>
+              <w:t>，減少重複動作。</w:t>
+            </w:r>
+          </w:p>
+        </w:tc>
+      </w:tr>
+      <w:tr>
+        <w:tc>
+          <w:tcPr>
+            <w:tcW w:w="4148" w:type="dxa"/>
+          </w:tcPr>
+          <w:p>
+            <w:pPr>
+              <w:rPr>
+                <w:rFonts w:ascii="Times New Roman" w:eastAsia="標楷體" w:hAnsi="Times New Roman" w:cs="Times New Roman"/>
+              </w:rPr>
+            </w:pPr>
+            <w:r>
+              <w:rPr>
+                <w:rFonts w:ascii="Times New Roman" w:eastAsia="標楷體" w:hAnsi="Times New Roman" w:cs="Times New Roman" w:hint="eastAsia"/>
+              </w:rPr>
               <w:t>Technology and Data Variations List</w:t>
             </w:r>
           </w:p>
@@ -3911,21 +4509,7 @@
               <w:rPr>
                 <w:rFonts w:ascii="Times New Roman" w:eastAsia="標楷體" w:hAnsi="Times New Roman" w:cs="Times New Roman" w:hint="eastAsia"/>
               </w:rPr>
-              <w:t>系統應預設基礎分類</w:t>
-            </w:r>
-            <w:proofErr w:type="gramStart"/>
-            <w:r>
-              <w:rPr>
-                <w:rFonts w:ascii="Times New Roman" w:eastAsia="標楷體" w:hAnsi="Times New Roman" w:cs="Times New Roman" w:hint="eastAsia"/>
-              </w:rPr>
-              <w:t>（</w:t>
-            </w:r>
-            <w:proofErr w:type="gramEnd"/>
-            <w:r>
-              <w:rPr>
-                <w:rFonts w:ascii="Times New Roman" w:eastAsia="標楷體" w:hAnsi="Times New Roman" w:cs="Times New Roman" w:hint="eastAsia"/>
-              </w:rPr>
-              <w:t>如：</w:t>
+              <w:t>系統應預設基礎分類（如：</w:t>
             </w:r>
             <w:r>
               <w:rPr>
@@ -3937,21 +4521,7 @@
               <w:rPr>
                 <w:rFonts w:ascii="Times New Roman" w:eastAsia="標楷體" w:hAnsi="Times New Roman" w:cs="Times New Roman" w:hint="eastAsia"/>
               </w:rPr>
-              <w:t>自動帶入的類別</w:t>
-            </w:r>
-            <w:proofErr w:type="gramStart"/>
-            <w:r>
-              <w:rPr>
-                <w:rFonts w:ascii="Times New Roman" w:eastAsia="標楷體" w:hAnsi="Times New Roman" w:cs="Times New Roman" w:hint="eastAsia"/>
-              </w:rPr>
-              <w:t>）</w:t>
-            </w:r>
-            <w:proofErr w:type="gramEnd"/>
-            <w:r>
-              <w:rPr>
-                <w:rFonts w:ascii="Times New Roman" w:eastAsia="標楷體" w:hAnsi="Times New Roman" w:cs="Times New Roman" w:hint="eastAsia"/>
-              </w:rPr>
-              <w:t>，並允許賣家自定義標籤（</w:t>
+              <w:t>自動帶入的類別），並允許賣家自定義標籤（</w:t>
             </w:r>
             <w:r>
               <w:rPr>
@@ -4001,7 +4571,19 @@
               <w:rPr>
                 <w:rFonts w:ascii="Times New Roman" w:eastAsia="標楷體" w:hAnsi="Times New Roman" w:cs="Times New Roman" w:hint="eastAsia"/>
               </w:rPr>
-              <w:t>當賣家擁有超過一定數量的書籍，或需要整理賣場時觸發（中頻率）。</w:t>
+              <w:t>當賣家擁有超過一定數量</w:t>
+            </w:r>
+            <w:r>
+              <w:rPr>
+                <w:rFonts w:ascii="Times New Roman" w:eastAsia="標楷體" w:hAnsi="Times New Roman" w:cs="Times New Roman" w:hint="eastAsia"/>
+              </w:rPr>
+              <w:t>的商品</w:t>
+            </w:r>
+            <w:r>
+              <w:rPr>
+                <w:rFonts w:ascii="Times New Roman" w:eastAsia="標楷體" w:hAnsi="Times New Roman" w:cs="Times New Roman" w:hint="eastAsia"/>
+              </w:rPr>
+              <w:t>，或需要整理賣場時觸發（中頻率）。</w:t>
             </w:r>
           </w:p>
         </w:tc>
@@ -4039,7 +4621,19 @@
               <w:rPr>
                 <w:rFonts w:ascii="Times New Roman" w:eastAsia="標楷體" w:hAnsi="Times New Roman" w:cs="Times New Roman" w:hint="eastAsia"/>
               </w:rPr>
-              <w:t>是否需要限制單一分類下的書籍數量上限？或限制自定義分類的總數？</w:t>
+              <w:t>是否需要限制單一分類下的</w:t>
+            </w:r>
+            <w:r>
+              <w:rPr>
+                <w:rFonts w:ascii="Times New Roman" w:eastAsia="標楷體" w:hAnsi="Times New Roman" w:cs="Times New Roman" w:hint="eastAsia"/>
+              </w:rPr>
+              <w:t>商品</w:t>
+            </w:r>
+            <w:r>
+              <w:rPr>
+                <w:rFonts w:ascii="Times New Roman" w:eastAsia="標楷體" w:hAnsi="Times New Roman" w:cs="Times New Roman" w:hint="eastAsia"/>
+              </w:rPr>
+              <w:t>數量上限？或限制自定義分類的總數？</w:t>
             </w:r>
           </w:p>
         </w:tc>
@@ -4062,7 +4656,19 @@
         <w:rPr>
           <w:rFonts w:ascii="Times New Roman" w:eastAsia="標楷體" w:hAnsi="Times New Roman" w:cs="Times New Roman" w:hint="eastAsia"/>
         </w:rPr>
-        <w:t xml:space="preserve">1.5.5 </w:t>
+        <w:t>1.5.</w:t>
+      </w:r>
+      <w:r>
+        <w:rPr>
+          <w:rFonts w:ascii="Times New Roman" w:eastAsia="標楷體" w:hAnsi="Times New Roman" w:cs="Times New Roman" w:hint="eastAsia"/>
+        </w:rPr>
+        <w:t>6</w:t>
+      </w:r>
+      <w:r>
+        <w:rPr>
+          <w:rFonts w:ascii="Times New Roman" w:eastAsia="標楷體" w:hAnsi="Times New Roman" w:cs="Times New Roman" w:hint="eastAsia"/>
+        </w:rPr>
+        <w:t xml:space="preserve"> </w:t>
       </w:r>
       <w:r>
         <w:rPr>
@@ -4154,16 +4760,12 @@
                 <w:rFonts w:ascii="Times New Roman" w:eastAsia="標楷體" w:hAnsi="Times New Roman" w:cs="Times New Roman"/>
               </w:rPr>
             </w:pPr>
-            <w:proofErr w:type="spellStart"/>
-            <w:proofErr w:type="gramStart"/>
             <w:r>
               <w:rPr>
                 <w:rFonts w:ascii="Times New Roman" w:eastAsia="標楷體" w:hAnsi="Times New Roman" w:cs="Times New Roman"/>
               </w:rPr>
               <w:t>Re:Book</w:t>
             </w:r>
-            <w:proofErr w:type="spellEnd"/>
-            <w:proofErr w:type="gramEnd"/>
           </w:p>
         </w:tc>
       </w:tr>
@@ -4282,38 +4884,67 @@
               <w:rPr>
                 <w:rFonts w:ascii="Times New Roman" w:eastAsia="標楷體" w:hAnsi="Times New Roman" w:cs="Times New Roman" w:hint="eastAsia"/>
               </w:rPr>
-              <w:t>買家：希望在正式決定交易前，先暫存感興趣的書籍，以便一次性聯繫不同賣家或比較價格</w:t>
-            </w:r>
-            <w:r>
-              <w:rPr>
-                <w:rFonts w:ascii="Times New Roman" w:eastAsia="標楷體" w:hAnsi="Times New Roman" w:cs="Times New Roman"/>
-              </w:rPr>
-              <w:br/>
-            </w:r>
-            <w:r>
-              <w:rPr>
-                <w:rFonts w:ascii="Times New Roman" w:eastAsia="標楷體" w:hAnsi="Times New Roman" w:cs="Times New Roman" w:hint="eastAsia"/>
-              </w:rPr>
-              <w:t>賣家：希望知道有多少潛在買家對其書籍感興趣（追蹤數）。</w:t>
-            </w:r>
-          </w:p>
-        </w:tc>
-      </w:tr>
-      <w:tr>
-        <w:tc>
-          <w:tcPr>
-            <w:tcW w:w="4148" w:type="dxa"/>
-          </w:tcPr>
-          <w:p>
-            <w:pPr>
-              <w:rPr>
-                <w:rFonts w:ascii="Times New Roman" w:eastAsia="標楷體" w:hAnsi="Times New Roman" w:cs="Times New Roman"/>
-              </w:rPr>
-            </w:pPr>
-            <w:r>
-              <w:rPr>
-                <w:rFonts w:ascii="Times New Roman" w:eastAsia="標楷體" w:hAnsi="Times New Roman" w:cs="Times New Roman" w:hint="eastAsia"/>
-              </w:rPr>
+              <w:t>買家：希望在正式決定交易前，先暫存感興趣</w:t>
+            </w:r>
+            <w:r>
+              <w:rPr>
+                <w:rFonts w:ascii="Times New Roman" w:eastAsia="標楷體" w:hAnsi="Times New Roman" w:cs="Times New Roman" w:hint="eastAsia"/>
+              </w:rPr>
+              <w:t>的商品</w:t>
+            </w:r>
+            <w:r>
+              <w:rPr>
+                <w:rFonts w:ascii="Times New Roman" w:eastAsia="標楷體" w:hAnsi="Times New Roman" w:cs="Times New Roman" w:hint="eastAsia"/>
+              </w:rPr>
+              <w:t>，以便一次性聯繫不同賣家或比較價格</w:t>
+            </w:r>
+          </w:p>
+          <w:p>
+            <w:pPr>
+              <w:rPr>
+                <w:rFonts w:ascii="Times New Roman" w:eastAsia="標楷體" w:hAnsi="Times New Roman" w:cs="Times New Roman"/>
+              </w:rPr>
+            </w:pPr>
+            <w:r>
+              <w:rPr>
+                <w:rFonts w:ascii="Times New Roman" w:eastAsia="標楷體" w:hAnsi="Times New Roman" w:cs="Times New Roman" w:hint="eastAsia"/>
+                <w:highlight w:val="yellow"/>
+              </w:rPr>
+              <w:t>賣家：希望知道有多少潛在買家對其</w:t>
+            </w:r>
+            <w:r>
+              <w:rPr>
+                <w:rFonts w:ascii="Times New Roman" w:eastAsia="標楷體" w:hAnsi="Times New Roman" w:cs="Times New Roman" w:hint="eastAsia"/>
+                <w:highlight w:val="yellow"/>
+              </w:rPr>
+              <w:t>商品</w:t>
+            </w:r>
+            <w:r>
+              <w:rPr>
+                <w:rFonts w:ascii="Times New Roman" w:eastAsia="標楷體" w:hAnsi="Times New Roman" w:cs="Times New Roman" w:hint="eastAsia"/>
+                <w:highlight w:val="yellow"/>
+              </w:rPr>
+              <w:t>感興趣（追蹤數）。</w:t>
+            </w:r>
+          </w:p>
+        </w:tc>
+      </w:tr>
+      <w:tr>
+        <w:tc>
+          <w:tcPr>
+            <w:tcW w:w="4148" w:type="dxa"/>
+          </w:tcPr>
+          <w:p>
+            <w:pPr>
+              <w:rPr>
+                <w:rFonts w:ascii="Times New Roman" w:eastAsia="標楷體" w:hAnsi="Times New Roman" w:cs="Times New Roman"/>
+              </w:rPr>
+            </w:pPr>
+            <w:r>
+              <w:rPr>
+                <w:rFonts w:ascii="Times New Roman" w:eastAsia="標楷體" w:hAnsi="Times New Roman" w:cs="Times New Roman" w:hint="eastAsia"/>
+              </w:rPr>
+              <w:lastRenderedPageBreak/>
               <w:t>Preconditions</w:t>
             </w:r>
           </w:p>
@@ -4332,7 +4963,19 @@
               <w:rPr>
                 <w:rFonts w:ascii="Times New Roman" w:eastAsia="標楷體" w:hAnsi="Times New Roman" w:cs="Times New Roman" w:hint="eastAsia"/>
               </w:rPr>
-              <w:t>買家必須已登入系統，且系統中存在可選購的書籍。</w:t>
+              <w:t>買家必須已登入系統，且系統中存在可選購</w:t>
+            </w:r>
+            <w:r>
+              <w:rPr>
+                <w:rFonts w:ascii="Times New Roman" w:eastAsia="標楷體" w:hAnsi="Times New Roman" w:cs="Times New Roman" w:hint="eastAsia"/>
+              </w:rPr>
+              <w:t>的商品</w:t>
+            </w:r>
+            <w:r>
+              <w:rPr>
+                <w:rFonts w:ascii="Times New Roman" w:eastAsia="標楷體" w:hAnsi="Times New Roman" w:cs="Times New Roman" w:hint="eastAsia"/>
+              </w:rPr>
+              <w:t>。</w:t>
             </w:r>
           </w:p>
         </w:tc>
@@ -4370,30 +5013,100 @@
               <w:rPr>
                 <w:rFonts w:ascii="Times New Roman" w:eastAsia="標楷體" w:hAnsi="Times New Roman" w:cs="Times New Roman" w:hint="eastAsia"/>
               </w:rPr>
-              <w:t>書籍成功加入買家的個人清單，且系統能即時反映該書籍的最新狀態</w:t>
-            </w:r>
-            <w:proofErr w:type="gramStart"/>
-            <w:r>
-              <w:rPr>
-                <w:rFonts w:ascii="Times New Roman" w:eastAsia="標楷體" w:hAnsi="Times New Roman" w:cs="Times New Roman" w:hint="eastAsia"/>
-              </w:rPr>
-              <w:t>（</w:t>
-            </w:r>
-            <w:proofErr w:type="gramEnd"/>
-            <w:r>
-              <w:rPr>
-                <w:rFonts w:ascii="Times New Roman" w:eastAsia="標楷體" w:hAnsi="Times New Roman" w:cs="Times New Roman" w:hint="eastAsia"/>
-              </w:rPr>
-              <w:t>如：是否已被他人買走</w:t>
-            </w:r>
-            <w:proofErr w:type="gramStart"/>
-            <w:r>
-              <w:rPr>
-                <w:rFonts w:ascii="Times New Roman" w:eastAsia="標楷體" w:hAnsi="Times New Roman" w:cs="Times New Roman" w:hint="eastAsia"/>
-              </w:rPr>
-              <w:t>）</w:t>
-            </w:r>
-            <w:proofErr w:type="gramEnd"/>
+              <w:t>商品</w:t>
+            </w:r>
+            <w:r>
+              <w:rPr>
+                <w:rFonts w:ascii="Times New Roman" w:eastAsia="標楷體" w:hAnsi="Times New Roman" w:cs="Times New Roman" w:hint="eastAsia"/>
+              </w:rPr>
+              <w:t>成功加入買家的</w:t>
+            </w:r>
+            <w:r>
+              <w:rPr>
+                <w:rFonts w:ascii="Times New Roman" w:eastAsia="標楷體" w:hAnsi="Times New Roman" w:cs="Times New Roman" w:hint="eastAsia"/>
+              </w:rPr>
+              <w:t>購物車</w:t>
+            </w:r>
+            <w:r>
+              <w:rPr>
+                <w:rFonts w:ascii="Times New Roman" w:eastAsia="標楷體" w:hAnsi="Times New Roman" w:cs="Times New Roman" w:hint="eastAsia"/>
+              </w:rPr>
+              <w:t>，且系統能即時反映該書籍的最新狀態（如：是否已被他人買走）。</w:t>
+            </w:r>
+          </w:p>
+        </w:tc>
+      </w:tr>
+      <w:tr>
+        <w:tc>
+          <w:tcPr>
+            <w:tcW w:w="4148" w:type="dxa"/>
+          </w:tcPr>
+          <w:p>
+            <w:pPr>
+              <w:rPr>
+                <w:rFonts w:ascii="Times New Roman" w:eastAsia="標楷體" w:hAnsi="Times New Roman" w:cs="Times New Roman"/>
+              </w:rPr>
+            </w:pPr>
+            <w:r>
+              <w:rPr>
+                <w:rFonts w:ascii="Times New Roman" w:eastAsia="標楷體" w:hAnsi="Times New Roman" w:cs="Times New Roman" w:hint="eastAsia"/>
+              </w:rPr>
+              <w:t>Main Success Scenario</w:t>
+            </w:r>
+          </w:p>
+        </w:tc>
+        <w:tc>
+          <w:tcPr>
+            <w:tcW w:w="4148" w:type="dxa"/>
+          </w:tcPr>
+          <w:p>
+            <w:pPr>
+              <w:rPr>
+                <w:rFonts w:ascii="Times New Roman" w:eastAsia="標楷體" w:hAnsi="Times New Roman" w:cs="Times New Roman"/>
+              </w:rPr>
+            </w:pPr>
+            <w:r>
+              <w:rPr>
+                <w:rFonts w:ascii="Times New Roman" w:eastAsia="標楷體" w:hAnsi="Times New Roman" w:cs="Times New Roman" w:hint="eastAsia"/>
+              </w:rPr>
+              <w:t xml:space="preserve">1. </w:t>
+            </w:r>
+            <w:r>
+              <w:rPr>
+                <w:rFonts w:ascii="Times New Roman" w:eastAsia="標楷體" w:hAnsi="Times New Roman" w:cs="Times New Roman" w:hint="eastAsia"/>
+              </w:rPr>
+              <w:t>買家在搜尋結果或</w:t>
+            </w:r>
+            <w:r>
+              <w:rPr>
+                <w:rFonts w:ascii="Times New Roman" w:eastAsia="標楷體" w:hAnsi="Times New Roman" w:cs="Times New Roman" w:hint="eastAsia"/>
+              </w:rPr>
+              <w:t>商品的</w:t>
+            </w:r>
+            <w:r>
+              <w:rPr>
+                <w:rFonts w:ascii="Times New Roman" w:eastAsia="標楷體" w:hAnsi="Times New Roman" w:cs="Times New Roman" w:hint="eastAsia"/>
+              </w:rPr>
+              <w:t>詳情頁點擊「加入</w:t>
+            </w:r>
+            <w:r>
+              <w:rPr>
+                <w:rFonts w:ascii="Times New Roman" w:eastAsia="標楷體" w:hAnsi="Times New Roman" w:cs="Times New Roman" w:hint="eastAsia"/>
+              </w:rPr>
+              <w:t>購物車</w:t>
+            </w:r>
+            <w:r>
+              <w:rPr>
+                <w:rFonts w:ascii="Times New Roman" w:eastAsia="標楷體" w:hAnsi="Times New Roman" w:cs="Times New Roman" w:hint="eastAsia"/>
+              </w:rPr>
+              <w:t>」</w:t>
+            </w:r>
+            <w:r>
+              <w:rPr>
+                <w:rFonts w:ascii="Times New Roman" w:eastAsia="標楷體" w:hAnsi="Times New Roman" w:cs="Times New Roman" w:hint="eastAsia"/>
+              </w:rPr>
+              <w:t>按鈕</w:t>
+            </w:r>
             <w:r>
               <w:rPr>
                 <w:rFonts w:ascii="Times New Roman" w:eastAsia="標楷體" w:hAnsi="Times New Roman" w:cs="Times New Roman" w:hint="eastAsia"/>
@@ -4401,64 +5114,6 @@
               <w:t>。</w:t>
             </w:r>
           </w:p>
-        </w:tc>
-      </w:tr>
-      <w:tr>
-        <w:tc>
-          <w:tcPr>
-            <w:tcW w:w="4148" w:type="dxa"/>
-          </w:tcPr>
-          <w:p>
-            <w:pPr>
-              <w:rPr>
-                <w:rFonts w:ascii="Times New Roman" w:eastAsia="標楷體" w:hAnsi="Times New Roman" w:cs="Times New Roman"/>
-              </w:rPr>
-            </w:pPr>
-            <w:r>
-              <w:rPr>
-                <w:rFonts w:ascii="Times New Roman" w:eastAsia="標楷體" w:hAnsi="Times New Roman" w:cs="Times New Roman" w:hint="eastAsia"/>
-              </w:rPr>
-              <w:t>Main Success Scenario</w:t>
-            </w:r>
-          </w:p>
-        </w:tc>
-        <w:tc>
-          <w:tcPr>
-            <w:tcW w:w="4148" w:type="dxa"/>
-          </w:tcPr>
-          <w:p>
-            <w:pPr>
-              <w:rPr>
-                <w:rFonts w:ascii="Times New Roman" w:eastAsia="標楷體" w:hAnsi="Times New Roman" w:cs="Times New Roman"/>
-              </w:rPr>
-            </w:pPr>
-            <w:r>
-              <w:rPr>
-                <w:rFonts w:ascii="Times New Roman" w:eastAsia="標楷體" w:hAnsi="Times New Roman" w:cs="Times New Roman" w:hint="eastAsia"/>
-              </w:rPr>
-              <w:t xml:space="preserve">1. </w:t>
-            </w:r>
-            <w:r>
-              <w:rPr>
-                <w:rFonts w:ascii="Times New Roman" w:eastAsia="標楷體" w:hAnsi="Times New Roman" w:cs="Times New Roman" w:hint="eastAsia"/>
-              </w:rPr>
-              <w:t>買家在搜尋結果或書籍</w:t>
-            </w:r>
-            <w:proofErr w:type="gramStart"/>
-            <w:r>
-              <w:rPr>
-                <w:rFonts w:ascii="Times New Roman" w:eastAsia="標楷體" w:hAnsi="Times New Roman" w:cs="Times New Roman" w:hint="eastAsia"/>
-              </w:rPr>
-              <w:t>詳情頁點擊</w:t>
-            </w:r>
-            <w:proofErr w:type="gramEnd"/>
-            <w:r>
-              <w:rPr>
-                <w:rFonts w:ascii="Times New Roman" w:eastAsia="標楷體" w:hAnsi="Times New Roman" w:cs="Times New Roman" w:hint="eastAsia"/>
-              </w:rPr>
-              <w:t>「加入清單」。</w:t>
-            </w:r>
-          </w:p>
           <w:p>
             <w:pPr>
               <w:rPr>
@@ -4475,7 +5130,31 @@
               <w:rPr>
                 <w:rFonts w:ascii="Times New Roman" w:eastAsia="標楷體" w:hAnsi="Times New Roman" w:cs="Times New Roman" w:hint="eastAsia"/>
               </w:rPr>
-              <w:t>系統將該書籍物件存入買家的「意向清單」中。</w:t>
+              <w:t>系統將該</w:t>
+            </w:r>
+            <w:r>
+              <w:rPr>
+                <w:rFonts w:ascii="Times New Roman" w:eastAsia="標楷體" w:hAnsi="Times New Roman" w:cs="Times New Roman" w:hint="eastAsia"/>
+              </w:rPr>
+              <w:t>商品</w:t>
+            </w:r>
+            <w:r>
+              <w:rPr>
+                <w:rFonts w:ascii="Times New Roman" w:eastAsia="標楷體" w:hAnsi="Times New Roman" w:cs="Times New Roman" w:hint="eastAsia"/>
+              </w:rPr>
+              <w:t>存入買家的「</w:t>
+            </w:r>
+            <w:r>
+              <w:rPr>
+                <w:rFonts w:ascii="Times New Roman" w:eastAsia="標楷體" w:hAnsi="Times New Roman" w:cs="Times New Roman" w:hint="eastAsia"/>
+              </w:rPr>
+              <w:t>購物車</w:t>
+            </w:r>
+            <w:r>
+              <w:rPr>
+                <w:rFonts w:ascii="Times New Roman" w:eastAsia="標楷體" w:hAnsi="Times New Roman" w:cs="Times New Roman" w:hint="eastAsia"/>
+              </w:rPr>
+              <w:t>」中。</w:t>
             </w:r>
           </w:p>
           <w:p>
@@ -4494,7 +5173,31 @@
               <w:rPr>
                 <w:rFonts w:ascii="Times New Roman" w:eastAsia="標楷體" w:hAnsi="Times New Roman" w:cs="Times New Roman" w:hint="eastAsia"/>
               </w:rPr>
-              <w:t>買家進入清單頁面，查看所有已收藏的書籍資訊與賣家資訊。</w:t>
+              <w:t>買家進入</w:t>
+            </w:r>
+            <w:r>
+              <w:rPr>
+                <w:rFonts w:ascii="Times New Roman" w:eastAsia="標楷體" w:hAnsi="Times New Roman" w:cs="Times New Roman" w:hint="eastAsia"/>
+              </w:rPr>
+              <w:t>購物車</w:t>
+            </w:r>
+            <w:r>
+              <w:rPr>
+                <w:rFonts w:ascii="Times New Roman" w:eastAsia="標楷體" w:hAnsi="Times New Roman" w:cs="Times New Roman" w:hint="eastAsia"/>
+              </w:rPr>
+              <w:t>頁面，查看所有已收藏的</w:t>
+            </w:r>
+            <w:r>
+              <w:rPr>
+                <w:rFonts w:ascii="Times New Roman" w:eastAsia="標楷體" w:hAnsi="Times New Roman" w:cs="Times New Roman" w:hint="eastAsia"/>
+              </w:rPr>
+              <w:t>商品</w:t>
+            </w:r>
+            <w:r>
+              <w:rPr>
+                <w:rFonts w:ascii="Times New Roman" w:eastAsia="標楷體" w:hAnsi="Times New Roman" w:cs="Times New Roman" w:hint="eastAsia"/>
+              </w:rPr>
+              <w:t>資訊與賣家資訊。</w:t>
             </w:r>
           </w:p>
           <w:p>
@@ -4513,21 +5216,19 @@
               <w:rPr>
                 <w:rFonts w:ascii="Times New Roman" w:eastAsia="標楷體" w:hAnsi="Times New Roman" w:cs="Times New Roman" w:hint="eastAsia"/>
               </w:rPr>
-              <w:t>買家可從清單中直接</w:t>
-            </w:r>
-            <w:proofErr w:type="gramStart"/>
-            <w:r>
-              <w:rPr>
-                <w:rFonts w:ascii="Times New Roman" w:eastAsia="標楷體" w:hAnsi="Times New Roman" w:cs="Times New Roman" w:hint="eastAsia"/>
-              </w:rPr>
-              <w:t>發起私訊或</w:t>
-            </w:r>
-            <w:proofErr w:type="gramEnd"/>
-            <w:r>
-              <w:rPr>
-                <w:rFonts w:ascii="Times New Roman" w:eastAsia="標楷體" w:hAnsi="Times New Roman" w:cs="Times New Roman" w:hint="eastAsia"/>
-              </w:rPr>
-              <w:t>進行最終確認。</w:t>
+              <w:t>買家可從</w:t>
+            </w:r>
+            <w:r>
+              <w:rPr>
+                <w:rFonts w:ascii="Times New Roman" w:eastAsia="標楷體" w:hAnsi="Times New Roman" w:cs="Times New Roman" w:hint="eastAsia"/>
+              </w:rPr>
+              <w:t>購物車頁面</w:t>
+            </w:r>
+            <w:r>
+              <w:rPr>
+                <w:rFonts w:ascii="Times New Roman" w:eastAsia="標楷體" w:hAnsi="Times New Roman" w:cs="Times New Roman" w:hint="eastAsia"/>
+              </w:rPr>
+              <w:t>中直接發起私訊或進行最終確認。</w:t>
             </w:r>
           </w:p>
         </w:tc>
@@ -4571,7 +5272,13 @@
               <w:rPr>
                 <w:rFonts w:ascii="Times New Roman" w:eastAsia="標楷體" w:hAnsi="Times New Roman" w:cs="Times New Roman" w:hint="eastAsia"/>
               </w:rPr>
-              <w:t>書籍已下架</w:t>
+              <w:t>商品</w:t>
+            </w:r>
+            <w:r>
+              <w:rPr>
+                <w:rFonts w:ascii="Times New Roman" w:eastAsia="標楷體" w:hAnsi="Times New Roman" w:cs="Times New Roman" w:hint="eastAsia"/>
+              </w:rPr>
+              <w:t>已下架</w:t>
             </w:r>
             <w:r>
               <w:rPr>
@@ -4602,47 +5309,81 @@
               <w:rPr>
                 <w:rFonts w:ascii="Times New Roman" w:eastAsia="標楷體" w:hAnsi="Times New Roman" w:cs="Times New Roman" w:hint="eastAsia"/>
               </w:rPr>
-              <w:t>移除書籍：買家從清單中手動刪除不再感興趣的書籍。</w:t>
-            </w:r>
-          </w:p>
-          <w:p>
-            <w:pPr>
-              <w:rPr>
-                <w:rFonts w:ascii="Times New Roman" w:eastAsia="標楷體" w:hAnsi="Times New Roman" w:cs="Times New Roman"/>
-              </w:rPr>
-            </w:pPr>
-            <w:r>
-              <w:rPr>
-                <w:rFonts w:ascii="Times New Roman" w:eastAsia="標楷體" w:hAnsi="Times New Roman" w:cs="Times New Roman" w:hint="eastAsia"/>
-              </w:rPr>
-              <w:lastRenderedPageBreak/>
+              <w:t>移除</w:t>
+            </w:r>
+            <w:r>
+              <w:rPr>
+                <w:rFonts w:ascii="Times New Roman" w:eastAsia="標楷體" w:hAnsi="Times New Roman" w:cs="Times New Roman" w:hint="eastAsia"/>
+              </w:rPr>
+              <w:t>商品</w:t>
+            </w:r>
+            <w:r>
+              <w:rPr>
+                <w:rFonts w:ascii="Times New Roman" w:eastAsia="標楷體" w:hAnsi="Times New Roman" w:cs="Times New Roman" w:hint="eastAsia"/>
+              </w:rPr>
+              <w:t>：買家從清單中手動刪除不再感興趣的</w:t>
+            </w:r>
+            <w:r>
+              <w:rPr>
+                <w:rFonts w:ascii="Times New Roman" w:eastAsia="標楷體" w:hAnsi="Times New Roman" w:cs="Times New Roman" w:hint="eastAsia"/>
+              </w:rPr>
+              <w:t>商品</w:t>
+            </w:r>
+            <w:r>
+              <w:rPr>
+                <w:rFonts w:ascii="Times New Roman" w:eastAsia="標楷體" w:hAnsi="Times New Roman" w:cs="Times New Roman" w:hint="eastAsia"/>
+              </w:rPr>
+              <w:t>。</w:t>
+            </w:r>
+          </w:p>
+          <w:p>
+            <w:pPr>
+              <w:rPr>
+                <w:rFonts w:ascii="Times New Roman" w:eastAsia="標楷體" w:hAnsi="Times New Roman" w:cs="Times New Roman"/>
+              </w:rPr>
+            </w:pPr>
+            <w:r>
+              <w:rPr>
+                <w:rFonts w:ascii="Times New Roman" w:eastAsia="標楷體" w:hAnsi="Times New Roman" w:cs="Times New Roman" w:hint="eastAsia"/>
+              </w:rPr>
               <w:t xml:space="preserve">4a. </w:t>
             </w:r>
             <w:r>
               <w:rPr>
                 <w:rFonts w:ascii="Times New Roman" w:eastAsia="標楷體" w:hAnsi="Times New Roman" w:cs="Times New Roman" w:hint="eastAsia"/>
               </w:rPr>
-              <w:t>重複加入：若書籍已在清單中，系統提示不重複加入。</w:t>
-            </w:r>
-          </w:p>
-        </w:tc>
-      </w:tr>
-      <w:tr>
-        <w:tc>
-          <w:tcPr>
-            <w:tcW w:w="4148" w:type="dxa"/>
-          </w:tcPr>
-          <w:p>
-            <w:pPr>
-              <w:rPr>
-                <w:rFonts w:ascii="Times New Roman" w:eastAsia="標楷體" w:hAnsi="Times New Roman" w:cs="Times New Roman"/>
-              </w:rPr>
-            </w:pPr>
-            <w:r>
-              <w:rPr>
-                <w:rFonts w:ascii="Times New Roman" w:eastAsia="標楷體" w:hAnsi="Times New Roman" w:cs="Times New Roman" w:hint="eastAsia"/>
-              </w:rPr>
-              <w:lastRenderedPageBreak/>
+              <w:t>重複加入：若</w:t>
+            </w:r>
+            <w:r>
+              <w:rPr>
+                <w:rFonts w:ascii="Times New Roman" w:eastAsia="標楷體" w:hAnsi="Times New Roman" w:cs="Times New Roman" w:hint="eastAsia"/>
+              </w:rPr>
+              <w:t>商品</w:t>
+            </w:r>
+            <w:r>
+              <w:rPr>
+                <w:rFonts w:ascii="Times New Roman" w:eastAsia="標楷體" w:hAnsi="Times New Roman" w:cs="Times New Roman" w:hint="eastAsia"/>
+              </w:rPr>
+              <w:t>已在清單中，系統提示不重複加入。</w:t>
+            </w:r>
+          </w:p>
+        </w:tc>
+      </w:tr>
+      <w:tr>
+        <w:tc>
+          <w:tcPr>
+            <w:tcW w:w="4148" w:type="dxa"/>
+          </w:tcPr>
+          <w:p>
+            <w:pPr>
+              <w:rPr>
+                <w:rFonts w:ascii="Times New Roman" w:eastAsia="標楷體" w:hAnsi="Times New Roman" w:cs="Times New Roman"/>
+              </w:rPr>
+            </w:pPr>
+            <w:r>
+              <w:rPr>
+                <w:rFonts w:ascii="Times New Roman" w:eastAsia="標楷體" w:hAnsi="Times New Roman" w:cs="Times New Roman" w:hint="eastAsia"/>
+              </w:rPr>
               <w:t>Special Requirements</w:t>
             </w:r>
           </w:p>
@@ -4673,7 +5414,19 @@
               <w:rPr>
                 <w:rFonts w:ascii="Times New Roman" w:eastAsia="標楷體" w:hAnsi="Times New Roman" w:cs="Times New Roman" w:hint="eastAsia"/>
               </w:rPr>
-              <w:t>）同步書籍的銷售狀態。</w:t>
+              <w:t>）同步</w:t>
+            </w:r>
+            <w:r>
+              <w:rPr>
+                <w:rFonts w:ascii="Times New Roman" w:eastAsia="標楷體" w:hAnsi="Times New Roman" w:cs="Times New Roman" w:hint="eastAsia"/>
+              </w:rPr>
+              <w:t>商品</w:t>
+            </w:r>
+            <w:r>
+              <w:rPr>
+                <w:rFonts w:ascii="Times New Roman" w:eastAsia="標楷體" w:hAnsi="Times New Roman" w:cs="Times New Roman" w:hint="eastAsia"/>
+              </w:rPr>
+              <w:t>的銷售狀態。</w:t>
             </w:r>
           </w:p>
         </w:tc>
@@ -4749,7 +5502,19 @@
               <w:rPr>
                 <w:rFonts w:ascii="Times New Roman" w:eastAsia="標楷體" w:hAnsi="Times New Roman" w:cs="Times New Roman" w:hint="eastAsia"/>
               </w:rPr>
-              <w:t>當買家瀏覽到感興趣但尚未決定立刻購買的書籍時（高頻率）。</w:t>
+              <w:t>當買家瀏覽到感興趣但尚未決定立刻購買的</w:t>
+            </w:r>
+            <w:r>
+              <w:rPr>
+                <w:rFonts w:ascii="Times New Roman" w:eastAsia="標楷體" w:hAnsi="Times New Roman" w:cs="Times New Roman" w:hint="eastAsia"/>
+              </w:rPr>
+              <w:t>商品</w:t>
+            </w:r>
+            <w:r>
+              <w:rPr>
+                <w:rFonts w:ascii="Times New Roman" w:eastAsia="標楷體" w:hAnsi="Times New Roman" w:cs="Times New Roman" w:hint="eastAsia"/>
+              </w:rPr>
+              <w:t>時（高頻率）。</w:t>
             </w:r>
           </w:p>
         </w:tc>
@@ -4787,7 +5552,19 @@
               <w:rPr>
                 <w:rFonts w:ascii="Times New Roman" w:eastAsia="標楷體" w:hAnsi="Times New Roman" w:cs="Times New Roman" w:hint="eastAsia"/>
               </w:rPr>
-              <w:t>是否需要設置「清單上限數」，以防止資料庫負擔過重？</w:t>
+              <w:t>是否需要設置「</w:t>
+            </w:r>
+            <w:r>
+              <w:rPr>
+                <w:rFonts w:ascii="Times New Roman" w:eastAsia="標楷體" w:hAnsi="Times New Roman" w:cs="Times New Roman" w:hint="eastAsia"/>
+              </w:rPr>
+              <w:t>購物車</w:t>
+            </w:r>
+            <w:r>
+              <w:rPr>
+                <w:rFonts w:ascii="Times New Roman" w:eastAsia="標楷體" w:hAnsi="Times New Roman" w:cs="Times New Roman" w:hint="eastAsia"/>
+              </w:rPr>
+              <w:t>上限數」，以防止資料庫負擔過重？</w:t>
             </w:r>
           </w:p>
         </w:tc>
@@ -4932,7 +5709,19 @@
               <w:rPr>
                 <w:rFonts w:ascii="Times New Roman" w:eastAsia="標楷體" w:hAnsi="Times New Roman" w:cs="Times New Roman" w:hint="eastAsia"/>
               </w:rPr>
-              <w:t>新增或更新書籍清單應在</w:t>
+              <w:t>新增或更新</w:t>
+            </w:r>
+            <w:r>
+              <w:rPr>
+                <w:rFonts w:ascii="Times New Roman" w:eastAsia="標楷體" w:hAnsi="Times New Roman" w:cs="Times New Roman" w:hint="eastAsia"/>
+              </w:rPr>
+              <w:t>購物車</w:t>
+            </w:r>
+            <w:r>
+              <w:rPr>
+                <w:rFonts w:ascii="Times New Roman" w:eastAsia="標楷體" w:hAnsi="Times New Roman" w:cs="Times New Roman" w:hint="eastAsia"/>
+              </w:rPr>
+              <w:t>應在</w:t>
             </w:r>
             <w:r>
               <w:rPr>
@@ -5006,7 +5795,19 @@
               <w:rPr>
                 <w:rFonts w:ascii="Times New Roman" w:eastAsia="標楷體" w:hAnsi="Times New Roman" w:cs="Times New Roman" w:hint="eastAsia"/>
               </w:rPr>
-              <w:t>搜尋書籍的查詢結果應在</w:t>
+              <w:t>搜尋</w:t>
+            </w:r>
+            <w:r>
+              <w:rPr>
+                <w:rFonts w:ascii="Times New Roman" w:eastAsia="標楷體" w:hAnsi="Times New Roman" w:cs="Times New Roman" w:hint="eastAsia"/>
+              </w:rPr>
+              <w:t>商品</w:t>
+            </w:r>
+            <w:r>
+              <w:rPr>
+                <w:rFonts w:ascii="Times New Roman" w:eastAsia="標楷體" w:hAnsi="Times New Roman" w:cs="Times New Roman" w:hint="eastAsia"/>
+              </w:rPr>
+              <w:t>的查詢結果應在</w:t>
             </w:r>
             <w:r>
               <w:rPr>
@@ -5076,19 +5877,11 @@
                 <w:rFonts w:ascii="Times New Roman" w:eastAsia="標楷體" w:hAnsi="Times New Roman" w:cs="Times New Roman"/>
               </w:rPr>
             </w:pPr>
-            <w:proofErr w:type="gramStart"/>
-            <w:r>
-              <w:rPr>
-                <w:rFonts w:ascii="Times New Roman" w:eastAsia="標楷體" w:hAnsi="Times New Roman" w:cs="Times New Roman" w:hint="eastAsia"/>
-              </w:rPr>
-              <w:t>私訊傳遞</w:t>
-            </w:r>
-            <w:proofErr w:type="gramEnd"/>
-            <w:r>
-              <w:rPr>
-                <w:rFonts w:ascii="Times New Roman" w:eastAsia="標楷體" w:hAnsi="Times New Roman" w:cs="Times New Roman" w:hint="eastAsia"/>
-              </w:rPr>
-              <w:t>的延遲時間應小於</w:t>
+            <w:r>
+              <w:rPr>
+                <w:rFonts w:ascii="Times New Roman" w:eastAsia="標楷體" w:hAnsi="Times New Roman" w:cs="Times New Roman" w:hint="eastAsia"/>
+              </w:rPr>
+              <w:t>私訊傳遞的延遲時間應小於</w:t>
             </w:r>
             <w:r>
               <w:rPr>
@@ -5174,7 +5967,14 @@
               <w:rPr>
                 <w:rFonts w:ascii="Times New Roman" w:eastAsia="標楷體" w:hAnsi="Times New Roman" w:cs="Times New Roman" w:hint="eastAsia"/>
               </w:rPr>
-              <w:t>名使用者同時在線（</w:t>
+              <w:t>名使用者同時在線</w:t>
+            </w:r>
+            <w:r>
+              <w:rPr>
+                <w:rFonts w:ascii="Times New Roman" w:eastAsia="標楷體" w:hAnsi="Times New Roman" w:cs="Times New Roman" w:hint="eastAsia"/>
+              </w:rPr>
+              <w:lastRenderedPageBreak/>
+              <w:t>（</w:t>
             </w:r>
             <w:r>
               <w:rPr>
@@ -5206,6 +6006,7 @@
               <w:rPr>
                 <w:rFonts w:ascii="Times New Roman" w:eastAsia="標楷體" w:hAnsi="Times New Roman" w:cs="Times New Roman"/>
               </w:rPr>
+              <w:lastRenderedPageBreak/>
               <w:t>NFR-</w:t>
             </w:r>
             <w:r>
@@ -5334,35 +6135,7 @@
               <w:rPr>
                 <w:rFonts w:ascii="Times New Roman" w:eastAsia="標楷體" w:hAnsi="Times New Roman" w:cs="Times New Roman" w:hint="eastAsia"/>
               </w:rPr>
-              <w:t>敏感的使用者</w:t>
-            </w:r>
-            <w:proofErr w:type="gramStart"/>
-            <w:r>
-              <w:rPr>
-                <w:rFonts w:ascii="Times New Roman" w:eastAsia="標楷體" w:hAnsi="Times New Roman" w:cs="Times New Roman" w:hint="eastAsia"/>
-              </w:rPr>
-              <w:t>個</w:t>
-            </w:r>
-            <w:proofErr w:type="gramEnd"/>
-            <w:r>
-              <w:rPr>
-                <w:rFonts w:ascii="Times New Roman" w:eastAsia="標楷體" w:hAnsi="Times New Roman" w:cs="Times New Roman" w:hint="eastAsia"/>
-              </w:rPr>
-              <w:t>資</w:t>
-            </w:r>
-            <w:proofErr w:type="gramStart"/>
-            <w:r>
-              <w:rPr>
-                <w:rFonts w:ascii="Times New Roman" w:eastAsia="標楷體" w:hAnsi="Times New Roman" w:cs="Times New Roman" w:hint="eastAsia"/>
-              </w:rPr>
-              <w:t>與私訊對話</w:t>
-            </w:r>
-            <w:proofErr w:type="gramEnd"/>
-            <w:r>
-              <w:rPr>
-                <w:rFonts w:ascii="Times New Roman" w:eastAsia="標楷體" w:hAnsi="Times New Roman" w:cs="Times New Roman" w:hint="eastAsia"/>
-              </w:rPr>
-              <w:t>內容，必須經過安全加密處理。</w:t>
+              <w:t>敏感的使用者個資與私訊對話內容，必須經過安全加密處理。</w:t>
             </w:r>
           </w:p>
         </w:tc>
@@ -5424,61 +6197,19 @@
               <w:rPr>
                 <w:rFonts w:ascii="Times New Roman" w:eastAsia="標楷體" w:hAnsi="Times New Roman" w:cs="Times New Roman" w:hint="eastAsia"/>
               </w:rPr>
-              <w:t>系統必須要求使用有效的學校電子郵件信箱</w:t>
-            </w:r>
-            <w:proofErr w:type="gramStart"/>
-            <w:r>
-              <w:rPr>
-                <w:rFonts w:ascii="Times New Roman" w:eastAsia="標楷體" w:hAnsi="Times New Roman" w:cs="Times New Roman" w:hint="eastAsia"/>
-              </w:rPr>
-              <w:t>（</w:t>
-            </w:r>
-            <w:proofErr w:type="gramEnd"/>
-            <w:r>
-              <w:rPr>
-                <w:rFonts w:ascii="Times New Roman" w:eastAsia="標楷體" w:hAnsi="Times New Roman" w:cs="Times New Roman" w:hint="eastAsia"/>
-              </w:rPr>
-              <w:t>例如</w:t>
-            </w:r>
-            <w:r>
-              <w:rPr>
-                <w:rFonts w:ascii="Times New Roman" w:eastAsia="標楷體" w:hAnsi="Times New Roman" w:cs="Times New Roman" w:hint="eastAsia"/>
-              </w:rPr>
-              <w:t xml:space="preserve"> .</w:t>
-            </w:r>
-            <w:proofErr w:type="spellStart"/>
-            <w:r>
-              <w:rPr>
-                <w:rFonts w:ascii="Times New Roman" w:eastAsia="標楷體" w:hAnsi="Times New Roman" w:cs="Times New Roman" w:hint="eastAsia"/>
-              </w:rPr>
-              <w:t>edu</w:t>
-            </w:r>
-            <w:proofErr w:type="spellEnd"/>
-            <w:r>
-              <w:rPr>
-                <w:rFonts w:ascii="Times New Roman" w:eastAsia="標楷體" w:hAnsi="Times New Roman" w:cs="Times New Roman" w:hint="eastAsia"/>
-              </w:rPr>
-              <w:t xml:space="preserve"> </w:t>
-            </w:r>
-            <w:r>
-              <w:rPr>
-                <w:rFonts w:ascii="Times New Roman" w:eastAsia="標楷體" w:hAnsi="Times New Roman" w:cs="Times New Roman" w:hint="eastAsia"/>
-              </w:rPr>
-              <w:t>網域</w:t>
-            </w:r>
-            <w:proofErr w:type="gramStart"/>
-            <w:r>
-              <w:rPr>
-                <w:rFonts w:ascii="Times New Roman" w:eastAsia="標楷體" w:hAnsi="Times New Roman" w:cs="Times New Roman" w:hint="eastAsia"/>
-              </w:rPr>
-              <w:t>）</w:t>
-            </w:r>
-            <w:proofErr w:type="gramEnd"/>
-            <w:r>
-              <w:rPr>
-                <w:rFonts w:ascii="Times New Roman" w:eastAsia="標楷體" w:hAnsi="Times New Roman" w:cs="Times New Roman" w:hint="eastAsia"/>
-              </w:rPr>
-              <w:t>進行身分驗證註冊。</w:t>
+              <w:t>系統必須要求使用有效的學校電子郵件信箱（例如</w:t>
+            </w:r>
+            <w:r>
+              <w:rPr>
+                <w:rFonts w:ascii="Times New Roman" w:eastAsia="標楷體" w:hAnsi="Times New Roman" w:cs="Times New Roman" w:hint="eastAsia"/>
+              </w:rPr>
+              <w:t xml:space="preserve"> .edu </w:t>
+            </w:r>
+            <w:r>
+              <w:rPr>
+                <w:rFonts w:ascii="Times New Roman" w:eastAsia="標楷體" w:hAnsi="Times New Roman" w:cs="Times New Roman" w:hint="eastAsia"/>
+              </w:rPr>
+              <w:t>網域）進行身分驗證註冊。</w:t>
             </w:r>
           </w:p>
         </w:tc>
@@ -5684,10 +6415,357 @@
         <w:t>Glossary</w:t>
       </w:r>
     </w:p>
+    <w:tbl>
+      <w:tblPr>
+        <w:tblStyle w:val="af2"/>
+        <w:tblW w:w="0" w:type="auto"/>
+        <w:tblLook w:val="04A0" w:firstRow="1" w:lastRow="0" w:firstColumn="1" w:lastColumn="0" w:noHBand="0" w:noVBand="1"/>
+      </w:tblPr>
+      <w:tblGrid>
+        <w:gridCol w:w="1980"/>
+        <w:gridCol w:w="6316"/>
+      </w:tblGrid>
+      <w:tr>
+        <w:tc>
+          <w:tcPr>
+            <w:tcW w:w="1980" w:type="dxa"/>
+          </w:tcPr>
+          <w:p>
+            <w:pPr>
+              <w:rPr>
+                <w:rFonts w:ascii="Times New Roman" w:eastAsia="標楷體" w:hAnsi="Times New Roman" w:cs="Times New Roman" w:hint="eastAsia"/>
+              </w:rPr>
+            </w:pPr>
+            <w:r>
+              <w:rPr>
+                <w:rFonts w:ascii="Times New Roman" w:eastAsia="標楷體" w:hAnsi="Times New Roman" w:cs="Times New Roman" w:hint="eastAsia"/>
+              </w:rPr>
+              <w:t>Term(</w:t>
+            </w:r>
+            <w:r>
+              <w:rPr>
+                <w:rFonts w:ascii="Times New Roman" w:eastAsia="標楷體" w:hAnsi="Times New Roman" w:cs="Times New Roman" w:hint="eastAsia"/>
+              </w:rPr>
+              <w:t>術語</w:t>
+            </w:r>
+            <w:r>
+              <w:rPr>
+                <w:rFonts w:ascii="Times New Roman" w:eastAsia="標楷體" w:hAnsi="Times New Roman" w:cs="Times New Roman" w:hint="eastAsia"/>
+              </w:rPr>
+              <w:t>)</w:t>
+            </w:r>
+          </w:p>
+        </w:tc>
+        <w:tc>
+          <w:tcPr>
+            <w:tcW w:w="6316" w:type="dxa"/>
+          </w:tcPr>
+          <w:p>
+            <w:pPr>
+              <w:rPr>
+                <w:rFonts w:ascii="Times New Roman" w:eastAsia="標楷體" w:hAnsi="Times New Roman" w:cs="Times New Roman" w:hint="eastAsia"/>
+              </w:rPr>
+            </w:pPr>
+            <w:r>
+              <w:rPr>
+                <w:rFonts w:ascii="Times New Roman" w:eastAsia="標楷體" w:hAnsi="Times New Roman" w:cs="Times New Roman" w:hint="eastAsia"/>
+              </w:rPr>
+              <w:t>Definition(</w:t>
+            </w:r>
+            <w:r>
+              <w:rPr>
+                <w:rFonts w:ascii="Times New Roman" w:eastAsia="標楷體" w:hAnsi="Times New Roman" w:cs="Times New Roman" w:hint="eastAsia"/>
+              </w:rPr>
+              <w:t>定義</w:t>
+            </w:r>
+            <w:r>
+              <w:rPr>
+                <w:rFonts w:ascii="Times New Roman" w:eastAsia="標楷體" w:hAnsi="Times New Roman" w:cs="Times New Roman" w:hint="eastAsia"/>
+              </w:rPr>
+              <w:t>)</w:t>
+            </w:r>
+          </w:p>
+        </w:tc>
+      </w:tr>
+      <w:tr>
+        <w:tc>
+          <w:tcPr>
+            <w:tcW w:w="1980" w:type="dxa"/>
+          </w:tcPr>
+          <w:p>
+            <w:pPr>
+              <w:rPr>
+                <w:rFonts w:ascii="Times New Roman" w:eastAsia="標楷體" w:hAnsi="Times New Roman" w:cs="Times New Roman" w:hint="eastAsia"/>
+              </w:rPr>
+            </w:pPr>
+            <w:r>
+              <w:rPr>
+                <w:rFonts w:ascii="Times New Roman" w:eastAsia="標楷體" w:hAnsi="Times New Roman" w:cs="Times New Roman" w:hint="eastAsia"/>
+              </w:rPr>
+              <w:t>ISBN</w:t>
+            </w:r>
+          </w:p>
+        </w:tc>
+        <w:tc>
+          <w:tcPr>
+            <w:tcW w:w="6316" w:type="dxa"/>
+          </w:tcPr>
+          <w:p>
+            <w:pPr>
+              <w:rPr>
+                <w:rFonts w:ascii="Times New Roman" w:eastAsia="標楷體" w:hAnsi="Times New Roman" w:cs="Times New Roman" w:hint="eastAsia"/>
+              </w:rPr>
+            </w:pPr>
+            <w:r>
+              <w:rPr>
+                <w:rFonts w:ascii="Times New Roman" w:eastAsia="標楷體" w:hAnsi="Times New Roman" w:cs="Times New Roman"/>
+              </w:rPr>
+              <w:t xml:space="preserve">International Standard Book Number </w:t>
+            </w:r>
+            <w:r>
+              <w:rPr>
+                <w:rFonts w:ascii="Times New Roman" w:eastAsia="標楷體" w:hAnsi="Times New Roman" w:cs="Times New Roman"/>
+              </w:rPr>
+              <w:t>的縮寫。用於唯一識別特定書籍的</w:t>
+            </w:r>
+            <w:r>
+              <w:rPr>
+                <w:rFonts w:ascii="Times New Roman" w:eastAsia="標楷體" w:hAnsi="Times New Roman" w:cs="Times New Roman"/>
+              </w:rPr>
+              <w:t xml:space="preserve"> 10 </w:t>
+            </w:r>
+            <w:r>
+              <w:rPr>
+                <w:rFonts w:ascii="Times New Roman" w:eastAsia="標楷體" w:hAnsi="Times New Roman" w:cs="Times New Roman"/>
+              </w:rPr>
+              <w:t>位或</w:t>
+            </w:r>
+            <w:r>
+              <w:rPr>
+                <w:rFonts w:ascii="Times New Roman" w:eastAsia="標楷體" w:hAnsi="Times New Roman" w:cs="Times New Roman"/>
+              </w:rPr>
+              <w:t xml:space="preserve"> 13 </w:t>
+            </w:r>
+            <w:r>
+              <w:rPr>
+                <w:rFonts w:ascii="Times New Roman" w:eastAsia="標楷體" w:hAnsi="Times New Roman" w:cs="Times New Roman"/>
+              </w:rPr>
+              <w:t>位數字代碼，本系統中用於快速帶入書籍基本資料。</w:t>
+            </w:r>
+          </w:p>
+        </w:tc>
+      </w:tr>
+      <w:tr>
+        <w:tc>
+          <w:tcPr>
+            <w:tcW w:w="1980" w:type="dxa"/>
+          </w:tcPr>
+          <w:p>
+            <w:pPr>
+              <w:rPr>
+                <w:rFonts w:ascii="Times New Roman" w:eastAsia="標楷體" w:hAnsi="Times New Roman" w:cs="Times New Roman" w:hint="eastAsia"/>
+              </w:rPr>
+            </w:pPr>
+            <w:r>
+              <w:rPr>
+                <w:rFonts w:ascii="Times New Roman" w:eastAsia="標楷體" w:hAnsi="Times New Roman" w:cs="Times New Roman" w:hint="eastAsia"/>
+              </w:rPr>
+              <w:t>商品</w:t>
+            </w:r>
+            <w:r>
+              <w:rPr>
+                <w:rFonts w:ascii="Times New Roman" w:eastAsia="標楷體" w:hAnsi="Times New Roman" w:cs="Times New Roman" w:hint="eastAsia"/>
+              </w:rPr>
+              <w:t>/</w:t>
+            </w:r>
+            <w:r>
+              <w:rPr>
+                <w:rFonts w:ascii="Times New Roman" w:eastAsia="標楷體" w:hAnsi="Times New Roman" w:cs="Times New Roman" w:hint="eastAsia"/>
+              </w:rPr>
+              <w:t>書籍</w:t>
+            </w:r>
+          </w:p>
+        </w:tc>
+        <w:tc>
+          <w:tcPr>
+            <w:tcW w:w="6316" w:type="dxa"/>
+          </w:tcPr>
+          <w:p>
+            <w:pPr>
+              <w:rPr>
+                <w:rFonts w:ascii="Times New Roman" w:eastAsia="標楷體" w:hAnsi="Times New Roman" w:cs="Times New Roman" w:hint="eastAsia"/>
+              </w:rPr>
+            </w:pPr>
+            <w:r>
+              <w:rPr>
+                <w:rFonts w:ascii="Times New Roman" w:eastAsia="標楷體" w:hAnsi="Times New Roman" w:cs="Times New Roman"/>
+              </w:rPr>
+              <w:t>賣家在平台上發布的一筆具體</w:t>
+            </w:r>
+            <w:r>
+              <w:rPr>
+                <w:rFonts w:ascii="Times New Roman" w:eastAsia="標楷體" w:hAnsi="Times New Roman" w:cs="Times New Roman" w:hint="eastAsia"/>
+              </w:rPr>
+              <w:t>待售資訊</w:t>
+            </w:r>
+            <w:r>
+              <w:rPr>
+                <w:rFonts w:ascii="Times New Roman" w:eastAsia="標楷體" w:hAnsi="Times New Roman" w:cs="Times New Roman"/>
+              </w:rPr>
+              <w:t>，包含該書籍的價格、書況、照片與所在地點等資訊。</w:t>
+            </w:r>
+          </w:p>
+        </w:tc>
+      </w:tr>
+      <w:tr>
+        <w:tc>
+          <w:tcPr>
+            <w:tcW w:w="1980" w:type="dxa"/>
+          </w:tcPr>
+          <w:p>
+            <w:pPr>
+              <w:rPr>
+                <w:rFonts w:ascii="Times New Roman" w:eastAsia="標楷體" w:hAnsi="Times New Roman" w:cs="Times New Roman" w:hint="eastAsia"/>
+              </w:rPr>
+            </w:pPr>
+            <w:r>
+              <w:rPr>
+                <w:rFonts w:ascii="Times New Roman" w:eastAsia="標楷體" w:hAnsi="Times New Roman" w:cs="Times New Roman" w:hint="eastAsia"/>
+              </w:rPr>
+              <w:t>使用者</w:t>
+            </w:r>
+          </w:p>
+        </w:tc>
+        <w:tc>
+          <w:tcPr>
+            <w:tcW w:w="6316" w:type="dxa"/>
+          </w:tcPr>
+          <w:p>
+            <w:pPr>
+              <w:rPr>
+                <w:rFonts w:ascii="Times New Roman" w:eastAsia="標楷體" w:hAnsi="Times New Roman" w:cs="Times New Roman" w:hint="eastAsia"/>
+              </w:rPr>
+            </w:pPr>
+            <w:r>
+              <w:rPr>
+                <w:rFonts w:ascii="Times New Roman" w:eastAsia="標楷體" w:hAnsi="Times New Roman" w:cs="Times New Roman" w:hint="eastAsia"/>
+              </w:rPr>
+              <w:t>使用平台的使用者</w:t>
+            </w:r>
+            <w:r>
+              <w:rPr>
+                <w:rFonts w:ascii="Times New Roman" w:eastAsia="標楷體" w:hAnsi="Times New Roman" w:cs="Times New Roman"/>
+              </w:rPr>
+              <w:t>。在本專案中嚴格區分為「買家」與「賣家」兩種不同權限的角色。</w:t>
+            </w:r>
+          </w:p>
+        </w:tc>
+      </w:tr>
+      <w:tr>
+        <w:tc>
+          <w:tcPr>
+            <w:tcW w:w="1980" w:type="dxa"/>
+          </w:tcPr>
+          <w:p>
+            <w:pPr>
+              <w:rPr>
+                <w:rFonts w:ascii="Times New Roman" w:eastAsia="標楷體" w:hAnsi="Times New Roman" w:cs="Times New Roman" w:hint="eastAsia"/>
+              </w:rPr>
+            </w:pPr>
+            <w:r>
+              <w:rPr>
+                <w:rFonts w:ascii="Times New Roman" w:eastAsia="標楷體" w:hAnsi="Times New Roman" w:cs="Times New Roman" w:hint="eastAsia"/>
+              </w:rPr>
+              <w:t>購物車</w:t>
+            </w:r>
+          </w:p>
+        </w:tc>
+        <w:tc>
+          <w:tcPr>
+            <w:tcW w:w="6316" w:type="dxa"/>
+          </w:tcPr>
+          <w:p>
+            <w:pPr>
+              <w:rPr>
+                <w:rFonts w:ascii="Times New Roman" w:eastAsia="標楷體" w:hAnsi="Times New Roman" w:cs="Times New Roman" w:hint="eastAsia"/>
+              </w:rPr>
+            </w:pPr>
+            <w:r>
+              <w:rPr>
+                <w:rFonts w:ascii="Times New Roman" w:eastAsia="標楷體" w:hAnsi="Times New Roman" w:cs="Times New Roman" w:hint="eastAsia"/>
+              </w:rPr>
+              <w:t>暫存買家有意交易的商品。讓買家在後續可以進行比價或發起私訊以進行協商。</w:t>
+            </w:r>
+          </w:p>
+        </w:tc>
+      </w:tr>
+      <w:tr>
+        <w:tc>
+          <w:tcPr>
+            <w:tcW w:w="1980" w:type="dxa"/>
+          </w:tcPr>
+          <w:p>
+            <w:pPr>
+              <w:rPr>
+                <w:rFonts w:ascii="Times New Roman" w:eastAsia="標楷體" w:hAnsi="Times New Roman" w:cs="Times New Roman" w:hint="eastAsia"/>
+              </w:rPr>
+            </w:pPr>
+            <w:r>
+              <w:rPr>
+                <w:rFonts w:ascii="Times New Roman" w:eastAsia="標楷體" w:hAnsi="Times New Roman" w:cs="Times New Roman" w:hint="eastAsia"/>
+              </w:rPr>
+              <w:t>交易狀態</w:t>
+            </w:r>
+          </w:p>
+        </w:tc>
+        <w:tc>
+          <w:tcPr>
+            <w:tcW w:w="6316" w:type="dxa"/>
+          </w:tcPr>
+          <w:p>
+            <w:pPr>
+              <w:rPr>
+                <w:rFonts w:ascii="Times New Roman" w:eastAsia="標楷體" w:hAnsi="Times New Roman" w:cs="Times New Roman" w:hint="eastAsia"/>
+              </w:rPr>
+            </w:pPr>
+            <w:r>
+              <w:rPr>
+                <w:rFonts w:ascii="Times New Roman" w:eastAsia="標楷體" w:hAnsi="Times New Roman" w:cs="Times New Roman" w:hint="eastAsia"/>
+              </w:rPr>
+              <w:t>標記商品當前的所處的生命週期</w:t>
+            </w:r>
+            <w:r>
+              <w:rPr>
+                <w:rFonts w:ascii="Times New Roman" w:eastAsia="標楷體" w:hAnsi="Times New Roman" w:cs="Times New Roman" w:hint="eastAsia"/>
+              </w:rPr>
+              <w:t>(</w:t>
+            </w:r>
+            <w:r>
+              <w:rPr>
+                <w:rFonts w:ascii="Times New Roman" w:eastAsia="標楷體" w:hAnsi="Times New Roman" w:cs="Times New Roman" w:hint="eastAsia"/>
+              </w:rPr>
+              <w:t>待售或是已售出</w:t>
+            </w:r>
+            <w:r>
+              <w:rPr>
+                <w:rFonts w:ascii="Times New Roman" w:eastAsia="標楷體" w:hAnsi="Times New Roman" w:cs="Times New Roman" w:hint="eastAsia"/>
+              </w:rPr>
+              <w:t>)</w:t>
+            </w:r>
+            <w:r>
+              <w:rPr>
+                <w:rFonts w:ascii="Times New Roman" w:eastAsia="標楷體" w:hAnsi="Times New Roman" w:cs="Times New Roman" w:hint="eastAsia"/>
+              </w:rPr>
+              <w:t>。</w:t>
+            </w:r>
+          </w:p>
+        </w:tc>
+      </w:tr>
+    </w:tbl>
     <w:p>
       <w:pPr>
         <w:rPr>
-          <w:rFonts w:ascii="Times New Roman" w:eastAsia="標楷體" w:hAnsi="Times New Roman" w:cs="Times New Roman"/>
+          <w:rFonts w:ascii="Times New Roman" w:eastAsia="標楷體" w:hAnsi="Times New Roman" w:cs="Times New Roman" w:hint="eastAsia"/>
         </w:rPr>
       </w:pPr>
     </w:p>
@@ -5837,7 +6915,7 @@
 </file>
 
 <file path=word/endnotes.xml><?xml version="1.0" encoding="utf-8"?>
-<w:endnotes xmlns:wpc="http://schemas.microsoft.com/office/word/2010/wordprocessingCanvas" xmlns:cx="http://schemas.microsoft.com/office/drawing/2014/chartex" xmlns:cx1="http://schemas.microsoft.com/office/drawing/2015/9/8/chartex" xmlns:cx2="http://schemas.microsoft.com/office/drawing/2015/10/21/chartex" xmlns:cx3="http://schemas.microsoft.com/office/drawing/2016/5/9/chartex" xmlns:cx4="http://schemas.microsoft.com/office/drawing/2016/5/10/chartex" xmlns:cx5="http://schemas.microsoft.com/office/drawing/2016/5/11/chartex" xmlns:cx6="http://schemas.microsoft.com/office/drawing/2016/5/12/chartex" xmlns:cx7="http://schemas.microsoft.com/office/drawing/2016/5/13/chartex" xmlns:cx8="http://schemas.microsoft.com/office/drawing/2016/5/14/chartex" xmlns:mc="http://schemas.openxmlformats.org/markup-compatibility/2006" xmlns:aink="http://schemas.microsoft.com/office/drawing/2016/ink" xmlns:am3d="http://schemas.microsoft.com/office/drawing/2017/model3d" xmlns:o="urn:schemas-microsoft-com:office:office" xmlns:oel="http://schemas.microsoft.com/office/2019/extlst" xmlns:r="http://schemas.openxmlformats.org/officeDocument/2006/relationships" xmlns:m="http://schemas.openxmlformats.org/officeDocument/2006/math" xmlns:v="urn:schemas-microsoft-com:vml" xmlns:wp14="http://schemas.microsoft.com/office/word/2010/wordprocessingDrawing" xmlns:wp="http://schemas.openxmlformats.org/drawingml/2006/wordprocessingDrawing" xmlns:w10="urn:schemas-microsoft-com:office:word" xmlns:w="http://schemas.openxmlformats.org/wordprocessingml/2006/main" xmlns:w14="http://schemas.microsoft.com/office/word/2010/wordml" xmlns:w15="http://schemas.microsoft.com/office/word/2012/wordml" xmlns:w16cex="http://schemas.microsoft.com/office/word/2018/wordml/cex" xmlns:w16cid="http://schemas.microsoft.com/office/word/2016/wordml/cid" xmlns:w16="http://schemas.microsoft.com/office/word/2018/wordml" xmlns:w16sdtdh="http://schemas.microsoft.com/office/word/2020/wordml/sdtdatahash" xmlns:w16se="http://schemas.microsoft.com/office/word/2015/wordml/symex" xmlns:wpg="http://schemas.microsoft.com/office/word/2010/wordprocessingGroup" xmlns:wpi="http://schemas.microsoft.com/office/word/2010/wordprocessingInk" xmlns:wne="http://schemas.microsoft.com/office/word/2006/wordml" xmlns:wps="http://schemas.microsoft.com/office/word/2010/wordprocessingShape" mc:Ignorable="w14 w15 w16se w16cid w16 w16cex w16sdtdh wp14">
+<w:endnotes xmlns:wpc="http://schemas.microsoft.com/office/word/2010/wordprocessingCanvas" xmlns:cx="http://schemas.microsoft.com/office/drawing/2014/chartex" xmlns:cx1="http://schemas.microsoft.com/office/drawing/2015/9/8/chartex" xmlns:cx2="http://schemas.microsoft.com/office/drawing/2015/10/21/chartex" xmlns:cx3="http://schemas.microsoft.com/office/drawing/2016/5/9/chartex" xmlns:cx4="http://schemas.microsoft.com/office/drawing/2016/5/10/chartex" xmlns:cx5="http://schemas.microsoft.com/office/drawing/2016/5/11/chartex" xmlns:cx6="http://schemas.microsoft.com/office/drawing/2016/5/12/chartex" xmlns:cx7="http://schemas.microsoft.com/office/drawing/2016/5/13/chartex" xmlns:cx8="http://schemas.microsoft.com/office/drawing/2016/5/14/chartex" xmlns:mc="http://schemas.openxmlformats.org/markup-compatibility/2006" xmlns:aink="http://schemas.microsoft.com/office/drawing/2016/ink" xmlns:am3d="http://schemas.microsoft.com/office/drawing/2017/model3d" xmlns:o="urn:schemas-microsoft-com:office:office" xmlns:oel="http://schemas.microsoft.com/office/2019/extlst" xmlns:r="http://schemas.openxmlformats.org/officeDocument/2006/relationships" xmlns:m="http://schemas.openxmlformats.org/officeDocument/2006/math" xmlns:v="urn:schemas-microsoft-com:vml" xmlns:wp14="http://schemas.microsoft.com/office/word/2010/wordprocessingDrawing" xmlns:wp="http://schemas.openxmlformats.org/drawingml/2006/wordprocessingDrawing" xmlns:w10="urn:schemas-microsoft-com:office:word" xmlns:w="http://schemas.openxmlformats.org/wordprocessingml/2006/main" xmlns:w14="http://schemas.microsoft.com/office/word/2010/wordml" xmlns:w15="http://schemas.microsoft.com/office/word/2012/wordml" xmlns:w16cex="http://schemas.microsoft.com/office/word/2018/wordml/cex" xmlns:w16cid="http://schemas.microsoft.com/office/word/2016/wordml/cid" xmlns:w16="http://schemas.microsoft.com/office/word/2018/wordml" xmlns:w16du="http://schemas.microsoft.com/office/word/2023/wordml/word16du" xmlns:w16sdtdh="http://schemas.microsoft.com/office/word/2020/wordml/sdtdatahash" xmlns:w16sdtfl="http://schemas.microsoft.com/office/word/2024/wordml/sdtformatlock" xmlns:w16se="http://schemas.microsoft.com/office/word/2015/wordml/symex" xmlns:wpg="http://schemas.microsoft.com/office/word/2010/wordprocessingGroup" xmlns:wpi="http://schemas.microsoft.com/office/word/2010/wordprocessingInk" xmlns:wne="http://schemas.microsoft.com/office/word/2006/wordml" xmlns:wps="http://schemas.microsoft.com/office/word/2010/wordprocessingShape" mc:Ignorable="w14 w15 w16se w16cid w16 w16cex w16sdtdh w16sdtfl w16du wp14">
   <w:endnote w:type="separator" w:id="-1">
     <w:p>
       <w:pPr>
@@ -5862,7 +6940,7 @@
 </file>
 
 <file path=word/footnotes.xml><?xml version="1.0" encoding="utf-8"?>
-<w:footnotes xmlns:wpc="http://schemas.microsoft.com/office/word/2010/wordprocessingCanvas" xmlns:cx="http://schemas.microsoft.com/office/drawing/2014/chartex" xmlns:cx1="http://schemas.microsoft.com/office/drawing/2015/9/8/chartex" xmlns:cx2="http://schemas.microsoft.com/office/drawing/2015/10/21/chartex" xmlns:cx3="http://schemas.microsoft.com/office/drawing/2016/5/9/chartex" xmlns:cx4="http://schemas.microsoft.com/office/drawing/2016/5/10/chartex" xmlns:cx5="http://schemas.microsoft.com/office/drawing/2016/5/11/chartex" xmlns:cx6="http://schemas.microsoft.com/office/drawing/2016/5/12/chartex" xmlns:cx7="http://schemas.microsoft.com/office/drawing/2016/5/13/chartex" xmlns:cx8="http://schemas.microsoft.com/office/drawing/2016/5/14/chartex" xmlns:mc="http://schemas.openxmlformats.org/markup-compatibility/2006" xmlns:aink="http://schemas.microsoft.com/office/drawing/2016/ink" xmlns:am3d="http://schemas.microsoft.com/office/drawing/2017/model3d" xmlns:o="urn:schemas-microsoft-com:office:office" xmlns:oel="http://schemas.microsoft.com/office/2019/extlst" xmlns:r="http://schemas.openxmlformats.org/officeDocument/2006/relationships" xmlns:m="http://schemas.openxmlformats.org/officeDocument/2006/math" xmlns:v="urn:schemas-microsoft-com:vml" xmlns:wp14="http://schemas.microsoft.com/office/word/2010/wordprocessingDrawing" xmlns:wp="http://schemas.openxmlformats.org/drawingml/2006/wordprocessingDrawing" xmlns:w10="urn:schemas-microsoft-com:office:word" xmlns:w="http://schemas.openxmlformats.org/wordprocessingml/2006/main" xmlns:w14="http://schemas.microsoft.com/office/word/2010/wordml" xmlns:w15="http://schemas.microsoft.com/office/word/2012/wordml" xmlns:w16cex="http://schemas.microsoft.com/office/word/2018/wordml/cex" xmlns:w16cid="http://schemas.microsoft.com/office/word/2016/wordml/cid" xmlns:w16="http://schemas.microsoft.com/office/word/2018/wordml" xmlns:w16sdtdh="http://schemas.microsoft.com/office/word/2020/wordml/sdtdatahash" xmlns:w16se="http://schemas.microsoft.com/office/word/2015/wordml/symex" xmlns:wpg="http://schemas.microsoft.com/office/word/2010/wordprocessingGroup" xmlns:wpi="http://schemas.microsoft.com/office/word/2010/wordprocessingInk" xmlns:wne="http://schemas.microsoft.com/office/word/2006/wordml" xmlns:wps="http://schemas.microsoft.com/office/word/2010/wordprocessingShape" mc:Ignorable="w14 w15 w16se w16cid w16 w16cex w16sdtdh wp14">
+<w:footnotes xmlns:wpc="http://schemas.microsoft.com/office/word/2010/wordprocessingCanvas" xmlns:cx="http://schemas.microsoft.com/office/drawing/2014/chartex" xmlns:cx1="http://schemas.microsoft.com/office/drawing/2015/9/8/chartex" xmlns:cx2="http://schemas.microsoft.com/office/drawing/2015/10/21/chartex" xmlns:cx3="http://schemas.microsoft.com/office/drawing/2016/5/9/chartex" xmlns:cx4="http://schemas.microsoft.com/office/drawing/2016/5/10/chartex" xmlns:cx5="http://schemas.microsoft.com/office/drawing/2016/5/11/chartex" xmlns:cx6="http://schemas.microsoft.com/office/drawing/2016/5/12/chartex" xmlns:cx7="http://schemas.microsoft.com/office/drawing/2016/5/13/chartex" xmlns:cx8="http://schemas.microsoft.com/office/drawing/2016/5/14/chartex" xmlns:mc="http://schemas.openxmlformats.org/markup-compatibility/2006" xmlns:aink="http://schemas.microsoft.com/office/drawing/2016/ink" xmlns:am3d="http://schemas.microsoft.com/office/drawing/2017/model3d" xmlns:o="urn:schemas-microsoft-com:office:office" xmlns:oel="http://schemas.microsoft.com/office/2019/extlst" xmlns:r="http://schemas.openxmlformats.org/officeDocument/2006/relationships" xmlns:m="http://schemas.openxmlformats.org/officeDocument/2006/math" xmlns:v="urn:schemas-microsoft-com:vml" xmlns:wp14="http://schemas.microsoft.com/office/word/2010/wordprocessingDrawing" xmlns:wp="http://schemas.openxmlformats.org/drawingml/2006/wordprocessingDrawing" xmlns:w10="urn:schemas-microsoft-com:office:word" xmlns:w="http://schemas.openxmlformats.org/wordprocessingml/2006/main" xmlns:w14="http://schemas.microsoft.com/office/word/2010/wordml" xmlns:w15="http://schemas.microsoft.com/office/word/2012/wordml" xmlns:w16cex="http://schemas.microsoft.com/office/word/2018/wordml/cex" xmlns:w16cid="http://schemas.microsoft.com/office/word/2016/wordml/cid" xmlns:w16="http://schemas.microsoft.com/office/word/2018/wordml" xmlns:w16du="http://schemas.microsoft.com/office/word/2023/wordml/word16du" xmlns:w16sdtdh="http://schemas.microsoft.com/office/word/2020/wordml/sdtdatahash" xmlns:w16sdtfl="http://schemas.microsoft.com/office/word/2024/wordml/sdtformatlock" xmlns:w16se="http://schemas.microsoft.com/office/word/2015/wordml/symex" xmlns:wpg="http://schemas.microsoft.com/office/word/2010/wordprocessingGroup" xmlns:wpi="http://schemas.microsoft.com/office/word/2010/wordprocessingInk" xmlns:wne="http://schemas.microsoft.com/office/word/2006/wordml" xmlns:wps="http://schemas.microsoft.com/office/word/2010/wordprocessingShape" mc:Ignorable="w14 w15 w16se w16cid w16 w16cex w16sdtdh w16sdtfl w16du wp14">
   <w:footnote w:type="separator" w:id="-1">
     <w:p>
       <w:pPr>
@@ -5887,7 +6965,7 @@
 </file>
 
 <file path=word/numbering.xml><?xml version="1.0" encoding="utf-8"?>
-<w:numbering xmlns:wpc="http://schemas.microsoft.com/office/word/2010/wordprocessingCanvas" xmlns:cx="http://schemas.microsoft.com/office/drawing/2014/chartex" xmlns:cx1="http://schemas.microsoft.com/office/drawing/2015/9/8/chartex" xmlns:cx2="http://schemas.microsoft.com/office/drawing/2015/10/21/chartex" xmlns:cx3="http://schemas.microsoft.com/office/drawing/2016/5/9/chartex" xmlns:cx4="http://schemas.microsoft.com/office/drawing/2016/5/10/chartex" xmlns:cx5="http://schemas.microsoft.com/office/drawing/2016/5/11/chartex" xmlns:cx6="http://schemas.microsoft.com/office/drawing/2016/5/12/chartex" xmlns:cx7="http://schemas.microsoft.com/office/drawing/2016/5/13/chartex" xmlns:cx8="http://schemas.microsoft.com/office/drawing/2016/5/14/chartex" xmlns:mc="http://schemas.openxmlformats.org/markup-compatibility/2006" xmlns:aink="http://schemas.microsoft.com/office/drawing/2016/ink" xmlns:am3d="http://schemas.microsoft.com/office/drawing/2017/model3d" xmlns:o="urn:schemas-microsoft-com:office:office" xmlns:oel="http://schemas.microsoft.com/office/2019/extlst" xmlns:r="http://schemas.openxmlformats.org/officeDocument/2006/relationships" xmlns:m="http://schemas.openxmlformats.org/officeDocument/2006/math" xmlns:v="urn:schemas-microsoft-com:vml" xmlns:wp14="http://schemas.microsoft.com/office/word/2010/wordprocessingDrawing" xmlns:wp="http://schemas.openxmlformats.org/drawingml/2006/wordprocessingDrawing" xmlns:w10="urn:schemas-microsoft-com:office:word" xmlns:w="http://schemas.openxmlformats.org/wordprocessingml/2006/main" xmlns:w14="http://schemas.microsoft.com/office/word/2010/wordml" xmlns:w15="http://schemas.microsoft.com/office/word/2012/wordml" xmlns:w16cex="http://schemas.microsoft.com/office/word/2018/wordml/cex" xmlns:w16cid="http://schemas.microsoft.com/office/word/2016/wordml/cid" xmlns:w16="http://schemas.microsoft.com/office/word/2018/wordml" xmlns:w16sdtdh="http://schemas.microsoft.com/office/word/2020/wordml/sdtdatahash" xmlns:w16se="http://schemas.microsoft.com/office/word/2015/wordml/symex" xmlns:wpg="http://schemas.microsoft.com/office/word/2010/wordprocessingGroup" xmlns:wpi="http://schemas.microsoft.com/office/word/2010/wordprocessingInk" xmlns:wne="http://schemas.microsoft.com/office/word/2006/wordml" xmlns:wps="http://schemas.microsoft.com/office/word/2010/wordprocessingShape" mc:Ignorable="w14 w15 w16se w16cid w16 w16cex w16sdtdh wp14">
+<w:numbering xmlns:wpc="http://schemas.microsoft.com/office/word/2010/wordprocessingCanvas" xmlns:cx="http://schemas.microsoft.com/office/drawing/2014/chartex" xmlns:cx1="http://schemas.microsoft.com/office/drawing/2015/9/8/chartex" xmlns:cx2="http://schemas.microsoft.com/office/drawing/2015/10/21/chartex" xmlns:cx3="http://schemas.microsoft.com/office/drawing/2016/5/9/chartex" xmlns:cx4="http://schemas.microsoft.com/office/drawing/2016/5/10/chartex" xmlns:cx5="http://schemas.microsoft.com/office/drawing/2016/5/11/chartex" xmlns:cx6="http://schemas.microsoft.com/office/drawing/2016/5/12/chartex" xmlns:cx7="http://schemas.microsoft.com/office/drawing/2016/5/13/chartex" xmlns:cx8="http://schemas.microsoft.com/office/drawing/2016/5/14/chartex" xmlns:mc="http://schemas.openxmlformats.org/markup-compatibility/2006" xmlns:aink="http://schemas.microsoft.com/office/drawing/2016/ink" xmlns:am3d="http://schemas.microsoft.com/office/drawing/2017/model3d" xmlns:o="urn:schemas-microsoft-com:office:office" xmlns:oel="http://schemas.microsoft.com/office/2019/extlst" xmlns:r="http://schemas.openxmlformats.org/officeDocument/2006/relationships" xmlns:m="http://schemas.openxmlformats.org/officeDocument/2006/math" xmlns:v="urn:schemas-microsoft-com:vml" xmlns:wp14="http://schemas.microsoft.com/office/word/2010/wordprocessingDrawing" xmlns:wp="http://schemas.openxmlformats.org/drawingml/2006/wordprocessingDrawing" xmlns:w10="urn:schemas-microsoft-com:office:word" xmlns:w="http://schemas.openxmlformats.org/wordprocessingml/2006/main" xmlns:w14="http://schemas.microsoft.com/office/word/2010/wordml" xmlns:w15="http://schemas.microsoft.com/office/word/2012/wordml" xmlns:w16cex="http://schemas.microsoft.com/office/word/2018/wordml/cex" xmlns:w16cid="http://schemas.microsoft.com/office/word/2016/wordml/cid" xmlns:w16="http://schemas.microsoft.com/office/word/2018/wordml" xmlns:w16du="http://schemas.microsoft.com/office/word/2023/wordml/word16du" xmlns:w16sdtdh="http://schemas.microsoft.com/office/word/2020/wordml/sdtdatahash" xmlns:w16sdtfl="http://schemas.microsoft.com/office/word/2024/wordml/sdtformatlock" xmlns:w16se="http://schemas.microsoft.com/office/word/2015/wordml/symex" xmlns:wpg="http://schemas.microsoft.com/office/word/2010/wordprocessingGroup" xmlns:wpi="http://schemas.microsoft.com/office/word/2010/wordprocessingInk" xmlns:wne="http://schemas.microsoft.com/office/word/2006/wordml" xmlns:wps="http://schemas.microsoft.com/office/word/2010/wordprocessingShape" mc:Ignorable="w14 w15 w16se w16cid w16 w16cex w16sdtdh w16sdtfl w16du wp14">
   <w:abstractNum w:abstractNumId="0" w15:restartNumberingAfterBreak="0">
     <w:nsid w:val="1F397696"/>
     <w:multiLevelType w:val="hybridMultilevel"/>
@@ -6216,7 +7294,7 @@
 </file>
 
 <file path=word/styles.xml><?xml version="1.0" encoding="utf-8"?>
-<w:styles xmlns:mc="http://schemas.openxmlformats.org/markup-compatibility/2006" xmlns:r="http://schemas.openxmlformats.org/officeDocument/2006/relationships" xmlns:w="http://schemas.openxmlformats.org/wordprocessingml/2006/main" xmlns:w14="http://schemas.microsoft.com/office/word/2010/wordml" xmlns:w15="http://schemas.microsoft.com/office/word/2012/wordml" xmlns:w16cex="http://schemas.microsoft.com/office/word/2018/wordml/cex" xmlns:w16cid="http://schemas.microsoft.com/office/word/2016/wordml/cid" xmlns:w16="http://schemas.microsoft.com/office/word/2018/wordml" xmlns:w16sdtdh="http://schemas.microsoft.com/office/word/2020/wordml/sdtdatahash" xmlns:w16se="http://schemas.microsoft.com/office/word/2015/wordml/symex" mc:Ignorable="w14 w15 w16se w16cid w16 w16cex w16sdtdh">
+<w:styles xmlns:mc="http://schemas.openxmlformats.org/markup-compatibility/2006" xmlns:r="http://schemas.openxmlformats.org/officeDocument/2006/relationships" xmlns:w="http://schemas.openxmlformats.org/wordprocessingml/2006/main" xmlns:w14="http://schemas.microsoft.com/office/word/2010/wordml" xmlns:w15="http://schemas.microsoft.com/office/word/2012/wordml" xmlns:w16cex="http://schemas.microsoft.com/office/word/2018/wordml/cex" xmlns:w16cid="http://schemas.microsoft.com/office/word/2016/wordml/cid" xmlns:w16="http://schemas.microsoft.com/office/word/2018/wordml" xmlns:w16du="http://schemas.microsoft.com/office/word/2023/wordml/word16du" xmlns:w16sdtdh="http://schemas.microsoft.com/office/word/2020/wordml/sdtdatahash" xmlns:w16sdtfl="http://schemas.microsoft.com/office/word/2024/wordml/sdtformatlock" xmlns:w16se="http://schemas.microsoft.com/office/word/2015/wordml/symex" mc:Ignorable="w14 w15 w16se w16cid w16 w16cex w16sdtdh w16sdtfl w16du">
   <w:docDefaults>
     <w:rPrDefault>
       <w:rPr>
@@ -6615,7 +7693,7 @@
   <w:style w:type="paragraph" w:default="1" w:styleId="a">
     <w:name w:val="Normal"/>
     <w:qFormat/>
-    <w:rsid w:val="00540B92"/>
+    <w:rsid w:val="007B0C51"/>
     <w:pPr>
       <w:widowControl w:val="0"/>
     </w:pPr>
@@ -7210,6 +8288,27 @@
       </w:tblBorders>
     </w:tblPr>
   </w:style>
+  <w:style w:type="paragraph" w:styleId="af3">
+    <w:name w:val="Date"/>
+    <w:basedOn w:val="a"/>
+    <w:next w:val="a"/>
+    <w:link w:val="af4"/>
+    <w:uiPriority w:val="99"/>
+    <w:semiHidden/>
+    <w:unhideWhenUsed/>
+    <w:rsid w:val="007B0C51"/>
+    <w:pPr>
+      <w:jc w:val="right"/>
+    </w:pPr>
+  </w:style>
+  <w:style w:type="character" w:customStyle="1" w:styleId="af4">
+    <w:name w:val="日期 字元"/>
+    <w:basedOn w:val="a0"/>
+    <w:link w:val="af3"/>
+    <w:uiPriority w:val="99"/>
+    <w:semiHidden/>
+    <w:rsid w:val="007B0C51"/>
+  </w:style>
 </w:styles>
 </file>
 

</xml_diff>

<commit_message>
doc: revise UC and NFR
</commit_message>
<xml_diff>
--- a/document/hw2.docx
+++ b/document/hw2.docx
@@ -1,6 +1,6 @@
 
 <file path=word/document.xml><?xml version="1.0" encoding="utf-8"?>
-<w:document xmlns:wpc="http://schemas.microsoft.com/office/word/2010/wordprocessingCanvas" xmlns:cx="http://schemas.microsoft.com/office/drawing/2014/chartex" xmlns:cx1="http://schemas.microsoft.com/office/drawing/2015/9/8/chartex" xmlns:cx2="http://schemas.microsoft.com/office/drawing/2015/10/21/chartex" xmlns:cx3="http://schemas.microsoft.com/office/drawing/2016/5/9/chartex" xmlns:cx4="http://schemas.microsoft.com/office/drawing/2016/5/10/chartex" xmlns:cx5="http://schemas.microsoft.com/office/drawing/2016/5/11/chartex" xmlns:cx6="http://schemas.microsoft.com/office/drawing/2016/5/12/chartex" xmlns:cx7="http://schemas.microsoft.com/office/drawing/2016/5/13/chartex" xmlns:cx8="http://schemas.microsoft.com/office/drawing/2016/5/14/chartex" xmlns:mc="http://schemas.openxmlformats.org/markup-compatibility/2006" xmlns:aink="http://schemas.microsoft.com/office/drawing/2016/ink" xmlns:am3d="http://schemas.microsoft.com/office/drawing/2017/model3d" xmlns:o="urn:schemas-microsoft-com:office:office" xmlns:oel="http://schemas.microsoft.com/office/2019/extlst" xmlns:r="http://schemas.openxmlformats.org/officeDocument/2006/relationships" xmlns:m="http://schemas.openxmlformats.org/officeDocument/2006/math" xmlns:v="urn:schemas-microsoft-com:vml" xmlns:wp14="http://schemas.microsoft.com/office/word/2010/wordprocessingDrawing" xmlns:wp="http://schemas.openxmlformats.org/drawingml/2006/wordprocessingDrawing" xmlns:w10="urn:schemas-microsoft-com:office:word" xmlns:w="http://schemas.openxmlformats.org/wordprocessingml/2006/main" xmlns:w14="http://schemas.microsoft.com/office/word/2010/wordml" xmlns:w15="http://schemas.microsoft.com/office/word/2012/wordml" xmlns:w16cex="http://schemas.microsoft.com/office/word/2018/wordml/cex" xmlns:w16cid="http://schemas.microsoft.com/office/word/2016/wordml/cid" xmlns:w16="http://schemas.microsoft.com/office/word/2018/wordml" xmlns:w16du="http://schemas.microsoft.com/office/word/2023/wordml/word16du" xmlns:w16sdtdh="http://schemas.microsoft.com/office/word/2020/wordml/sdtdatahash" xmlns:w16sdtfl="http://schemas.microsoft.com/office/word/2024/wordml/sdtformatlock" xmlns:w16se="http://schemas.microsoft.com/office/word/2015/wordml/symex" xmlns:wpg="http://schemas.microsoft.com/office/word/2010/wordprocessingGroup" xmlns:wpi="http://schemas.microsoft.com/office/word/2010/wordprocessingInk" xmlns:wne="http://schemas.microsoft.com/office/word/2006/wordml" xmlns:wps="http://schemas.microsoft.com/office/word/2010/wordprocessingShape" mc:Ignorable="w14 w15 w16se w16cid w16 w16cex w16sdtdh w16sdtfl w16du wp14">
+<w:document xmlns:wpc="http://schemas.microsoft.com/office/word/2010/wordprocessingCanvas" xmlns:cx="http://schemas.microsoft.com/office/drawing/2014/chartex" xmlns:cx1="http://schemas.microsoft.com/office/drawing/2015/9/8/chartex" xmlns:cx2="http://schemas.microsoft.com/office/drawing/2015/10/21/chartex" xmlns:cx3="http://schemas.microsoft.com/office/drawing/2016/5/9/chartex" xmlns:cx4="http://schemas.microsoft.com/office/drawing/2016/5/10/chartex" xmlns:cx5="http://schemas.microsoft.com/office/drawing/2016/5/11/chartex" xmlns:cx6="http://schemas.microsoft.com/office/drawing/2016/5/12/chartex" xmlns:cx7="http://schemas.microsoft.com/office/drawing/2016/5/13/chartex" xmlns:cx8="http://schemas.microsoft.com/office/drawing/2016/5/14/chartex" xmlns:mc="http://schemas.openxmlformats.org/markup-compatibility/2006" xmlns:aink="http://schemas.microsoft.com/office/drawing/2016/ink" xmlns:am3d="http://schemas.microsoft.com/office/drawing/2017/model3d" xmlns:o="urn:schemas-microsoft-com:office:office" xmlns:oel="http://schemas.microsoft.com/office/2019/extlst" xmlns:r="http://schemas.openxmlformats.org/officeDocument/2006/relationships" xmlns:m="http://schemas.openxmlformats.org/officeDocument/2006/math" xmlns:v="urn:schemas-microsoft-com:vml" xmlns:wp14="http://schemas.microsoft.com/office/word/2010/wordprocessingDrawing" xmlns:wp="http://schemas.openxmlformats.org/drawingml/2006/wordprocessingDrawing" xmlns:w10="urn:schemas-microsoft-com:office:word" xmlns:w="http://schemas.openxmlformats.org/wordprocessingml/2006/main" xmlns:w14="http://schemas.microsoft.com/office/word/2010/wordml" xmlns:w15="http://schemas.microsoft.com/office/word/2012/wordml" xmlns:w16cex="http://schemas.microsoft.com/office/word/2018/wordml/cex" xmlns:w16cid="http://schemas.microsoft.com/office/word/2016/wordml/cid" xmlns:w16="http://schemas.microsoft.com/office/word/2018/wordml" xmlns:w16sdtdh="http://schemas.microsoft.com/office/word/2020/wordml/sdtdatahash" xmlns:w16se="http://schemas.microsoft.com/office/word/2015/wordml/symex" xmlns:wpg="http://schemas.microsoft.com/office/word/2010/wordprocessingGroup" xmlns:wpi="http://schemas.microsoft.com/office/word/2010/wordprocessingInk" xmlns:wne="http://schemas.microsoft.com/office/word/2006/wordml" xmlns:wps="http://schemas.microsoft.com/office/word/2010/wordprocessingShape" mc:Ignorable="w14 w15 w16se w16cid w16 w16cex w16sdtdh wp14">
   <w:body>
     <w:p>
       <w:pPr>
@@ -83,6 +83,7 @@
           <w:szCs w:val="52"/>
         </w:rPr>
       </w:pPr>
+      <w:proofErr w:type="spellStart"/>
       <w:r>
         <w:rPr>
           <w:rFonts w:ascii="Times New Roman" w:eastAsia="標楷體" w:hAnsi="Times New Roman" w:cs="Times New Roman" w:hint="eastAsia"/>
@@ -93,6 +94,7 @@
         </w:rPr>
         <w:t>Re:Book</w:t>
       </w:r>
+      <w:proofErr w:type="spellEnd"/>
     </w:p>
     <w:p>
       <w:pPr>
@@ -357,12 +359,14 @@
           <w:rFonts w:ascii="Times New Roman" w:eastAsia="標楷體" w:hAnsi="Times New Roman" w:cs="Times New Roman"/>
         </w:rPr>
       </w:pPr>
+      <w:proofErr w:type="spellStart"/>
       <w:r>
         <w:rPr>
           <w:rFonts w:ascii="Times New Roman" w:eastAsia="標楷體" w:hAnsi="Times New Roman" w:cs="Times New Roman"/>
         </w:rPr>
         <w:t>Re:Book</w:t>
       </w:r>
+      <w:proofErr w:type="spellEnd"/>
       <w:r>
         <w:rPr>
           <w:rFonts w:ascii="Times New Roman" w:eastAsia="標楷體" w:hAnsi="Times New Roman" w:cs="Times New Roman"/>
@@ -376,11 +380,19 @@
           <w:rFonts w:ascii="Times New Roman" w:eastAsia="標楷體" w:hAnsi="Times New Roman" w:cs="Times New Roman"/>
         </w:rPr>
       </w:pPr>
+      <w:proofErr w:type="spellStart"/>
       <w:r>
         <w:rPr>
           <w:rFonts w:ascii="Times New Roman" w:eastAsia="標楷體" w:hAnsi="Times New Roman" w:cs="Times New Roman" w:hint="eastAsia"/>
         </w:rPr>
-        <w:t xml:space="preserve">Re:Book </w:t>
+        <w:t>Re:Book</w:t>
+      </w:r>
+      <w:proofErr w:type="spellEnd"/>
+      <w:r>
+        <w:rPr>
+          <w:rFonts w:ascii="Times New Roman" w:eastAsia="標楷體" w:hAnsi="Times New Roman" w:cs="Times New Roman" w:hint="eastAsia"/>
+        </w:rPr>
+        <w:t xml:space="preserve"> </w:t>
       </w:r>
       <w:r>
         <w:rPr>
@@ -407,11 +419,19 @@
           <w:rFonts w:ascii="Times New Roman" w:eastAsia="標楷體" w:hAnsi="Times New Roman" w:cs="Times New Roman"/>
         </w:rPr>
       </w:pPr>
+      <w:proofErr w:type="spellStart"/>
       <w:r>
         <w:rPr>
           <w:rFonts w:ascii="Times New Roman" w:eastAsia="標楷體" w:hAnsi="Times New Roman" w:cs="Times New Roman" w:hint="eastAsia"/>
         </w:rPr>
-        <w:t xml:space="preserve">Re:Book </w:t>
+        <w:t>Re:Book</w:t>
+      </w:r>
+      <w:proofErr w:type="spellEnd"/>
+      <w:r>
+        <w:rPr>
+          <w:rFonts w:ascii="Times New Roman" w:eastAsia="標楷體" w:hAnsi="Times New Roman" w:cs="Times New Roman" w:hint="eastAsia"/>
+        </w:rPr>
+        <w:t xml:space="preserve"> </w:t>
       </w:r>
       <w:r>
         <w:rPr>
@@ -627,7 +647,7 @@
           <w:p>
             <w:pPr>
               <w:rPr>
-                <w:rFonts w:ascii="Times New Roman" w:eastAsia="標楷體" w:hAnsi="Times New Roman" w:cs="Times New Roman" w:hint="eastAsia"/>
+                <w:rFonts w:ascii="Times New Roman" w:eastAsia="標楷體" w:hAnsi="Times New Roman" w:cs="Times New Roman"/>
               </w:rPr>
             </w:pPr>
             <w:r>
@@ -741,7 +761,7 @@
           <w:p>
             <w:pPr>
               <w:rPr>
-                <w:rFonts w:ascii="Times New Roman" w:eastAsia="標楷體" w:hAnsi="Times New Roman" w:cs="Times New Roman" w:hint="eastAsia"/>
+                <w:rFonts w:ascii="Times New Roman" w:eastAsia="標楷體" w:hAnsi="Times New Roman" w:cs="Times New Roman"/>
               </w:rPr>
             </w:pPr>
             <w:r>
@@ -792,14 +812,7 @@
     <w:p>
       <w:pPr>
         <w:rPr>
-          <w:rFonts w:ascii="Times New Roman" w:eastAsia="標楷體" w:hAnsi="Times New Roman" w:cs="Times New Roman"/>
-        </w:rPr>
-      </w:pPr>
-    </w:p>
-    <w:p>
-      <w:pPr>
-        <w:rPr>
-          <w:rFonts w:ascii="Times New Roman" w:eastAsia="標楷體" w:hAnsi="Times New Roman" w:cs="Times New Roman"/>
+          <w:rFonts w:hint="eastAsia"/>
         </w:rPr>
       </w:pPr>
     </w:p>
@@ -913,12 +926,14 @@
                 <w:rFonts w:ascii="Times New Roman" w:eastAsia="標楷體" w:hAnsi="Times New Roman" w:cs="Times New Roman"/>
               </w:rPr>
             </w:pPr>
+            <w:proofErr w:type="spellStart"/>
             <w:r>
               <w:rPr>
                 <w:rFonts w:ascii="Times New Roman" w:eastAsia="標楷體" w:hAnsi="Times New Roman" w:cs="Times New Roman" w:hint="eastAsia"/>
               </w:rPr>
               <w:t>Re:Book</w:t>
             </w:r>
+            <w:proofErr w:type="spellEnd"/>
           </w:p>
         </w:tc>
       </w:tr>
@@ -1037,7 +1052,31 @@
               <w:rPr>
                 <w:rFonts w:ascii="Times New Roman" w:eastAsia="標楷體" w:hAnsi="Times New Roman" w:cs="Times New Roman" w:hint="eastAsia"/>
               </w:rPr>
-              <w:t>賣家：希望方便地新增、修改或下架書籍，以順利售出商品</w:t>
+              <w:t>賣家：希望方便</w:t>
+            </w:r>
+            <w:r>
+              <w:rPr>
+                <w:rFonts w:ascii="Times New Roman" w:eastAsia="標楷體" w:hAnsi="Times New Roman" w:cs="Times New Roman" w:hint="eastAsia"/>
+              </w:rPr>
+              <w:t>地上架、</w:t>
+            </w:r>
+            <w:r>
+              <w:rPr>
+                <w:rFonts w:ascii="Times New Roman" w:eastAsia="標楷體" w:hAnsi="Times New Roman" w:cs="Times New Roman" w:hint="eastAsia"/>
+              </w:rPr>
+              <w:t>下架</w:t>
+            </w:r>
+            <w:r>
+              <w:rPr>
+                <w:rFonts w:ascii="Times New Roman" w:eastAsia="標楷體" w:hAnsi="Times New Roman" w:cs="Times New Roman" w:hint="eastAsia"/>
+              </w:rPr>
+              <w:t>書籍與編輯其資訊</w:t>
+            </w:r>
+            <w:r>
+              <w:rPr>
+                <w:rFonts w:ascii="Times New Roman" w:eastAsia="標楷體" w:hAnsi="Times New Roman" w:cs="Times New Roman" w:hint="eastAsia"/>
+              </w:rPr>
+              <w:t>，以順利售出商品</w:t>
             </w:r>
           </w:p>
           <w:p>
@@ -1188,13 +1227,13 @@
               <w:rPr>
                 <w:rFonts w:ascii="Times New Roman" w:eastAsia="標楷體" w:hAnsi="Times New Roman" w:cs="Times New Roman" w:hint="eastAsia"/>
               </w:rPr>
-              <w:t>賣家選擇「新增書籍」或「編輯現有書籍」。</w:t>
-            </w:r>
-          </w:p>
-          <w:p>
-            <w:pPr>
-              <w:rPr>
-                <w:rFonts w:ascii="Times New Roman" w:eastAsia="標楷體" w:hAnsi="Times New Roman" w:cs="Times New Roman"/>
+              <w:t>賣家進入「個人賣場管理」頁面。</w:t>
+            </w:r>
+          </w:p>
+          <w:p>
+            <w:pPr>
+              <w:rPr>
+                <w:rFonts w:ascii="Times New Roman" w:eastAsia="標楷體" w:hAnsi="Times New Roman" w:cs="Times New Roman" w:hint="eastAsia"/>
               </w:rPr>
             </w:pPr>
             <w:r>
@@ -1205,170 +1244,470 @@
             </w:r>
             <w:r>
               <w:rPr>
-                <w:rFonts w:ascii="Times New Roman" w:eastAsia="標楷體" w:hAnsi="Times New Roman" w:cs="Times New Roman" w:hint="eastAsia"/>
-              </w:rPr>
-              <w:t>賣家輸入</w:t>
-            </w:r>
-            <w:r>
-              <w:rPr>
-                <w:rFonts w:ascii="Times New Roman" w:eastAsia="標楷體" w:hAnsi="Times New Roman" w:cs="Times New Roman" w:hint="eastAsia"/>
-              </w:rPr>
-              <w:t>/</w:t>
-            </w:r>
-            <w:r>
-              <w:rPr>
-                <w:rFonts w:ascii="Times New Roman" w:eastAsia="標楷體" w:hAnsi="Times New Roman" w:cs="Times New Roman" w:hint="eastAsia"/>
-              </w:rPr>
-              <w:t>修改</w:t>
-            </w:r>
-            <w:r>
-              <w:rPr>
-                <w:rFonts w:ascii="Times New Roman" w:eastAsia="標楷體" w:hAnsi="Times New Roman" w:cs="Times New Roman" w:hint="eastAsia"/>
+                <w:rFonts w:ascii="Times New Roman" w:eastAsia="標楷體" w:hAnsi="Times New Roman" w:cs="Times New Roman"/>
+              </w:rPr>
+              <w:t>系統顯示目前的書籍清單。</w:t>
+            </w:r>
+          </w:p>
+          <w:p>
+            <w:pPr>
+              <w:rPr>
+                <w:rFonts w:ascii="Times New Roman" w:eastAsia="標楷體" w:hAnsi="Times New Roman" w:cs="Times New Roman" w:hint="eastAsia"/>
+              </w:rPr>
+            </w:pPr>
+            <w:r>
+              <w:rPr>
+                <w:rFonts w:ascii="Times New Roman" w:eastAsia="標楷體" w:hAnsi="Times New Roman" w:cs="Times New Roman" w:hint="eastAsia"/>
+              </w:rPr>
+              <w:t>3</w:t>
+            </w:r>
+            <w:r>
+              <w:rPr>
+                <w:rFonts w:ascii="Times New Roman" w:eastAsia="標楷體" w:hAnsi="Times New Roman" w:cs="Times New Roman" w:hint="eastAsia"/>
+              </w:rPr>
+              <w:t xml:space="preserve">. </w:t>
+            </w:r>
+            <w:r>
+              <w:rPr>
+                <w:rFonts w:ascii="Times New Roman" w:eastAsia="標楷體" w:hAnsi="Times New Roman" w:cs="Times New Roman" w:hint="eastAsia"/>
+              </w:rPr>
+              <w:t>賣家</w:t>
+            </w:r>
+            <w:r>
+              <w:rPr>
+                <w:rFonts w:ascii="Times New Roman" w:eastAsia="標楷體" w:hAnsi="Times New Roman" w:cs="Times New Roman" w:hint="eastAsia"/>
+              </w:rPr>
+              <w:t>填寫並提交書籍資訊（包含</w:t>
+            </w:r>
+            <w:r>
+              <w:rPr>
+                <w:rFonts w:ascii="Times New Roman" w:eastAsia="標楷體" w:hAnsi="Times New Roman" w:cs="Times New Roman" w:hint="eastAsia"/>
+              </w:rPr>
+              <w:t>ISBN</w:t>
+            </w:r>
+            <w:r>
+              <w:rPr>
+                <w:rFonts w:ascii="Times New Roman" w:eastAsia="標楷體" w:hAnsi="Times New Roman" w:cs="Times New Roman" w:hint="eastAsia"/>
+              </w:rPr>
+              <w:t>、書名、價格、書況及區域</w:t>
+            </w:r>
+            <w:r>
+              <w:rPr>
+                <w:rFonts w:ascii="Times New Roman" w:eastAsia="標楷體" w:hAnsi="Times New Roman" w:cs="Times New Roman" w:hint="eastAsia"/>
+              </w:rPr>
+              <w:t>）</w:t>
+            </w:r>
+            <w:r>
+              <w:rPr>
+                <w:rFonts w:ascii="Times New Roman" w:eastAsia="標楷體" w:hAnsi="Times New Roman" w:cs="Times New Roman" w:hint="eastAsia"/>
+              </w:rPr>
+              <w:t>。</w:t>
+            </w:r>
+          </w:p>
+          <w:p>
+            <w:pPr>
+              <w:rPr>
+                <w:rFonts w:ascii="Times New Roman" w:eastAsia="標楷體" w:hAnsi="Times New Roman" w:cs="Times New Roman" w:hint="eastAsia"/>
+              </w:rPr>
+            </w:pPr>
+            <w:r>
+              <w:rPr>
+                <w:rFonts w:ascii="Times New Roman" w:eastAsia="標楷體" w:hAnsi="Times New Roman" w:cs="Times New Roman" w:hint="eastAsia"/>
+              </w:rPr>
+              <w:t>4</w:t>
+            </w:r>
+            <w:r>
+              <w:rPr>
+                <w:rFonts w:ascii="Times New Roman" w:eastAsia="標楷體" w:hAnsi="Times New Roman" w:cs="Times New Roman" w:hint="eastAsia"/>
+              </w:rPr>
+              <w:t xml:space="preserve">. </w:t>
+            </w:r>
+            <w:r>
+              <w:rPr>
+                <w:rFonts w:ascii="Times New Roman" w:eastAsia="標楷體" w:hAnsi="Times New Roman" w:cs="Times New Roman" w:hint="eastAsia"/>
+              </w:rPr>
+              <w:t>系統驗證資料格式</w:t>
+            </w:r>
+            <w:r>
+              <w:rPr>
+                <w:rFonts w:ascii="Times New Roman" w:eastAsia="標楷體" w:hAnsi="Times New Roman" w:cs="Times New Roman" w:hint="eastAsia"/>
+              </w:rPr>
+              <w:t>與必填欄位</w:t>
+            </w:r>
+            <w:r>
+              <w:rPr>
+                <w:rFonts w:ascii="Times New Roman" w:eastAsia="標楷體" w:hAnsi="Times New Roman" w:cs="Times New Roman" w:hint="eastAsia"/>
+              </w:rPr>
+              <w:t>。</w:t>
+            </w:r>
+          </w:p>
+          <w:p>
+            <w:pPr>
+              <w:rPr>
+                <w:rFonts w:ascii="Times New Roman" w:eastAsia="標楷體" w:hAnsi="Times New Roman" w:cs="Times New Roman"/>
+              </w:rPr>
+            </w:pPr>
+            <w:r>
+              <w:rPr>
+                <w:rFonts w:ascii="Times New Roman" w:eastAsia="標楷體" w:hAnsi="Times New Roman" w:cs="Times New Roman" w:hint="eastAsia"/>
+              </w:rPr>
+              <w:t xml:space="preserve">5. </w:t>
+            </w:r>
+            <w:r>
+              <w:rPr>
+                <w:rFonts w:ascii="Times New Roman" w:eastAsia="標楷體" w:hAnsi="Times New Roman" w:cs="Times New Roman" w:hint="eastAsia"/>
+              </w:rPr>
+              <w:t>系統</w:t>
+            </w:r>
+            <w:r>
+              <w:rPr>
+                <w:rFonts w:ascii="Times New Roman" w:eastAsia="標楷體" w:hAnsi="Times New Roman" w:cs="Times New Roman"/>
+              </w:rPr>
+              <w:t>將書籍資訊更新至資料庫。</w:t>
+            </w:r>
+          </w:p>
+          <w:p>
+            <w:pPr>
+              <w:rPr>
+                <w:rFonts w:ascii="Times New Roman" w:eastAsia="標楷體" w:hAnsi="Times New Roman" w:cs="Times New Roman" w:hint="eastAsia"/>
+              </w:rPr>
+            </w:pPr>
+            <w:r>
+              <w:rPr>
+                <w:rFonts w:ascii="Times New Roman" w:eastAsia="標楷體" w:hAnsi="Times New Roman" w:cs="Times New Roman" w:hint="eastAsia"/>
+              </w:rPr>
+              <w:t xml:space="preserve">6. </w:t>
+            </w:r>
+            <w:r>
+              <w:rPr>
+                <w:rFonts w:ascii="Times New Roman" w:eastAsia="標楷體" w:hAnsi="Times New Roman" w:cs="Times New Roman"/>
+              </w:rPr>
+              <w:t>系統重新載入清單，顯示最新狀態並提示成功訊息。</w:t>
+            </w:r>
+          </w:p>
+        </w:tc>
+      </w:tr>
+      <w:tr>
+        <w:tc>
+          <w:tcPr>
+            <w:tcW w:w="4148" w:type="dxa"/>
+          </w:tcPr>
+          <w:p>
+            <w:pPr>
+              <w:rPr>
+                <w:rFonts w:ascii="Times New Roman" w:eastAsia="標楷體" w:hAnsi="Times New Roman" w:cs="Times New Roman"/>
+              </w:rPr>
+            </w:pPr>
+            <w:r>
+              <w:rPr>
+                <w:rFonts w:ascii="Times New Roman" w:eastAsia="標楷體" w:hAnsi="Times New Roman" w:cs="Times New Roman" w:hint="eastAsia"/>
+              </w:rPr>
+              <w:t>Extensions</w:t>
+            </w:r>
+          </w:p>
+        </w:tc>
+        <w:tc>
+          <w:tcPr>
+            <w:tcW w:w="4148" w:type="dxa"/>
+          </w:tcPr>
+          <w:p>
+            <w:pPr>
+              <w:rPr>
+                <w:rFonts w:ascii="Times New Roman" w:eastAsia="標楷體" w:hAnsi="Times New Roman" w:cs="Times New Roman"/>
+              </w:rPr>
+            </w:pPr>
+            <w:r>
+              <w:rPr>
+                <w:rFonts w:ascii="Times New Roman" w:eastAsia="標楷體" w:hAnsi="Times New Roman" w:cs="Times New Roman" w:hint="eastAsia"/>
+              </w:rPr>
+              <w:t xml:space="preserve">3a. </w:t>
+            </w:r>
+            <w:r>
+              <w:rPr>
+                <w:rFonts w:ascii="Times New Roman" w:eastAsia="標楷體" w:hAnsi="Times New Roman" w:cs="Times New Roman"/>
+              </w:rPr>
+              <w:t>賣家選擇「刪除」書籍：</w:t>
+            </w:r>
+          </w:p>
+          <w:p>
+            <w:pPr>
+              <w:pStyle w:val="a9"/>
+              <w:numPr>
+                <w:ilvl w:val="0"/>
+                <w:numId w:val="4"/>
+              </w:numPr>
+              <w:rPr>
+                <w:rFonts w:ascii="Times New Roman" w:eastAsia="標楷體" w:hAnsi="Times New Roman" w:cs="Times New Roman"/>
+              </w:rPr>
+            </w:pPr>
+            <w:r>
+              <w:rPr>
+                <w:rFonts w:ascii="Times New Roman" w:eastAsia="標楷體" w:hAnsi="Times New Roman" w:cs="Times New Roman" w:hint="eastAsia"/>
+              </w:rPr>
+              <w:t>系統跳出確認刪除警告。</w:t>
+            </w:r>
+          </w:p>
+          <w:p>
+            <w:pPr>
+              <w:pStyle w:val="a9"/>
+              <w:numPr>
+                <w:ilvl w:val="0"/>
+                <w:numId w:val="4"/>
+              </w:numPr>
+              <w:rPr>
+                <w:rFonts w:ascii="Times New Roman" w:eastAsia="標楷體" w:hAnsi="Times New Roman" w:cs="Times New Roman"/>
+              </w:rPr>
+            </w:pPr>
+            <w:r>
+              <w:rPr>
+                <w:rFonts w:ascii="Times New Roman" w:eastAsia="標楷體" w:hAnsi="Times New Roman" w:cs="Times New Roman"/>
+              </w:rPr>
+              <w:t>賣家確認刪除。</w:t>
+            </w:r>
+          </w:p>
+          <w:p>
+            <w:pPr>
+              <w:pStyle w:val="a9"/>
+              <w:numPr>
+                <w:ilvl w:val="0"/>
+                <w:numId w:val="4"/>
+              </w:numPr>
+              <w:rPr>
+                <w:rFonts w:ascii="Times New Roman" w:eastAsia="標楷體" w:hAnsi="Times New Roman" w:cs="Times New Roman"/>
+              </w:rPr>
+            </w:pPr>
+            <w:r>
+              <w:rPr>
+                <w:rFonts w:ascii="Times New Roman" w:eastAsia="標楷體" w:hAnsi="Times New Roman" w:cs="Times New Roman"/>
+              </w:rPr>
+              <w:t>系統</w:t>
+            </w:r>
+            <w:r>
+              <w:rPr>
+                <w:rFonts w:ascii="Times New Roman" w:eastAsia="標楷體" w:hAnsi="Times New Roman" w:cs="Times New Roman" w:hint="eastAsia"/>
+              </w:rPr>
+              <w:t>從</w:t>
+            </w:r>
+            <w:r>
+              <w:rPr>
+                <w:rFonts w:ascii="Times New Roman" w:eastAsia="標楷體" w:hAnsi="Times New Roman" w:cs="Times New Roman"/>
+              </w:rPr>
+              <w:t>資料庫移除該</w:t>
+            </w:r>
+            <w:r>
+              <w:rPr>
+                <w:rFonts w:ascii="Times New Roman" w:eastAsia="標楷體" w:hAnsi="Times New Roman" w:cs="Times New Roman" w:hint="eastAsia"/>
+              </w:rPr>
+              <w:t>項商品</w:t>
+            </w:r>
+            <w:r>
+              <w:rPr>
+                <w:rFonts w:ascii="Times New Roman" w:eastAsia="標楷體" w:hAnsi="Times New Roman" w:cs="Times New Roman"/>
+              </w:rPr>
+              <w:t>。</w:t>
+            </w:r>
+          </w:p>
+          <w:p>
+            <w:pPr>
+              <w:pStyle w:val="a9"/>
+              <w:numPr>
+                <w:ilvl w:val="0"/>
+                <w:numId w:val="4"/>
+              </w:numPr>
+              <w:rPr>
+                <w:rFonts w:ascii="Times New Roman" w:eastAsia="標楷體" w:hAnsi="Times New Roman" w:cs="Times New Roman" w:hint="eastAsia"/>
+                <w:highlight w:val="yellow"/>
+              </w:rPr>
+            </w:pPr>
+            <w:r>
+              <w:rPr>
+                <w:rFonts w:ascii="Times New Roman" w:eastAsia="標楷體" w:hAnsi="Times New Roman" w:cs="Times New Roman"/>
+                <w:highlight w:val="yellow"/>
+              </w:rPr>
+              <w:t>接續執行</w:t>
+            </w:r>
+            <w:r>
+              <w:rPr>
+                <w:rFonts w:ascii="Times New Roman" w:eastAsia="標楷體" w:hAnsi="Times New Roman" w:cs="Times New Roman" w:hint="eastAsia"/>
+                <w:highlight w:val="yellow"/>
+              </w:rPr>
+              <w:t>Main Success Scenario</w:t>
+            </w:r>
+            <w:r>
+              <w:rPr>
+                <w:rFonts w:ascii="Times New Roman" w:eastAsia="標楷體" w:hAnsi="Times New Roman" w:cs="Times New Roman"/>
+                <w:highlight w:val="yellow"/>
+              </w:rPr>
+              <w:t>第</w:t>
+            </w:r>
+            <w:r>
+              <w:rPr>
+                <w:rFonts w:ascii="Times New Roman" w:eastAsia="標楷體" w:hAnsi="Times New Roman" w:cs="Times New Roman"/>
+                <w:highlight w:val="yellow"/>
+              </w:rPr>
+              <w:t>6</w:t>
+            </w:r>
+            <w:r>
+              <w:rPr>
+                <w:rFonts w:ascii="Times New Roman" w:eastAsia="標楷體" w:hAnsi="Times New Roman" w:cs="Times New Roman"/>
+                <w:highlight w:val="yellow"/>
+              </w:rPr>
+              <w:t>步。</w:t>
+            </w:r>
+          </w:p>
+          <w:p>
+            <w:pPr>
+              <w:rPr>
+                <w:rFonts w:ascii="Times New Roman" w:eastAsia="標楷體" w:hAnsi="Times New Roman" w:cs="Times New Roman"/>
+                <w:highlight w:val="yellow"/>
+              </w:rPr>
+            </w:pPr>
+            <w:r>
+              <w:rPr>
+                <w:rFonts w:ascii="Times New Roman" w:eastAsia="標楷體" w:hAnsi="Times New Roman" w:cs="Times New Roman" w:hint="eastAsia"/>
+                <w:highlight w:val="yellow"/>
+              </w:rPr>
+              <w:t xml:space="preserve">3b. </w:t>
+            </w:r>
+            <w:r>
+              <w:rPr>
+                <w:rFonts w:ascii="Times New Roman" w:eastAsia="標楷體" w:hAnsi="Times New Roman" w:cs="Times New Roman"/>
+                <w:highlight w:val="yellow"/>
+              </w:rPr>
+              <w:t>賣家選擇「查詢」書籍：</w:t>
+            </w:r>
+          </w:p>
+          <w:p>
+            <w:pPr>
+              <w:pStyle w:val="a9"/>
+              <w:numPr>
+                <w:ilvl w:val="0"/>
+                <w:numId w:val="5"/>
+              </w:numPr>
+              <w:rPr>
+                <w:rFonts w:ascii="Times New Roman" w:eastAsia="標楷體" w:hAnsi="Times New Roman" w:cs="Times New Roman"/>
+                <w:highlight w:val="yellow"/>
+              </w:rPr>
+            </w:pPr>
+            <w:r>
+              <w:rPr>
+                <w:rFonts w:ascii="Times New Roman" w:eastAsia="標楷體" w:hAnsi="Times New Roman" w:cs="Times New Roman"/>
+                <w:highlight w:val="yellow"/>
+              </w:rPr>
+              <w:t>賣家輸入查詢關鍵字（如書名或</w:t>
+            </w:r>
+            <w:r>
+              <w:rPr>
+                <w:rFonts w:ascii="Times New Roman" w:eastAsia="標楷體" w:hAnsi="Times New Roman" w:cs="Times New Roman"/>
+                <w:highlight w:val="yellow"/>
               </w:rPr>
               <w:t xml:space="preserve"> ISBN</w:t>
             </w:r>
             <w:r>
               <w:rPr>
-                <w:rFonts w:ascii="Times New Roman" w:eastAsia="標楷體" w:hAnsi="Times New Roman" w:cs="Times New Roman" w:hint="eastAsia"/>
-              </w:rPr>
-              <w:t>、書名、價格、書況及區域資訊。</w:t>
-            </w:r>
-          </w:p>
-          <w:p>
-            <w:pPr>
-              <w:rPr>
-                <w:rFonts w:ascii="Times New Roman" w:eastAsia="標楷體" w:hAnsi="Times New Roman" w:cs="Times New Roman"/>
-              </w:rPr>
-            </w:pPr>
-            <w:r>
-              <w:rPr>
-                <w:rFonts w:ascii="Times New Roman" w:eastAsia="標楷體" w:hAnsi="Times New Roman" w:cs="Times New Roman" w:hint="eastAsia"/>
-              </w:rPr>
-              <w:t xml:space="preserve">3. </w:t>
-            </w:r>
-            <w:r>
-              <w:rPr>
-                <w:rFonts w:ascii="Times New Roman" w:eastAsia="標楷體" w:hAnsi="Times New Roman" w:cs="Times New Roman" w:hint="eastAsia"/>
-              </w:rPr>
-              <w:t>系統驗證資料格式。</w:t>
-            </w:r>
-          </w:p>
-          <w:p>
-            <w:pPr>
-              <w:rPr>
-                <w:rFonts w:ascii="Times New Roman" w:eastAsia="標楷體" w:hAnsi="Times New Roman" w:cs="Times New Roman"/>
-              </w:rPr>
-            </w:pPr>
-            <w:r>
-              <w:rPr>
-                <w:rFonts w:ascii="Times New Roman" w:eastAsia="標楷體" w:hAnsi="Times New Roman" w:cs="Times New Roman" w:hint="eastAsia"/>
-              </w:rPr>
-              <w:t xml:space="preserve">4. </w:t>
-            </w:r>
-            <w:r>
-              <w:rPr>
-                <w:rFonts w:ascii="Times New Roman" w:eastAsia="標楷體" w:hAnsi="Times New Roman" w:cs="Times New Roman" w:hint="eastAsia"/>
-              </w:rPr>
-              <w:t>賣家確認提交。</w:t>
-            </w:r>
-          </w:p>
-          <w:p>
-            <w:pPr>
-              <w:rPr>
-                <w:rFonts w:ascii="Times New Roman" w:eastAsia="標楷體" w:hAnsi="Times New Roman" w:cs="Times New Roman"/>
-              </w:rPr>
-            </w:pPr>
-            <w:r>
-              <w:rPr>
-                <w:rFonts w:ascii="Times New Roman" w:eastAsia="標楷體" w:hAnsi="Times New Roman" w:cs="Times New Roman" w:hint="eastAsia"/>
-              </w:rPr>
-              <w:t xml:space="preserve">5. </w:t>
-            </w:r>
-            <w:r>
-              <w:rPr>
-                <w:rFonts w:ascii="Times New Roman" w:eastAsia="標楷體" w:hAnsi="Times New Roman" w:cs="Times New Roman" w:hint="eastAsia"/>
-              </w:rPr>
-              <w:t>系統儲存資料並顯示「</w:t>
-            </w:r>
-            <w:r>
-              <w:rPr>
-                <w:rFonts w:ascii="Times New Roman" w:eastAsia="標楷體" w:hAnsi="Times New Roman" w:cs="Times New Roman" w:hint="eastAsia"/>
-              </w:rPr>
-              <w:t>新增</w:t>
-            </w:r>
-            <w:r>
-              <w:rPr>
-                <w:rFonts w:ascii="Times New Roman" w:eastAsia="標楷體" w:hAnsi="Times New Roman" w:cs="Times New Roman" w:hint="eastAsia"/>
-              </w:rPr>
-              <w:t>成功」</w:t>
-            </w:r>
-            <w:r>
-              <w:rPr>
-                <w:rFonts w:ascii="Times New Roman" w:eastAsia="標楷體" w:hAnsi="Times New Roman" w:cs="Times New Roman" w:hint="eastAsia"/>
-              </w:rPr>
-              <w:t>或</w:t>
-            </w:r>
-            <w:r>
-              <w:rPr>
-                <w:rFonts w:ascii="Times New Roman" w:eastAsia="標楷體" w:hAnsi="Times New Roman" w:cs="Times New Roman" w:hint="eastAsia"/>
-              </w:rPr>
-              <w:t>「</w:t>
-            </w:r>
-            <w:r>
-              <w:rPr>
-                <w:rFonts w:ascii="Times New Roman" w:eastAsia="標楷體" w:hAnsi="Times New Roman" w:cs="Times New Roman" w:hint="eastAsia"/>
-              </w:rPr>
-              <w:t>修改</w:t>
-            </w:r>
-            <w:r>
-              <w:rPr>
-                <w:rFonts w:ascii="Times New Roman" w:eastAsia="標楷體" w:hAnsi="Times New Roman" w:cs="Times New Roman" w:hint="eastAsia"/>
-              </w:rPr>
-              <w:t>成功」</w:t>
-            </w:r>
-            <w:r>
-              <w:rPr>
-                <w:rFonts w:ascii="Times New Roman" w:eastAsia="標楷體" w:hAnsi="Times New Roman" w:cs="Times New Roman" w:hint="eastAsia"/>
-              </w:rPr>
-              <w:t>訊息。</w:t>
-            </w:r>
-          </w:p>
-        </w:tc>
-      </w:tr>
-      <w:tr>
-        <w:tc>
-          <w:tcPr>
-            <w:tcW w:w="4148" w:type="dxa"/>
-          </w:tcPr>
-          <w:p>
-            <w:pPr>
-              <w:rPr>
-                <w:rFonts w:ascii="Times New Roman" w:eastAsia="標楷體" w:hAnsi="Times New Roman" w:cs="Times New Roman"/>
-              </w:rPr>
-            </w:pPr>
-            <w:r>
-              <w:rPr>
-                <w:rFonts w:ascii="Times New Roman" w:eastAsia="標楷體" w:hAnsi="Times New Roman" w:cs="Times New Roman" w:hint="eastAsia"/>
-              </w:rPr>
-              <w:t>Extensions</w:t>
-            </w:r>
-          </w:p>
-        </w:tc>
-        <w:tc>
-          <w:tcPr>
-            <w:tcW w:w="4148" w:type="dxa"/>
-          </w:tcPr>
-          <w:p>
-            <w:pPr>
-              <w:rPr>
-                <w:rFonts w:ascii="Times New Roman" w:eastAsia="標楷體" w:hAnsi="Times New Roman" w:cs="Times New Roman"/>
-              </w:rPr>
-            </w:pPr>
-            <w:r>
-              <w:rPr>
-                <w:rFonts w:ascii="Times New Roman" w:eastAsia="標楷體" w:hAnsi="Times New Roman" w:cs="Times New Roman" w:hint="eastAsia"/>
-              </w:rPr>
-              <w:t xml:space="preserve">3a. ISBN </w:t>
+                <w:rFonts w:ascii="Times New Roman" w:eastAsia="標楷體" w:hAnsi="Times New Roman" w:cs="Times New Roman"/>
+                <w:highlight w:val="yellow"/>
+              </w:rPr>
+              <w:t>）。</w:t>
+            </w:r>
+          </w:p>
+          <w:p>
+            <w:pPr>
+              <w:pStyle w:val="a9"/>
+              <w:numPr>
+                <w:ilvl w:val="0"/>
+                <w:numId w:val="5"/>
+              </w:numPr>
+              <w:rPr>
+                <w:rFonts w:ascii="Times New Roman" w:eastAsia="標楷體" w:hAnsi="Times New Roman" w:cs="Times New Roman" w:hint="eastAsia"/>
+              </w:rPr>
+            </w:pPr>
+            <w:r>
+              <w:rPr>
+                <w:rFonts w:ascii="Times New Roman" w:eastAsia="標楷體" w:hAnsi="Times New Roman" w:cs="Times New Roman"/>
+                <w:highlight w:val="yellow"/>
+              </w:rPr>
+              <w:lastRenderedPageBreak/>
+              <w:t>系統</w:t>
+            </w:r>
+            <w:r>
+              <w:rPr>
+                <w:rFonts w:ascii="Times New Roman" w:eastAsia="標楷體" w:hAnsi="Times New Roman" w:cs="Times New Roman" w:hint="eastAsia"/>
+                <w:highlight w:val="yellow"/>
+              </w:rPr>
+              <w:t>篩選</w:t>
+            </w:r>
+            <w:r>
+              <w:rPr>
+                <w:rFonts w:ascii="Times New Roman" w:eastAsia="標楷體" w:hAnsi="Times New Roman" w:cs="Times New Roman"/>
+                <w:highlight w:val="yellow"/>
+              </w:rPr>
+              <w:t>並顯示符合條件的書籍清單</w:t>
+            </w:r>
+            <w:r>
+              <w:rPr>
+                <w:rFonts w:ascii="Times New Roman" w:eastAsia="標楷體" w:hAnsi="Times New Roman" w:cs="Times New Roman"/>
+                <w:highlight w:val="yellow"/>
+              </w:rPr>
+              <w:t>。</w:t>
+            </w:r>
+            <w:r>
+              <w:rPr>
+                <w:rFonts w:ascii="Times New Roman" w:eastAsia="標楷體" w:hAnsi="Times New Roman" w:cs="Times New Roman" w:hint="eastAsia"/>
+                <w:highlight w:val="yellow"/>
+              </w:rPr>
+              <w:t>（</w:t>
+            </w:r>
+            <w:r>
+              <w:rPr>
+                <w:rFonts w:ascii="Times New Roman" w:eastAsia="標楷體" w:hAnsi="Times New Roman" w:cs="Times New Roman" w:hint="eastAsia"/>
+                <w:highlight w:val="yellow"/>
+              </w:rPr>
+              <w:t>use case</w:t>
+            </w:r>
+            <w:r>
+              <w:rPr>
+                <w:rFonts w:ascii="Times New Roman" w:eastAsia="標楷體" w:hAnsi="Times New Roman" w:cs="Times New Roman" w:hint="eastAsia"/>
+                <w:highlight w:val="yellow"/>
+              </w:rPr>
+              <w:t>結束）</w:t>
+            </w:r>
+          </w:p>
+          <w:p>
+            <w:pPr>
+              <w:rPr>
+                <w:rFonts w:ascii="Times New Roman" w:eastAsia="標楷體" w:hAnsi="Times New Roman" w:cs="Times New Roman"/>
+              </w:rPr>
+            </w:pPr>
+            <w:r>
+              <w:rPr>
+                <w:rFonts w:ascii="Times New Roman" w:eastAsia="標楷體" w:hAnsi="Times New Roman" w:cs="Times New Roman" w:hint="eastAsia"/>
+              </w:rPr>
+              <w:t>4</w:t>
+            </w:r>
+            <w:r>
+              <w:rPr>
+                <w:rFonts w:ascii="Times New Roman" w:eastAsia="標楷體" w:hAnsi="Times New Roman" w:cs="Times New Roman" w:hint="eastAsia"/>
+              </w:rPr>
+              <w:t>a.</w:t>
+            </w:r>
+            <w:r>
+              <w:rPr>
+                <w:rFonts w:ascii="Times New Roman" w:eastAsia="標楷體" w:hAnsi="Times New Roman" w:cs="Times New Roman" w:hint="eastAsia"/>
+              </w:rPr>
+              <w:t xml:space="preserve"> </w:t>
+            </w:r>
+            <w:r>
+              <w:rPr>
+                <w:rFonts w:ascii="Times New Roman" w:eastAsia="標楷體" w:hAnsi="Times New Roman" w:cs="Times New Roman" w:hint="eastAsia"/>
+              </w:rPr>
+              <w:t>ISB</w:t>
+            </w:r>
+            <w:r>
+              <w:rPr>
+                <w:rFonts w:ascii="Times New Roman" w:eastAsia="標楷體" w:hAnsi="Times New Roman" w:cs="Times New Roman" w:hint="eastAsia"/>
+              </w:rPr>
+              <w:t>N</w:t>
             </w:r>
             <w:r>
               <w:rPr>
@@ -1387,7 +1726,19 @@
               <w:rPr>
                 <w:rFonts w:ascii="Times New Roman" w:eastAsia="標楷體" w:hAnsi="Times New Roman" w:cs="Times New Roman" w:hint="eastAsia"/>
               </w:rPr>
-              <w:t xml:space="preserve">3b. </w:t>
+              <w:t>4</w:t>
+            </w:r>
+            <w:r>
+              <w:rPr>
+                <w:rFonts w:ascii="Times New Roman" w:eastAsia="標楷體" w:hAnsi="Times New Roman" w:cs="Times New Roman" w:hint="eastAsia"/>
+              </w:rPr>
+              <w:t>b.</w:t>
+            </w:r>
+            <w:r>
+              <w:rPr>
+                <w:rFonts w:ascii="Times New Roman" w:eastAsia="標楷體" w:hAnsi="Times New Roman" w:cs="Times New Roman" w:hint="eastAsia"/>
+              </w:rPr>
+              <w:t xml:space="preserve"> </w:t>
             </w:r>
             <w:r>
               <w:rPr>
@@ -1406,7 +1757,25 @@
               <w:rPr>
                 <w:rFonts w:ascii="Times New Roman" w:eastAsia="標楷體" w:hAnsi="Times New Roman" w:cs="Times New Roman" w:hint="eastAsia"/>
               </w:rPr>
-              <w:t xml:space="preserve">4a. </w:t>
+              <w:t>5a</w:t>
+            </w:r>
+            <w:r>
+              <w:rPr>
+                <w:rFonts w:ascii="Times New Roman" w:eastAsia="標楷體" w:hAnsi="Times New Roman" w:cs="Times New Roman" w:hint="eastAsia"/>
+              </w:rPr>
+              <w:t>.</w:t>
+            </w:r>
+            <w:r>
+              <w:rPr>
+                <w:rFonts w:ascii="Times New Roman" w:eastAsia="標楷體" w:hAnsi="Times New Roman" w:cs="Times New Roman" w:hint="eastAsia"/>
+              </w:rPr>
+              <w:t xml:space="preserve"> </w:t>
+            </w:r>
+            <w:r>
+              <w:rPr>
+                <w:rFonts w:ascii="Times New Roman" w:eastAsia="標楷體" w:hAnsi="Times New Roman" w:cs="Times New Roman" w:hint="eastAsia"/>
+              </w:rPr>
+              <w:t>找不到要</w:t>
             </w:r>
             <w:r>
               <w:rPr>
@@ -1418,196 +1787,228 @@
               <w:rPr>
                 <w:rFonts w:ascii="Times New Roman" w:eastAsia="標楷體" w:hAnsi="Times New Roman" w:cs="Times New Roman" w:hint="eastAsia"/>
               </w:rPr>
+              <w:t>的書籍</w:t>
+            </w:r>
+            <w:r>
+              <w:rPr>
+                <w:rFonts w:ascii="Times New Roman" w:eastAsia="標楷體" w:hAnsi="Times New Roman" w:cs="Times New Roman" w:hint="eastAsia"/>
+              </w:rPr>
+              <w:t>：</w:t>
+            </w:r>
+            <w:r>
+              <w:rPr>
+                <w:rFonts w:ascii="Times New Roman" w:eastAsia="標楷體" w:hAnsi="Times New Roman" w:cs="Times New Roman" w:hint="eastAsia"/>
+              </w:rPr>
+              <w:t>系統提示無此書籍</w:t>
+            </w:r>
+            <w:r>
+              <w:rPr>
+                <w:rFonts w:ascii="Times New Roman" w:eastAsia="標楷體" w:hAnsi="Times New Roman" w:cs="Times New Roman" w:hint="eastAsia"/>
+                <w:highlight w:val="yellow"/>
+              </w:rPr>
+              <w:t>（</w:t>
+            </w:r>
+            <w:r>
+              <w:rPr>
+                <w:rFonts w:ascii="Times New Roman" w:eastAsia="標楷體" w:hAnsi="Times New Roman" w:cs="Times New Roman" w:hint="eastAsia"/>
+                <w:highlight w:val="yellow"/>
+              </w:rPr>
+              <w:t>use case</w:t>
+            </w:r>
+            <w:r>
+              <w:rPr>
+                <w:rFonts w:ascii="Times New Roman" w:eastAsia="標楷體" w:hAnsi="Times New Roman" w:cs="Times New Roman" w:hint="eastAsia"/>
+                <w:highlight w:val="yellow"/>
+              </w:rPr>
+              <w:t>結束）</w:t>
+            </w:r>
+          </w:p>
+        </w:tc>
+      </w:tr>
+      <w:tr>
+        <w:tc>
+          <w:tcPr>
+            <w:tcW w:w="4148" w:type="dxa"/>
+          </w:tcPr>
+          <w:p>
+            <w:pPr>
+              <w:rPr>
+                <w:rFonts w:ascii="Times New Roman" w:eastAsia="標楷體" w:hAnsi="Times New Roman" w:cs="Times New Roman"/>
+              </w:rPr>
+            </w:pPr>
+            <w:r>
+              <w:rPr>
+                <w:rFonts w:ascii="Times New Roman" w:eastAsia="標楷體" w:hAnsi="Times New Roman" w:cs="Times New Roman" w:hint="eastAsia"/>
+              </w:rPr>
+              <w:lastRenderedPageBreak/>
+              <w:t>Special Re</w:t>
+            </w:r>
+            <w:r>
+              <w:rPr>
+                <w:rFonts w:ascii="Times New Roman" w:eastAsia="標楷體" w:hAnsi="Times New Roman" w:cs="Times New Roman" w:hint="eastAsia"/>
+              </w:rPr>
+              <w:t>quirements</w:t>
+            </w:r>
+          </w:p>
+        </w:tc>
+        <w:tc>
+          <w:tcPr>
+            <w:tcW w:w="4148" w:type="dxa"/>
+          </w:tcPr>
+          <w:p>
+            <w:pPr>
+              <w:rPr>
+                <w:rFonts w:ascii="Times New Roman" w:eastAsia="標楷體" w:hAnsi="Times New Roman" w:cs="Times New Roman"/>
+              </w:rPr>
+            </w:pPr>
+            <w:r>
+              <w:rPr>
+                <w:rFonts w:ascii="Times New Roman" w:eastAsia="標楷體" w:hAnsi="Times New Roman" w:cs="Times New Roman" w:hint="eastAsia"/>
+              </w:rPr>
+              <w:t>在</w:t>
+            </w:r>
+            <w:r>
+              <w:rPr>
+                <w:rFonts w:ascii="Times New Roman" w:eastAsia="標楷體" w:hAnsi="Times New Roman" w:cs="Times New Roman" w:hint="eastAsia"/>
+              </w:rPr>
+              <w:t xml:space="preserve"> 2 </w:t>
+            </w:r>
+            <w:r>
+              <w:rPr>
+                <w:rFonts w:ascii="Times New Roman" w:eastAsia="標楷體" w:hAnsi="Times New Roman" w:cs="Times New Roman" w:hint="eastAsia"/>
+              </w:rPr>
+              <w:t>秒內完成資料更新同步。</w:t>
+            </w:r>
+          </w:p>
+        </w:tc>
+      </w:tr>
+      <w:tr>
+        <w:tc>
+          <w:tcPr>
+            <w:tcW w:w="4148" w:type="dxa"/>
+          </w:tcPr>
+          <w:p>
+            <w:pPr>
+              <w:rPr>
+                <w:rFonts w:ascii="Times New Roman" w:eastAsia="標楷體" w:hAnsi="Times New Roman" w:cs="Times New Roman"/>
+              </w:rPr>
+            </w:pPr>
+            <w:r>
+              <w:rPr>
+                <w:rFonts w:ascii="Times New Roman" w:eastAsia="標楷體" w:hAnsi="Times New Roman" w:cs="Times New Roman" w:hint="eastAsia"/>
+              </w:rPr>
+              <w:t>Technology and Data Variations List</w:t>
+            </w:r>
+          </w:p>
+        </w:tc>
+        <w:tc>
+          <w:tcPr>
+            <w:tcW w:w="4148" w:type="dxa"/>
+          </w:tcPr>
+          <w:p>
+            <w:pPr>
+              <w:rPr>
+                <w:rFonts w:ascii="Times New Roman" w:eastAsia="標楷體" w:hAnsi="Times New Roman" w:cs="Times New Roman"/>
+              </w:rPr>
+            </w:pPr>
+            <w:r>
+              <w:rPr>
+                <w:rFonts w:ascii="Times New Roman" w:eastAsia="標楷體" w:hAnsi="Times New Roman" w:cs="Times New Roman" w:hint="eastAsia"/>
+              </w:rPr>
+              <w:t>賣家透過</w:t>
+            </w:r>
+            <w:r>
+              <w:rPr>
+                <w:rFonts w:ascii="Times New Roman" w:eastAsia="標楷體" w:hAnsi="Times New Roman" w:cs="Times New Roman" w:hint="eastAsia"/>
+              </w:rPr>
+              <w:t xml:space="preserve"> Web </w:t>
+            </w:r>
+            <w:r>
+              <w:rPr>
+                <w:rFonts w:ascii="Times New Roman" w:eastAsia="標楷體" w:hAnsi="Times New Roman" w:cs="Times New Roman" w:hint="eastAsia"/>
+              </w:rPr>
+              <w:t>瀏覽器手動輸入資料</w:t>
+            </w:r>
+          </w:p>
+        </w:tc>
+      </w:tr>
+      <w:tr>
+        <w:tc>
+          <w:tcPr>
+            <w:tcW w:w="4148" w:type="dxa"/>
+          </w:tcPr>
+          <w:p>
+            <w:pPr>
+              <w:rPr>
+                <w:rFonts w:ascii="Times New Roman" w:eastAsia="標楷體" w:hAnsi="Times New Roman" w:cs="Times New Roman"/>
+              </w:rPr>
+            </w:pPr>
+            <w:r>
+              <w:rPr>
+                <w:rFonts w:ascii="Times New Roman" w:eastAsia="標楷體" w:hAnsi="Times New Roman" w:cs="Times New Roman" w:hint="eastAsia"/>
+              </w:rPr>
+              <w:t>Frequency of Occurrence</w:t>
+            </w:r>
+          </w:p>
+        </w:tc>
+        <w:tc>
+          <w:tcPr>
+            <w:tcW w:w="4148" w:type="dxa"/>
+          </w:tcPr>
+          <w:p>
+            <w:pPr>
+              <w:rPr>
+                <w:rFonts w:ascii="Times New Roman" w:eastAsia="標楷體" w:hAnsi="Times New Roman" w:cs="Times New Roman"/>
+              </w:rPr>
+            </w:pPr>
+            <w:r>
+              <w:rPr>
+                <w:rFonts w:ascii="Times New Roman" w:eastAsia="標楷體" w:hAnsi="Times New Roman" w:cs="Times New Roman" w:hint="eastAsia"/>
+              </w:rPr>
+              <w:t>每當賣家有新</w:t>
+            </w:r>
+            <w:r>
+              <w:rPr>
+                <w:rFonts w:ascii="Times New Roman" w:eastAsia="標楷體" w:hAnsi="Times New Roman" w:cs="Times New Roman" w:hint="eastAsia"/>
+              </w:rPr>
               <w:t>商品</w:t>
             </w:r>
             <w:r>
               <w:rPr>
                 <w:rFonts w:ascii="Times New Roman" w:eastAsia="標楷體" w:hAnsi="Times New Roman" w:cs="Times New Roman" w:hint="eastAsia"/>
               </w:rPr>
-              <w:t>：賣家選擇刪除，系統確認後從資料庫移除該項目。</w:t>
-            </w:r>
-          </w:p>
-        </w:tc>
-      </w:tr>
-      <w:tr>
-        <w:tc>
-          <w:tcPr>
-            <w:tcW w:w="4148" w:type="dxa"/>
-          </w:tcPr>
-          <w:p>
-            <w:pPr>
-              <w:rPr>
-                <w:rFonts w:ascii="Times New Roman" w:eastAsia="標楷體" w:hAnsi="Times New Roman" w:cs="Times New Roman"/>
-              </w:rPr>
-            </w:pPr>
-            <w:r>
-              <w:rPr>
-                <w:rFonts w:ascii="Times New Roman" w:eastAsia="標楷體" w:hAnsi="Times New Roman" w:cs="Times New Roman" w:hint="eastAsia"/>
-              </w:rPr>
-              <w:t>Special Re</w:t>
-            </w:r>
-            <w:r>
-              <w:rPr>
-                <w:rFonts w:ascii="Times New Roman" w:eastAsia="標楷體" w:hAnsi="Times New Roman" w:cs="Times New Roman" w:hint="eastAsia"/>
-              </w:rPr>
-              <w:t>quirements</w:t>
-            </w:r>
-          </w:p>
-        </w:tc>
-        <w:tc>
-          <w:tcPr>
-            <w:tcW w:w="4148" w:type="dxa"/>
-          </w:tcPr>
-          <w:p>
-            <w:pPr>
-              <w:rPr>
-                <w:rFonts w:ascii="Times New Roman" w:eastAsia="標楷體" w:hAnsi="Times New Roman" w:cs="Times New Roman"/>
-              </w:rPr>
-            </w:pPr>
-            <w:r>
-              <w:rPr>
-                <w:rFonts w:ascii="Times New Roman" w:eastAsia="標楷體" w:hAnsi="Times New Roman" w:cs="Times New Roman" w:hint="eastAsia"/>
-              </w:rPr>
-              <w:t>在</w:t>
-            </w:r>
-            <w:r>
-              <w:rPr>
-                <w:rFonts w:ascii="Times New Roman" w:eastAsia="標楷體" w:hAnsi="Times New Roman" w:cs="Times New Roman" w:hint="eastAsia"/>
-              </w:rPr>
-              <w:t xml:space="preserve"> 2 </w:t>
-            </w:r>
-            <w:r>
-              <w:rPr>
-                <w:rFonts w:ascii="Times New Roman" w:eastAsia="標楷體" w:hAnsi="Times New Roman" w:cs="Times New Roman" w:hint="eastAsia"/>
-              </w:rPr>
-              <w:t>秒內完成資料更新同步。</w:t>
-            </w:r>
-          </w:p>
-        </w:tc>
-      </w:tr>
-      <w:tr>
-        <w:tc>
-          <w:tcPr>
-            <w:tcW w:w="4148" w:type="dxa"/>
-          </w:tcPr>
-          <w:p>
-            <w:pPr>
-              <w:rPr>
-                <w:rFonts w:ascii="Times New Roman" w:eastAsia="標楷體" w:hAnsi="Times New Roman" w:cs="Times New Roman"/>
-              </w:rPr>
-            </w:pPr>
-            <w:r>
-              <w:rPr>
-                <w:rFonts w:ascii="Times New Roman" w:eastAsia="標楷體" w:hAnsi="Times New Roman" w:cs="Times New Roman" w:hint="eastAsia"/>
-              </w:rPr>
-              <w:t>Technology and Data Variations List</w:t>
-            </w:r>
-          </w:p>
-        </w:tc>
-        <w:tc>
-          <w:tcPr>
-            <w:tcW w:w="4148" w:type="dxa"/>
-          </w:tcPr>
-          <w:p>
-            <w:pPr>
-              <w:rPr>
-                <w:rFonts w:ascii="Times New Roman" w:eastAsia="標楷體" w:hAnsi="Times New Roman" w:cs="Times New Roman"/>
-              </w:rPr>
-            </w:pPr>
-            <w:r>
-              <w:rPr>
-                <w:rFonts w:ascii="Times New Roman" w:eastAsia="標楷體" w:hAnsi="Times New Roman" w:cs="Times New Roman" w:hint="eastAsia"/>
-              </w:rPr>
-              <w:t>賣家透過</w:t>
-            </w:r>
-            <w:r>
-              <w:rPr>
-                <w:rFonts w:ascii="Times New Roman" w:eastAsia="標楷體" w:hAnsi="Times New Roman" w:cs="Times New Roman" w:hint="eastAsia"/>
-              </w:rPr>
-              <w:t xml:space="preserve"> Web </w:t>
-            </w:r>
-            <w:r>
-              <w:rPr>
-                <w:rFonts w:ascii="Times New Roman" w:eastAsia="標楷體" w:hAnsi="Times New Roman" w:cs="Times New Roman" w:hint="eastAsia"/>
-              </w:rPr>
-              <w:t>瀏覽器手動輸入資料</w:t>
-            </w:r>
-          </w:p>
-        </w:tc>
-      </w:tr>
-      <w:tr>
-        <w:tc>
-          <w:tcPr>
-            <w:tcW w:w="4148" w:type="dxa"/>
-          </w:tcPr>
-          <w:p>
-            <w:pPr>
-              <w:rPr>
-                <w:rFonts w:ascii="Times New Roman" w:eastAsia="標楷體" w:hAnsi="Times New Roman" w:cs="Times New Roman"/>
-              </w:rPr>
-            </w:pPr>
-            <w:r>
-              <w:rPr>
-                <w:rFonts w:ascii="Times New Roman" w:eastAsia="標楷體" w:hAnsi="Times New Roman" w:cs="Times New Roman" w:hint="eastAsia"/>
-              </w:rPr>
-              <w:t>Frequency of Occurrence</w:t>
-            </w:r>
-          </w:p>
-        </w:tc>
-        <w:tc>
-          <w:tcPr>
-            <w:tcW w:w="4148" w:type="dxa"/>
-          </w:tcPr>
-          <w:p>
-            <w:pPr>
-              <w:rPr>
-                <w:rFonts w:ascii="Times New Roman" w:eastAsia="標楷體" w:hAnsi="Times New Roman" w:cs="Times New Roman"/>
-              </w:rPr>
-            </w:pPr>
-            <w:r>
-              <w:rPr>
-                <w:rFonts w:ascii="Times New Roman" w:eastAsia="標楷體" w:hAnsi="Times New Roman" w:cs="Times New Roman" w:hint="eastAsia"/>
-              </w:rPr>
-              <w:t>每當賣家有新</w:t>
-            </w:r>
-            <w:r>
-              <w:rPr>
-                <w:rFonts w:ascii="Times New Roman" w:eastAsia="標楷體" w:hAnsi="Times New Roman" w:cs="Times New Roman" w:hint="eastAsia"/>
-              </w:rPr>
-              <w:t>商品</w:t>
-            </w:r>
-            <w:r>
-              <w:rPr>
-                <w:rFonts w:ascii="Times New Roman" w:eastAsia="標楷體" w:hAnsi="Times New Roman" w:cs="Times New Roman" w:hint="eastAsia"/>
-              </w:rPr>
-              <w:t>要賣或商品狀態改</w:t>
-            </w:r>
-            <w:r>
-              <w:rPr>
-                <w:rFonts w:ascii="Times New Roman" w:eastAsia="標楷體" w:hAnsi="Times New Roman" w:cs="Times New Roman" w:hint="eastAsia"/>
-              </w:rPr>
-              <w:lastRenderedPageBreak/>
-              <w:t>變時觸發（高頻率）。</w:t>
-            </w:r>
-          </w:p>
-        </w:tc>
-      </w:tr>
-      <w:tr>
-        <w:tc>
-          <w:tcPr>
-            <w:tcW w:w="4148" w:type="dxa"/>
-          </w:tcPr>
-          <w:p>
-            <w:pPr>
-              <w:rPr>
-                <w:rFonts w:ascii="Times New Roman" w:eastAsia="標楷體" w:hAnsi="Times New Roman" w:cs="Times New Roman"/>
-              </w:rPr>
-            </w:pPr>
-            <w:r>
-              <w:rPr>
-                <w:rFonts w:ascii="Times New Roman" w:eastAsia="標楷體" w:hAnsi="Times New Roman" w:cs="Times New Roman" w:hint="eastAsia"/>
-              </w:rPr>
-              <w:lastRenderedPageBreak/>
+              <w:t>要</w:t>
+            </w:r>
+            <w:r>
+              <w:rPr>
+                <w:rFonts w:ascii="Times New Roman" w:eastAsia="標楷體" w:hAnsi="Times New Roman" w:cs="Times New Roman" w:hint="eastAsia"/>
+              </w:rPr>
+              <w:t>上架</w:t>
+            </w:r>
+            <w:r>
+              <w:rPr>
+                <w:rFonts w:ascii="Times New Roman" w:eastAsia="標楷體" w:hAnsi="Times New Roman" w:cs="Times New Roman" w:hint="eastAsia"/>
+              </w:rPr>
+              <w:t>或商品狀態改變時觸發（高頻率）。</w:t>
+            </w:r>
+          </w:p>
+        </w:tc>
+      </w:tr>
+      <w:tr>
+        <w:tc>
+          <w:tcPr>
+            <w:tcW w:w="4148" w:type="dxa"/>
+          </w:tcPr>
+          <w:p>
+            <w:pPr>
+              <w:rPr>
+                <w:rFonts w:ascii="Times New Roman" w:eastAsia="標楷體" w:hAnsi="Times New Roman" w:cs="Times New Roman"/>
+              </w:rPr>
+            </w:pPr>
+            <w:r>
+              <w:rPr>
+                <w:rFonts w:ascii="Times New Roman" w:eastAsia="標楷體" w:hAnsi="Times New Roman" w:cs="Times New Roman" w:hint="eastAsia"/>
+              </w:rPr>
               <w:t>Miscellaneous</w:t>
             </w:r>
           </w:p>
@@ -1735,12 +2136,14 @@
                 <w:rFonts w:ascii="Times New Roman" w:eastAsia="標楷體" w:hAnsi="Times New Roman" w:cs="Times New Roman"/>
               </w:rPr>
             </w:pPr>
+            <w:proofErr w:type="spellStart"/>
             <w:r>
               <w:rPr>
                 <w:rFonts w:ascii="Times New Roman" w:eastAsia="標楷體" w:hAnsi="Times New Roman" w:cs="Times New Roman" w:hint="eastAsia"/>
               </w:rPr>
               <w:t>Re:Book</w:t>
             </w:r>
+            <w:proofErr w:type="spellEnd"/>
           </w:p>
         </w:tc>
       </w:tr>
@@ -2116,6 +2519,7 @@
               <w:rPr>
                 <w:rFonts w:ascii="Times New Roman" w:eastAsia="標楷體" w:hAnsi="Times New Roman" w:cs="Times New Roman" w:hint="eastAsia"/>
               </w:rPr>
+              <w:lastRenderedPageBreak/>
               <w:t xml:space="preserve">5. </w:t>
             </w:r>
             <w:r>
@@ -2154,6 +2558,7 @@
               <w:rPr>
                 <w:rFonts w:ascii="Times New Roman" w:eastAsia="標楷體" w:hAnsi="Times New Roman" w:cs="Times New Roman" w:hint="eastAsia"/>
               </w:rPr>
+              <w:lastRenderedPageBreak/>
               <w:t>Extensions</w:t>
             </w:r>
           </w:p>
@@ -2235,7 +2640,19 @@
               <w:rPr>
                 <w:rFonts w:ascii="Times New Roman" w:eastAsia="標楷體" w:hAnsi="Times New Roman" w:cs="Times New Roman" w:hint="eastAsia"/>
               </w:rPr>
-              <w:t>搜尋結果的加載時間應小於</w:t>
+              <w:t>載</w:t>
+            </w:r>
+            <w:r>
+              <w:rPr>
+                <w:rFonts w:ascii="Times New Roman" w:eastAsia="標楷體" w:hAnsi="Times New Roman" w:cs="Times New Roman" w:hint="eastAsia"/>
+              </w:rPr>
+              <w:t>入</w:t>
+            </w:r>
+            <w:r>
+              <w:rPr>
+                <w:rFonts w:ascii="Times New Roman" w:eastAsia="標楷體" w:hAnsi="Times New Roman" w:cs="Times New Roman" w:hint="eastAsia"/>
+              </w:rPr>
+              <w:t>搜尋結果的時間應小於</w:t>
             </w:r>
             <w:r>
               <w:rPr>
@@ -2327,34 +2744,26 @@
               <w:rPr>
                 <w:rFonts w:ascii="Times New Roman" w:eastAsia="標楷體" w:hAnsi="Times New Roman" w:cs="Times New Roman" w:hint="eastAsia"/>
               </w:rPr>
-              <w:t>不同格式</w:t>
-            </w:r>
-            <w:r>
-              <w:rPr>
-                <w:rFonts w:ascii="Times New Roman" w:eastAsia="標楷體" w:hAnsi="Times New Roman" w:cs="Times New Roman" w:hint="eastAsia"/>
-              </w:rPr>
-              <w:lastRenderedPageBreak/>
-              <w:t>的輸入。</w:t>
-            </w:r>
-          </w:p>
-        </w:tc>
-      </w:tr>
-      <w:tr>
-        <w:tc>
-          <w:tcPr>
-            <w:tcW w:w="4148" w:type="dxa"/>
-          </w:tcPr>
-          <w:p>
-            <w:pPr>
-              <w:rPr>
-                <w:rFonts w:ascii="Times New Roman" w:eastAsia="標楷體" w:hAnsi="Times New Roman" w:cs="Times New Roman"/>
-              </w:rPr>
-            </w:pPr>
-            <w:r>
-              <w:rPr>
-                <w:rFonts w:ascii="Times New Roman" w:eastAsia="標楷體" w:hAnsi="Times New Roman" w:cs="Times New Roman" w:hint="eastAsia"/>
-              </w:rPr>
-              <w:lastRenderedPageBreak/>
+              <w:t>不同格式的輸入。</w:t>
+            </w:r>
+          </w:p>
+        </w:tc>
+      </w:tr>
+      <w:tr>
+        <w:tc>
+          <w:tcPr>
+            <w:tcW w:w="4148" w:type="dxa"/>
+          </w:tcPr>
+          <w:p>
+            <w:pPr>
+              <w:rPr>
+                <w:rFonts w:ascii="Times New Roman" w:eastAsia="標楷體" w:hAnsi="Times New Roman" w:cs="Times New Roman"/>
+              </w:rPr>
+            </w:pPr>
+            <w:r>
+              <w:rPr>
+                <w:rFonts w:ascii="Times New Roman" w:eastAsia="標楷體" w:hAnsi="Times New Roman" w:cs="Times New Roman" w:hint="eastAsia"/>
+              </w:rPr>
               <w:t>Frequency of Occurrence</w:t>
             </w:r>
           </w:p>
@@ -2427,7 +2836,7 @@
     <w:p>
       <w:pPr>
         <w:rPr>
-          <w:rFonts w:ascii="Times New Roman" w:eastAsia="標楷體" w:hAnsi="Times New Roman" w:cs="Times New Roman" w:hint="eastAsia"/>
+          <w:rFonts w:ascii="Times New Roman" w:eastAsia="標楷體" w:hAnsi="Times New Roman" w:cs="Times New Roman"/>
         </w:rPr>
       </w:pPr>
       <w:r>
@@ -2486,13 +2895,7 @@
               <w:rPr>
                 <w:rFonts w:ascii="Times New Roman" w:eastAsia="標楷體" w:hAnsi="Times New Roman" w:cs="Times New Roman" w:hint="eastAsia"/>
               </w:rPr>
-              <w:t>FEA-0</w:t>
-            </w:r>
-            <w:r>
-              <w:rPr>
-                <w:rFonts w:ascii="Times New Roman" w:eastAsia="標楷體" w:hAnsi="Times New Roman" w:cs="Times New Roman" w:hint="eastAsia"/>
-              </w:rPr>
-              <w:t>3</w:t>
+              <w:t>FEA-03</w:t>
             </w:r>
           </w:p>
         </w:tc>
@@ -2526,12 +2929,14 @@
                 <w:rFonts w:ascii="Times New Roman" w:eastAsia="標楷體" w:hAnsi="Times New Roman" w:cs="Times New Roman"/>
               </w:rPr>
             </w:pPr>
+            <w:proofErr w:type="spellStart"/>
             <w:r>
               <w:rPr>
                 <w:rFonts w:ascii="Times New Roman" w:eastAsia="標楷體" w:hAnsi="Times New Roman" w:cs="Times New Roman" w:hint="eastAsia"/>
               </w:rPr>
               <w:t>Re:Book</w:t>
             </w:r>
+            <w:proofErr w:type="spellEnd"/>
           </w:p>
         </w:tc>
       </w:tr>
@@ -2612,13 +3017,7 @@
               <w:rPr>
                 <w:rFonts w:ascii="Times New Roman" w:eastAsia="標楷體" w:hAnsi="Times New Roman" w:cs="Times New Roman" w:hint="eastAsia"/>
               </w:rPr>
-              <w:t>賣</w:t>
-            </w:r>
-            <w:r>
-              <w:rPr>
-                <w:rFonts w:ascii="Times New Roman" w:eastAsia="標楷體" w:hAnsi="Times New Roman" w:cs="Times New Roman" w:hint="eastAsia"/>
-              </w:rPr>
-              <w:t>家</w:t>
+              <w:t>賣家</w:t>
             </w:r>
           </w:p>
         </w:tc>
@@ -2915,7 +3314,7 @@
     <w:p>
       <w:pPr>
         <w:rPr>
-          <w:rFonts w:ascii="Times New Roman" w:eastAsia="標楷體" w:hAnsi="Times New Roman" w:cs="Times New Roman" w:hint="eastAsia"/>
+          <w:rFonts w:ascii="Times New Roman" w:eastAsia="標楷體" w:hAnsi="Times New Roman" w:cs="Times New Roman"/>
         </w:rPr>
       </w:pPr>
     </w:p>
@@ -3027,30 +3426,33 @@
                 <w:rFonts w:ascii="Times New Roman" w:eastAsia="標楷體" w:hAnsi="Times New Roman" w:cs="Times New Roman"/>
               </w:rPr>
             </w:pPr>
+            <w:proofErr w:type="spellStart"/>
             <w:r>
               <w:rPr>
                 <w:rFonts w:ascii="Times New Roman" w:eastAsia="標楷體" w:hAnsi="Times New Roman" w:cs="Times New Roman" w:hint="eastAsia"/>
               </w:rPr>
               <w:t>Re:Book</w:t>
             </w:r>
-          </w:p>
-        </w:tc>
-      </w:tr>
-      <w:tr>
-        <w:tc>
-          <w:tcPr>
-            <w:tcW w:w="4148" w:type="dxa"/>
-          </w:tcPr>
-          <w:p>
-            <w:pPr>
-              <w:rPr>
-                <w:rFonts w:ascii="Times New Roman" w:eastAsia="標楷體" w:hAnsi="Times New Roman" w:cs="Times New Roman"/>
-              </w:rPr>
-            </w:pPr>
-            <w:r>
-              <w:rPr>
-                <w:rFonts w:ascii="Times New Roman" w:eastAsia="標楷體" w:hAnsi="Times New Roman" w:cs="Times New Roman" w:hint="eastAsia"/>
-              </w:rPr>
+            <w:proofErr w:type="spellEnd"/>
+          </w:p>
+        </w:tc>
+      </w:tr>
+      <w:tr>
+        <w:tc>
+          <w:tcPr>
+            <w:tcW w:w="4148" w:type="dxa"/>
+          </w:tcPr>
+          <w:p>
+            <w:pPr>
+              <w:rPr>
+                <w:rFonts w:ascii="Times New Roman" w:eastAsia="標楷體" w:hAnsi="Times New Roman" w:cs="Times New Roman"/>
+              </w:rPr>
+            </w:pPr>
+            <w:r>
+              <w:rPr>
+                <w:rFonts w:ascii="Times New Roman" w:eastAsia="標楷體" w:hAnsi="Times New Roman" w:cs="Times New Roman" w:hint="eastAsia"/>
+              </w:rPr>
+              <w:lastRenderedPageBreak/>
               <w:t>Level</w:t>
             </w:r>
           </w:p>
@@ -3284,7 +3686,6 @@
               <w:rPr>
                 <w:rFonts w:ascii="Times New Roman" w:eastAsia="標楷體" w:hAnsi="Times New Roman" w:cs="Times New Roman" w:hint="eastAsia"/>
               </w:rPr>
-              <w:lastRenderedPageBreak/>
               <w:t>Main Success Scenario</w:t>
             </w:r>
           </w:p>
@@ -3769,12 +4170,14 @@
                 <w:rFonts w:ascii="Times New Roman" w:eastAsia="標楷體" w:hAnsi="Times New Roman" w:cs="Times New Roman"/>
               </w:rPr>
             </w:pPr>
+            <w:proofErr w:type="spellStart"/>
             <w:r>
               <w:rPr>
                 <w:rFonts w:ascii="Times New Roman" w:eastAsia="標楷體" w:hAnsi="Times New Roman" w:cs="Times New Roman" w:hint="eastAsia"/>
               </w:rPr>
               <w:t>Re:Book</w:t>
             </w:r>
+            <w:proofErr w:type="spellEnd"/>
           </w:p>
         </w:tc>
       </w:tr>
@@ -3837,6 +4240,7 @@
               <w:rPr>
                 <w:rFonts w:ascii="Times New Roman" w:eastAsia="標楷體" w:hAnsi="Times New Roman" w:cs="Times New Roman" w:hint="eastAsia"/>
               </w:rPr>
+              <w:lastRenderedPageBreak/>
               <w:t>Primary Actor</w:t>
             </w:r>
           </w:p>
@@ -3980,13 +4384,31 @@
               <w:rPr>
                 <w:rFonts w:ascii="Times New Roman" w:eastAsia="標楷體" w:hAnsi="Times New Roman" w:cs="Times New Roman" w:hint="eastAsia"/>
               </w:rPr>
-              <w:t>賣家必須已登入，且帳號內已上架多</w:t>
-            </w:r>
-            <w:r>
-              <w:rPr>
-                <w:rFonts w:ascii="Times New Roman" w:eastAsia="標楷體" w:hAnsi="Times New Roman" w:cs="Times New Roman" w:hint="eastAsia"/>
-              </w:rPr>
-              <w:t>件待售商品</w:t>
+              <w:t>賣家必須已登入，且帳號內已上架</w:t>
+            </w:r>
+            <w:r>
+              <w:rPr>
+                <w:rFonts w:ascii="Times New Roman" w:eastAsia="標楷體" w:hAnsi="Times New Roman" w:cs="Times New Roman" w:hint="eastAsia"/>
+              </w:rPr>
+              <w:t>1</w:t>
+            </w:r>
+            <w:r>
+              <w:rPr>
+                <w:rFonts w:ascii="Times New Roman" w:eastAsia="標楷體" w:hAnsi="Times New Roman" w:cs="Times New Roman" w:hint="eastAsia"/>
+              </w:rPr>
+              <w:t>件</w:t>
+            </w:r>
+            <w:r>
+              <w:rPr>
+                <w:rFonts w:ascii="Times New Roman" w:eastAsia="標楷體" w:hAnsi="Times New Roman" w:cs="Times New Roman" w:hint="eastAsia"/>
+              </w:rPr>
+              <w:t>以上的</w:t>
+            </w:r>
+            <w:r>
+              <w:rPr>
+                <w:rFonts w:ascii="Times New Roman" w:eastAsia="標楷體" w:hAnsi="Times New Roman" w:cs="Times New Roman" w:hint="eastAsia"/>
+              </w:rPr>
+              <w:t>待售商品</w:t>
             </w:r>
             <w:r>
               <w:rPr>
@@ -4048,13 +4470,25 @@
               <w:rPr>
                 <w:rFonts w:ascii="Times New Roman" w:eastAsia="標楷體" w:hAnsi="Times New Roman" w:cs="Times New Roman" w:hint="eastAsia"/>
               </w:rPr>
-              <w:t>賣家建立的</w:t>
-            </w:r>
-            <w:r>
-              <w:rPr>
-                <w:rFonts w:ascii="Times New Roman" w:eastAsia="標楷體" w:hAnsi="Times New Roman" w:cs="Times New Roman" w:hint="eastAsia"/>
-              </w:rPr>
-              <w:t>的分類中，且買家在賣家個人頁面能看到清楚的分類結構。</w:t>
+              <w:t>賣家</w:t>
+            </w:r>
+            <w:r>
+              <w:rPr>
+                <w:rFonts w:ascii="Times New Roman" w:eastAsia="標楷體" w:hAnsi="Times New Roman" w:cs="Times New Roman" w:hint="eastAsia"/>
+              </w:rPr>
+              <w:t>所</w:t>
+            </w:r>
+            <w:r>
+              <w:rPr>
+                <w:rFonts w:ascii="Times New Roman" w:eastAsia="標楷體" w:hAnsi="Times New Roman" w:cs="Times New Roman" w:hint="eastAsia"/>
+              </w:rPr>
+              <w:t>建立的</w:t>
+            </w:r>
+            <w:r>
+              <w:rPr>
+                <w:rFonts w:ascii="Times New Roman" w:eastAsia="標楷體" w:hAnsi="Times New Roman" w:cs="Times New Roman" w:hint="eastAsia"/>
+              </w:rPr>
+              <w:t>分類中，且買家在賣家個人頁面能看到清楚的分類結構。</w:t>
             </w:r>
           </w:p>
         </w:tc>
@@ -4111,448 +4545,588 @@
               <w:rPr>
                 <w:rFonts w:ascii="Times New Roman" w:eastAsia="標楷體" w:hAnsi="Times New Roman" w:cs="Times New Roman" w:hint="eastAsia"/>
               </w:rPr>
+              <w:t xml:space="preserve">2. </w:t>
+            </w:r>
+            <w:r>
+              <w:rPr>
+                <w:rFonts w:ascii="Times New Roman" w:eastAsia="標楷體" w:hAnsi="Times New Roman" w:cs="Times New Roman" w:hint="eastAsia"/>
+              </w:rPr>
+              <w:t>賣家</w:t>
+            </w:r>
+            <w:r>
+              <w:rPr>
+                <w:rFonts w:ascii="Times New Roman" w:eastAsia="標楷體" w:hAnsi="Times New Roman" w:cs="Times New Roman" w:hint="eastAsia"/>
+              </w:rPr>
+              <w:t>點選</w:t>
+            </w:r>
+            <w:r>
+              <w:rPr>
+                <w:rFonts w:ascii="Times New Roman" w:eastAsia="標楷體" w:hAnsi="Times New Roman" w:cs="Times New Roman" w:hint="eastAsia"/>
+              </w:rPr>
+              <w:t>「建立</w:t>
+            </w:r>
+            <w:r>
+              <w:rPr>
+                <w:rFonts w:ascii="Times New Roman" w:eastAsia="標楷體" w:hAnsi="Times New Roman" w:cs="Times New Roman" w:hint="eastAsia"/>
+              </w:rPr>
+              <w:t>/</w:t>
+            </w:r>
+            <w:r>
+              <w:rPr>
+                <w:rFonts w:ascii="Times New Roman" w:eastAsia="標楷體" w:hAnsi="Times New Roman" w:cs="Times New Roman" w:hint="eastAsia"/>
+              </w:rPr>
+              <w:t>編輯分類」</w:t>
+            </w:r>
+            <w:r>
+              <w:rPr>
+                <w:rFonts w:ascii="Times New Roman" w:eastAsia="標楷體" w:hAnsi="Times New Roman" w:cs="Times New Roman" w:hint="eastAsia"/>
+              </w:rPr>
+              <w:t>按鈕</w:t>
+            </w:r>
+            <w:r>
+              <w:rPr>
+                <w:rFonts w:ascii="Times New Roman" w:eastAsia="標楷體" w:hAnsi="Times New Roman" w:cs="Times New Roman" w:hint="eastAsia"/>
+              </w:rPr>
+              <w:t>。</w:t>
+            </w:r>
+          </w:p>
+          <w:p>
+            <w:pPr>
+              <w:rPr>
+                <w:rFonts w:ascii="Times New Roman" w:eastAsia="標楷體" w:hAnsi="Times New Roman" w:cs="Times New Roman"/>
+              </w:rPr>
+            </w:pPr>
+            <w:r>
+              <w:rPr>
+                <w:rFonts w:ascii="Times New Roman" w:eastAsia="標楷體" w:hAnsi="Times New Roman" w:cs="Times New Roman" w:hint="eastAsia"/>
+              </w:rPr>
+              <w:t xml:space="preserve">3. </w:t>
+            </w:r>
+            <w:r>
+              <w:rPr>
+                <w:rFonts w:ascii="Times New Roman" w:eastAsia="標楷體" w:hAnsi="Times New Roman" w:cs="Times New Roman" w:hint="eastAsia"/>
+              </w:rPr>
+              <w:t>賣家輸入自定義的類別名稱。</w:t>
+            </w:r>
+          </w:p>
+          <w:p>
+            <w:pPr>
+              <w:rPr>
+                <w:rFonts w:ascii="Times New Roman" w:eastAsia="標楷體" w:hAnsi="Times New Roman" w:cs="Times New Roman"/>
+              </w:rPr>
+            </w:pPr>
+            <w:r>
+              <w:rPr>
+                <w:rFonts w:ascii="Times New Roman" w:eastAsia="標楷體" w:hAnsi="Times New Roman" w:cs="Times New Roman" w:hint="eastAsia"/>
+              </w:rPr>
+              <w:t>4</w:t>
+            </w:r>
+            <w:r>
+              <w:rPr>
+                <w:rFonts w:ascii="Times New Roman" w:eastAsia="標楷體" w:hAnsi="Times New Roman" w:cs="Times New Roman" w:hint="eastAsia"/>
+              </w:rPr>
+              <w:t xml:space="preserve">. </w:t>
+            </w:r>
+            <w:r>
+              <w:rPr>
+                <w:rFonts w:ascii="Times New Roman" w:eastAsia="標楷體" w:hAnsi="Times New Roman" w:cs="Times New Roman" w:hint="eastAsia"/>
+              </w:rPr>
+              <w:t>賣家從已上架的</w:t>
+            </w:r>
+            <w:r>
+              <w:rPr>
+                <w:rFonts w:ascii="Times New Roman" w:eastAsia="標楷體" w:hAnsi="Times New Roman" w:cs="Times New Roman" w:hint="eastAsia"/>
+              </w:rPr>
+              <w:t>商品</w:t>
+            </w:r>
+            <w:r>
+              <w:rPr>
+                <w:rFonts w:ascii="Times New Roman" w:eastAsia="標楷體" w:hAnsi="Times New Roman" w:cs="Times New Roman" w:hint="eastAsia"/>
+              </w:rPr>
+              <w:t>清單中，勾選欲歸入該分類</w:t>
+            </w:r>
+            <w:r>
+              <w:rPr>
+                <w:rFonts w:ascii="Times New Roman" w:eastAsia="標楷體" w:hAnsi="Times New Roman" w:cs="Times New Roman" w:hint="eastAsia"/>
+              </w:rPr>
+              <w:t>的</w:t>
+            </w:r>
+            <w:r>
+              <w:rPr>
+                <w:rFonts w:ascii="Times New Roman" w:eastAsia="標楷體" w:hAnsi="Times New Roman" w:cs="Times New Roman" w:hint="eastAsia"/>
+              </w:rPr>
+              <w:t>商品</w:t>
+            </w:r>
+            <w:r>
+              <w:rPr>
+                <w:rFonts w:ascii="Times New Roman" w:eastAsia="標楷體" w:hAnsi="Times New Roman" w:cs="Times New Roman" w:hint="eastAsia"/>
+              </w:rPr>
+              <w:t>。</w:t>
+            </w:r>
+          </w:p>
+          <w:p>
+            <w:pPr>
+              <w:rPr>
+                <w:rFonts w:ascii="Times New Roman" w:eastAsia="標楷體" w:hAnsi="Times New Roman" w:cs="Times New Roman"/>
+              </w:rPr>
+            </w:pPr>
+            <w:r>
+              <w:rPr>
+                <w:rFonts w:ascii="Times New Roman" w:eastAsia="標楷體" w:hAnsi="Times New Roman" w:cs="Times New Roman" w:hint="eastAsia"/>
+              </w:rPr>
+              <w:t>5</w:t>
+            </w:r>
+            <w:r>
+              <w:rPr>
+                <w:rFonts w:ascii="Times New Roman" w:eastAsia="標楷體" w:hAnsi="Times New Roman" w:cs="Times New Roman" w:hint="eastAsia"/>
+              </w:rPr>
+              <w:t xml:space="preserve">. </w:t>
+            </w:r>
+            <w:r>
+              <w:rPr>
+                <w:rFonts w:ascii="Times New Roman" w:eastAsia="標楷體" w:hAnsi="Times New Roman" w:cs="Times New Roman" w:hint="eastAsia"/>
+              </w:rPr>
+              <w:t>賣家點</w:t>
+            </w:r>
+            <w:r>
+              <w:rPr>
+                <w:rFonts w:ascii="Times New Roman" w:eastAsia="標楷體" w:hAnsi="Times New Roman" w:cs="Times New Roman" w:hint="eastAsia"/>
+              </w:rPr>
+              <w:t>選</w:t>
+            </w:r>
+            <w:r>
+              <w:rPr>
+                <w:rFonts w:ascii="Times New Roman" w:eastAsia="標楷體" w:hAnsi="Times New Roman" w:cs="Times New Roman" w:hint="eastAsia"/>
+              </w:rPr>
+              <w:t>「確認套用」</w:t>
+            </w:r>
+            <w:r>
+              <w:rPr>
+                <w:rFonts w:ascii="Times New Roman" w:eastAsia="標楷體" w:hAnsi="Times New Roman" w:cs="Times New Roman" w:hint="eastAsia"/>
+              </w:rPr>
+              <w:t>按鈕</w:t>
+            </w:r>
+            <w:r>
+              <w:rPr>
+                <w:rFonts w:ascii="Times New Roman" w:eastAsia="標楷體" w:hAnsi="Times New Roman" w:cs="Times New Roman" w:hint="eastAsia"/>
+              </w:rPr>
+              <w:t>。</w:t>
+            </w:r>
+          </w:p>
+          <w:p>
+            <w:pPr>
+              <w:rPr>
+                <w:rFonts w:ascii="Times New Roman" w:eastAsia="標楷體" w:hAnsi="Times New Roman" w:cs="Times New Roman"/>
+              </w:rPr>
+            </w:pPr>
+            <w:r>
+              <w:rPr>
+                <w:rFonts w:ascii="Times New Roman" w:eastAsia="標楷體" w:hAnsi="Times New Roman" w:cs="Times New Roman" w:hint="eastAsia"/>
+              </w:rPr>
+              <w:t>6</w:t>
+            </w:r>
+            <w:r>
+              <w:rPr>
+                <w:rFonts w:ascii="Times New Roman" w:eastAsia="標楷體" w:hAnsi="Times New Roman" w:cs="Times New Roman" w:hint="eastAsia"/>
+              </w:rPr>
+              <w:t xml:space="preserve">. </w:t>
+            </w:r>
+            <w:r>
+              <w:rPr>
+                <w:rFonts w:ascii="Times New Roman" w:eastAsia="標楷體" w:hAnsi="Times New Roman" w:cs="Times New Roman" w:hint="eastAsia"/>
+              </w:rPr>
+              <w:t>系統更新</w:t>
+            </w:r>
+            <w:r>
+              <w:rPr>
+                <w:rFonts w:ascii="Times New Roman" w:eastAsia="標楷體" w:hAnsi="Times New Roman" w:cs="Times New Roman" w:hint="eastAsia"/>
+              </w:rPr>
+              <w:t>賣場</w:t>
+            </w:r>
+            <w:r>
+              <w:rPr>
+                <w:rFonts w:ascii="Times New Roman" w:eastAsia="標楷體" w:hAnsi="Times New Roman" w:cs="Times New Roman" w:hint="eastAsia"/>
+              </w:rPr>
+              <w:t>與分類的關聯資料，並即時反映在賣家</w:t>
+            </w:r>
+            <w:r>
+              <w:rPr>
+                <w:rFonts w:ascii="Times New Roman" w:eastAsia="標楷體" w:hAnsi="Times New Roman" w:cs="Times New Roman" w:hint="eastAsia"/>
+              </w:rPr>
+              <w:t>的個人</w:t>
+            </w:r>
+            <w:r>
+              <w:rPr>
+                <w:rFonts w:ascii="Times New Roman" w:eastAsia="標楷體" w:hAnsi="Times New Roman" w:cs="Times New Roman" w:hint="eastAsia"/>
+              </w:rPr>
+              <w:t>賣場。</w:t>
+            </w:r>
+          </w:p>
+        </w:tc>
+      </w:tr>
+      <w:tr>
+        <w:tc>
+          <w:tcPr>
+            <w:tcW w:w="4148" w:type="dxa"/>
+          </w:tcPr>
+          <w:p>
+            <w:pPr>
+              <w:rPr>
+                <w:rFonts w:ascii="Times New Roman" w:eastAsia="標楷體" w:hAnsi="Times New Roman" w:cs="Times New Roman"/>
+              </w:rPr>
+            </w:pPr>
+            <w:r>
+              <w:rPr>
+                <w:rFonts w:ascii="Times New Roman" w:eastAsia="標楷體" w:hAnsi="Times New Roman" w:cs="Times New Roman" w:hint="eastAsia"/>
+              </w:rPr>
+              <w:t>Extensions</w:t>
+            </w:r>
+          </w:p>
+        </w:tc>
+        <w:tc>
+          <w:tcPr>
+            <w:tcW w:w="4148" w:type="dxa"/>
+          </w:tcPr>
+          <w:p>
+            <w:pPr>
+              <w:rPr>
+                <w:rFonts w:ascii="Times New Roman" w:eastAsia="標楷體" w:hAnsi="Times New Roman" w:cs="Times New Roman"/>
+              </w:rPr>
+            </w:pPr>
+            <w:r>
+              <w:rPr>
+                <w:rFonts w:ascii="Times New Roman" w:eastAsia="標楷體" w:hAnsi="Times New Roman" w:cs="Times New Roman" w:hint="eastAsia"/>
+              </w:rPr>
+              <w:t xml:space="preserve">2a. </w:t>
+            </w:r>
+            <w:r>
+              <w:rPr>
+                <w:rFonts w:ascii="Times New Roman" w:eastAsia="標楷體" w:hAnsi="Times New Roman" w:cs="Times New Roman" w:hint="eastAsia"/>
+              </w:rPr>
+              <w:t>賣家選擇「刪除分類」</w:t>
+            </w:r>
+          </w:p>
+          <w:p>
+            <w:pPr>
+              <w:pStyle w:val="a9"/>
+              <w:numPr>
+                <w:ilvl w:val="0"/>
+                <w:numId w:val="6"/>
+              </w:numPr>
+              <w:rPr>
+                <w:rFonts w:ascii="Times New Roman" w:eastAsia="標楷體" w:hAnsi="Times New Roman" w:cs="Times New Roman"/>
+              </w:rPr>
+            </w:pPr>
+            <w:r>
+              <w:rPr>
+                <w:rFonts w:ascii="Times New Roman" w:eastAsia="標楷體" w:hAnsi="Times New Roman" w:cs="Times New Roman" w:hint="eastAsia"/>
+              </w:rPr>
+              <w:t>賣家點選要刪除的分類</w:t>
+            </w:r>
+          </w:p>
+          <w:p>
+            <w:pPr>
+              <w:pStyle w:val="a9"/>
+              <w:numPr>
+                <w:ilvl w:val="0"/>
+                <w:numId w:val="6"/>
+              </w:numPr>
+              <w:rPr>
+                <w:rFonts w:ascii="Times New Roman" w:eastAsia="標楷體" w:hAnsi="Times New Roman" w:cs="Times New Roman"/>
+              </w:rPr>
+            </w:pPr>
+            <w:r>
+              <w:rPr>
+                <w:rFonts w:ascii="Times New Roman" w:eastAsia="標楷體" w:hAnsi="Times New Roman" w:cs="Times New Roman" w:hint="eastAsia"/>
+              </w:rPr>
+              <w:t>系統跳出確認刪除警告。</w:t>
+            </w:r>
+          </w:p>
+          <w:p>
+            <w:pPr>
+              <w:pStyle w:val="a9"/>
+              <w:numPr>
+                <w:ilvl w:val="0"/>
+                <w:numId w:val="6"/>
+              </w:numPr>
+              <w:spacing w:line="276" w:lineRule="auto"/>
+              <w:rPr>
+                <w:rFonts w:ascii="Times New Roman" w:eastAsia="標楷體" w:hAnsi="Times New Roman" w:cs="Times New Roman" w:hint="eastAsia"/>
+                <w:highlight w:val="yellow"/>
+              </w:rPr>
+            </w:pPr>
+            <w:r>
+              <w:rPr>
+                <w:rFonts w:ascii="Times New Roman" w:eastAsia="標楷體" w:hAnsi="Times New Roman" w:cs="Times New Roman" w:hint="eastAsia"/>
+                <w:highlight w:val="yellow"/>
+              </w:rPr>
+              <w:t>回到</w:t>
+            </w:r>
+            <w:r>
+              <w:rPr>
+                <w:rFonts w:ascii="Times New Roman" w:eastAsia="標楷體" w:hAnsi="Times New Roman" w:cs="Times New Roman" w:hint="eastAsia"/>
+                <w:highlight w:val="yellow"/>
+              </w:rPr>
+              <w:t>Main Success Scenario</w:t>
+            </w:r>
+            <w:r>
+              <w:rPr>
+                <w:rFonts w:ascii="Times New Roman" w:eastAsia="標楷體" w:hAnsi="Times New Roman" w:cs="Times New Roman" w:hint="eastAsia"/>
+                <w:highlight w:val="yellow"/>
+              </w:rPr>
+              <w:t>第</w:t>
+            </w:r>
+            <w:r>
+              <w:rPr>
+                <w:rFonts w:ascii="Times New Roman" w:eastAsia="標楷體" w:hAnsi="Times New Roman" w:cs="Times New Roman" w:hint="eastAsia"/>
+                <w:highlight w:val="yellow"/>
+              </w:rPr>
+              <w:t>5</w:t>
+            </w:r>
+            <w:r>
+              <w:rPr>
+                <w:rFonts w:ascii="Times New Roman" w:eastAsia="標楷體" w:hAnsi="Times New Roman" w:cs="Times New Roman" w:hint="eastAsia"/>
+                <w:highlight w:val="yellow"/>
+              </w:rPr>
+              <w:t>步。</w:t>
+            </w:r>
+          </w:p>
+          <w:p>
+            <w:pPr>
+              <w:rPr>
+                <w:rFonts w:ascii="Times New Roman" w:eastAsia="標楷體" w:hAnsi="Times New Roman" w:cs="Times New Roman"/>
+              </w:rPr>
+            </w:pPr>
+            <w:r>
+              <w:rPr>
+                <w:rFonts w:ascii="Times New Roman" w:eastAsia="標楷體" w:hAnsi="Times New Roman" w:cs="Times New Roman" w:hint="eastAsia"/>
+              </w:rPr>
+              <w:t>3</w:t>
+            </w:r>
+            <w:r>
+              <w:rPr>
+                <w:rFonts w:ascii="Times New Roman" w:eastAsia="標楷體" w:hAnsi="Times New Roman" w:cs="Times New Roman" w:hint="eastAsia"/>
+              </w:rPr>
+              <w:t xml:space="preserve">a. </w:t>
+            </w:r>
+            <w:r>
+              <w:rPr>
+                <w:rFonts w:ascii="Times New Roman" w:eastAsia="標楷體" w:hAnsi="Times New Roman" w:cs="Times New Roman" w:hint="eastAsia"/>
+              </w:rPr>
+              <w:t>分類名稱重複：系統提示該分類已存在。</w:t>
+            </w:r>
+          </w:p>
+          <w:p>
+            <w:pPr>
+              <w:rPr>
+                <w:rFonts w:ascii="Times New Roman" w:eastAsia="標楷體" w:hAnsi="Times New Roman" w:cs="Times New Roman"/>
+              </w:rPr>
+            </w:pPr>
+            <w:r>
+              <w:rPr>
+                <w:rFonts w:ascii="Times New Roman" w:eastAsia="標楷體" w:hAnsi="Times New Roman" w:cs="Times New Roman" w:hint="eastAsia"/>
+              </w:rPr>
+              <w:t>4</w:t>
+            </w:r>
+            <w:r>
+              <w:rPr>
+                <w:rFonts w:ascii="Times New Roman" w:eastAsia="標楷體" w:hAnsi="Times New Roman" w:cs="Times New Roman" w:hint="eastAsia"/>
+              </w:rPr>
+              <w:t xml:space="preserve">a. </w:t>
+            </w:r>
+            <w:r>
+              <w:rPr>
+                <w:rFonts w:ascii="Times New Roman" w:eastAsia="標楷體" w:hAnsi="Times New Roman" w:cs="Times New Roman" w:hint="eastAsia"/>
+              </w:rPr>
+              <w:t>批次移動失敗：若系統在處理大量</w:t>
+            </w:r>
+            <w:r>
+              <w:rPr>
+                <w:rFonts w:ascii="Times New Roman" w:eastAsia="標楷體" w:hAnsi="Times New Roman" w:cs="Times New Roman" w:hint="eastAsia"/>
+              </w:rPr>
+              <w:t>商品</w:t>
+            </w:r>
+            <w:r>
+              <w:rPr>
+                <w:rFonts w:ascii="Times New Roman" w:eastAsia="標楷體" w:hAnsi="Times New Roman" w:cs="Times New Roman" w:hint="eastAsia"/>
+              </w:rPr>
+              <w:t>關聯時發生錯誤，系統應還原狀態並提示賣家重新操作。</w:t>
+            </w:r>
+          </w:p>
+          <w:p>
+            <w:pPr>
+              <w:rPr>
+                <w:rFonts w:ascii="Times New Roman" w:eastAsia="標楷體" w:hAnsi="Times New Roman" w:cs="Times New Roman"/>
+              </w:rPr>
+            </w:pPr>
+            <w:r>
+              <w:rPr>
+                <w:rFonts w:ascii="Times New Roman" w:eastAsia="標楷體" w:hAnsi="Times New Roman" w:cs="Times New Roman" w:hint="eastAsia"/>
+                <w:highlight w:val="yellow"/>
+              </w:rPr>
+              <w:t>5</w:t>
+            </w:r>
+            <w:r>
+              <w:rPr>
+                <w:rFonts w:ascii="Times New Roman" w:eastAsia="標楷體" w:hAnsi="Times New Roman" w:cs="Times New Roman" w:hint="eastAsia"/>
+                <w:highlight w:val="yellow"/>
+              </w:rPr>
+              <w:t xml:space="preserve">a. </w:t>
+            </w:r>
+            <w:r>
+              <w:rPr>
+                <w:rFonts w:ascii="Times New Roman" w:eastAsia="標楷體" w:hAnsi="Times New Roman" w:cs="Times New Roman" w:hint="eastAsia"/>
+                <w:highlight w:val="yellow"/>
+              </w:rPr>
+              <w:t>刪除分類：賣家刪除分類時，系統需確認</w:t>
+            </w:r>
+            <w:r>
+              <w:rPr>
+                <w:rFonts w:ascii="Times New Roman" w:eastAsia="標楷體" w:hAnsi="Times New Roman" w:cs="Times New Roman" w:hint="eastAsia"/>
+                <w:highlight w:val="yellow"/>
+              </w:rPr>
+              <w:t>商品</w:t>
+            </w:r>
+            <w:r>
+              <w:rPr>
+                <w:rFonts w:ascii="Times New Roman" w:eastAsia="標楷體" w:hAnsi="Times New Roman" w:cs="Times New Roman" w:hint="eastAsia"/>
+                <w:highlight w:val="yellow"/>
+              </w:rPr>
+              <w:t>是否回歸到「未分類」狀態而非直接刪除</w:t>
+            </w:r>
+            <w:r>
+              <w:rPr>
+                <w:rFonts w:ascii="Times New Roman" w:eastAsia="標楷體" w:hAnsi="Times New Roman" w:cs="Times New Roman" w:hint="eastAsia"/>
+                <w:highlight w:val="yellow"/>
+              </w:rPr>
+              <w:t>商品</w:t>
+            </w:r>
+            <w:r>
+              <w:rPr>
+                <w:rFonts w:ascii="Times New Roman" w:eastAsia="標楷體" w:hAnsi="Times New Roman" w:cs="Times New Roman" w:hint="eastAsia"/>
+                <w:highlight w:val="yellow"/>
+              </w:rPr>
+              <w:t>。</w:t>
+            </w:r>
+          </w:p>
+        </w:tc>
+      </w:tr>
+      <w:tr>
+        <w:tc>
+          <w:tcPr>
+            <w:tcW w:w="4148" w:type="dxa"/>
+          </w:tcPr>
+          <w:p>
+            <w:pPr>
+              <w:rPr>
+                <w:rFonts w:ascii="Times New Roman" w:eastAsia="標楷體" w:hAnsi="Times New Roman" w:cs="Times New Roman"/>
+              </w:rPr>
+            </w:pPr>
+            <w:r>
+              <w:rPr>
+                <w:rFonts w:ascii="Times New Roman" w:eastAsia="標楷體" w:hAnsi="Times New Roman" w:cs="Times New Roman" w:hint="eastAsia"/>
+              </w:rPr>
+              <w:t>Special Requirements</w:t>
+            </w:r>
+          </w:p>
+        </w:tc>
+        <w:tc>
+          <w:tcPr>
+            <w:tcW w:w="4148" w:type="dxa"/>
+          </w:tcPr>
+          <w:p>
+            <w:pPr>
+              <w:rPr>
+                <w:rFonts w:ascii="Times New Roman" w:eastAsia="標楷體" w:hAnsi="Times New Roman" w:cs="Times New Roman"/>
+              </w:rPr>
+            </w:pPr>
+            <w:r>
+              <w:rPr>
+                <w:rFonts w:ascii="Times New Roman" w:eastAsia="標楷體" w:hAnsi="Times New Roman" w:cs="Times New Roman" w:hint="eastAsia"/>
+              </w:rPr>
+              <w:t>支援「批次處理」功能，確保賣家能一次性分類多</w:t>
+            </w:r>
+            <w:r>
+              <w:rPr>
+                <w:rFonts w:ascii="Times New Roman" w:eastAsia="標楷體" w:hAnsi="Times New Roman" w:cs="Times New Roman" w:hint="eastAsia"/>
+              </w:rPr>
+              <w:t>件商品</w:t>
+            </w:r>
+            <w:r>
+              <w:rPr>
+                <w:rFonts w:ascii="Times New Roman" w:eastAsia="標楷體" w:hAnsi="Times New Roman" w:cs="Times New Roman" w:hint="eastAsia"/>
+              </w:rPr>
+              <w:t>，減少重複動作。</w:t>
+            </w:r>
+          </w:p>
+        </w:tc>
+      </w:tr>
+      <w:tr>
+        <w:tc>
+          <w:tcPr>
+            <w:tcW w:w="4148" w:type="dxa"/>
+          </w:tcPr>
+          <w:p>
+            <w:pPr>
+              <w:rPr>
+                <w:rFonts w:ascii="Times New Roman" w:eastAsia="標楷體" w:hAnsi="Times New Roman" w:cs="Times New Roman"/>
+              </w:rPr>
+            </w:pPr>
+            <w:r>
+              <w:rPr>
+                <w:rFonts w:ascii="Times New Roman" w:eastAsia="標楷體" w:hAnsi="Times New Roman" w:cs="Times New Roman" w:hint="eastAsia"/>
+              </w:rPr>
+              <w:t>Technology and Data Variations List</w:t>
+            </w:r>
+          </w:p>
+        </w:tc>
+        <w:tc>
+          <w:tcPr>
+            <w:tcW w:w="4148" w:type="dxa"/>
+          </w:tcPr>
+          <w:p>
+            <w:pPr>
+              <w:rPr>
+                <w:rFonts w:ascii="Times New Roman" w:eastAsia="標楷體" w:hAnsi="Times New Roman" w:cs="Times New Roman"/>
+              </w:rPr>
+            </w:pPr>
+            <w:r>
+              <w:rPr>
+                <w:rFonts w:ascii="Times New Roman" w:eastAsia="標楷體" w:hAnsi="Times New Roman" w:cs="Times New Roman" w:hint="eastAsia"/>
+              </w:rPr>
+              <w:t>系統應預設基礎分類（如：</w:t>
+            </w:r>
+            <w:r>
+              <w:rPr>
+                <w:rFonts w:ascii="Times New Roman" w:eastAsia="標楷體" w:hAnsi="Times New Roman" w:cs="Times New Roman" w:hint="eastAsia"/>
+              </w:rPr>
+              <w:t xml:space="preserve">ISBN </w:t>
+            </w:r>
+            <w:r>
+              <w:rPr>
+                <w:rFonts w:ascii="Times New Roman" w:eastAsia="標楷體" w:hAnsi="Times New Roman" w:cs="Times New Roman" w:hint="eastAsia"/>
+              </w:rPr>
+              <w:t>自動帶入的類別），並允許賣家自定義標籤進行更彈性的管理。</w:t>
+            </w:r>
+          </w:p>
+        </w:tc>
+      </w:tr>
+      <w:tr>
+        <w:tc>
+          <w:tcPr>
+            <w:tcW w:w="4148" w:type="dxa"/>
+          </w:tcPr>
+          <w:p>
+            <w:pPr>
+              <w:rPr>
+                <w:rFonts w:ascii="Times New Roman" w:eastAsia="標楷體" w:hAnsi="Times New Roman" w:cs="Times New Roman"/>
+              </w:rPr>
+            </w:pPr>
+            <w:r>
+              <w:rPr>
+                <w:rFonts w:ascii="Times New Roman" w:eastAsia="標楷體" w:hAnsi="Times New Roman" w:cs="Times New Roman" w:hint="eastAsia"/>
+              </w:rPr>
               <w:lastRenderedPageBreak/>
-              <w:t xml:space="preserve">2. </w:t>
-            </w:r>
-            <w:r>
-              <w:rPr>
-                <w:rFonts w:ascii="Times New Roman" w:eastAsia="標楷體" w:hAnsi="Times New Roman" w:cs="Times New Roman" w:hint="eastAsia"/>
-              </w:rPr>
-              <w:t>賣家</w:t>
-            </w:r>
-            <w:r>
-              <w:rPr>
-                <w:rFonts w:ascii="Times New Roman" w:eastAsia="標楷體" w:hAnsi="Times New Roman" w:cs="Times New Roman" w:hint="eastAsia"/>
-              </w:rPr>
-              <w:t>點選</w:t>
-            </w:r>
-            <w:r>
-              <w:rPr>
-                <w:rFonts w:ascii="Times New Roman" w:eastAsia="標楷體" w:hAnsi="Times New Roman" w:cs="Times New Roman" w:hint="eastAsia"/>
-              </w:rPr>
-              <w:t>「建立</w:t>
-            </w:r>
-            <w:r>
-              <w:rPr>
-                <w:rFonts w:ascii="Times New Roman" w:eastAsia="標楷體" w:hAnsi="Times New Roman" w:cs="Times New Roman" w:hint="eastAsia"/>
-              </w:rPr>
-              <w:t>/</w:t>
-            </w:r>
-            <w:r>
-              <w:rPr>
-                <w:rFonts w:ascii="Times New Roman" w:eastAsia="標楷體" w:hAnsi="Times New Roman" w:cs="Times New Roman" w:hint="eastAsia"/>
-              </w:rPr>
-              <w:t>編輯分類」</w:t>
-            </w:r>
-            <w:r>
-              <w:rPr>
-                <w:rFonts w:ascii="Times New Roman" w:eastAsia="標楷體" w:hAnsi="Times New Roman" w:cs="Times New Roman" w:hint="eastAsia"/>
-              </w:rPr>
-              <w:t>按鈕</w:t>
-            </w:r>
-            <w:r>
-              <w:rPr>
-                <w:rFonts w:ascii="Times New Roman" w:eastAsia="標楷體" w:hAnsi="Times New Roman" w:cs="Times New Roman" w:hint="eastAsia"/>
-              </w:rPr>
-              <w:t>。</w:t>
-            </w:r>
-          </w:p>
-          <w:p>
-            <w:pPr>
-              <w:rPr>
-                <w:rFonts w:ascii="Times New Roman" w:eastAsia="標楷體" w:hAnsi="Times New Roman" w:cs="Times New Roman" w:hint="eastAsia"/>
-              </w:rPr>
-            </w:pPr>
-            <w:r>
-              <w:rPr>
-                <w:rFonts w:ascii="Times New Roman" w:eastAsia="標楷體" w:hAnsi="Times New Roman" w:cs="Times New Roman" w:hint="eastAsia"/>
-              </w:rPr>
-              <w:t xml:space="preserve">3. </w:t>
-            </w:r>
-            <w:r>
-              <w:rPr>
-                <w:rFonts w:ascii="Times New Roman" w:eastAsia="標楷體" w:hAnsi="Times New Roman" w:cs="Times New Roman" w:hint="eastAsia"/>
-              </w:rPr>
-              <w:t>賣家輸入自定義的類別名稱。</w:t>
-            </w:r>
-          </w:p>
-          <w:p>
-            <w:pPr>
-              <w:rPr>
-                <w:rFonts w:ascii="Times New Roman" w:eastAsia="標楷體" w:hAnsi="Times New Roman" w:cs="Times New Roman"/>
-              </w:rPr>
-            </w:pPr>
-            <w:r>
-              <w:rPr>
-                <w:rFonts w:ascii="Times New Roman" w:eastAsia="標楷體" w:hAnsi="Times New Roman" w:cs="Times New Roman" w:hint="eastAsia"/>
-              </w:rPr>
-              <w:t xml:space="preserve">3. </w:t>
-            </w:r>
-            <w:r>
-              <w:rPr>
-                <w:rFonts w:ascii="Times New Roman" w:eastAsia="標楷體" w:hAnsi="Times New Roman" w:cs="Times New Roman" w:hint="eastAsia"/>
-              </w:rPr>
-              <w:t>賣家從已上架的</w:t>
-            </w:r>
-            <w:r>
-              <w:rPr>
-                <w:rFonts w:ascii="Times New Roman" w:eastAsia="標楷體" w:hAnsi="Times New Roman" w:cs="Times New Roman" w:hint="eastAsia"/>
-              </w:rPr>
-              <w:t>商品</w:t>
-            </w:r>
-            <w:r>
-              <w:rPr>
-                <w:rFonts w:ascii="Times New Roman" w:eastAsia="標楷體" w:hAnsi="Times New Roman" w:cs="Times New Roman" w:hint="eastAsia"/>
-              </w:rPr>
-              <w:t>清單中，勾選欲歸入該分類的多</w:t>
-            </w:r>
-            <w:r>
-              <w:rPr>
-                <w:rFonts w:ascii="Times New Roman" w:eastAsia="標楷體" w:hAnsi="Times New Roman" w:cs="Times New Roman" w:hint="eastAsia"/>
-              </w:rPr>
-              <w:t>個商品</w:t>
-            </w:r>
-            <w:r>
-              <w:rPr>
-                <w:rFonts w:ascii="Times New Roman" w:eastAsia="標楷體" w:hAnsi="Times New Roman" w:cs="Times New Roman" w:hint="eastAsia"/>
-              </w:rPr>
-              <w:t>。</w:t>
-            </w:r>
-          </w:p>
-          <w:p>
-            <w:pPr>
-              <w:rPr>
-                <w:rFonts w:ascii="Times New Roman" w:eastAsia="標楷體" w:hAnsi="Times New Roman" w:cs="Times New Roman"/>
-              </w:rPr>
-            </w:pPr>
-            <w:r>
-              <w:rPr>
-                <w:rFonts w:ascii="Times New Roman" w:eastAsia="標楷體" w:hAnsi="Times New Roman" w:cs="Times New Roman" w:hint="eastAsia"/>
-              </w:rPr>
-              <w:t xml:space="preserve">4. </w:t>
-            </w:r>
-            <w:r>
-              <w:rPr>
-                <w:rFonts w:ascii="Times New Roman" w:eastAsia="標楷體" w:hAnsi="Times New Roman" w:cs="Times New Roman" w:hint="eastAsia"/>
-              </w:rPr>
-              <w:t>賣家點</w:t>
-            </w:r>
-            <w:r>
-              <w:rPr>
-                <w:rFonts w:ascii="Times New Roman" w:eastAsia="標楷體" w:hAnsi="Times New Roman" w:cs="Times New Roman" w:hint="eastAsia"/>
-              </w:rPr>
-              <w:t>選</w:t>
-            </w:r>
-            <w:r>
-              <w:rPr>
-                <w:rFonts w:ascii="Times New Roman" w:eastAsia="標楷體" w:hAnsi="Times New Roman" w:cs="Times New Roman" w:hint="eastAsia"/>
-              </w:rPr>
-              <w:t>「確認套用」</w:t>
-            </w:r>
-            <w:r>
-              <w:rPr>
-                <w:rFonts w:ascii="Times New Roman" w:eastAsia="標楷體" w:hAnsi="Times New Roman" w:cs="Times New Roman" w:hint="eastAsia"/>
-              </w:rPr>
-              <w:t>按鈕</w:t>
-            </w:r>
-            <w:r>
-              <w:rPr>
-                <w:rFonts w:ascii="Times New Roman" w:eastAsia="標楷體" w:hAnsi="Times New Roman" w:cs="Times New Roman" w:hint="eastAsia"/>
-              </w:rPr>
-              <w:t>。</w:t>
-            </w:r>
-          </w:p>
-          <w:p>
-            <w:pPr>
-              <w:rPr>
-                <w:rFonts w:ascii="Times New Roman" w:eastAsia="標楷體" w:hAnsi="Times New Roman" w:cs="Times New Roman"/>
-              </w:rPr>
-            </w:pPr>
-            <w:r>
-              <w:rPr>
-                <w:rFonts w:ascii="Times New Roman" w:eastAsia="標楷體" w:hAnsi="Times New Roman" w:cs="Times New Roman" w:hint="eastAsia"/>
-              </w:rPr>
-              <w:t xml:space="preserve">5. </w:t>
-            </w:r>
-            <w:r>
-              <w:rPr>
-                <w:rFonts w:ascii="Times New Roman" w:eastAsia="標楷體" w:hAnsi="Times New Roman" w:cs="Times New Roman" w:hint="eastAsia"/>
-              </w:rPr>
-              <w:t>系統更新</w:t>
-            </w:r>
-            <w:r>
-              <w:rPr>
-                <w:rFonts w:ascii="Times New Roman" w:eastAsia="標楷體" w:hAnsi="Times New Roman" w:cs="Times New Roman" w:hint="eastAsia"/>
-              </w:rPr>
-              <w:t>賣場</w:t>
-            </w:r>
-            <w:r>
-              <w:rPr>
-                <w:rFonts w:ascii="Times New Roman" w:eastAsia="標楷體" w:hAnsi="Times New Roman" w:cs="Times New Roman" w:hint="eastAsia"/>
-              </w:rPr>
-              <w:t>與分類的關聯資料，並即時反映在賣家</w:t>
-            </w:r>
-            <w:r>
-              <w:rPr>
-                <w:rFonts w:ascii="Times New Roman" w:eastAsia="標楷體" w:hAnsi="Times New Roman" w:cs="Times New Roman" w:hint="eastAsia"/>
-              </w:rPr>
-              <w:t>的個人</w:t>
-            </w:r>
-            <w:r>
-              <w:rPr>
-                <w:rFonts w:ascii="Times New Roman" w:eastAsia="標楷體" w:hAnsi="Times New Roman" w:cs="Times New Roman" w:hint="eastAsia"/>
-              </w:rPr>
-              <w:t>賣場。</w:t>
-            </w:r>
-          </w:p>
-        </w:tc>
-      </w:tr>
-      <w:tr>
-        <w:tc>
-          <w:tcPr>
-            <w:tcW w:w="4148" w:type="dxa"/>
-          </w:tcPr>
-          <w:p>
-            <w:pPr>
-              <w:rPr>
-                <w:rFonts w:ascii="Times New Roman" w:eastAsia="標楷體" w:hAnsi="Times New Roman" w:cs="Times New Roman"/>
-              </w:rPr>
-            </w:pPr>
-            <w:r>
-              <w:rPr>
-                <w:rFonts w:ascii="Times New Roman" w:eastAsia="標楷體" w:hAnsi="Times New Roman" w:cs="Times New Roman" w:hint="eastAsia"/>
-              </w:rPr>
-              <w:lastRenderedPageBreak/>
-              <w:t>Extensions</w:t>
-            </w:r>
-          </w:p>
-        </w:tc>
-        <w:tc>
-          <w:tcPr>
-            <w:tcW w:w="4148" w:type="dxa"/>
-          </w:tcPr>
-          <w:p>
-            <w:pPr>
-              <w:rPr>
-                <w:rFonts w:ascii="Times New Roman" w:eastAsia="標楷體" w:hAnsi="Times New Roman" w:cs="Times New Roman"/>
-              </w:rPr>
-            </w:pPr>
-            <w:r>
-              <w:rPr>
-                <w:rFonts w:ascii="Times New Roman" w:eastAsia="標楷體" w:hAnsi="Times New Roman" w:cs="Times New Roman" w:hint="eastAsia"/>
-              </w:rPr>
-              <w:t xml:space="preserve">2a. </w:t>
-            </w:r>
-            <w:r>
-              <w:rPr>
-                <w:rFonts w:ascii="Times New Roman" w:eastAsia="標楷體" w:hAnsi="Times New Roman" w:cs="Times New Roman" w:hint="eastAsia"/>
-              </w:rPr>
-              <w:t>分類名稱重複：系統提示該分類已存在。</w:t>
-            </w:r>
-          </w:p>
-          <w:p>
-            <w:pPr>
-              <w:rPr>
-                <w:rFonts w:ascii="Times New Roman" w:eastAsia="標楷體" w:hAnsi="Times New Roman" w:cs="Times New Roman"/>
-              </w:rPr>
-            </w:pPr>
-            <w:r>
-              <w:rPr>
-                <w:rFonts w:ascii="Times New Roman" w:eastAsia="標楷體" w:hAnsi="Times New Roman" w:cs="Times New Roman" w:hint="eastAsia"/>
-              </w:rPr>
-              <w:t xml:space="preserve">3a. </w:t>
-            </w:r>
-            <w:r>
-              <w:rPr>
-                <w:rFonts w:ascii="Times New Roman" w:eastAsia="標楷體" w:hAnsi="Times New Roman" w:cs="Times New Roman" w:hint="eastAsia"/>
-              </w:rPr>
-              <w:t>批次移動失敗：若系統在處理大量</w:t>
-            </w:r>
-            <w:r>
-              <w:rPr>
-                <w:rFonts w:ascii="Times New Roman" w:eastAsia="標楷體" w:hAnsi="Times New Roman" w:cs="Times New Roman" w:hint="eastAsia"/>
-              </w:rPr>
-              <w:t>商品</w:t>
-            </w:r>
-            <w:r>
-              <w:rPr>
-                <w:rFonts w:ascii="Times New Roman" w:eastAsia="標楷體" w:hAnsi="Times New Roman" w:cs="Times New Roman" w:hint="eastAsia"/>
-              </w:rPr>
-              <w:t>關聯時發生錯誤，系統應還原狀態並提示賣家重新操作。</w:t>
-            </w:r>
-          </w:p>
-          <w:p>
-            <w:pPr>
-              <w:rPr>
-                <w:rFonts w:ascii="Times New Roman" w:eastAsia="標楷體" w:hAnsi="Times New Roman" w:cs="Times New Roman"/>
-              </w:rPr>
-            </w:pPr>
-            <w:r>
-              <w:rPr>
-                <w:rFonts w:ascii="Times New Roman" w:eastAsia="標楷體" w:hAnsi="Times New Roman" w:cs="Times New Roman" w:hint="eastAsia"/>
-              </w:rPr>
-              <w:t xml:space="preserve">4a. </w:t>
-            </w:r>
-            <w:r>
-              <w:rPr>
-                <w:rFonts w:ascii="Times New Roman" w:eastAsia="標楷體" w:hAnsi="Times New Roman" w:cs="Times New Roman" w:hint="eastAsia"/>
-              </w:rPr>
-              <w:t>刪除分類：賣家刪除分類時，系統需確認</w:t>
-            </w:r>
-            <w:r>
-              <w:rPr>
-                <w:rFonts w:ascii="Times New Roman" w:eastAsia="標楷體" w:hAnsi="Times New Roman" w:cs="Times New Roman" w:hint="eastAsia"/>
-              </w:rPr>
-              <w:t>商品</w:t>
-            </w:r>
-            <w:r>
-              <w:rPr>
-                <w:rFonts w:ascii="Times New Roman" w:eastAsia="標楷體" w:hAnsi="Times New Roman" w:cs="Times New Roman" w:hint="eastAsia"/>
-              </w:rPr>
-              <w:t>是否回歸到「未分類」狀態而非直接刪除</w:t>
-            </w:r>
-            <w:r>
-              <w:rPr>
-                <w:rFonts w:ascii="Times New Roman" w:eastAsia="標楷體" w:hAnsi="Times New Roman" w:cs="Times New Roman" w:hint="eastAsia"/>
-              </w:rPr>
-              <w:t>商品</w:t>
-            </w:r>
-            <w:r>
-              <w:rPr>
-                <w:rFonts w:ascii="Times New Roman" w:eastAsia="標楷體" w:hAnsi="Times New Roman" w:cs="Times New Roman" w:hint="eastAsia"/>
-              </w:rPr>
-              <w:t>。</w:t>
-            </w:r>
-          </w:p>
-        </w:tc>
-      </w:tr>
-      <w:tr>
-        <w:tc>
-          <w:tcPr>
-            <w:tcW w:w="4148" w:type="dxa"/>
-          </w:tcPr>
-          <w:p>
-            <w:pPr>
-              <w:rPr>
-                <w:rFonts w:ascii="Times New Roman" w:eastAsia="標楷體" w:hAnsi="Times New Roman" w:cs="Times New Roman"/>
-              </w:rPr>
-            </w:pPr>
-            <w:r>
-              <w:rPr>
-                <w:rFonts w:ascii="Times New Roman" w:eastAsia="標楷體" w:hAnsi="Times New Roman" w:cs="Times New Roman" w:hint="eastAsia"/>
-              </w:rPr>
-              <w:t>Special Requirements</w:t>
-            </w:r>
-          </w:p>
-        </w:tc>
-        <w:tc>
-          <w:tcPr>
-            <w:tcW w:w="4148" w:type="dxa"/>
-          </w:tcPr>
-          <w:p>
-            <w:pPr>
-              <w:rPr>
-                <w:rFonts w:ascii="Times New Roman" w:eastAsia="標楷體" w:hAnsi="Times New Roman" w:cs="Times New Roman"/>
-              </w:rPr>
-            </w:pPr>
-            <w:r>
-              <w:rPr>
-                <w:rFonts w:ascii="Times New Roman" w:eastAsia="標楷體" w:hAnsi="Times New Roman" w:cs="Times New Roman" w:hint="eastAsia"/>
-              </w:rPr>
-              <w:t>支援「批次處理」功能，確保賣家能一次性分類多</w:t>
-            </w:r>
-            <w:r>
-              <w:rPr>
-                <w:rFonts w:ascii="Times New Roman" w:eastAsia="標楷體" w:hAnsi="Times New Roman" w:cs="Times New Roman" w:hint="eastAsia"/>
-              </w:rPr>
-              <w:t>件商品</w:t>
-            </w:r>
-            <w:r>
-              <w:rPr>
-                <w:rFonts w:ascii="Times New Roman" w:eastAsia="標楷體" w:hAnsi="Times New Roman" w:cs="Times New Roman" w:hint="eastAsia"/>
-              </w:rPr>
-              <w:t>，減少重複動作。</w:t>
-            </w:r>
-          </w:p>
-        </w:tc>
-      </w:tr>
-      <w:tr>
-        <w:tc>
-          <w:tcPr>
-            <w:tcW w:w="4148" w:type="dxa"/>
-          </w:tcPr>
-          <w:p>
-            <w:pPr>
-              <w:rPr>
-                <w:rFonts w:ascii="Times New Roman" w:eastAsia="標楷體" w:hAnsi="Times New Roman" w:cs="Times New Roman"/>
-              </w:rPr>
-            </w:pPr>
-            <w:r>
-              <w:rPr>
-                <w:rFonts w:ascii="Times New Roman" w:eastAsia="標楷體" w:hAnsi="Times New Roman" w:cs="Times New Roman" w:hint="eastAsia"/>
-              </w:rPr>
-              <w:t>Technology and Data Variations List</w:t>
-            </w:r>
-          </w:p>
-        </w:tc>
-        <w:tc>
-          <w:tcPr>
-            <w:tcW w:w="4148" w:type="dxa"/>
-          </w:tcPr>
-          <w:p>
-            <w:pPr>
-              <w:rPr>
-                <w:rFonts w:ascii="Times New Roman" w:eastAsia="標楷體" w:hAnsi="Times New Roman" w:cs="Times New Roman"/>
-              </w:rPr>
-            </w:pPr>
-            <w:r>
-              <w:rPr>
-                <w:rFonts w:ascii="Times New Roman" w:eastAsia="標楷體" w:hAnsi="Times New Roman" w:cs="Times New Roman" w:hint="eastAsia"/>
-              </w:rPr>
-              <w:t>系統應預設基礎分類（如：</w:t>
-            </w:r>
-            <w:r>
-              <w:rPr>
-                <w:rFonts w:ascii="Times New Roman" w:eastAsia="標楷體" w:hAnsi="Times New Roman" w:cs="Times New Roman" w:hint="eastAsia"/>
-              </w:rPr>
-              <w:t xml:space="preserve">ISBN </w:t>
-            </w:r>
-            <w:r>
-              <w:rPr>
-                <w:rFonts w:ascii="Times New Roman" w:eastAsia="標楷體" w:hAnsi="Times New Roman" w:cs="Times New Roman" w:hint="eastAsia"/>
-              </w:rPr>
-              <w:t>自動帶入的類別），並允許賣家自定義標籤（</w:t>
-            </w:r>
-            <w:r>
-              <w:rPr>
-                <w:rFonts w:ascii="Times New Roman" w:eastAsia="標楷體" w:hAnsi="Times New Roman" w:cs="Times New Roman" w:hint="eastAsia"/>
-              </w:rPr>
-              <w:t>Tag</w:t>
-            </w:r>
-            <w:r>
-              <w:rPr>
-                <w:rFonts w:ascii="Times New Roman" w:eastAsia="標楷體" w:hAnsi="Times New Roman" w:cs="Times New Roman" w:hint="eastAsia"/>
-              </w:rPr>
-              <w:t>）進行更彈性的管理。</w:t>
-            </w:r>
-          </w:p>
-        </w:tc>
-      </w:tr>
-      <w:tr>
-        <w:tc>
-          <w:tcPr>
-            <w:tcW w:w="4148" w:type="dxa"/>
-          </w:tcPr>
-          <w:p>
-            <w:pPr>
-              <w:rPr>
-                <w:rFonts w:ascii="Times New Roman" w:eastAsia="標楷體" w:hAnsi="Times New Roman" w:cs="Times New Roman"/>
-              </w:rPr>
-            </w:pPr>
-            <w:r>
-              <w:rPr>
-                <w:rFonts w:ascii="Times New Roman" w:eastAsia="標楷體" w:hAnsi="Times New Roman" w:cs="Times New Roman" w:hint="eastAsia"/>
-              </w:rPr>
               <w:t>Frequency of Occurrence</w:t>
             </w:r>
           </w:p>
@@ -4760,12 +5334,14 @@
                 <w:rFonts w:ascii="Times New Roman" w:eastAsia="標楷體" w:hAnsi="Times New Roman" w:cs="Times New Roman"/>
               </w:rPr>
             </w:pPr>
+            <w:proofErr w:type="spellStart"/>
             <w:r>
               <w:rPr>
                 <w:rFonts w:ascii="Times New Roman" w:eastAsia="標楷體" w:hAnsi="Times New Roman" w:cs="Times New Roman"/>
               </w:rPr>
               <w:t>Re:Book</w:t>
             </w:r>
+            <w:proofErr w:type="spellEnd"/>
           </w:p>
         </w:tc>
       </w:tr>
@@ -4944,508 +5520,551 @@
               <w:rPr>
                 <w:rFonts w:ascii="Times New Roman" w:eastAsia="標楷體" w:hAnsi="Times New Roman" w:cs="Times New Roman" w:hint="eastAsia"/>
               </w:rPr>
+              <w:t>Preconditions</w:t>
+            </w:r>
+          </w:p>
+        </w:tc>
+        <w:tc>
+          <w:tcPr>
+            <w:tcW w:w="4148" w:type="dxa"/>
+          </w:tcPr>
+          <w:p>
+            <w:pPr>
+              <w:rPr>
+                <w:rFonts w:ascii="Times New Roman" w:eastAsia="標楷體" w:hAnsi="Times New Roman" w:cs="Times New Roman"/>
+              </w:rPr>
+            </w:pPr>
+            <w:r>
+              <w:rPr>
+                <w:rFonts w:ascii="Times New Roman" w:eastAsia="標楷體" w:hAnsi="Times New Roman" w:cs="Times New Roman" w:hint="eastAsia"/>
+              </w:rPr>
+              <w:t>買家必須已登入系統，且系統中存在可選購</w:t>
+            </w:r>
+            <w:r>
+              <w:rPr>
+                <w:rFonts w:ascii="Times New Roman" w:eastAsia="標楷體" w:hAnsi="Times New Roman" w:cs="Times New Roman" w:hint="eastAsia"/>
+              </w:rPr>
+              <w:t>的商品</w:t>
+            </w:r>
+            <w:r>
+              <w:rPr>
+                <w:rFonts w:ascii="Times New Roman" w:eastAsia="標楷體" w:hAnsi="Times New Roman" w:cs="Times New Roman" w:hint="eastAsia"/>
+              </w:rPr>
+              <w:t>。</w:t>
+            </w:r>
+          </w:p>
+        </w:tc>
+      </w:tr>
+      <w:tr>
+        <w:tc>
+          <w:tcPr>
+            <w:tcW w:w="4148" w:type="dxa"/>
+          </w:tcPr>
+          <w:p>
+            <w:pPr>
+              <w:rPr>
+                <w:rFonts w:ascii="Times New Roman" w:eastAsia="標楷體" w:hAnsi="Times New Roman" w:cs="Times New Roman"/>
+              </w:rPr>
+            </w:pPr>
+            <w:r>
+              <w:rPr>
+                <w:rFonts w:ascii="Times New Roman" w:eastAsia="標楷體" w:hAnsi="Times New Roman" w:cs="Times New Roman" w:hint="eastAsia"/>
+              </w:rPr>
+              <w:t>Success Guarantee</w:t>
+            </w:r>
+          </w:p>
+        </w:tc>
+        <w:tc>
+          <w:tcPr>
+            <w:tcW w:w="4148" w:type="dxa"/>
+          </w:tcPr>
+          <w:p>
+            <w:pPr>
+              <w:rPr>
+                <w:rFonts w:ascii="Times New Roman" w:eastAsia="標楷體" w:hAnsi="Times New Roman" w:cs="Times New Roman"/>
+              </w:rPr>
+            </w:pPr>
+            <w:r>
+              <w:rPr>
+                <w:rFonts w:ascii="Times New Roman" w:eastAsia="標楷體" w:hAnsi="Times New Roman" w:cs="Times New Roman" w:hint="eastAsia"/>
+              </w:rPr>
+              <w:t>商品</w:t>
+            </w:r>
+            <w:r>
+              <w:rPr>
+                <w:rFonts w:ascii="Times New Roman" w:eastAsia="標楷體" w:hAnsi="Times New Roman" w:cs="Times New Roman" w:hint="eastAsia"/>
+              </w:rPr>
+              <w:t>成功加入買家的</w:t>
+            </w:r>
+            <w:r>
+              <w:rPr>
+                <w:rFonts w:ascii="Times New Roman" w:eastAsia="標楷體" w:hAnsi="Times New Roman" w:cs="Times New Roman" w:hint="eastAsia"/>
+              </w:rPr>
+              <w:t>購物車</w:t>
+            </w:r>
+            <w:r>
+              <w:rPr>
+                <w:rFonts w:ascii="Times New Roman" w:eastAsia="標楷體" w:hAnsi="Times New Roman" w:cs="Times New Roman" w:hint="eastAsia"/>
+              </w:rPr>
+              <w:t>，且系統能即時反映該書籍的最新狀態（如：是否已被他人買走）。</w:t>
+            </w:r>
+          </w:p>
+        </w:tc>
+      </w:tr>
+      <w:tr>
+        <w:tc>
+          <w:tcPr>
+            <w:tcW w:w="4148" w:type="dxa"/>
+          </w:tcPr>
+          <w:p>
+            <w:pPr>
+              <w:rPr>
+                <w:rFonts w:ascii="Times New Roman" w:eastAsia="標楷體" w:hAnsi="Times New Roman" w:cs="Times New Roman"/>
+              </w:rPr>
+            </w:pPr>
+            <w:r>
+              <w:rPr>
+                <w:rFonts w:ascii="Times New Roman" w:eastAsia="標楷體" w:hAnsi="Times New Roman" w:cs="Times New Roman" w:hint="eastAsia"/>
+              </w:rPr>
+              <w:t>Main Success Scenario</w:t>
+            </w:r>
+          </w:p>
+        </w:tc>
+        <w:tc>
+          <w:tcPr>
+            <w:tcW w:w="4148" w:type="dxa"/>
+          </w:tcPr>
+          <w:p>
+            <w:pPr>
+              <w:rPr>
+                <w:rFonts w:ascii="Times New Roman" w:eastAsia="標楷體" w:hAnsi="Times New Roman" w:cs="Times New Roman"/>
+              </w:rPr>
+            </w:pPr>
+            <w:r>
+              <w:rPr>
+                <w:rFonts w:ascii="Times New Roman" w:eastAsia="標楷體" w:hAnsi="Times New Roman" w:cs="Times New Roman" w:hint="eastAsia"/>
+              </w:rPr>
+              <w:t xml:space="preserve">1. </w:t>
+            </w:r>
+            <w:r>
+              <w:rPr>
+                <w:rFonts w:ascii="Times New Roman" w:eastAsia="標楷體" w:hAnsi="Times New Roman" w:cs="Times New Roman" w:hint="eastAsia"/>
+              </w:rPr>
+              <w:t>買家在搜尋結果或</w:t>
+            </w:r>
+            <w:r>
+              <w:rPr>
+                <w:rFonts w:ascii="Times New Roman" w:eastAsia="標楷體" w:hAnsi="Times New Roman" w:cs="Times New Roman" w:hint="eastAsia"/>
+              </w:rPr>
+              <w:t>商品的</w:t>
+            </w:r>
+            <w:r>
+              <w:rPr>
+                <w:rFonts w:ascii="Times New Roman" w:eastAsia="標楷體" w:hAnsi="Times New Roman" w:cs="Times New Roman" w:hint="eastAsia"/>
+              </w:rPr>
+              <w:t>詳情頁點擊「加入</w:t>
+            </w:r>
+            <w:r>
+              <w:rPr>
+                <w:rFonts w:ascii="Times New Roman" w:eastAsia="標楷體" w:hAnsi="Times New Roman" w:cs="Times New Roman" w:hint="eastAsia"/>
+              </w:rPr>
+              <w:t>購物車</w:t>
+            </w:r>
+            <w:r>
+              <w:rPr>
+                <w:rFonts w:ascii="Times New Roman" w:eastAsia="標楷體" w:hAnsi="Times New Roman" w:cs="Times New Roman" w:hint="eastAsia"/>
+              </w:rPr>
+              <w:t>」</w:t>
+            </w:r>
+            <w:r>
+              <w:rPr>
+                <w:rFonts w:ascii="Times New Roman" w:eastAsia="標楷體" w:hAnsi="Times New Roman" w:cs="Times New Roman" w:hint="eastAsia"/>
+              </w:rPr>
+              <w:t>按鈕</w:t>
+            </w:r>
+            <w:r>
+              <w:rPr>
+                <w:rFonts w:ascii="Times New Roman" w:eastAsia="標楷體" w:hAnsi="Times New Roman" w:cs="Times New Roman" w:hint="eastAsia"/>
+              </w:rPr>
+              <w:t>。</w:t>
+            </w:r>
+          </w:p>
+          <w:p>
+            <w:pPr>
+              <w:rPr>
+                <w:rFonts w:ascii="Times New Roman" w:eastAsia="標楷體" w:hAnsi="Times New Roman" w:cs="Times New Roman"/>
+              </w:rPr>
+            </w:pPr>
+            <w:r>
+              <w:rPr>
+                <w:rFonts w:ascii="Times New Roman" w:eastAsia="標楷體" w:hAnsi="Times New Roman" w:cs="Times New Roman" w:hint="eastAsia"/>
+              </w:rPr>
+              <w:t xml:space="preserve">2. </w:t>
+            </w:r>
+            <w:r>
+              <w:rPr>
+                <w:rFonts w:ascii="Times New Roman" w:eastAsia="標楷體" w:hAnsi="Times New Roman" w:cs="Times New Roman" w:hint="eastAsia"/>
+              </w:rPr>
+              <w:t>系統將該</w:t>
+            </w:r>
+            <w:r>
+              <w:rPr>
+                <w:rFonts w:ascii="Times New Roman" w:eastAsia="標楷體" w:hAnsi="Times New Roman" w:cs="Times New Roman" w:hint="eastAsia"/>
+              </w:rPr>
+              <w:t>商品</w:t>
+            </w:r>
+            <w:r>
+              <w:rPr>
+                <w:rFonts w:ascii="Times New Roman" w:eastAsia="標楷體" w:hAnsi="Times New Roman" w:cs="Times New Roman" w:hint="eastAsia"/>
+              </w:rPr>
+              <w:t>存入買家的「</w:t>
+            </w:r>
+            <w:r>
+              <w:rPr>
+                <w:rFonts w:ascii="Times New Roman" w:eastAsia="標楷體" w:hAnsi="Times New Roman" w:cs="Times New Roman" w:hint="eastAsia"/>
+              </w:rPr>
+              <w:t>購物車</w:t>
+            </w:r>
+            <w:r>
+              <w:rPr>
+                <w:rFonts w:ascii="Times New Roman" w:eastAsia="標楷體" w:hAnsi="Times New Roman" w:cs="Times New Roman" w:hint="eastAsia"/>
+              </w:rPr>
+              <w:t>」中。</w:t>
+            </w:r>
+          </w:p>
+          <w:p>
+            <w:pPr>
+              <w:rPr>
+                <w:rFonts w:ascii="Times New Roman" w:eastAsia="標楷體" w:hAnsi="Times New Roman" w:cs="Times New Roman"/>
+              </w:rPr>
+            </w:pPr>
+            <w:r>
+              <w:rPr>
+                <w:rFonts w:ascii="Times New Roman" w:eastAsia="標楷體" w:hAnsi="Times New Roman" w:cs="Times New Roman" w:hint="eastAsia"/>
+              </w:rPr>
+              <w:t xml:space="preserve">3. </w:t>
+            </w:r>
+            <w:r>
+              <w:rPr>
+                <w:rFonts w:ascii="Times New Roman" w:eastAsia="標楷體" w:hAnsi="Times New Roman" w:cs="Times New Roman" w:hint="eastAsia"/>
+              </w:rPr>
+              <w:t>買家進入</w:t>
+            </w:r>
+            <w:r>
+              <w:rPr>
+                <w:rFonts w:ascii="Times New Roman" w:eastAsia="標楷體" w:hAnsi="Times New Roman" w:cs="Times New Roman" w:hint="eastAsia"/>
+              </w:rPr>
+              <w:t>購物車</w:t>
+            </w:r>
+            <w:r>
+              <w:rPr>
+                <w:rFonts w:ascii="Times New Roman" w:eastAsia="標楷體" w:hAnsi="Times New Roman" w:cs="Times New Roman" w:hint="eastAsia"/>
+              </w:rPr>
+              <w:t>頁面，查看所有已收藏的</w:t>
+            </w:r>
+            <w:r>
+              <w:rPr>
+                <w:rFonts w:ascii="Times New Roman" w:eastAsia="標楷體" w:hAnsi="Times New Roman" w:cs="Times New Roman" w:hint="eastAsia"/>
+              </w:rPr>
+              <w:t>商品</w:t>
+            </w:r>
+            <w:r>
+              <w:rPr>
+                <w:rFonts w:ascii="Times New Roman" w:eastAsia="標楷體" w:hAnsi="Times New Roman" w:cs="Times New Roman" w:hint="eastAsia"/>
+              </w:rPr>
+              <w:t>資訊與賣家資訊。</w:t>
+            </w:r>
+          </w:p>
+          <w:p>
+            <w:pPr>
+              <w:rPr>
+                <w:rFonts w:ascii="Times New Roman" w:eastAsia="標楷體" w:hAnsi="Times New Roman" w:cs="Times New Roman"/>
+              </w:rPr>
+            </w:pPr>
+            <w:r>
+              <w:rPr>
+                <w:rFonts w:ascii="Times New Roman" w:eastAsia="標楷體" w:hAnsi="Times New Roman" w:cs="Times New Roman" w:hint="eastAsia"/>
+              </w:rPr>
+              <w:t xml:space="preserve">4. </w:t>
+            </w:r>
+            <w:r>
+              <w:rPr>
+                <w:rFonts w:ascii="Times New Roman" w:eastAsia="標楷體" w:hAnsi="Times New Roman" w:cs="Times New Roman" w:hint="eastAsia"/>
+              </w:rPr>
+              <w:t>買家可從</w:t>
+            </w:r>
+            <w:r>
+              <w:rPr>
+                <w:rFonts w:ascii="Times New Roman" w:eastAsia="標楷體" w:hAnsi="Times New Roman" w:cs="Times New Roman" w:hint="eastAsia"/>
+              </w:rPr>
+              <w:t>購物車頁面</w:t>
+            </w:r>
+            <w:r>
+              <w:rPr>
+                <w:rFonts w:ascii="Times New Roman" w:eastAsia="標楷體" w:hAnsi="Times New Roman" w:cs="Times New Roman" w:hint="eastAsia"/>
+              </w:rPr>
+              <w:t>中直接</w:t>
+            </w:r>
+            <w:r>
+              <w:rPr>
+                <w:rFonts w:ascii="Times New Roman" w:eastAsia="標楷體" w:hAnsi="Times New Roman" w:cs="Times New Roman" w:hint="eastAsia"/>
+              </w:rPr>
+              <w:t>下單或發送私訊給賣家</w:t>
+            </w:r>
+            <w:r>
+              <w:rPr>
+                <w:rFonts w:ascii="Times New Roman" w:eastAsia="標楷體" w:hAnsi="Times New Roman" w:cs="Times New Roman" w:hint="eastAsia"/>
+              </w:rPr>
+              <w:t>。</w:t>
+            </w:r>
+          </w:p>
+        </w:tc>
+      </w:tr>
+      <w:tr>
+        <w:tc>
+          <w:tcPr>
+            <w:tcW w:w="4148" w:type="dxa"/>
+          </w:tcPr>
+          <w:p>
+            <w:pPr>
+              <w:rPr>
+                <w:rFonts w:ascii="Times New Roman" w:eastAsia="標楷體" w:hAnsi="Times New Roman" w:cs="Times New Roman"/>
+              </w:rPr>
+            </w:pPr>
+            <w:r>
+              <w:rPr>
+                <w:rFonts w:ascii="Times New Roman" w:eastAsia="標楷體" w:hAnsi="Times New Roman" w:cs="Times New Roman" w:hint="eastAsia"/>
+              </w:rPr>
+              <w:t>Extensions</w:t>
+            </w:r>
+          </w:p>
+        </w:tc>
+        <w:tc>
+          <w:tcPr>
+            <w:tcW w:w="4148" w:type="dxa"/>
+          </w:tcPr>
+          <w:p>
+            <w:pPr>
+              <w:rPr>
+                <w:rFonts w:ascii="Times New Roman" w:eastAsia="標楷體" w:hAnsi="Times New Roman" w:cs="Times New Roman"/>
+              </w:rPr>
+            </w:pPr>
+            <w:r>
+              <w:rPr>
+                <w:rFonts w:ascii="Times New Roman" w:eastAsia="標楷體" w:hAnsi="Times New Roman" w:cs="Times New Roman" w:hint="eastAsia"/>
+              </w:rPr>
+              <w:t>2</w:t>
+            </w:r>
+            <w:r>
+              <w:rPr>
+                <w:rFonts w:ascii="Times New Roman" w:eastAsia="標楷體" w:hAnsi="Times New Roman" w:cs="Times New Roman" w:hint="eastAsia"/>
+              </w:rPr>
+              <w:t xml:space="preserve">a. </w:t>
+            </w:r>
+            <w:r>
+              <w:rPr>
+                <w:rFonts w:ascii="Times New Roman" w:eastAsia="標楷體" w:hAnsi="Times New Roman" w:cs="Times New Roman" w:hint="eastAsia"/>
+              </w:rPr>
+              <w:t>重複加入：若</w:t>
+            </w:r>
+            <w:r>
+              <w:rPr>
+                <w:rFonts w:ascii="Times New Roman" w:eastAsia="標楷體" w:hAnsi="Times New Roman" w:cs="Times New Roman" w:hint="eastAsia"/>
+              </w:rPr>
+              <w:t>商品</w:t>
+            </w:r>
+            <w:r>
+              <w:rPr>
+                <w:rFonts w:ascii="Times New Roman" w:eastAsia="標楷體" w:hAnsi="Times New Roman" w:cs="Times New Roman" w:hint="eastAsia"/>
+              </w:rPr>
+              <w:t>已在清單中，系統提示不重複加入。</w:t>
+            </w:r>
+            <w:r>
+              <w:rPr>
+                <w:rFonts w:ascii="Times New Roman" w:eastAsia="標楷體" w:hAnsi="Times New Roman" w:cs="Times New Roman"/>
+              </w:rPr>
+              <w:br/>
+            </w:r>
+            <w:r>
+              <w:rPr>
+                <w:rFonts w:ascii="Times New Roman" w:eastAsia="標楷體" w:hAnsi="Times New Roman" w:cs="Times New Roman" w:hint="eastAsia"/>
+              </w:rPr>
+              <w:t>3</w:t>
+            </w:r>
+            <w:r>
+              <w:rPr>
+                <w:rFonts w:ascii="Times New Roman" w:eastAsia="標楷體" w:hAnsi="Times New Roman" w:cs="Times New Roman" w:hint="eastAsia"/>
+              </w:rPr>
+              <w:t xml:space="preserve">a. </w:t>
+            </w:r>
+            <w:r>
+              <w:rPr>
+                <w:rFonts w:ascii="Times New Roman" w:eastAsia="標楷體" w:hAnsi="Times New Roman" w:cs="Times New Roman" w:hint="eastAsia"/>
+              </w:rPr>
+              <w:t>商品</w:t>
+            </w:r>
+            <w:r>
+              <w:rPr>
+                <w:rFonts w:ascii="Times New Roman" w:eastAsia="標楷體" w:hAnsi="Times New Roman" w:cs="Times New Roman" w:hint="eastAsia"/>
+              </w:rPr>
+              <w:t>已下架</w:t>
+            </w:r>
+            <w:r>
+              <w:rPr>
+                <w:rFonts w:ascii="Times New Roman" w:eastAsia="標楷體" w:hAnsi="Times New Roman" w:cs="Times New Roman" w:hint="eastAsia"/>
+              </w:rPr>
+              <w:t>/</w:t>
+            </w:r>
+            <w:r>
+              <w:rPr>
+                <w:rFonts w:ascii="Times New Roman" w:eastAsia="標楷體" w:hAnsi="Times New Roman" w:cs="Times New Roman" w:hint="eastAsia"/>
+              </w:rPr>
+              <w:t>售出：系統提示該商品已失效，並自動從清單中標註或移除。</w:t>
+            </w:r>
+          </w:p>
+          <w:p>
+            <w:pPr>
+              <w:rPr>
+                <w:rFonts w:ascii="Times New Roman" w:eastAsia="標楷體" w:hAnsi="Times New Roman" w:cs="Times New Roman" w:hint="eastAsia"/>
+              </w:rPr>
+            </w:pPr>
+            <w:r>
+              <w:rPr>
+                <w:rFonts w:ascii="Times New Roman" w:eastAsia="標楷體" w:hAnsi="Times New Roman" w:cs="Times New Roman" w:hint="eastAsia"/>
+                <w:highlight w:val="yellow"/>
+              </w:rPr>
+              <w:t>3</w:t>
+            </w:r>
+            <w:r>
+              <w:rPr>
+                <w:rFonts w:ascii="Times New Roman" w:eastAsia="標楷體" w:hAnsi="Times New Roman" w:cs="Times New Roman" w:hint="eastAsia"/>
+                <w:highlight w:val="yellow"/>
+              </w:rPr>
+              <w:t>b</w:t>
+            </w:r>
+            <w:r>
+              <w:rPr>
+                <w:rFonts w:ascii="Times New Roman" w:eastAsia="標楷體" w:hAnsi="Times New Roman" w:cs="Times New Roman" w:hint="eastAsia"/>
+                <w:highlight w:val="yellow"/>
+              </w:rPr>
+              <w:t xml:space="preserve">. </w:t>
+            </w:r>
+            <w:r>
+              <w:rPr>
+                <w:rFonts w:ascii="Times New Roman" w:eastAsia="標楷體" w:hAnsi="Times New Roman" w:cs="Times New Roman" w:hint="eastAsia"/>
+                <w:highlight w:val="yellow"/>
+              </w:rPr>
+              <w:t>移除</w:t>
+            </w:r>
+            <w:r>
+              <w:rPr>
+                <w:rFonts w:ascii="Times New Roman" w:eastAsia="標楷體" w:hAnsi="Times New Roman" w:cs="Times New Roman" w:hint="eastAsia"/>
+                <w:highlight w:val="yellow"/>
+              </w:rPr>
+              <w:t>商品</w:t>
+            </w:r>
+            <w:r>
+              <w:rPr>
+                <w:rFonts w:ascii="Times New Roman" w:eastAsia="標楷體" w:hAnsi="Times New Roman" w:cs="Times New Roman" w:hint="eastAsia"/>
+                <w:highlight w:val="yellow"/>
+              </w:rPr>
+              <w:t>：買家從清單中手動刪除不再感興趣的</w:t>
+            </w:r>
+            <w:r>
+              <w:rPr>
+                <w:rFonts w:ascii="Times New Roman" w:eastAsia="標楷體" w:hAnsi="Times New Roman" w:cs="Times New Roman" w:hint="eastAsia"/>
+                <w:highlight w:val="yellow"/>
+              </w:rPr>
+              <w:t>商品</w:t>
+            </w:r>
+            <w:r>
+              <w:rPr>
+                <w:rFonts w:ascii="Times New Roman" w:eastAsia="標楷體" w:hAnsi="Times New Roman" w:cs="Times New Roman" w:hint="eastAsia"/>
+                <w:highlight w:val="yellow"/>
+              </w:rPr>
+              <w:t>。</w:t>
+            </w:r>
+          </w:p>
+        </w:tc>
+      </w:tr>
+      <w:tr>
+        <w:tc>
+          <w:tcPr>
+            <w:tcW w:w="4148" w:type="dxa"/>
+          </w:tcPr>
+          <w:p>
+            <w:pPr>
+              <w:rPr>
+                <w:rFonts w:ascii="Times New Roman" w:eastAsia="標楷體" w:hAnsi="Times New Roman" w:cs="Times New Roman"/>
+              </w:rPr>
+            </w:pPr>
+            <w:r>
+              <w:rPr>
+                <w:rFonts w:ascii="Times New Roman" w:eastAsia="標楷體" w:hAnsi="Times New Roman" w:cs="Times New Roman" w:hint="eastAsia"/>
+              </w:rPr>
+              <w:t>Special Requirements</w:t>
+            </w:r>
+          </w:p>
+        </w:tc>
+        <w:tc>
+          <w:tcPr>
+            <w:tcW w:w="4148" w:type="dxa"/>
+          </w:tcPr>
+          <w:p>
+            <w:pPr>
+              <w:rPr>
+                <w:rFonts w:ascii="Times New Roman" w:eastAsia="標楷體" w:hAnsi="Times New Roman" w:cs="Times New Roman"/>
+              </w:rPr>
+            </w:pPr>
+            <w:r>
+              <w:rPr>
+                <w:rFonts w:ascii="Times New Roman" w:eastAsia="標楷體" w:hAnsi="Times New Roman" w:cs="Times New Roman" w:hint="eastAsia"/>
+              </w:rPr>
+              <w:t>清單應能即時（</w:t>
+            </w:r>
+            <w:r>
+              <w:rPr>
+                <w:rFonts w:ascii="Times New Roman" w:eastAsia="標楷體" w:hAnsi="Times New Roman" w:cs="Times New Roman" w:hint="eastAsia"/>
+              </w:rPr>
+              <w:t>Real-time</w:t>
+            </w:r>
+            <w:r>
+              <w:rPr>
+                <w:rFonts w:ascii="Times New Roman" w:eastAsia="標楷體" w:hAnsi="Times New Roman" w:cs="Times New Roman" w:hint="eastAsia"/>
+              </w:rPr>
+              <w:t>）同步</w:t>
+            </w:r>
+            <w:r>
+              <w:rPr>
+                <w:rFonts w:ascii="Times New Roman" w:eastAsia="標楷體" w:hAnsi="Times New Roman" w:cs="Times New Roman" w:hint="eastAsia"/>
+              </w:rPr>
+              <w:t>商品</w:t>
+            </w:r>
+            <w:r>
+              <w:rPr>
+                <w:rFonts w:ascii="Times New Roman" w:eastAsia="標楷體" w:hAnsi="Times New Roman" w:cs="Times New Roman" w:hint="eastAsia"/>
+              </w:rPr>
+              <w:t>的銷售狀態。</w:t>
+            </w:r>
+          </w:p>
+        </w:tc>
+      </w:tr>
+      <w:tr>
+        <w:tc>
+          <w:tcPr>
+            <w:tcW w:w="4148" w:type="dxa"/>
+          </w:tcPr>
+          <w:p>
+            <w:pPr>
+              <w:rPr>
+                <w:rFonts w:ascii="Times New Roman" w:eastAsia="標楷體" w:hAnsi="Times New Roman" w:cs="Times New Roman"/>
+              </w:rPr>
+            </w:pPr>
+            <w:r>
+              <w:rPr>
+                <w:rFonts w:ascii="Times New Roman" w:eastAsia="標楷體" w:hAnsi="Times New Roman" w:cs="Times New Roman" w:hint="eastAsia"/>
+              </w:rPr>
               <w:lastRenderedPageBreak/>
-              <w:t>Preconditions</w:t>
-            </w:r>
-          </w:p>
-        </w:tc>
-        <w:tc>
-          <w:tcPr>
-            <w:tcW w:w="4148" w:type="dxa"/>
-          </w:tcPr>
-          <w:p>
-            <w:pPr>
-              <w:rPr>
-                <w:rFonts w:ascii="Times New Roman" w:eastAsia="標楷體" w:hAnsi="Times New Roman" w:cs="Times New Roman"/>
-              </w:rPr>
-            </w:pPr>
-            <w:r>
-              <w:rPr>
-                <w:rFonts w:ascii="Times New Roman" w:eastAsia="標楷體" w:hAnsi="Times New Roman" w:cs="Times New Roman" w:hint="eastAsia"/>
-              </w:rPr>
-              <w:t>買家必須已登入系統，且系統中存在可選購</w:t>
-            </w:r>
-            <w:r>
-              <w:rPr>
-                <w:rFonts w:ascii="Times New Roman" w:eastAsia="標楷體" w:hAnsi="Times New Roman" w:cs="Times New Roman" w:hint="eastAsia"/>
-              </w:rPr>
-              <w:t>的商品</w:t>
-            </w:r>
-            <w:r>
-              <w:rPr>
-                <w:rFonts w:ascii="Times New Roman" w:eastAsia="標楷體" w:hAnsi="Times New Roman" w:cs="Times New Roman" w:hint="eastAsia"/>
-              </w:rPr>
-              <w:t>。</w:t>
-            </w:r>
-          </w:p>
-        </w:tc>
-      </w:tr>
-      <w:tr>
-        <w:tc>
-          <w:tcPr>
-            <w:tcW w:w="4148" w:type="dxa"/>
-          </w:tcPr>
-          <w:p>
-            <w:pPr>
-              <w:rPr>
-                <w:rFonts w:ascii="Times New Roman" w:eastAsia="標楷體" w:hAnsi="Times New Roman" w:cs="Times New Roman"/>
-              </w:rPr>
-            </w:pPr>
-            <w:r>
-              <w:rPr>
-                <w:rFonts w:ascii="Times New Roman" w:eastAsia="標楷體" w:hAnsi="Times New Roman" w:cs="Times New Roman" w:hint="eastAsia"/>
-              </w:rPr>
-              <w:t>Success Guarantee</w:t>
-            </w:r>
-          </w:p>
-        </w:tc>
-        <w:tc>
-          <w:tcPr>
-            <w:tcW w:w="4148" w:type="dxa"/>
-          </w:tcPr>
-          <w:p>
-            <w:pPr>
-              <w:rPr>
-                <w:rFonts w:ascii="Times New Roman" w:eastAsia="標楷體" w:hAnsi="Times New Roman" w:cs="Times New Roman"/>
-              </w:rPr>
-            </w:pPr>
-            <w:r>
-              <w:rPr>
-                <w:rFonts w:ascii="Times New Roman" w:eastAsia="標楷體" w:hAnsi="Times New Roman" w:cs="Times New Roman" w:hint="eastAsia"/>
-              </w:rPr>
-              <w:t>商品</w:t>
-            </w:r>
-            <w:r>
-              <w:rPr>
-                <w:rFonts w:ascii="Times New Roman" w:eastAsia="標楷體" w:hAnsi="Times New Roman" w:cs="Times New Roman" w:hint="eastAsia"/>
-              </w:rPr>
-              <w:t>成功加入買家的</w:t>
-            </w:r>
-            <w:r>
-              <w:rPr>
-                <w:rFonts w:ascii="Times New Roman" w:eastAsia="標楷體" w:hAnsi="Times New Roman" w:cs="Times New Roman" w:hint="eastAsia"/>
-              </w:rPr>
-              <w:t>購物車</w:t>
-            </w:r>
-            <w:r>
-              <w:rPr>
-                <w:rFonts w:ascii="Times New Roman" w:eastAsia="標楷體" w:hAnsi="Times New Roman" w:cs="Times New Roman" w:hint="eastAsia"/>
-              </w:rPr>
-              <w:t>，且系統能即時反映該書籍的最新狀態（如：是否已被他人買走）。</w:t>
-            </w:r>
-          </w:p>
-        </w:tc>
-      </w:tr>
-      <w:tr>
-        <w:tc>
-          <w:tcPr>
-            <w:tcW w:w="4148" w:type="dxa"/>
-          </w:tcPr>
-          <w:p>
-            <w:pPr>
-              <w:rPr>
-                <w:rFonts w:ascii="Times New Roman" w:eastAsia="標楷體" w:hAnsi="Times New Roman" w:cs="Times New Roman"/>
-              </w:rPr>
-            </w:pPr>
-            <w:r>
-              <w:rPr>
-                <w:rFonts w:ascii="Times New Roman" w:eastAsia="標楷體" w:hAnsi="Times New Roman" w:cs="Times New Roman" w:hint="eastAsia"/>
-              </w:rPr>
-              <w:t>Main Success Scenario</w:t>
-            </w:r>
-          </w:p>
-        </w:tc>
-        <w:tc>
-          <w:tcPr>
-            <w:tcW w:w="4148" w:type="dxa"/>
-          </w:tcPr>
-          <w:p>
-            <w:pPr>
-              <w:rPr>
-                <w:rFonts w:ascii="Times New Roman" w:eastAsia="標楷體" w:hAnsi="Times New Roman" w:cs="Times New Roman"/>
-              </w:rPr>
-            </w:pPr>
-            <w:r>
-              <w:rPr>
-                <w:rFonts w:ascii="Times New Roman" w:eastAsia="標楷體" w:hAnsi="Times New Roman" w:cs="Times New Roman" w:hint="eastAsia"/>
-              </w:rPr>
-              <w:t xml:space="preserve">1. </w:t>
-            </w:r>
-            <w:r>
-              <w:rPr>
-                <w:rFonts w:ascii="Times New Roman" w:eastAsia="標楷體" w:hAnsi="Times New Roman" w:cs="Times New Roman" w:hint="eastAsia"/>
-              </w:rPr>
-              <w:t>買家在搜尋結果或</w:t>
-            </w:r>
-            <w:r>
-              <w:rPr>
-                <w:rFonts w:ascii="Times New Roman" w:eastAsia="標楷體" w:hAnsi="Times New Roman" w:cs="Times New Roman" w:hint="eastAsia"/>
-              </w:rPr>
-              <w:t>商品的</w:t>
-            </w:r>
-            <w:r>
-              <w:rPr>
-                <w:rFonts w:ascii="Times New Roman" w:eastAsia="標楷體" w:hAnsi="Times New Roman" w:cs="Times New Roman" w:hint="eastAsia"/>
-              </w:rPr>
-              <w:t>詳情頁點擊「加入</w:t>
-            </w:r>
-            <w:r>
-              <w:rPr>
-                <w:rFonts w:ascii="Times New Roman" w:eastAsia="標楷體" w:hAnsi="Times New Roman" w:cs="Times New Roman" w:hint="eastAsia"/>
-              </w:rPr>
-              <w:t>購物車</w:t>
-            </w:r>
-            <w:r>
-              <w:rPr>
-                <w:rFonts w:ascii="Times New Roman" w:eastAsia="標楷體" w:hAnsi="Times New Roman" w:cs="Times New Roman" w:hint="eastAsia"/>
-              </w:rPr>
-              <w:t>」</w:t>
-            </w:r>
-            <w:r>
-              <w:rPr>
-                <w:rFonts w:ascii="Times New Roman" w:eastAsia="標楷體" w:hAnsi="Times New Roman" w:cs="Times New Roman" w:hint="eastAsia"/>
-              </w:rPr>
-              <w:t>按鈕</w:t>
-            </w:r>
-            <w:r>
-              <w:rPr>
-                <w:rFonts w:ascii="Times New Roman" w:eastAsia="標楷體" w:hAnsi="Times New Roman" w:cs="Times New Roman" w:hint="eastAsia"/>
-              </w:rPr>
-              <w:t>。</w:t>
-            </w:r>
-          </w:p>
-          <w:p>
-            <w:pPr>
-              <w:rPr>
-                <w:rFonts w:ascii="Times New Roman" w:eastAsia="標楷體" w:hAnsi="Times New Roman" w:cs="Times New Roman"/>
-              </w:rPr>
-            </w:pPr>
-            <w:r>
-              <w:rPr>
-                <w:rFonts w:ascii="Times New Roman" w:eastAsia="標楷體" w:hAnsi="Times New Roman" w:cs="Times New Roman" w:hint="eastAsia"/>
-              </w:rPr>
-              <w:t xml:space="preserve">2. </w:t>
-            </w:r>
-            <w:r>
-              <w:rPr>
-                <w:rFonts w:ascii="Times New Roman" w:eastAsia="標楷體" w:hAnsi="Times New Roman" w:cs="Times New Roman" w:hint="eastAsia"/>
-              </w:rPr>
-              <w:t>系統將該</w:t>
-            </w:r>
-            <w:r>
-              <w:rPr>
-                <w:rFonts w:ascii="Times New Roman" w:eastAsia="標楷體" w:hAnsi="Times New Roman" w:cs="Times New Roman" w:hint="eastAsia"/>
-              </w:rPr>
-              <w:t>商品</w:t>
-            </w:r>
-            <w:r>
-              <w:rPr>
-                <w:rFonts w:ascii="Times New Roman" w:eastAsia="標楷體" w:hAnsi="Times New Roman" w:cs="Times New Roman" w:hint="eastAsia"/>
-              </w:rPr>
-              <w:t>存入買家的「</w:t>
-            </w:r>
-            <w:r>
-              <w:rPr>
-                <w:rFonts w:ascii="Times New Roman" w:eastAsia="標楷體" w:hAnsi="Times New Roman" w:cs="Times New Roman" w:hint="eastAsia"/>
-              </w:rPr>
-              <w:t>購物車</w:t>
-            </w:r>
-            <w:r>
-              <w:rPr>
-                <w:rFonts w:ascii="Times New Roman" w:eastAsia="標楷體" w:hAnsi="Times New Roman" w:cs="Times New Roman" w:hint="eastAsia"/>
-              </w:rPr>
-              <w:t>」中。</w:t>
-            </w:r>
-          </w:p>
-          <w:p>
-            <w:pPr>
-              <w:rPr>
-                <w:rFonts w:ascii="Times New Roman" w:eastAsia="標楷體" w:hAnsi="Times New Roman" w:cs="Times New Roman"/>
-              </w:rPr>
-            </w:pPr>
-            <w:r>
-              <w:rPr>
-                <w:rFonts w:ascii="Times New Roman" w:eastAsia="標楷體" w:hAnsi="Times New Roman" w:cs="Times New Roman" w:hint="eastAsia"/>
-              </w:rPr>
-              <w:t xml:space="preserve">3. </w:t>
-            </w:r>
-            <w:r>
-              <w:rPr>
-                <w:rFonts w:ascii="Times New Roman" w:eastAsia="標楷體" w:hAnsi="Times New Roman" w:cs="Times New Roman" w:hint="eastAsia"/>
-              </w:rPr>
-              <w:t>買家進入</w:t>
-            </w:r>
-            <w:r>
-              <w:rPr>
-                <w:rFonts w:ascii="Times New Roman" w:eastAsia="標楷體" w:hAnsi="Times New Roman" w:cs="Times New Roman" w:hint="eastAsia"/>
-              </w:rPr>
-              <w:t>購物車</w:t>
-            </w:r>
-            <w:r>
-              <w:rPr>
-                <w:rFonts w:ascii="Times New Roman" w:eastAsia="標楷體" w:hAnsi="Times New Roman" w:cs="Times New Roman" w:hint="eastAsia"/>
-              </w:rPr>
-              <w:t>頁面，查看所有已收藏的</w:t>
-            </w:r>
-            <w:r>
-              <w:rPr>
-                <w:rFonts w:ascii="Times New Roman" w:eastAsia="標楷體" w:hAnsi="Times New Roman" w:cs="Times New Roman" w:hint="eastAsia"/>
-              </w:rPr>
-              <w:t>商品</w:t>
-            </w:r>
-            <w:r>
-              <w:rPr>
-                <w:rFonts w:ascii="Times New Roman" w:eastAsia="標楷體" w:hAnsi="Times New Roman" w:cs="Times New Roman" w:hint="eastAsia"/>
-              </w:rPr>
-              <w:t>資訊與賣家資訊。</w:t>
-            </w:r>
-          </w:p>
-          <w:p>
-            <w:pPr>
-              <w:rPr>
-                <w:rFonts w:ascii="Times New Roman" w:eastAsia="標楷體" w:hAnsi="Times New Roman" w:cs="Times New Roman"/>
-              </w:rPr>
-            </w:pPr>
-            <w:r>
-              <w:rPr>
-                <w:rFonts w:ascii="Times New Roman" w:eastAsia="標楷體" w:hAnsi="Times New Roman" w:cs="Times New Roman" w:hint="eastAsia"/>
-              </w:rPr>
-              <w:t xml:space="preserve">4. </w:t>
-            </w:r>
-            <w:r>
-              <w:rPr>
-                <w:rFonts w:ascii="Times New Roman" w:eastAsia="標楷體" w:hAnsi="Times New Roman" w:cs="Times New Roman" w:hint="eastAsia"/>
-              </w:rPr>
-              <w:t>買家可從</w:t>
-            </w:r>
-            <w:r>
-              <w:rPr>
-                <w:rFonts w:ascii="Times New Roman" w:eastAsia="標楷體" w:hAnsi="Times New Roman" w:cs="Times New Roman" w:hint="eastAsia"/>
-              </w:rPr>
-              <w:t>購物車頁面</w:t>
-            </w:r>
-            <w:r>
-              <w:rPr>
-                <w:rFonts w:ascii="Times New Roman" w:eastAsia="標楷體" w:hAnsi="Times New Roman" w:cs="Times New Roman" w:hint="eastAsia"/>
-              </w:rPr>
-              <w:t>中直接發起私訊或進行最終確認。</w:t>
-            </w:r>
-          </w:p>
-        </w:tc>
-      </w:tr>
-      <w:tr>
-        <w:tc>
-          <w:tcPr>
-            <w:tcW w:w="4148" w:type="dxa"/>
-          </w:tcPr>
-          <w:p>
-            <w:pPr>
-              <w:rPr>
-                <w:rFonts w:ascii="Times New Roman" w:eastAsia="標楷體" w:hAnsi="Times New Roman" w:cs="Times New Roman"/>
-              </w:rPr>
-            </w:pPr>
-            <w:r>
-              <w:rPr>
-                <w:rFonts w:ascii="Times New Roman" w:eastAsia="標楷體" w:hAnsi="Times New Roman" w:cs="Times New Roman" w:hint="eastAsia"/>
-              </w:rPr>
-              <w:t>Extensions</w:t>
-            </w:r>
-          </w:p>
-        </w:tc>
-        <w:tc>
-          <w:tcPr>
-            <w:tcW w:w="4148" w:type="dxa"/>
-          </w:tcPr>
-          <w:p>
-            <w:pPr>
-              <w:rPr>
-                <w:rFonts w:ascii="Times New Roman" w:eastAsia="標楷體" w:hAnsi="Times New Roman" w:cs="Times New Roman"/>
-              </w:rPr>
-            </w:pPr>
-            <w:r>
-              <w:rPr>
-                <w:rFonts w:ascii="Times New Roman" w:eastAsia="標楷體" w:hAnsi="Times New Roman" w:cs="Times New Roman" w:hint="eastAsia"/>
-              </w:rPr>
-              <w:t xml:space="preserve">2a. </w:t>
-            </w:r>
-            <w:r>
-              <w:rPr>
-                <w:rFonts w:ascii="Times New Roman" w:eastAsia="標楷體" w:hAnsi="Times New Roman" w:cs="Times New Roman" w:hint="eastAsia"/>
-              </w:rPr>
-              <w:t>商品</w:t>
-            </w:r>
-            <w:r>
-              <w:rPr>
-                <w:rFonts w:ascii="Times New Roman" w:eastAsia="標楷體" w:hAnsi="Times New Roman" w:cs="Times New Roman" w:hint="eastAsia"/>
-              </w:rPr>
-              <w:t>已下架</w:t>
-            </w:r>
-            <w:r>
-              <w:rPr>
-                <w:rFonts w:ascii="Times New Roman" w:eastAsia="標楷體" w:hAnsi="Times New Roman" w:cs="Times New Roman" w:hint="eastAsia"/>
-              </w:rPr>
-              <w:t>/</w:t>
-            </w:r>
-            <w:r>
-              <w:rPr>
-                <w:rFonts w:ascii="Times New Roman" w:eastAsia="標楷體" w:hAnsi="Times New Roman" w:cs="Times New Roman" w:hint="eastAsia"/>
-              </w:rPr>
-              <w:t>售出：系統提示該商品已失效，並自動從清單中標註或移除。</w:t>
-            </w:r>
-          </w:p>
-          <w:p>
-            <w:pPr>
-              <w:rPr>
-                <w:rFonts w:ascii="Times New Roman" w:eastAsia="標楷體" w:hAnsi="Times New Roman" w:cs="Times New Roman"/>
-              </w:rPr>
-            </w:pPr>
-            <w:r>
-              <w:rPr>
-                <w:rFonts w:ascii="Times New Roman" w:eastAsia="標楷體" w:hAnsi="Times New Roman" w:cs="Times New Roman" w:hint="eastAsia"/>
-              </w:rPr>
-              <w:t xml:space="preserve">3a. </w:t>
-            </w:r>
-            <w:r>
-              <w:rPr>
-                <w:rFonts w:ascii="Times New Roman" w:eastAsia="標楷體" w:hAnsi="Times New Roman" w:cs="Times New Roman" w:hint="eastAsia"/>
-              </w:rPr>
-              <w:t>移除</w:t>
-            </w:r>
-            <w:r>
-              <w:rPr>
-                <w:rFonts w:ascii="Times New Roman" w:eastAsia="標楷體" w:hAnsi="Times New Roman" w:cs="Times New Roman" w:hint="eastAsia"/>
-              </w:rPr>
-              <w:t>商品</w:t>
-            </w:r>
-            <w:r>
-              <w:rPr>
-                <w:rFonts w:ascii="Times New Roman" w:eastAsia="標楷體" w:hAnsi="Times New Roman" w:cs="Times New Roman" w:hint="eastAsia"/>
-              </w:rPr>
-              <w:t>：買家從清單中手動刪除不再感興趣的</w:t>
-            </w:r>
-            <w:r>
-              <w:rPr>
-                <w:rFonts w:ascii="Times New Roman" w:eastAsia="標楷體" w:hAnsi="Times New Roman" w:cs="Times New Roman" w:hint="eastAsia"/>
-              </w:rPr>
-              <w:t>商品</w:t>
-            </w:r>
-            <w:r>
-              <w:rPr>
-                <w:rFonts w:ascii="Times New Roman" w:eastAsia="標楷體" w:hAnsi="Times New Roman" w:cs="Times New Roman" w:hint="eastAsia"/>
-              </w:rPr>
-              <w:t>。</w:t>
-            </w:r>
-          </w:p>
-          <w:p>
-            <w:pPr>
-              <w:rPr>
-                <w:rFonts w:ascii="Times New Roman" w:eastAsia="標楷體" w:hAnsi="Times New Roman" w:cs="Times New Roman"/>
-              </w:rPr>
-            </w:pPr>
-            <w:r>
-              <w:rPr>
-                <w:rFonts w:ascii="Times New Roman" w:eastAsia="標楷體" w:hAnsi="Times New Roman" w:cs="Times New Roman" w:hint="eastAsia"/>
-              </w:rPr>
-              <w:t xml:space="preserve">4a. </w:t>
-            </w:r>
-            <w:r>
-              <w:rPr>
-                <w:rFonts w:ascii="Times New Roman" w:eastAsia="標楷體" w:hAnsi="Times New Roman" w:cs="Times New Roman" w:hint="eastAsia"/>
-              </w:rPr>
-              <w:t>重複加入：若</w:t>
-            </w:r>
-            <w:r>
-              <w:rPr>
-                <w:rFonts w:ascii="Times New Roman" w:eastAsia="標楷體" w:hAnsi="Times New Roman" w:cs="Times New Roman" w:hint="eastAsia"/>
-              </w:rPr>
-              <w:t>商品</w:t>
-            </w:r>
-            <w:r>
-              <w:rPr>
-                <w:rFonts w:ascii="Times New Roman" w:eastAsia="標楷體" w:hAnsi="Times New Roman" w:cs="Times New Roman" w:hint="eastAsia"/>
-              </w:rPr>
-              <w:t>已在清單中，系統提示不重複加入。</w:t>
-            </w:r>
-          </w:p>
-        </w:tc>
-      </w:tr>
-      <w:tr>
-        <w:tc>
-          <w:tcPr>
-            <w:tcW w:w="4148" w:type="dxa"/>
-          </w:tcPr>
-          <w:p>
-            <w:pPr>
-              <w:rPr>
-                <w:rFonts w:ascii="Times New Roman" w:eastAsia="標楷體" w:hAnsi="Times New Roman" w:cs="Times New Roman"/>
-              </w:rPr>
-            </w:pPr>
-            <w:r>
-              <w:rPr>
-                <w:rFonts w:ascii="Times New Roman" w:eastAsia="標楷體" w:hAnsi="Times New Roman" w:cs="Times New Roman" w:hint="eastAsia"/>
-              </w:rPr>
-              <w:t>Special Requirements</w:t>
-            </w:r>
-          </w:p>
-        </w:tc>
-        <w:tc>
-          <w:tcPr>
-            <w:tcW w:w="4148" w:type="dxa"/>
-          </w:tcPr>
-          <w:p>
-            <w:pPr>
-              <w:rPr>
-                <w:rFonts w:ascii="Times New Roman" w:eastAsia="標楷體" w:hAnsi="Times New Roman" w:cs="Times New Roman"/>
-              </w:rPr>
-            </w:pPr>
-            <w:r>
-              <w:rPr>
-                <w:rFonts w:ascii="Times New Roman" w:eastAsia="標楷體" w:hAnsi="Times New Roman" w:cs="Times New Roman" w:hint="eastAsia"/>
-              </w:rPr>
-              <w:t>清單應能即時（</w:t>
-            </w:r>
-            <w:r>
-              <w:rPr>
-                <w:rFonts w:ascii="Times New Roman" w:eastAsia="標楷體" w:hAnsi="Times New Roman" w:cs="Times New Roman" w:hint="eastAsia"/>
-              </w:rPr>
-              <w:t>Real-time</w:t>
-            </w:r>
-            <w:r>
-              <w:rPr>
-                <w:rFonts w:ascii="Times New Roman" w:eastAsia="標楷體" w:hAnsi="Times New Roman" w:cs="Times New Roman" w:hint="eastAsia"/>
-              </w:rPr>
-              <w:t>）同步</w:t>
-            </w:r>
-            <w:r>
-              <w:rPr>
-                <w:rFonts w:ascii="Times New Roman" w:eastAsia="標楷體" w:hAnsi="Times New Roman" w:cs="Times New Roman" w:hint="eastAsia"/>
-              </w:rPr>
-              <w:t>商品</w:t>
-            </w:r>
-            <w:r>
-              <w:rPr>
-                <w:rFonts w:ascii="Times New Roman" w:eastAsia="標楷體" w:hAnsi="Times New Roman" w:cs="Times New Roman" w:hint="eastAsia"/>
-              </w:rPr>
-              <w:t>的銷售狀態。</w:t>
-            </w:r>
-          </w:p>
-        </w:tc>
-      </w:tr>
-      <w:tr>
-        <w:tc>
-          <w:tcPr>
-            <w:tcW w:w="4148" w:type="dxa"/>
-          </w:tcPr>
-          <w:p>
-            <w:pPr>
-              <w:rPr>
-                <w:rFonts w:ascii="Times New Roman" w:eastAsia="標楷體" w:hAnsi="Times New Roman" w:cs="Times New Roman"/>
-              </w:rPr>
-            </w:pPr>
-            <w:r>
-              <w:rPr>
-                <w:rFonts w:ascii="Times New Roman" w:eastAsia="標楷體" w:hAnsi="Times New Roman" w:cs="Times New Roman" w:hint="eastAsia"/>
-              </w:rPr>
               <w:t>Technology and Data Variations List</w:t>
             </w:r>
           </w:p>
@@ -5955,38 +6574,19 @@
               <w:rPr>
                 <w:rFonts w:ascii="Times New Roman" w:eastAsia="標楷體" w:hAnsi="Times New Roman" w:cs="Times New Roman" w:hint="eastAsia"/>
               </w:rPr>
-              <w:t>系統需支援高達</w:t>
-            </w:r>
-            <w:r>
-              <w:rPr>
-                <w:rFonts w:ascii="Times New Roman" w:eastAsia="標楷體" w:hAnsi="Times New Roman" w:cs="Times New Roman" w:hint="eastAsia"/>
-              </w:rPr>
-              <w:t xml:space="preserve"> 100 </w:t>
-            </w:r>
-            <w:r>
-              <w:rPr>
-                <w:rFonts w:ascii="Times New Roman" w:eastAsia="標楷體" w:hAnsi="Times New Roman" w:cs="Times New Roman" w:hint="eastAsia"/>
-              </w:rPr>
-              <w:t>名使用者同時在線</w:t>
-            </w:r>
-            <w:r>
-              <w:rPr>
-                <w:rFonts w:ascii="Times New Roman" w:eastAsia="標楷體" w:hAnsi="Times New Roman" w:cs="Times New Roman" w:hint="eastAsia"/>
-              </w:rPr>
-              <w:lastRenderedPageBreak/>
-              <w:t>（</w:t>
-            </w:r>
-            <w:r>
-              <w:rPr>
-                <w:rFonts w:ascii="Times New Roman" w:eastAsia="標楷體" w:hAnsi="Times New Roman" w:cs="Times New Roman" w:hint="eastAsia"/>
-              </w:rPr>
-              <w:t>Concurrent users</w:t>
-            </w:r>
-            <w:r>
-              <w:rPr>
-                <w:rFonts w:ascii="Times New Roman" w:eastAsia="標楷體" w:hAnsi="Times New Roman" w:cs="Times New Roman" w:hint="eastAsia"/>
-              </w:rPr>
-              <w:t>），且效能不得降低。</w:t>
+              <w:t>系統需支援</w:t>
+            </w:r>
+            <w:r>
+              <w:rPr>
+                <w:rFonts w:ascii="Times New Roman" w:eastAsia="標楷體" w:hAnsi="Times New Roman" w:cs="Times New Roman" w:hint="eastAsia"/>
+              </w:rPr>
+              <w:t>100</w:t>
+            </w:r>
+            <w:r>
+              <w:rPr>
+                <w:rFonts w:ascii="Times New Roman" w:eastAsia="標楷體" w:hAnsi="Times New Roman" w:cs="Times New Roman" w:hint="eastAsia"/>
+              </w:rPr>
+              <w:t>名使用者同時在線，且效能不得降低。</w:t>
             </w:r>
           </w:p>
         </w:tc>
@@ -6006,7 +6606,6 @@
               <w:rPr>
                 <w:rFonts w:ascii="Times New Roman" w:eastAsia="標楷體" w:hAnsi="Times New Roman" w:cs="Times New Roman"/>
               </w:rPr>
-              <w:lastRenderedPageBreak/>
               <w:t>NFR-</w:t>
             </w:r>
             <w:r>
@@ -6049,19 +6648,7 @@
               <w:rPr>
                 <w:rFonts w:ascii="Times New Roman" w:eastAsia="標楷體" w:hAnsi="Times New Roman" w:cs="Times New Roman" w:hint="eastAsia"/>
               </w:rPr>
-              <w:t>系統的正常運行時間（</w:t>
-            </w:r>
-            <w:r>
-              <w:rPr>
-                <w:rFonts w:ascii="Times New Roman" w:eastAsia="標楷體" w:hAnsi="Times New Roman" w:cs="Times New Roman" w:hint="eastAsia"/>
-              </w:rPr>
-              <w:t>Uptime</w:t>
-            </w:r>
-            <w:r>
-              <w:rPr>
-                <w:rFonts w:ascii="Times New Roman" w:eastAsia="標楷體" w:hAnsi="Times New Roman" w:cs="Times New Roman" w:hint="eastAsia"/>
-              </w:rPr>
-              <w:t>）應至少達到</w:t>
+              <w:t>系統的正常運行時間應至少達到</w:t>
             </w:r>
             <w:r>
               <w:rPr>
@@ -6196,18 +6783,30 @@
             <w:r>
               <w:rPr>
                 <w:rFonts w:ascii="Times New Roman" w:eastAsia="標楷體" w:hAnsi="Times New Roman" w:cs="Times New Roman" w:hint="eastAsia"/>
+                <w:highlight w:val="yellow"/>
               </w:rPr>
               <w:t>系統必須要求使用有效的學校電子郵件信箱（例如</w:t>
             </w:r>
             <w:r>
               <w:rPr>
                 <w:rFonts w:ascii="Times New Roman" w:eastAsia="標楷體" w:hAnsi="Times New Roman" w:cs="Times New Roman" w:hint="eastAsia"/>
-              </w:rPr>
-              <w:t xml:space="preserve"> .edu </w:t>
-            </w:r>
-            <w:r>
-              <w:rPr>
-                <w:rFonts w:ascii="Times New Roman" w:eastAsia="標楷體" w:hAnsi="Times New Roman" w:cs="Times New Roman" w:hint="eastAsia"/>
+                <w:highlight w:val="yellow"/>
+              </w:rPr>
+              <w:t>.</w:t>
+            </w:r>
+            <w:proofErr w:type="spellStart"/>
+            <w:r>
+              <w:rPr>
+                <w:rFonts w:ascii="Times New Roman" w:eastAsia="標楷體" w:hAnsi="Times New Roman" w:cs="Times New Roman" w:hint="eastAsia"/>
+                <w:highlight w:val="yellow"/>
+              </w:rPr>
+              <w:t>edu</w:t>
+            </w:r>
+            <w:proofErr w:type="spellEnd"/>
+            <w:r>
+              <w:rPr>
+                <w:rFonts w:ascii="Times New Roman" w:eastAsia="標楷體" w:hAnsi="Times New Roman" w:cs="Times New Roman" w:hint="eastAsia"/>
+                <w:highlight w:val="yellow"/>
               </w:rPr>
               <w:t>網域）進行身分驗證註冊。</w:t>
             </w:r>
@@ -6271,19 +6870,7 @@
               <w:rPr>
                 <w:rFonts w:ascii="Times New Roman" w:eastAsia="標楷體" w:hAnsi="Times New Roman" w:cs="Times New Roman" w:hint="eastAsia"/>
               </w:rPr>
-              <w:t>系統介面需支援響應式設計（</w:t>
-            </w:r>
-            <w:r>
-              <w:rPr>
-                <w:rFonts w:ascii="Times New Roman" w:eastAsia="標楷體" w:hAnsi="Times New Roman" w:cs="Times New Roman" w:hint="eastAsia"/>
-              </w:rPr>
-              <w:t>Responsive Design</w:t>
-            </w:r>
-            <w:r>
-              <w:rPr>
-                <w:rFonts w:ascii="Times New Roman" w:eastAsia="標楷體" w:hAnsi="Times New Roman" w:cs="Times New Roman" w:hint="eastAsia"/>
-              </w:rPr>
-              <w:t>），以相容桌上型電腦、平板電腦和智慧型手機等多種裝置。</w:t>
+              <w:t>系統介面需支援響應式設計，以相容桌上型電腦、平板電腦和智慧型手機等多種裝置。</w:t>
             </w:r>
           </w:p>
         </w:tc>
@@ -6357,19 +6944,7 @@
               <w:rPr>
                 <w:rFonts w:ascii="Times New Roman" w:eastAsia="標楷體" w:hAnsi="Times New Roman" w:cs="Times New Roman" w:hint="eastAsia"/>
               </w:rPr>
-              <w:t>程式碼的測試覆蓋率（</w:t>
-            </w:r>
-            <w:r>
-              <w:rPr>
-                <w:rFonts w:ascii="Times New Roman" w:eastAsia="標楷體" w:hAnsi="Times New Roman" w:cs="Times New Roman" w:hint="eastAsia"/>
-              </w:rPr>
-              <w:t>Code coverage</w:t>
-            </w:r>
-            <w:r>
-              <w:rPr>
-                <w:rFonts w:ascii="Times New Roman" w:eastAsia="標楷體" w:hAnsi="Times New Roman" w:cs="Times New Roman" w:hint="eastAsia"/>
-              </w:rPr>
-              <w:t>）應至少達到</w:t>
+              <w:t>程式碼的測試覆蓋率應至少達到</w:t>
             </w:r>
             <w:r>
               <w:rPr>
@@ -6433,7 +7008,7 @@
           <w:p>
             <w:pPr>
               <w:rPr>
-                <w:rFonts w:ascii="Times New Roman" w:eastAsia="標楷體" w:hAnsi="Times New Roman" w:cs="Times New Roman" w:hint="eastAsia"/>
+                <w:rFonts w:ascii="Times New Roman" w:eastAsia="標楷體" w:hAnsi="Times New Roman" w:cs="Times New Roman"/>
               </w:rPr>
             </w:pPr>
             <w:r>
@@ -6463,7 +7038,7 @@
           <w:p>
             <w:pPr>
               <w:rPr>
-                <w:rFonts w:ascii="Times New Roman" w:eastAsia="標楷體" w:hAnsi="Times New Roman" w:cs="Times New Roman" w:hint="eastAsia"/>
+                <w:rFonts w:ascii="Times New Roman" w:eastAsia="標楷體" w:hAnsi="Times New Roman" w:cs="Times New Roman"/>
               </w:rPr>
             </w:pPr>
             <w:r>
@@ -6495,7 +7070,7 @@
           <w:p>
             <w:pPr>
               <w:rPr>
-                <w:rFonts w:ascii="Times New Roman" w:eastAsia="標楷體" w:hAnsi="Times New Roman" w:cs="Times New Roman" w:hint="eastAsia"/>
+                <w:rFonts w:ascii="Times New Roman" w:eastAsia="標楷體" w:hAnsi="Times New Roman" w:cs="Times New Roman"/>
               </w:rPr>
             </w:pPr>
             <w:r>
@@ -6513,7 +7088,7 @@
           <w:p>
             <w:pPr>
               <w:rPr>
-                <w:rFonts w:ascii="Times New Roman" w:eastAsia="標楷體" w:hAnsi="Times New Roman" w:cs="Times New Roman" w:hint="eastAsia"/>
+                <w:rFonts w:ascii="Times New Roman" w:eastAsia="標楷體" w:hAnsi="Times New Roman" w:cs="Times New Roman"/>
               </w:rPr>
             </w:pPr>
             <w:r>
@@ -6532,19 +7107,19 @@
               <w:rPr>
                 <w:rFonts w:ascii="Times New Roman" w:eastAsia="標楷體" w:hAnsi="Times New Roman" w:cs="Times New Roman"/>
               </w:rPr>
-              <w:t xml:space="preserve"> 10 </w:t>
-            </w:r>
-            <w:r>
-              <w:rPr>
-                <w:rFonts w:ascii="Times New Roman" w:eastAsia="標楷體" w:hAnsi="Times New Roman" w:cs="Times New Roman"/>
-              </w:rPr>
-              <w:t>位或</w:t>
-            </w:r>
-            <w:r>
-              <w:rPr>
-                <w:rFonts w:ascii="Times New Roman" w:eastAsia="標楷體" w:hAnsi="Times New Roman" w:cs="Times New Roman"/>
-              </w:rPr>
-              <w:t xml:space="preserve"> 13 </w:t>
+              <w:t>10</w:t>
+            </w:r>
+            <w:r>
+              <w:rPr>
+                <w:rFonts w:ascii="Times New Roman" w:eastAsia="標楷體" w:hAnsi="Times New Roman" w:cs="Times New Roman"/>
+              </w:rPr>
+              <w:t>或</w:t>
+            </w:r>
+            <w:r>
+              <w:rPr>
+                <w:rFonts w:ascii="Times New Roman" w:eastAsia="標楷體" w:hAnsi="Times New Roman" w:cs="Times New Roman"/>
+              </w:rPr>
+              <w:t>13</w:t>
             </w:r>
             <w:r>
               <w:rPr>
@@ -6563,7 +7138,7 @@
           <w:p>
             <w:pPr>
               <w:rPr>
-                <w:rFonts w:ascii="Times New Roman" w:eastAsia="標楷體" w:hAnsi="Times New Roman" w:cs="Times New Roman" w:hint="eastAsia"/>
+                <w:rFonts w:ascii="Times New Roman" w:eastAsia="標楷體" w:hAnsi="Times New Roman" w:cs="Times New Roman"/>
               </w:rPr>
             </w:pPr>
             <w:r>
@@ -6593,7 +7168,7 @@
           <w:p>
             <w:pPr>
               <w:rPr>
-                <w:rFonts w:ascii="Times New Roman" w:eastAsia="標楷體" w:hAnsi="Times New Roman" w:cs="Times New Roman" w:hint="eastAsia"/>
+                <w:rFonts w:ascii="Times New Roman" w:eastAsia="標楷體" w:hAnsi="Times New Roman" w:cs="Times New Roman"/>
               </w:rPr>
             </w:pPr>
             <w:r>
@@ -6612,7 +7187,14 @@
               <w:rPr>
                 <w:rFonts w:ascii="Times New Roman" w:eastAsia="標楷體" w:hAnsi="Times New Roman" w:cs="Times New Roman"/>
               </w:rPr>
-              <w:t>，包含該書籍的價格、書況、照片與所在地點等資訊。</w:t>
+              <w:t>，包含該書籍的價</w:t>
+            </w:r>
+            <w:r>
+              <w:rPr>
+                <w:rFonts w:ascii="Times New Roman" w:eastAsia="標楷體" w:hAnsi="Times New Roman" w:cs="Times New Roman"/>
+              </w:rPr>
+              <w:lastRenderedPageBreak/>
+              <w:t>格、書況、照片與所在地點等資訊。</w:t>
             </w:r>
           </w:p>
         </w:tc>
@@ -6625,13 +7207,14 @@
           <w:p>
             <w:pPr>
               <w:rPr>
-                <w:rFonts w:ascii="Times New Roman" w:eastAsia="標楷體" w:hAnsi="Times New Roman" w:cs="Times New Roman" w:hint="eastAsia"/>
-              </w:rPr>
-            </w:pPr>
-            <w:r>
-              <w:rPr>
-                <w:rFonts w:ascii="Times New Roman" w:eastAsia="標楷體" w:hAnsi="Times New Roman" w:cs="Times New Roman" w:hint="eastAsia"/>
-              </w:rPr>
+                <w:rFonts w:ascii="Times New Roman" w:eastAsia="標楷體" w:hAnsi="Times New Roman" w:cs="Times New Roman"/>
+              </w:rPr>
+            </w:pPr>
+            <w:r>
+              <w:rPr>
+                <w:rFonts w:ascii="Times New Roman" w:eastAsia="標楷體" w:hAnsi="Times New Roman" w:cs="Times New Roman" w:hint="eastAsia"/>
+              </w:rPr>
+              <w:lastRenderedPageBreak/>
               <w:t>使用者</w:t>
             </w:r>
           </w:p>
@@ -6643,7 +7226,7 @@
           <w:p>
             <w:pPr>
               <w:rPr>
-                <w:rFonts w:ascii="Times New Roman" w:eastAsia="標楷體" w:hAnsi="Times New Roman" w:cs="Times New Roman" w:hint="eastAsia"/>
+                <w:rFonts w:ascii="Times New Roman" w:eastAsia="標楷體" w:hAnsi="Times New Roman" w:cs="Times New Roman"/>
               </w:rPr>
             </w:pPr>
             <w:r>
@@ -6669,7 +7252,7 @@
           <w:p>
             <w:pPr>
               <w:rPr>
-                <w:rFonts w:ascii="Times New Roman" w:eastAsia="標楷體" w:hAnsi="Times New Roman" w:cs="Times New Roman" w:hint="eastAsia"/>
+                <w:rFonts w:ascii="Times New Roman" w:eastAsia="標楷體" w:hAnsi="Times New Roman" w:cs="Times New Roman"/>
               </w:rPr>
             </w:pPr>
             <w:r>
@@ -6687,7 +7270,7 @@
           <w:p>
             <w:pPr>
               <w:rPr>
-                <w:rFonts w:ascii="Times New Roman" w:eastAsia="標楷體" w:hAnsi="Times New Roman" w:cs="Times New Roman" w:hint="eastAsia"/>
+                <w:rFonts w:ascii="Times New Roman" w:eastAsia="標楷體" w:hAnsi="Times New Roman" w:cs="Times New Roman"/>
               </w:rPr>
             </w:pPr>
             <w:r>
@@ -6707,7 +7290,7 @@
           <w:p>
             <w:pPr>
               <w:rPr>
-                <w:rFonts w:ascii="Times New Roman" w:eastAsia="標楷體" w:hAnsi="Times New Roman" w:cs="Times New Roman" w:hint="eastAsia"/>
+                <w:rFonts w:ascii="Times New Roman" w:eastAsia="標楷體" w:hAnsi="Times New Roman" w:cs="Times New Roman"/>
               </w:rPr>
             </w:pPr>
             <w:r>
@@ -6725,7 +7308,7 @@
           <w:p>
             <w:pPr>
               <w:rPr>
-                <w:rFonts w:ascii="Times New Roman" w:eastAsia="標楷體" w:hAnsi="Times New Roman" w:cs="Times New Roman" w:hint="eastAsia"/>
+                <w:rFonts w:ascii="Times New Roman" w:eastAsia="標楷體" w:hAnsi="Times New Roman" w:cs="Times New Roman"/>
               </w:rPr>
             </w:pPr>
             <w:r>
@@ -6766,20 +7349,6 @@
       <w:pPr>
         <w:rPr>
           <w:rFonts w:ascii="Times New Roman" w:eastAsia="標楷體" w:hAnsi="Times New Roman" w:cs="Times New Roman" w:hint="eastAsia"/>
-        </w:rPr>
-      </w:pPr>
-    </w:p>
-    <w:p>
-      <w:pPr>
-        <w:rPr>
-          <w:rFonts w:ascii="Times New Roman" w:eastAsia="標楷體" w:hAnsi="Times New Roman" w:cs="Times New Roman"/>
-        </w:rPr>
-      </w:pPr>
-    </w:p>
-    <w:p>
-      <w:pPr>
-        <w:rPr>
-          <w:rFonts w:ascii="Times New Roman" w:eastAsia="標楷體" w:hAnsi="Times New Roman" w:cs="Times New Roman"/>
         </w:rPr>
       </w:pPr>
     </w:p>
@@ -6915,7 +7484,7 @@
 </file>
 
 <file path=word/endnotes.xml><?xml version="1.0" encoding="utf-8"?>
-<w:endnotes xmlns:wpc="http://schemas.microsoft.com/office/word/2010/wordprocessingCanvas" xmlns:cx="http://schemas.microsoft.com/office/drawing/2014/chartex" xmlns:cx1="http://schemas.microsoft.com/office/drawing/2015/9/8/chartex" xmlns:cx2="http://schemas.microsoft.com/office/drawing/2015/10/21/chartex" xmlns:cx3="http://schemas.microsoft.com/office/drawing/2016/5/9/chartex" xmlns:cx4="http://schemas.microsoft.com/office/drawing/2016/5/10/chartex" xmlns:cx5="http://schemas.microsoft.com/office/drawing/2016/5/11/chartex" xmlns:cx6="http://schemas.microsoft.com/office/drawing/2016/5/12/chartex" xmlns:cx7="http://schemas.microsoft.com/office/drawing/2016/5/13/chartex" xmlns:cx8="http://schemas.microsoft.com/office/drawing/2016/5/14/chartex" xmlns:mc="http://schemas.openxmlformats.org/markup-compatibility/2006" xmlns:aink="http://schemas.microsoft.com/office/drawing/2016/ink" xmlns:am3d="http://schemas.microsoft.com/office/drawing/2017/model3d" xmlns:o="urn:schemas-microsoft-com:office:office" xmlns:oel="http://schemas.microsoft.com/office/2019/extlst" xmlns:r="http://schemas.openxmlformats.org/officeDocument/2006/relationships" xmlns:m="http://schemas.openxmlformats.org/officeDocument/2006/math" xmlns:v="urn:schemas-microsoft-com:vml" xmlns:wp14="http://schemas.microsoft.com/office/word/2010/wordprocessingDrawing" xmlns:wp="http://schemas.openxmlformats.org/drawingml/2006/wordprocessingDrawing" xmlns:w10="urn:schemas-microsoft-com:office:word" xmlns:w="http://schemas.openxmlformats.org/wordprocessingml/2006/main" xmlns:w14="http://schemas.microsoft.com/office/word/2010/wordml" xmlns:w15="http://schemas.microsoft.com/office/word/2012/wordml" xmlns:w16cex="http://schemas.microsoft.com/office/word/2018/wordml/cex" xmlns:w16cid="http://schemas.microsoft.com/office/word/2016/wordml/cid" xmlns:w16="http://schemas.microsoft.com/office/word/2018/wordml" xmlns:w16du="http://schemas.microsoft.com/office/word/2023/wordml/word16du" xmlns:w16sdtdh="http://schemas.microsoft.com/office/word/2020/wordml/sdtdatahash" xmlns:w16sdtfl="http://schemas.microsoft.com/office/word/2024/wordml/sdtformatlock" xmlns:w16se="http://schemas.microsoft.com/office/word/2015/wordml/symex" xmlns:wpg="http://schemas.microsoft.com/office/word/2010/wordprocessingGroup" xmlns:wpi="http://schemas.microsoft.com/office/word/2010/wordprocessingInk" xmlns:wne="http://schemas.microsoft.com/office/word/2006/wordml" xmlns:wps="http://schemas.microsoft.com/office/word/2010/wordprocessingShape" mc:Ignorable="w14 w15 w16se w16cid w16 w16cex w16sdtdh w16sdtfl w16du wp14">
+<w:endnotes xmlns:wpc="http://schemas.microsoft.com/office/word/2010/wordprocessingCanvas" xmlns:cx="http://schemas.microsoft.com/office/drawing/2014/chartex" xmlns:cx1="http://schemas.microsoft.com/office/drawing/2015/9/8/chartex" xmlns:cx2="http://schemas.microsoft.com/office/drawing/2015/10/21/chartex" xmlns:cx3="http://schemas.microsoft.com/office/drawing/2016/5/9/chartex" xmlns:cx4="http://schemas.microsoft.com/office/drawing/2016/5/10/chartex" xmlns:cx5="http://schemas.microsoft.com/office/drawing/2016/5/11/chartex" xmlns:cx6="http://schemas.microsoft.com/office/drawing/2016/5/12/chartex" xmlns:cx7="http://schemas.microsoft.com/office/drawing/2016/5/13/chartex" xmlns:cx8="http://schemas.microsoft.com/office/drawing/2016/5/14/chartex" xmlns:mc="http://schemas.openxmlformats.org/markup-compatibility/2006" xmlns:aink="http://schemas.microsoft.com/office/drawing/2016/ink" xmlns:am3d="http://schemas.microsoft.com/office/drawing/2017/model3d" xmlns:o="urn:schemas-microsoft-com:office:office" xmlns:oel="http://schemas.microsoft.com/office/2019/extlst" xmlns:r="http://schemas.openxmlformats.org/officeDocument/2006/relationships" xmlns:m="http://schemas.openxmlformats.org/officeDocument/2006/math" xmlns:v="urn:schemas-microsoft-com:vml" xmlns:wp14="http://schemas.microsoft.com/office/word/2010/wordprocessingDrawing" xmlns:wp="http://schemas.openxmlformats.org/drawingml/2006/wordprocessingDrawing" xmlns:w10="urn:schemas-microsoft-com:office:word" xmlns:w="http://schemas.openxmlformats.org/wordprocessingml/2006/main" xmlns:w14="http://schemas.microsoft.com/office/word/2010/wordml" xmlns:w15="http://schemas.microsoft.com/office/word/2012/wordml" xmlns:w16cex="http://schemas.microsoft.com/office/word/2018/wordml/cex" xmlns:w16cid="http://schemas.microsoft.com/office/word/2016/wordml/cid" xmlns:w16="http://schemas.microsoft.com/office/word/2018/wordml" xmlns:w16sdtdh="http://schemas.microsoft.com/office/word/2020/wordml/sdtdatahash" xmlns:w16se="http://schemas.microsoft.com/office/word/2015/wordml/symex" xmlns:wpg="http://schemas.microsoft.com/office/word/2010/wordprocessingGroup" xmlns:wpi="http://schemas.microsoft.com/office/word/2010/wordprocessingInk" xmlns:wne="http://schemas.microsoft.com/office/word/2006/wordml" xmlns:wps="http://schemas.microsoft.com/office/word/2010/wordprocessingShape" mc:Ignorable="w14 w15 w16se w16cid w16 w16cex w16sdtdh wp14">
   <w:endnote w:type="separator" w:id="-1">
     <w:p>
       <w:pPr>
@@ -6940,7 +7509,7 @@
 </file>
 
 <file path=word/footnotes.xml><?xml version="1.0" encoding="utf-8"?>
-<w:footnotes xmlns:wpc="http://schemas.microsoft.com/office/word/2010/wordprocessingCanvas" xmlns:cx="http://schemas.microsoft.com/office/drawing/2014/chartex" xmlns:cx1="http://schemas.microsoft.com/office/drawing/2015/9/8/chartex" xmlns:cx2="http://schemas.microsoft.com/office/drawing/2015/10/21/chartex" xmlns:cx3="http://schemas.microsoft.com/office/drawing/2016/5/9/chartex" xmlns:cx4="http://schemas.microsoft.com/office/drawing/2016/5/10/chartex" xmlns:cx5="http://schemas.microsoft.com/office/drawing/2016/5/11/chartex" xmlns:cx6="http://schemas.microsoft.com/office/drawing/2016/5/12/chartex" xmlns:cx7="http://schemas.microsoft.com/office/drawing/2016/5/13/chartex" xmlns:cx8="http://schemas.microsoft.com/office/drawing/2016/5/14/chartex" xmlns:mc="http://schemas.openxmlformats.org/markup-compatibility/2006" xmlns:aink="http://schemas.microsoft.com/office/drawing/2016/ink" xmlns:am3d="http://schemas.microsoft.com/office/drawing/2017/model3d" xmlns:o="urn:schemas-microsoft-com:office:office" xmlns:oel="http://schemas.microsoft.com/office/2019/extlst" xmlns:r="http://schemas.openxmlformats.org/officeDocument/2006/relationships" xmlns:m="http://schemas.openxmlformats.org/officeDocument/2006/math" xmlns:v="urn:schemas-microsoft-com:vml" xmlns:wp14="http://schemas.microsoft.com/office/word/2010/wordprocessingDrawing" xmlns:wp="http://schemas.openxmlformats.org/drawingml/2006/wordprocessingDrawing" xmlns:w10="urn:schemas-microsoft-com:office:word" xmlns:w="http://schemas.openxmlformats.org/wordprocessingml/2006/main" xmlns:w14="http://schemas.microsoft.com/office/word/2010/wordml" xmlns:w15="http://schemas.microsoft.com/office/word/2012/wordml" xmlns:w16cex="http://schemas.microsoft.com/office/word/2018/wordml/cex" xmlns:w16cid="http://schemas.microsoft.com/office/word/2016/wordml/cid" xmlns:w16="http://schemas.microsoft.com/office/word/2018/wordml" xmlns:w16du="http://schemas.microsoft.com/office/word/2023/wordml/word16du" xmlns:w16sdtdh="http://schemas.microsoft.com/office/word/2020/wordml/sdtdatahash" xmlns:w16sdtfl="http://schemas.microsoft.com/office/word/2024/wordml/sdtformatlock" xmlns:w16se="http://schemas.microsoft.com/office/word/2015/wordml/symex" xmlns:wpg="http://schemas.microsoft.com/office/word/2010/wordprocessingGroup" xmlns:wpi="http://schemas.microsoft.com/office/word/2010/wordprocessingInk" xmlns:wne="http://schemas.microsoft.com/office/word/2006/wordml" xmlns:wps="http://schemas.microsoft.com/office/word/2010/wordprocessingShape" mc:Ignorable="w14 w15 w16se w16cid w16 w16cex w16sdtdh w16sdtfl w16du wp14">
+<w:footnotes xmlns:wpc="http://schemas.microsoft.com/office/word/2010/wordprocessingCanvas" xmlns:cx="http://schemas.microsoft.com/office/drawing/2014/chartex" xmlns:cx1="http://schemas.microsoft.com/office/drawing/2015/9/8/chartex" xmlns:cx2="http://schemas.microsoft.com/office/drawing/2015/10/21/chartex" xmlns:cx3="http://schemas.microsoft.com/office/drawing/2016/5/9/chartex" xmlns:cx4="http://schemas.microsoft.com/office/drawing/2016/5/10/chartex" xmlns:cx5="http://schemas.microsoft.com/office/drawing/2016/5/11/chartex" xmlns:cx6="http://schemas.microsoft.com/office/drawing/2016/5/12/chartex" xmlns:cx7="http://schemas.microsoft.com/office/drawing/2016/5/13/chartex" xmlns:cx8="http://schemas.microsoft.com/office/drawing/2016/5/14/chartex" xmlns:mc="http://schemas.openxmlformats.org/markup-compatibility/2006" xmlns:aink="http://schemas.microsoft.com/office/drawing/2016/ink" xmlns:am3d="http://schemas.microsoft.com/office/drawing/2017/model3d" xmlns:o="urn:schemas-microsoft-com:office:office" xmlns:oel="http://schemas.microsoft.com/office/2019/extlst" xmlns:r="http://schemas.openxmlformats.org/officeDocument/2006/relationships" xmlns:m="http://schemas.openxmlformats.org/officeDocument/2006/math" xmlns:v="urn:schemas-microsoft-com:vml" xmlns:wp14="http://schemas.microsoft.com/office/word/2010/wordprocessingDrawing" xmlns:wp="http://schemas.openxmlformats.org/drawingml/2006/wordprocessingDrawing" xmlns:w10="urn:schemas-microsoft-com:office:word" xmlns:w="http://schemas.openxmlformats.org/wordprocessingml/2006/main" xmlns:w14="http://schemas.microsoft.com/office/word/2010/wordml" xmlns:w15="http://schemas.microsoft.com/office/word/2012/wordml" xmlns:w16cex="http://schemas.microsoft.com/office/word/2018/wordml/cex" xmlns:w16cid="http://schemas.microsoft.com/office/word/2016/wordml/cid" xmlns:w16="http://schemas.microsoft.com/office/word/2018/wordml" xmlns:w16sdtdh="http://schemas.microsoft.com/office/word/2020/wordml/sdtdatahash" xmlns:w16se="http://schemas.microsoft.com/office/word/2015/wordml/symex" xmlns:wpg="http://schemas.microsoft.com/office/word/2010/wordprocessingGroup" xmlns:wpi="http://schemas.microsoft.com/office/word/2010/wordprocessingInk" xmlns:wne="http://schemas.microsoft.com/office/word/2006/wordml" xmlns:wps="http://schemas.microsoft.com/office/word/2010/wordprocessingShape" mc:Ignorable="w14 w15 w16se w16cid w16 w16cex w16sdtdh wp14">
   <w:footnote w:type="separator" w:id="-1">
     <w:p>
       <w:pPr>
@@ -6965,18 +7534,18 @@
 </file>
 
 <file path=word/numbering.xml><?xml version="1.0" encoding="utf-8"?>
-<w:numbering xmlns:wpc="http://schemas.microsoft.com/office/word/2010/wordprocessingCanvas" xmlns:cx="http://schemas.microsoft.com/office/drawing/2014/chartex" xmlns:cx1="http://schemas.microsoft.com/office/drawing/2015/9/8/chartex" xmlns:cx2="http://schemas.microsoft.com/office/drawing/2015/10/21/chartex" xmlns:cx3="http://schemas.microsoft.com/office/drawing/2016/5/9/chartex" xmlns:cx4="http://schemas.microsoft.com/office/drawing/2016/5/10/chartex" xmlns:cx5="http://schemas.microsoft.com/office/drawing/2016/5/11/chartex" xmlns:cx6="http://schemas.microsoft.com/office/drawing/2016/5/12/chartex" xmlns:cx7="http://schemas.microsoft.com/office/drawing/2016/5/13/chartex" xmlns:cx8="http://schemas.microsoft.com/office/drawing/2016/5/14/chartex" xmlns:mc="http://schemas.openxmlformats.org/markup-compatibility/2006" xmlns:aink="http://schemas.microsoft.com/office/drawing/2016/ink" xmlns:am3d="http://schemas.microsoft.com/office/drawing/2017/model3d" xmlns:o="urn:schemas-microsoft-com:office:office" xmlns:oel="http://schemas.microsoft.com/office/2019/extlst" xmlns:r="http://schemas.openxmlformats.org/officeDocument/2006/relationships" xmlns:m="http://schemas.openxmlformats.org/officeDocument/2006/math" xmlns:v="urn:schemas-microsoft-com:vml" xmlns:wp14="http://schemas.microsoft.com/office/word/2010/wordprocessingDrawing" xmlns:wp="http://schemas.openxmlformats.org/drawingml/2006/wordprocessingDrawing" xmlns:w10="urn:schemas-microsoft-com:office:word" xmlns:w="http://schemas.openxmlformats.org/wordprocessingml/2006/main" xmlns:w14="http://schemas.microsoft.com/office/word/2010/wordml" xmlns:w15="http://schemas.microsoft.com/office/word/2012/wordml" xmlns:w16cex="http://schemas.microsoft.com/office/word/2018/wordml/cex" xmlns:w16cid="http://schemas.microsoft.com/office/word/2016/wordml/cid" xmlns:w16="http://schemas.microsoft.com/office/word/2018/wordml" xmlns:w16du="http://schemas.microsoft.com/office/word/2023/wordml/word16du" xmlns:w16sdtdh="http://schemas.microsoft.com/office/word/2020/wordml/sdtdatahash" xmlns:w16sdtfl="http://schemas.microsoft.com/office/word/2024/wordml/sdtformatlock" xmlns:w16se="http://schemas.microsoft.com/office/word/2015/wordml/symex" xmlns:wpg="http://schemas.microsoft.com/office/word/2010/wordprocessingGroup" xmlns:wpi="http://schemas.microsoft.com/office/word/2010/wordprocessingInk" xmlns:wne="http://schemas.microsoft.com/office/word/2006/wordml" xmlns:wps="http://schemas.microsoft.com/office/word/2010/wordprocessingShape" mc:Ignorable="w14 w15 w16se w16cid w16 w16cex w16sdtdh w16sdtfl w16du wp14">
+<w:numbering xmlns:wpc="http://schemas.microsoft.com/office/word/2010/wordprocessingCanvas" xmlns:cx="http://schemas.microsoft.com/office/drawing/2014/chartex" xmlns:cx1="http://schemas.microsoft.com/office/drawing/2015/9/8/chartex" xmlns:cx2="http://schemas.microsoft.com/office/drawing/2015/10/21/chartex" xmlns:cx3="http://schemas.microsoft.com/office/drawing/2016/5/9/chartex" xmlns:cx4="http://schemas.microsoft.com/office/drawing/2016/5/10/chartex" xmlns:cx5="http://schemas.microsoft.com/office/drawing/2016/5/11/chartex" xmlns:cx6="http://schemas.microsoft.com/office/drawing/2016/5/12/chartex" xmlns:cx7="http://schemas.microsoft.com/office/drawing/2016/5/13/chartex" xmlns:cx8="http://schemas.microsoft.com/office/drawing/2016/5/14/chartex" xmlns:mc="http://schemas.openxmlformats.org/markup-compatibility/2006" xmlns:aink="http://schemas.microsoft.com/office/drawing/2016/ink" xmlns:am3d="http://schemas.microsoft.com/office/drawing/2017/model3d" xmlns:o="urn:schemas-microsoft-com:office:office" xmlns:oel="http://schemas.microsoft.com/office/2019/extlst" xmlns:r="http://schemas.openxmlformats.org/officeDocument/2006/relationships" xmlns:m="http://schemas.openxmlformats.org/officeDocument/2006/math" xmlns:v="urn:schemas-microsoft-com:vml" xmlns:wp14="http://schemas.microsoft.com/office/word/2010/wordprocessingDrawing" xmlns:wp="http://schemas.openxmlformats.org/drawingml/2006/wordprocessingDrawing" xmlns:w10="urn:schemas-microsoft-com:office:word" xmlns:w="http://schemas.openxmlformats.org/wordprocessingml/2006/main" xmlns:w14="http://schemas.microsoft.com/office/word/2010/wordml" xmlns:w15="http://schemas.microsoft.com/office/word/2012/wordml" xmlns:w16cex="http://schemas.microsoft.com/office/word/2018/wordml/cex" xmlns:w16cid="http://schemas.microsoft.com/office/word/2016/wordml/cid" xmlns:w16="http://schemas.microsoft.com/office/word/2018/wordml" xmlns:w16sdtdh="http://schemas.microsoft.com/office/word/2020/wordml/sdtdatahash" xmlns:w16se="http://schemas.microsoft.com/office/word/2015/wordml/symex" xmlns:wpg="http://schemas.microsoft.com/office/word/2010/wordprocessingGroup" xmlns:wpi="http://schemas.microsoft.com/office/word/2010/wordprocessingInk" xmlns:wne="http://schemas.microsoft.com/office/word/2006/wordml" xmlns:wps="http://schemas.microsoft.com/office/word/2010/wordprocessingShape" mc:Ignorable="w14 w15 w16se w16cid w16 w16cex w16sdtdh wp14">
   <w:abstractNum w:abstractNumId="0" w15:restartNumberingAfterBreak="0">
-    <w:nsid w:val="1F397696"/>
+    <w:nsid w:val="0E237A54"/>
     <w:multiLevelType w:val="hybridMultilevel"/>
-    <w:tmpl w:val="24763604"/>
-    <w:lvl w:ilvl="0" w:tplc="4C665A28">
+    <w:tmpl w:val="EE5AA63C"/>
+    <w:lvl w:ilvl="0" w:tplc="7892E1D2">
       <w:start w:val="1"/>
       <w:numFmt w:val="decimal"/>
       <w:lvlText w:val="%1."/>
       <w:lvlJc w:val="left"/>
       <w:pPr>
-        <w:ind w:left="360" w:hanging="360"/>
+        <w:ind w:left="840" w:hanging="360"/>
       </w:pPr>
       <w:rPr>
         <w:rFonts w:hint="default"/>
@@ -6988,7 +7557,7 @@
       <w:lvlText w:val="%2、"/>
       <w:lvlJc w:val="left"/>
       <w:pPr>
-        <w:ind w:left="960" w:hanging="480"/>
+        <w:ind w:left="1440" w:hanging="480"/>
       </w:pPr>
     </w:lvl>
     <w:lvl w:ilvl="2" w:tplc="0409001B" w:tentative="1">
@@ -6997,7 +7566,7 @@
       <w:lvlText w:val="%3."/>
       <w:lvlJc w:val="right"/>
       <w:pPr>
-        <w:ind w:left="1440" w:hanging="480"/>
+        <w:ind w:left="1920" w:hanging="480"/>
       </w:pPr>
     </w:lvl>
     <w:lvl w:ilvl="3" w:tplc="0409000F" w:tentative="1">
@@ -7006,7 +7575,7 @@
       <w:lvlText w:val="%4."/>
       <w:lvlJc w:val="left"/>
       <w:pPr>
-        <w:ind w:left="1920" w:hanging="480"/>
+        <w:ind w:left="2400" w:hanging="480"/>
       </w:pPr>
     </w:lvl>
     <w:lvl w:ilvl="4" w:tplc="04090019" w:tentative="1">
@@ -7015,7 +7584,7 @@
       <w:lvlText w:val="%5、"/>
       <w:lvlJc w:val="left"/>
       <w:pPr>
-        <w:ind w:left="2400" w:hanging="480"/>
+        <w:ind w:left="2880" w:hanging="480"/>
       </w:pPr>
     </w:lvl>
     <w:lvl w:ilvl="5" w:tplc="0409001B" w:tentative="1">
@@ -7024,7 +7593,7 @@
       <w:lvlText w:val="%6."/>
       <w:lvlJc w:val="right"/>
       <w:pPr>
-        <w:ind w:left="2880" w:hanging="480"/>
+        <w:ind w:left="3360" w:hanging="480"/>
       </w:pPr>
     </w:lvl>
     <w:lvl w:ilvl="6" w:tplc="0409000F" w:tentative="1">
@@ -7033,7 +7602,7 @@
       <w:lvlText w:val="%7."/>
       <w:lvlJc w:val="left"/>
       <w:pPr>
-        <w:ind w:left="3360" w:hanging="480"/>
+        <w:ind w:left="3840" w:hanging="480"/>
       </w:pPr>
     </w:lvl>
     <w:lvl w:ilvl="7" w:tplc="04090019" w:tentative="1">
@@ -7042,7 +7611,7 @@
       <w:lvlText w:val="%8、"/>
       <w:lvlJc w:val="left"/>
       <w:pPr>
-        <w:ind w:left="3840" w:hanging="480"/>
+        <w:ind w:left="4320" w:hanging="480"/>
       </w:pPr>
     </w:lvl>
     <w:lvl w:ilvl="8" w:tplc="0409001B" w:tentative="1">
@@ -7051,11 +7620,100 @@
       <w:lvlText w:val="%9."/>
       <w:lvlJc w:val="right"/>
       <w:pPr>
-        <w:ind w:left="4320" w:hanging="480"/>
+        <w:ind w:left="4800" w:hanging="480"/>
       </w:pPr>
     </w:lvl>
   </w:abstractNum>
   <w:abstractNum w:abstractNumId="1" w15:restartNumberingAfterBreak="0">
+    <w:nsid w:val="1F397696"/>
+    <w:multiLevelType w:val="hybridMultilevel"/>
+    <w:tmpl w:val="24763604"/>
+    <w:lvl w:ilvl="0" w:tplc="4C665A28">
+      <w:start w:val="1"/>
+      <w:numFmt w:val="decimal"/>
+      <w:lvlText w:val="%1."/>
+      <w:lvlJc w:val="left"/>
+      <w:pPr>
+        <w:ind w:left="360" w:hanging="360"/>
+      </w:pPr>
+      <w:rPr>
+        <w:rFonts w:hint="default"/>
+      </w:rPr>
+    </w:lvl>
+    <w:lvl w:ilvl="1" w:tplc="04090019" w:tentative="1">
+      <w:start w:val="1"/>
+      <w:numFmt w:val="ideographTraditional"/>
+      <w:lvlText w:val="%2、"/>
+      <w:lvlJc w:val="left"/>
+      <w:pPr>
+        <w:ind w:left="960" w:hanging="480"/>
+      </w:pPr>
+    </w:lvl>
+    <w:lvl w:ilvl="2" w:tplc="0409001B" w:tentative="1">
+      <w:start w:val="1"/>
+      <w:numFmt w:val="lowerRoman"/>
+      <w:lvlText w:val="%3."/>
+      <w:lvlJc w:val="right"/>
+      <w:pPr>
+        <w:ind w:left="1440" w:hanging="480"/>
+      </w:pPr>
+    </w:lvl>
+    <w:lvl w:ilvl="3" w:tplc="0409000F" w:tentative="1">
+      <w:start w:val="1"/>
+      <w:numFmt w:val="decimal"/>
+      <w:lvlText w:val="%4."/>
+      <w:lvlJc w:val="left"/>
+      <w:pPr>
+        <w:ind w:left="1920" w:hanging="480"/>
+      </w:pPr>
+    </w:lvl>
+    <w:lvl w:ilvl="4" w:tplc="04090019" w:tentative="1">
+      <w:start w:val="1"/>
+      <w:numFmt w:val="ideographTraditional"/>
+      <w:lvlText w:val="%5、"/>
+      <w:lvlJc w:val="left"/>
+      <w:pPr>
+        <w:ind w:left="2400" w:hanging="480"/>
+      </w:pPr>
+    </w:lvl>
+    <w:lvl w:ilvl="5" w:tplc="0409001B" w:tentative="1">
+      <w:start w:val="1"/>
+      <w:numFmt w:val="lowerRoman"/>
+      <w:lvlText w:val="%6."/>
+      <w:lvlJc w:val="right"/>
+      <w:pPr>
+        <w:ind w:left="2880" w:hanging="480"/>
+      </w:pPr>
+    </w:lvl>
+    <w:lvl w:ilvl="6" w:tplc="0409000F" w:tentative="1">
+      <w:start w:val="1"/>
+      <w:numFmt w:val="decimal"/>
+      <w:lvlText w:val="%7."/>
+      <w:lvlJc w:val="left"/>
+      <w:pPr>
+        <w:ind w:left="3360" w:hanging="480"/>
+      </w:pPr>
+    </w:lvl>
+    <w:lvl w:ilvl="7" w:tplc="04090019" w:tentative="1">
+      <w:start w:val="1"/>
+      <w:numFmt w:val="ideographTraditional"/>
+      <w:lvlText w:val="%8、"/>
+      <w:lvlJc w:val="left"/>
+      <w:pPr>
+        <w:ind w:left="3840" w:hanging="480"/>
+      </w:pPr>
+    </w:lvl>
+    <w:lvl w:ilvl="8" w:tplc="0409001B" w:tentative="1">
+      <w:start w:val="1"/>
+      <w:numFmt w:val="lowerRoman"/>
+      <w:lvlText w:val="%9."/>
+      <w:lvlJc w:val="right"/>
+      <w:pPr>
+        <w:ind w:left="4320" w:hanging="480"/>
+      </w:pPr>
+    </w:lvl>
+  </w:abstractNum>
+  <w:abstractNum w:abstractNumId="2" w15:restartNumberingAfterBreak="0">
     <w:nsid w:val="261C4754"/>
     <w:multiLevelType w:val="multilevel"/>
     <w:tmpl w:val="42008736"/>
@@ -7168,7 +7826,96 @@
       </w:rPr>
     </w:lvl>
   </w:abstractNum>
-  <w:abstractNum w:abstractNumId="2" w15:restartNumberingAfterBreak="0">
+  <w:abstractNum w:abstractNumId="3" w15:restartNumberingAfterBreak="0">
+    <w:nsid w:val="310300D0"/>
+    <w:multiLevelType w:val="hybridMultilevel"/>
+    <w:tmpl w:val="B03EA8F6"/>
+    <w:lvl w:ilvl="0" w:tplc="7EAC1608">
+      <w:start w:val="1"/>
+      <w:numFmt w:val="decimal"/>
+      <w:lvlText w:val="%1."/>
+      <w:lvlJc w:val="left"/>
+      <w:pPr>
+        <w:ind w:left="840" w:hanging="360"/>
+      </w:pPr>
+      <w:rPr>
+        <w:rFonts w:hint="default"/>
+      </w:rPr>
+    </w:lvl>
+    <w:lvl w:ilvl="1" w:tplc="04090019" w:tentative="1">
+      <w:start w:val="1"/>
+      <w:numFmt w:val="ideographTraditional"/>
+      <w:lvlText w:val="%2、"/>
+      <w:lvlJc w:val="left"/>
+      <w:pPr>
+        <w:ind w:left="1440" w:hanging="480"/>
+      </w:pPr>
+    </w:lvl>
+    <w:lvl w:ilvl="2" w:tplc="0409001B" w:tentative="1">
+      <w:start w:val="1"/>
+      <w:numFmt w:val="lowerRoman"/>
+      <w:lvlText w:val="%3."/>
+      <w:lvlJc w:val="right"/>
+      <w:pPr>
+        <w:ind w:left="1920" w:hanging="480"/>
+      </w:pPr>
+    </w:lvl>
+    <w:lvl w:ilvl="3" w:tplc="0409000F" w:tentative="1">
+      <w:start w:val="1"/>
+      <w:numFmt w:val="decimal"/>
+      <w:lvlText w:val="%4."/>
+      <w:lvlJc w:val="left"/>
+      <w:pPr>
+        <w:ind w:left="2400" w:hanging="480"/>
+      </w:pPr>
+    </w:lvl>
+    <w:lvl w:ilvl="4" w:tplc="04090019" w:tentative="1">
+      <w:start w:val="1"/>
+      <w:numFmt w:val="ideographTraditional"/>
+      <w:lvlText w:val="%5、"/>
+      <w:lvlJc w:val="left"/>
+      <w:pPr>
+        <w:ind w:left="2880" w:hanging="480"/>
+      </w:pPr>
+    </w:lvl>
+    <w:lvl w:ilvl="5" w:tplc="0409001B" w:tentative="1">
+      <w:start w:val="1"/>
+      <w:numFmt w:val="lowerRoman"/>
+      <w:lvlText w:val="%6."/>
+      <w:lvlJc w:val="right"/>
+      <w:pPr>
+        <w:ind w:left="3360" w:hanging="480"/>
+      </w:pPr>
+    </w:lvl>
+    <w:lvl w:ilvl="6" w:tplc="0409000F" w:tentative="1">
+      <w:start w:val="1"/>
+      <w:numFmt w:val="decimal"/>
+      <w:lvlText w:val="%7."/>
+      <w:lvlJc w:val="left"/>
+      <w:pPr>
+        <w:ind w:left="3840" w:hanging="480"/>
+      </w:pPr>
+    </w:lvl>
+    <w:lvl w:ilvl="7" w:tplc="04090019" w:tentative="1">
+      <w:start w:val="1"/>
+      <w:numFmt w:val="ideographTraditional"/>
+      <w:lvlText w:val="%8、"/>
+      <w:lvlJc w:val="left"/>
+      <w:pPr>
+        <w:ind w:left="4320" w:hanging="480"/>
+      </w:pPr>
+    </w:lvl>
+    <w:lvl w:ilvl="8" w:tplc="0409001B" w:tentative="1">
+      <w:start w:val="1"/>
+      <w:numFmt w:val="lowerRoman"/>
+      <w:lvlText w:val="%9."/>
+      <w:lvlJc w:val="right"/>
+      <w:pPr>
+        <w:ind w:left="4800" w:hanging="480"/>
+      </w:pPr>
+    </w:lvl>
+  </w:abstractNum>
+  <w:abstractNum w:abstractNumId="4" w15:restartNumberingAfterBreak="0">
     <w:nsid w:val="4B030739"/>
     <w:multiLevelType w:val="hybridMultilevel"/>
     <w:tmpl w:val="67E4FD68"/>
@@ -7281,20 +8028,148 @@
       </w:rPr>
     </w:lvl>
   </w:abstractNum>
+  <w:abstractNum w:abstractNumId="5" w15:restartNumberingAfterBreak="0">
+    <w:nsid w:val="6901172F"/>
+    <w:multiLevelType w:val="hybridMultilevel"/>
+    <w:tmpl w:val="41B8C0DA"/>
+    <w:lvl w:ilvl="0" w:tplc="1C2AF764">
+      <w:start w:val="1"/>
+      <w:numFmt w:val="decimal"/>
+      <w:lvlText w:val="%1."/>
+      <w:lvlJc w:val="left"/>
+      <w:pPr>
+        <w:ind w:left="840" w:hanging="360"/>
+      </w:pPr>
+      <w:rPr>
+        <w:rFonts w:hint="default"/>
+      </w:rPr>
+    </w:lvl>
+    <w:lvl w:ilvl="1" w:tplc="04090019" w:tentative="1">
+      <w:start w:val="1"/>
+      <w:numFmt w:val="ideographTraditional"/>
+      <w:lvlText w:val="%2、"/>
+      <w:lvlJc w:val="left"/>
+      <w:pPr>
+        <w:ind w:left="1440" w:hanging="480"/>
+      </w:pPr>
+    </w:lvl>
+    <w:lvl w:ilvl="2" w:tplc="0409001B" w:tentative="1">
+      <w:start w:val="1"/>
+      <w:numFmt w:val="lowerRoman"/>
+      <w:lvlText w:val="%3."/>
+      <w:lvlJc w:val="right"/>
+      <w:pPr>
+        <w:ind w:left="1920" w:hanging="480"/>
+      </w:pPr>
+    </w:lvl>
+    <w:lvl w:ilvl="3" w:tplc="0409000F" w:tentative="1">
+      <w:start w:val="1"/>
+      <w:numFmt w:val="decimal"/>
+      <w:lvlText w:val="%4."/>
+      <w:lvlJc w:val="left"/>
+      <w:pPr>
+        <w:ind w:left="2400" w:hanging="480"/>
+      </w:pPr>
+    </w:lvl>
+    <w:lvl w:ilvl="4" w:tplc="04090019" w:tentative="1">
+      <w:start w:val="1"/>
+      <w:numFmt w:val="ideographTraditional"/>
+      <w:lvlText w:val="%5、"/>
+      <w:lvlJc w:val="left"/>
+      <w:pPr>
+        <w:ind w:left="2880" w:hanging="480"/>
+      </w:pPr>
+    </w:lvl>
+    <w:lvl w:ilvl="5" w:tplc="0409001B" w:tentative="1">
+      <w:start w:val="1"/>
+      <w:numFmt w:val="lowerRoman"/>
+      <w:lvlText w:val="%6."/>
+      <w:lvlJc w:val="right"/>
+      <w:pPr>
+        <w:ind w:left="3360" w:hanging="480"/>
+      </w:pPr>
+    </w:lvl>
+    <w:lvl w:ilvl="6" w:tplc="0409000F" w:tentative="1">
+      <w:start w:val="1"/>
+      <w:numFmt w:val="decimal"/>
+      <w:lvlText w:val="%7."/>
+      <w:lvlJc w:val="left"/>
+      <w:pPr>
+        <w:ind w:left="3840" w:hanging="480"/>
+      </w:pPr>
+    </w:lvl>
+    <w:lvl w:ilvl="7" w:tplc="04090019" w:tentative="1">
+      <w:start w:val="1"/>
+      <w:numFmt w:val="ideographTraditional"/>
+      <w:lvlText w:val="%8、"/>
+      <w:lvlJc w:val="left"/>
+      <w:pPr>
+        <w:ind w:left="4320" w:hanging="480"/>
+      </w:pPr>
+    </w:lvl>
+    <w:lvl w:ilvl="8" w:tplc="0409001B" w:tentative="1">
+      <w:start w:val="1"/>
+      <w:numFmt w:val="lowerRoman"/>
+      <w:lvlText w:val="%9."/>
+      <w:lvlJc w:val="right"/>
+      <w:pPr>
+        <w:ind w:left="4800" w:hanging="480"/>
+      </w:pPr>
+    </w:lvl>
+  </w:abstractNum>
   <w:num w:numId="1" w16cid:durableId="1101150216">
+    <w:abstractNumId w:val="4"/>
+  </w:num>
+  <w:num w:numId="2" w16cid:durableId="1255750687">
     <w:abstractNumId w:val="2"/>
   </w:num>
-  <w:num w:numId="2" w16cid:durableId="1255750687">
+  <w:num w:numId="3" w16cid:durableId="2023389186">
     <w:abstractNumId w:val="1"/>
   </w:num>
-  <w:num w:numId="3" w16cid:durableId="2023389186">
+  <w:num w:numId="4" w16cid:durableId="1786346422">
     <w:abstractNumId w:val="0"/>
+  </w:num>
+  <w:num w:numId="5" w16cid:durableId="808938519">
+    <w:abstractNumId w:val="5"/>
+  </w:num>
+  <w:num w:numId="6" w16cid:durableId="2106612740">
+    <w:abstractNumId w:val="3"/>
+  </w:num>
+  <w:num w:numId="7" w16cid:durableId="1489900482">
+    <w:abstractNumId w:val="0"/>
+    <w:lvlOverride w:ilvl="0">
+      <w:startOverride w:val="1"/>
+    </w:lvlOverride>
+    <w:lvlOverride w:ilvl="1">
+      <w:startOverride w:val="1"/>
+    </w:lvlOverride>
+    <w:lvlOverride w:ilvl="2">
+      <w:startOverride w:val="1"/>
+    </w:lvlOverride>
+    <w:lvlOverride w:ilvl="3">
+      <w:startOverride w:val="1"/>
+    </w:lvlOverride>
+    <w:lvlOverride w:ilvl="4">
+      <w:startOverride w:val="1"/>
+    </w:lvlOverride>
+    <w:lvlOverride w:ilvl="5">
+      <w:startOverride w:val="1"/>
+    </w:lvlOverride>
+    <w:lvlOverride w:ilvl="6">
+      <w:startOverride w:val="1"/>
+    </w:lvlOverride>
+    <w:lvlOverride w:ilvl="7">
+      <w:startOverride w:val="1"/>
+    </w:lvlOverride>
+    <w:lvlOverride w:ilvl="8">
+      <w:startOverride w:val="1"/>
+    </w:lvlOverride>
   </w:num>
 </w:numbering>
 </file>
 
 <file path=word/styles.xml><?xml version="1.0" encoding="utf-8"?>
-<w:styles xmlns:mc="http://schemas.openxmlformats.org/markup-compatibility/2006" xmlns:r="http://schemas.openxmlformats.org/officeDocument/2006/relationships" xmlns:w="http://schemas.openxmlformats.org/wordprocessingml/2006/main" xmlns:w14="http://schemas.microsoft.com/office/word/2010/wordml" xmlns:w15="http://schemas.microsoft.com/office/word/2012/wordml" xmlns:w16cex="http://schemas.microsoft.com/office/word/2018/wordml/cex" xmlns:w16cid="http://schemas.microsoft.com/office/word/2016/wordml/cid" xmlns:w16="http://schemas.microsoft.com/office/word/2018/wordml" xmlns:w16du="http://schemas.microsoft.com/office/word/2023/wordml/word16du" xmlns:w16sdtdh="http://schemas.microsoft.com/office/word/2020/wordml/sdtdatahash" xmlns:w16sdtfl="http://schemas.microsoft.com/office/word/2024/wordml/sdtformatlock" xmlns:w16se="http://schemas.microsoft.com/office/word/2015/wordml/symex" mc:Ignorable="w14 w15 w16se w16cid w16 w16cex w16sdtdh w16sdtfl w16du">
+<w:styles xmlns:mc="http://schemas.openxmlformats.org/markup-compatibility/2006" xmlns:r="http://schemas.openxmlformats.org/officeDocument/2006/relationships" xmlns:w="http://schemas.openxmlformats.org/wordprocessingml/2006/main" xmlns:w14="http://schemas.microsoft.com/office/word/2010/wordml" xmlns:w15="http://schemas.microsoft.com/office/word/2012/wordml" xmlns:w16cex="http://schemas.microsoft.com/office/word/2018/wordml/cex" xmlns:w16cid="http://schemas.microsoft.com/office/word/2016/wordml/cid" xmlns:w16="http://schemas.microsoft.com/office/word/2018/wordml" xmlns:w16sdtdh="http://schemas.microsoft.com/office/word/2020/wordml/sdtdatahash" xmlns:w16se="http://schemas.microsoft.com/office/word/2015/wordml/symex" mc:Ignorable="w14 w15 w16se w16cid w16 w16cex w16sdtdh">
   <w:docDefaults>
     <w:rPrDefault>
       <w:rPr>
@@ -7898,7 +8773,6 @@
   <w:style w:type="character" w:default="1" w:styleId="a0">
     <w:name w:val="Default Paragraph Font"/>
     <w:uiPriority w:val="1"/>
-    <w:semiHidden/>
     <w:unhideWhenUsed/>
   </w:style>
   <w:style w:type="table" w:default="1" w:styleId="a1">

</xml_diff>

<commit_message>
doc: add `Use case Diagram` and revise use case description
</commit_message>
<xml_diff>
--- a/document/hw2.docx
+++ b/document/hw2.docx
@@ -1,6 +1,6 @@
 
 <file path=word/document.xml><?xml version="1.0" encoding="utf-8"?>
-<w:document xmlns:wpc="http://schemas.microsoft.com/office/word/2010/wordprocessingCanvas" xmlns:cx="http://schemas.microsoft.com/office/drawing/2014/chartex" xmlns:cx1="http://schemas.microsoft.com/office/drawing/2015/9/8/chartex" xmlns:cx2="http://schemas.microsoft.com/office/drawing/2015/10/21/chartex" xmlns:cx3="http://schemas.microsoft.com/office/drawing/2016/5/9/chartex" xmlns:cx4="http://schemas.microsoft.com/office/drawing/2016/5/10/chartex" xmlns:cx5="http://schemas.microsoft.com/office/drawing/2016/5/11/chartex" xmlns:cx6="http://schemas.microsoft.com/office/drawing/2016/5/12/chartex" xmlns:cx7="http://schemas.microsoft.com/office/drawing/2016/5/13/chartex" xmlns:cx8="http://schemas.microsoft.com/office/drawing/2016/5/14/chartex" xmlns:mc="http://schemas.openxmlformats.org/markup-compatibility/2006" xmlns:aink="http://schemas.microsoft.com/office/drawing/2016/ink" xmlns:am3d="http://schemas.microsoft.com/office/drawing/2017/model3d" xmlns:o="urn:schemas-microsoft-com:office:office" xmlns:oel="http://schemas.microsoft.com/office/2019/extlst" xmlns:r="http://schemas.openxmlformats.org/officeDocument/2006/relationships" xmlns:m="http://schemas.openxmlformats.org/officeDocument/2006/math" xmlns:v="urn:schemas-microsoft-com:vml" xmlns:wp14="http://schemas.microsoft.com/office/word/2010/wordprocessingDrawing" xmlns:wp="http://schemas.openxmlformats.org/drawingml/2006/wordprocessingDrawing" xmlns:w10="urn:schemas-microsoft-com:office:word" xmlns:w="http://schemas.openxmlformats.org/wordprocessingml/2006/main" xmlns:w14="http://schemas.microsoft.com/office/word/2010/wordml" xmlns:w15="http://schemas.microsoft.com/office/word/2012/wordml" xmlns:w16cex="http://schemas.microsoft.com/office/word/2018/wordml/cex" xmlns:w16cid="http://schemas.microsoft.com/office/word/2016/wordml/cid" xmlns:w16="http://schemas.microsoft.com/office/word/2018/wordml" xmlns:w16sdtdh="http://schemas.microsoft.com/office/word/2020/wordml/sdtdatahash" xmlns:w16se="http://schemas.microsoft.com/office/word/2015/wordml/symex" xmlns:wpg="http://schemas.microsoft.com/office/word/2010/wordprocessingGroup" xmlns:wpi="http://schemas.microsoft.com/office/word/2010/wordprocessingInk" xmlns:wne="http://schemas.microsoft.com/office/word/2006/wordml" xmlns:wps="http://schemas.microsoft.com/office/word/2010/wordprocessingShape" mc:Ignorable="w14 w15 w16se w16cid w16 w16cex w16sdtdh wp14">
+<w:document xmlns:wpc="http://schemas.microsoft.com/office/word/2010/wordprocessingCanvas" xmlns:cx="http://schemas.microsoft.com/office/drawing/2014/chartex" xmlns:cx1="http://schemas.microsoft.com/office/drawing/2015/9/8/chartex" xmlns:cx2="http://schemas.microsoft.com/office/drawing/2015/10/21/chartex" xmlns:cx3="http://schemas.microsoft.com/office/drawing/2016/5/9/chartex" xmlns:cx4="http://schemas.microsoft.com/office/drawing/2016/5/10/chartex" xmlns:cx5="http://schemas.microsoft.com/office/drawing/2016/5/11/chartex" xmlns:cx6="http://schemas.microsoft.com/office/drawing/2016/5/12/chartex" xmlns:cx7="http://schemas.microsoft.com/office/drawing/2016/5/13/chartex" xmlns:cx8="http://schemas.microsoft.com/office/drawing/2016/5/14/chartex" xmlns:mc="http://schemas.openxmlformats.org/markup-compatibility/2006" xmlns:aink="http://schemas.microsoft.com/office/drawing/2016/ink" xmlns:am3d="http://schemas.microsoft.com/office/drawing/2017/model3d" xmlns:o="urn:schemas-microsoft-com:office:office" xmlns:oel="http://schemas.microsoft.com/office/2019/extlst" xmlns:r="http://schemas.openxmlformats.org/officeDocument/2006/relationships" xmlns:m="http://schemas.openxmlformats.org/officeDocument/2006/math" xmlns:v="urn:schemas-microsoft-com:vml" xmlns:wp14="http://schemas.microsoft.com/office/word/2010/wordprocessingDrawing" xmlns:wp="http://schemas.openxmlformats.org/drawingml/2006/wordprocessingDrawing" xmlns:w10="urn:schemas-microsoft-com:office:word" xmlns:w="http://schemas.openxmlformats.org/wordprocessingml/2006/main" xmlns:w14="http://schemas.microsoft.com/office/word/2010/wordml" xmlns:w15="http://schemas.microsoft.com/office/word/2012/wordml" xmlns:w16cex="http://schemas.microsoft.com/office/word/2018/wordml/cex" xmlns:w16cid="http://schemas.microsoft.com/office/word/2016/wordml/cid" xmlns:w16="http://schemas.microsoft.com/office/word/2018/wordml" xmlns:w16du="http://schemas.microsoft.com/office/word/2023/wordml/word16du" xmlns:w16sdtdh="http://schemas.microsoft.com/office/word/2020/wordml/sdtdatahash" xmlns:w16sdtfl="http://schemas.microsoft.com/office/word/2024/wordml/sdtformatlock" xmlns:w16se="http://schemas.microsoft.com/office/word/2015/wordml/symex" xmlns:wpg="http://schemas.microsoft.com/office/word/2010/wordprocessingGroup" xmlns:wpi="http://schemas.microsoft.com/office/word/2010/wordprocessingInk" xmlns:wne="http://schemas.microsoft.com/office/word/2006/wordml" xmlns:wps="http://schemas.microsoft.com/office/word/2010/wordprocessingShape" mc:Ignorable="w14 w15 w16se w16cid w16 w16cex w16sdtdh w16sdtfl w16du wp14">
   <w:body>
     <w:p>
       <w:pPr>
@@ -84,6 +84,7 @@
         </w:rPr>
       </w:pPr>
       <w:proofErr w:type="spellStart"/>
+      <w:proofErr w:type="gramStart"/>
       <w:r>
         <w:rPr>
           <w:rFonts w:ascii="Times New Roman" w:eastAsia="標楷體" w:hAnsi="Times New Roman" w:cs="Times New Roman" w:hint="eastAsia"/>
@@ -95,6 +96,7 @@
         <w:t>Re:Book</w:t>
       </w:r>
       <w:proofErr w:type="spellEnd"/>
+      <w:proofErr w:type="gramEnd"/>
     </w:p>
     <w:p>
       <w:pPr>
@@ -199,13 +201,23 @@
           <w:szCs w:val="40"/>
         </w:rPr>
       </w:pPr>
+      <w:proofErr w:type="gramStart"/>
       <w:r>
         <w:rPr>
           <w:rFonts w:ascii="Times New Roman" w:eastAsia="標楷體" w:hAnsi="Times New Roman" w:cs="Times New Roman"/>
           <w:sz w:val="40"/>
           <w:szCs w:val="40"/>
         </w:rPr>
-        <w:t>資工碩二</w:t>
+        <w:t>資工碩</w:t>
+      </w:r>
+      <w:proofErr w:type="gramEnd"/>
+      <w:r>
+        <w:rPr>
+          <w:rFonts w:ascii="Times New Roman" w:eastAsia="標楷體" w:hAnsi="Times New Roman" w:cs="Times New Roman"/>
+          <w:sz w:val="40"/>
+          <w:szCs w:val="40"/>
+        </w:rPr>
+        <w:t>二</w:t>
       </w:r>
       <w:r>
         <w:rPr>
@@ -239,8 +251,18 @@
           <w:sz w:val="40"/>
           <w:szCs w:val="40"/>
         </w:rPr>
-        <w:t>資工碩一</w:t>
+        <w:t>資工碩</w:t>
       </w:r>
+      <w:proofErr w:type="gramStart"/>
+      <w:r>
+        <w:rPr>
+          <w:rFonts w:ascii="Times New Roman" w:eastAsia="標楷體" w:hAnsi="Times New Roman" w:cs="Times New Roman"/>
+          <w:sz w:val="40"/>
+          <w:szCs w:val="40"/>
+        </w:rPr>
+        <w:t>一</w:t>
+      </w:r>
+      <w:proofErr w:type="gramEnd"/>
       <w:r>
         <w:rPr>
           <w:rFonts w:ascii="Times New Roman" w:eastAsia="標楷體" w:hAnsi="Times New Roman" w:cs="Times New Roman"/>
@@ -338,6 +360,312 @@
         <w:t>Change History</w:t>
       </w:r>
     </w:p>
+    <w:tbl>
+      <w:tblPr>
+        <w:tblStyle w:val="af2"/>
+        <w:tblW w:w="0" w:type="auto"/>
+        <w:tblLook w:val="04A0" w:firstRow="1" w:lastRow="0" w:firstColumn="1" w:lastColumn="0" w:noHBand="0" w:noVBand="1"/>
+      </w:tblPr>
+      <w:tblGrid>
+        <w:gridCol w:w="990"/>
+        <w:gridCol w:w="5384"/>
+        <w:gridCol w:w="1922"/>
+      </w:tblGrid>
+      <w:tr>
+        <w:tc>
+          <w:tcPr>
+            <w:tcW w:w="990" w:type="dxa"/>
+            <w:shd w:val="clear" w:color="auto" w:fill="E8E8E8" w:themeFill="background2"/>
+          </w:tcPr>
+          <w:p>
+            <w:pPr>
+              <w:rPr>
+                <w:rFonts w:ascii="Times New Roman" w:hAnsi="Times New Roman" w:cs="Times New Roman"/>
+              </w:rPr>
+            </w:pPr>
+            <w:r>
+              <w:rPr>
+                <w:rFonts w:ascii="Times New Roman" w:hAnsi="Times New Roman" w:cs="Times New Roman"/>
+              </w:rPr>
+              <w:t>Version</w:t>
+            </w:r>
+          </w:p>
+        </w:tc>
+        <w:tc>
+          <w:tcPr>
+            <w:tcW w:w="5384" w:type="dxa"/>
+            <w:shd w:val="clear" w:color="auto" w:fill="E8E8E8" w:themeFill="background2"/>
+          </w:tcPr>
+          <w:p>
+            <w:pPr>
+              <w:rPr>
+                <w:rFonts w:ascii="Times New Roman" w:hAnsi="Times New Roman" w:cs="Times New Roman"/>
+              </w:rPr>
+            </w:pPr>
+            <w:r>
+              <w:rPr>
+                <w:rFonts w:ascii="Times New Roman" w:hAnsi="Times New Roman" w:cs="Times New Roman"/>
+              </w:rPr>
+              <w:t>Description</w:t>
+            </w:r>
+          </w:p>
+        </w:tc>
+        <w:tc>
+          <w:tcPr>
+            <w:tcW w:w="1922" w:type="dxa"/>
+            <w:shd w:val="clear" w:color="auto" w:fill="E8E8E8" w:themeFill="background2"/>
+          </w:tcPr>
+          <w:p>
+            <w:pPr>
+              <w:rPr>
+                <w:rFonts w:ascii="Times New Roman" w:hAnsi="Times New Roman" w:cs="Times New Roman"/>
+              </w:rPr>
+            </w:pPr>
+            <w:r>
+              <w:rPr>
+                <w:rFonts w:ascii="Times New Roman" w:hAnsi="Times New Roman" w:cs="Times New Roman"/>
+              </w:rPr>
+              <w:t>Date</w:t>
+            </w:r>
+          </w:p>
+        </w:tc>
+      </w:tr>
+      <w:tr>
+        <w:tc>
+          <w:tcPr>
+            <w:tcW w:w="8296" w:type="dxa"/>
+            <w:gridSpan w:val="3"/>
+          </w:tcPr>
+          <w:p>
+            <w:pPr>
+              <w:rPr>
+                <w:rFonts w:ascii="Times New Roman" w:hAnsi="Times New Roman" w:cs="Times New Roman"/>
+              </w:rPr>
+            </w:pPr>
+            <w:r>
+              <w:rPr>
+                <w:rFonts w:ascii="Times New Roman" w:hAnsi="Times New Roman" w:cs="Times New Roman"/>
+              </w:rPr>
+              <w:t>Iteration 1</w:t>
+            </w:r>
+          </w:p>
+        </w:tc>
+      </w:tr>
+      <w:tr>
+        <w:tc>
+          <w:tcPr>
+            <w:tcW w:w="990" w:type="dxa"/>
+          </w:tcPr>
+          <w:p>
+            <w:pPr>
+              <w:rPr>
+                <w:rFonts w:ascii="Times New Roman" w:hAnsi="Times New Roman" w:cs="Times New Roman"/>
+              </w:rPr>
+            </w:pPr>
+            <w:r>
+              <w:rPr>
+                <w:rFonts w:ascii="Times New Roman" w:hAnsi="Times New Roman" w:cs="Times New Roman"/>
+              </w:rPr>
+              <w:t>1</w:t>
+            </w:r>
+          </w:p>
+        </w:tc>
+        <w:tc>
+          <w:tcPr>
+            <w:tcW w:w="5384" w:type="dxa"/>
+          </w:tcPr>
+          <w:p>
+            <w:pPr>
+              <w:rPr>
+                <w:rFonts w:ascii="Times New Roman" w:hAnsi="Times New Roman" w:cs="Times New Roman"/>
+              </w:rPr>
+            </w:pPr>
+            <w:r>
+              <w:rPr>
+                <w:rFonts w:ascii="Times New Roman" w:hAnsi="Times New Roman" w:cs="Times New Roman"/>
+              </w:rPr>
+              <w:t>Problem Statement, Software Environment</w:t>
+            </w:r>
+          </w:p>
+        </w:tc>
+        <w:tc>
+          <w:tcPr>
+            <w:tcW w:w="1922" w:type="dxa"/>
+          </w:tcPr>
+          <w:p>
+            <w:pPr>
+              <w:rPr>
+                <w:rFonts w:ascii="Times New Roman" w:hAnsi="Times New Roman" w:cs="Times New Roman"/>
+              </w:rPr>
+            </w:pPr>
+            <w:r>
+              <w:rPr>
+                <w:rFonts w:ascii="Times New Roman" w:hAnsi="Times New Roman" w:cs="Times New Roman"/>
+              </w:rPr>
+              <w:t>2026/3/4</w:t>
+            </w:r>
+          </w:p>
+        </w:tc>
+      </w:tr>
+      <w:tr>
+        <w:tc>
+          <w:tcPr>
+            <w:tcW w:w="990" w:type="dxa"/>
+          </w:tcPr>
+          <w:p>
+            <w:pPr>
+              <w:rPr>
+                <w:rFonts w:ascii="Times New Roman" w:hAnsi="Times New Roman" w:cs="Times New Roman"/>
+              </w:rPr>
+            </w:pPr>
+            <w:r>
+              <w:rPr>
+                <w:rFonts w:ascii="Times New Roman" w:hAnsi="Times New Roman" w:cs="Times New Roman"/>
+              </w:rPr>
+              <w:t>2</w:t>
+            </w:r>
+          </w:p>
+        </w:tc>
+        <w:tc>
+          <w:tcPr>
+            <w:tcW w:w="5384" w:type="dxa"/>
+          </w:tcPr>
+          <w:p>
+            <w:pPr>
+              <w:rPr>
+                <w:rFonts w:ascii="Times New Roman" w:hAnsi="Times New Roman" w:cs="Times New Roman"/>
+              </w:rPr>
+            </w:pPr>
+            <w:r>
+              <w:rPr>
+                <w:rFonts w:ascii="Times New Roman" w:hAnsi="Times New Roman" w:cs="Times New Roman"/>
+              </w:rPr>
+              <w:t xml:space="preserve">Summary of System Features, Use cases, </w:t>
+            </w:r>
+            <w:proofErr w:type="gramStart"/>
+            <w:r>
+              <w:rPr>
+                <w:rFonts w:ascii="Times New Roman" w:hAnsi="Times New Roman" w:cs="Times New Roman"/>
+              </w:rPr>
+              <w:t>Non-functional</w:t>
+            </w:r>
+            <w:proofErr w:type="gramEnd"/>
+            <w:r>
+              <w:rPr>
+                <w:rFonts w:ascii="Times New Roman" w:hAnsi="Times New Roman" w:cs="Times New Roman"/>
+              </w:rPr>
+              <w:t xml:space="preserve"> requirements</w:t>
+            </w:r>
+          </w:p>
+        </w:tc>
+        <w:tc>
+          <w:tcPr>
+            <w:tcW w:w="1922" w:type="dxa"/>
+          </w:tcPr>
+          <w:p>
+            <w:pPr>
+              <w:rPr>
+                <w:rFonts w:ascii="Times New Roman" w:hAnsi="Times New Roman" w:cs="Times New Roman"/>
+              </w:rPr>
+            </w:pPr>
+            <w:r>
+              <w:rPr>
+                <w:rFonts w:ascii="Times New Roman" w:hAnsi="Times New Roman" w:cs="Times New Roman"/>
+              </w:rPr>
+              <w:t>2026/3/9</w:t>
+            </w:r>
+          </w:p>
+        </w:tc>
+      </w:tr>
+      <w:tr>
+        <w:tc>
+          <w:tcPr>
+            <w:tcW w:w="990" w:type="dxa"/>
+          </w:tcPr>
+          <w:p>
+            <w:pPr>
+              <w:rPr>
+                <w:rFonts w:ascii="Times New Roman" w:hAnsi="Times New Roman" w:cs="Times New Roman"/>
+              </w:rPr>
+            </w:pPr>
+            <w:r>
+              <w:rPr>
+                <w:rFonts w:ascii="Times New Roman" w:hAnsi="Times New Roman" w:cs="Times New Roman"/>
+              </w:rPr>
+              <w:t>3</w:t>
+            </w:r>
+          </w:p>
+        </w:tc>
+        <w:tc>
+          <w:tcPr>
+            <w:tcW w:w="5384" w:type="dxa"/>
+          </w:tcPr>
+          <w:p>
+            <w:pPr>
+              <w:rPr>
+                <w:rFonts w:ascii="Times New Roman" w:hAnsi="Times New Roman" w:cs="Times New Roman"/>
+              </w:rPr>
+            </w:pPr>
+            <w:r>
+              <w:rPr>
+                <w:rFonts w:ascii="Times New Roman" w:hAnsi="Times New Roman" w:cs="Times New Roman"/>
+              </w:rPr>
+              <w:t>Use case diagram</w:t>
+            </w:r>
+            <w:r>
+              <w:rPr>
+                <w:rFonts w:ascii="Times New Roman" w:hAnsi="Times New Roman" w:cs="Times New Roman"/>
+              </w:rPr>
+              <w:t xml:space="preserve">, </w:t>
+            </w:r>
+            <w:r>
+              <w:rPr>
+                <w:rFonts w:ascii="Times New Roman" w:hAnsi="Times New Roman" w:cs="Times New Roman"/>
+              </w:rPr>
+              <w:t xml:space="preserve">Use cases, </w:t>
+            </w:r>
+            <w:proofErr w:type="gramStart"/>
+            <w:r>
+              <w:rPr>
+                <w:rFonts w:ascii="Times New Roman" w:hAnsi="Times New Roman" w:cs="Times New Roman"/>
+              </w:rPr>
+              <w:t>Non-functional</w:t>
+            </w:r>
+            <w:proofErr w:type="gramEnd"/>
+            <w:r>
+              <w:rPr>
+                <w:rFonts w:ascii="Times New Roman" w:hAnsi="Times New Roman" w:cs="Times New Roman"/>
+              </w:rPr>
+              <w:t xml:space="preserve"> requirements</w:t>
+            </w:r>
+            <w:r>
+              <w:rPr>
+                <w:rFonts w:ascii="Times New Roman" w:hAnsi="Times New Roman" w:cs="Times New Roman"/>
+              </w:rPr>
+              <w:t>, Glossary</w:t>
+            </w:r>
+          </w:p>
+        </w:tc>
+        <w:tc>
+          <w:tcPr>
+            <w:tcW w:w="1922" w:type="dxa"/>
+          </w:tcPr>
+          <w:p>
+            <w:pPr>
+              <w:rPr>
+                <w:rFonts w:ascii="Times New Roman" w:hAnsi="Times New Roman" w:cs="Times New Roman"/>
+              </w:rPr>
+            </w:pPr>
+            <w:r>
+              <w:rPr>
+                <w:rFonts w:ascii="Times New Roman" w:hAnsi="Times New Roman" w:cs="Times New Roman"/>
+              </w:rPr>
+              <w:t>2026/3/13</w:t>
+            </w:r>
+          </w:p>
+        </w:tc>
+      </w:tr>
+    </w:tbl>
     <w:p/>
     <w:p>
       <w:pPr>
@@ -362,16 +690,34 @@
       <w:proofErr w:type="spellStart"/>
       <w:r>
         <w:rPr>
-          <w:rFonts w:ascii="Times New Roman" w:eastAsia="標楷體" w:hAnsi="Times New Roman" w:cs="Times New Roman"/>
+          <w:rFonts w:ascii="Times New Roman" w:eastAsia="標楷體" w:hAnsi="Times New Roman" w:cs="Times New Roman" w:hint="eastAsia"/>
         </w:rPr>
         <w:t>Re:Book</w:t>
       </w:r>
       <w:proofErr w:type="spellEnd"/>
       <w:r>
         <w:rPr>
-          <w:rFonts w:ascii="Times New Roman" w:eastAsia="標楷體" w:hAnsi="Times New Roman" w:cs="Times New Roman"/>
-        </w:rPr>
-        <w:t>：賦予知識第二次生命</w:t>
+          <w:rFonts w:ascii="Times New Roman" w:eastAsia="標楷體" w:hAnsi="Times New Roman" w:cs="Times New Roman" w:hint="eastAsia"/>
+        </w:rPr>
+        <w:t xml:space="preserve"> </w:t>
+      </w:r>
+      <w:r>
+        <w:rPr>
+          <w:rFonts w:ascii="Times New Roman" w:eastAsia="標楷體" w:hAnsi="Times New Roman" w:cs="Times New Roman" w:hint="eastAsia"/>
+        </w:rPr>
+        <w:t>是一款專為大學生</w:t>
+      </w:r>
+      <w:r>
+        <w:rPr>
+          <w:rFonts w:ascii="Times New Roman" w:eastAsia="標楷體" w:hAnsi="Times New Roman" w:cs="Times New Roman" w:hint="eastAsia"/>
+        </w:rPr>
+        <w:t>、</w:t>
+      </w:r>
+      <w:r>
+        <w:rPr>
+          <w:rFonts w:ascii="Times New Roman" w:eastAsia="標楷體" w:hAnsi="Times New Roman" w:cs="Times New Roman" w:hint="eastAsia"/>
+        </w:rPr>
+        <w:t>研究生與自學者打造的應用程式，旨在解決資源浪費與學術教材成本過高的問題。每逢學期交替、教材需求達到高峰之際，本平台透過行動裝置與網頁介面，串連校園社群與學生網路群組，為二手書流通建立更有效率的媒合橋樑。我們深信此平台的存在具有其必要性，因為每一本書都值得擁有延續價值的機會，而不應被遺忘或淪為廢棄物。</w:t>
       </w:r>
     </w:p>
     <w:p>
@@ -398,45 +744,6 @@
         <w:rPr>
           <w:rFonts w:ascii="Times New Roman" w:eastAsia="標楷體" w:hAnsi="Times New Roman" w:cs="Times New Roman" w:hint="eastAsia"/>
         </w:rPr>
-        <w:t>是一款專為大學生</w:t>
-      </w:r>
-      <w:r>
-        <w:rPr>
-          <w:rFonts w:ascii="Times New Roman" w:eastAsia="標楷體" w:hAnsi="Times New Roman" w:cs="Times New Roman" w:hint="eastAsia"/>
-        </w:rPr>
-        <w:t>、</w:t>
-      </w:r>
-      <w:r>
-        <w:rPr>
-          <w:rFonts w:ascii="Times New Roman" w:eastAsia="標楷體" w:hAnsi="Times New Roman" w:cs="Times New Roman" w:hint="eastAsia"/>
-        </w:rPr>
-        <w:t>研究生與自學者打造的應用程式，旨在解決資源浪費與學術教材成本過高的問題。每逢學期交替、教材需求達到高峰之際，本平台透過行動裝置與網頁介面，串連校園社群與學生網路群組，為二手書流通建立更有效率的媒合橋樑。我們深信此平台的存在具有其必要性，因為每一本書都值得擁有延續價值的機會，而不應被遺忘或淪為廢棄物。</w:t>
-      </w:r>
-    </w:p>
-    <w:p>
-      <w:pPr>
-        <w:rPr>
-          <w:rFonts w:ascii="Times New Roman" w:eastAsia="標楷體" w:hAnsi="Times New Roman" w:cs="Times New Roman"/>
-        </w:rPr>
-      </w:pPr>
-      <w:proofErr w:type="spellStart"/>
-      <w:r>
-        <w:rPr>
-          <w:rFonts w:ascii="Times New Roman" w:eastAsia="標楷體" w:hAnsi="Times New Roman" w:cs="Times New Roman" w:hint="eastAsia"/>
-        </w:rPr>
-        <w:t>Re:Book</w:t>
-      </w:r>
-      <w:proofErr w:type="spellEnd"/>
-      <w:r>
-        <w:rPr>
-          <w:rFonts w:ascii="Times New Roman" w:eastAsia="標楷體" w:hAnsi="Times New Roman" w:cs="Times New Roman" w:hint="eastAsia"/>
-        </w:rPr>
-        <w:t xml:space="preserve"> </w:t>
-      </w:r>
-      <w:r>
-        <w:rPr>
-          <w:rFonts w:ascii="Times New Roman" w:eastAsia="標楷體" w:hAnsi="Times New Roman" w:cs="Times New Roman" w:hint="eastAsia"/>
-        </w:rPr>
         <w:t>透過直觀且易於操作的交換機制，為二手書注入新的生命。賣家可輸入書名、作者、出版社或</w:t>
       </w:r>
       <w:r>
@@ -461,7 +768,35 @@
         <w:rPr>
           <w:rFonts w:ascii="Times New Roman" w:eastAsia="標楷體" w:hAnsi="Times New Roman" w:cs="Times New Roman" w:hint="eastAsia"/>
         </w:rPr>
-        <w:t>類。為體現對書本價值的尊重，賣家可設定期望售價，並上傳書況照片或分享使用心得。潛在買家則可透過搜尋與篩選功能，快速找到所需書籍。平台同時提供私訊機制，讓雙方協商最終價格與交付方式，確保知識的傳遞過程既順暢高效，也保有人與人之間的溫度。</w:t>
+        <w:t>類。為體現對書本價值的尊重，賣家可設定期望售價，並上傳書</w:t>
+      </w:r>
+      <w:proofErr w:type="gramStart"/>
+      <w:r>
+        <w:rPr>
+          <w:rFonts w:ascii="Times New Roman" w:eastAsia="標楷體" w:hAnsi="Times New Roman" w:cs="Times New Roman" w:hint="eastAsia"/>
+        </w:rPr>
+        <w:t>況</w:t>
+      </w:r>
+      <w:proofErr w:type="gramEnd"/>
+      <w:r>
+        <w:rPr>
+          <w:rFonts w:ascii="Times New Roman" w:eastAsia="標楷體" w:hAnsi="Times New Roman" w:cs="Times New Roman" w:hint="eastAsia"/>
+        </w:rPr>
+        <w:t>照片或分享使用心得。潛在買家則可透過搜尋與篩選功能，快速找到所需書籍。平台同時</w:t>
+      </w:r>
+      <w:proofErr w:type="gramStart"/>
+      <w:r>
+        <w:rPr>
+          <w:rFonts w:ascii="Times New Roman" w:eastAsia="標楷體" w:hAnsi="Times New Roman" w:cs="Times New Roman" w:hint="eastAsia"/>
+        </w:rPr>
+        <w:t>提供私訊機制</w:t>
+      </w:r>
+      <w:proofErr w:type="gramEnd"/>
+      <w:r>
+        <w:rPr>
+          <w:rFonts w:ascii="Times New Roman" w:eastAsia="標楷體" w:hAnsi="Times New Roman" w:cs="Times New Roman" w:hint="eastAsia"/>
+        </w:rPr>
+        <w:t>，讓雙方協商最終價格與交付方式，確保知識的傳遞過程既順暢高效，也保有人與人之間的溫度。</w:t>
       </w:r>
     </w:p>
     <w:p>
@@ -654,7 +989,7 @@
               <w:rPr>
                 <w:rFonts w:ascii="Times New Roman" w:eastAsia="標楷體" w:hAnsi="Times New Roman" w:cs="Times New Roman" w:hint="eastAsia"/>
               </w:rPr>
-              <w:t>更新書籍狀態</w:t>
+              <w:t>建立訂單</w:t>
             </w:r>
           </w:p>
         </w:tc>
@@ -688,12 +1023,14 @@
                 <w:rFonts w:ascii="Times New Roman" w:eastAsia="標楷體" w:hAnsi="Times New Roman" w:cs="Times New Roman"/>
               </w:rPr>
             </w:pPr>
+            <w:proofErr w:type="gramStart"/>
             <w:r>
               <w:rPr>
                 <w:rFonts w:ascii="Times New Roman" w:eastAsia="標楷體" w:hAnsi="Times New Roman" w:cs="Times New Roman" w:hint="eastAsia"/>
               </w:rPr>
               <w:t>發送私訊</w:t>
             </w:r>
+            <w:proofErr w:type="gramEnd"/>
           </w:p>
         </w:tc>
       </w:tr>
@@ -712,6 +1049,7 @@
               <w:rPr>
                 <w:rFonts w:ascii="Times New Roman" w:eastAsia="標楷體" w:hAnsi="Times New Roman" w:cs="Times New Roman" w:hint="eastAsia"/>
               </w:rPr>
+              <w:lastRenderedPageBreak/>
               <w:t>FEA-05</w:t>
             </w:r>
           </w:p>
@@ -783,26 +1121,18 @@
     <w:p>
       <w:pPr>
         <w:rPr>
-          <w:rFonts w:ascii="Times New Roman" w:eastAsia="標楷體" w:hAnsi="Times New Roman" w:cs="Times New Roman"/>
+          <w:rFonts w:ascii="Times New Roman" w:eastAsia="標楷體" w:hAnsi="Times New Roman" w:cs="Times New Roman" w:hint="eastAsia"/>
         </w:rPr>
       </w:pPr>
     </w:p>
     <w:p>
       <w:pPr>
-        <w:rPr>
-          <w:rFonts w:ascii="Times New Roman" w:eastAsia="標楷體" w:hAnsi="Times New Roman" w:cs="Times New Roman"/>
-        </w:rPr>
-      </w:pPr>
-    </w:p>
-    <w:p>
-      <w:pPr>
         <w:pStyle w:val="2"/>
       </w:pPr>
       <w:r>
         <w:rPr>
           <w:rFonts w:hint="eastAsia"/>
         </w:rPr>
-        <w:lastRenderedPageBreak/>
         <w:t xml:space="preserve">1.4 </w:t>
       </w:r>
       <w:r>
@@ -811,10 +1141,58 @@
     </w:p>
     <w:p>
       <w:pPr>
+        <w:jc w:val="center"/>
         <w:rPr>
           <w:rFonts w:hint="eastAsia"/>
         </w:rPr>
       </w:pPr>
+      <w:r>
+        <w:rPr>
+          <w:rFonts w:hint="eastAsia"/>
+          <w:noProof/>
+        </w:rPr>
+        <w:drawing>
+          <wp:inline distT="0" distB="0" distL="0" distR="0" wp14:anchorId="41C226C1" wp14:editId="61892A26">
+            <wp:extent cx="2652193" cy="4363378"/>
+            <wp:effectExtent l="0" t="0" r="0" b="0"/>
+            <wp:docPr id="611272060" name="圖片 2"/>
+            <wp:cNvGraphicFramePr>
+              <a:graphicFrameLocks xmlns:a="http://schemas.openxmlformats.org/drawingml/2006/main" noChangeAspect="1"/>
+            </wp:cNvGraphicFramePr>
+            <a:graphic xmlns:a="http://schemas.openxmlformats.org/drawingml/2006/main">
+              <a:graphicData uri="http://schemas.openxmlformats.org/drawingml/2006/picture">
+                <pic:pic xmlns:pic="http://schemas.openxmlformats.org/drawingml/2006/picture">
+                  <pic:nvPicPr>
+                    <pic:cNvPr id="611272060" name="圖片 611272060"/>
+                    <pic:cNvPicPr/>
+                  </pic:nvPicPr>
+                  <pic:blipFill>
+                    <a:blip r:embed="rId7" cstate="print">
+                      <a:extLst>
+                        <a:ext uri="{28A0092B-C50C-407E-A947-70E740481C1C}">
+                          <a14:useLocalDpi xmlns:a14="http://schemas.microsoft.com/office/drawing/2010/main" val="0"/>
+                        </a:ext>
+                      </a:extLst>
+                    </a:blip>
+                    <a:stretch>
+                      <a:fillRect/>
+                    </a:stretch>
+                  </pic:blipFill>
+                  <pic:spPr>
+                    <a:xfrm>
+                      <a:off x="0" y="0"/>
+                      <a:ext cx="2671570" cy="4395257"/>
+                    </a:xfrm>
+                    <a:prstGeom prst="rect">
+                      <a:avLst/>
+                    </a:prstGeom>
+                  </pic:spPr>
+                </pic:pic>
+              </a:graphicData>
+            </a:graphic>
+          </wp:inline>
+        </w:drawing>
+      </w:r>
     </w:p>
     <w:p>
       <w:pPr>
@@ -832,19 +1210,17 @@
     </w:p>
     <w:p>
       <w:pPr>
-        <w:rPr>
-          <w:rFonts w:ascii="Times New Roman" w:eastAsia="標楷體" w:hAnsi="Times New Roman" w:cs="Times New Roman"/>
-        </w:rPr>
+        <w:pStyle w:val="3"/>
       </w:pPr>
       <w:r>
         <w:rPr>
-          <w:rFonts w:ascii="Times New Roman" w:eastAsia="標楷體" w:hAnsi="Times New Roman" w:cs="Times New Roman" w:hint="eastAsia"/>
+          <w:rFonts w:hint="eastAsia"/>
         </w:rPr>
         <w:t xml:space="preserve">1.5.1 </w:t>
       </w:r>
       <w:r>
         <w:rPr>
-          <w:rFonts w:ascii="Times New Roman" w:eastAsia="標楷體" w:hAnsi="Times New Roman" w:cs="Times New Roman" w:hint="eastAsia"/>
+          <w:rFonts w:hint="eastAsia"/>
         </w:rPr>
         <w:t>管理書籍清單</w:t>
       </w:r>
@@ -927,6 +1303,7 @@
               </w:rPr>
             </w:pPr>
             <w:proofErr w:type="spellStart"/>
+            <w:proofErr w:type="gramStart"/>
             <w:r>
               <w:rPr>
                 <w:rFonts w:ascii="Times New Roman" w:eastAsia="標楷體" w:hAnsi="Times New Roman" w:cs="Times New Roman" w:hint="eastAsia"/>
@@ -934,6 +1311,7 @@
               <w:t>Re:Book</w:t>
             </w:r>
             <w:proofErr w:type="spellEnd"/>
+            <w:proofErr w:type="gramEnd"/>
           </w:p>
         </w:tc>
       </w:tr>
@@ -1076,7 +1454,13 @@
               <w:rPr>
                 <w:rFonts w:ascii="Times New Roman" w:eastAsia="標楷體" w:hAnsi="Times New Roman" w:cs="Times New Roman" w:hint="eastAsia"/>
               </w:rPr>
-              <w:t>，以順利售出商品</w:t>
+              <w:t>，以順利售出</w:t>
+            </w:r>
+            <w:r>
+              <w:rPr>
+                <w:rFonts w:ascii="Times New Roman" w:eastAsia="標楷體" w:hAnsi="Times New Roman" w:cs="Times New Roman" w:hint="eastAsia"/>
+              </w:rPr>
+              <w:t>書籍</w:t>
             </w:r>
           </w:p>
           <w:p>
@@ -1095,12 +1479,13 @@
               <w:rPr>
                 <w:rFonts w:ascii="Times New Roman" w:eastAsia="標楷體" w:hAnsi="Times New Roman" w:cs="Times New Roman" w:hint="eastAsia"/>
               </w:rPr>
-              <w:t>商品</w:t>
-            </w:r>
-            <w:r>
-              <w:rPr>
-                <w:rFonts w:ascii="Times New Roman" w:eastAsia="標楷體" w:hAnsi="Times New Roman" w:cs="Times New Roman" w:hint="eastAsia"/>
-              </w:rPr>
+              <w:t>書籍</w:t>
+            </w:r>
+            <w:r>
+              <w:rPr>
+                <w:rFonts w:ascii="Times New Roman" w:eastAsia="標楷體" w:hAnsi="Times New Roman" w:cs="Times New Roman" w:hint="eastAsia"/>
+              </w:rPr>
+              <w:lastRenderedPageBreak/>
               <w:t>狀態與資訊。</w:t>
             </w:r>
           </w:p>
@@ -1121,6 +1506,7 @@
               <w:rPr>
                 <w:rFonts w:ascii="Times New Roman" w:eastAsia="標楷體" w:hAnsi="Times New Roman" w:cs="Times New Roman" w:hint="eastAsia"/>
               </w:rPr>
+              <w:lastRenderedPageBreak/>
               <w:t>Preconditions</w:t>
             </w:r>
           </w:p>
@@ -1177,7 +1563,7 @@
               <w:rPr>
                 <w:rFonts w:ascii="Times New Roman" w:eastAsia="標楷體" w:hAnsi="Times New Roman" w:cs="Times New Roman" w:hint="eastAsia"/>
               </w:rPr>
-              <w:t>商品</w:t>
+              <w:t>書籍</w:t>
             </w:r>
             <w:r>
               <w:rPr>
@@ -1233,7 +1619,7 @@
           <w:p>
             <w:pPr>
               <w:rPr>
-                <w:rFonts w:ascii="Times New Roman" w:eastAsia="標楷體" w:hAnsi="Times New Roman" w:cs="Times New Roman" w:hint="eastAsia"/>
+                <w:rFonts w:ascii="Times New Roman" w:eastAsia="標楷體" w:hAnsi="Times New Roman" w:cs="Times New Roman"/>
               </w:rPr>
             </w:pPr>
             <w:r>
@@ -1246,13 +1632,25 @@
               <w:rPr>
                 <w:rFonts w:ascii="Times New Roman" w:eastAsia="標楷體" w:hAnsi="Times New Roman" w:cs="Times New Roman"/>
               </w:rPr>
-              <w:t>系統顯示目前的書籍清單。</w:t>
-            </w:r>
-          </w:p>
-          <w:p>
-            <w:pPr>
-              <w:rPr>
-                <w:rFonts w:ascii="Times New Roman" w:eastAsia="標楷體" w:hAnsi="Times New Roman" w:cs="Times New Roman" w:hint="eastAsia"/>
+              <w:t>系統顯示目前</w:t>
+            </w:r>
+            <w:r>
+              <w:rPr>
+                <w:rFonts w:ascii="Times New Roman" w:eastAsia="標楷體" w:hAnsi="Times New Roman" w:cs="Times New Roman" w:hint="eastAsia"/>
+              </w:rPr>
+              <w:t>所有待售</w:t>
+            </w:r>
+            <w:r>
+              <w:rPr>
+                <w:rFonts w:ascii="Times New Roman" w:eastAsia="標楷體" w:hAnsi="Times New Roman" w:cs="Times New Roman"/>
+              </w:rPr>
+              <w:t>的書籍。</w:t>
+            </w:r>
+          </w:p>
+          <w:p>
+            <w:pPr>
+              <w:rPr>
+                <w:rFonts w:ascii="Times New Roman" w:eastAsia="標楷體" w:hAnsi="Times New Roman" w:cs="Times New Roman"/>
               </w:rPr>
             </w:pPr>
             <w:r>
@@ -1289,7 +1687,27 @@
               <w:rPr>
                 <w:rFonts w:ascii="Times New Roman" w:eastAsia="標楷體" w:hAnsi="Times New Roman" w:cs="Times New Roman" w:hint="eastAsia"/>
               </w:rPr>
-              <w:t>、書名、價格、書況及區域</w:t>
+              <w:t>、書名、價格、書</w:t>
+            </w:r>
+            <w:proofErr w:type="gramStart"/>
+            <w:r>
+              <w:rPr>
+                <w:rFonts w:ascii="Times New Roman" w:eastAsia="標楷體" w:hAnsi="Times New Roman" w:cs="Times New Roman" w:hint="eastAsia"/>
+              </w:rPr>
+              <w:t>況</w:t>
+            </w:r>
+            <w:proofErr w:type="gramEnd"/>
+            <w:r>
+              <w:rPr>
+                <w:rFonts w:ascii="Times New Roman" w:eastAsia="標楷體" w:hAnsi="Times New Roman" w:cs="Times New Roman" w:hint="eastAsia"/>
+              </w:rPr>
+              <w:t>及</w:t>
+            </w:r>
+            <w:r>
+              <w:rPr>
+                <w:rFonts w:ascii="Times New Roman" w:eastAsia="標楷體" w:hAnsi="Times New Roman" w:cs="Times New Roman" w:hint="eastAsia"/>
+              </w:rPr>
+              <w:t>書籍所在地</w:t>
             </w:r>
             <w:r>
               <w:rPr>
@@ -1307,7 +1725,7 @@
           <w:p>
             <w:pPr>
               <w:rPr>
-                <w:rFonts w:ascii="Times New Roman" w:eastAsia="標楷體" w:hAnsi="Times New Roman" w:cs="Times New Roman" w:hint="eastAsia"/>
+                <w:rFonts w:ascii="Times New Roman" w:eastAsia="標楷體" w:hAnsi="Times New Roman" w:cs="Times New Roman"/>
               </w:rPr>
             </w:pPr>
             <w:r>
@@ -1326,14 +1744,28 @@
               <w:rPr>
                 <w:rFonts w:ascii="Times New Roman" w:eastAsia="標楷體" w:hAnsi="Times New Roman" w:cs="Times New Roman" w:hint="eastAsia"/>
               </w:rPr>
-              <w:t>系統驗證資料格式</w:t>
-            </w:r>
+              <w:t>系統驗證</w:t>
+            </w:r>
+            <w:r>
+              <w:rPr>
+                <w:rFonts w:ascii="Times New Roman" w:eastAsia="標楷體" w:hAnsi="Times New Roman" w:cs="Times New Roman" w:hint="eastAsia"/>
+              </w:rPr>
+              <w:t>ISBN</w:t>
+            </w:r>
+            <w:r>
+              <w:rPr>
+                <w:rFonts w:ascii="Times New Roman" w:eastAsia="標楷體" w:hAnsi="Times New Roman" w:cs="Times New Roman" w:hint="eastAsia"/>
+              </w:rPr>
+              <w:t>格式</w:t>
+            </w:r>
+            <w:proofErr w:type="gramStart"/>
             <w:r>
               <w:rPr>
                 <w:rFonts w:ascii="Times New Roman" w:eastAsia="標楷體" w:hAnsi="Times New Roman" w:cs="Times New Roman" w:hint="eastAsia"/>
               </w:rPr>
               <w:t>與必填欄位</w:t>
             </w:r>
+            <w:proofErr w:type="gramEnd"/>
             <w:r>
               <w:rPr>
                 <w:rFonts w:ascii="Times New Roman" w:eastAsia="標楷體" w:hAnsi="Times New Roman" w:cs="Times New Roman" w:hint="eastAsia"/>
@@ -1369,7 +1801,7 @@
           <w:p>
             <w:pPr>
               <w:rPr>
-                <w:rFonts w:ascii="Times New Roman" w:eastAsia="標楷體" w:hAnsi="Times New Roman" w:cs="Times New Roman" w:hint="eastAsia"/>
+                <w:rFonts w:ascii="Times New Roman" w:eastAsia="標楷體" w:hAnsi="Times New Roman" w:cs="Times New Roman"/>
               </w:rPr>
             </w:pPr>
             <w:r>
@@ -1444,7 +1876,37 @@
               <w:rPr>
                 <w:rFonts w:ascii="Times New Roman" w:eastAsia="標楷體" w:hAnsi="Times New Roman" w:cs="Times New Roman" w:hint="eastAsia"/>
               </w:rPr>
-              <w:t>系統跳出確認刪除警告。</w:t>
+              <w:t>系統跳出</w:t>
+            </w:r>
+            <w:r>
+              <w:rPr>
+                <w:rFonts w:ascii="Times New Roman" w:eastAsia="標楷體" w:hAnsi="Times New Roman" w:cs="Times New Roman" w:hint="eastAsia"/>
+              </w:rPr>
+              <w:t>警告</w:t>
+            </w:r>
+            <w:r>
+              <w:rPr>
+                <w:rFonts w:ascii="Times New Roman" w:eastAsia="標楷體" w:hAnsi="Times New Roman" w:cs="Times New Roman" w:hint="eastAsia"/>
+              </w:rPr>
+              <w:t>以</w:t>
+            </w:r>
+            <w:r>
+              <w:rPr>
+                <w:rFonts w:ascii="Times New Roman" w:eastAsia="標楷體" w:hAnsi="Times New Roman" w:cs="Times New Roman" w:hint="eastAsia"/>
+              </w:rPr>
+              <w:t>確認</w:t>
+            </w:r>
+            <w:r>
+              <w:rPr>
+                <w:rFonts w:ascii="Times New Roman" w:eastAsia="標楷體" w:hAnsi="Times New Roman" w:cs="Times New Roman" w:hint="eastAsia"/>
+              </w:rPr>
+              <w:t>是否</w:t>
+            </w:r>
+            <w:r>
+              <w:rPr>
+                <w:rFonts w:ascii="Times New Roman" w:eastAsia="標楷體" w:hAnsi="Times New Roman" w:cs="Times New Roman" w:hint="eastAsia"/>
+              </w:rPr>
+              <w:t>刪除。</w:t>
             </w:r>
           </w:p>
           <w:p>
@@ -1498,7 +1960,19 @@
               <w:rPr>
                 <w:rFonts w:ascii="Times New Roman" w:eastAsia="標楷體" w:hAnsi="Times New Roman" w:cs="Times New Roman" w:hint="eastAsia"/>
               </w:rPr>
-              <w:t>項商品</w:t>
+              <w:t>本</w:t>
+            </w:r>
+            <w:r>
+              <w:rPr>
+                <w:rFonts w:ascii="Times New Roman" w:eastAsia="標楷體" w:hAnsi="Times New Roman" w:cs="Times New Roman" w:hint="eastAsia"/>
+              </w:rPr>
+              <w:t>書籍</w:t>
+            </w:r>
+            <w:r>
+              <w:rPr>
+                <w:rFonts w:ascii="Times New Roman" w:eastAsia="標楷體" w:hAnsi="Times New Roman" w:cs="Times New Roman" w:hint="eastAsia"/>
+              </w:rPr>
+              <w:t>資料</w:t>
             </w:r>
             <w:r>
               <w:rPr>
@@ -1515,163 +1989,21 @@
                 <w:numId w:val="4"/>
               </w:numPr>
               <w:rPr>
-                <w:rFonts w:ascii="Times New Roman" w:eastAsia="標楷體" w:hAnsi="Times New Roman" w:cs="Times New Roman" w:hint="eastAsia"/>
-                <w:highlight w:val="yellow"/>
-              </w:rPr>
-            </w:pPr>
-            <w:r>
-              <w:rPr>
-                <w:rFonts w:ascii="Times New Roman" w:eastAsia="標楷體" w:hAnsi="Times New Roman" w:cs="Times New Roman"/>
-                <w:highlight w:val="yellow"/>
-              </w:rPr>
-              <w:t>接續執行</w:t>
-            </w:r>
-            <w:r>
-              <w:rPr>
-                <w:rFonts w:ascii="Times New Roman" w:eastAsia="標楷體" w:hAnsi="Times New Roman" w:cs="Times New Roman" w:hint="eastAsia"/>
-                <w:highlight w:val="yellow"/>
-              </w:rPr>
-              <w:t>Main Success Scenario</w:t>
-            </w:r>
-            <w:r>
-              <w:rPr>
-                <w:rFonts w:ascii="Times New Roman" w:eastAsia="標楷體" w:hAnsi="Times New Roman" w:cs="Times New Roman"/>
-                <w:highlight w:val="yellow"/>
-              </w:rPr>
-              <w:t>第</w:t>
-            </w:r>
-            <w:r>
-              <w:rPr>
-                <w:rFonts w:ascii="Times New Roman" w:eastAsia="標楷體" w:hAnsi="Times New Roman" w:cs="Times New Roman"/>
-                <w:highlight w:val="yellow"/>
-              </w:rPr>
-              <w:t>6</w:t>
-            </w:r>
-            <w:r>
-              <w:rPr>
-                <w:rFonts w:ascii="Times New Roman" w:eastAsia="標楷體" w:hAnsi="Times New Roman" w:cs="Times New Roman"/>
-                <w:highlight w:val="yellow"/>
-              </w:rPr>
-              <w:t>步。</w:t>
-            </w:r>
-          </w:p>
-          <w:p>
-            <w:pPr>
-              <w:rPr>
-                <w:rFonts w:ascii="Times New Roman" w:eastAsia="標楷體" w:hAnsi="Times New Roman" w:cs="Times New Roman"/>
-                <w:highlight w:val="yellow"/>
-              </w:rPr>
-            </w:pPr>
-            <w:r>
-              <w:rPr>
-                <w:rFonts w:ascii="Times New Roman" w:eastAsia="標楷體" w:hAnsi="Times New Roman" w:cs="Times New Roman" w:hint="eastAsia"/>
-                <w:highlight w:val="yellow"/>
-              </w:rPr>
-              <w:t xml:space="preserve">3b. </w:t>
-            </w:r>
-            <w:r>
-              <w:rPr>
-                <w:rFonts w:ascii="Times New Roman" w:eastAsia="標楷體" w:hAnsi="Times New Roman" w:cs="Times New Roman"/>
-                <w:highlight w:val="yellow"/>
-              </w:rPr>
-              <w:t>賣家選擇「查詢」書籍：</w:t>
-            </w:r>
-          </w:p>
-          <w:p>
-            <w:pPr>
-              <w:pStyle w:val="a9"/>
-              <w:numPr>
-                <w:ilvl w:val="0"/>
-                <w:numId w:val="5"/>
-              </w:numPr>
-              <w:rPr>
-                <w:rFonts w:ascii="Times New Roman" w:eastAsia="標楷體" w:hAnsi="Times New Roman" w:cs="Times New Roman"/>
-                <w:highlight w:val="yellow"/>
-              </w:rPr>
-            </w:pPr>
-            <w:r>
-              <w:rPr>
-                <w:rFonts w:ascii="Times New Roman" w:eastAsia="標楷體" w:hAnsi="Times New Roman" w:cs="Times New Roman"/>
-                <w:highlight w:val="yellow"/>
-              </w:rPr>
-              <w:t>賣家輸入查詢關鍵字（如書名或</w:t>
-            </w:r>
-            <w:r>
-              <w:rPr>
-                <w:rFonts w:ascii="Times New Roman" w:eastAsia="標楷體" w:hAnsi="Times New Roman" w:cs="Times New Roman"/>
-                <w:highlight w:val="yellow"/>
-              </w:rPr>
-              <w:t xml:space="preserve"> ISBN</w:t>
-            </w:r>
-            <w:r>
-              <w:rPr>
-                <w:rFonts w:ascii="Times New Roman" w:eastAsia="標楷體" w:hAnsi="Times New Roman" w:cs="Times New Roman"/>
-                <w:highlight w:val="yellow"/>
-              </w:rPr>
-              <w:t>）。</w:t>
-            </w:r>
-          </w:p>
-          <w:p>
-            <w:pPr>
-              <w:pStyle w:val="a9"/>
-              <w:numPr>
-                <w:ilvl w:val="0"/>
-                <w:numId w:val="5"/>
-              </w:numPr>
-              <w:rPr>
-                <w:rFonts w:ascii="Times New Roman" w:eastAsia="標楷體" w:hAnsi="Times New Roman" w:cs="Times New Roman" w:hint="eastAsia"/>
-              </w:rPr>
-            </w:pPr>
-            <w:r>
-              <w:rPr>
-                <w:rFonts w:ascii="Times New Roman" w:eastAsia="標楷體" w:hAnsi="Times New Roman" w:cs="Times New Roman"/>
-                <w:highlight w:val="yellow"/>
-              </w:rPr>
-              <w:lastRenderedPageBreak/>
-              <w:t>系統</w:t>
-            </w:r>
-            <w:r>
-              <w:rPr>
-                <w:rFonts w:ascii="Times New Roman" w:eastAsia="標楷體" w:hAnsi="Times New Roman" w:cs="Times New Roman" w:hint="eastAsia"/>
-                <w:highlight w:val="yellow"/>
-              </w:rPr>
-              <w:t>篩選</w:t>
-            </w:r>
-            <w:r>
-              <w:rPr>
-                <w:rFonts w:ascii="Times New Roman" w:eastAsia="標楷體" w:hAnsi="Times New Roman" w:cs="Times New Roman"/>
-                <w:highlight w:val="yellow"/>
-              </w:rPr>
-              <w:t>並顯示符合條件的書籍清單</w:t>
-            </w:r>
-            <w:r>
-              <w:rPr>
-                <w:rFonts w:ascii="Times New Roman" w:eastAsia="標楷體" w:hAnsi="Times New Roman" w:cs="Times New Roman"/>
-                <w:highlight w:val="yellow"/>
+                <w:rFonts w:ascii="Times New Roman" w:eastAsia="標楷體" w:hAnsi="Times New Roman" w:cs="Times New Roman"/>
+              </w:rPr>
+            </w:pPr>
+            <w:r>
+              <w:rPr>
+                <w:rFonts w:ascii="Times New Roman" w:eastAsia="標楷體" w:hAnsi="Times New Roman" w:cs="Times New Roman"/>
+              </w:rPr>
+              <w:t>重新載入清單，顯示最新狀態</w:t>
+            </w:r>
+            <w:r>
+              <w:rPr>
+                <w:rFonts w:ascii="Times New Roman" w:eastAsia="標楷體" w:hAnsi="Times New Roman" w:cs="Times New Roman"/>
               </w:rPr>
               <w:t>。</w:t>
             </w:r>
-            <w:r>
-              <w:rPr>
-                <w:rFonts w:ascii="Times New Roman" w:eastAsia="標楷體" w:hAnsi="Times New Roman" w:cs="Times New Roman" w:hint="eastAsia"/>
-                <w:highlight w:val="yellow"/>
-              </w:rPr>
-              <w:t>（</w:t>
-            </w:r>
-            <w:r>
-              <w:rPr>
-                <w:rFonts w:ascii="Times New Roman" w:eastAsia="標楷體" w:hAnsi="Times New Roman" w:cs="Times New Roman" w:hint="eastAsia"/>
-                <w:highlight w:val="yellow"/>
-              </w:rPr>
-              <w:t>use case</w:t>
-            </w:r>
-            <w:r>
-              <w:rPr>
-                <w:rFonts w:ascii="Times New Roman" w:eastAsia="標楷體" w:hAnsi="Times New Roman" w:cs="Times New Roman" w:hint="eastAsia"/>
-                <w:highlight w:val="yellow"/>
-              </w:rPr>
-              <w:t>結束）</w:t>
-            </w:r>
           </w:p>
           <w:p>
             <w:pPr>
@@ -1719,7 +2051,7 @@
           <w:p>
             <w:pPr>
               <w:rPr>
-                <w:rFonts w:ascii="Times New Roman" w:eastAsia="標楷體" w:hAnsi="Times New Roman" w:cs="Times New Roman"/>
+                <w:rFonts w:ascii="Times New Roman" w:eastAsia="標楷體" w:hAnsi="Times New Roman" w:cs="Times New Roman" w:hint="eastAsia"/>
               </w:rPr>
             </w:pPr>
             <w:r>
@@ -1745,82 +2077,6 @@
                 <w:rFonts w:ascii="Times New Roman" w:eastAsia="標楷體" w:hAnsi="Times New Roman" w:cs="Times New Roman" w:hint="eastAsia"/>
               </w:rPr>
               <w:t>必填欄位缺失：系統標示未填欄位。</w:t>
-            </w:r>
-          </w:p>
-          <w:p>
-            <w:pPr>
-              <w:rPr>
-                <w:rFonts w:ascii="Times New Roman" w:eastAsia="標楷體" w:hAnsi="Times New Roman" w:cs="Times New Roman"/>
-              </w:rPr>
-            </w:pPr>
-            <w:r>
-              <w:rPr>
-                <w:rFonts w:ascii="Times New Roman" w:eastAsia="標楷體" w:hAnsi="Times New Roman" w:cs="Times New Roman" w:hint="eastAsia"/>
-              </w:rPr>
-              <w:t>5a</w:t>
-            </w:r>
-            <w:r>
-              <w:rPr>
-                <w:rFonts w:ascii="Times New Roman" w:eastAsia="標楷體" w:hAnsi="Times New Roman" w:cs="Times New Roman" w:hint="eastAsia"/>
-              </w:rPr>
-              <w:t>.</w:t>
-            </w:r>
-            <w:r>
-              <w:rPr>
-                <w:rFonts w:ascii="Times New Roman" w:eastAsia="標楷體" w:hAnsi="Times New Roman" w:cs="Times New Roman" w:hint="eastAsia"/>
-              </w:rPr>
-              <w:t xml:space="preserve"> </w:t>
-            </w:r>
-            <w:r>
-              <w:rPr>
-                <w:rFonts w:ascii="Times New Roman" w:eastAsia="標楷體" w:hAnsi="Times New Roman" w:cs="Times New Roman" w:hint="eastAsia"/>
-              </w:rPr>
-              <w:t>找不到要</w:t>
-            </w:r>
-            <w:r>
-              <w:rPr>
-                <w:rFonts w:ascii="Times New Roman" w:eastAsia="標楷體" w:hAnsi="Times New Roman" w:cs="Times New Roman" w:hint="eastAsia"/>
-              </w:rPr>
-              <w:t>刪除</w:t>
-            </w:r>
-            <w:r>
-              <w:rPr>
-                <w:rFonts w:ascii="Times New Roman" w:eastAsia="標楷體" w:hAnsi="Times New Roman" w:cs="Times New Roman" w:hint="eastAsia"/>
-              </w:rPr>
-              <w:t>的書籍</w:t>
-            </w:r>
-            <w:r>
-              <w:rPr>
-                <w:rFonts w:ascii="Times New Roman" w:eastAsia="標楷體" w:hAnsi="Times New Roman" w:cs="Times New Roman" w:hint="eastAsia"/>
-              </w:rPr>
-              <w:t>：</w:t>
-            </w:r>
-            <w:r>
-              <w:rPr>
-                <w:rFonts w:ascii="Times New Roman" w:eastAsia="標楷體" w:hAnsi="Times New Roman" w:cs="Times New Roman" w:hint="eastAsia"/>
-              </w:rPr>
-              <w:t>系統提示無此書籍</w:t>
-            </w:r>
-            <w:r>
-              <w:rPr>
-                <w:rFonts w:ascii="Times New Roman" w:eastAsia="標楷體" w:hAnsi="Times New Roman" w:cs="Times New Roman" w:hint="eastAsia"/>
-                <w:highlight w:val="yellow"/>
-              </w:rPr>
-              <w:t>（</w:t>
-            </w:r>
-            <w:r>
-              <w:rPr>
-                <w:rFonts w:ascii="Times New Roman" w:eastAsia="標楷體" w:hAnsi="Times New Roman" w:cs="Times New Roman" w:hint="eastAsia"/>
-                <w:highlight w:val="yellow"/>
-              </w:rPr>
-              <w:t>use case</w:t>
-            </w:r>
-            <w:r>
-              <w:rPr>
-                <w:rFonts w:ascii="Times New Roman" w:eastAsia="標楷體" w:hAnsi="Times New Roman" w:cs="Times New Roman" w:hint="eastAsia"/>
-                <w:highlight w:val="yellow"/>
-              </w:rPr>
-              <w:t>結束）</w:t>
             </w:r>
           </w:p>
         </w:tc>
@@ -1840,7 +2096,6 @@
               <w:rPr>
                 <w:rFonts w:ascii="Times New Roman" w:eastAsia="標楷體" w:hAnsi="Times New Roman" w:cs="Times New Roman" w:hint="eastAsia"/>
               </w:rPr>
-              <w:lastRenderedPageBreak/>
               <w:t>Special Re</w:t>
             </w:r>
             <w:r>
@@ -1915,19 +2170,7 @@
               <w:rPr>
                 <w:rFonts w:ascii="Times New Roman" w:eastAsia="標楷體" w:hAnsi="Times New Roman" w:cs="Times New Roman" w:hint="eastAsia"/>
               </w:rPr>
-              <w:t>賣家透過</w:t>
-            </w:r>
-            <w:r>
-              <w:rPr>
-                <w:rFonts w:ascii="Times New Roman" w:eastAsia="標楷體" w:hAnsi="Times New Roman" w:cs="Times New Roman" w:hint="eastAsia"/>
-              </w:rPr>
-              <w:t xml:space="preserve"> Web </w:t>
-            </w:r>
-            <w:r>
-              <w:rPr>
-                <w:rFonts w:ascii="Times New Roman" w:eastAsia="標楷體" w:hAnsi="Times New Roman" w:cs="Times New Roman" w:hint="eastAsia"/>
-              </w:rPr>
-              <w:t>瀏覽器手動輸入資料</w:t>
+              <w:t>無</w:t>
             </w:r>
           </w:p>
         </w:tc>
@@ -1965,31 +2208,7 @@
               <w:rPr>
                 <w:rFonts w:ascii="Times New Roman" w:eastAsia="標楷體" w:hAnsi="Times New Roman" w:cs="Times New Roman" w:hint="eastAsia"/>
               </w:rPr>
-              <w:t>每當賣家有新</w:t>
-            </w:r>
-            <w:r>
-              <w:rPr>
-                <w:rFonts w:ascii="Times New Roman" w:eastAsia="標楷體" w:hAnsi="Times New Roman" w:cs="Times New Roman" w:hint="eastAsia"/>
-              </w:rPr>
-              <w:t>商品</w:t>
-            </w:r>
-            <w:r>
-              <w:rPr>
-                <w:rFonts w:ascii="Times New Roman" w:eastAsia="標楷體" w:hAnsi="Times New Roman" w:cs="Times New Roman" w:hint="eastAsia"/>
-              </w:rPr>
-              <w:t>要</w:t>
-            </w:r>
-            <w:r>
-              <w:rPr>
-                <w:rFonts w:ascii="Times New Roman" w:eastAsia="標楷體" w:hAnsi="Times New Roman" w:cs="Times New Roman" w:hint="eastAsia"/>
-              </w:rPr>
-              <w:t>上架</w:t>
-            </w:r>
-            <w:r>
-              <w:rPr>
-                <w:rFonts w:ascii="Times New Roman" w:eastAsia="標楷體" w:hAnsi="Times New Roman" w:cs="Times New Roman" w:hint="eastAsia"/>
-              </w:rPr>
-              <w:t>或商品狀態改變時觸發（高頻率）。</w:t>
+              <w:t>高頻率</w:t>
             </w:r>
           </w:p>
         </w:tc>
@@ -2042,19 +2261,17 @@
     </w:p>
     <w:p>
       <w:pPr>
-        <w:rPr>
-          <w:rFonts w:ascii="Times New Roman" w:eastAsia="標楷體" w:hAnsi="Times New Roman" w:cs="Times New Roman"/>
-        </w:rPr>
+        <w:pStyle w:val="3"/>
       </w:pPr>
       <w:r>
         <w:rPr>
-          <w:rFonts w:ascii="Times New Roman" w:eastAsia="標楷體" w:hAnsi="Times New Roman" w:cs="Times New Roman" w:hint="eastAsia"/>
+          <w:rFonts w:hint="eastAsia"/>
         </w:rPr>
         <w:t xml:space="preserve">1.5.2 </w:t>
       </w:r>
       <w:r>
         <w:rPr>
-          <w:rFonts w:ascii="Times New Roman" w:eastAsia="標楷體" w:hAnsi="Times New Roman" w:cs="Times New Roman" w:hint="eastAsia"/>
+          <w:rFonts w:hint="eastAsia"/>
         </w:rPr>
         <w:t>搜尋書籍</w:t>
       </w:r>
@@ -2137,6 +2354,7 @@
               </w:rPr>
             </w:pPr>
             <w:proofErr w:type="spellStart"/>
+            <w:proofErr w:type="gramStart"/>
             <w:r>
               <w:rPr>
                 <w:rFonts w:ascii="Times New Roman" w:eastAsia="標楷體" w:hAnsi="Times New Roman" w:cs="Times New Roman" w:hint="eastAsia"/>
@@ -2144,6 +2362,7 @@
               <w:t>Re:Book</w:t>
             </w:r>
             <w:proofErr w:type="spellEnd"/>
+            <w:proofErr w:type="gramEnd"/>
           </w:p>
         </w:tc>
       </w:tr>
@@ -2206,6 +2425,7 @@
               <w:rPr>
                 <w:rFonts w:ascii="Times New Roman" w:eastAsia="標楷體" w:hAnsi="Times New Roman" w:cs="Times New Roman" w:hint="eastAsia"/>
               </w:rPr>
+              <w:lastRenderedPageBreak/>
               <w:t>Primary Actor</w:t>
             </w:r>
           </w:p>
@@ -2319,19 +2539,19 @@
               <w:rPr>
                 <w:rFonts w:ascii="Times New Roman" w:eastAsia="標楷體" w:hAnsi="Times New Roman" w:cs="Times New Roman" w:hint="eastAsia"/>
               </w:rPr>
-              <w:t>系統已建立</w:t>
-            </w:r>
-            <w:r>
-              <w:rPr>
-                <w:rFonts w:ascii="Times New Roman" w:eastAsia="標楷體" w:hAnsi="Times New Roman" w:cs="Times New Roman" w:hint="eastAsia"/>
-              </w:rPr>
-              <w:t>商品</w:t>
-            </w:r>
-            <w:r>
-              <w:rPr>
-                <w:rFonts w:ascii="Times New Roman" w:eastAsia="標楷體" w:hAnsi="Times New Roman" w:cs="Times New Roman" w:hint="eastAsia"/>
-              </w:rPr>
-              <w:t>資料庫，且買家已進入搜尋頁面（不一定要登入即可搜尋，但購買通常需登入）。</w:t>
+              <w:t>買家已進入搜尋頁面（不</w:t>
+            </w:r>
+            <w:r>
+              <w:rPr>
+                <w:rFonts w:ascii="Times New Roman" w:eastAsia="標楷體" w:hAnsi="Times New Roman" w:cs="Times New Roman" w:hint="eastAsia"/>
+              </w:rPr>
+              <w:t>需</w:t>
+            </w:r>
+            <w:r>
+              <w:rPr>
+                <w:rFonts w:ascii="Times New Roman" w:eastAsia="標楷體" w:hAnsi="Times New Roman" w:cs="Times New Roman" w:hint="eastAsia"/>
+              </w:rPr>
+              <w:t>登入即可搜尋）。</w:t>
             </w:r>
           </w:p>
         </w:tc>
@@ -2369,13 +2589,25 @@
               <w:rPr>
                 <w:rFonts w:ascii="Times New Roman" w:eastAsia="標楷體" w:hAnsi="Times New Roman" w:cs="Times New Roman" w:hint="eastAsia"/>
               </w:rPr>
-              <w:t>系統根據買家輸入的準則，顯示符合條件的</w:t>
-            </w:r>
-            <w:r>
-              <w:rPr>
-                <w:rFonts w:ascii="Times New Roman" w:eastAsia="標楷體" w:hAnsi="Times New Roman" w:cs="Times New Roman" w:hint="eastAsia"/>
-              </w:rPr>
-              <w:t>商品</w:t>
+              <w:t>系統根據買家輸入的</w:t>
+            </w:r>
+            <w:r>
+              <w:rPr>
+                <w:rFonts w:ascii="Times New Roman" w:eastAsia="標楷體" w:hAnsi="Times New Roman" w:cs="Times New Roman" w:hint="eastAsia"/>
+              </w:rPr>
+              <w:t>條件</w:t>
+            </w:r>
+            <w:r>
+              <w:rPr>
+                <w:rFonts w:ascii="Times New Roman" w:eastAsia="標楷體" w:hAnsi="Times New Roman" w:cs="Times New Roman" w:hint="eastAsia"/>
+              </w:rPr>
+              <w:t>，顯示符合的</w:t>
+            </w:r>
+            <w:r>
+              <w:rPr>
+                <w:rFonts w:ascii="Times New Roman" w:eastAsia="標楷體" w:hAnsi="Times New Roman" w:cs="Times New Roman" w:hint="eastAsia"/>
+              </w:rPr>
+              <w:t>書籍</w:t>
             </w:r>
             <w:r>
               <w:rPr>
@@ -2456,19 +2688,47 @@
               <w:rPr>
                 <w:rFonts w:ascii="Times New Roman" w:eastAsia="標楷體" w:hAnsi="Times New Roman" w:cs="Times New Roman" w:hint="eastAsia"/>
               </w:rPr>
-              <w:t>買家選擇篩選條件（如：區域</w:t>
-            </w:r>
-            <w:r>
-              <w:rPr>
-                <w:rFonts w:ascii="Times New Roman" w:eastAsia="標楷體" w:hAnsi="Times New Roman" w:cs="Times New Roman" w:hint="eastAsia"/>
-              </w:rPr>
-              <w:t>/</w:t>
-            </w:r>
-            <w:r>
-              <w:rPr>
-                <w:rFonts w:ascii="Times New Roman" w:eastAsia="標楷體" w:hAnsi="Times New Roman" w:cs="Times New Roman" w:hint="eastAsia"/>
-              </w:rPr>
-              <w:t>校區、價格範圍、書況）。</w:t>
+              <w:t>買家選擇篩選條件</w:t>
+            </w:r>
+            <w:proofErr w:type="gramStart"/>
+            <w:r>
+              <w:rPr>
+                <w:rFonts w:ascii="Times New Roman" w:eastAsia="標楷體" w:hAnsi="Times New Roman" w:cs="Times New Roman" w:hint="eastAsia"/>
+              </w:rPr>
+              <w:t>（</w:t>
+            </w:r>
+            <w:proofErr w:type="gramEnd"/>
+            <w:r>
+              <w:rPr>
+                <w:rFonts w:ascii="Times New Roman" w:eastAsia="標楷體" w:hAnsi="Times New Roman" w:cs="Times New Roman" w:hint="eastAsia"/>
+              </w:rPr>
+              <w:t>如：</w:t>
+            </w:r>
+            <w:r>
+              <w:rPr>
+                <w:rFonts w:ascii="Times New Roman" w:eastAsia="標楷體" w:hAnsi="Times New Roman" w:cs="Times New Roman" w:hint="eastAsia"/>
+              </w:rPr>
+              <w:t>所在地</w:t>
+            </w:r>
+            <w:r>
+              <w:rPr>
+                <w:rFonts w:ascii="Times New Roman" w:eastAsia="標楷體" w:hAnsi="Times New Roman" w:cs="Times New Roman" w:hint="eastAsia"/>
+              </w:rPr>
+              <w:t>、價格範圍</w:t>
+            </w:r>
+            <w:proofErr w:type="gramStart"/>
+            <w:r>
+              <w:rPr>
+                <w:rFonts w:ascii="Times New Roman" w:eastAsia="標楷體" w:hAnsi="Times New Roman" w:cs="Times New Roman" w:hint="eastAsia"/>
+              </w:rPr>
+              <w:t>）</w:t>
+            </w:r>
+            <w:proofErr w:type="gramEnd"/>
+            <w:r>
+              <w:rPr>
+                <w:rFonts w:ascii="Times New Roman" w:eastAsia="標楷體" w:hAnsi="Times New Roman" w:cs="Times New Roman" w:hint="eastAsia"/>
+              </w:rPr>
+              <w:t>。</w:t>
             </w:r>
           </w:p>
           <w:p>
@@ -2487,7 +2747,19 @@
               <w:rPr>
                 <w:rFonts w:ascii="Times New Roman" w:eastAsia="標楷體" w:hAnsi="Times New Roman" w:cs="Times New Roman" w:hint="eastAsia"/>
               </w:rPr>
-              <w:t>系統根據輸入的關鍵字與篩選準則檢索資料庫。</w:t>
+              <w:t>系統根據輸入的關鍵字與篩選</w:t>
+            </w:r>
+            <w:r>
+              <w:rPr>
+                <w:rFonts w:ascii="Times New Roman" w:eastAsia="標楷體" w:hAnsi="Times New Roman" w:cs="Times New Roman" w:hint="eastAsia"/>
+              </w:rPr>
+              <w:t>條件</w:t>
+            </w:r>
+            <w:r>
+              <w:rPr>
+                <w:rFonts w:ascii="Times New Roman" w:eastAsia="標楷體" w:hAnsi="Times New Roman" w:cs="Times New Roman" w:hint="eastAsia"/>
+              </w:rPr>
+              <w:t>檢索資料庫。</w:t>
             </w:r>
           </w:p>
           <w:p>
@@ -2506,33 +2778,32 @@
               <w:rPr>
                 <w:rFonts w:ascii="Times New Roman" w:eastAsia="標楷體" w:hAnsi="Times New Roman" w:cs="Times New Roman" w:hint="eastAsia"/>
               </w:rPr>
-              <w:t>系統依據相關性或價格排序，顯示搜尋結果列表。</w:t>
-            </w:r>
-          </w:p>
-          <w:p>
-            <w:pPr>
-              <w:rPr>
-                <w:rFonts w:ascii="Times New Roman" w:eastAsia="標楷體" w:hAnsi="Times New Roman" w:cs="Times New Roman"/>
-              </w:rPr>
-            </w:pPr>
-            <w:r>
-              <w:rPr>
-                <w:rFonts w:ascii="Times New Roman" w:eastAsia="標楷體" w:hAnsi="Times New Roman" w:cs="Times New Roman" w:hint="eastAsia"/>
-              </w:rPr>
-              <w:lastRenderedPageBreak/>
+              <w:t>系統顯示搜尋結果列表。</w:t>
+            </w:r>
+          </w:p>
+          <w:p>
+            <w:pPr>
+              <w:rPr>
+                <w:rFonts w:ascii="Times New Roman" w:eastAsia="標楷體" w:hAnsi="Times New Roman" w:cs="Times New Roman"/>
+              </w:rPr>
+            </w:pPr>
+            <w:r>
+              <w:rPr>
+                <w:rFonts w:ascii="Times New Roman" w:eastAsia="標楷體" w:hAnsi="Times New Roman" w:cs="Times New Roman" w:hint="eastAsia"/>
+              </w:rPr>
               <w:t xml:space="preserve">5. </w:t>
             </w:r>
             <w:r>
               <w:rPr>
                 <w:rFonts w:ascii="Times New Roman" w:eastAsia="標楷體" w:hAnsi="Times New Roman" w:cs="Times New Roman" w:hint="eastAsia"/>
               </w:rPr>
-              <w:t>買家點擊感興趣的</w:t>
-            </w:r>
-            <w:r>
-              <w:rPr>
-                <w:rFonts w:ascii="Times New Roman" w:eastAsia="標楷體" w:hAnsi="Times New Roman" w:cs="Times New Roman" w:hint="eastAsia"/>
-              </w:rPr>
-              <w:t>商品</w:t>
+              <w:t>買家點擊</w:t>
+            </w:r>
+            <w:r>
+              <w:rPr>
+                <w:rFonts w:ascii="Times New Roman" w:eastAsia="標楷體" w:hAnsi="Times New Roman" w:cs="Times New Roman" w:hint="eastAsia"/>
+              </w:rPr>
+              <w:t>書籍</w:t>
             </w:r>
             <w:r>
               <w:rPr>
@@ -2558,7 +2829,6 @@
               <w:rPr>
                 <w:rFonts w:ascii="Times New Roman" w:eastAsia="標楷體" w:hAnsi="Times New Roman" w:cs="Times New Roman" w:hint="eastAsia"/>
               </w:rPr>
-              <w:lastRenderedPageBreak/>
               <w:t>Extensions</w:t>
             </w:r>
           </w:p>
@@ -2583,7 +2853,7 @@
               <w:rPr>
                 <w:rFonts w:ascii="Times New Roman" w:eastAsia="標楷體" w:hAnsi="Times New Roman" w:cs="Times New Roman" w:hint="eastAsia"/>
               </w:rPr>
-              <w:t>查無結果：系統提示「找不到相符的書籍」，並建議更改關鍵字或放寬篩選條件。</w:t>
+              <w:t>查無結果：系統提示「找不到相符的書籍」。</w:t>
             </w:r>
           </w:p>
           <w:p>
@@ -2666,24 +2936,6 @@
               </w:rPr>
               <w:t>秒。</w:t>
             </w:r>
-            <w:r>
-              <w:rPr>
-                <w:rFonts w:ascii="Times New Roman" w:eastAsia="標楷體" w:hAnsi="Times New Roman" w:cs="Times New Roman" w:hint="eastAsia"/>
-              </w:rPr>
-              <w:t xml:space="preserve"> (</w:t>
-            </w:r>
-            <w:r>
-              <w:rPr>
-                <w:rFonts w:ascii="Times New Roman" w:eastAsia="標楷體" w:hAnsi="Times New Roman" w:cs="Times New Roman" w:hint="eastAsia"/>
-              </w:rPr>
-              <w:t>屬</w:t>
-            </w:r>
-            <w:r>
-              <w:rPr>
-                <w:rFonts w:ascii="Times New Roman" w:eastAsia="標楷體" w:hAnsi="Times New Roman" w:cs="Times New Roman" w:hint="eastAsia"/>
-              </w:rPr>
-              <w:t xml:space="preserve"> Non-functional Requirement)</w:t>
-            </w:r>
           </w:p>
         </w:tc>
       </w:tr>
@@ -2720,31 +2972,7 @@
               <w:rPr>
                 <w:rFonts w:ascii="Times New Roman" w:eastAsia="標楷體" w:hAnsi="Times New Roman" w:cs="Times New Roman" w:hint="eastAsia"/>
               </w:rPr>
-              <w:t>支援部分關鍵字匹配（模糊搜尋）；支援</w:t>
-            </w:r>
-            <w:r>
-              <w:rPr>
-                <w:rFonts w:ascii="Times New Roman" w:eastAsia="標楷體" w:hAnsi="Times New Roman" w:cs="Times New Roman" w:hint="eastAsia"/>
-              </w:rPr>
-              <w:t xml:space="preserve"> ISBN-10 </w:t>
-            </w:r>
-            <w:r>
-              <w:rPr>
-                <w:rFonts w:ascii="Times New Roman" w:eastAsia="標楷體" w:hAnsi="Times New Roman" w:cs="Times New Roman" w:hint="eastAsia"/>
-              </w:rPr>
-              <w:t>與</w:t>
-            </w:r>
-            <w:r>
-              <w:rPr>
-                <w:rFonts w:ascii="Times New Roman" w:eastAsia="標楷體" w:hAnsi="Times New Roman" w:cs="Times New Roman" w:hint="eastAsia"/>
-              </w:rPr>
-              <w:t xml:space="preserve"> ISBN-13 </w:t>
-            </w:r>
-            <w:r>
-              <w:rPr>
-                <w:rFonts w:ascii="Times New Roman" w:eastAsia="標楷體" w:hAnsi="Times New Roman" w:cs="Times New Roman" w:hint="eastAsia"/>
-              </w:rPr>
-              <w:t>不同格式的輸入。</w:t>
+              <w:t>無</w:t>
             </w:r>
           </w:p>
         </w:tc>
@@ -2782,7 +3010,7 @@
               <w:rPr>
                 <w:rFonts w:ascii="Times New Roman" w:eastAsia="標楷體" w:hAnsi="Times New Roman" w:cs="Times New Roman" w:hint="eastAsia"/>
               </w:rPr>
-              <w:t>每當買家想要尋找書籍時觸發（極高頻率）。</w:t>
+              <w:t>極高頻率</w:t>
             </w:r>
           </w:p>
         </w:tc>
@@ -2835,21 +3063,22 @@
     </w:p>
     <w:p>
       <w:pPr>
-        <w:rPr>
-          <w:rFonts w:ascii="Times New Roman" w:eastAsia="標楷體" w:hAnsi="Times New Roman" w:cs="Times New Roman"/>
+        <w:pStyle w:val="3"/>
+        <w:rPr>
+          <w:rFonts w:hint="eastAsia"/>
         </w:rPr>
       </w:pPr>
       <w:r>
         <w:rPr>
-          <w:rFonts w:ascii="Times New Roman" w:eastAsia="標楷體" w:hAnsi="Times New Roman" w:cs="Times New Roman" w:hint="eastAsia"/>
+          <w:rFonts w:hint="eastAsia"/>
         </w:rPr>
         <w:t xml:space="preserve">1.5.3 </w:t>
       </w:r>
       <w:r>
         <w:rPr>
-          <w:rFonts w:ascii="Times New Roman" w:eastAsia="標楷體" w:hAnsi="Times New Roman" w:cs="Times New Roman" w:hint="eastAsia"/>
-        </w:rPr>
-        <w:t>更新書籍狀態</w:t>
+          <w:rFonts w:hint="eastAsia"/>
+        </w:rPr>
+        <w:t>建立訂單</w:t>
       </w:r>
     </w:p>
     <w:tbl>
@@ -2930,6 +3159,7 @@
               </w:rPr>
             </w:pPr>
             <w:proofErr w:type="spellStart"/>
+            <w:proofErr w:type="gramStart"/>
             <w:r>
               <w:rPr>
                 <w:rFonts w:ascii="Times New Roman" w:eastAsia="標楷體" w:hAnsi="Times New Roman" w:cs="Times New Roman" w:hint="eastAsia"/>
@@ -2937,6 +3167,7 @@
               <w:t>Re:Book</w:t>
             </w:r>
             <w:proofErr w:type="spellEnd"/>
+            <w:proofErr w:type="gramEnd"/>
           </w:p>
         </w:tc>
       </w:tr>
@@ -3051,6 +3282,43 @@
                 <w:rFonts w:ascii="Times New Roman" w:eastAsia="標楷體" w:hAnsi="Times New Roman" w:cs="Times New Roman"/>
               </w:rPr>
             </w:pPr>
+            <w:r>
+              <w:rPr>
+                <w:rFonts w:ascii="Times New Roman" w:eastAsia="標楷體" w:hAnsi="Times New Roman" w:cs="Times New Roman"/>
+              </w:rPr>
+              <w:t>買家：希望送出訂單後能鎖定書籍，避免被他人買走</w:t>
+            </w:r>
+            <w:r>
+              <w:rPr>
+                <w:rFonts w:ascii="Times New Roman" w:eastAsia="標楷體" w:hAnsi="Times New Roman" w:cs="Times New Roman" w:hint="eastAsia"/>
+              </w:rPr>
+              <w:t>。</w:t>
+            </w:r>
+          </w:p>
+          <w:p>
+            <w:pPr>
+              <w:rPr>
+                <w:rFonts w:ascii="Times New Roman" w:eastAsia="標楷體" w:hAnsi="Times New Roman" w:cs="Times New Roman" w:hint="eastAsia"/>
+              </w:rPr>
+            </w:pPr>
+            <w:r>
+              <w:rPr>
+                <w:rFonts w:ascii="Times New Roman" w:eastAsia="標楷體" w:hAnsi="Times New Roman" w:cs="Times New Roman"/>
+              </w:rPr>
+              <w:t>賣家：希望獲得確定的訂單通知，並</w:t>
+            </w:r>
+            <w:r>
+              <w:rPr>
+                <w:rFonts w:ascii="Times New Roman" w:eastAsia="標楷體" w:hAnsi="Times New Roman" w:cs="Times New Roman" w:hint="eastAsia"/>
+              </w:rPr>
+              <w:t>完成交易</w:t>
+            </w:r>
+            <w:r>
+              <w:rPr>
+                <w:rFonts w:ascii="Times New Roman" w:eastAsia="標楷體" w:hAnsi="Times New Roman" w:cs="Times New Roman"/>
+              </w:rPr>
+              <w:t>。</w:t>
+            </w:r>
           </w:p>
         </w:tc>
       </w:tr>
@@ -3069,6 +3337,7 @@
               <w:rPr>
                 <w:rFonts w:ascii="Times New Roman" w:eastAsia="標楷體" w:hAnsi="Times New Roman" w:cs="Times New Roman" w:hint="eastAsia"/>
               </w:rPr>
+              <w:lastRenderedPageBreak/>
               <w:t>Preconditions</w:t>
             </w:r>
           </w:p>
@@ -3080,9 +3349,15 @@
           <w:p>
             <w:pPr>
               <w:rPr>
-                <w:rFonts w:ascii="Times New Roman" w:eastAsia="標楷體" w:hAnsi="Times New Roman" w:cs="Times New Roman"/>
-              </w:rPr>
-            </w:pPr>
+                <w:rFonts w:ascii="Times New Roman" w:eastAsia="標楷體" w:hAnsi="Times New Roman" w:cs="Times New Roman" w:hint="eastAsia"/>
+              </w:rPr>
+            </w:pPr>
+            <w:r>
+              <w:rPr>
+                <w:rFonts w:ascii="Times New Roman" w:eastAsia="標楷體" w:hAnsi="Times New Roman" w:cs="Times New Roman"/>
+              </w:rPr>
+              <w:t>買家與賣家皆已登入系統。目標書籍當前的狀態必須為「待售中」。</w:t>
+            </w:r>
           </w:p>
         </w:tc>
       </w:tr>
@@ -3115,6 +3390,12 @@
                 <w:rFonts w:ascii="Times New Roman" w:eastAsia="標楷體" w:hAnsi="Times New Roman" w:cs="Times New Roman"/>
               </w:rPr>
             </w:pPr>
+            <w:r>
+              <w:rPr>
+                <w:rFonts w:ascii="Times New Roman" w:eastAsia="標楷體" w:hAnsi="Times New Roman" w:cs="Times New Roman"/>
+              </w:rPr>
+              <w:t>訂單成功建立與結案，且系統自動連動更新書籍狀態（先轉為「保留中」，完成後轉為「已售出」）。</w:t>
+            </w:r>
           </w:p>
         </w:tc>
       </w:tr>
@@ -3144,9 +3425,206 @@
           <w:p>
             <w:pPr>
               <w:rPr>
-                <w:rFonts w:ascii="Times New Roman" w:eastAsia="標楷體" w:hAnsi="Times New Roman" w:cs="Times New Roman"/>
-              </w:rPr>
-            </w:pPr>
+                <w:rFonts w:ascii="Times New Roman" w:eastAsia="標楷體" w:hAnsi="Times New Roman" w:cs="Times New Roman" w:hint="eastAsia"/>
+              </w:rPr>
+            </w:pPr>
+            <w:r>
+              <w:rPr>
+                <w:rFonts w:ascii="Times New Roman" w:eastAsia="標楷體" w:hAnsi="Times New Roman" w:cs="Times New Roman" w:hint="eastAsia"/>
+              </w:rPr>
+              <w:t xml:space="preserve">1. </w:t>
+            </w:r>
+            <w:r>
+              <w:rPr>
+                <w:rFonts w:ascii="Times New Roman" w:eastAsia="標楷體" w:hAnsi="Times New Roman" w:cs="Times New Roman" w:hint="eastAsia"/>
+              </w:rPr>
+              <w:t>買家在書籍頁面或</w:t>
+            </w:r>
+            <w:r>
+              <w:rPr>
+                <w:rFonts w:ascii="Times New Roman" w:eastAsia="標楷體" w:hAnsi="Times New Roman" w:cs="Times New Roman" w:hint="eastAsia"/>
+              </w:rPr>
+              <w:t>購物車</w:t>
+            </w:r>
+            <w:r>
+              <w:rPr>
+                <w:rFonts w:ascii="Times New Roman" w:eastAsia="標楷體" w:hAnsi="Times New Roman" w:cs="Times New Roman" w:hint="eastAsia"/>
+              </w:rPr>
+              <w:t>中點擊「購買」。</w:t>
+            </w:r>
+          </w:p>
+          <w:p>
+            <w:pPr>
+              <w:rPr>
+                <w:rFonts w:ascii="Times New Roman" w:eastAsia="標楷體" w:hAnsi="Times New Roman" w:cs="Times New Roman" w:hint="eastAsia"/>
+              </w:rPr>
+            </w:pPr>
+            <w:r>
+              <w:rPr>
+                <w:rFonts w:ascii="Times New Roman" w:eastAsia="標楷體" w:hAnsi="Times New Roman" w:cs="Times New Roman" w:hint="eastAsia"/>
+              </w:rPr>
+              <w:t xml:space="preserve">2. </w:t>
+            </w:r>
+            <w:r>
+              <w:rPr>
+                <w:rFonts w:ascii="Times New Roman" w:eastAsia="標楷體" w:hAnsi="Times New Roman" w:cs="Times New Roman" w:hint="eastAsia"/>
+              </w:rPr>
+              <w:t>系統顯示訂單資訊與線下交易選項</w:t>
+            </w:r>
+            <w:proofErr w:type="gramStart"/>
+            <w:r>
+              <w:rPr>
+                <w:rFonts w:ascii="Times New Roman" w:eastAsia="標楷體" w:hAnsi="Times New Roman" w:cs="Times New Roman" w:hint="eastAsia"/>
+              </w:rPr>
+              <w:t>（</w:t>
+            </w:r>
+            <w:proofErr w:type="gramEnd"/>
+            <w:r>
+              <w:rPr>
+                <w:rFonts w:ascii="Times New Roman" w:eastAsia="標楷體" w:hAnsi="Times New Roman" w:cs="Times New Roman" w:hint="eastAsia"/>
+              </w:rPr>
+              <w:t>如：面交付現、自行匯款</w:t>
+            </w:r>
+            <w:proofErr w:type="gramStart"/>
+            <w:r>
+              <w:rPr>
+                <w:rFonts w:ascii="Times New Roman" w:eastAsia="標楷體" w:hAnsi="Times New Roman" w:cs="Times New Roman" w:hint="eastAsia"/>
+              </w:rPr>
+              <w:t>）</w:t>
+            </w:r>
+            <w:proofErr w:type="gramEnd"/>
+            <w:r>
+              <w:rPr>
+                <w:rFonts w:ascii="Times New Roman" w:eastAsia="標楷體" w:hAnsi="Times New Roman" w:cs="Times New Roman" w:hint="eastAsia"/>
+              </w:rPr>
+              <w:t>。</w:t>
+            </w:r>
+          </w:p>
+          <w:p>
+            <w:pPr>
+              <w:rPr>
+                <w:rFonts w:ascii="Times New Roman" w:eastAsia="標楷體" w:hAnsi="Times New Roman" w:cs="Times New Roman" w:hint="eastAsia"/>
+              </w:rPr>
+            </w:pPr>
+            <w:r>
+              <w:rPr>
+                <w:rFonts w:ascii="Times New Roman" w:eastAsia="標楷體" w:hAnsi="Times New Roman" w:cs="Times New Roman" w:hint="eastAsia"/>
+              </w:rPr>
+              <w:t xml:space="preserve">3. </w:t>
+            </w:r>
+            <w:r>
+              <w:rPr>
+                <w:rFonts w:ascii="Times New Roman" w:eastAsia="標楷體" w:hAnsi="Times New Roman" w:cs="Times New Roman" w:hint="eastAsia"/>
+              </w:rPr>
+              <w:t>買家確認送出訂單。</w:t>
+            </w:r>
+          </w:p>
+          <w:p>
+            <w:pPr>
+              <w:rPr>
+                <w:rFonts w:ascii="Times New Roman" w:eastAsia="標楷體" w:hAnsi="Times New Roman" w:cs="Times New Roman" w:hint="eastAsia"/>
+              </w:rPr>
+            </w:pPr>
+            <w:r>
+              <w:rPr>
+                <w:rFonts w:ascii="Times New Roman" w:eastAsia="標楷體" w:hAnsi="Times New Roman" w:cs="Times New Roman" w:hint="eastAsia"/>
+              </w:rPr>
+              <w:t xml:space="preserve">4. </w:t>
+            </w:r>
+            <w:r>
+              <w:rPr>
+                <w:rFonts w:ascii="Times New Roman" w:eastAsia="標楷體" w:hAnsi="Times New Roman" w:cs="Times New Roman" w:hint="eastAsia"/>
+              </w:rPr>
+              <w:t>系統生成訂單，並自動將該書籍狀態更新為「保留中」。</w:t>
+            </w:r>
+          </w:p>
+          <w:p>
+            <w:pPr>
+              <w:rPr>
+                <w:rFonts w:ascii="Times New Roman" w:eastAsia="標楷體" w:hAnsi="Times New Roman" w:cs="Times New Roman" w:hint="eastAsia"/>
+              </w:rPr>
+            </w:pPr>
+            <w:r>
+              <w:rPr>
+                <w:rFonts w:ascii="Times New Roman" w:eastAsia="標楷體" w:hAnsi="Times New Roman" w:cs="Times New Roman" w:hint="eastAsia"/>
+              </w:rPr>
+              <w:t xml:space="preserve">5. </w:t>
+            </w:r>
+            <w:r>
+              <w:rPr>
+                <w:rFonts w:ascii="Times New Roman" w:eastAsia="標楷體" w:hAnsi="Times New Roman" w:cs="Times New Roman" w:hint="eastAsia"/>
+              </w:rPr>
+              <w:t>系統發送新訂單通知給賣家。</w:t>
+            </w:r>
+          </w:p>
+          <w:p>
+            <w:pPr>
+              <w:rPr>
+                <w:rFonts w:ascii="Times New Roman" w:eastAsia="標楷體" w:hAnsi="Times New Roman" w:cs="Times New Roman" w:hint="eastAsia"/>
+              </w:rPr>
+            </w:pPr>
+            <w:r>
+              <w:rPr>
+                <w:rFonts w:ascii="Times New Roman" w:eastAsia="標楷體" w:hAnsi="Times New Roman" w:cs="Times New Roman" w:hint="eastAsia"/>
+              </w:rPr>
+              <w:t xml:space="preserve">6. </w:t>
+            </w:r>
+            <w:r>
+              <w:rPr>
+                <w:rFonts w:ascii="Times New Roman" w:eastAsia="標楷體" w:hAnsi="Times New Roman" w:cs="Times New Roman" w:hint="eastAsia"/>
+              </w:rPr>
+              <w:t>雙方依約定進行</w:t>
+            </w:r>
+            <w:r>
+              <w:rPr>
+                <w:rFonts w:ascii="Times New Roman" w:eastAsia="標楷體" w:hAnsi="Times New Roman" w:cs="Times New Roman" w:hint="eastAsia"/>
+              </w:rPr>
+              <w:t>交易</w:t>
+            </w:r>
+            <w:r>
+              <w:rPr>
+                <w:rFonts w:ascii="Times New Roman" w:eastAsia="標楷體" w:hAnsi="Times New Roman" w:cs="Times New Roman" w:hint="eastAsia"/>
+              </w:rPr>
+              <w:t>。</w:t>
+            </w:r>
+          </w:p>
+          <w:p>
+            <w:pPr>
+              <w:rPr>
+                <w:rFonts w:ascii="Times New Roman" w:eastAsia="標楷體" w:hAnsi="Times New Roman" w:cs="Times New Roman" w:hint="eastAsia"/>
+              </w:rPr>
+            </w:pPr>
+            <w:r>
+              <w:rPr>
+                <w:rFonts w:ascii="Times New Roman" w:eastAsia="標楷體" w:hAnsi="Times New Roman" w:cs="Times New Roman" w:hint="eastAsia"/>
+              </w:rPr>
+              <w:t xml:space="preserve">7. </w:t>
+            </w:r>
+            <w:r>
+              <w:rPr>
+                <w:rFonts w:ascii="Times New Roman" w:eastAsia="標楷體" w:hAnsi="Times New Roman" w:cs="Times New Roman" w:hint="eastAsia"/>
+              </w:rPr>
+              <w:t>賣家在系統後台點擊「確認已完成交易」。</w:t>
+            </w:r>
+          </w:p>
+          <w:p>
+            <w:pPr>
+              <w:rPr>
+                <w:rFonts w:ascii="Times New Roman" w:eastAsia="標楷體" w:hAnsi="Times New Roman" w:cs="Times New Roman"/>
+              </w:rPr>
+            </w:pPr>
+            <w:r>
+              <w:rPr>
+                <w:rFonts w:ascii="Times New Roman" w:eastAsia="標楷體" w:hAnsi="Times New Roman" w:cs="Times New Roman" w:hint="eastAsia"/>
+              </w:rPr>
+              <w:t xml:space="preserve">8. </w:t>
+            </w:r>
+            <w:r>
+              <w:rPr>
+                <w:rFonts w:ascii="Times New Roman" w:eastAsia="標楷體" w:hAnsi="Times New Roman" w:cs="Times New Roman" w:hint="eastAsia"/>
+              </w:rPr>
+              <w:t>系統將訂單狀態標記為「完成」，並自動將該書籍狀態更新為「已售出」。</w:t>
+            </w:r>
           </w:p>
         </w:tc>
       </w:tr>
@@ -3176,9 +3654,64 @@
           <w:p>
             <w:pPr>
               <w:rPr>
-                <w:rFonts w:ascii="Times New Roman" w:eastAsia="標楷體" w:hAnsi="Times New Roman" w:cs="Times New Roman"/>
-              </w:rPr>
-            </w:pPr>
+                <w:rFonts w:ascii="Times New Roman" w:eastAsia="標楷體" w:hAnsi="Times New Roman" w:cs="Times New Roman" w:hint="eastAsia"/>
+              </w:rPr>
+            </w:pPr>
+            <w:r>
+              <w:rPr>
+                <w:rFonts w:ascii="Times New Roman" w:eastAsia="標楷體" w:hAnsi="Times New Roman" w:cs="Times New Roman" w:hint="eastAsia"/>
+              </w:rPr>
+              <w:t xml:space="preserve">4a. </w:t>
+            </w:r>
+            <w:r>
+              <w:rPr>
+                <w:rFonts w:ascii="Times New Roman" w:eastAsia="標楷體" w:hAnsi="Times New Roman" w:cs="Times New Roman" w:hint="eastAsia"/>
+              </w:rPr>
+              <w:t>併發衝突</w:t>
+            </w:r>
+            <w:r>
+              <w:rPr>
+                <w:rFonts w:ascii="Times New Roman" w:eastAsia="標楷體" w:hAnsi="Times New Roman" w:cs="Times New Roman" w:hint="eastAsia"/>
+              </w:rPr>
+              <w:t xml:space="preserve"> (Concurrency)</w:t>
+            </w:r>
+            <w:r>
+              <w:rPr>
+                <w:rFonts w:ascii="Times New Roman" w:eastAsia="標楷體" w:hAnsi="Times New Roman" w:cs="Times New Roman" w:hint="eastAsia"/>
+              </w:rPr>
+              <w:t>：買家送出結帳瞬間，書籍剛好被他人下單，系統中斷流程並提示「書籍已被預訂」。</w:t>
+            </w:r>
+          </w:p>
+          <w:p>
+            <w:pPr>
+              <w:rPr>
+                <w:rFonts w:ascii="Times New Roman" w:eastAsia="標楷體" w:hAnsi="Times New Roman" w:cs="Times New Roman"/>
+              </w:rPr>
+            </w:pPr>
+            <w:r>
+              <w:rPr>
+                <w:rFonts w:ascii="Times New Roman" w:eastAsia="標楷體" w:hAnsi="Times New Roman" w:cs="Times New Roman" w:hint="eastAsia"/>
+              </w:rPr>
+              <w:t xml:space="preserve">7a. </w:t>
+            </w:r>
+            <w:r>
+              <w:rPr>
+                <w:rFonts w:ascii="Times New Roman" w:eastAsia="標楷體" w:hAnsi="Times New Roman" w:cs="Times New Roman" w:hint="eastAsia"/>
+              </w:rPr>
+              <w:t>交易取消：若</w:t>
+            </w:r>
+            <w:r>
+              <w:rPr>
+                <w:rFonts w:ascii="Times New Roman" w:eastAsia="標楷體" w:hAnsi="Times New Roman" w:cs="Times New Roman" w:hint="eastAsia"/>
+              </w:rPr>
+              <w:t>交易</w:t>
+            </w:r>
+            <w:r>
+              <w:rPr>
+                <w:rFonts w:ascii="Times New Roman" w:eastAsia="標楷體" w:hAnsi="Times New Roman" w:cs="Times New Roman" w:hint="eastAsia"/>
+              </w:rPr>
+              <w:t>失敗，賣家或買家點擊「取消訂單」，系統將訂單作廢，並自動將書籍狀態恢復為「待售中」。</w:t>
+            </w:r>
           </w:p>
         </w:tc>
       </w:tr>
@@ -3211,6 +3744,24 @@
                 <w:rFonts w:ascii="Times New Roman" w:eastAsia="標楷體" w:hAnsi="Times New Roman" w:cs="Times New Roman"/>
               </w:rPr>
             </w:pPr>
+            <w:r>
+              <w:rPr>
+                <w:rFonts w:ascii="Times New Roman" w:eastAsia="標楷體" w:hAnsi="Times New Roman" w:cs="Times New Roman"/>
+              </w:rPr>
+              <w:t>訂單生成與書籍狀態切換必須具備資料庫的原子性（</w:t>
+            </w:r>
+            <w:r>
+              <w:rPr>
+                <w:rFonts w:ascii="Times New Roman" w:eastAsia="標楷體" w:hAnsi="Times New Roman" w:cs="Times New Roman"/>
+              </w:rPr>
+              <w:t>Atomicity</w:t>
+            </w:r>
+            <w:r>
+              <w:rPr>
+                <w:rFonts w:ascii="Times New Roman" w:eastAsia="標楷體" w:hAnsi="Times New Roman" w:cs="Times New Roman"/>
+              </w:rPr>
+              <w:t>），確保兩者同時成功或失敗。</w:t>
+            </w:r>
           </w:p>
         </w:tc>
       </w:tr>
@@ -3243,6 +3794,12 @@
                 <w:rFonts w:ascii="Times New Roman" w:eastAsia="標楷體" w:hAnsi="Times New Roman" w:cs="Times New Roman"/>
               </w:rPr>
             </w:pPr>
+            <w:r>
+              <w:rPr>
+                <w:rFonts w:ascii="Times New Roman" w:eastAsia="標楷體" w:hAnsi="Times New Roman" w:cs="Times New Roman" w:hint="eastAsia"/>
+              </w:rPr>
+              <w:t>無</w:t>
+            </w:r>
           </w:p>
         </w:tc>
       </w:tr>
@@ -3272,9 +3829,15 @@
           <w:p>
             <w:pPr>
               <w:rPr>
-                <w:rFonts w:ascii="Times New Roman" w:eastAsia="標楷體" w:hAnsi="Times New Roman" w:cs="Times New Roman"/>
-              </w:rPr>
-            </w:pPr>
+                <w:rFonts w:ascii="Times New Roman" w:eastAsia="標楷體" w:hAnsi="Times New Roman" w:cs="Times New Roman" w:hint="eastAsia"/>
+              </w:rPr>
+            </w:pPr>
+            <w:r>
+              <w:rPr>
+                <w:rFonts w:ascii="Times New Roman" w:eastAsia="標楷體" w:hAnsi="Times New Roman" w:cs="Times New Roman"/>
+              </w:rPr>
+              <w:t>中頻率</w:t>
+            </w:r>
           </w:p>
         </w:tc>
       </w:tr>
@@ -3307,6 +3870,52 @@
                 <w:rFonts w:ascii="Times New Roman" w:eastAsia="標楷體" w:hAnsi="Times New Roman" w:cs="Times New Roman"/>
               </w:rPr>
             </w:pPr>
+            <w:r>
+              <w:rPr>
+                <w:rFonts w:ascii="Times New Roman" w:eastAsia="標楷體" w:hAnsi="Times New Roman" w:cs="Times New Roman"/>
+              </w:rPr>
+              <w:t>是否需要設定自動取消機制？</w:t>
+            </w:r>
+            <w:proofErr w:type="gramStart"/>
+            <w:r>
+              <w:rPr>
+                <w:rFonts w:ascii="Times New Roman" w:eastAsia="標楷體" w:hAnsi="Times New Roman" w:cs="Times New Roman"/>
+              </w:rPr>
+              <w:t>（</w:t>
+            </w:r>
+            <w:proofErr w:type="gramEnd"/>
+            <w:r>
+              <w:rPr>
+                <w:rFonts w:ascii="Times New Roman" w:eastAsia="標楷體" w:hAnsi="Times New Roman" w:cs="Times New Roman"/>
+              </w:rPr>
+              <w:t>例如：訂單成立後</w:t>
+            </w:r>
+            <w:r>
+              <w:rPr>
+                <w:rFonts w:ascii="Times New Roman" w:eastAsia="標楷體" w:hAnsi="Times New Roman" w:cs="Times New Roman"/>
+              </w:rPr>
+              <w:t>7</w:t>
+            </w:r>
+            <w:r>
+              <w:rPr>
+                <w:rFonts w:ascii="Times New Roman" w:eastAsia="標楷體" w:hAnsi="Times New Roman" w:cs="Times New Roman"/>
+              </w:rPr>
+              <w:t>天內未點擊完成，系統自動取消並恢復書籍狀態</w:t>
+            </w:r>
+            <w:proofErr w:type="gramStart"/>
+            <w:r>
+              <w:rPr>
+                <w:rFonts w:ascii="Times New Roman" w:eastAsia="標楷體" w:hAnsi="Times New Roman" w:cs="Times New Roman"/>
+              </w:rPr>
+              <w:t>）</w:t>
+            </w:r>
+            <w:proofErr w:type="gramEnd"/>
+            <w:r>
+              <w:rPr>
+                <w:rFonts w:ascii="Times New Roman" w:eastAsia="標楷體" w:hAnsi="Times New Roman" w:cs="Times New Roman"/>
+              </w:rPr>
+              <w:t>。</w:t>
+            </w:r>
           </w:p>
         </w:tc>
       </w:tr>
@@ -3320,31 +3929,30 @@
     </w:p>
     <w:p>
       <w:pPr>
-        <w:rPr>
-          <w:rFonts w:ascii="Times New Roman" w:eastAsia="標楷體" w:hAnsi="Times New Roman" w:cs="Times New Roman"/>
-        </w:rPr>
+        <w:pStyle w:val="3"/>
       </w:pPr>
       <w:r>
         <w:rPr>
-          <w:rFonts w:ascii="Times New Roman" w:eastAsia="標楷體" w:hAnsi="Times New Roman" w:cs="Times New Roman" w:hint="eastAsia"/>
-        </w:rPr>
+          <w:rFonts w:hint="eastAsia"/>
+        </w:rPr>
+        <w:lastRenderedPageBreak/>
         <w:t>1.5.</w:t>
       </w:r>
       <w:r>
         <w:rPr>
-          <w:rFonts w:ascii="Times New Roman" w:eastAsia="標楷體" w:hAnsi="Times New Roman" w:cs="Times New Roman" w:hint="eastAsia"/>
+          <w:rFonts w:hint="eastAsia"/>
         </w:rPr>
         <w:t>4</w:t>
       </w:r>
       <w:r>
         <w:rPr>
-          <w:rFonts w:ascii="Times New Roman" w:eastAsia="標楷體" w:hAnsi="Times New Roman" w:cs="Times New Roman" w:hint="eastAsia"/>
+          <w:rFonts w:hint="eastAsia"/>
         </w:rPr>
         <w:t xml:space="preserve"> </w:t>
       </w:r>
       <w:r>
         <w:rPr>
-          <w:rFonts w:ascii="Times New Roman" w:eastAsia="標楷體" w:hAnsi="Times New Roman" w:cs="Times New Roman" w:hint="eastAsia"/>
+          <w:rFonts w:hint="eastAsia"/>
         </w:rPr>
         <w:t>發送私訊</w:t>
       </w:r>
@@ -3392,7 +4000,13 @@
               <w:rPr>
                 <w:rFonts w:ascii="Times New Roman" w:eastAsia="標楷體" w:hAnsi="Times New Roman" w:cs="Times New Roman" w:hint="eastAsia"/>
               </w:rPr>
-              <w:t>FEA-03</w:t>
+              <w:t>FEA-0</w:t>
+            </w:r>
+            <w:r>
+              <w:rPr>
+                <w:rFonts w:ascii="Times New Roman" w:eastAsia="標楷體" w:hAnsi="Times New Roman" w:cs="Times New Roman" w:hint="eastAsia"/>
+              </w:rPr>
+              <w:t>4</w:t>
             </w:r>
           </w:p>
         </w:tc>
@@ -3427,6 +4041,7 @@
               </w:rPr>
             </w:pPr>
             <w:proofErr w:type="spellStart"/>
+            <w:proofErr w:type="gramStart"/>
             <w:r>
               <w:rPr>
                 <w:rFonts w:ascii="Times New Roman" w:eastAsia="標楷體" w:hAnsi="Times New Roman" w:cs="Times New Roman" w:hint="eastAsia"/>
@@ -3434,6 +4049,7 @@
               <w:t>Re:Book</w:t>
             </w:r>
             <w:proofErr w:type="spellEnd"/>
+            <w:proofErr w:type="gramEnd"/>
           </w:p>
         </w:tc>
       </w:tr>
@@ -3452,7 +4068,6 @@
               <w:rPr>
                 <w:rFonts w:ascii="Times New Roman" w:eastAsia="標楷體" w:hAnsi="Times New Roman" w:cs="Times New Roman" w:hint="eastAsia"/>
               </w:rPr>
-              <w:lastRenderedPageBreak/>
               <w:t>Level</w:t>
             </w:r>
           </w:p>
@@ -3553,32 +4168,34 @@
               <w:rPr>
                 <w:rFonts w:ascii="Times New Roman" w:eastAsia="標楷體" w:hAnsi="Times New Roman" w:cs="Times New Roman" w:hint="eastAsia"/>
               </w:rPr>
-              <w:t>買家：希望直接聯繫賣家以詢問書況細節或協商最終價格</w:t>
-            </w:r>
-          </w:p>
-          <w:p>
-            <w:pPr>
-              <w:rPr>
-                <w:rFonts w:ascii="Times New Roman" w:eastAsia="標楷體" w:hAnsi="Times New Roman" w:cs="Times New Roman"/>
-              </w:rPr>
-            </w:pPr>
-            <w:r>
-              <w:rPr>
-                <w:rFonts w:ascii="Times New Roman" w:eastAsia="標楷體" w:hAnsi="Times New Roman" w:cs="Times New Roman" w:hint="eastAsia"/>
-              </w:rPr>
-              <w:t>賣家：希望在不公開個人通訊軟體（如</w:t>
-            </w:r>
-            <w:r>
-              <w:rPr>
-                <w:rFonts w:ascii="Times New Roman" w:eastAsia="標楷體" w:hAnsi="Times New Roman" w:cs="Times New Roman" w:hint="eastAsia"/>
-              </w:rPr>
-              <w:t xml:space="preserve"> Line</w:t>
-            </w:r>
-            <w:r>
-              <w:rPr>
-                <w:rFonts w:ascii="Times New Roman" w:eastAsia="標楷體" w:hAnsi="Times New Roman" w:cs="Times New Roman" w:hint="eastAsia"/>
-              </w:rPr>
-              <w:t>）的情況下，回答買家疑問並達成交易協議。</w:t>
+              <w:t>買家：希望直接聯繫賣家以詢問書</w:t>
+            </w:r>
+            <w:proofErr w:type="gramStart"/>
+            <w:r>
+              <w:rPr>
+                <w:rFonts w:ascii="Times New Roman" w:eastAsia="標楷體" w:hAnsi="Times New Roman" w:cs="Times New Roman" w:hint="eastAsia"/>
+              </w:rPr>
+              <w:t>況</w:t>
+            </w:r>
+            <w:proofErr w:type="gramEnd"/>
+            <w:r>
+              <w:rPr>
+                <w:rFonts w:ascii="Times New Roman" w:eastAsia="標楷體" w:hAnsi="Times New Roman" w:cs="Times New Roman" w:hint="eastAsia"/>
+              </w:rPr>
+              <w:t>細節或協商最終價格</w:t>
+            </w:r>
+          </w:p>
+          <w:p>
+            <w:pPr>
+              <w:rPr>
+                <w:rFonts w:ascii="Times New Roman" w:eastAsia="標楷體" w:hAnsi="Times New Roman" w:cs="Times New Roman"/>
+              </w:rPr>
+            </w:pPr>
+            <w:r>
+              <w:rPr>
+                <w:rFonts w:ascii="Times New Roman" w:eastAsia="標楷體" w:hAnsi="Times New Roman" w:cs="Times New Roman" w:hint="eastAsia"/>
+              </w:rPr>
+              <w:t>賣家：希望在不公開個人通訊軟體的情況下，回答買家疑問並達成交易協議。</w:t>
             </w:r>
           </w:p>
         </w:tc>
@@ -3622,7 +4239,7 @@
               <w:rPr>
                 <w:rFonts w:ascii="Times New Roman" w:eastAsia="標楷體" w:hAnsi="Times New Roman" w:cs="Times New Roman" w:hint="eastAsia"/>
               </w:rPr>
-              <w:t>件商品</w:t>
+              <w:t>本書籍</w:t>
             </w:r>
             <w:r>
               <w:rPr>
@@ -3666,7 +4283,49 @@
               <w:rPr>
                 <w:rFonts w:ascii="Times New Roman" w:eastAsia="標楷體" w:hAnsi="Times New Roman" w:cs="Times New Roman" w:hint="eastAsia"/>
               </w:rPr>
-              <w:t>訊息正確傳送至賣家的收件匣，且雙方能看到完整的歷史對話紀錄。</w:t>
+              <w:t>買家的</w:t>
+            </w:r>
+            <w:r>
+              <w:rPr>
+                <w:rFonts w:ascii="Times New Roman" w:eastAsia="標楷體" w:hAnsi="Times New Roman" w:cs="Times New Roman" w:hint="eastAsia"/>
+              </w:rPr>
+              <w:t>訊息</w:t>
+            </w:r>
+            <w:r>
+              <w:rPr>
+                <w:rFonts w:ascii="Times New Roman" w:eastAsia="標楷體" w:hAnsi="Times New Roman" w:cs="Times New Roman" w:hint="eastAsia"/>
+              </w:rPr>
+              <w:t>能</w:t>
+            </w:r>
+            <w:r>
+              <w:rPr>
+                <w:rFonts w:ascii="Times New Roman" w:eastAsia="標楷體" w:hAnsi="Times New Roman" w:cs="Times New Roman" w:hint="eastAsia"/>
+              </w:rPr>
+              <w:t>正確</w:t>
+            </w:r>
+            <w:r>
+              <w:rPr>
+                <w:rFonts w:ascii="Times New Roman" w:eastAsia="標楷體" w:hAnsi="Times New Roman" w:cs="Times New Roman" w:hint="eastAsia"/>
+              </w:rPr>
+              <w:t>被</w:t>
+            </w:r>
+            <w:r>
+              <w:rPr>
+                <w:rFonts w:ascii="Times New Roman" w:eastAsia="標楷體" w:hAnsi="Times New Roman" w:cs="Times New Roman" w:hint="eastAsia"/>
+              </w:rPr>
+              <w:t>傳送</w:t>
+            </w:r>
+            <w:r>
+              <w:rPr>
+                <w:rFonts w:ascii="Times New Roman" w:eastAsia="標楷體" w:hAnsi="Times New Roman" w:cs="Times New Roman" w:hint="eastAsia"/>
+              </w:rPr>
+              <w:t>給</w:t>
+            </w:r>
+            <w:r>
+              <w:rPr>
+                <w:rFonts w:ascii="Times New Roman" w:eastAsia="標楷體" w:hAnsi="Times New Roman" w:cs="Times New Roman" w:hint="eastAsia"/>
+              </w:rPr>
+              <w:t>賣家，且雙方能看到歷史對話紀錄。</w:t>
             </w:r>
           </w:p>
         </w:tc>
@@ -3716,13 +4375,27 @@
               <w:rPr>
                 <w:rFonts w:ascii="Times New Roman" w:eastAsia="標楷體" w:hAnsi="Times New Roman" w:cs="Times New Roman" w:hint="eastAsia"/>
               </w:rPr>
-              <w:t>商品</w:t>
-            </w:r>
-            <w:r>
-              <w:rPr>
-                <w:rFonts w:ascii="Times New Roman" w:eastAsia="標楷體" w:hAnsi="Times New Roman" w:cs="Times New Roman" w:hint="eastAsia"/>
-              </w:rPr>
-              <w:t>詳情頁面點擊「聯繫賣家」按鈕。</w:t>
+              <w:t>書籍</w:t>
+            </w:r>
+            <w:r>
+              <w:rPr>
+                <w:rFonts w:ascii="Times New Roman" w:eastAsia="標楷體" w:hAnsi="Times New Roman" w:cs="Times New Roman" w:hint="eastAsia"/>
+              </w:rPr>
+              <w:t>詳情</w:t>
+            </w:r>
+            <w:proofErr w:type="gramStart"/>
+            <w:r>
+              <w:rPr>
+                <w:rFonts w:ascii="Times New Roman" w:eastAsia="標楷體" w:hAnsi="Times New Roman" w:cs="Times New Roman" w:hint="eastAsia"/>
+              </w:rPr>
+              <w:t>頁面點擊</w:t>
+            </w:r>
+            <w:proofErr w:type="gramEnd"/>
+            <w:r>
+              <w:rPr>
+                <w:rFonts w:ascii="Times New Roman" w:eastAsia="標楷體" w:hAnsi="Times New Roman" w:cs="Times New Roman" w:hint="eastAsia"/>
+              </w:rPr>
+              <w:t>「聯繫賣家」按鈕。</w:t>
             </w:r>
           </w:p>
           <w:p>
@@ -3741,19 +4414,21 @@
               <w:rPr>
                 <w:rFonts w:ascii="Times New Roman" w:eastAsia="標楷體" w:hAnsi="Times New Roman" w:cs="Times New Roman" w:hint="eastAsia"/>
               </w:rPr>
-              <w:t>系統開啟該</w:t>
-            </w:r>
-            <w:r>
-              <w:rPr>
-                <w:rFonts w:ascii="Times New Roman" w:eastAsia="標楷體" w:hAnsi="Times New Roman" w:cs="Times New Roman" w:hint="eastAsia"/>
-              </w:rPr>
-              <w:t>商品</w:t>
-            </w:r>
-            <w:r>
-              <w:rPr>
-                <w:rFonts w:ascii="Times New Roman" w:eastAsia="標楷體" w:hAnsi="Times New Roman" w:cs="Times New Roman" w:hint="eastAsia"/>
-              </w:rPr>
-              <w:t>專屬的私訊對話視窗。</w:t>
+              <w:t>系統</w:t>
+            </w:r>
+            <w:proofErr w:type="gramStart"/>
+            <w:r>
+              <w:rPr>
+                <w:rFonts w:ascii="Times New Roman" w:eastAsia="標楷體" w:hAnsi="Times New Roman" w:cs="Times New Roman" w:hint="eastAsia"/>
+              </w:rPr>
+              <w:t>開啟私訊對話</w:t>
+            </w:r>
+            <w:proofErr w:type="gramEnd"/>
+            <w:r>
+              <w:rPr>
+                <w:rFonts w:ascii="Times New Roman" w:eastAsia="標楷體" w:hAnsi="Times New Roman" w:cs="Times New Roman" w:hint="eastAsia"/>
+              </w:rPr>
+              <w:t>視窗。</w:t>
             </w:r>
           </w:p>
           <w:p>
@@ -3772,7 +4447,55 @@
               <w:rPr>
                 <w:rFonts w:ascii="Times New Roman" w:eastAsia="標楷體" w:hAnsi="Times New Roman" w:cs="Times New Roman" w:hint="eastAsia"/>
               </w:rPr>
-              <w:t>買家輸入諮詢內容（如：詢問筆記狀況、議價或約定地點）。</w:t>
+              <w:t>買家輸入諮詢內容</w:t>
+            </w:r>
+            <w:proofErr w:type="gramStart"/>
+            <w:r>
+              <w:rPr>
+                <w:rFonts w:ascii="Times New Roman" w:eastAsia="標楷體" w:hAnsi="Times New Roman" w:cs="Times New Roman" w:hint="eastAsia"/>
+              </w:rPr>
+              <w:t>（</w:t>
+            </w:r>
+            <w:proofErr w:type="gramEnd"/>
+            <w:r>
+              <w:rPr>
+                <w:rFonts w:ascii="Times New Roman" w:eastAsia="標楷體" w:hAnsi="Times New Roman" w:cs="Times New Roman" w:hint="eastAsia"/>
+              </w:rPr>
+              <w:t>如：詢問</w:t>
+            </w:r>
+            <w:r>
+              <w:rPr>
+                <w:rFonts w:ascii="Times New Roman" w:eastAsia="標楷體" w:hAnsi="Times New Roman" w:cs="Times New Roman" w:hint="eastAsia"/>
+              </w:rPr>
+              <w:t>書</w:t>
+            </w:r>
+            <w:proofErr w:type="gramStart"/>
+            <w:r>
+              <w:rPr>
+                <w:rFonts w:ascii="Times New Roman" w:eastAsia="標楷體" w:hAnsi="Times New Roman" w:cs="Times New Roman" w:hint="eastAsia"/>
+              </w:rPr>
+              <w:t>況</w:t>
+            </w:r>
+            <w:proofErr w:type="gramEnd"/>
+            <w:r>
+              <w:rPr>
+                <w:rFonts w:ascii="Times New Roman" w:eastAsia="標楷體" w:hAnsi="Times New Roman" w:cs="Times New Roman" w:hint="eastAsia"/>
+              </w:rPr>
+              <w:t>、議價或約定地點</w:t>
+            </w:r>
+            <w:proofErr w:type="gramStart"/>
+            <w:r>
+              <w:rPr>
+                <w:rFonts w:ascii="Times New Roman" w:eastAsia="標楷體" w:hAnsi="Times New Roman" w:cs="Times New Roman" w:hint="eastAsia"/>
+              </w:rPr>
+              <w:t>）</w:t>
+            </w:r>
+            <w:proofErr w:type="gramEnd"/>
+            <w:r>
+              <w:rPr>
+                <w:rFonts w:ascii="Times New Roman" w:eastAsia="標楷體" w:hAnsi="Times New Roman" w:cs="Times New Roman" w:hint="eastAsia"/>
+              </w:rPr>
+              <w:t>。</w:t>
             </w:r>
           </w:p>
           <w:p>
@@ -3810,7 +4533,19 @@
               <w:rPr>
                 <w:rFonts w:ascii="Times New Roman" w:eastAsia="標楷體" w:hAnsi="Times New Roman" w:cs="Times New Roman" w:hint="eastAsia"/>
               </w:rPr>
-              <w:t>系統將訊息即時推播給賣家，並顯示於兩者的對話清單中。</w:t>
+              <w:t>系統將訊息即時推播給賣家，並顯示於兩者的對話</w:t>
+            </w:r>
+            <w:r>
+              <w:rPr>
+                <w:rFonts w:ascii="Times New Roman" w:eastAsia="標楷體" w:hAnsi="Times New Roman" w:cs="Times New Roman" w:hint="eastAsia"/>
+              </w:rPr>
+              <w:t>視窗</w:t>
+            </w:r>
+            <w:r>
+              <w:rPr>
+                <w:rFonts w:ascii="Times New Roman" w:eastAsia="標楷體" w:hAnsi="Times New Roman" w:cs="Times New Roman" w:hint="eastAsia"/>
+              </w:rPr>
+              <w:t>中。</w:t>
             </w:r>
           </w:p>
         </w:tc>
@@ -3961,7 +4696,21 @@
               <w:rPr>
                 <w:rFonts w:ascii="Times New Roman" w:eastAsia="標楷體" w:hAnsi="Times New Roman" w:cs="Times New Roman" w:hint="eastAsia"/>
               </w:rPr>
-              <w:t>支援文字訊息；未來可擴充支援圖片傳送（用於拍攝更詳細的書況）。</w:t>
+              <w:t>支援文字訊息；未來可擴充支援圖片傳送（用於拍攝更詳細的書</w:t>
+            </w:r>
+            <w:proofErr w:type="gramStart"/>
+            <w:r>
+              <w:rPr>
+                <w:rFonts w:ascii="Times New Roman" w:eastAsia="標楷體" w:hAnsi="Times New Roman" w:cs="Times New Roman" w:hint="eastAsia"/>
+              </w:rPr>
+              <w:t>況</w:t>
+            </w:r>
+            <w:proofErr w:type="gramEnd"/>
+            <w:r>
+              <w:rPr>
+                <w:rFonts w:ascii="Times New Roman" w:eastAsia="標楷體" w:hAnsi="Times New Roman" w:cs="Times New Roman" w:hint="eastAsia"/>
+              </w:rPr>
+              <w:t>）。</w:t>
             </w:r>
           </w:p>
         </w:tc>
@@ -3999,19 +4748,7 @@
               <w:rPr>
                 <w:rFonts w:ascii="Times New Roman" w:eastAsia="標楷體" w:hAnsi="Times New Roman" w:cs="Times New Roman" w:hint="eastAsia"/>
               </w:rPr>
-              <w:t>當買家對特定</w:t>
-            </w:r>
-            <w:r>
-              <w:rPr>
-                <w:rFonts w:ascii="Times New Roman" w:eastAsia="標楷體" w:hAnsi="Times New Roman" w:cs="Times New Roman" w:hint="eastAsia"/>
-              </w:rPr>
-              <w:t>商品</w:t>
-            </w:r>
-            <w:r>
-              <w:rPr>
-                <w:rFonts w:ascii="Times New Roman" w:eastAsia="標楷體" w:hAnsi="Times New Roman" w:cs="Times New Roman" w:hint="eastAsia"/>
-              </w:rPr>
-              <w:t>有購買意願或疑問時觸發（高頻率）。</w:t>
+              <w:t>高頻率</w:t>
             </w:r>
           </w:p>
         </w:tc>
@@ -4049,7 +4786,13 @@
               <w:rPr>
                 <w:rFonts w:ascii="Times New Roman" w:eastAsia="標楷體" w:hAnsi="Times New Roman" w:cs="Times New Roman" w:hint="eastAsia"/>
               </w:rPr>
-              <w:t>是否需要設置檢舉功能以防止騷擾？（待討論問題）</w:t>
+              <w:t>是否需要設置檢舉功能以防止騷擾？</w:t>
+            </w:r>
+            <w:r>
+              <w:rPr>
+                <w:rFonts w:ascii="Times New Roman" w:eastAsia="標楷體" w:hAnsi="Times New Roman" w:cs="Times New Roman"/>
+              </w:rPr>
+              <w:t xml:space="preserve"> </w:t>
             </w:r>
           </w:p>
         </w:tc>
@@ -4064,31 +4807,29 @@
     </w:p>
     <w:p>
       <w:pPr>
-        <w:rPr>
-          <w:rFonts w:ascii="Times New Roman" w:eastAsia="標楷體" w:hAnsi="Times New Roman" w:cs="Times New Roman"/>
-        </w:rPr>
+        <w:pStyle w:val="3"/>
       </w:pPr>
       <w:r>
         <w:rPr>
-          <w:rFonts w:ascii="Times New Roman" w:eastAsia="標楷體" w:hAnsi="Times New Roman" w:cs="Times New Roman" w:hint="eastAsia"/>
+          <w:rFonts w:hint="eastAsia"/>
         </w:rPr>
         <w:t>1.5.</w:t>
       </w:r>
       <w:r>
         <w:rPr>
-          <w:rFonts w:ascii="Times New Roman" w:eastAsia="標楷體" w:hAnsi="Times New Roman" w:cs="Times New Roman" w:hint="eastAsia"/>
+          <w:rFonts w:hint="eastAsia"/>
         </w:rPr>
         <w:t>5</w:t>
       </w:r>
       <w:r>
         <w:rPr>
-          <w:rFonts w:ascii="Times New Roman" w:eastAsia="標楷體" w:hAnsi="Times New Roman" w:cs="Times New Roman" w:hint="eastAsia"/>
+          <w:rFonts w:hint="eastAsia"/>
         </w:rPr>
         <w:t xml:space="preserve"> </w:t>
       </w:r>
       <w:r>
         <w:rPr>
-          <w:rFonts w:ascii="Times New Roman" w:eastAsia="標楷體" w:hAnsi="Times New Roman" w:cs="Times New Roman" w:hint="eastAsia"/>
+          <w:rFonts w:hint="eastAsia"/>
         </w:rPr>
         <w:t>分類管理</w:t>
       </w:r>
@@ -4136,7 +4877,13 @@
               <w:rPr>
                 <w:rFonts w:ascii="Times New Roman" w:eastAsia="標楷體" w:hAnsi="Times New Roman" w:cs="Times New Roman" w:hint="eastAsia"/>
               </w:rPr>
-              <w:t>FEA-04</w:t>
+              <w:t>FEA-0</w:t>
+            </w:r>
+            <w:r>
+              <w:rPr>
+                <w:rFonts w:ascii="Times New Roman" w:eastAsia="標楷體" w:hAnsi="Times New Roman" w:cs="Times New Roman" w:hint="eastAsia"/>
+              </w:rPr>
+              <w:t>5</w:t>
             </w:r>
           </w:p>
         </w:tc>
@@ -4156,6 +4903,7 @@
               <w:rPr>
                 <w:rFonts w:ascii="Times New Roman" w:eastAsia="標楷體" w:hAnsi="Times New Roman" w:cs="Times New Roman" w:hint="eastAsia"/>
               </w:rPr>
+              <w:lastRenderedPageBreak/>
               <w:t>Scope</w:t>
             </w:r>
           </w:p>
@@ -4171,6 +4919,7 @@
               </w:rPr>
             </w:pPr>
             <w:proofErr w:type="spellStart"/>
+            <w:proofErr w:type="gramStart"/>
             <w:r>
               <w:rPr>
                 <w:rFonts w:ascii="Times New Roman" w:eastAsia="標楷體" w:hAnsi="Times New Roman" w:cs="Times New Roman" w:hint="eastAsia"/>
@@ -4178,6 +4927,7 @@
               <w:t>Re:Book</w:t>
             </w:r>
             <w:proofErr w:type="spellEnd"/>
+            <w:proofErr w:type="gramEnd"/>
           </w:p>
         </w:tc>
       </w:tr>
@@ -4240,7 +4990,6 @@
               <w:rPr>
                 <w:rFonts w:ascii="Times New Roman" w:eastAsia="標楷體" w:hAnsi="Times New Roman" w:cs="Times New Roman" w:hint="eastAsia"/>
               </w:rPr>
-              <w:lastRenderedPageBreak/>
               <w:t>Primary Actor</w:t>
             </w:r>
           </w:p>
@@ -4303,7 +5052,7 @@
               <w:rPr>
                 <w:rFonts w:ascii="Times New Roman" w:eastAsia="標楷體" w:hAnsi="Times New Roman" w:cs="Times New Roman" w:hint="eastAsia"/>
               </w:rPr>
-              <w:t>件商品</w:t>
+              <w:t>本書籍</w:t>
             </w:r>
             <w:r>
               <w:rPr>
@@ -4340,7 +5089,7 @@
               <w:rPr>
                 <w:rFonts w:ascii="Times New Roman" w:eastAsia="標楷體" w:hAnsi="Times New Roman" w:cs="Times New Roman" w:hint="eastAsia"/>
               </w:rPr>
-              <w:t>商品</w:t>
+              <w:t>書籍</w:t>
             </w:r>
             <w:r>
               <w:rPr>
@@ -4396,7 +5145,7 @@
               <w:rPr>
                 <w:rFonts w:ascii="Times New Roman" w:eastAsia="標楷體" w:hAnsi="Times New Roman" w:cs="Times New Roman" w:hint="eastAsia"/>
               </w:rPr>
-              <w:t>件</w:t>
+              <w:t>本</w:t>
             </w:r>
             <w:r>
               <w:rPr>
@@ -4408,7 +5157,13 @@
               <w:rPr>
                 <w:rFonts w:ascii="Times New Roman" w:eastAsia="標楷體" w:hAnsi="Times New Roman" w:cs="Times New Roman" w:hint="eastAsia"/>
               </w:rPr>
-              <w:t>待售商品</w:t>
+              <w:t>待售</w:t>
+            </w:r>
+            <w:r>
+              <w:rPr>
+                <w:rFonts w:ascii="Times New Roman" w:eastAsia="標楷體" w:hAnsi="Times New Roman" w:cs="Times New Roman" w:hint="eastAsia"/>
+              </w:rPr>
+              <w:t>書籍</w:t>
             </w:r>
             <w:r>
               <w:rPr>
@@ -4452,7 +5207,7 @@
               <w:rPr>
                 <w:rFonts w:ascii="Times New Roman" w:eastAsia="標楷體" w:hAnsi="Times New Roman" w:cs="Times New Roman" w:hint="eastAsia"/>
               </w:rPr>
-              <w:t>商品</w:t>
+              <w:t>書籍</w:t>
             </w:r>
             <w:r>
               <w:rPr>
@@ -4464,7 +5219,14 @@
               <w:rPr>
                 <w:rFonts w:ascii="Times New Roman" w:eastAsia="標楷體" w:hAnsi="Times New Roman" w:cs="Times New Roman" w:hint="eastAsia"/>
               </w:rPr>
-              <w:t>被正確歸類至</w:t>
+              <w:t>被正確</w:t>
+            </w:r>
+            <w:proofErr w:type="gramStart"/>
+            <w:r>
+              <w:rPr>
+                <w:rFonts w:ascii="Times New Roman" w:eastAsia="標楷體" w:hAnsi="Times New Roman" w:cs="Times New Roman" w:hint="eastAsia"/>
+              </w:rPr>
+              <w:t>歸類至</w:t>
             </w:r>
             <w:r>
               <w:rPr>
@@ -4472,6 +5234,7 @@
               </w:rPr>
               <w:t>賣家</w:t>
             </w:r>
+            <w:proofErr w:type="gramEnd"/>
             <w:r>
               <w:rPr>
                 <w:rFonts w:ascii="Times New Roman" w:eastAsia="標楷體" w:hAnsi="Times New Roman" w:cs="Times New Roman" w:hint="eastAsia"/>
@@ -4488,7 +5251,21 @@
               <w:rPr>
                 <w:rFonts w:ascii="Times New Roman" w:eastAsia="標楷體" w:hAnsi="Times New Roman" w:cs="Times New Roman" w:hint="eastAsia"/>
               </w:rPr>
-              <w:t>分類中，且買家在賣家個人頁面能看到清楚的分類結構。</w:t>
+              <w:t>分類中，且買家在賣家個人頁面能看到</w:t>
+            </w:r>
+            <w:proofErr w:type="gramStart"/>
+            <w:r>
+              <w:rPr>
+                <w:rFonts w:ascii="Times New Roman" w:eastAsia="標楷體" w:hAnsi="Times New Roman" w:cs="Times New Roman" w:hint="eastAsia"/>
+              </w:rPr>
+              <w:t>清楚的</w:t>
+            </w:r>
+            <w:proofErr w:type="gramEnd"/>
+            <w:r>
+              <w:rPr>
+                <w:rFonts w:ascii="Times New Roman" w:eastAsia="標楷體" w:hAnsi="Times New Roman" w:cs="Times New Roman" w:hint="eastAsia"/>
+              </w:rPr>
+              <w:t>分類結構。</w:t>
             </w:r>
           </w:p>
         </w:tc>
@@ -4637,7 +5414,7 @@
               <w:rPr>
                 <w:rFonts w:ascii="Times New Roman" w:eastAsia="標楷體" w:hAnsi="Times New Roman" w:cs="Times New Roman" w:hint="eastAsia"/>
               </w:rPr>
-              <w:t>商品</w:t>
+              <w:t>書籍</w:t>
             </w:r>
             <w:r>
               <w:rPr>
@@ -4655,7 +5432,7 @@
               <w:rPr>
                 <w:rFonts w:ascii="Times New Roman" w:eastAsia="標楷體" w:hAnsi="Times New Roman" w:cs="Times New Roman" w:hint="eastAsia"/>
               </w:rPr>
-              <w:t>商品</w:t>
+              <w:t>書籍</w:t>
             </w:r>
             <w:r>
               <w:rPr>
@@ -4831,15 +5608,40 @@
                 <w:ilvl w:val="0"/>
                 <w:numId w:val="6"/>
               </w:numPr>
-              <w:rPr>
-                <w:rFonts w:ascii="Times New Roman" w:eastAsia="標楷體" w:hAnsi="Times New Roman" w:cs="Times New Roman"/>
-              </w:rPr>
-            </w:pPr>
-            <w:r>
-              <w:rPr>
-                <w:rFonts w:ascii="Times New Roman" w:eastAsia="標楷體" w:hAnsi="Times New Roman" w:cs="Times New Roman" w:hint="eastAsia"/>
-              </w:rPr>
-              <w:t>系統跳出確認刪除警告。</w:t>
+              <w:spacing w:after="160" w:line="278" w:lineRule="auto"/>
+              <w:rPr>
+                <w:rFonts w:ascii="Times New Roman" w:eastAsia="標楷體" w:hAnsi="Times New Roman" w:cs="Times New Roman"/>
+              </w:rPr>
+            </w:pPr>
+            <w:r>
+              <w:rPr>
+                <w:rFonts w:ascii="Times New Roman" w:eastAsia="標楷體" w:hAnsi="Times New Roman" w:cs="Times New Roman" w:hint="eastAsia"/>
+              </w:rPr>
+              <w:t>系統跳出警告</w:t>
+            </w:r>
+            <w:r>
+              <w:rPr>
+                <w:rFonts w:ascii="Times New Roman" w:eastAsia="標楷體" w:hAnsi="Times New Roman" w:cs="Times New Roman" w:hint="eastAsia"/>
+              </w:rPr>
+              <w:t>以</w:t>
+            </w:r>
+            <w:r>
+              <w:rPr>
+                <w:rFonts w:ascii="Times New Roman" w:eastAsia="標楷體" w:hAnsi="Times New Roman" w:cs="Times New Roman" w:hint="eastAsia"/>
+              </w:rPr>
+              <w:t>確認</w:t>
+            </w:r>
+            <w:r>
+              <w:rPr>
+                <w:rFonts w:ascii="Times New Roman" w:eastAsia="標楷體" w:hAnsi="Times New Roman" w:cs="Times New Roman" w:hint="eastAsia"/>
+              </w:rPr>
+              <w:t>是否</w:t>
+            </w:r>
+            <w:r>
+              <w:rPr>
+                <w:rFonts w:ascii="Times New Roman" w:eastAsia="標楷體" w:hAnsi="Times New Roman" w:cs="Times New Roman" w:hint="eastAsia"/>
+              </w:rPr>
+              <w:t>刪除。</w:t>
             </w:r>
           </w:p>
           <w:p>
@@ -4849,46 +5651,47 @@
                 <w:ilvl w:val="0"/>
                 <w:numId w:val="6"/>
               </w:numPr>
-              <w:spacing w:line="276" w:lineRule="auto"/>
-              <w:rPr>
-                <w:rFonts w:ascii="Times New Roman" w:eastAsia="標楷體" w:hAnsi="Times New Roman" w:cs="Times New Roman" w:hint="eastAsia"/>
-                <w:highlight w:val="yellow"/>
-              </w:rPr>
-            </w:pPr>
-            <w:r>
-              <w:rPr>
-                <w:rFonts w:ascii="Times New Roman" w:eastAsia="標楷體" w:hAnsi="Times New Roman" w:cs="Times New Roman" w:hint="eastAsia"/>
-                <w:highlight w:val="yellow"/>
-              </w:rPr>
-              <w:t>回到</w:t>
-            </w:r>
-            <w:r>
-              <w:rPr>
-                <w:rFonts w:ascii="Times New Roman" w:eastAsia="標楷體" w:hAnsi="Times New Roman" w:cs="Times New Roman" w:hint="eastAsia"/>
-                <w:highlight w:val="yellow"/>
-              </w:rPr>
-              <w:t>Main Success Scenario</w:t>
-            </w:r>
-            <w:r>
-              <w:rPr>
-                <w:rFonts w:ascii="Times New Roman" w:eastAsia="標楷體" w:hAnsi="Times New Roman" w:cs="Times New Roman" w:hint="eastAsia"/>
-                <w:highlight w:val="yellow"/>
-              </w:rPr>
-              <w:t>第</w:t>
-            </w:r>
-            <w:r>
-              <w:rPr>
-                <w:rFonts w:ascii="Times New Roman" w:eastAsia="標楷體" w:hAnsi="Times New Roman" w:cs="Times New Roman" w:hint="eastAsia"/>
-                <w:highlight w:val="yellow"/>
-              </w:rPr>
-              <w:t>5</w:t>
-            </w:r>
-            <w:r>
-              <w:rPr>
-                <w:rFonts w:ascii="Times New Roman" w:eastAsia="標楷體" w:hAnsi="Times New Roman" w:cs="Times New Roman" w:hint="eastAsia"/>
-                <w:highlight w:val="yellow"/>
-              </w:rPr>
-              <w:t>步。</w:t>
+              <w:spacing w:after="160" w:line="278" w:lineRule="auto"/>
+              <w:rPr>
+                <w:rFonts w:ascii="Times New Roman" w:eastAsia="標楷體" w:hAnsi="Times New Roman" w:cs="Times New Roman"/>
+              </w:rPr>
+            </w:pPr>
+            <w:r>
+              <w:rPr>
+                <w:rFonts w:ascii="Times New Roman" w:eastAsia="標楷體" w:hAnsi="Times New Roman" w:cs="Times New Roman"/>
+              </w:rPr>
+              <w:t>賣家確認刪除。</w:t>
+            </w:r>
+          </w:p>
+          <w:p>
+            <w:pPr>
+              <w:pStyle w:val="a9"/>
+              <w:numPr>
+                <w:ilvl w:val="0"/>
+                <w:numId w:val="6"/>
+              </w:numPr>
+              <w:spacing w:after="160" w:line="278" w:lineRule="auto"/>
+              <w:rPr>
+                <w:rFonts w:ascii="Times New Roman" w:eastAsia="標楷體" w:hAnsi="Times New Roman" w:cs="Times New Roman"/>
+              </w:rPr>
+            </w:pPr>
+            <w:r>
+              <w:rPr>
+                <w:rFonts w:ascii="Times New Roman" w:eastAsia="標楷體" w:hAnsi="Times New Roman" w:cs="Times New Roman" w:hint="eastAsia"/>
+              </w:rPr>
+              <w:t>系統將被刪除分類中的書籍</w:t>
+            </w:r>
+            <w:r>
+              <w:rPr>
+                <w:rFonts w:ascii="Times New Roman" w:eastAsia="標楷體" w:hAnsi="Times New Roman" w:cs="Times New Roman" w:hint="eastAsia"/>
+              </w:rPr>
+              <w:t>狀態更新為</w:t>
+            </w:r>
+            <w:r>
+              <w:rPr>
+                <w:rFonts w:ascii="Times New Roman" w:eastAsia="標楷體" w:hAnsi="Times New Roman" w:cs="Times New Roman" w:hint="eastAsia"/>
+              </w:rPr>
+              <w:t>「未分類」</w:t>
             </w:r>
           </w:p>
           <w:p>
@@ -4919,7 +5722,7 @@
           <w:p>
             <w:pPr>
               <w:rPr>
-                <w:rFonts w:ascii="Times New Roman" w:eastAsia="標楷體" w:hAnsi="Times New Roman" w:cs="Times New Roman"/>
+                <w:rFonts w:ascii="Times New Roman" w:eastAsia="標楷體" w:hAnsi="Times New Roman" w:cs="Times New Roman" w:hint="eastAsia"/>
               </w:rPr>
             </w:pPr>
             <w:r>
@@ -4944,69 +5747,13 @@
               <w:rPr>
                 <w:rFonts w:ascii="Times New Roman" w:eastAsia="標楷體" w:hAnsi="Times New Roman" w:cs="Times New Roman" w:hint="eastAsia"/>
               </w:rPr>
-              <w:t>商品</w:t>
+              <w:t>書籍</w:t>
             </w:r>
             <w:r>
               <w:rPr>
                 <w:rFonts w:ascii="Times New Roman" w:eastAsia="標楷體" w:hAnsi="Times New Roman" w:cs="Times New Roman" w:hint="eastAsia"/>
               </w:rPr>
               <w:t>關聯時發生錯誤，系統應還原狀態並提示賣家重新操作。</w:t>
-            </w:r>
-          </w:p>
-          <w:p>
-            <w:pPr>
-              <w:rPr>
-                <w:rFonts w:ascii="Times New Roman" w:eastAsia="標楷體" w:hAnsi="Times New Roman" w:cs="Times New Roman"/>
-              </w:rPr>
-            </w:pPr>
-            <w:r>
-              <w:rPr>
-                <w:rFonts w:ascii="Times New Roman" w:eastAsia="標楷體" w:hAnsi="Times New Roman" w:cs="Times New Roman" w:hint="eastAsia"/>
-                <w:highlight w:val="yellow"/>
-              </w:rPr>
-              <w:t>5</w:t>
-            </w:r>
-            <w:r>
-              <w:rPr>
-                <w:rFonts w:ascii="Times New Roman" w:eastAsia="標楷體" w:hAnsi="Times New Roman" w:cs="Times New Roman" w:hint="eastAsia"/>
-                <w:highlight w:val="yellow"/>
-              </w:rPr>
-              <w:t xml:space="preserve">a. </w:t>
-            </w:r>
-            <w:r>
-              <w:rPr>
-                <w:rFonts w:ascii="Times New Roman" w:eastAsia="標楷體" w:hAnsi="Times New Roman" w:cs="Times New Roman" w:hint="eastAsia"/>
-                <w:highlight w:val="yellow"/>
-              </w:rPr>
-              <w:t>刪除分類：賣家刪除分類時，系統需確認</w:t>
-            </w:r>
-            <w:r>
-              <w:rPr>
-                <w:rFonts w:ascii="Times New Roman" w:eastAsia="標楷體" w:hAnsi="Times New Roman" w:cs="Times New Roman" w:hint="eastAsia"/>
-                <w:highlight w:val="yellow"/>
-              </w:rPr>
-              <w:t>商品</w:t>
-            </w:r>
-            <w:r>
-              <w:rPr>
-                <w:rFonts w:ascii="Times New Roman" w:eastAsia="標楷體" w:hAnsi="Times New Roman" w:cs="Times New Roman" w:hint="eastAsia"/>
-                <w:highlight w:val="yellow"/>
-              </w:rPr>
-              <w:t>是否回歸到「未分類」狀態而非直接刪除</w:t>
-            </w:r>
-            <w:r>
-              <w:rPr>
-                <w:rFonts w:ascii="Times New Roman" w:eastAsia="標楷體" w:hAnsi="Times New Roman" w:cs="Times New Roman" w:hint="eastAsia"/>
-                <w:highlight w:val="yellow"/>
-              </w:rPr>
-              <w:t>商品</w:t>
-            </w:r>
-            <w:r>
-              <w:rPr>
-                <w:rFonts w:ascii="Times New Roman" w:eastAsia="標楷體" w:hAnsi="Times New Roman" w:cs="Times New Roman" w:hint="eastAsia"/>
-                <w:highlight w:val="yellow"/>
-              </w:rPr>
-              <w:t>。</w:t>
             </w:r>
           </w:p>
         </w:tc>
@@ -5044,19 +5791,43 @@
               <w:rPr>
                 <w:rFonts w:ascii="Times New Roman" w:eastAsia="標楷體" w:hAnsi="Times New Roman" w:cs="Times New Roman" w:hint="eastAsia"/>
               </w:rPr>
-              <w:t>支援「批次處理」功能，確保賣家能一次性分類多</w:t>
-            </w:r>
-            <w:r>
-              <w:rPr>
-                <w:rFonts w:ascii="Times New Roman" w:eastAsia="標楷體" w:hAnsi="Times New Roman" w:cs="Times New Roman" w:hint="eastAsia"/>
-              </w:rPr>
-              <w:t>件商品</w:t>
-            </w:r>
-            <w:r>
-              <w:rPr>
-                <w:rFonts w:ascii="Times New Roman" w:eastAsia="標楷體" w:hAnsi="Times New Roman" w:cs="Times New Roman" w:hint="eastAsia"/>
-              </w:rPr>
-              <w:t>，減少重複動作。</w:t>
+              <w:t>支援「批次處理」功能，賣家</w:t>
+            </w:r>
+            <w:r>
+              <w:rPr>
+                <w:rFonts w:ascii="Times New Roman" w:eastAsia="標楷體" w:hAnsi="Times New Roman" w:cs="Times New Roman" w:hint="eastAsia"/>
+              </w:rPr>
+              <w:t>可以</w:t>
+            </w:r>
+            <w:r>
+              <w:rPr>
+                <w:rFonts w:ascii="Times New Roman" w:eastAsia="標楷體" w:hAnsi="Times New Roman" w:cs="Times New Roman" w:hint="eastAsia"/>
+              </w:rPr>
+              <w:t>一次</w:t>
+            </w:r>
+            <w:r>
+              <w:rPr>
+                <w:rFonts w:ascii="Times New Roman" w:eastAsia="標楷體" w:hAnsi="Times New Roman" w:cs="Times New Roman" w:hint="eastAsia"/>
+              </w:rPr>
+              <w:t>處理</w:t>
+            </w:r>
+            <w:r>
+              <w:rPr>
+                <w:rFonts w:ascii="Times New Roman" w:eastAsia="標楷體" w:hAnsi="Times New Roman" w:cs="Times New Roman" w:hint="eastAsia"/>
+              </w:rPr>
+              <w:t>多</w:t>
+            </w:r>
+            <w:r>
+              <w:rPr>
+                <w:rFonts w:ascii="Times New Roman" w:eastAsia="標楷體" w:hAnsi="Times New Roman" w:cs="Times New Roman" w:hint="eastAsia"/>
+              </w:rPr>
+              <w:t>本書籍</w:t>
+            </w:r>
+            <w:r>
+              <w:rPr>
+                <w:rFonts w:ascii="Times New Roman" w:eastAsia="標楷體" w:hAnsi="Times New Roman" w:cs="Times New Roman" w:hint="eastAsia"/>
+              </w:rPr>
+              <w:t>。</w:t>
             </w:r>
           </w:p>
         </w:tc>
@@ -5094,19 +5865,7 @@
               <w:rPr>
                 <w:rFonts w:ascii="Times New Roman" w:eastAsia="標楷體" w:hAnsi="Times New Roman" w:cs="Times New Roman" w:hint="eastAsia"/>
               </w:rPr>
-              <w:t>系統應預設基礎分類（如：</w:t>
-            </w:r>
-            <w:r>
-              <w:rPr>
-                <w:rFonts w:ascii="Times New Roman" w:eastAsia="標楷體" w:hAnsi="Times New Roman" w:cs="Times New Roman" w:hint="eastAsia"/>
-              </w:rPr>
-              <w:t xml:space="preserve">ISBN </w:t>
-            </w:r>
-            <w:r>
-              <w:rPr>
-                <w:rFonts w:ascii="Times New Roman" w:eastAsia="標楷體" w:hAnsi="Times New Roman" w:cs="Times New Roman" w:hint="eastAsia"/>
-              </w:rPr>
-              <w:t>自動帶入的類別），並允許賣家自定義標籤進行更彈性的管理。</w:t>
+              <w:t>允許賣家自定義標籤進行彈性的管理。</w:t>
             </w:r>
           </w:p>
         </w:tc>
@@ -5145,19 +5904,7 @@
               <w:rPr>
                 <w:rFonts w:ascii="Times New Roman" w:eastAsia="標楷體" w:hAnsi="Times New Roman" w:cs="Times New Roman" w:hint="eastAsia"/>
               </w:rPr>
-              <w:t>當賣家擁有超過一定數量</w:t>
-            </w:r>
-            <w:r>
-              <w:rPr>
-                <w:rFonts w:ascii="Times New Roman" w:eastAsia="標楷體" w:hAnsi="Times New Roman" w:cs="Times New Roman" w:hint="eastAsia"/>
-              </w:rPr>
-              <w:t>的商品</w:t>
-            </w:r>
-            <w:r>
-              <w:rPr>
-                <w:rFonts w:ascii="Times New Roman" w:eastAsia="標楷體" w:hAnsi="Times New Roman" w:cs="Times New Roman" w:hint="eastAsia"/>
-              </w:rPr>
-              <w:t>，或需要整理賣場時觸發（中頻率）。</w:t>
+              <w:t>中頻率</w:t>
             </w:r>
           </w:p>
         </w:tc>
@@ -5201,7 +5948,7 @@
               <w:rPr>
                 <w:rFonts w:ascii="Times New Roman" w:eastAsia="標楷體" w:hAnsi="Times New Roman" w:cs="Times New Roman" w:hint="eastAsia"/>
               </w:rPr>
-              <w:t>商品</w:t>
+              <w:t>書籍</w:t>
             </w:r>
             <w:r>
               <w:rPr>
@@ -5222,37 +5969,35 @@
     </w:p>
     <w:p>
       <w:pPr>
-        <w:rPr>
-          <w:rFonts w:ascii="Times New Roman" w:eastAsia="標楷體" w:hAnsi="Times New Roman" w:cs="Times New Roman"/>
-        </w:rPr>
+        <w:pStyle w:val="3"/>
       </w:pPr>
       <w:r>
         <w:rPr>
-          <w:rFonts w:ascii="Times New Roman" w:eastAsia="標楷體" w:hAnsi="Times New Roman" w:cs="Times New Roman" w:hint="eastAsia"/>
+          <w:rFonts w:hint="eastAsia"/>
         </w:rPr>
         <w:t>1.5.</w:t>
       </w:r>
       <w:r>
         <w:rPr>
-          <w:rFonts w:ascii="Times New Roman" w:eastAsia="標楷體" w:hAnsi="Times New Roman" w:cs="Times New Roman" w:hint="eastAsia"/>
+          <w:rFonts w:hint="eastAsia"/>
         </w:rPr>
         <w:t>6</w:t>
       </w:r>
       <w:r>
         <w:rPr>
-          <w:rFonts w:ascii="Times New Roman" w:eastAsia="標楷體" w:hAnsi="Times New Roman" w:cs="Times New Roman" w:hint="eastAsia"/>
+          <w:rFonts w:hint="eastAsia"/>
         </w:rPr>
         <w:t xml:space="preserve"> </w:t>
       </w:r>
       <w:r>
         <w:rPr>
-          <w:rFonts w:ascii="Times New Roman" w:eastAsia="標楷體" w:hAnsi="Times New Roman" w:cs="Times New Roman" w:hint="eastAsia"/>
+          <w:rFonts w:hint="eastAsia"/>
         </w:rPr>
         <w:t>管理</w:t>
       </w:r>
       <w:r>
         <w:rPr>
-          <w:rFonts w:ascii="Times New Roman" w:eastAsia="標楷體" w:hAnsi="Times New Roman" w:cs="Times New Roman" w:hint="eastAsia"/>
+          <w:rFonts w:hint="eastAsia"/>
         </w:rPr>
         <w:t>購物車</w:t>
       </w:r>
@@ -5300,7 +6045,13 @@
               <w:rPr>
                 <w:rFonts w:ascii="Times New Roman" w:eastAsia="標楷體" w:hAnsi="Times New Roman" w:cs="Times New Roman" w:hint="eastAsia"/>
               </w:rPr>
-              <w:t>FEA-05</w:t>
+              <w:t>FEA-0</w:t>
+            </w:r>
+            <w:r>
+              <w:rPr>
+                <w:rFonts w:ascii="Times New Roman" w:eastAsia="標楷體" w:hAnsi="Times New Roman" w:cs="Times New Roman" w:hint="eastAsia"/>
+              </w:rPr>
+              <w:t>6</w:t>
             </w:r>
           </w:p>
         </w:tc>
@@ -5335,6 +6086,7 @@
               </w:rPr>
             </w:pPr>
             <w:proofErr w:type="spellStart"/>
+            <w:proofErr w:type="gramStart"/>
             <w:r>
               <w:rPr>
                 <w:rFonts w:ascii="Times New Roman" w:eastAsia="標楷體" w:hAnsi="Times New Roman" w:cs="Times New Roman"/>
@@ -5342,6 +6094,7 @@
               <w:t>Re:Book</w:t>
             </w:r>
             <w:proofErr w:type="spellEnd"/>
+            <w:proofErr w:type="gramEnd"/>
           </w:p>
         </w:tc>
       </w:tr>
@@ -5453,54 +6206,32 @@
           <w:p>
             <w:pPr>
               <w:rPr>
-                <w:rFonts w:ascii="Times New Roman" w:eastAsia="標楷體" w:hAnsi="Times New Roman" w:cs="Times New Roman"/>
-              </w:rPr>
-            </w:pPr>
-            <w:r>
-              <w:rPr>
-                <w:rFonts w:ascii="Times New Roman" w:eastAsia="標楷體" w:hAnsi="Times New Roman" w:cs="Times New Roman" w:hint="eastAsia"/>
-              </w:rPr>
-              <w:t>買家：希望在正式決定交易前，先暫存感興趣</w:t>
-            </w:r>
-            <w:r>
-              <w:rPr>
-                <w:rFonts w:ascii="Times New Roman" w:eastAsia="標楷體" w:hAnsi="Times New Roman" w:cs="Times New Roman" w:hint="eastAsia"/>
-              </w:rPr>
-              <w:t>的商品</w:t>
+                <w:rFonts w:ascii="Times New Roman" w:eastAsia="標楷體" w:hAnsi="Times New Roman" w:cs="Times New Roman" w:hint="eastAsia"/>
+              </w:rPr>
+            </w:pPr>
+            <w:r>
+              <w:rPr>
+                <w:rFonts w:ascii="Times New Roman" w:eastAsia="標楷體" w:hAnsi="Times New Roman" w:cs="Times New Roman" w:hint="eastAsia"/>
+              </w:rPr>
+              <w:t>買家：希望暫存感興趣</w:t>
+            </w:r>
+            <w:r>
+              <w:rPr>
+                <w:rFonts w:ascii="Times New Roman" w:eastAsia="標楷體" w:hAnsi="Times New Roman" w:cs="Times New Roman" w:hint="eastAsia"/>
+              </w:rPr>
+              <w:t>的</w:t>
+            </w:r>
+            <w:r>
+              <w:rPr>
+                <w:rFonts w:ascii="Times New Roman" w:eastAsia="標楷體" w:hAnsi="Times New Roman" w:cs="Times New Roman" w:hint="eastAsia"/>
+              </w:rPr>
+              <w:t>書籍</w:t>
             </w:r>
             <w:r>
               <w:rPr>
                 <w:rFonts w:ascii="Times New Roman" w:eastAsia="標楷體" w:hAnsi="Times New Roman" w:cs="Times New Roman" w:hint="eastAsia"/>
               </w:rPr>
               <w:t>，以便一次性聯繫不同賣家或比較價格</w:t>
-            </w:r>
-          </w:p>
-          <w:p>
-            <w:pPr>
-              <w:rPr>
-                <w:rFonts w:ascii="Times New Roman" w:eastAsia="標楷體" w:hAnsi="Times New Roman" w:cs="Times New Roman"/>
-              </w:rPr>
-            </w:pPr>
-            <w:r>
-              <w:rPr>
-                <w:rFonts w:ascii="Times New Roman" w:eastAsia="標楷體" w:hAnsi="Times New Roman" w:cs="Times New Roman" w:hint="eastAsia"/>
-                <w:highlight w:val="yellow"/>
-              </w:rPr>
-              <w:t>賣家：希望知道有多少潛在買家對其</w:t>
-            </w:r>
-            <w:r>
-              <w:rPr>
-                <w:rFonts w:ascii="Times New Roman" w:eastAsia="標楷體" w:hAnsi="Times New Roman" w:cs="Times New Roman" w:hint="eastAsia"/>
-                <w:highlight w:val="yellow"/>
-              </w:rPr>
-              <w:t>商品</w:t>
-            </w:r>
-            <w:r>
-              <w:rPr>
-                <w:rFonts w:ascii="Times New Roman" w:eastAsia="標楷體" w:hAnsi="Times New Roman" w:cs="Times New Roman" w:hint="eastAsia"/>
-                <w:highlight w:val="yellow"/>
-              </w:rPr>
-              <w:t>感興趣（追蹤數）。</w:t>
             </w:r>
           </w:p>
         </w:tc>
@@ -5538,19 +6269,7 @@
               <w:rPr>
                 <w:rFonts w:ascii="Times New Roman" w:eastAsia="標楷體" w:hAnsi="Times New Roman" w:cs="Times New Roman" w:hint="eastAsia"/>
               </w:rPr>
-              <w:t>買家必須已登入系統，且系統中存在可選購</w:t>
-            </w:r>
-            <w:r>
-              <w:rPr>
-                <w:rFonts w:ascii="Times New Roman" w:eastAsia="標楷體" w:hAnsi="Times New Roman" w:cs="Times New Roman" w:hint="eastAsia"/>
-              </w:rPr>
-              <w:t>的商品</w:t>
-            </w:r>
-            <w:r>
-              <w:rPr>
-                <w:rFonts w:ascii="Times New Roman" w:eastAsia="標楷體" w:hAnsi="Times New Roman" w:cs="Times New Roman" w:hint="eastAsia"/>
-              </w:rPr>
-              <w:t>。</w:t>
+              <w:t>買家已登入系統</w:t>
             </w:r>
           </w:p>
         </w:tc>
@@ -5588,7 +6307,7 @@
               <w:rPr>
                 <w:rFonts w:ascii="Times New Roman" w:eastAsia="標楷體" w:hAnsi="Times New Roman" w:cs="Times New Roman" w:hint="eastAsia"/>
               </w:rPr>
-              <w:t>商品</w:t>
+              <w:t>書籍</w:t>
             </w:r>
             <w:r>
               <w:rPr>
@@ -5606,7 +6325,7 @@
               <w:rPr>
                 <w:rFonts w:ascii="Times New Roman" w:eastAsia="標楷體" w:hAnsi="Times New Roman" w:cs="Times New Roman" w:hint="eastAsia"/>
               </w:rPr>
-              <w:t>，且系統能即時反映該書籍的最新狀態（如：是否已被他人買走）。</w:t>
+              <w:t>，且系統能即時反映該書籍的最新狀態。</w:t>
             </w:r>
           </w:p>
         </w:tc>
@@ -5656,13 +6375,27 @@
               <w:rPr>
                 <w:rFonts w:ascii="Times New Roman" w:eastAsia="標楷體" w:hAnsi="Times New Roman" w:cs="Times New Roman" w:hint="eastAsia"/>
               </w:rPr>
-              <w:t>商品的</w:t>
-            </w:r>
-            <w:r>
-              <w:rPr>
-                <w:rFonts w:ascii="Times New Roman" w:eastAsia="標楷體" w:hAnsi="Times New Roman" w:cs="Times New Roman" w:hint="eastAsia"/>
-              </w:rPr>
-              <w:t>詳情頁點擊「加入</w:t>
+              <w:t>書籍</w:t>
+            </w:r>
+            <w:r>
+              <w:rPr>
+                <w:rFonts w:ascii="Times New Roman" w:eastAsia="標楷體" w:hAnsi="Times New Roman" w:cs="Times New Roman" w:hint="eastAsia"/>
+              </w:rPr>
+              <w:t>的</w:t>
+            </w:r>
+            <w:proofErr w:type="gramStart"/>
+            <w:r>
+              <w:rPr>
+                <w:rFonts w:ascii="Times New Roman" w:eastAsia="標楷體" w:hAnsi="Times New Roman" w:cs="Times New Roman" w:hint="eastAsia"/>
+              </w:rPr>
+              <w:t>詳情頁點擊</w:t>
+            </w:r>
+            <w:proofErr w:type="gramEnd"/>
+            <w:r>
+              <w:rPr>
+                <w:rFonts w:ascii="Times New Roman" w:eastAsia="標楷體" w:hAnsi="Times New Roman" w:cs="Times New Roman" w:hint="eastAsia"/>
+              </w:rPr>
+              <w:t>「加入</w:t>
             </w:r>
             <w:r>
               <w:rPr>
@@ -5711,7 +6444,7 @@
               <w:rPr>
                 <w:rFonts w:ascii="Times New Roman" w:eastAsia="標楷體" w:hAnsi="Times New Roman" w:cs="Times New Roman" w:hint="eastAsia"/>
               </w:rPr>
-              <w:t>商品</w:t>
+              <w:t>書籍</w:t>
             </w:r>
             <w:r>
               <w:rPr>
@@ -5750,6 +6483,7 @@
               </w:rPr>
               <w:t>買家進入</w:t>
             </w:r>
+            <w:proofErr w:type="gramStart"/>
             <w:r>
               <w:rPr>
                 <w:rFonts w:ascii="Times New Roman" w:eastAsia="標楷體" w:hAnsi="Times New Roman" w:cs="Times New Roman" w:hint="eastAsia"/>
@@ -5760,19 +6494,38 @@
               <w:rPr>
                 <w:rFonts w:ascii="Times New Roman" w:eastAsia="標楷體" w:hAnsi="Times New Roman" w:cs="Times New Roman" w:hint="eastAsia"/>
               </w:rPr>
-              <w:t>頁面，查看所有已收藏的</w:t>
-            </w:r>
-            <w:r>
-              <w:rPr>
-                <w:rFonts w:ascii="Times New Roman" w:eastAsia="標楷體" w:hAnsi="Times New Roman" w:cs="Times New Roman" w:hint="eastAsia"/>
-              </w:rPr>
-              <w:t>商品</w:t>
-            </w:r>
-            <w:r>
-              <w:rPr>
-                <w:rFonts w:ascii="Times New Roman" w:eastAsia="標楷體" w:hAnsi="Times New Roman" w:cs="Times New Roman" w:hint="eastAsia"/>
-              </w:rPr>
-              <w:t>資訊與賣家資訊。</w:t>
+              <w:t>頁面</w:t>
+            </w:r>
+            <w:proofErr w:type="gramEnd"/>
+            <w:r>
+              <w:rPr>
+                <w:rFonts w:ascii="Times New Roman" w:eastAsia="標楷體" w:hAnsi="Times New Roman" w:cs="Times New Roman" w:hint="eastAsia"/>
+              </w:rPr>
+              <w:t>，查看所有已</w:t>
+            </w:r>
+            <w:r>
+              <w:rPr>
+                <w:rFonts w:ascii="Times New Roman" w:eastAsia="標楷體" w:hAnsi="Times New Roman" w:cs="Times New Roman" w:hint="eastAsia"/>
+              </w:rPr>
+              <w:t>加入</w:t>
+            </w:r>
+            <w:r>
+              <w:rPr>
+                <w:rFonts w:ascii="Times New Roman" w:eastAsia="標楷體" w:hAnsi="Times New Roman" w:cs="Times New Roman" w:hint="eastAsia"/>
+              </w:rPr>
+              <w:t>的</w:t>
+            </w:r>
+            <w:r>
+              <w:rPr>
+                <w:rFonts w:ascii="Times New Roman" w:eastAsia="標楷體" w:hAnsi="Times New Roman" w:cs="Times New Roman" w:hint="eastAsia"/>
+              </w:rPr>
+              <w:t>書籍</w:t>
+            </w:r>
+            <w:r>
+              <w:rPr>
+                <w:rFonts w:ascii="Times New Roman" w:eastAsia="標楷體" w:hAnsi="Times New Roman" w:cs="Times New Roman" w:hint="eastAsia"/>
+              </w:rPr>
+              <w:t>資訊。</w:t>
             </w:r>
           </w:p>
           <w:p>
@@ -5793,12 +6546,14 @@
               </w:rPr>
               <w:t>買家可從</w:t>
             </w:r>
+            <w:proofErr w:type="gramStart"/>
             <w:r>
               <w:rPr>
                 <w:rFonts w:ascii="Times New Roman" w:eastAsia="標楷體" w:hAnsi="Times New Roman" w:cs="Times New Roman" w:hint="eastAsia"/>
               </w:rPr>
               <w:t>購物車頁面</w:t>
             </w:r>
+            <w:proofErr w:type="gramEnd"/>
             <w:r>
               <w:rPr>
                 <w:rFonts w:ascii="Times New Roman" w:eastAsia="標楷體" w:hAnsi="Times New Roman" w:cs="Times New Roman" w:hint="eastAsia"/>
@@ -5809,7 +6564,7 @@
               <w:rPr>
                 <w:rFonts w:ascii="Times New Roman" w:eastAsia="標楷體" w:hAnsi="Times New Roman" w:cs="Times New Roman" w:hint="eastAsia"/>
               </w:rPr>
-              <w:t>下單或發送私訊給賣家</w:t>
+              <w:t>下單</w:t>
             </w:r>
             <w:r>
               <w:rPr>
@@ -5871,7 +6626,7 @@
               <w:rPr>
                 <w:rFonts w:ascii="Times New Roman" w:eastAsia="標楷體" w:hAnsi="Times New Roman" w:cs="Times New Roman" w:hint="eastAsia"/>
               </w:rPr>
-              <w:t>商品</w:t>
+              <w:t>書籍</w:t>
             </w:r>
             <w:r>
               <w:rPr>
@@ -5879,12 +6634,13 @@
               </w:rPr>
               <w:t>已在清單中，系統提示不重複加入。</w:t>
             </w:r>
-            <w:r>
-              <w:rPr>
-                <w:rFonts w:ascii="Times New Roman" w:eastAsia="標楷體" w:hAnsi="Times New Roman" w:cs="Times New Roman"/>
-              </w:rPr>
-              <w:br/>
-            </w:r>
+          </w:p>
+          <w:p>
+            <w:pPr>
+              <w:rPr>
+                <w:rFonts w:ascii="Times New Roman" w:eastAsia="標楷體" w:hAnsi="Times New Roman" w:cs="Times New Roman"/>
+              </w:rPr>
+            </w:pPr>
             <w:r>
               <w:rPr>
                 <w:rFonts w:ascii="Times New Roman" w:eastAsia="標楷體" w:hAnsi="Times New Roman" w:cs="Times New Roman" w:hint="eastAsia"/>
@@ -5901,7 +6657,7 @@
               <w:rPr>
                 <w:rFonts w:ascii="Times New Roman" w:eastAsia="標楷體" w:hAnsi="Times New Roman" w:cs="Times New Roman" w:hint="eastAsia"/>
               </w:rPr>
-              <w:t>商品</w:t>
+              <w:t>書籍</w:t>
             </w:r>
             <w:r>
               <w:rPr>
@@ -5919,68 +6675,108 @@
               <w:rPr>
                 <w:rFonts w:ascii="Times New Roman" w:eastAsia="標楷體" w:hAnsi="Times New Roman" w:cs="Times New Roman" w:hint="eastAsia"/>
               </w:rPr>
-              <w:t>售出：系統提示該商品已失效，並自動從清單中標註或移除。</w:t>
-            </w:r>
-          </w:p>
-          <w:p>
-            <w:pPr>
-              <w:rPr>
-                <w:rFonts w:ascii="Times New Roman" w:eastAsia="標楷體" w:hAnsi="Times New Roman" w:cs="Times New Roman" w:hint="eastAsia"/>
-              </w:rPr>
-            </w:pPr>
-            <w:r>
-              <w:rPr>
-                <w:rFonts w:ascii="Times New Roman" w:eastAsia="標楷體" w:hAnsi="Times New Roman" w:cs="Times New Roman" w:hint="eastAsia"/>
-                <w:highlight w:val="yellow"/>
+              <w:t>售出：系統</w:t>
+            </w:r>
+            <w:r>
+              <w:rPr>
+                <w:rFonts w:ascii="Times New Roman" w:eastAsia="標楷體" w:hAnsi="Times New Roman" w:cs="Times New Roman" w:hint="eastAsia"/>
+              </w:rPr>
+              <w:t>自動</w:t>
+            </w:r>
+            <w:r>
+              <w:rPr>
+                <w:rFonts w:ascii="Times New Roman" w:eastAsia="標楷體" w:hAnsi="Times New Roman" w:cs="Times New Roman" w:hint="eastAsia"/>
+              </w:rPr>
+              <w:t>標示</w:t>
+            </w:r>
+            <w:r>
+              <w:rPr>
+                <w:rFonts w:ascii="Times New Roman" w:eastAsia="標楷體" w:hAnsi="Times New Roman" w:cs="Times New Roman" w:hint="eastAsia"/>
+              </w:rPr>
+              <w:t>該</w:t>
+            </w:r>
+            <w:r>
+              <w:rPr>
+                <w:rFonts w:ascii="Times New Roman" w:eastAsia="標楷體" w:hAnsi="Times New Roman" w:cs="Times New Roman" w:hint="eastAsia"/>
+              </w:rPr>
+              <w:t>書籍</w:t>
+            </w:r>
+            <w:r>
+              <w:rPr>
+                <w:rFonts w:ascii="Times New Roman" w:eastAsia="標楷體" w:hAnsi="Times New Roman" w:cs="Times New Roman" w:hint="eastAsia"/>
+              </w:rPr>
+              <w:t>狀態</w:t>
+            </w:r>
+            <w:r>
+              <w:rPr>
+                <w:rFonts w:ascii="Times New Roman" w:eastAsia="標楷體" w:hAnsi="Times New Roman" w:cs="Times New Roman" w:hint="eastAsia"/>
+              </w:rPr>
+              <w:t>。</w:t>
+            </w:r>
+          </w:p>
+          <w:p>
+            <w:pPr>
+              <w:rPr>
+                <w:rFonts w:ascii="Times New Roman" w:eastAsia="標楷體" w:hAnsi="Times New Roman" w:cs="Times New Roman"/>
+              </w:rPr>
+            </w:pPr>
+            <w:r>
+              <w:rPr>
+                <w:rFonts w:ascii="Times New Roman" w:eastAsia="標楷體" w:hAnsi="Times New Roman" w:cs="Times New Roman" w:hint="eastAsia"/>
               </w:rPr>
               <w:t>3</w:t>
             </w:r>
             <w:r>
               <w:rPr>
                 <w:rFonts w:ascii="Times New Roman" w:eastAsia="標楷體" w:hAnsi="Times New Roman" w:cs="Times New Roman" w:hint="eastAsia"/>
-                <w:highlight w:val="yellow"/>
               </w:rPr>
               <w:t>b</w:t>
             </w:r>
             <w:r>
               <w:rPr>
                 <w:rFonts w:ascii="Times New Roman" w:eastAsia="標楷體" w:hAnsi="Times New Roman" w:cs="Times New Roman" w:hint="eastAsia"/>
-                <w:highlight w:val="yellow"/>
               </w:rPr>
               <w:t xml:space="preserve">. </w:t>
             </w:r>
             <w:r>
               <w:rPr>
                 <w:rFonts w:ascii="Times New Roman" w:eastAsia="標楷體" w:hAnsi="Times New Roman" w:cs="Times New Roman" w:hint="eastAsia"/>
-                <w:highlight w:val="yellow"/>
               </w:rPr>
               <w:t>移除</w:t>
             </w:r>
             <w:r>
               <w:rPr>
                 <w:rFonts w:ascii="Times New Roman" w:eastAsia="標楷體" w:hAnsi="Times New Roman" w:cs="Times New Roman" w:hint="eastAsia"/>
-                <w:highlight w:val="yellow"/>
-              </w:rPr>
-              <w:t>商品</w:t>
-            </w:r>
-            <w:r>
-              <w:rPr>
-                <w:rFonts w:ascii="Times New Roman" w:eastAsia="標楷體" w:hAnsi="Times New Roman" w:cs="Times New Roman" w:hint="eastAsia"/>
-                <w:highlight w:val="yellow"/>
-              </w:rPr>
-              <w:t>：買家從清單中手動刪除不再感興趣的</w:t>
-            </w:r>
-            <w:r>
-              <w:rPr>
-                <w:rFonts w:ascii="Times New Roman" w:eastAsia="標楷體" w:hAnsi="Times New Roman" w:cs="Times New Roman" w:hint="eastAsia"/>
-                <w:highlight w:val="yellow"/>
-              </w:rPr>
-              <w:t>商品</w:t>
-            </w:r>
-            <w:r>
-              <w:rPr>
-                <w:rFonts w:ascii="Times New Roman" w:eastAsia="標楷體" w:hAnsi="Times New Roman" w:cs="Times New Roman" w:hint="eastAsia"/>
-                <w:highlight w:val="yellow"/>
+              </w:rPr>
+              <w:t>書籍</w:t>
+            </w:r>
+            <w:r>
+              <w:rPr>
+                <w:rFonts w:ascii="Times New Roman" w:eastAsia="標楷體" w:hAnsi="Times New Roman" w:cs="Times New Roman" w:hint="eastAsia"/>
+              </w:rPr>
+              <w:t>：買家從</w:t>
+            </w:r>
+            <w:r>
+              <w:rPr>
+                <w:rFonts w:ascii="Times New Roman" w:eastAsia="標楷體" w:hAnsi="Times New Roman" w:cs="Times New Roman" w:hint="eastAsia"/>
+              </w:rPr>
+              <w:t>購物車</w:t>
+            </w:r>
+            <w:r>
+              <w:rPr>
+                <w:rFonts w:ascii="Times New Roman" w:eastAsia="標楷體" w:hAnsi="Times New Roman" w:cs="Times New Roman" w:hint="eastAsia"/>
+              </w:rPr>
+              <w:t>中刪除不再感興趣的</w:t>
+            </w:r>
+            <w:r>
+              <w:rPr>
+                <w:rFonts w:ascii="Times New Roman" w:eastAsia="標楷體" w:hAnsi="Times New Roman" w:cs="Times New Roman" w:hint="eastAsia"/>
+              </w:rPr>
+              <w:t>書籍</w:t>
+            </w:r>
+            <w:r>
+              <w:rPr>
+                <w:rFonts w:ascii="Times New Roman" w:eastAsia="標楷體" w:hAnsi="Times New Roman" w:cs="Times New Roman" w:hint="eastAsia"/>
               </w:rPr>
               <w:t>。</w:t>
             </w:r>
@@ -6020,31 +6816,25 @@
               <w:rPr>
                 <w:rFonts w:ascii="Times New Roman" w:eastAsia="標楷體" w:hAnsi="Times New Roman" w:cs="Times New Roman" w:hint="eastAsia"/>
               </w:rPr>
-              <w:t>清單應能即時（</w:t>
-            </w:r>
-            <w:r>
-              <w:rPr>
-                <w:rFonts w:ascii="Times New Roman" w:eastAsia="標楷體" w:hAnsi="Times New Roman" w:cs="Times New Roman" w:hint="eastAsia"/>
-              </w:rPr>
-              <w:t>Real-time</w:t>
-            </w:r>
-            <w:r>
-              <w:rPr>
-                <w:rFonts w:ascii="Times New Roman" w:eastAsia="標楷體" w:hAnsi="Times New Roman" w:cs="Times New Roman" w:hint="eastAsia"/>
-              </w:rPr>
-              <w:t>）同步</w:t>
-            </w:r>
-            <w:r>
-              <w:rPr>
-                <w:rFonts w:ascii="Times New Roman" w:eastAsia="標楷體" w:hAnsi="Times New Roman" w:cs="Times New Roman" w:hint="eastAsia"/>
-              </w:rPr>
-              <w:t>商品</w:t>
-            </w:r>
-            <w:r>
-              <w:rPr>
-                <w:rFonts w:ascii="Times New Roman" w:eastAsia="標楷體" w:hAnsi="Times New Roman" w:cs="Times New Roman" w:hint="eastAsia"/>
-              </w:rPr>
-              <w:t>的銷售狀態。</w:t>
+              <w:t>購物車</w:t>
+            </w:r>
+            <w:r>
+              <w:rPr>
+                <w:rFonts w:ascii="Times New Roman" w:eastAsia="標楷體" w:hAnsi="Times New Roman" w:cs="Times New Roman" w:hint="eastAsia"/>
+              </w:rPr>
+              <w:t>應能即時同步</w:t>
+            </w:r>
+            <w:r>
+              <w:rPr>
+                <w:rFonts w:ascii="Times New Roman" w:eastAsia="標楷體" w:hAnsi="Times New Roman" w:cs="Times New Roman" w:hint="eastAsia"/>
+              </w:rPr>
+              <w:t>書籍</w:t>
+            </w:r>
+            <w:r>
+              <w:rPr>
+                <w:rFonts w:ascii="Times New Roman" w:eastAsia="標楷體" w:hAnsi="Times New Roman" w:cs="Times New Roman" w:hint="eastAsia"/>
+              </w:rPr>
+              <w:t>的狀態。</w:t>
             </w:r>
           </w:p>
         </w:tc>
@@ -6064,7 +6854,6 @@
               <w:rPr>
                 <w:rFonts w:ascii="Times New Roman" w:eastAsia="標楷體" w:hAnsi="Times New Roman" w:cs="Times New Roman" w:hint="eastAsia"/>
               </w:rPr>
-              <w:lastRenderedPageBreak/>
               <w:t>Technology and Data Variations List</w:t>
             </w:r>
           </w:p>
@@ -6083,7 +6872,7 @@
               <w:rPr>
                 <w:rFonts w:ascii="Times New Roman" w:eastAsia="標楷體" w:hAnsi="Times New Roman" w:cs="Times New Roman" w:hint="eastAsia"/>
               </w:rPr>
-              <w:t>支援「關注特定賣家」功能，當該賣家有新書上架時，買家會收到通知（未來擴充項目）。</w:t>
+              <w:t>無</w:t>
             </w:r>
           </w:p>
         </w:tc>
@@ -6121,19 +6910,7 @@
               <w:rPr>
                 <w:rFonts w:ascii="Times New Roman" w:eastAsia="標楷體" w:hAnsi="Times New Roman" w:cs="Times New Roman" w:hint="eastAsia"/>
               </w:rPr>
-              <w:t>當買家瀏覽到感興趣但尚未決定立刻購買的</w:t>
-            </w:r>
-            <w:r>
-              <w:rPr>
-                <w:rFonts w:ascii="Times New Roman" w:eastAsia="標楷體" w:hAnsi="Times New Roman" w:cs="Times New Roman" w:hint="eastAsia"/>
-              </w:rPr>
-              <w:t>商品</w:t>
-            </w:r>
-            <w:r>
-              <w:rPr>
-                <w:rFonts w:ascii="Times New Roman" w:eastAsia="標楷體" w:hAnsi="Times New Roman" w:cs="Times New Roman" w:hint="eastAsia"/>
-              </w:rPr>
-              <w:t>時（高頻率）。</w:t>
+              <w:t>高頻率</w:t>
             </w:r>
           </w:p>
         </w:tc>
@@ -6171,19 +6948,7 @@
               <w:rPr>
                 <w:rFonts w:ascii="Times New Roman" w:eastAsia="標楷體" w:hAnsi="Times New Roman" w:cs="Times New Roman" w:hint="eastAsia"/>
               </w:rPr>
-              <w:t>是否需要設置「</w:t>
-            </w:r>
-            <w:r>
-              <w:rPr>
-                <w:rFonts w:ascii="Times New Roman" w:eastAsia="標楷體" w:hAnsi="Times New Roman" w:cs="Times New Roman" w:hint="eastAsia"/>
-              </w:rPr>
-              <w:t>購物車</w:t>
-            </w:r>
-            <w:r>
-              <w:rPr>
-                <w:rFonts w:ascii="Times New Roman" w:eastAsia="標楷體" w:hAnsi="Times New Roman" w:cs="Times New Roman" w:hint="eastAsia"/>
-              </w:rPr>
-              <w:t>上限數」，以防止資料庫負擔過重？</w:t>
+              <w:t>無</w:t>
             </w:r>
           </w:p>
         </w:tc>
@@ -6292,6 +7057,7 @@
               <w:rPr>
                 <w:rFonts w:ascii="Times New Roman" w:eastAsia="標楷體" w:hAnsi="Times New Roman" w:cs="Times New Roman"/>
               </w:rPr>
+              <w:lastRenderedPageBreak/>
               <w:t>NFR-1</w:t>
             </w:r>
           </w:p>
@@ -6346,7 +7112,7 @@
               <w:rPr>
                 <w:rFonts w:ascii="Times New Roman" w:eastAsia="標楷體" w:hAnsi="Times New Roman" w:cs="Times New Roman" w:hint="eastAsia"/>
               </w:rPr>
-              <w:t xml:space="preserve"> 2 </w:t>
+              <w:t>2</w:t>
             </w:r>
             <w:r>
               <w:rPr>
@@ -6420,7 +7186,7 @@
               <w:rPr>
                 <w:rFonts w:ascii="Times New Roman" w:eastAsia="標楷體" w:hAnsi="Times New Roman" w:cs="Times New Roman" w:hint="eastAsia"/>
               </w:rPr>
-              <w:t>商品</w:t>
+              <w:t>書籍</w:t>
             </w:r>
             <w:r>
               <w:rPr>
@@ -6432,7 +7198,7 @@
               <w:rPr>
                 <w:rFonts w:ascii="Times New Roman" w:eastAsia="標楷體" w:hAnsi="Times New Roman" w:cs="Times New Roman" w:hint="eastAsia"/>
               </w:rPr>
-              <w:t xml:space="preserve"> 2 </w:t>
+              <w:t>2</w:t>
             </w:r>
             <w:r>
               <w:rPr>
@@ -6496,17 +7262,25 @@
                 <w:rFonts w:ascii="Times New Roman" w:eastAsia="標楷體" w:hAnsi="Times New Roman" w:cs="Times New Roman"/>
               </w:rPr>
             </w:pPr>
-            <w:r>
-              <w:rPr>
-                <w:rFonts w:ascii="Times New Roman" w:eastAsia="標楷體" w:hAnsi="Times New Roman" w:cs="Times New Roman" w:hint="eastAsia"/>
-              </w:rPr>
-              <w:t>私訊傳遞的延遲時間應小於</w:t>
-            </w:r>
-            <w:r>
-              <w:rPr>
-                <w:rFonts w:ascii="Times New Roman" w:eastAsia="標楷體" w:hAnsi="Times New Roman" w:cs="Times New Roman" w:hint="eastAsia"/>
-              </w:rPr>
-              <w:t xml:space="preserve"> 1 </w:t>
+            <w:proofErr w:type="gramStart"/>
+            <w:r>
+              <w:rPr>
+                <w:rFonts w:ascii="Times New Roman" w:eastAsia="標楷體" w:hAnsi="Times New Roman" w:cs="Times New Roman" w:hint="eastAsia"/>
+              </w:rPr>
+              <w:t>私訊傳遞</w:t>
+            </w:r>
+            <w:proofErr w:type="gramEnd"/>
+            <w:r>
+              <w:rPr>
+                <w:rFonts w:ascii="Times New Roman" w:eastAsia="標楷體" w:hAnsi="Times New Roman" w:cs="Times New Roman" w:hint="eastAsia"/>
+              </w:rPr>
+              <w:t>的延遲時間應小於</w:t>
+            </w:r>
+            <w:r>
+              <w:rPr>
+                <w:rFonts w:ascii="Times New Roman" w:eastAsia="標楷體" w:hAnsi="Times New Roman" w:cs="Times New Roman" w:hint="eastAsia"/>
+              </w:rPr>
+              <w:t>1</w:t>
             </w:r>
             <w:r>
               <w:rPr>
@@ -6654,7 +7428,7 @@
               <w:rPr>
                 <w:rFonts w:ascii="Times New Roman" w:eastAsia="標楷體" w:hAnsi="Times New Roman" w:cs="Times New Roman" w:hint="eastAsia"/>
               </w:rPr>
-              <w:t xml:space="preserve"> 99.9%</w:t>
+              <w:t>99.9%</w:t>
             </w:r>
             <w:r>
               <w:rPr>
@@ -6673,7 +7447,7 @@
           <w:p>
             <w:pPr>
               <w:rPr>
-                <w:rFonts w:ascii="Times New Roman" w:eastAsia="標楷體" w:hAnsi="Times New Roman" w:cs="Times New Roman"/>
+                <w:rFonts w:ascii="Times New Roman" w:eastAsia="標楷體" w:hAnsi="Times New Roman" w:cs="Times New Roman" w:hint="eastAsia"/>
               </w:rPr>
             </w:pPr>
             <w:r>
@@ -6704,7 +7478,7 @@
               <w:rPr>
                 <w:rFonts w:ascii="Times New Roman" w:eastAsia="標楷體" w:hAnsi="Times New Roman" w:cs="Times New Roman"/>
               </w:rPr>
-              <w:t>Security</w:t>
+              <w:t>Compatibility</w:t>
             </w:r>
           </w:p>
         </w:tc>
@@ -6722,7 +7496,7 @@
               <w:rPr>
                 <w:rFonts w:ascii="Times New Roman" w:eastAsia="標楷體" w:hAnsi="Times New Roman" w:cs="Times New Roman" w:hint="eastAsia"/>
               </w:rPr>
-              <w:t>敏感的使用者個資與私訊對話內容，必須經過安全加密處理。</w:t>
+              <w:t>系統介面需支援響應式設計，以相容桌上型電腦、平板電腦和智慧型手機等多種裝置。</w:t>
             </w:r>
           </w:p>
         </w:tc>
@@ -6735,7 +7509,7 @@
           <w:p>
             <w:pPr>
               <w:rPr>
-                <w:rFonts w:ascii="Times New Roman" w:eastAsia="標楷體" w:hAnsi="Times New Roman" w:cs="Times New Roman"/>
+                <w:rFonts w:ascii="Times New Roman" w:eastAsia="標楷體" w:hAnsi="Times New Roman" w:cs="Times New Roman" w:hint="eastAsia"/>
               </w:rPr>
             </w:pPr>
             <w:r>
@@ -6766,7 +7540,7 @@
               <w:rPr>
                 <w:rFonts w:ascii="Times New Roman" w:eastAsia="標楷體" w:hAnsi="Times New Roman" w:cs="Times New Roman"/>
               </w:rPr>
-              <w:t>Security</w:t>
+              <w:t>Testability</w:t>
             </w:r>
           </w:p>
         </w:tc>
@@ -6783,154 +7557,6 @@
             <w:r>
               <w:rPr>
                 <w:rFonts w:ascii="Times New Roman" w:eastAsia="標楷體" w:hAnsi="Times New Roman" w:cs="Times New Roman" w:hint="eastAsia"/>
-                <w:highlight w:val="yellow"/>
-              </w:rPr>
-              <w:t>系統必須要求使用有效的學校電子郵件信箱（例如</w:t>
-            </w:r>
-            <w:r>
-              <w:rPr>
-                <w:rFonts w:ascii="Times New Roman" w:eastAsia="標楷體" w:hAnsi="Times New Roman" w:cs="Times New Roman" w:hint="eastAsia"/>
-                <w:highlight w:val="yellow"/>
-              </w:rPr>
-              <w:t>.</w:t>
-            </w:r>
-            <w:proofErr w:type="spellStart"/>
-            <w:r>
-              <w:rPr>
-                <w:rFonts w:ascii="Times New Roman" w:eastAsia="標楷體" w:hAnsi="Times New Roman" w:cs="Times New Roman" w:hint="eastAsia"/>
-                <w:highlight w:val="yellow"/>
-              </w:rPr>
-              <w:t>edu</w:t>
-            </w:r>
-            <w:proofErr w:type="spellEnd"/>
-            <w:r>
-              <w:rPr>
-                <w:rFonts w:ascii="Times New Roman" w:eastAsia="標楷體" w:hAnsi="Times New Roman" w:cs="Times New Roman" w:hint="eastAsia"/>
-                <w:highlight w:val="yellow"/>
-              </w:rPr>
-              <w:t>網域）進行身分驗證註冊。</w:t>
-            </w:r>
-          </w:p>
-        </w:tc>
-      </w:tr>
-      <w:tr>
-        <w:tc>
-          <w:tcPr>
-            <w:tcW w:w="1129" w:type="dxa"/>
-          </w:tcPr>
-          <w:p>
-            <w:pPr>
-              <w:rPr>
-                <w:rFonts w:ascii="Times New Roman" w:eastAsia="標楷體" w:hAnsi="Times New Roman" w:cs="Times New Roman"/>
-              </w:rPr>
-            </w:pPr>
-            <w:r>
-              <w:rPr>
-                <w:rFonts w:ascii="Times New Roman" w:eastAsia="標楷體" w:hAnsi="Times New Roman" w:cs="Times New Roman"/>
-              </w:rPr>
-              <w:t>NFR-</w:t>
-            </w:r>
-            <w:r>
-              <w:rPr>
-                <w:rFonts w:ascii="Times New Roman" w:eastAsia="標楷體" w:hAnsi="Times New Roman" w:cs="Times New Roman" w:hint="eastAsia"/>
-              </w:rPr>
-              <w:t>8</w:t>
-            </w:r>
-          </w:p>
-        </w:tc>
-        <w:tc>
-          <w:tcPr>
-            <w:tcW w:w="1701" w:type="dxa"/>
-          </w:tcPr>
-          <w:p>
-            <w:pPr>
-              <w:rPr>
-                <w:rFonts w:ascii="Times New Roman" w:eastAsia="標楷體" w:hAnsi="Times New Roman" w:cs="Times New Roman"/>
-              </w:rPr>
-            </w:pPr>
-            <w:r>
-              <w:rPr>
-                <w:rFonts w:ascii="Times New Roman" w:eastAsia="標楷體" w:hAnsi="Times New Roman" w:cs="Times New Roman"/>
-              </w:rPr>
-              <w:t>Compatibility</w:t>
-            </w:r>
-          </w:p>
-        </w:tc>
-        <w:tc>
-          <w:tcPr>
-            <w:tcW w:w="5466" w:type="dxa"/>
-          </w:tcPr>
-          <w:p>
-            <w:pPr>
-              <w:rPr>
-                <w:rFonts w:ascii="Times New Roman" w:eastAsia="標楷體" w:hAnsi="Times New Roman" w:cs="Times New Roman"/>
-              </w:rPr>
-            </w:pPr>
-            <w:r>
-              <w:rPr>
-                <w:rFonts w:ascii="Times New Roman" w:eastAsia="標楷體" w:hAnsi="Times New Roman" w:cs="Times New Roman" w:hint="eastAsia"/>
-              </w:rPr>
-              <w:t>系統介面需支援響應式設計，以相容桌上型電腦、平板電腦和智慧型手機等多種裝置。</w:t>
-            </w:r>
-          </w:p>
-        </w:tc>
-      </w:tr>
-      <w:tr>
-        <w:tc>
-          <w:tcPr>
-            <w:tcW w:w="1129" w:type="dxa"/>
-          </w:tcPr>
-          <w:p>
-            <w:pPr>
-              <w:rPr>
-                <w:rFonts w:ascii="Times New Roman" w:eastAsia="標楷體" w:hAnsi="Times New Roman" w:cs="Times New Roman"/>
-              </w:rPr>
-            </w:pPr>
-            <w:r>
-              <w:rPr>
-                <w:rFonts w:ascii="Times New Roman" w:eastAsia="標楷體" w:hAnsi="Times New Roman" w:cs="Times New Roman"/>
-              </w:rPr>
-              <w:t>NFR-</w:t>
-            </w:r>
-            <w:r>
-              <w:rPr>
-                <w:rFonts w:ascii="Times New Roman" w:eastAsia="標楷體" w:hAnsi="Times New Roman" w:cs="Times New Roman" w:hint="eastAsia"/>
-              </w:rPr>
-              <w:t>9</w:t>
-            </w:r>
-          </w:p>
-        </w:tc>
-        <w:tc>
-          <w:tcPr>
-            <w:tcW w:w="1701" w:type="dxa"/>
-          </w:tcPr>
-          <w:p>
-            <w:pPr>
-              <w:rPr>
-                <w:rFonts w:ascii="Times New Roman" w:eastAsia="標楷體" w:hAnsi="Times New Roman" w:cs="Times New Roman"/>
-              </w:rPr>
-            </w:pPr>
-            <w:r>
-              <w:rPr>
-                <w:rFonts w:ascii="Times New Roman" w:eastAsia="標楷體" w:hAnsi="Times New Roman" w:cs="Times New Roman"/>
-              </w:rPr>
-              <w:t>Testability</w:t>
-            </w:r>
-          </w:p>
-        </w:tc>
-        <w:tc>
-          <w:tcPr>
-            <w:tcW w:w="5466" w:type="dxa"/>
-          </w:tcPr>
-          <w:p>
-            <w:pPr>
-              <w:rPr>
-                <w:rFonts w:ascii="Times New Roman" w:eastAsia="標楷體" w:hAnsi="Times New Roman" w:cs="Times New Roman"/>
-              </w:rPr>
-            </w:pPr>
-            <w:r>
-              <w:rPr>
-                <w:rFonts w:ascii="Times New Roman" w:eastAsia="標楷體" w:hAnsi="Times New Roman" w:cs="Times New Roman" w:hint="eastAsia"/>
               </w:rPr>
               <w:t>後端</w:t>
             </w:r>
@@ -6938,7 +7564,7 @@
               <w:rPr>
                 <w:rFonts w:ascii="Times New Roman" w:eastAsia="標楷體" w:hAnsi="Times New Roman" w:cs="Times New Roman" w:hint="eastAsia"/>
               </w:rPr>
-              <w:t xml:space="preserve"> Java </w:t>
+              <w:t>Java</w:t>
             </w:r>
             <w:r>
               <w:rPr>
@@ -6950,7 +7576,7 @@
               <w:rPr>
                 <w:rFonts w:ascii="Times New Roman" w:eastAsia="標楷體" w:hAnsi="Times New Roman" w:cs="Times New Roman" w:hint="eastAsia"/>
               </w:rPr>
-              <w:t xml:space="preserve"> 85%</w:t>
+              <w:t>85%</w:t>
             </w:r>
             <w:r>
               <w:rPr>
@@ -6965,14 +7591,7 @@
     <w:p>
       <w:pPr>
         <w:rPr>
-          <w:rFonts w:ascii="Times New Roman" w:eastAsia="標楷體" w:hAnsi="Times New Roman" w:cs="Times New Roman"/>
-        </w:rPr>
-      </w:pPr>
-    </w:p>
-    <w:p>
-      <w:pPr>
-        <w:rPr>
-          <w:rFonts w:ascii="Times New Roman" w:eastAsia="標楷體" w:hAnsi="Times New Roman" w:cs="Times New Roman"/>
+          <w:rFonts w:ascii="Times New Roman" w:eastAsia="標楷體" w:hAnsi="Times New Roman" w:cs="Times New Roman" w:hint="eastAsia"/>
         </w:rPr>
       </w:pPr>
     </w:p>
@@ -7145,18 +7764,6 @@
               <w:rPr>
                 <w:rFonts w:ascii="Times New Roman" w:eastAsia="標楷體" w:hAnsi="Times New Roman" w:cs="Times New Roman" w:hint="eastAsia"/>
               </w:rPr>
-              <w:t>商品</w:t>
-            </w:r>
-            <w:r>
-              <w:rPr>
-                <w:rFonts w:ascii="Times New Roman" w:eastAsia="標楷體" w:hAnsi="Times New Roman" w:cs="Times New Roman" w:hint="eastAsia"/>
-              </w:rPr>
-              <w:t>/</w:t>
-            </w:r>
-            <w:r>
-              <w:rPr>
-                <w:rFonts w:ascii="Times New Roman" w:eastAsia="標楷體" w:hAnsi="Times New Roman" w:cs="Times New Roman" w:hint="eastAsia"/>
-              </w:rPr>
               <w:t>書籍</w:t>
             </w:r>
           </w:p>
@@ -7187,14 +7794,21 @@
               <w:rPr>
                 <w:rFonts w:ascii="Times New Roman" w:eastAsia="標楷體" w:hAnsi="Times New Roman" w:cs="Times New Roman"/>
               </w:rPr>
-              <w:t>，包含該書籍的價</w:t>
-            </w:r>
-            <w:r>
-              <w:rPr>
-                <w:rFonts w:ascii="Times New Roman" w:eastAsia="標楷體" w:hAnsi="Times New Roman" w:cs="Times New Roman"/>
-              </w:rPr>
-              <w:lastRenderedPageBreak/>
-              <w:t>格、書況、照片與所在地點等資訊。</w:t>
+              <w:t>，包含該書籍的價格、書</w:t>
+            </w:r>
+            <w:proofErr w:type="gramStart"/>
+            <w:r>
+              <w:rPr>
+                <w:rFonts w:ascii="Times New Roman" w:eastAsia="標楷體" w:hAnsi="Times New Roman" w:cs="Times New Roman"/>
+              </w:rPr>
+              <w:t>況</w:t>
+            </w:r>
+            <w:proofErr w:type="gramEnd"/>
+            <w:r>
+              <w:rPr>
+                <w:rFonts w:ascii="Times New Roman" w:eastAsia="標楷體" w:hAnsi="Times New Roman" w:cs="Times New Roman"/>
+              </w:rPr>
+              <w:t>、照片與所在地點等資訊。</w:t>
             </w:r>
           </w:p>
         </w:tc>
@@ -7214,7 +7828,6 @@
               <w:rPr>
                 <w:rFonts w:ascii="Times New Roman" w:eastAsia="標楷體" w:hAnsi="Times New Roman" w:cs="Times New Roman" w:hint="eastAsia"/>
               </w:rPr>
-              <w:lastRenderedPageBreak/>
               <w:t>使用者</w:t>
             </w:r>
           </w:p>
@@ -7252,14 +7865,14 @@
           <w:p>
             <w:pPr>
               <w:rPr>
-                <w:rFonts w:ascii="Times New Roman" w:eastAsia="標楷體" w:hAnsi="Times New Roman" w:cs="Times New Roman"/>
-              </w:rPr>
-            </w:pPr>
-            <w:r>
-              <w:rPr>
-                <w:rFonts w:ascii="Times New Roman" w:eastAsia="標楷體" w:hAnsi="Times New Roman" w:cs="Times New Roman" w:hint="eastAsia"/>
-              </w:rPr>
-              <w:t>購物車</w:t>
+                <w:rFonts w:ascii="Times New Roman" w:eastAsia="標楷體" w:hAnsi="Times New Roman" w:cs="Times New Roman" w:hint="eastAsia"/>
+              </w:rPr>
+            </w:pPr>
+            <w:r>
+              <w:rPr>
+                <w:rFonts w:ascii="Times New Roman" w:eastAsia="標楷體" w:hAnsi="Times New Roman" w:cs="Times New Roman" w:hint="eastAsia"/>
+              </w:rPr>
+              <w:t>賣場</w:t>
             </w:r>
           </w:p>
         </w:tc>
@@ -7270,14 +7883,20 @@
           <w:p>
             <w:pPr>
               <w:rPr>
-                <w:rFonts w:ascii="Times New Roman" w:eastAsia="標楷體" w:hAnsi="Times New Roman" w:cs="Times New Roman"/>
-              </w:rPr>
-            </w:pPr>
-            <w:r>
-              <w:rPr>
-                <w:rFonts w:ascii="Times New Roman" w:eastAsia="標楷體" w:hAnsi="Times New Roman" w:cs="Times New Roman" w:hint="eastAsia"/>
-              </w:rPr>
-              <w:t>暫存買家有意交易的商品。讓買家在後續可以進行比價或發起私訊以進行協商。</w:t>
+                <w:rFonts w:ascii="Times New Roman" w:eastAsia="標楷體" w:hAnsi="Times New Roman" w:cs="Times New Roman" w:hint="eastAsia"/>
+              </w:rPr>
+            </w:pPr>
+            <w:r>
+              <w:rPr>
+                <w:rFonts w:ascii="Times New Roman" w:eastAsia="標楷體" w:hAnsi="Times New Roman" w:cs="Times New Roman" w:hint="eastAsia"/>
+              </w:rPr>
+              <w:t>賣家管理所有書籍的頁面</w:t>
+            </w:r>
+            <w:r>
+              <w:rPr>
+                <w:rFonts w:ascii="Times New Roman" w:eastAsia="標楷體" w:hAnsi="Times New Roman" w:cs="Times New Roman" w:hint="eastAsia"/>
+              </w:rPr>
+              <w:t>，賣家可以在此進行書籍的分類。</w:t>
             </w:r>
           </w:p>
         </w:tc>
@@ -7290,6 +7909,110 @@
           <w:p>
             <w:pPr>
               <w:rPr>
+                <w:rFonts w:ascii="Times New Roman" w:eastAsia="標楷體" w:hAnsi="Times New Roman" w:cs="Times New Roman" w:hint="eastAsia"/>
+              </w:rPr>
+            </w:pPr>
+            <w:proofErr w:type="gramStart"/>
+            <w:r>
+              <w:rPr>
+                <w:rFonts w:ascii="Times New Roman" w:eastAsia="標楷體" w:hAnsi="Times New Roman" w:cs="Times New Roman" w:hint="eastAsia"/>
+              </w:rPr>
+              <w:t>私訊</w:t>
+            </w:r>
+            <w:proofErr w:type="gramEnd"/>
+          </w:p>
+        </w:tc>
+        <w:tc>
+          <w:tcPr>
+            <w:tcW w:w="6316" w:type="dxa"/>
+          </w:tcPr>
+          <w:p>
+            <w:pPr>
+              <w:rPr>
+                <w:rFonts w:ascii="Times New Roman" w:eastAsia="標楷體" w:hAnsi="Times New Roman" w:cs="Times New Roman" w:hint="eastAsia"/>
+              </w:rPr>
+            </w:pPr>
+            <w:r>
+              <w:rPr>
+                <w:rFonts w:ascii="Times New Roman" w:eastAsia="標楷體" w:hAnsi="Times New Roman" w:cs="Times New Roman" w:hint="eastAsia"/>
+              </w:rPr>
+              <w:t>買家和賣家溝通的管道</w:t>
+            </w:r>
+          </w:p>
+        </w:tc>
+      </w:tr>
+      <w:tr>
+        <w:tc>
+          <w:tcPr>
+            <w:tcW w:w="1980" w:type="dxa"/>
+          </w:tcPr>
+          <w:p>
+            <w:pPr>
+              <w:rPr>
+                <w:rFonts w:ascii="Times New Roman" w:eastAsia="標楷體" w:hAnsi="Times New Roman" w:cs="Times New Roman"/>
+              </w:rPr>
+            </w:pPr>
+            <w:r>
+              <w:rPr>
+                <w:rFonts w:ascii="Times New Roman" w:eastAsia="標楷體" w:hAnsi="Times New Roman" w:cs="Times New Roman" w:hint="eastAsia"/>
+              </w:rPr>
+              <w:t>購物車</w:t>
+            </w:r>
+          </w:p>
+        </w:tc>
+        <w:tc>
+          <w:tcPr>
+            <w:tcW w:w="6316" w:type="dxa"/>
+          </w:tcPr>
+          <w:p>
+            <w:pPr>
+              <w:rPr>
+                <w:rFonts w:ascii="Times New Roman" w:eastAsia="標楷體" w:hAnsi="Times New Roman" w:cs="Times New Roman"/>
+              </w:rPr>
+            </w:pPr>
+            <w:r>
+              <w:rPr>
+                <w:rFonts w:ascii="Times New Roman" w:eastAsia="標楷體" w:hAnsi="Times New Roman" w:cs="Times New Roman" w:hint="eastAsia"/>
+              </w:rPr>
+              <w:t>暫存買家有意交易的</w:t>
+            </w:r>
+            <w:r>
+              <w:rPr>
+                <w:rFonts w:ascii="Times New Roman" w:eastAsia="標楷體" w:hAnsi="Times New Roman" w:cs="Times New Roman" w:hint="eastAsia"/>
+              </w:rPr>
+              <w:t>書籍</w:t>
+            </w:r>
+            <w:r>
+              <w:rPr>
+                <w:rFonts w:ascii="Times New Roman" w:eastAsia="標楷體" w:hAnsi="Times New Roman" w:cs="Times New Roman" w:hint="eastAsia"/>
+              </w:rPr>
+              <w:t>。讓買家在後續可以進行比價或</w:t>
+            </w:r>
+            <w:proofErr w:type="gramStart"/>
+            <w:r>
+              <w:rPr>
+                <w:rFonts w:ascii="Times New Roman" w:eastAsia="標楷體" w:hAnsi="Times New Roman" w:cs="Times New Roman" w:hint="eastAsia"/>
+              </w:rPr>
+              <w:t>發起私訊以</w:t>
+            </w:r>
+            <w:proofErr w:type="gramEnd"/>
+            <w:r>
+              <w:rPr>
+                <w:rFonts w:ascii="Times New Roman" w:eastAsia="標楷體" w:hAnsi="Times New Roman" w:cs="Times New Roman" w:hint="eastAsia"/>
+              </w:rPr>
+              <w:t>進行協商。</w:t>
+            </w:r>
+          </w:p>
+        </w:tc>
+      </w:tr>
+      <w:tr>
+        <w:tc>
+          <w:tcPr>
+            <w:tcW w:w="1980" w:type="dxa"/>
+          </w:tcPr>
+          <w:p>
+            <w:pPr>
+              <w:rPr>
                 <w:rFonts w:ascii="Times New Roman" w:eastAsia="標楷體" w:hAnsi="Times New Roman" w:cs="Times New Roman"/>
               </w:rPr>
             </w:pPr>
@@ -7315,7 +8038,19 @@
               <w:rPr>
                 <w:rFonts w:ascii="Times New Roman" w:eastAsia="標楷體" w:hAnsi="Times New Roman" w:cs="Times New Roman" w:hint="eastAsia"/>
               </w:rPr>
-              <w:t>標記商品當前的所處的生命週期</w:t>
+              <w:t>標記</w:t>
+            </w:r>
+            <w:r>
+              <w:rPr>
+                <w:rFonts w:ascii="Times New Roman" w:eastAsia="標楷體" w:hAnsi="Times New Roman" w:cs="Times New Roman" w:hint="eastAsia"/>
+              </w:rPr>
+              <w:t>書籍</w:t>
+            </w:r>
+            <w:r>
+              <w:rPr>
+                <w:rFonts w:ascii="Times New Roman" w:eastAsia="標楷體" w:hAnsi="Times New Roman" w:cs="Times New Roman" w:hint="eastAsia"/>
+              </w:rPr>
+              <w:t>當前的所處的生命週期</w:t>
             </w:r>
             <w:r>
               <w:rPr>
@@ -7325,9 +8060,21 @@
             </w:r>
             <w:r>
               <w:rPr>
-                <w:rFonts w:ascii="Times New Roman" w:eastAsia="標楷體" w:hAnsi="Times New Roman" w:cs="Times New Roman" w:hint="eastAsia"/>
-              </w:rPr>
-              <w:t>待售或是已售出</w:t>
+                <w:rFonts w:ascii="Times New Roman" w:eastAsia="標楷體" w:hAnsi="Times New Roman" w:cs="Times New Roman"/>
+              </w:rPr>
+              <w:t>待售中</w:t>
+            </w:r>
+            <w:r>
+              <w:rPr>
+                <w:rFonts w:ascii="Times New Roman" w:eastAsia="標楷體" w:hAnsi="Times New Roman" w:cs="Times New Roman" w:hint="eastAsia"/>
+              </w:rPr>
+              <w:t>、保留中</w:t>
+            </w:r>
+            <w:r>
+              <w:rPr>
+                <w:rFonts w:ascii="Times New Roman" w:eastAsia="標楷體" w:hAnsi="Times New Roman" w:cs="Times New Roman" w:hint="eastAsia"/>
+              </w:rPr>
+              <w:t>或已售出</w:t>
             </w:r>
             <w:r>
               <w:rPr>
@@ -7348,7 +8095,7 @@
     <w:p>
       <w:pPr>
         <w:rPr>
-          <w:rFonts w:ascii="Times New Roman" w:eastAsia="標楷體" w:hAnsi="Times New Roman" w:cs="Times New Roman" w:hint="eastAsia"/>
+          <w:rFonts w:ascii="Times New Roman" w:eastAsia="標楷體" w:hAnsi="Times New Roman" w:cs="Times New Roman"/>
         </w:rPr>
       </w:pPr>
     </w:p>
@@ -7392,7 +8139,7 @@
           <w:numId w:val="1"/>
         </w:numPr>
         <w:rPr>
-          <w:rFonts w:ascii="Times New Roman" w:eastAsia="標楷體" w:hAnsi="Times New Roman" w:cs="Times New Roman"/>
+          <w:rFonts w:ascii="Times New Roman" w:eastAsia="標楷體" w:hAnsi="Times New Roman" w:cs="Times New Roman" w:hint="eastAsia"/>
         </w:rPr>
       </w:pPr>
       <w:r>
@@ -7404,16 +8151,10 @@
     </w:p>
     <w:p>
       <w:pPr>
-        <w:rPr>
-          <w:rFonts w:ascii="Times New Roman" w:eastAsia="標楷體" w:hAnsi="Times New Roman" w:cs="Times New Roman"/>
-        </w:rPr>
-      </w:pPr>
-    </w:p>
-    <w:p>
-      <w:pPr>
         <w:pStyle w:val="1"/>
       </w:pPr>
       <w:r>
+        <w:lastRenderedPageBreak/>
         <w:t>Measurement</w:t>
       </w:r>
     </w:p>
@@ -7471,6 +8212,32 @@
           <w:rFonts w:ascii="Times New Roman" w:eastAsia="標楷體" w:hAnsi="Times New Roman" w:cs="Times New Roman" w:hint="eastAsia"/>
         </w:rPr>
         <w:t>18:19</w:t>
+      </w:r>
+    </w:p>
+    <w:p>
+      <w:pPr>
+        <w:rPr>
+          <w:rFonts w:ascii="Times New Roman" w:eastAsia="標楷體" w:hAnsi="Times New Roman" w:cs="Times New Roman"/>
+        </w:rPr>
+      </w:pPr>
+      <w:r>
+        <w:rPr>
+          <w:rFonts w:ascii="Times New Roman" w:eastAsia="標楷體" w:hAnsi="Times New Roman" w:cs="Times New Roman" w:hint="eastAsia"/>
+        </w:rPr>
+        <w:t>26/03/09 14:30~16:00</w:t>
+      </w:r>
+    </w:p>
+    <w:p>
+      <w:pPr>
+        <w:rPr>
+          <w:rFonts w:ascii="Times New Roman" w:eastAsia="標楷體" w:hAnsi="Times New Roman" w:cs="Times New Roman" w:hint="eastAsia"/>
+        </w:rPr>
+      </w:pPr>
+      <w:r>
+        <w:rPr>
+          <w:rFonts w:ascii="Times New Roman" w:eastAsia="標楷體" w:hAnsi="Times New Roman" w:cs="Times New Roman" w:hint="eastAsia"/>
+        </w:rPr>
+        <w:t>26/03/13 13:00~16:00</w:t>
       </w:r>
     </w:p>
     <w:sectPr>
@@ -7484,7 +8251,7 @@
 </file>
 
 <file path=word/endnotes.xml><?xml version="1.0" encoding="utf-8"?>
-<w:endnotes xmlns:wpc="http://schemas.microsoft.com/office/word/2010/wordprocessingCanvas" xmlns:cx="http://schemas.microsoft.com/office/drawing/2014/chartex" xmlns:cx1="http://schemas.microsoft.com/office/drawing/2015/9/8/chartex" xmlns:cx2="http://schemas.microsoft.com/office/drawing/2015/10/21/chartex" xmlns:cx3="http://schemas.microsoft.com/office/drawing/2016/5/9/chartex" xmlns:cx4="http://schemas.microsoft.com/office/drawing/2016/5/10/chartex" xmlns:cx5="http://schemas.microsoft.com/office/drawing/2016/5/11/chartex" xmlns:cx6="http://schemas.microsoft.com/office/drawing/2016/5/12/chartex" xmlns:cx7="http://schemas.microsoft.com/office/drawing/2016/5/13/chartex" xmlns:cx8="http://schemas.microsoft.com/office/drawing/2016/5/14/chartex" xmlns:mc="http://schemas.openxmlformats.org/markup-compatibility/2006" xmlns:aink="http://schemas.microsoft.com/office/drawing/2016/ink" xmlns:am3d="http://schemas.microsoft.com/office/drawing/2017/model3d" xmlns:o="urn:schemas-microsoft-com:office:office" xmlns:oel="http://schemas.microsoft.com/office/2019/extlst" xmlns:r="http://schemas.openxmlformats.org/officeDocument/2006/relationships" xmlns:m="http://schemas.openxmlformats.org/officeDocument/2006/math" xmlns:v="urn:schemas-microsoft-com:vml" xmlns:wp14="http://schemas.microsoft.com/office/word/2010/wordprocessingDrawing" xmlns:wp="http://schemas.openxmlformats.org/drawingml/2006/wordprocessingDrawing" xmlns:w10="urn:schemas-microsoft-com:office:word" xmlns:w="http://schemas.openxmlformats.org/wordprocessingml/2006/main" xmlns:w14="http://schemas.microsoft.com/office/word/2010/wordml" xmlns:w15="http://schemas.microsoft.com/office/word/2012/wordml" xmlns:w16cex="http://schemas.microsoft.com/office/word/2018/wordml/cex" xmlns:w16cid="http://schemas.microsoft.com/office/word/2016/wordml/cid" xmlns:w16="http://schemas.microsoft.com/office/word/2018/wordml" xmlns:w16sdtdh="http://schemas.microsoft.com/office/word/2020/wordml/sdtdatahash" xmlns:w16se="http://schemas.microsoft.com/office/word/2015/wordml/symex" xmlns:wpg="http://schemas.microsoft.com/office/word/2010/wordprocessingGroup" xmlns:wpi="http://schemas.microsoft.com/office/word/2010/wordprocessingInk" xmlns:wne="http://schemas.microsoft.com/office/word/2006/wordml" xmlns:wps="http://schemas.microsoft.com/office/word/2010/wordprocessingShape" mc:Ignorable="w14 w15 w16se w16cid w16 w16cex w16sdtdh wp14">
+<w:endnotes xmlns:wpc="http://schemas.microsoft.com/office/word/2010/wordprocessingCanvas" xmlns:cx="http://schemas.microsoft.com/office/drawing/2014/chartex" xmlns:cx1="http://schemas.microsoft.com/office/drawing/2015/9/8/chartex" xmlns:cx2="http://schemas.microsoft.com/office/drawing/2015/10/21/chartex" xmlns:cx3="http://schemas.microsoft.com/office/drawing/2016/5/9/chartex" xmlns:cx4="http://schemas.microsoft.com/office/drawing/2016/5/10/chartex" xmlns:cx5="http://schemas.microsoft.com/office/drawing/2016/5/11/chartex" xmlns:cx6="http://schemas.microsoft.com/office/drawing/2016/5/12/chartex" xmlns:cx7="http://schemas.microsoft.com/office/drawing/2016/5/13/chartex" xmlns:cx8="http://schemas.microsoft.com/office/drawing/2016/5/14/chartex" xmlns:mc="http://schemas.openxmlformats.org/markup-compatibility/2006" xmlns:aink="http://schemas.microsoft.com/office/drawing/2016/ink" xmlns:am3d="http://schemas.microsoft.com/office/drawing/2017/model3d" xmlns:o="urn:schemas-microsoft-com:office:office" xmlns:oel="http://schemas.microsoft.com/office/2019/extlst" xmlns:r="http://schemas.openxmlformats.org/officeDocument/2006/relationships" xmlns:m="http://schemas.openxmlformats.org/officeDocument/2006/math" xmlns:v="urn:schemas-microsoft-com:vml" xmlns:wp14="http://schemas.microsoft.com/office/word/2010/wordprocessingDrawing" xmlns:wp="http://schemas.openxmlformats.org/drawingml/2006/wordprocessingDrawing" xmlns:w10="urn:schemas-microsoft-com:office:word" xmlns:w="http://schemas.openxmlformats.org/wordprocessingml/2006/main" xmlns:w14="http://schemas.microsoft.com/office/word/2010/wordml" xmlns:w15="http://schemas.microsoft.com/office/word/2012/wordml" xmlns:w16cex="http://schemas.microsoft.com/office/word/2018/wordml/cex" xmlns:w16cid="http://schemas.microsoft.com/office/word/2016/wordml/cid" xmlns:w16="http://schemas.microsoft.com/office/word/2018/wordml" xmlns:w16du="http://schemas.microsoft.com/office/word/2023/wordml/word16du" xmlns:w16sdtdh="http://schemas.microsoft.com/office/word/2020/wordml/sdtdatahash" xmlns:w16sdtfl="http://schemas.microsoft.com/office/word/2024/wordml/sdtformatlock" xmlns:w16se="http://schemas.microsoft.com/office/word/2015/wordml/symex" xmlns:wpg="http://schemas.microsoft.com/office/word/2010/wordprocessingGroup" xmlns:wpi="http://schemas.microsoft.com/office/word/2010/wordprocessingInk" xmlns:wne="http://schemas.microsoft.com/office/word/2006/wordml" xmlns:wps="http://schemas.microsoft.com/office/word/2010/wordprocessingShape" mc:Ignorable="w14 w15 w16se w16cid w16 w16cex w16sdtdh w16sdtfl w16du wp14">
   <w:endnote w:type="separator" w:id="-1">
     <w:p>
       <w:pPr>
@@ -7509,7 +8276,7 @@
 </file>
 
 <file path=word/footnotes.xml><?xml version="1.0" encoding="utf-8"?>
-<w:footnotes xmlns:wpc="http://schemas.microsoft.com/office/word/2010/wordprocessingCanvas" xmlns:cx="http://schemas.microsoft.com/office/drawing/2014/chartex" xmlns:cx1="http://schemas.microsoft.com/office/drawing/2015/9/8/chartex" xmlns:cx2="http://schemas.microsoft.com/office/drawing/2015/10/21/chartex" xmlns:cx3="http://schemas.microsoft.com/office/drawing/2016/5/9/chartex" xmlns:cx4="http://schemas.microsoft.com/office/drawing/2016/5/10/chartex" xmlns:cx5="http://schemas.microsoft.com/office/drawing/2016/5/11/chartex" xmlns:cx6="http://schemas.microsoft.com/office/drawing/2016/5/12/chartex" xmlns:cx7="http://schemas.microsoft.com/office/drawing/2016/5/13/chartex" xmlns:cx8="http://schemas.microsoft.com/office/drawing/2016/5/14/chartex" xmlns:mc="http://schemas.openxmlformats.org/markup-compatibility/2006" xmlns:aink="http://schemas.microsoft.com/office/drawing/2016/ink" xmlns:am3d="http://schemas.microsoft.com/office/drawing/2017/model3d" xmlns:o="urn:schemas-microsoft-com:office:office" xmlns:oel="http://schemas.microsoft.com/office/2019/extlst" xmlns:r="http://schemas.openxmlformats.org/officeDocument/2006/relationships" xmlns:m="http://schemas.openxmlformats.org/officeDocument/2006/math" xmlns:v="urn:schemas-microsoft-com:vml" xmlns:wp14="http://schemas.microsoft.com/office/word/2010/wordprocessingDrawing" xmlns:wp="http://schemas.openxmlformats.org/drawingml/2006/wordprocessingDrawing" xmlns:w10="urn:schemas-microsoft-com:office:word" xmlns:w="http://schemas.openxmlformats.org/wordprocessingml/2006/main" xmlns:w14="http://schemas.microsoft.com/office/word/2010/wordml" xmlns:w15="http://schemas.microsoft.com/office/word/2012/wordml" xmlns:w16cex="http://schemas.microsoft.com/office/word/2018/wordml/cex" xmlns:w16cid="http://schemas.microsoft.com/office/word/2016/wordml/cid" xmlns:w16="http://schemas.microsoft.com/office/word/2018/wordml" xmlns:w16sdtdh="http://schemas.microsoft.com/office/word/2020/wordml/sdtdatahash" xmlns:w16se="http://schemas.microsoft.com/office/word/2015/wordml/symex" xmlns:wpg="http://schemas.microsoft.com/office/word/2010/wordprocessingGroup" xmlns:wpi="http://schemas.microsoft.com/office/word/2010/wordprocessingInk" xmlns:wne="http://schemas.microsoft.com/office/word/2006/wordml" xmlns:wps="http://schemas.microsoft.com/office/word/2010/wordprocessingShape" mc:Ignorable="w14 w15 w16se w16cid w16 w16cex w16sdtdh wp14">
+<w:footnotes xmlns:wpc="http://schemas.microsoft.com/office/word/2010/wordprocessingCanvas" xmlns:cx="http://schemas.microsoft.com/office/drawing/2014/chartex" xmlns:cx1="http://schemas.microsoft.com/office/drawing/2015/9/8/chartex" xmlns:cx2="http://schemas.microsoft.com/office/drawing/2015/10/21/chartex" xmlns:cx3="http://schemas.microsoft.com/office/drawing/2016/5/9/chartex" xmlns:cx4="http://schemas.microsoft.com/office/drawing/2016/5/10/chartex" xmlns:cx5="http://schemas.microsoft.com/office/drawing/2016/5/11/chartex" xmlns:cx6="http://schemas.microsoft.com/office/drawing/2016/5/12/chartex" xmlns:cx7="http://schemas.microsoft.com/office/drawing/2016/5/13/chartex" xmlns:cx8="http://schemas.microsoft.com/office/drawing/2016/5/14/chartex" xmlns:mc="http://schemas.openxmlformats.org/markup-compatibility/2006" xmlns:aink="http://schemas.microsoft.com/office/drawing/2016/ink" xmlns:am3d="http://schemas.microsoft.com/office/drawing/2017/model3d" xmlns:o="urn:schemas-microsoft-com:office:office" xmlns:oel="http://schemas.microsoft.com/office/2019/extlst" xmlns:r="http://schemas.openxmlformats.org/officeDocument/2006/relationships" xmlns:m="http://schemas.openxmlformats.org/officeDocument/2006/math" xmlns:v="urn:schemas-microsoft-com:vml" xmlns:wp14="http://schemas.microsoft.com/office/word/2010/wordprocessingDrawing" xmlns:wp="http://schemas.openxmlformats.org/drawingml/2006/wordprocessingDrawing" xmlns:w10="urn:schemas-microsoft-com:office:word" xmlns:w="http://schemas.openxmlformats.org/wordprocessingml/2006/main" xmlns:w14="http://schemas.microsoft.com/office/word/2010/wordml" xmlns:w15="http://schemas.microsoft.com/office/word/2012/wordml" xmlns:w16cex="http://schemas.microsoft.com/office/word/2018/wordml/cex" xmlns:w16cid="http://schemas.microsoft.com/office/word/2016/wordml/cid" xmlns:w16="http://schemas.microsoft.com/office/word/2018/wordml" xmlns:w16du="http://schemas.microsoft.com/office/word/2023/wordml/word16du" xmlns:w16sdtdh="http://schemas.microsoft.com/office/word/2020/wordml/sdtdatahash" xmlns:w16sdtfl="http://schemas.microsoft.com/office/word/2024/wordml/sdtformatlock" xmlns:w16se="http://schemas.microsoft.com/office/word/2015/wordml/symex" xmlns:wpg="http://schemas.microsoft.com/office/word/2010/wordprocessingGroup" xmlns:wpi="http://schemas.microsoft.com/office/word/2010/wordprocessingInk" xmlns:wne="http://schemas.microsoft.com/office/word/2006/wordml" xmlns:wps="http://schemas.microsoft.com/office/word/2010/wordprocessingShape" mc:Ignorable="w14 w15 w16se w16cid w16 w16cex w16sdtdh w16sdtfl w16du wp14">
   <w:footnote w:type="separator" w:id="-1">
     <w:p>
       <w:pPr>
@@ -7534,7 +8301,7 @@
 </file>
 
 <file path=word/numbering.xml><?xml version="1.0" encoding="utf-8"?>
-<w:numbering xmlns:wpc="http://schemas.microsoft.com/office/word/2010/wordprocessingCanvas" xmlns:cx="http://schemas.microsoft.com/office/drawing/2014/chartex" xmlns:cx1="http://schemas.microsoft.com/office/drawing/2015/9/8/chartex" xmlns:cx2="http://schemas.microsoft.com/office/drawing/2015/10/21/chartex" xmlns:cx3="http://schemas.microsoft.com/office/drawing/2016/5/9/chartex" xmlns:cx4="http://schemas.microsoft.com/office/drawing/2016/5/10/chartex" xmlns:cx5="http://schemas.microsoft.com/office/drawing/2016/5/11/chartex" xmlns:cx6="http://schemas.microsoft.com/office/drawing/2016/5/12/chartex" xmlns:cx7="http://schemas.microsoft.com/office/drawing/2016/5/13/chartex" xmlns:cx8="http://schemas.microsoft.com/office/drawing/2016/5/14/chartex" xmlns:mc="http://schemas.openxmlformats.org/markup-compatibility/2006" xmlns:aink="http://schemas.microsoft.com/office/drawing/2016/ink" xmlns:am3d="http://schemas.microsoft.com/office/drawing/2017/model3d" xmlns:o="urn:schemas-microsoft-com:office:office" xmlns:oel="http://schemas.microsoft.com/office/2019/extlst" xmlns:r="http://schemas.openxmlformats.org/officeDocument/2006/relationships" xmlns:m="http://schemas.openxmlformats.org/officeDocument/2006/math" xmlns:v="urn:schemas-microsoft-com:vml" xmlns:wp14="http://schemas.microsoft.com/office/word/2010/wordprocessingDrawing" xmlns:wp="http://schemas.openxmlformats.org/drawingml/2006/wordprocessingDrawing" xmlns:w10="urn:schemas-microsoft-com:office:word" xmlns:w="http://schemas.openxmlformats.org/wordprocessingml/2006/main" xmlns:w14="http://schemas.microsoft.com/office/word/2010/wordml" xmlns:w15="http://schemas.microsoft.com/office/word/2012/wordml" xmlns:w16cex="http://schemas.microsoft.com/office/word/2018/wordml/cex" xmlns:w16cid="http://schemas.microsoft.com/office/word/2016/wordml/cid" xmlns:w16="http://schemas.microsoft.com/office/word/2018/wordml" xmlns:w16sdtdh="http://schemas.microsoft.com/office/word/2020/wordml/sdtdatahash" xmlns:w16se="http://schemas.microsoft.com/office/word/2015/wordml/symex" xmlns:wpg="http://schemas.microsoft.com/office/word/2010/wordprocessingGroup" xmlns:wpi="http://schemas.microsoft.com/office/word/2010/wordprocessingInk" xmlns:wne="http://schemas.microsoft.com/office/word/2006/wordml" xmlns:wps="http://schemas.microsoft.com/office/word/2010/wordprocessingShape" mc:Ignorable="w14 w15 w16se w16cid w16 w16cex w16sdtdh wp14">
+<w:numbering xmlns:wpc="http://schemas.microsoft.com/office/word/2010/wordprocessingCanvas" xmlns:cx="http://schemas.microsoft.com/office/drawing/2014/chartex" xmlns:cx1="http://schemas.microsoft.com/office/drawing/2015/9/8/chartex" xmlns:cx2="http://schemas.microsoft.com/office/drawing/2015/10/21/chartex" xmlns:cx3="http://schemas.microsoft.com/office/drawing/2016/5/9/chartex" xmlns:cx4="http://schemas.microsoft.com/office/drawing/2016/5/10/chartex" xmlns:cx5="http://schemas.microsoft.com/office/drawing/2016/5/11/chartex" xmlns:cx6="http://schemas.microsoft.com/office/drawing/2016/5/12/chartex" xmlns:cx7="http://schemas.microsoft.com/office/drawing/2016/5/13/chartex" xmlns:cx8="http://schemas.microsoft.com/office/drawing/2016/5/14/chartex" xmlns:mc="http://schemas.openxmlformats.org/markup-compatibility/2006" xmlns:aink="http://schemas.microsoft.com/office/drawing/2016/ink" xmlns:am3d="http://schemas.microsoft.com/office/drawing/2017/model3d" xmlns:o="urn:schemas-microsoft-com:office:office" xmlns:oel="http://schemas.microsoft.com/office/2019/extlst" xmlns:r="http://schemas.openxmlformats.org/officeDocument/2006/relationships" xmlns:m="http://schemas.openxmlformats.org/officeDocument/2006/math" xmlns:v="urn:schemas-microsoft-com:vml" xmlns:wp14="http://schemas.microsoft.com/office/word/2010/wordprocessingDrawing" xmlns:wp="http://schemas.openxmlformats.org/drawingml/2006/wordprocessingDrawing" xmlns:w10="urn:schemas-microsoft-com:office:word" xmlns:w="http://schemas.openxmlformats.org/wordprocessingml/2006/main" xmlns:w14="http://schemas.microsoft.com/office/word/2010/wordml" xmlns:w15="http://schemas.microsoft.com/office/word/2012/wordml" xmlns:w16cex="http://schemas.microsoft.com/office/word/2018/wordml/cex" xmlns:w16cid="http://schemas.microsoft.com/office/word/2016/wordml/cid" xmlns:w16="http://schemas.microsoft.com/office/word/2018/wordml" xmlns:w16du="http://schemas.microsoft.com/office/word/2023/wordml/word16du" xmlns:w16sdtdh="http://schemas.microsoft.com/office/word/2020/wordml/sdtdatahash" xmlns:w16sdtfl="http://schemas.microsoft.com/office/word/2024/wordml/sdtformatlock" xmlns:w16se="http://schemas.microsoft.com/office/word/2015/wordml/symex" xmlns:wpg="http://schemas.microsoft.com/office/word/2010/wordprocessingGroup" xmlns:wpi="http://schemas.microsoft.com/office/word/2010/wordprocessingInk" xmlns:wne="http://schemas.microsoft.com/office/word/2006/wordml" xmlns:wps="http://schemas.microsoft.com/office/word/2010/wordprocessingShape" mc:Ignorable="w14 w15 w16se w16cid w16 w16cex w16sdtdh w16sdtfl w16du wp14">
   <w:abstractNum w:abstractNumId="0" w15:restartNumberingAfterBreak="0">
     <w:nsid w:val="0E237A54"/>
     <w:multiLevelType w:val="hybridMultilevel"/>
@@ -7625,6 +8392,119 @@
     </w:lvl>
   </w:abstractNum>
   <w:abstractNum w:abstractNumId="1" w15:restartNumberingAfterBreak="0">
+    <w:nsid w:val="10E4285D"/>
+    <w:multiLevelType w:val="multilevel"/>
+    <w:tmpl w:val="66BEF5D4"/>
+    <w:lvl w:ilvl="0">
+      <w:start w:val="1"/>
+      <w:numFmt w:val="decimal"/>
+      <w:lvlText w:val="%1."/>
+      <w:lvlJc w:val="left"/>
+      <w:pPr>
+        <w:tabs>
+          <w:tab w:val="num" w:pos="720"/>
+        </w:tabs>
+        <w:ind w:left="720" w:hanging="360"/>
+      </w:pPr>
+    </w:lvl>
+    <w:lvl w:ilvl="1" w:tentative="1">
+      <w:start w:val="1"/>
+      <w:numFmt w:val="decimal"/>
+      <w:lvlText w:val="%2."/>
+      <w:lvlJc w:val="left"/>
+      <w:pPr>
+        <w:tabs>
+          <w:tab w:val="num" w:pos="1440"/>
+        </w:tabs>
+        <w:ind w:left="1440" w:hanging="360"/>
+      </w:pPr>
+    </w:lvl>
+    <w:lvl w:ilvl="2" w:tentative="1">
+      <w:start w:val="1"/>
+      <w:numFmt w:val="decimal"/>
+      <w:lvlText w:val="%3."/>
+      <w:lvlJc w:val="left"/>
+      <w:pPr>
+        <w:tabs>
+          <w:tab w:val="num" w:pos="2160"/>
+        </w:tabs>
+        <w:ind w:left="2160" w:hanging="360"/>
+      </w:pPr>
+    </w:lvl>
+    <w:lvl w:ilvl="3" w:tentative="1">
+      <w:start w:val="1"/>
+      <w:numFmt w:val="decimal"/>
+      <w:lvlText w:val="%4."/>
+      <w:lvlJc w:val="left"/>
+      <w:pPr>
+        <w:tabs>
+          <w:tab w:val="num" w:pos="2880"/>
+        </w:tabs>
+        <w:ind w:left="2880" w:hanging="360"/>
+      </w:pPr>
+    </w:lvl>
+    <w:lvl w:ilvl="4" w:tentative="1">
+      <w:start w:val="1"/>
+      <w:numFmt w:val="decimal"/>
+      <w:lvlText w:val="%5."/>
+      <w:lvlJc w:val="left"/>
+      <w:pPr>
+        <w:tabs>
+          <w:tab w:val="num" w:pos="3600"/>
+        </w:tabs>
+        <w:ind w:left="3600" w:hanging="360"/>
+      </w:pPr>
+    </w:lvl>
+    <w:lvl w:ilvl="5" w:tentative="1">
+      <w:start w:val="1"/>
+      <w:numFmt w:val="decimal"/>
+      <w:lvlText w:val="%6."/>
+      <w:lvlJc w:val="left"/>
+      <w:pPr>
+        <w:tabs>
+          <w:tab w:val="num" w:pos="4320"/>
+        </w:tabs>
+        <w:ind w:left="4320" w:hanging="360"/>
+      </w:pPr>
+    </w:lvl>
+    <w:lvl w:ilvl="6" w:tentative="1">
+      <w:start w:val="1"/>
+      <w:numFmt w:val="decimal"/>
+      <w:lvlText w:val="%7."/>
+      <w:lvlJc w:val="left"/>
+      <w:pPr>
+        <w:tabs>
+          <w:tab w:val="num" w:pos="5040"/>
+        </w:tabs>
+        <w:ind w:left="5040" w:hanging="360"/>
+      </w:pPr>
+    </w:lvl>
+    <w:lvl w:ilvl="7" w:tentative="1">
+      <w:start w:val="1"/>
+      <w:numFmt w:val="decimal"/>
+      <w:lvlText w:val="%8."/>
+      <w:lvlJc w:val="left"/>
+      <w:pPr>
+        <w:tabs>
+          <w:tab w:val="num" w:pos="5760"/>
+        </w:tabs>
+        <w:ind w:left="5760" w:hanging="360"/>
+      </w:pPr>
+    </w:lvl>
+    <w:lvl w:ilvl="8" w:tentative="1">
+      <w:start w:val="1"/>
+      <w:numFmt w:val="decimal"/>
+      <w:lvlText w:val="%9."/>
+      <w:lvlJc w:val="left"/>
+      <w:pPr>
+        <w:tabs>
+          <w:tab w:val="num" w:pos="6480"/>
+        </w:tabs>
+        <w:ind w:left="6480" w:hanging="360"/>
+      </w:pPr>
+    </w:lvl>
+  </w:abstractNum>
+  <w:abstractNum w:abstractNumId="2" w15:restartNumberingAfterBreak="0">
     <w:nsid w:val="1F397696"/>
     <w:multiLevelType w:val="hybridMultilevel"/>
     <w:tmpl w:val="24763604"/>
@@ -7713,7 +8593,7 @@
       </w:pPr>
     </w:lvl>
   </w:abstractNum>
-  <w:abstractNum w:abstractNumId="2" w15:restartNumberingAfterBreak="0">
+  <w:abstractNum w:abstractNumId="3" w15:restartNumberingAfterBreak="0">
     <w:nsid w:val="261C4754"/>
     <w:multiLevelType w:val="multilevel"/>
     <w:tmpl w:val="42008736"/>
@@ -7826,7 +8706,120 @@
       </w:rPr>
     </w:lvl>
   </w:abstractNum>
-  <w:abstractNum w:abstractNumId="3" w15:restartNumberingAfterBreak="0">
+  <w:abstractNum w:abstractNumId="4" w15:restartNumberingAfterBreak="0">
+    <w:nsid w:val="2DC22962"/>
+    <w:multiLevelType w:val="multilevel"/>
+    <w:tmpl w:val="79D68678"/>
+    <w:lvl w:ilvl="0">
+      <w:start w:val="1"/>
+      <w:numFmt w:val="decimal"/>
+      <w:lvlText w:val="%1."/>
+      <w:lvlJc w:val="left"/>
+      <w:pPr>
+        <w:tabs>
+          <w:tab w:val="num" w:pos="720"/>
+        </w:tabs>
+        <w:ind w:left="720" w:hanging="360"/>
+      </w:pPr>
+    </w:lvl>
+    <w:lvl w:ilvl="1" w:tentative="1">
+      <w:start w:val="1"/>
+      <w:numFmt w:val="decimal"/>
+      <w:lvlText w:val="%2."/>
+      <w:lvlJc w:val="left"/>
+      <w:pPr>
+        <w:tabs>
+          <w:tab w:val="num" w:pos="1440"/>
+        </w:tabs>
+        <w:ind w:left="1440" w:hanging="360"/>
+      </w:pPr>
+    </w:lvl>
+    <w:lvl w:ilvl="2" w:tentative="1">
+      <w:start w:val="1"/>
+      <w:numFmt w:val="decimal"/>
+      <w:lvlText w:val="%3."/>
+      <w:lvlJc w:val="left"/>
+      <w:pPr>
+        <w:tabs>
+          <w:tab w:val="num" w:pos="2160"/>
+        </w:tabs>
+        <w:ind w:left="2160" w:hanging="360"/>
+      </w:pPr>
+    </w:lvl>
+    <w:lvl w:ilvl="3" w:tentative="1">
+      <w:start w:val="1"/>
+      <w:numFmt w:val="decimal"/>
+      <w:lvlText w:val="%4."/>
+      <w:lvlJc w:val="left"/>
+      <w:pPr>
+        <w:tabs>
+          <w:tab w:val="num" w:pos="2880"/>
+        </w:tabs>
+        <w:ind w:left="2880" w:hanging="360"/>
+      </w:pPr>
+    </w:lvl>
+    <w:lvl w:ilvl="4" w:tentative="1">
+      <w:start w:val="1"/>
+      <w:numFmt w:val="decimal"/>
+      <w:lvlText w:val="%5."/>
+      <w:lvlJc w:val="left"/>
+      <w:pPr>
+        <w:tabs>
+          <w:tab w:val="num" w:pos="3600"/>
+        </w:tabs>
+        <w:ind w:left="3600" w:hanging="360"/>
+      </w:pPr>
+    </w:lvl>
+    <w:lvl w:ilvl="5" w:tentative="1">
+      <w:start w:val="1"/>
+      <w:numFmt w:val="decimal"/>
+      <w:lvlText w:val="%6."/>
+      <w:lvlJc w:val="left"/>
+      <w:pPr>
+        <w:tabs>
+          <w:tab w:val="num" w:pos="4320"/>
+        </w:tabs>
+        <w:ind w:left="4320" w:hanging="360"/>
+      </w:pPr>
+    </w:lvl>
+    <w:lvl w:ilvl="6" w:tentative="1">
+      <w:start w:val="1"/>
+      <w:numFmt w:val="decimal"/>
+      <w:lvlText w:val="%7."/>
+      <w:lvlJc w:val="left"/>
+      <w:pPr>
+        <w:tabs>
+          <w:tab w:val="num" w:pos="5040"/>
+        </w:tabs>
+        <w:ind w:left="5040" w:hanging="360"/>
+      </w:pPr>
+    </w:lvl>
+    <w:lvl w:ilvl="7" w:tentative="1">
+      <w:start w:val="1"/>
+      <w:numFmt w:val="decimal"/>
+      <w:lvlText w:val="%8."/>
+      <w:lvlJc w:val="left"/>
+      <w:pPr>
+        <w:tabs>
+          <w:tab w:val="num" w:pos="5760"/>
+        </w:tabs>
+        <w:ind w:left="5760" w:hanging="360"/>
+      </w:pPr>
+    </w:lvl>
+    <w:lvl w:ilvl="8" w:tentative="1">
+      <w:start w:val="1"/>
+      <w:numFmt w:val="decimal"/>
+      <w:lvlText w:val="%9."/>
+      <w:lvlJc w:val="left"/>
+      <w:pPr>
+        <w:tabs>
+          <w:tab w:val="num" w:pos="6480"/>
+        </w:tabs>
+        <w:ind w:left="6480" w:hanging="360"/>
+      </w:pPr>
+    </w:lvl>
+  </w:abstractNum>
+  <w:abstractNum w:abstractNumId="5" w15:restartNumberingAfterBreak="0">
     <w:nsid w:val="310300D0"/>
     <w:multiLevelType w:val="hybridMultilevel"/>
     <w:tmpl w:val="B03EA8F6"/>
@@ -7915,7 +8908,120 @@
       </w:pPr>
     </w:lvl>
   </w:abstractNum>
-  <w:abstractNum w:abstractNumId="4" w15:restartNumberingAfterBreak="0">
+  <w:abstractNum w:abstractNumId="6" w15:restartNumberingAfterBreak="0">
+    <w:nsid w:val="39EE2293"/>
+    <w:multiLevelType w:val="multilevel"/>
+    <w:tmpl w:val="445E386E"/>
+    <w:lvl w:ilvl="0">
+      <w:start w:val="1"/>
+      <w:numFmt w:val="decimal"/>
+      <w:lvlText w:val="%1."/>
+      <w:lvlJc w:val="left"/>
+      <w:pPr>
+        <w:tabs>
+          <w:tab w:val="num" w:pos="720"/>
+        </w:tabs>
+        <w:ind w:left="720" w:hanging="360"/>
+      </w:pPr>
+    </w:lvl>
+    <w:lvl w:ilvl="1" w:tentative="1">
+      <w:start w:val="1"/>
+      <w:numFmt w:val="decimal"/>
+      <w:lvlText w:val="%2."/>
+      <w:lvlJc w:val="left"/>
+      <w:pPr>
+        <w:tabs>
+          <w:tab w:val="num" w:pos="1440"/>
+        </w:tabs>
+        <w:ind w:left="1440" w:hanging="360"/>
+      </w:pPr>
+    </w:lvl>
+    <w:lvl w:ilvl="2" w:tentative="1">
+      <w:start w:val="1"/>
+      <w:numFmt w:val="decimal"/>
+      <w:lvlText w:val="%3."/>
+      <w:lvlJc w:val="left"/>
+      <w:pPr>
+        <w:tabs>
+          <w:tab w:val="num" w:pos="2160"/>
+        </w:tabs>
+        <w:ind w:left="2160" w:hanging="360"/>
+      </w:pPr>
+    </w:lvl>
+    <w:lvl w:ilvl="3" w:tentative="1">
+      <w:start w:val="1"/>
+      <w:numFmt w:val="decimal"/>
+      <w:lvlText w:val="%4."/>
+      <w:lvlJc w:val="left"/>
+      <w:pPr>
+        <w:tabs>
+          <w:tab w:val="num" w:pos="2880"/>
+        </w:tabs>
+        <w:ind w:left="2880" w:hanging="360"/>
+      </w:pPr>
+    </w:lvl>
+    <w:lvl w:ilvl="4" w:tentative="1">
+      <w:start w:val="1"/>
+      <w:numFmt w:val="decimal"/>
+      <w:lvlText w:val="%5."/>
+      <w:lvlJc w:val="left"/>
+      <w:pPr>
+        <w:tabs>
+          <w:tab w:val="num" w:pos="3600"/>
+        </w:tabs>
+        <w:ind w:left="3600" w:hanging="360"/>
+      </w:pPr>
+    </w:lvl>
+    <w:lvl w:ilvl="5" w:tentative="1">
+      <w:start w:val="1"/>
+      <w:numFmt w:val="decimal"/>
+      <w:lvlText w:val="%6."/>
+      <w:lvlJc w:val="left"/>
+      <w:pPr>
+        <w:tabs>
+          <w:tab w:val="num" w:pos="4320"/>
+        </w:tabs>
+        <w:ind w:left="4320" w:hanging="360"/>
+      </w:pPr>
+    </w:lvl>
+    <w:lvl w:ilvl="6" w:tentative="1">
+      <w:start w:val="1"/>
+      <w:numFmt w:val="decimal"/>
+      <w:lvlText w:val="%7."/>
+      <w:lvlJc w:val="left"/>
+      <w:pPr>
+        <w:tabs>
+          <w:tab w:val="num" w:pos="5040"/>
+        </w:tabs>
+        <w:ind w:left="5040" w:hanging="360"/>
+      </w:pPr>
+    </w:lvl>
+    <w:lvl w:ilvl="7" w:tentative="1">
+      <w:start w:val="1"/>
+      <w:numFmt w:val="decimal"/>
+      <w:lvlText w:val="%8."/>
+      <w:lvlJc w:val="left"/>
+      <w:pPr>
+        <w:tabs>
+          <w:tab w:val="num" w:pos="5760"/>
+        </w:tabs>
+        <w:ind w:left="5760" w:hanging="360"/>
+      </w:pPr>
+    </w:lvl>
+    <w:lvl w:ilvl="8" w:tentative="1">
+      <w:start w:val="1"/>
+      <w:numFmt w:val="decimal"/>
+      <w:lvlText w:val="%9."/>
+      <w:lvlJc w:val="left"/>
+      <w:pPr>
+        <w:tabs>
+          <w:tab w:val="num" w:pos="6480"/>
+        </w:tabs>
+        <w:ind w:left="6480" w:hanging="360"/>
+      </w:pPr>
+    </w:lvl>
+  </w:abstractNum>
+  <w:abstractNum w:abstractNumId="7" w15:restartNumberingAfterBreak="0">
     <w:nsid w:val="4B030739"/>
     <w:multiLevelType w:val="hybridMultilevel"/>
     <w:tmpl w:val="67E4FD68"/>
@@ -8028,7 +9134,7 @@
       </w:rPr>
     </w:lvl>
   </w:abstractNum>
-  <w:abstractNum w:abstractNumId="5" w15:restartNumberingAfterBreak="0">
+  <w:abstractNum w:abstractNumId="8" w15:restartNumberingAfterBreak="0">
     <w:nsid w:val="6901172F"/>
     <w:multiLevelType w:val="hybridMultilevel"/>
     <w:tmpl w:val="41B8C0DA"/>
@@ -8118,22 +9224,22 @@
     </w:lvl>
   </w:abstractNum>
   <w:num w:numId="1" w16cid:durableId="1101150216">
-    <w:abstractNumId w:val="4"/>
+    <w:abstractNumId w:val="7"/>
   </w:num>
   <w:num w:numId="2" w16cid:durableId="1255750687">
-    <w:abstractNumId w:val="2"/>
+    <w:abstractNumId w:val="3"/>
   </w:num>
   <w:num w:numId="3" w16cid:durableId="2023389186">
-    <w:abstractNumId w:val="1"/>
+    <w:abstractNumId w:val="2"/>
   </w:num>
   <w:num w:numId="4" w16cid:durableId="1786346422">
     <w:abstractNumId w:val="0"/>
   </w:num>
   <w:num w:numId="5" w16cid:durableId="808938519">
-    <w:abstractNumId w:val="5"/>
+    <w:abstractNumId w:val="8"/>
   </w:num>
   <w:num w:numId="6" w16cid:durableId="2106612740">
-    <w:abstractNumId w:val="3"/>
+    <w:abstractNumId w:val="5"/>
   </w:num>
   <w:num w:numId="7" w16cid:durableId="1489900482">
     <w:abstractNumId w:val="0"/>
@@ -8165,11 +9271,20 @@
       <w:startOverride w:val="1"/>
     </w:lvlOverride>
   </w:num>
+  <w:num w:numId="8" w16cid:durableId="541483985">
+    <w:abstractNumId w:val="6"/>
+  </w:num>
+  <w:num w:numId="9" w16cid:durableId="705719654">
+    <w:abstractNumId w:val="1"/>
+  </w:num>
+  <w:num w:numId="10" w16cid:durableId="437872203">
+    <w:abstractNumId w:val="4"/>
+  </w:num>
 </w:numbering>
 </file>
 
 <file path=word/styles.xml><?xml version="1.0" encoding="utf-8"?>
-<w:styles xmlns:mc="http://schemas.openxmlformats.org/markup-compatibility/2006" xmlns:r="http://schemas.openxmlformats.org/officeDocument/2006/relationships" xmlns:w="http://schemas.openxmlformats.org/wordprocessingml/2006/main" xmlns:w14="http://schemas.microsoft.com/office/word/2010/wordml" xmlns:w15="http://schemas.microsoft.com/office/word/2012/wordml" xmlns:w16cex="http://schemas.microsoft.com/office/word/2018/wordml/cex" xmlns:w16cid="http://schemas.microsoft.com/office/word/2016/wordml/cid" xmlns:w16="http://schemas.microsoft.com/office/word/2018/wordml" xmlns:w16sdtdh="http://schemas.microsoft.com/office/word/2020/wordml/sdtdatahash" xmlns:w16se="http://schemas.microsoft.com/office/word/2015/wordml/symex" mc:Ignorable="w14 w15 w16se w16cid w16 w16cex w16sdtdh">
+<w:styles xmlns:mc="http://schemas.openxmlformats.org/markup-compatibility/2006" xmlns:r="http://schemas.openxmlformats.org/officeDocument/2006/relationships" xmlns:w="http://schemas.openxmlformats.org/wordprocessingml/2006/main" xmlns:w14="http://schemas.microsoft.com/office/word/2010/wordml" xmlns:w15="http://schemas.microsoft.com/office/word/2012/wordml" xmlns:w16cex="http://schemas.microsoft.com/office/word/2018/wordml/cex" xmlns:w16cid="http://schemas.microsoft.com/office/word/2016/wordml/cid" xmlns:w16="http://schemas.microsoft.com/office/word/2018/wordml" xmlns:w16du="http://schemas.microsoft.com/office/word/2023/wordml/word16du" xmlns:w16sdtdh="http://schemas.microsoft.com/office/word/2020/wordml/sdtdatahash" xmlns:w16sdtfl="http://schemas.microsoft.com/office/word/2024/wordml/sdtformatlock" xmlns:w16se="http://schemas.microsoft.com/office/word/2015/wordml/symex" mc:Ignorable="w14 w15 w16se w16cid w16 w16cex w16sdtdh w16sdtfl w16du">
   <w:docDefaults>
     <w:rPrDefault>
       <w:rPr>
@@ -8622,10 +9737,9 @@
     <w:next w:val="a"/>
     <w:link w:val="30"/>
     <w:uiPriority w:val="9"/>
-    <w:semiHidden/>
     <w:unhideWhenUsed/>
     <w:qFormat/>
-    <w:rsid w:val="00A42C4D"/>
+    <w:rsid w:val="00317D74"/>
     <w:pPr>
       <w:keepNext/>
       <w:keepLines/>
@@ -8633,9 +9747,9 @@
       <w:outlineLvl w:val="2"/>
     </w:pPr>
     <w:rPr>
-      <w:rFonts w:eastAsiaTheme="majorEastAsia" w:cstheme="majorBidi"/>
-      <w:color w:val="0F4761" w:themeColor="accent1" w:themeShade="BF"/>
-      <w:sz w:val="32"/>
+      <w:rFonts w:ascii="Times New Roman" w:eastAsia="標楷體" w:hAnsi="Times New Roman" w:cstheme="majorBidi"/>
+      <w:b/>
+      <w:sz w:val="28"/>
       <w:szCs w:val="32"/>
     </w:rPr>
   </w:style>
@@ -8827,12 +9941,11 @@
     <w:basedOn w:val="a0"/>
     <w:link w:val="3"/>
     <w:uiPriority w:val="9"/>
-    <w:semiHidden/>
-    <w:rsid w:val="00A42C4D"/>
+    <w:rsid w:val="00317D74"/>
     <w:rPr>
-      <w:rFonts w:eastAsiaTheme="majorEastAsia" w:cstheme="majorBidi"/>
-      <w:color w:val="0F4761" w:themeColor="accent1" w:themeShade="BF"/>
-      <w:sz w:val="32"/>
+      <w:rFonts w:ascii="Times New Roman" w:eastAsia="標楷體" w:hAnsi="Times New Roman" w:cstheme="majorBidi"/>
+      <w:b/>
+      <w:sz w:val="28"/>
       <w:szCs w:val="32"/>
     </w:rPr>
   </w:style>

</xml_diff>